<commit_message>
first text for the result part of the master script
</commit_message>
<xml_diff>
--- a/Master_scriptie_tekst.docx
+++ b/Master_scriptie_tekst.docx
@@ -1905,6 +1905,285 @@
         </w:rPr>
         <w:lastRenderedPageBreak/>
         <w:t>Hoofdstuk 4: Resultaten</w:t>
+      </w:r>
+    </w:p>
+    <w:p>
+      <w:pPr>
+        <w:spacing w:before="100" w:beforeAutospacing="1" w:after="100" w:afterAutospacing="1" w:line="240" w:lineRule="auto"/>
+        <w:rPr>
+          <w:rFonts w:eastAsia="Times New Roman" w:cs="Times New Roman"/>
+          <w:kern w:val="0"/>
+          <w:lang w:eastAsia="nl-BE"/>
+          <w14:ligatures w14:val="none"/>
+        </w:rPr>
+      </w:pPr>
+      <w:r>
+        <w:rPr>
+          <w:rFonts w:eastAsia="Times New Roman" w:cs="Times New Roman"/>
+          <w:kern w:val="0"/>
+          <w:lang w:eastAsia="nl-BE"/>
+          <w14:ligatures w14:val="none"/>
+        </w:rPr>
+        <w:t>De resultaten wijzen erop dat versie 2 van de software, met de extra features, duidelijk als gebruiksvriendelijker, efficiënter en aantrekkelijker wordt ervaren dan versie 1.</w:t>
+      </w:r>
+    </w:p>
+    <w:p>
+      <w:pPr>
+        <w:spacing w:before="100" w:beforeAutospacing="1" w:after="100" w:afterAutospacing="1" w:line="240" w:lineRule="auto"/>
+        <w:rPr>
+          <w:rFonts w:eastAsia="Times New Roman" w:cs="Times New Roman"/>
+          <w:b/>
+          <w:bCs/>
+          <w:kern w:val="0"/>
+          <w:sz w:val="28"/>
+          <w:szCs w:val="28"/>
+          <w:lang w:eastAsia="nl-BE"/>
+          <w14:ligatures w14:val="none"/>
+        </w:rPr>
+      </w:pPr>
+      <w:r>
+        <w:rPr>
+          <w:rFonts w:eastAsia="Times New Roman" w:cs="Times New Roman"/>
+          <w:b/>
+          <w:bCs/>
+          <w:kern w:val="0"/>
+          <w:sz w:val="28"/>
+          <w:szCs w:val="28"/>
+          <w:lang w:eastAsia="nl-BE"/>
+          <w14:ligatures w14:val="none"/>
+        </w:rPr>
+        <w:t>Kwantitatieve UX-resultaten</w:t>
+      </w:r>
+    </w:p>
+    <w:p>
+      <w:pPr>
+        <w:spacing w:before="100" w:beforeAutospacing="1" w:after="100" w:afterAutospacing="1" w:line="240" w:lineRule="auto"/>
+        <w:rPr>
+          <w:rFonts w:eastAsia="Times New Roman" w:cs="Times New Roman"/>
+          <w:kern w:val="0"/>
+          <w:lang w:eastAsia="nl-BE"/>
+          <w14:ligatures w14:val="none"/>
+        </w:rPr>
+      </w:pPr>
+      <w:r>
+        <w:rPr>
+          <w:rFonts w:eastAsia="Times New Roman" w:cs="Times New Roman"/>
+          <w:kern w:val="0"/>
+          <w:lang w:eastAsia="nl-BE"/>
+          <w14:ligatures w14:val="none"/>
+        </w:rPr>
+        <w:t>In de UEQ-grafiek scoort versie 2 op alle dimensies (aantrekkelijkheid, transparantie, efficiëntie, bestuurbaarheid, stimulatie en originaliteit) positief, terwijl versie 1 op meerdere schalen negatief blijft. Vooral stimulatie en originaliteit maken een sterke sprong van uitgesproken negatieve beoordelingen in versie 1 naar sterk positieve beoordelingen in versie 2, wat wijst op een veel plezierigere en moderner aanvoelende interactie. Ook efficiëntie en aantrekkelijkheid verbeteren substantieel, wat suggereert dat gebruikers versie 2 als sneller, minder foutgevoelig en visueel aantrekkelijker ervaren.</w:t>
+      </w:r>
+    </w:p>
+    <w:p>
+      <w:pPr>
+        <w:spacing w:before="100" w:beforeAutospacing="1" w:after="100" w:afterAutospacing="1" w:line="240" w:lineRule="auto"/>
+        <w:rPr>
+          <w:rFonts w:eastAsia="Times New Roman" w:cs="Times New Roman"/>
+          <w:b/>
+          <w:bCs/>
+          <w:kern w:val="0"/>
+          <w:sz w:val="28"/>
+          <w:szCs w:val="28"/>
+          <w:lang w:eastAsia="nl-BE"/>
+          <w14:ligatures w14:val="none"/>
+        </w:rPr>
+      </w:pPr>
+      <w:r>
+        <w:rPr>
+          <w:rFonts w:eastAsia="Times New Roman" w:cs="Times New Roman"/>
+          <w:b/>
+          <w:bCs/>
+          <w:kern w:val="0"/>
+          <w:sz w:val="28"/>
+          <w:szCs w:val="28"/>
+          <w:lang w:eastAsia="nl-BE"/>
+          <w14:ligatures w14:val="none"/>
+        </w:rPr>
+        <w:t>Waardering van de toegevoegde features</w:t>
+      </w:r>
+    </w:p>
+    <w:p>
+      <w:pPr>
+        <w:spacing w:before="100" w:beforeAutospacing="1" w:after="100" w:afterAutospacing="1" w:line="240" w:lineRule="auto"/>
+        <w:rPr>
+          <w:rFonts w:eastAsia="Times New Roman" w:cs="Times New Roman"/>
+          <w:kern w:val="0"/>
+          <w:lang w:eastAsia="nl-BE"/>
+          <w14:ligatures w14:val="none"/>
+        </w:rPr>
+      </w:pPr>
+      <w:r>
+        <w:rPr>
+          <w:rFonts w:eastAsia="Times New Roman" w:cs="Times New Roman"/>
+          <w:kern w:val="0"/>
+          <w:lang w:eastAsia="nl-BE"/>
+          <w14:ligatures w14:val="none"/>
+        </w:rPr>
+        <w:t>De antwoorden op de open vragen sluiten nauw aan bij deze kwantitatieve resultaten. Deelnemers geven unaniem aan dat zij de taken makkelijker konden uitvoeren met versie 2 en noemen daarbij expliciet de aanwezigheid van filter- en sorteerfunctionaliteit, automatische danger-ratingberekening en zoekmogelijkheden. Versie 2 vermindert de cognitieve belasting doordat gebruikers niet langer zelf hoeven te tellen of danger ratings manueel moeten berekenen; meerdere deelnemers beschrijven dat de nieuwe functies tijd besparen en de kans op fouten verkleinen. De filtering op basis van node-status komt herhaaldelijk als meest nuttig naar voren, gevolgd door het tellen van nodes per status en de highlight-functie bij klikken in de filterbalk.</w:t>
+      </w:r>
+    </w:p>
+    <w:p>
+      <w:pPr>
+        <w:spacing w:before="100" w:beforeAutospacing="1" w:after="100" w:afterAutospacing="1" w:line="240" w:lineRule="auto"/>
+        <w:rPr>
+          <w:rFonts w:eastAsia="Times New Roman" w:cs="Times New Roman"/>
+          <w:b/>
+          <w:bCs/>
+          <w:kern w:val="0"/>
+          <w:sz w:val="28"/>
+          <w:szCs w:val="28"/>
+          <w:lang w:eastAsia="nl-BE"/>
+          <w14:ligatures w14:val="none"/>
+        </w:rPr>
+      </w:pPr>
+      <w:r>
+        <w:rPr>
+          <w:rFonts w:eastAsia="Times New Roman" w:cs="Times New Roman"/>
+          <w:b/>
+          <w:bCs/>
+          <w:kern w:val="0"/>
+          <w:sz w:val="28"/>
+          <w:szCs w:val="28"/>
+          <w:lang w:eastAsia="nl-BE"/>
+          <w14:ligatures w14:val="none"/>
+        </w:rPr>
+        <w:t>Ervaren gebruiksgemak en voorkeur</w:t>
+      </w:r>
+    </w:p>
+    <w:p>
+      <w:pPr>
+        <w:spacing w:before="100" w:beforeAutospacing="1" w:after="100" w:afterAutospacing="1" w:line="240" w:lineRule="auto"/>
+        <w:rPr>
+          <w:rFonts w:eastAsia="Times New Roman" w:cs="Times New Roman"/>
+          <w:kern w:val="0"/>
+          <w:lang w:eastAsia="nl-BE"/>
+          <w14:ligatures w14:val="none"/>
+        </w:rPr>
+      </w:pPr>
+      <w:r>
+        <w:rPr>
+          <w:rFonts w:eastAsia="Times New Roman" w:cs="Times New Roman"/>
+          <w:kern w:val="0"/>
+          <w:lang w:eastAsia="nl-BE"/>
+          <w14:ligatures w14:val="none"/>
+        </w:rPr>
+        <w:t>Ook op visueel en hedonisch vlak wordt versie 2 duidelijk hoger gewaardeerd. Deelnemers omschrijven deze versie als visueel aantrekkelijker, met overzichtelijke kleuren, een duidelijkere GUI en iconen die de gebruiker door de taakflow begeleiden. Dit komt overeen met de verhoogde UEQ-scores op aantrekkelijkheid, stimulatie en originaliteit en bevestigt dat de nieuwe vormgeving niet alleen mooier oogt, maar ook de oriëntatie binnen de boomstructuur ondersteunt. Alle deelnemers geven aan dat zij in een realistische werksituatie versie 2 zouden verkiezen, omdat deze volgens hen efficiënter, duidelijker, makkelijker in gebruik en functioneler is dan versie 1.</w:t>
+      </w:r>
+    </w:p>
+    <w:p>
+      <w:pPr>
+        <w:spacing w:before="100" w:beforeAutospacing="1" w:after="100" w:afterAutospacing="1" w:line="240" w:lineRule="auto"/>
+        <w:rPr>
+          <w:rFonts w:eastAsia="Times New Roman" w:cs="Times New Roman"/>
+          <w:b/>
+          <w:bCs/>
+          <w:kern w:val="0"/>
+          <w:sz w:val="28"/>
+          <w:szCs w:val="28"/>
+          <w:lang w:eastAsia="nl-BE"/>
+          <w14:ligatures w14:val="none"/>
+        </w:rPr>
+      </w:pPr>
+      <w:r>
+        <w:rPr>
+          <w:rFonts w:eastAsia="Times New Roman" w:cs="Times New Roman"/>
+          <w:b/>
+          <w:bCs/>
+          <w:kern w:val="0"/>
+          <w:sz w:val="28"/>
+          <w:szCs w:val="28"/>
+          <w:lang w:eastAsia="nl-BE"/>
+          <w14:ligatures w14:val="none"/>
+        </w:rPr>
+        <w:t>Verbeterpunten en suggesties</w:t>
+      </w:r>
+    </w:p>
+    <w:p>
+      <w:pPr>
+        <w:spacing w:before="100" w:beforeAutospacing="1" w:after="100" w:afterAutospacing="1" w:line="240" w:lineRule="auto"/>
+        <w:rPr>
+          <w:rFonts w:eastAsia="Times New Roman" w:cs="Times New Roman"/>
+          <w:kern w:val="0"/>
+          <w:lang w:eastAsia="nl-BE"/>
+          <w14:ligatures w14:val="none"/>
+        </w:rPr>
+      </w:pPr>
+      <w:r>
+        <w:rPr>
+          <w:rFonts w:eastAsia="Times New Roman" w:cs="Times New Roman"/>
+          <w:kern w:val="0"/>
+          <w:lang w:eastAsia="nl-BE"/>
+          <w14:ligatures w14:val="none"/>
+        </w:rPr>
+        <w:t xml:space="preserve">Ondanks de duidelijke voorkeur voor versie 2 formuleren deelnemers ook concrete verbeterpunten, wat waardevolle input biedt voor verdere iteraties van het ontwerp. Genoemde suggesties zijn onder meer het compacter weergeven van de tree zodat er meer op het scherm past, intuïtievere manieren om nodes in en uit te klappen en snellere navigatie binnen lange branches. Daarnaast worden uitbreidingen rond </w:t>
+      </w:r>
+      <w:r>
+        <w:rPr>
+          <w:rFonts w:eastAsia="Times New Roman" w:cs="Times New Roman"/>
+          <w:kern w:val="0"/>
+          <w:lang w:eastAsia="nl-BE"/>
+          <w14:ligatures w14:val="none"/>
+        </w:rPr>
+        <w:lastRenderedPageBreak/>
+        <w:t>statusbeheer voorgesteld, zoals custom statussen, een duidelijkere indicatie van de collapse/expand-knoppen en een eenvoudigere manier om per ongeluk aangemaakte nodes te annuleren. Tot slot worden ideeën geopperd voor verdere kwaliteitsverbeteringen, zoals een globale knop om alle branches behalve de geselecteerde in te klappen, zoom op een specifieke branch als nieuwe tree en een zoekbalk binnen de filterbalk.</w:t>
+      </w:r>
+    </w:p>
+    <w:p>
+      <w:pPr>
+        <w:spacing w:before="100" w:beforeAutospacing="1" w:after="100" w:afterAutospacing="1" w:line="240" w:lineRule="auto"/>
+        <w:rPr>
+          <w:rFonts w:eastAsia="Times New Roman" w:cs="Times New Roman"/>
+          <w:b/>
+          <w:bCs/>
+          <w:kern w:val="0"/>
+          <w:sz w:val="28"/>
+          <w:szCs w:val="28"/>
+          <w:lang w:eastAsia="nl-BE"/>
+          <w14:ligatures w14:val="none"/>
+        </w:rPr>
+      </w:pPr>
+      <w:r>
+        <w:rPr>
+          <w:rFonts w:eastAsia="Times New Roman" w:cs="Times New Roman"/>
+          <w:b/>
+          <w:bCs/>
+          <w:kern w:val="0"/>
+          <w:sz w:val="28"/>
+          <w:szCs w:val="28"/>
+          <w:lang w:eastAsia="nl-BE"/>
+          <w14:ligatures w14:val="none"/>
+        </w:rPr>
+        <w:t>Synthese</w:t>
+      </w:r>
+    </w:p>
+    <w:p>
+      <w:pPr>
+        <w:spacing w:before="100" w:beforeAutospacing="1" w:after="100" w:afterAutospacing="1" w:line="240" w:lineRule="auto"/>
+        <w:rPr>
+          <w:rFonts w:eastAsia="Times New Roman" w:cs="Times New Roman"/>
+          <w:kern w:val="0"/>
+          <w:lang w:eastAsia="nl-BE"/>
+          <w14:ligatures w14:val="none"/>
+        </w:rPr>
+      </w:pPr>
+      <w:r>
+        <w:rPr>
+          <w:rFonts w:eastAsia="Times New Roman" w:cs="Times New Roman"/>
+          <w:kern w:val="0"/>
+          <w:lang w:eastAsia="nl-BE"/>
+          <w14:ligatures w14:val="none"/>
+        </w:rPr>
+        <w:t>Samenvattend tonen zowel de UEQ-scores als de open antwoorden dat het toevoegen van de nieuwe features leidt tot een verschuiving van een overwegend negatief naar een duidelijk positief UX-profiel. Versie 2 wordt door alle deelnemers als voorkeursversie beschouwd omdat deze tijd bespaart, fouten reduceert en een aantrekkelijker, overzichtelijker en intuïtiever ontwerp biedt, terwijl de geformuleerde suggesties tegelijk concrete aangrijpingspunten bieden voor verdere verfijning van de interface.</w:t>
+      </w:r>
+      <w:r>
+        <w:rPr>
+          <w:rFonts w:eastAsia="Times New Roman" w:cs="Times New Roman"/>
+          <w:kern w:val="0"/>
+          <w:lang w:eastAsia="nl-BE"/>
+          <w14:ligatures w14:val="none"/>
+        </w:rPr>
+        <w:t xml:space="preserve"> </w:t>
       </w:r>
     </w:p>
     <w:p>
@@ -3155,6 +3434,119 @@
     </w:lvl>
   </w:abstractNum>
   <w:abstractNum w:abstractNumId="8" w15:restartNumberingAfterBreak="0">
+    <w:nsid w:val="787E42AC"/>
+    <w:multiLevelType w:val="multilevel"/>
+    <w:tmpl w:val="183AAC40"/>
+    <w:lvl w:ilvl="0">
+      <w:start w:val="1"/>
+      <w:numFmt w:val="decimal"/>
+      <w:lvlText w:val="%1."/>
+      <w:lvlJc w:val="left"/>
+      <w:pPr>
+        <w:tabs>
+          <w:tab w:val="num" w:pos="720"/>
+        </w:tabs>
+        <w:ind w:left="720" w:hanging="360"/>
+      </w:pPr>
+    </w:lvl>
+    <w:lvl w:ilvl="1" w:tentative="1">
+      <w:start w:val="1"/>
+      <w:numFmt w:val="decimal"/>
+      <w:lvlText w:val="%2."/>
+      <w:lvlJc w:val="left"/>
+      <w:pPr>
+        <w:tabs>
+          <w:tab w:val="num" w:pos="1440"/>
+        </w:tabs>
+        <w:ind w:left="1440" w:hanging="360"/>
+      </w:pPr>
+    </w:lvl>
+    <w:lvl w:ilvl="2" w:tentative="1">
+      <w:start w:val="1"/>
+      <w:numFmt w:val="decimal"/>
+      <w:lvlText w:val="%3."/>
+      <w:lvlJc w:val="left"/>
+      <w:pPr>
+        <w:tabs>
+          <w:tab w:val="num" w:pos="2160"/>
+        </w:tabs>
+        <w:ind w:left="2160" w:hanging="360"/>
+      </w:pPr>
+    </w:lvl>
+    <w:lvl w:ilvl="3" w:tentative="1">
+      <w:start w:val="1"/>
+      <w:numFmt w:val="decimal"/>
+      <w:lvlText w:val="%4."/>
+      <w:lvlJc w:val="left"/>
+      <w:pPr>
+        <w:tabs>
+          <w:tab w:val="num" w:pos="2880"/>
+        </w:tabs>
+        <w:ind w:left="2880" w:hanging="360"/>
+      </w:pPr>
+    </w:lvl>
+    <w:lvl w:ilvl="4" w:tentative="1">
+      <w:start w:val="1"/>
+      <w:numFmt w:val="decimal"/>
+      <w:lvlText w:val="%5."/>
+      <w:lvlJc w:val="left"/>
+      <w:pPr>
+        <w:tabs>
+          <w:tab w:val="num" w:pos="3600"/>
+        </w:tabs>
+        <w:ind w:left="3600" w:hanging="360"/>
+      </w:pPr>
+    </w:lvl>
+    <w:lvl w:ilvl="5" w:tentative="1">
+      <w:start w:val="1"/>
+      <w:numFmt w:val="decimal"/>
+      <w:lvlText w:val="%6."/>
+      <w:lvlJc w:val="left"/>
+      <w:pPr>
+        <w:tabs>
+          <w:tab w:val="num" w:pos="4320"/>
+        </w:tabs>
+        <w:ind w:left="4320" w:hanging="360"/>
+      </w:pPr>
+    </w:lvl>
+    <w:lvl w:ilvl="6" w:tentative="1">
+      <w:start w:val="1"/>
+      <w:numFmt w:val="decimal"/>
+      <w:lvlText w:val="%7."/>
+      <w:lvlJc w:val="left"/>
+      <w:pPr>
+        <w:tabs>
+          <w:tab w:val="num" w:pos="5040"/>
+        </w:tabs>
+        <w:ind w:left="5040" w:hanging="360"/>
+      </w:pPr>
+    </w:lvl>
+    <w:lvl w:ilvl="7" w:tentative="1">
+      <w:start w:val="1"/>
+      <w:numFmt w:val="decimal"/>
+      <w:lvlText w:val="%8."/>
+      <w:lvlJc w:val="left"/>
+      <w:pPr>
+        <w:tabs>
+          <w:tab w:val="num" w:pos="5760"/>
+        </w:tabs>
+        <w:ind w:left="5760" w:hanging="360"/>
+      </w:pPr>
+    </w:lvl>
+    <w:lvl w:ilvl="8" w:tentative="1">
+      <w:start w:val="1"/>
+      <w:numFmt w:val="decimal"/>
+      <w:lvlText w:val="%9."/>
+      <w:lvlJc w:val="left"/>
+      <w:pPr>
+        <w:tabs>
+          <w:tab w:val="num" w:pos="6480"/>
+        </w:tabs>
+        <w:ind w:left="6480" w:hanging="360"/>
+      </w:pPr>
+    </w:lvl>
+  </w:abstractNum>
+  <w:abstractNum w:abstractNumId="9" w15:restartNumberingAfterBreak="0">
     <w:nsid w:val="7D4F047B"/>
     <w:multiLevelType w:val="multilevel"/>
     <w:tmpl w:val="00FE70FE"/>
@@ -3303,7 +3695,7 @@
       </w:rPr>
     </w:lvl>
   </w:abstractNum>
-  <w:abstractNum w:abstractNumId="9" w15:restartNumberingAfterBreak="0">
+  <w:abstractNum w:abstractNumId="10" w15:restartNumberingAfterBreak="0">
     <w:nsid w:val="7FB234BB"/>
     <w:multiLevelType w:val="multilevel"/>
     <w:tmpl w:val="57B67D44"/>
@@ -3459,7 +3851,7 @@
     <w:abstractNumId w:val="1"/>
   </w:num>
   <w:num w:numId="3" w16cid:durableId="804390768">
-    <w:abstractNumId w:val="8"/>
+    <w:abstractNumId w:val="9"/>
   </w:num>
   <w:num w:numId="4" w16cid:durableId="740324678">
     <w:abstractNumId w:val="7"/>
@@ -3468,7 +3860,7 @@
     <w:abstractNumId w:val="3"/>
   </w:num>
   <w:num w:numId="6" w16cid:durableId="521011932">
-    <w:abstractNumId w:val="9"/>
+    <w:abstractNumId w:val="10"/>
   </w:num>
   <w:num w:numId="7" w16cid:durableId="2095086216">
     <w:abstractNumId w:val="5"/>
@@ -3481,6 +3873,9 @@
   </w:num>
   <w:num w:numId="10" w16cid:durableId="1285310722">
     <w:abstractNumId w:val="6"/>
+  </w:num>
+  <w:num w:numId="11" w16cid:durableId="1317300852">
+    <w:abstractNumId w:val="8"/>
   </w:num>
 </w:numbering>
 </file>

</xml_diff>

<commit_message>
small changes in text
</commit_message>
<xml_diff>
--- a/Master_scriptie_tekst.docx
+++ b/Master_scriptie_tekst.docx
@@ -1360,6 +1360,12 @@
     <w:p>
       <w:pPr>
         <w:spacing w:afterLines="24" w:after="57" w:line="288" w:lineRule="auto"/>
+        <w:ind w:left="720"/>
+      </w:pPr>
+    </w:p>
+    <w:p>
+      <w:pPr>
+        <w:spacing w:afterLines="24" w:after="57" w:line="288" w:lineRule="auto"/>
       </w:pPr>
       <w:r>
         <w:t xml:space="preserve">De data worden in een boomstructuur bijgehouden, terwijl D3 wordt gebruikt om posities te berekenen en transities (uitklappen, inklappen) te ondersteunen. </w:t>
@@ -1646,7 +1652,7 @@
           <w:noProof/>
         </w:rPr>
         <w:drawing>
-          <wp:inline distT="0" distB="0" distL="0" distR="0" wp14:anchorId="128D5ED9" wp14:editId="6523DA34">
+          <wp:inline distT="0" distB="0" distL="0" distR="0" wp14:anchorId="128D5ED9" wp14:editId="5A846830">
             <wp:extent cx="5759450" cy="2856865"/>
             <wp:effectExtent l="0" t="0" r="0" b="635"/>
             <wp:docPr id="234035025" name="Afbeelding 1" descr="Afbeelding met diagram, schermopname, lijn, ontwerp&#10;&#10;Door AI gegenereerde inhoud is mogelijk onjuist."/>
@@ -1704,7 +1710,7 @@
         </w:rPr>
         <w:lastRenderedPageBreak/>
         <w:drawing>
-          <wp:inline distT="0" distB="0" distL="0" distR="0" wp14:anchorId="7D672503" wp14:editId="6A58A0F6">
+          <wp:inline distT="0" distB="0" distL="0" distR="0" wp14:anchorId="7D672503" wp14:editId="2AB41B34">
             <wp:extent cx="5759450" cy="1689735"/>
             <wp:effectExtent l="0" t="0" r="0" b="5715"/>
             <wp:docPr id="373297823" name="Afbeelding 2" descr="Afbeelding met diagram, lijn, origami, ontwerp&#10;&#10;Door AI gegenereerde inhoud is mogelijk onjuist."/>
@@ -2043,6 +2049,12 @@
     <w:p>
       <w:pPr>
         <w:spacing w:afterLines="24" w:after="57" w:line="288" w:lineRule="auto"/>
+        <w:ind w:left="720"/>
+      </w:pPr>
+    </w:p>
+    <w:p>
+      <w:pPr>
+        <w:spacing w:afterLines="24" w:after="57" w:line="288" w:lineRule="auto"/>
       </w:pPr>
       <w:r>
         <w:t xml:space="preserve">Door alle </w:t>
@@ -2396,13 +2408,20 @@
         <w:rPr>
           <w:lang w:val="en-US"/>
         </w:rPr>
-        <w:t xml:space="preserve"> Weakness (rood </w:t>
-      </w:r>
-      <w:proofErr w:type="spellStart"/>
+        <w:t xml:space="preserve"> </w:t>
+      </w:r>
       <w:r>
         <w:rPr>
           <w:lang w:val="en-US"/>
         </w:rPr>
+        <w:lastRenderedPageBreak/>
+        <w:t xml:space="preserve">Weakness (rood </w:t>
+      </w:r>
+      <w:proofErr w:type="spellStart"/>
+      <w:r>
+        <w:rPr>
+          <w:lang w:val="en-US"/>
+        </w:rPr>
         <w:t>schild</w:t>
       </w:r>
       <w:proofErr w:type="spellEnd"/>
@@ -2438,14 +2457,7 @@
         <w:rPr>
           <w:lang w:val="en-US"/>
         </w:rPr>
-        <w:t xml:space="preserve">), Assumption Under </w:t>
-      </w:r>
-      <w:r>
-        <w:rPr>
-          <w:lang w:val="en-US"/>
-        </w:rPr>
-        <w:lastRenderedPageBreak/>
-        <w:t>Review (</w:t>
+        <w:t>), Assumption Under Review (</w:t>
       </w:r>
       <w:proofErr w:type="spellStart"/>
       <w:r>
@@ -2934,7 +2946,6 @@
         <w:rPr>
           <w:noProof/>
         </w:rPr>
-        <w:lastRenderedPageBreak/>
         <w:drawing>
           <wp:inline distT="0" distB="0" distL="0" distR="0" wp14:anchorId="18032CE1" wp14:editId="244C6695">
             <wp:extent cx="1577477" cy="1386960"/>
@@ -5531,7 +5542,26 @@
         <w:spacing w:afterLines="24" w:after="57" w:line="288" w:lineRule="auto"/>
       </w:pPr>
       <w:r>
-        <w:t>Hoewel geavanceerde foutafhandeling nog beperkt is, ondersteunt de tool gebruikers bij het herkennen en corrigeren van fouten. Bevestigingsdialogen bij verwijderen en resetten maken expliciet welke actie op het punt staat uitgevoerd te worden, zodat de gebruiker een vergissing kan terugdraaien door te annuleren. In de </w:t>
+        <w:t xml:space="preserve">Hoewel geavanceerde foutafhandeling nog beperkt is, ondersteunt de tool gebruikers bij het herkennen en corrigeren van fouten. Bevestigingsdialogen bij verwijderen en resetten maken expliciet welke actie op het punt staat uitgevoerd te worden, zodat de gebruiker een vergissing kan terugdraaien door te annuleren. </w:t>
+      </w:r>
+    </w:p>
+    <w:p>
+      <w:pPr>
+        <w:spacing w:afterLines="24" w:after="57" w:line="288" w:lineRule="auto"/>
+      </w:pPr>
+    </w:p>
+    <w:p>
+      <w:pPr>
+        <w:spacing w:afterLines="24" w:after="57" w:line="288" w:lineRule="auto"/>
+      </w:pPr>
+      <w:r>
+        <w:t>In</w:t>
+      </w:r>
+      <w:r>
+        <w:t xml:space="preserve"> </w:t>
+      </w:r>
+      <w:r>
+        <w:t>de </w:t>
       </w:r>
       <w:proofErr w:type="spellStart"/>
       <w:r>
@@ -5543,9 +5573,15 @@
       </w:r>
       <w:proofErr w:type="spellStart"/>
       <w:r>
-        <w:t>danger</w:t>
-      </w:r>
-      <w:proofErr w:type="spellEnd"/>
+        <w:t>dange</w:t>
+      </w:r>
+      <w:r>
+        <w:t>r</w:t>
+      </w:r>
+      <w:proofErr w:type="spellEnd"/>
+      <w:r>
+        <w:t xml:space="preserve"> </w:t>
+      </w:r>
       <w:r>
         <w:t xml:space="preserve"> rating, impact en </w:t>
       </w:r>
@@ -5902,8 +5938,15 @@
     <w:p>
       <w:pPr>
         <w:spacing w:afterLines="24" w:after="57" w:line="288" w:lineRule="auto"/>
-      </w:pPr>
-      <w:r>
+        <w:ind w:left="720"/>
+      </w:pPr>
+    </w:p>
+    <w:p>
+      <w:pPr>
+        <w:spacing w:afterLines="24" w:after="57" w:line="288" w:lineRule="auto"/>
+      </w:pPr>
+      <w:r>
+        <w:lastRenderedPageBreak/>
         <w:t>Deze keuzes houden de implementatie beheersbaar en laten toe om de impact van de visualisatie</w:t>
       </w:r>
       <w:r>
@@ -5926,6 +5969,16 @@
     <w:p>
       <w:pPr>
         <w:spacing w:afterLines="24" w:after="57" w:line="288" w:lineRule="auto"/>
+      </w:pPr>
+    </w:p>
+    <w:p>
+      <w:pPr>
+        <w:spacing w:afterLines="24" w:after="57" w:line="288" w:lineRule="auto"/>
+      </w:pPr>
+    </w:p>
+    <w:p>
+      <w:pPr>
+        <w:spacing w:afterLines="24" w:after="57" w:line="288" w:lineRule="auto"/>
         <w:rPr>
           <w:b/>
           <w:bCs/>
@@ -5940,7 +5993,6 @@
           <w:sz w:val="28"/>
           <w:szCs w:val="28"/>
         </w:rPr>
-        <w:lastRenderedPageBreak/>
         <w:t xml:space="preserve">3.13 </w:t>
       </w:r>
       <w:r>
@@ -5999,6 +6051,9 @@
     <w:p>
       <w:pPr>
         <w:spacing w:afterLines="24" w:after="57" w:line="288" w:lineRule="auto"/>
+        <w:rPr>
+          <w:rFonts w:ascii="Arial" w:hAnsi="Arial" w:cs="Arial"/>
+        </w:rPr>
       </w:pPr>
       <w:r>
         <w:t>De studie had als doel de bruikbaarheid, duidelijkheid en efficiëntie van de dreigingsmodelleringstool te evalueren bij het analyseren</w:t>
@@ -6037,6 +6092,11 @@
     <w:p>
       <w:pPr>
         <w:spacing w:afterLines="24" w:after="57" w:line="288" w:lineRule="auto"/>
+      </w:pPr>
+    </w:p>
+    <w:p>
+      <w:pPr>
+        <w:spacing w:afterLines="24" w:after="57" w:line="288" w:lineRule="auto"/>
         <w:rPr>
           <w:rFonts w:ascii="Arial" w:hAnsi="Arial" w:cs="Arial"/>
         </w:rPr>
@@ -6181,6 +6241,9 @@
     <w:p>
       <w:pPr>
         <w:spacing w:afterLines="24" w:after="57" w:line="288" w:lineRule="auto"/>
+        <w:rPr>
+          <w:rFonts w:ascii="Arial" w:hAnsi="Arial" w:cs="Arial"/>
+        </w:rPr>
       </w:pPr>
       <w:r>
         <w:t xml:space="preserve">De basisversie van de tool bevatte enkel kernfunctionaliteit: </w:t>
@@ -6279,6 +6342,11 @@
     <w:p>
       <w:pPr>
         <w:spacing w:afterLines="24" w:after="57" w:line="288" w:lineRule="auto"/>
+      </w:pPr>
+    </w:p>
+    <w:p>
+      <w:pPr>
+        <w:spacing w:afterLines="24" w:after="57" w:line="288" w:lineRule="auto"/>
         <w:rPr>
           <w:rFonts w:ascii="Arial" w:hAnsi="Arial" w:cs="Arial"/>
         </w:rPr>
@@ -6372,6 +6440,7 @@
           <w:rFonts w:ascii="Arial" w:hAnsi="Arial" w:cs="Arial"/>
           <w:noProof/>
         </w:rPr>
+        <w:lastRenderedPageBreak/>
         <w:drawing>
           <wp:inline distT="0" distB="0" distL="0" distR="0" wp14:anchorId="29DF05AA" wp14:editId="2156BAD3">
             <wp:extent cx="3756660" cy="734759"/>
@@ -6487,14 +6556,22 @@
           <w:rFonts w:ascii="Arial" w:hAnsi="Arial" w:cs="Arial"/>
         </w:rPr>
       </w:pPr>
+    </w:p>
+    <w:p>
+      <w:pPr>
+        <w:spacing w:afterLines="24" w:after="57" w:line="288" w:lineRule="auto"/>
+        <w:jc w:val="center"/>
+        <w:rPr>
+          <w:rFonts w:ascii="Arial" w:hAnsi="Arial" w:cs="Arial"/>
+        </w:rPr>
+      </w:pPr>
       <w:r>
         <w:rPr>
           <w:rFonts w:ascii="Arial" w:hAnsi="Arial" w:cs="Arial"/>
           <w:noProof/>
         </w:rPr>
-        <w:lastRenderedPageBreak/>
         <w:drawing>
-          <wp:inline distT="0" distB="0" distL="0" distR="0" wp14:anchorId="385A938B" wp14:editId="7AB207F9">
+          <wp:inline distT="0" distB="0" distL="0" distR="0" wp14:anchorId="385A938B" wp14:editId="49DC7CFF">
             <wp:extent cx="5759450" cy="2903855"/>
             <wp:effectExtent l="0" t="0" r="0" b="0"/>
             <wp:docPr id="254494346" name="Afbeelding 25" descr="Afbeelding met tekst, schermopname, Lettertype, nummer&#10;&#10;Door AI gegenereerde inhoud is mogelijk onjuist."/>
@@ -6576,6 +6653,9 @@
     <w:p>
       <w:pPr>
         <w:spacing w:afterLines="24" w:after="57" w:line="288" w:lineRule="auto"/>
+        <w:rPr>
+          <w:rFonts w:ascii="Arial" w:hAnsi="Arial" w:cs="Arial"/>
+        </w:rPr>
       </w:pPr>
       <w:r>
         <w:t xml:space="preserve">Per </w:t>
@@ -6689,6 +6769,11 @@
     <w:p>
       <w:pPr>
         <w:spacing w:afterLines="24" w:after="57" w:line="288" w:lineRule="auto"/>
+      </w:pPr>
+    </w:p>
+    <w:p>
+      <w:pPr>
+        <w:spacing w:afterLines="24" w:after="57" w:line="288" w:lineRule="auto"/>
         <w:rPr>
           <w:rFonts w:ascii="Arial" w:hAnsi="Arial" w:cs="Arial"/>
         </w:rPr>
@@ -6808,6 +6893,9 @@
     <w:p>
       <w:pPr>
         <w:spacing w:afterLines="24" w:after="57" w:line="288" w:lineRule="auto"/>
+        <w:rPr>
+          <w:rFonts w:ascii="Arial" w:hAnsi="Arial" w:cs="Arial"/>
+        </w:rPr>
       </w:pPr>
       <w:r>
         <w:t>Tijdens de sessie werd het scherm van de deelnemer opgenomen en live gevolgd, zodat interactiepatronen en fouten later kwalitatief konden worden geanalyseerd. Na elke versie vulden deelnemers de UEQ in en beantwoordden ze open vragen over welke features nuttig waren, welke verbeterd konden worden en welke versie ze in een reële werksituatie zouden verkiezen.</w:t>
@@ -6823,6 +6911,11 @@
       <w:pPr>
         <w:spacing w:afterLines="24" w:after="57" w:line="288" w:lineRule="auto"/>
       </w:pPr>
+    </w:p>
+    <w:p>
+      <w:pPr>
+        <w:spacing w:afterLines="24" w:after="57" w:line="288" w:lineRule="auto"/>
+      </w:pPr>
       <w:r>
         <w:t xml:space="preserve">De studie verzamelde zo zowel kwantitatieve </w:t>
       </w:r>
@@ -6832,11 +6925,7 @@
       </w:r>
       <w:proofErr w:type="spellEnd"/>
       <w:r>
-        <w:t xml:space="preserve"> als kwalitatieve feedback over de toegevoegde visualisatiefeatures ten opzichte van de </w:t>
-      </w:r>
-      <w:r>
-        <w:lastRenderedPageBreak/>
-        <w:t xml:space="preserve">basisfunctionaliteit. Alle gegevens werden </w:t>
+        <w:t xml:space="preserve"> als kwalitatieve feedback over de toegevoegde visualisatiefeatures ten opzichte van de basisfunctionaliteit. Alle gegevens werden </w:t>
       </w:r>
       <w:proofErr w:type="spellStart"/>
       <w:r>
@@ -6933,6 +7022,9 @@
     <w:p>
       <w:pPr>
         <w:spacing w:afterLines="24" w:after="57" w:line="288" w:lineRule="auto"/>
+        <w:rPr>
+          <w:rFonts w:ascii="Arial" w:hAnsi="Arial" w:cs="Arial"/>
+        </w:rPr>
       </w:pPr>
       <w:r>
         <w:t xml:space="preserve">De User </w:t>
@@ -6956,6 +7048,14 @@
       <w:pPr>
         <w:spacing w:afterLines="24" w:after="57" w:line="288" w:lineRule="auto"/>
       </w:pPr>
+    </w:p>
+    <w:p>
+      <w:pPr>
+        <w:spacing w:afterLines="24" w:after="57" w:line="288" w:lineRule="auto"/>
+        <w:rPr>
+          <w:rFonts w:ascii="Arial" w:hAnsi="Arial" w:cs="Arial"/>
+        </w:rPr>
+      </w:pPr>
       <w:r>
         <w:t xml:space="preserve">Deze schalen omvatten zowel pragmatische bruikbaarheidsaspecten als hedonistische </w:t>
       </w:r>
@@ -6978,6 +7078,14 @@
       <w:pPr>
         <w:spacing w:afterLines="24" w:after="57" w:line="288" w:lineRule="auto"/>
       </w:pPr>
+    </w:p>
+    <w:p>
+      <w:pPr>
+        <w:spacing w:afterLines="24" w:after="57" w:line="288" w:lineRule="auto"/>
+        <w:rPr>
+          <w:rFonts w:ascii="Arial" w:hAnsi="Arial" w:cs="Arial"/>
+        </w:rPr>
+      </w:pPr>
       <w:r>
         <w:t xml:space="preserve">De UEQ meet gebruikerservaring via gepaarde tegenstellingen op een 7-punts </w:t>
       </w:r>
@@ -6987,13 +7095,10 @@
       </w:r>
       <w:proofErr w:type="spellEnd"/>
       <w:r>
-        <w:t>, waarbij hogere scores positieve ervaringen aangeven.</w:t>
-      </w:r>
-      <w:r>
-        <w:rPr>
-          <w:rFonts w:ascii="Arial" w:hAnsi="Arial" w:cs="Arial"/>
-        </w:rPr>
-        <w:t>​</w:t>
+        <w:t>, waarbij hogere scores positieve ervaringen aangeven</w:t>
+      </w:r>
+      <w:r>
+        <w:t>:</w:t>
       </w:r>
     </w:p>
     <w:p>
@@ -7009,16 +7114,20 @@
           <w:b/>
           <w:bCs/>
         </w:rPr>
-        <w:t>Aantrekkelijkheid</w:t>
-      </w:r>
-      <w:r>
-        <w:t>: Beoordeelt de algemene waardering van het product door gebruikers.</w:t>
-      </w:r>
-      <w:r>
-        <w:rPr>
-          <w:rFonts w:ascii="Arial" w:hAnsi="Arial" w:cs="Arial"/>
-        </w:rPr>
-        <w:t>​</w:t>
+        <w:t>a</w:t>
+      </w:r>
+      <w:r>
+        <w:rPr>
+          <w:b/>
+          <w:bCs/>
+        </w:rPr>
+        <w:t>antrekkelijkheid</w:t>
+      </w:r>
+      <w:r>
+        <w:t>: Beoordeelt de algemene waardering van het product door gebruikers</w:t>
+      </w:r>
+      <w:r>
+        <w:t>;</w:t>
       </w:r>
     </w:p>
     <w:p>
@@ -7034,16 +7143,20 @@
           <w:b/>
           <w:bCs/>
         </w:rPr>
-        <w:t>Duidelijkheid</w:t>
-      </w:r>
-      <w:r>
-        <w:t>: Evalueert de eenvoud waarmee gebruikers vertrouwd raken en het product leren gebruiken.</w:t>
-      </w:r>
-      <w:r>
-        <w:rPr>
-          <w:rFonts w:ascii="Arial" w:hAnsi="Arial" w:cs="Arial"/>
-        </w:rPr>
-        <w:t>​</w:t>
+        <w:t>d</w:t>
+      </w:r>
+      <w:r>
+        <w:rPr>
+          <w:b/>
+          <w:bCs/>
+        </w:rPr>
+        <w:t>uidelijkheid</w:t>
+      </w:r>
+      <w:r>
+        <w:t>: Evalueert de eenvoud waarmee gebruikers vertrouwd raken en het product leren gebruiken</w:t>
+      </w:r>
+      <w:r>
+        <w:t>;</w:t>
       </w:r>
     </w:p>
     <w:p>
@@ -7059,16 +7172,20 @@
           <w:b/>
           <w:bCs/>
         </w:rPr>
-        <w:t>Efficiëntie</w:t>
-      </w:r>
-      <w:r>
-        <w:t>: Analyseert de mogelijkheid tot moeiteloze taakoplossing en snelle reactietijden.</w:t>
-      </w:r>
-      <w:r>
-        <w:rPr>
-          <w:rFonts w:ascii="Arial" w:hAnsi="Arial" w:cs="Arial"/>
-        </w:rPr>
-        <w:t>​</w:t>
+        <w:t>e</w:t>
+      </w:r>
+      <w:r>
+        <w:rPr>
+          <w:b/>
+          <w:bCs/>
+        </w:rPr>
+        <w:t>fficiëntie</w:t>
+      </w:r>
+      <w:r>
+        <w:t>: Analyseert de mogelijkheid tot moeiteloze taakoplossing en snelle reactietijden</w:t>
+      </w:r>
+      <w:r>
+        <w:t>;</w:t>
       </w:r>
     </w:p>
     <w:p>
@@ -7084,16 +7201,21 @@
           <w:b/>
           <w:bCs/>
         </w:rPr>
-        <w:t>Betrouwbaarheid</w:t>
-      </w:r>
-      <w:r>
-        <w:t>: Onderzoekt het gevoel van controle, voorspelbaarheid en veiligheid tijdens interacties.</w:t>
-      </w:r>
-      <w:r>
-        <w:rPr>
-          <w:rFonts w:ascii="Arial" w:hAnsi="Arial" w:cs="Arial"/>
-        </w:rPr>
-        <w:t>​</w:t>
+        <w:lastRenderedPageBreak/>
+        <w:t>b</w:t>
+      </w:r>
+      <w:r>
+        <w:rPr>
+          <w:b/>
+          <w:bCs/>
+        </w:rPr>
+        <w:t>etrouwbaarheid</w:t>
+      </w:r>
+      <w:r>
+        <w:t>: Onderzoekt het gevoel van controle, voorspelbaarheid en veiligheid tijdens interacties</w:t>
+      </w:r>
+      <w:r>
+        <w:t>;</w:t>
       </w:r>
     </w:p>
     <w:p>
@@ -7109,16 +7231,20 @@
           <w:b/>
           <w:bCs/>
         </w:rPr>
-        <w:t>Stimulatie</w:t>
-      </w:r>
-      <w:r>
-        <w:t>: Meet de mate waarin het product motiverend, opwindend en plezierig is.</w:t>
-      </w:r>
-      <w:r>
-        <w:rPr>
-          <w:rFonts w:ascii="Arial" w:hAnsi="Arial" w:cs="Arial"/>
-        </w:rPr>
-        <w:t>​</w:t>
+        <w:t>s</w:t>
+      </w:r>
+      <w:r>
+        <w:rPr>
+          <w:b/>
+          <w:bCs/>
+        </w:rPr>
+        <w:t>timulatie</w:t>
+      </w:r>
+      <w:r>
+        <w:t>: Meet de mate waarin het product motiverend, opwindend en plezierig is</w:t>
+      </w:r>
+      <w:r>
+        <w:t>;</w:t>
       </w:r>
     </w:p>
     <w:p>
@@ -7134,7 +7260,14 @@
           <w:b/>
           <w:bCs/>
         </w:rPr>
-        <w:t>Nieuwheid</w:t>
+        <w:t>n</w:t>
+      </w:r>
+      <w:r>
+        <w:rPr>
+          <w:b/>
+          <w:bCs/>
+        </w:rPr>
+        <w:t>ieuwheid</w:t>
       </w:r>
       <w:r>
         <w:t>: Beoordeelt de creativiteit van het ontwerp en de interesse die het opwekt.</w:t>
@@ -7219,6 +7352,9 @@
     <w:p>
       <w:pPr>
         <w:spacing w:afterLines="24" w:after="57" w:line="288" w:lineRule="auto"/>
+        <w:rPr>
+          <w:rFonts w:ascii="Arial" w:hAnsi="Arial" w:cs="Arial"/>
+        </w:rPr>
       </w:pPr>
       <w:r>
         <w:t xml:space="preserve">De UEQ biedt een robuuste, kwantitatieve methode voor het evalueren van gebruikersinterfaces in </w:t>
@@ -7237,11 +7373,7 @@
       </w:r>
       <w:proofErr w:type="spellEnd"/>
       <w:r>
-        <w:t xml:space="preserve">-tools, door pragmatische schalen (duidelijkheid, efficiëntie, betrouwbaarheid) te combineren met hedonistische aspecten </w:t>
-      </w:r>
-      <w:r>
-        <w:lastRenderedPageBreak/>
-        <w:t>(stimulatie, nieuwheid), wat directe vergelijkingen tussen prototypes, softwareversies of benchmarks mogelijk maakt.</w:t>
+        <w:t>-tools, door pragmatische schalen (duidelijkheid, efficiëntie, betrouwbaarheid) te combineren met hedonistische aspecten (stimulatie, nieuwheid), wat directe vergelijkingen tussen prototypes, softwareversies of benchmarks mogelijk maakt.</w:t>
       </w:r>
       <w:r>
         <w:rPr>
@@ -7249,6 +7381,11 @@
         </w:rPr>
         <w:t>​</w:t>
       </w:r>
+    </w:p>
+    <w:p>
+      <w:pPr>
+        <w:spacing w:afterLines="24" w:after="57" w:line="288" w:lineRule="auto"/>
+      </w:pPr>
     </w:p>
     <w:p>
       <w:pPr>
@@ -8327,7 +8464,25 @@
           <w:lang w:eastAsia="nl-BE"/>
           <w14:ligatures w14:val="none"/>
         </w:rPr>
-        <w:t xml:space="preserve"> trees, maar dat de toegevoegde UX-features een substantiële verbetering opleveren in gebruiksvriendelijkheid en efficiëntie. Versie 2 scoort op alle UEQ-dimensies positief en wordt door alle deelnemers unaniem verkozen boven generieke </w:t>
+        <w:t xml:space="preserve"> trees, maar dat de toegevoegde UX-features een substantiële verbetering opleveren in gebruiksvriendelijkheid en efficiëntie. Versie 2 scoort op alle UEQ-dimensies positief en wordt door alle deelnemers unaniem verkozen boven</w:t>
+      </w:r>
+      <w:r>
+        <w:rPr>
+          <w:rFonts w:eastAsia="Times New Roman" w:cs="Times New Roman"/>
+          <w:kern w:val="0"/>
+          <w:lang w:eastAsia="nl-BE"/>
+          <w14:ligatures w14:val="none"/>
+        </w:rPr>
+        <w:t xml:space="preserve"> de</w:t>
+      </w:r>
+      <w:r>
+        <w:rPr>
+          <w:rFonts w:eastAsia="Times New Roman" w:cs="Times New Roman"/>
+          <w:kern w:val="0"/>
+          <w:lang w:eastAsia="nl-BE"/>
+          <w14:ligatures w14:val="none"/>
+        </w:rPr>
+        <w:t xml:space="preserve"> generieke </w:t>
       </w:r>
       <w:proofErr w:type="spellStart"/>
       <w:r>
@@ -8347,7 +8502,7 @@
           <w:lang w:eastAsia="nl-BE"/>
           <w14:ligatures w14:val="none"/>
         </w:rPr>
-        <w:t xml:space="preserve">-tools, dankzij features zoals filtering en visuele codering. Deze bevindingen beantwoorden de onderzoeksvragen direct en onderbouwen de waarde van </w:t>
+        <w:t xml:space="preserve">-tool, dankzij features zoals filtering en visuele codering. Deze bevindingen beantwoorden de onderzoeksvragen direct en onderbouwen de waarde van </w:t>
       </w:r>
       <w:proofErr w:type="spellStart"/>
       <w:r>
@@ -9149,27 +9304,25 @@
           <w:lang w:eastAsia="nl-BE"/>
           <w14:ligatures w14:val="none"/>
         </w:rPr>
-        <w:t xml:space="preserve">, zoals bij STRIDE of attack trees. De sprong in </w:t>
-      </w:r>
-      <w:proofErr w:type="spellStart"/>
-      <w:r>
-        <w:rPr>
-          <w:rFonts w:eastAsia="Times New Roman" w:cs="Times New Roman"/>
-          <w:kern w:val="0"/>
-          <w:lang w:eastAsia="nl-BE"/>
-          <w14:ligatures w14:val="none"/>
-        </w:rPr>
-        <w:t>hedonische</w:t>
-      </w:r>
-      <w:proofErr w:type="spellEnd"/>
-      <w:r>
-        <w:rPr>
-          <w:rFonts w:eastAsia="Times New Roman" w:cs="Times New Roman"/>
-          <w:kern w:val="0"/>
-          <w:lang w:eastAsia="nl-BE"/>
-          <w14:ligatures w14:val="none"/>
-        </w:rPr>
-        <w:t xml:space="preserve"> UEQ-scores (stimulatie, originaliteit) ondersteunt de noodzaak voor aantrekkelijke interfaces om security-praktijken te integreren in </w:t>
+        <w:t xml:space="preserve">, zoals bij STRIDE of attack trees. De sprong </w:t>
+      </w:r>
+      <w:r>
+        <w:rPr>
+          <w:rFonts w:eastAsia="Times New Roman" w:cs="Times New Roman"/>
+          <w:kern w:val="0"/>
+          <w:lang w:eastAsia="nl-BE"/>
+          <w14:ligatures w14:val="none"/>
+        </w:rPr>
+        <w:t xml:space="preserve">in belevingsmatige </w:t>
+      </w:r>
+      <w:r>
+        <w:rPr>
+          <w:rFonts w:eastAsia="Times New Roman" w:cs="Times New Roman"/>
+          <w:kern w:val="0"/>
+          <w:lang w:eastAsia="nl-BE"/>
+          <w14:ligatures w14:val="none"/>
+        </w:rPr>
+        <w:t xml:space="preserve">UEQ-scores (stimulatie, originaliteit) ondersteunt de noodzaak voor aantrekkelijke interfaces om security-praktijken te integreren in </w:t>
       </w:r>
       <w:proofErr w:type="spellStart"/>
       <w:r>
@@ -9575,17 +9728,15 @@
         </w:rPr>
         <w:t xml:space="preserve"> door empirisch bewijs voor UX-features in security </w:t>
       </w:r>
-      <w:proofErr w:type="spellStart"/>
-      <w:r>
-        <w:rPr>
-          <w:rFonts w:eastAsia="Times New Roman" w:cs="Times New Roman"/>
-          <w:kern w:val="0"/>
-          <w:lang w:eastAsia="nl-BE"/>
-          <w14:ligatures w14:val="none"/>
-        </w:rPr>
-        <w:t>tooling</w:t>
-      </w:r>
-      <w:proofErr w:type="spellEnd"/>
+      <w:r>
+        <w:rPr>
+          <w:rFonts w:eastAsia="Times New Roman" w:cs="Times New Roman"/>
+          <w:kern w:val="0"/>
+          <w:lang w:eastAsia="nl-BE"/>
+          <w14:ligatures w14:val="none"/>
+        </w:rPr>
+        <w:t>modellering</w:t>
+      </w:r>
       <w:r>
         <w:rPr>
           <w:rFonts w:eastAsia="Times New Roman" w:cs="Times New Roman"/>
@@ -9693,7 +9844,25 @@
           <w:lang w:eastAsia="nl-BE"/>
           <w14:ligatures w14:val="none"/>
         </w:rPr>
-        <w:t xml:space="preserve"> laagdrempelig te maken; implementeer filtering en iconen in bestaande </w:t>
+        <w:t xml:space="preserve"> laagdrempelig te maken</w:t>
+      </w:r>
+      <w:r>
+        <w:rPr>
+          <w:rFonts w:eastAsia="Times New Roman" w:cs="Times New Roman"/>
+          <w:kern w:val="0"/>
+          <w:lang w:eastAsia="nl-BE"/>
+          <w14:ligatures w14:val="none"/>
+        </w:rPr>
+        <w:t xml:space="preserve"> en</w:t>
+      </w:r>
+      <w:r>
+        <w:rPr>
+          <w:rFonts w:eastAsia="Times New Roman" w:cs="Times New Roman"/>
+          <w:kern w:val="0"/>
+          <w:lang w:eastAsia="nl-BE"/>
+          <w14:ligatures w14:val="none"/>
+        </w:rPr>
+        <w:t xml:space="preserve"> implementeer filtering en iconen in bestaande </w:t>
       </w:r>
       <w:proofErr w:type="spellStart"/>
       <w:r>
@@ -9871,27 +10040,54 @@
           <w:lang w:eastAsia="nl-BE"/>
           <w14:ligatures w14:val="none"/>
         </w:rPr>
-        <w:t xml:space="preserve">-software. Implementeer voorgestelde features zoals globale </w:t>
-      </w:r>
-      <w:proofErr w:type="spellStart"/>
-      <w:r>
-        <w:rPr>
-          <w:rFonts w:eastAsia="Times New Roman" w:cs="Times New Roman"/>
-          <w:kern w:val="0"/>
-          <w:lang w:eastAsia="nl-BE"/>
-          <w14:ligatures w14:val="none"/>
-        </w:rPr>
-        <w:t>collapse</w:t>
-      </w:r>
-      <w:proofErr w:type="spellEnd"/>
-      <w:r>
-        <w:rPr>
-          <w:rFonts w:eastAsia="Times New Roman" w:cs="Times New Roman"/>
-          <w:kern w:val="0"/>
-          <w:lang w:eastAsia="nl-BE"/>
-          <w14:ligatures w14:val="none"/>
-        </w:rPr>
-        <w:t xml:space="preserve">-knoppen en </w:t>
+        <w:t>-software. Implementeer voorgestelde features zoals collaps</w:t>
+      </w:r>
+      <w:r>
+        <w:rPr>
+          <w:rFonts w:eastAsia="Times New Roman" w:cs="Times New Roman"/>
+          <w:kern w:val="0"/>
+          <w:lang w:eastAsia="nl-BE"/>
+          <w14:ligatures w14:val="none"/>
+        </w:rPr>
+        <w:t xml:space="preserve"> </w:t>
+      </w:r>
+      <w:proofErr w:type="spellStart"/>
+      <w:r>
+        <w:rPr>
+          <w:rFonts w:eastAsia="Times New Roman" w:cs="Times New Roman"/>
+          <w:kern w:val="0"/>
+          <w:lang w:eastAsia="nl-BE"/>
+          <w14:ligatures w14:val="none"/>
+        </w:rPr>
+        <w:t>child</w:t>
+      </w:r>
+      <w:r>
+        <w:rPr>
+          <w:rFonts w:eastAsia="Times New Roman" w:cs="Times New Roman"/>
+          <w:kern w:val="0"/>
+          <w:lang w:eastAsia="nl-BE"/>
+          <w14:ligatures w14:val="none"/>
+        </w:rPr>
+        <w:t>ren</w:t>
+      </w:r>
+      <w:proofErr w:type="spellEnd"/>
+      <w:r>
+        <w:rPr>
+          <w:rFonts w:eastAsia="Times New Roman" w:cs="Times New Roman"/>
+          <w:kern w:val="0"/>
+          <w:lang w:eastAsia="nl-BE"/>
+          <w14:ligatures w14:val="none"/>
+        </w:rPr>
+        <w:t xml:space="preserve"> </w:t>
+      </w:r>
+      <w:r>
+        <w:rPr>
+          <w:rFonts w:eastAsia="Times New Roman" w:cs="Times New Roman"/>
+          <w:kern w:val="0"/>
+          <w:lang w:eastAsia="nl-BE"/>
+          <w14:ligatures w14:val="none"/>
+        </w:rPr>
+        <w:t xml:space="preserve">knoppen en </w:t>
       </w:r>
       <w:proofErr w:type="spellStart"/>
       <w:r>
@@ -10141,6 +10337,11 @@
       <w:pPr>
         <w:spacing w:afterLines="24" w:after="57" w:line="288" w:lineRule="auto"/>
       </w:pPr>
+    </w:p>
+    <w:p>
+      <w:pPr>
+        <w:spacing w:afterLines="24" w:after="57" w:line="288" w:lineRule="auto"/>
+      </w:pPr>
       <w:r>
         <w:rPr>
           <w:b/>
@@ -10180,6 +10381,11 @@
       <w:pPr>
         <w:spacing w:afterLines="24" w:after="57" w:line="288" w:lineRule="auto"/>
       </w:pPr>
+    </w:p>
+    <w:p>
+      <w:pPr>
+        <w:spacing w:afterLines="24" w:after="57" w:line="288" w:lineRule="auto"/>
+      </w:pPr>
       <w:r>
         <w:rPr>
           <w:b/>
@@ -10206,6 +10412,11 @@
       <w:pPr>
         <w:spacing w:afterLines="24" w:after="57" w:line="288" w:lineRule="auto"/>
       </w:pPr>
+    </w:p>
+    <w:p>
+      <w:pPr>
+        <w:spacing w:afterLines="24" w:after="57" w:line="288" w:lineRule="auto"/>
+      </w:pPr>
       <w:r>
         <w:rPr>
           <w:b/>
@@ -10245,6 +10456,11 @@
       <w:pPr>
         <w:spacing w:afterLines="24" w:after="57" w:line="288" w:lineRule="auto"/>
       </w:pPr>
+    </w:p>
+    <w:p>
+      <w:pPr>
+        <w:spacing w:afterLines="24" w:after="57" w:line="288" w:lineRule="auto"/>
+      </w:pPr>
       <w:r>
         <w:t xml:space="preserve">De tool voldoet aan Nielsens </w:t>
       </w:r>
@@ -10291,6 +10507,11 @@
       <w:r>
         <w:t>.</w:t>
       </w:r>
+    </w:p>
+    <w:p>
+      <w:pPr>
+        <w:spacing w:afterLines="24" w:after="57" w:line="288" w:lineRule="auto"/>
+      </w:pPr>
     </w:p>
     <w:p>
       <w:pPr>
@@ -12908,6 +13129,7 @@
   <w:style w:type="character" w:default="1" w:styleId="Standaardalinea-lettertype">
     <w:name w:val="Default Paragraph Font"/>
     <w:uiPriority w:val="1"/>
+    <w:semiHidden/>
     <w:unhideWhenUsed/>
   </w:style>
   <w:style w:type="table" w:default="1" w:styleId="Standaardtabel">

</xml_diff>

<commit_message>
added related works and changed discution to fit the related works
</commit_message>
<xml_diff>
--- a/Master_scriptie_tekst.docx
+++ b/Master_scriptie_tekst.docx
@@ -784,6 +784,89 @@
         </w:rPr>
         <w:t>​</w:t>
       </w:r>
+      <w:r>
+        <w:rPr>
+          <w:rFonts w:ascii="Arial" w:hAnsi="Arial" w:cs="Arial"/>
+        </w:rPr>
+        <w:t xml:space="preserve"> </w:t>
+      </w:r>
+      <w:r>
+        <w:rPr>
+          <w:rFonts w:cs="Arial"/>
+        </w:rPr>
+        <w:t>Om dit doel te bereiken, beantwoordt dit onderzoek de volgende onderzoeksvragen:</w:t>
+      </w:r>
+    </w:p>
+    <w:p>
+      <w:pPr>
+        <w:pStyle w:val="Lijstalinea"/>
+        <w:numPr>
+          <w:ilvl w:val="0"/>
+          <w:numId w:val="18"/>
+        </w:numPr>
+        <w:spacing w:afterLines="24" w:after="57" w:line="288" w:lineRule="auto"/>
+      </w:pPr>
+      <w:r>
+        <w:t xml:space="preserve">Welke basisfunctionaliteit is minimaal noodzakelijk om </w:t>
+      </w:r>
+      <w:proofErr w:type="spellStart"/>
+      <w:r>
+        <w:t>threat</w:t>
+      </w:r>
+      <w:proofErr w:type="spellEnd"/>
+      <w:r>
+        <w:t xml:space="preserve"> </w:t>
+      </w:r>
+      <w:proofErr w:type="spellStart"/>
+      <w:r>
+        <w:t>modeling</w:t>
+      </w:r>
+      <w:proofErr w:type="spellEnd"/>
+      <w:r>
+        <w:t xml:space="preserve"> met </w:t>
+      </w:r>
+      <w:proofErr w:type="spellStart"/>
+      <w:r>
+        <w:t>Fortunately-Unfortunately</w:t>
+      </w:r>
+      <w:proofErr w:type="spellEnd"/>
+      <w:r>
+        <w:t xml:space="preserve"> trees te ondersteunen?</w:t>
+      </w:r>
+    </w:p>
+    <w:p>
+      <w:pPr>
+        <w:pStyle w:val="Lijstalinea"/>
+        <w:numPr>
+          <w:ilvl w:val="0"/>
+          <w:numId w:val="18"/>
+        </w:numPr>
+        <w:spacing w:afterLines="24" w:after="57" w:line="288" w:lineRule="auto"/>
+      </w:pPr>
+      <w:r>
+        <w:t>Welke extra functies (bv. filters, zoekfuncties, statusiconen, visuele structuren) worden door gebruikers als het meest nuttig ervaren?</w:t>
+      </w:r>
+    </w:p>
+    <w:p>
+      <w:pPr>
+        <w:pStyle w:val="Lijstalinea"/>
+        <w:numPr>
+          <w:ilvl w:val="0"/>
+          <w:numId w:val="18"/>
+        </w:numPr>
+        <w:spacing w:afterLines="24" w:after="57" w:line="288" w:lineRule="auto"/>
+      </w:pPr>
+      <w:r>
+        <w:t xml:space="preserve">Hoe verhoudt de voorgestelde tool zich qua gebruiksvriendelijkheid en effectiviteit ten opzichte van bestaande generieke </w:t>
+      </w:r>
+      <w:proofErr w:type="spellStart"/>
+      <w:r>
+        <w:t>mindmap</w:t>
+      </w:r>
+      <w:proofErr w:type="spellEnd"/>
+      <w:r>
+        <w:t>- of diagramsoftware?</w:t>
+      </w:r>
     </w:p>
     <w:p>
       <w:pPr>
@@ -894,7 +977,13 @@
       </w:r>
       <w:proofErr w:type="spellEnd"/>
       <w:r>
-        <w:t xml:space="preserve"> toe, inclusief taken, meetinstrumenten en analysemethoden. Hoofdstuk 4 presenteert de empirische resultaten over taakprestaties, user </w:t>
+        <w:t xml:space="preserve"> toe, inclusief taken</w:t>
+      </w:r>
+      <w:r>
+        <w:t xml:space="preserve"> </w:t>
+      </w:r>
+      <w:r>
+        <w:t xml:space="preserve">en analysemethoden. Hoofdstuk 4 presenteert de empirische resultaten over taakprestaties, user </w:t>
       </w:r>
       <w:proofErr w:type="spellStart"/>
       <w:r>
@@ -902,7 +991,16 @@
       </w:r>
       <w:proofErr w:type="spellEnd"/>
       <w:r>
-        <w:t xml:space="preserve"> en feature-ranking, gevolgd door een discussie in hoofdstuk 5 waarin deze bevindingen worden geïnterpreteerd, gekoppeld aan de literatuur en aangevuld met beperkingen en implicaties voor praktijk en toekomstig onderzoek. Hoofdstuk 6 besluit met de belangrijkste conclusies en schetst mogelijke uitbreidingen, zoals AI-ondersteuning en collaboratieve functies voor breder gebruik in onderwijs en industrie.</w:t>
+        <w:t xml:space="preserve"> en feature-ranking, gevolgd door een discussie in hoofdstuk 5 waarin deze bevindingen worden geïnterpreteerd, gekoppeld aan de literatuur en aangevuld met beperkingen en implicaties voor praktijk en toekomstig onderzoek. </w:t>
+      </w:r>
+    </w:p>
+    <w:p>
+      <w:pPr>
+        <w:spacing w:afterLines="24" w:after="57" w:line="288" w:lineRule="auto"/>
+      </w:pPr>
+      <w:r>
+        <w:lastRenderedPageBreak/>
+        <w:t>Hoofdstuk 6 besluit met de belangrijkste conclusies en schetst mogelijke uitbreidingen, zoals AI-ondersteuning en collaboratieve functies voor breder gebruik in onderwijs en industrie.</w:t>
       </w:r>
       <w:r>
         <w:br w:type="page"/>
@@ -910,7 +1008,6 @@
     </w:p>
     <w:p>
       <w:pPr>
-        <w:spacing w:afterLines="24" w:after="57" w:line="288" w:lineRule="auto"/>
         <w:rPr>
           <w:b/>
           <w:bCs/>
@@ -926,8 +1023,879 @@
           <w:szCs w:val="36"/>
         </w:rPr>
         <w:lastRenderedPageBreak/>
+        <w:br w:type="page"/>
+      </w:r>
+    </w:p>
+    <w:p>
+      <w:pPr>
+        <w:spacing w:afterLines="24" w:after="57" w:line="288" w:lineRule="auto"/>
+        <w:rPr>
+          <w:b/>
+          <w:bCs/>
+          <w:sz w:val="36"/>
+          <w:szCs w:val="36"/>
+        </w:rPr>
+      </w:pPr>
+      <w:r>
+        <w:rPr>
+          <w:b/>
+          <w:bCs/>
+          <w:sz w:val="36"/>
+          <w:szCs w:val="36"/>
+        </w:rPr>
+        <w:lastRenderedPageBreak/>
         <w:t>Hoofdstuk 2</w:t>
       </w:r>
+    </w:p>
+    <w:p>
+      <w:pPr>
+        <w:spacing w:afterLines="24" w:after="57" w:line="288" w:lineRule="auto"/>
+        <w:rPr>
+          <w:b/>
+          <w:bCs/>
+          <w:sz w:val="36"/>
+          <w:szCs w:val="36"/>
+        </w:rPr>
+      </w:pPr>
+      <w:r>
+        <w:rPr>
+          <w:b/>
+          <w:bCs/>
+          <w:sz w:val="36"/>
+          <w:szCs w:val="36"/>
+        </w:rPr>
+        <w:t>Gerelateerd werk</w:t>
+      </w:r>
+    </w:p>
+    <w:p>
+      <w:pPr>
+        <w:spacing w:afterLines="24" w:after="57" w:line="288" w:lineRule="auto"/>
+        <w:rPr>
+          <w:b/>
+          <w:bCs/>
+          <w:sz w:val="36"/>
+          <w:szCs w:val="36"/>
+        </w:rPr>
+      </w:pPr>
+    </w:p>
+    <w:p>
+      <w:pPr>
+        <w:spacing w:afterLines="24" w:after="57" w:line="288" w:lineRule="auto"/>
+        <w:rPr>
+          <w:b/>
+          <w:bCs/>
+          <w:sz w:val="36"/>
+          <w:szCs w:val="36"/>
+        </w:rPr>
+      </w:pPr>
+    </w:p>
+    <w:p>
+      <w:pPr>
+        <w:spacing w:afterLines="24" w:after="57" w:line="288" w:lineRule="auto"/>
+        <w:rPr>
+          <w:b/>
+          <w:bCs/>
+          <w:sz w:val="28"/>
+          <w:szCs w:val="28"/>
+          <w:lang w:val="en-GB"/>
+        </w:rPr>
+      </w:pPr>
+      <w:r>
+        <w:rPr>
+          <w:b/>
+          <w:bCs/>
+          <w:sz w:val="28"/>
+          <w:szCs w:val="28"/>
+          <w:lang w:val="en-GB"/>
+        </w:rPr>
+        <w:t>2.1</w:t>
+      </w:r>
+      <w:r>
+        <w:rPr>
+          <w:b/>
+          <w:bCs/>
+          <w:sz w:val="28"/>
+          <w:szCs w:val="28"/>
+          <w:lang w:val="en-GB"/>
+        </w:rPr>
+        <w:t xml:space="preserve"> </w:t>
+      </w:r>
+      <w:r>
+        <w:rPr>
+          <w:b/>
+          <w:bCs/>
+          <w:sz w:val="28"/>
+          <w:szCs w:val="28"/>
+          <w:lang w:val="en-GB"/>
+        </w:rPr>
+        <w:t>State-of-the-Art in Software Security Visualization: A Systematic Review</w:t>
+      </w:r>
+    </w:p>
+    <w:p>
+      <w:pPr>
+        <w:spacing w:afterLines="24" w:after="57" w:line="288" w:lineRule="auto"/>
+        <w:rPr>
+          <w:b/>
+          <w:bCs/>
+          <w:sz w:val="28"/>
+          <w:szCs w:val="28"/>
+          <w:lang w:val="en-GB"/>
+        </w:rPr>
+      </w:pPr>
+    </w:p>
+    <w:p>
+      <w:pPr>
+        <w:spacing w:afterLines="24" w:after="57" w:line="288" w:lineRule="auto"/>
+      </w:pPr>
+      <w:proofErr w:type="spellStart"/>
+      <w:r>
+        <w:t>Devendra</w:t>
+      </w:r>
+      <w:proofErr w:type="spellEnd"/>
+      <w:r>
+        <w:t xml:space="preserve"> et al. (2025) presenteren een systematische literatuurreview van software security </w:t>
+      </w:r>
+      <w:proofErr w:type="spellStart"/>
+      <w:r>
+        <w:t>visualization</w:t>
+      </w:r>
+      <w:proofErr w:type="spellEnd"/>
+      <w:r>
+        <w:t xml:space="preserve">, gebaseerd op 61 studies uit 2019-2024. De auteurs categoriseren visualisatietechnieken in vier hoofdcategorieën: </w:t>
+      </w:r>
+      <w:proofErr w:type="spellStart"/>
+      <w:r>
+        <w:t>graph-based</w:t>
+      </w:r>
+      <w:proofErr w:type="spellEnd"/>
+      <w:r>
+        <w:t xml:space="preserve"> (bijv. </w:t>
+      </w:r>
+      <w:proofErr w:type="spellStart"/>
+      <w:r>
+        <w:t>Wireshark</w:t>
+      </w:r>
+      <w:proofErr w:type="spellEnd"/>
+      <w:r>
+        <w:t xml:space="preserve"> voor </w:t>
+      </w:r>
+      <w:proofErr w:type="spellStart"/>
+      <w:r>
+        <w:t>netwerkgrafen</w:t>
+      </w:r>
+      <w:proofErr w:type="spellEnd"/>
+      <w:r>
+        <w:t xml:space="preserve">, </w:t>
+      </w:r>
+      <w:proofErr w:type="spellStart"/>
+      <w:r>
+        <w:t>SonarQube</w:t>
+      </w:r>
+      <w:proofErr w:type="spellEnd"/>
+      <w:r>
+        <w:t xml:space="preserve"> voor </w:t>
+      </w:r>
+      <w:proofErr w:type="spellStart"/>
+      <w:r>
+        <w:t>dependency</w:t>
+      </w:r>
+      <w:proofErr w:type="spellEnd"/>
+      <w:r>
+        <w:t xml:space="preserve"> </w:t>
+      </w:r>
+      <w:proofErr w:type="spellStart"/>
+      <w:r>
+        <w:t>graphs</w:t>
+      </w:r>
+      <w:proofErr w:type="spellEnd"/>
+      <w:r>
+        <w:t xml:space="preserve">), </w:t>
+      </w:r>
+      <w:proofErr w:type="spellStart"/>
+      <w:r>
+        <w:t>notation-based</w:t>
+      </w:r>
+      <w:proofErr w:type="spellEnd"/>
+      <w:r>
+        <w:t xml:space="preserve"> (UML-diagrammen, ERD), matrix-</w:t>
+      </w:r>
+      <w:proofErr w:type="spellStart"/>
+      <w:r>
+        <w:t>based</w:t>
+      </w:r>
+      <w:proofErr w:type="spellEnd"/>
+      <w:r>
+        <w:t xml:space="preserve"> (risicomatrices via Nessus, IBM </w:t>
+      </w:r>
+      <w:proofErr w:type="spellStart"/>
+      <w:r>
+        <w:t>QRadar</w:t>
+      </w:r>
+      <w:proofErr w:type="spellEnd"/>
+      <w:r>
+        <w:t xml:space="preserve">) en </w:t>
+      </w:r>
+      <w:proofErr w:type="spellStart"/>
+      <w:r>
+        <w:t>metaphoric</w:t>
+      </w:r>
+      <w:proofErr w:type="spellEnd"/>
+      <w:r>
+        <w:t xml:space="preserve"> (geografische dreigingskaarten, security heat </w:t>
+      </w:r>
+      <w:proofErr w:type="spellStart"/>
+      <w:r>
+        <w:t>maps</w:t>
+      </w:r>
+      <w:proofErr w:type="spellEnd"/>
+      <w:r>
+        <w:t>). Deze technieken worden toegepast in statische analyse (code-</w:t>
+      </w:r>
+      <w:proofErr w:type="spellStart"/>
+      <w:r>
+        <w:t>vulnerabiliteiten</w:t>
+      </w:r>
+      <w:proofErr w:type="spellEnd"/>
+      <w:r>
+        <w:t>), dynamische analyse (</w:t>
+      </w:r>
+      <w:proofErr w:type="spellStart"/>
+      <w:r>
+        <w:t>runtime</w:t>
+      </w:r>
+      <w:proofErr w:type="spellEnd"/>
+      <w:r>
+        <w:t>-dreigingen), operationele beveiliging (log-analyse, SIEM-data) en cybersecurity (</w:t>
+      </w:r>
+      <w:proofErr w:type="spellStart"/>
+      <w:r>
+        <w:t>threat</w:t>
+      </w:r>
+      <w:proofErr w:type="spellEnd"/>
+      <w:r>
+        <w:t xml:space="preserve"> intelligence, </w:t>
+      </w:r>
+      <w:proofErr w:type="spellStart"/>
+      <w:r>
+        <w:t>phishing</w:t>
+      </w:r>
+      <w:proofErr w:type="spellEnd"/>
+      <w:r>
+        <w:t xml:space="preserve">, malware). De review identificeert belangrijke uitdagingen zoals schaalbaarheid bij grote datasets, ontoereikende toegankelijkheid voor non-experts, en het gebrek aan gestandaardiseerde </w:t>
+      </w:r>
+      <w:proofErr w:type="spellStart"/>
+      <w:r>
+        <w:t>evaluatiemetrics</w:t>
+      </w:r>
+      <w:proofErr w:type="spellEnd"/>
+      <w:r>
+        <w:t>.[</w:t>
+      </w:r>
+      <w:r>
+        <w:t>1</w:t>
+      </w:r>
+      <w:r>
+        <w:t>]</w:t>
+      </w:r>
+    </w:p>
+    <w:p>
+      <w:pPr>
+        <w:spacing w:afterLines="24" w:after="57" w:line="288" w:lineRule="auto"/>
+      </w:pPr>
+    </w:p>
+    <w:p>
+      <w:pPr>
+        <w:spacing w:afterLines="24" w:after="57" w:line="288" w:lineRule="auto"/>
+      </w:pPr>
+      <w:r>
+        <w:t xml:space="preserve">Dit werk sluit nauw aan bij de geïmplementeerde </w:t>
+      </w:r>
+      <w:proofErr w:type="spellStart"/>
+      <w:r>
+        <w:t>webtool</w:t>
+      </w:r>
+      <w:proofErr w:type="spellEnd"/>
+      <w:r>
+        <w:t xml:space="preserve"> voor </w:t>
+      </w:r>
+      <w:proofErr w:type="spellStart"/>
+      <w:r>
+        <w:t>threat</w:t>
+      </w:r>
+      <w:proofErr w:type="spellEnd"/>
+      <w:r>
+        <w:t xml:space="preserve"> </w:t>
+      </w:r>
+      <w:proofErr w:type="spellStart"/>
+      <w:r>
+        <w:t>modeling</w:t>
+      </w:r>
+      <w:proofErr w:type="spellEnd"/>
+      <w:r>
+        <w:t xml:space="preserve"> op basis van de </w:t>
+      </w:r>
+      <w:proofErr w:type="spellStart"/>
+      <w:r>
+        <w:t>Fortunately</w:t>
+      </w:r>
+      <w:proofErr w:type="spellEnd"/>
+      <w:r>
+        <w:t>–</w:t>
+      </w:r>
+      <w:proofErr w:type="spellStart"/>
+      <w:r>
+        <w:t>Unfortunately</w:t>
+      </w:r>
+      <w:proofErr w:type="spellEnd"/>
+      <w:r>
+        <w:t xml:space="preserve">-methode, die visuele ondersteuning biedt via een fileview-geïnspireerde boomstructuur met kleurcodering (groen voor </w:t>
+      </w:r>
+      <w:proofErr w:type="spellStart"/>
+      <w:r>
+        <w:t>fortunately</w:t>
+      </w:r>
+      <w:proofErr w:type="spellEnd"/>
+      <w:r>
+        <w:t xml:space="preserve">, rood voor </w:t>
+      </w:r>
+      <w:proofErr w:type="spellStart"/>
+      <w:r>
+        <w:t>unfortunately</w:t>
+      </w:r>
+      <w:proofErr w:type="spellEnd"/>
+      <w:r>
+        <w:t>), statusiconen (</w:t>
+      </w:r>
+      <w:proofErr w:type="spellStart"/>
+      <w:r>
+        <w:t>Weakness</w:t>
+      </w:r>
+      <w:proofErr w:type="spellEnd"/>
+      <w:r>
+        <w:t xml:space="preserve">, </w:t>
+      </w:r>
+      <w:proofErr w:type="spellStart"/>
+      <w:r>
+        <w:t>Verified</w:t>
+      </w:r>
+      <w:proofErr w:type="spellEnd"/>
+      <w:r>
+        <w:t xml:space="preserve"> </w:t>
+      </w:r>
+      <w:proofErr w:type="spellStart"/>
+      <w:r>
+        <w:t>Assumption</w:t>
+      </w:r>
+      <w:proofErr w:type="spellEnd"/>
+      <w:r>
+        <w:t xml:space="preserve">), </w:t>
+      </w:r>
+      <w:proofErr w:type="spellStart"/>
+      <w:r>
+        <w:t>danger</w:t>
+      </w:r>
+      <w:proofErr w:type="spellEnd"/>
+      <w:r>
+        <w:t xml:space="preserve"> ratings en filtering. Waar </w:t>
+      </w:r>
+      <w:proofErr w:type="spellStart"/>
+      <w:r>
+        <w:t>Devendra</w:t>
+      </w:r>
+      <w:proofErr w:type="spellEnd"/>
+      <w:r>
+        <w:t xml:space="preserve"> et al. </w:t>
+      </w:r>
+      <w:proofErr w:type="spellStart"/>
+      <w:r>
+        <w:t>gaps</w:t>
+      </w:r>
+      <w:proofErr w:type="spellEnd"/>
+      <w:r>
+        <w:t xml:space="preserve"> signaleren in user-</w:t>
+      </w:r>
+      <w:proofErr w:type="spellStart"/>
+      <w:r>
+        <w:t>centric</w:t>
+      </w:r>
+      <w:proofErr w:type="spellEnd"/>
+      <w:r>
+        <w:t xml:space="preserve"> design en real-time prioritering, adresseert deze masterproef deze door UX-features zoals </w:t>
+      </w:r>
+      <w:proofErr w:type="spellStart"/>
+      <w:r>
+        <w:t>branch</w:t>
+      </w:r>
+      <w:proofErr w:type="spellEnd"/>
+      <w:r>
+        <w:t xml:space="preserve"> </w:t>
+      </w:r>
+      <w:proofErr w:type="spellStart"/>
+      <w:r>
+        <w:t>summaries</w:t>
+      </w:r>
+      <w:proofErr w:type="spellEnd"/>
+      <w:r>
+        <w:t xml:space="preserve">, </w:t>
+      </w:r>
+      <w:proofErr w:type="spellStart"/>
+      <w:r>
+        <w:t>highlighting</w:t>
+      </w:r>
+      <w:proofErr w:type="spellEnd"/>
+      <w:r>
+        <w:t xml:space="preserve"> vanuit filters en automatische sortering op </w:t>
+      </w:r>
+      <w:proofErr w:type="spellStart"/>
+      <w:r>
+        <w:t>danger</w:t>
+      </w:r>
+      <w:proofErr w:type="spellEnd"/>
+      <w:r>
+        <w:t xml:space="preserve"> rating te evalueren in een gebruikersonderzoek. De empirische resultaten tonen significante verbeteringen in UEQ-scores (efficiëntie, stimulatie) voor de uitgebreide versie, wat aantoont dat </w:t>
+      </w:r>
+      <w:proofErr w:type="spellStart"/>
+      <w:r>
+        <w:t>domeinspecifieke</w:t>
+      </w:r>
+      <w:proofErr w:type="spellEnd"/>
+      <w:r>
+        <w:t xml:space="preserve"> visualisaties </w:t>
+      </w:r>
+      <w:proofErr w:type="spellStart"/>
+      <w:r>
+        <w:t>threat</w:t>
+      </w:r>
+      <w:proofErr w:type="spellEnd"/>
+      <w:r>
+        <w:t xml:space="preserve"> </w:t>
+      </w:r>
+      <w:proofErr w:type="spellStart"/>
+      <w:r>
+        <w:t>modeling</w:t>
+      </w:r>
+      <w:proofErr w:type="spellEnd"/>
+      <w:r>
+        <w:t xml:space="preserve"> toegankelijker maken voor ontwikkelaars zonder security-expertise.[1]</w:t>
+      </w:r>
+    </w:p>
+    <w:p>
+      <w:pPr>
+        <w:spacing w:afterLines="24" w:after="57" w:line="288" w:lineRule="auto"/>
+      </w:pPr>
+    </w:p>
+    <w:p>
+      <w:pPr>
+        <w:spacing w:afterLines="24" w:after="57" w:line="288" w:lineRule="auto"/>
+        <w:rPr>
+          <w:b/>
+          <w:bCs/>
+        </w:rPr>
+      </w:pPr>
+      <w:r>
+        <w:t>[</w:t>
+      </w:r>
+      <w:r>
+        <w:t>1</w:t>
+      </w:r>
+      <w:r>
+        <w:t>](</w:t>
+      </w:r>
+      <w:hyperlink r:id="rId7" w:history="1">
+        <w:r>
+          <w:rPr>
+            <w:rStyle w:val="Hyperlink"/>
+          </w:rPr>
+          <w:t>https://arxiv.org/html/2509.20385v1</w:t>
+        </w:r>
+      </w:hyperlink>
+      <w:r>
+        <w:t>)</w:t>
+      </w:r>
+    </w:p>
+    <w:p>
+      <w:pPr>
+        <w:spacing w:afterLines="24" w:after="57" w:line="288" w:lineRule="auto"/>
+        <w:rPr>
+          <w:b/>
+          <w:bCs/>
+        </w:rPr>
+      </w:pPr>
+    </w:p>
+    <w:p>
+      <w:pPr>
+        <w:rPr>
+          <w:b/>
+          <w:bCs/>
+          <w:sz w:val="28"/>
+          <w:szCs w:val="28"/>
+          <w:lang w:val="en-GB"/>
+        </w:rPr>
+      </w:pPr>
+      <w:r>
+        <w:rPr>
+          <w:b/>
+          <w:bCs/>
+          <w:sz w:val="28"/>
+          <w:szCs w:val="28"/>
+          <w:lang w:val="en-GB"/>
+        </w:rPr>
+        <w:br w:type="page"/>
+      </w:r>
+    </w:p>
+    <w:p>
+      <w:pPr>
+        <w:spacing w:afterLines="24" w:after="57" w:line="288" w:lineRule="auto"/>
+        <w:rPr>
+          <w:b/>
+          <w:bCs/>
+          <w:sz w:val="28"/>
+          <w:szCs w:val="28"/>
+          <w:lang w:val="en-GB"/>
+        </w:rPr>
+      </w:pPr>
+      <w:r>
+        <w:rPr>
+          <w:b/>
+          <w:bCs/>
+          <w:sz w:val="28"/>
+          <w:szCs w:val="28"/>
+          <w:lang w:val="en-GB"/>
+        </w:rPr>
+        <w:lastRenderedPageBreak/>
+        <w:t xml:space="preserve">2.2 Threat </w:t>
+      </w:r>
+      <w:proofErr w:type="spellStart"/>
+      <w:r>
+        <w:rPr>
+          <w:b/>
+          <w:bCs/>
+          <w:sz w:val="28"/>
+          <w:szCs w:val="28"/>
+          <w:lang w:val="en-GB"/>
+        </w:rPr>
+        <w:t>modeling</w:t>
+      </w:r>
+      <w:proofErr w:type="spellEnd"/>
+      <w:r>
+        <w:rPr>
+          <w:b/>
+          <w:bCs/>
+          <w:sz w:val="28"/>
+          <w:szCs w:val="28"/>
+          <w:lang w:val="en-GB"/>
+        </w:rPr>
+        <w:t xml:space="preserve"> tools: A t</w:t>
+      </w:r>
+      <w:r>
+        <w:rPr>
+          <w:b/>
+          <w:bCs/>
+          <w:sz w:val="28"/>
+          <w:szCs w:val="28"/>
+          <w:lang w:val="en-GB"/>
+        </w:rPr>
+        <w:t>axonomy</w:t>
+      </w:r>
+    </w:p>
+    <w:p>
+      <w:pPr>
+        <w:spacing w:afterLines="24" w:after="57" w:line="288" w:lineRule="auto"/>
+        <w:rPr>
+          <w:b/>
+          <w:bCs/>
+          <w:sz w:val="28"/>
+          <w:szCs w:val="28"/>
+          <w:lang w:val="en-GB"/>
+        </w:rPr>
+      </w:pPr>
+    </w:p>
+    <w:p>
+      <w:pPr>
+        <w:spacing w:afterLines="24" w:after="57" w:line="288" w:lineRule="auto"/>
+      </w:pPr>
+      <w:proofErr w:type="spellStart"/>
+      <w:r>
+        <w:t>Shi</w:t>
+      </w:r>
+      <w:proofErr w:type="spellEnd"/>
+      <w:r>
+        <w:t xml:space="preserve"> et al. (2022) bieden een taxonomie en kwalitatieve vergelijking van </w:t>
+      </w:r>
+      <w:proofErr w:type="spellStart"/>
+      <w:r>
+        <w:t>threat</w:t>
+      </w:r>
+      <w:proofErr w:type="spellEnd"/>
+      <w:r>
+        <w:t xml:space="preserve"> </w:t>
+      </w:r>
+      <w:proofErr w:type="spellStart"/>
+      <w:r>
+        <w:t>modeling</w:t>
+      </w:r>
+      <w:proofErr w:type="spellEnd"/>
+      <w:r>
+        <w:t xml:space="preserve"> tools, gebaseerd op objectieve criteria zoals modelvorm (diagram- vs. tekst-gebaseerd), </w:t>
+      </w:r>
+      <w:proofErr w:type="spellStart"/>
+      <w:r>
+        <w:t>threat</w:t>
+      </w:r>
+      <w:proofErr w:type="spellEnd"/>
+      <w:r>
+        <w:t xml:space="preserve"> </w:t>
+      </w:r>
+      <w:proofErr w:type="spellStart"/>
+      <w:r>
+        <w:t>library</w:t>
+      </w:r>
+      <w:proofErr w:type="spellEnd"/>
+      <w:r>
+        <w:t xml:space="preserve"> grootte, evaluatiemethoden, mitigatie-suggesties, beschikbaarheid en SDLC-integratie. Ze evalueren zes populaire tools (Microsoft TMT, OWASP </w:t>
+      </w:r>
+      <w:proofErr w:type="spellStart"/>
+      <w:r>
+        <w:t>Threat</w:t>
+      </w:r>
+      <w:proofErr w:type="spellEnd"/>
+      <w:r>
+        <w:t xml:space="preserve"> Dragon, OVVL, OWASP </w:t>
+      </w:r>
+      <w:proofErr w:type="spellStart"/>
+      <w:r>
+        <w:t>pytm</w:t>
+      </w:r>
+      <w:proofErr w:type="spellEnd"/>
+      <w:r>
+        <w:t xml:space="preserve">, </w:t>
+      </w:r>
+      <w:proofErr w:type="spellStart"/>
+      <w:r>
+        <w:t>Threagile</w:t>
+      </w:r>
+      <w:proofErr w:type="spellEnd"/>
+      <w:r>
+        <w:t xml:space="preserve">, </w:t>
+      </w:r>
+      <w:proofErr w:type="spellStart"/>
+      <w:r>
+        <w:t>IriusRisk</w:t>
+      </w:r>
+      <w:proofErr w:type="spellEnd"/>
+      <w:r>
+        <w:t xml:space="preserve">) en tonen dat diagram-gebaseerde tools (zoals TMT) intuïtiever zijn voor non-experts maar vaak gebrek vertoont aan </w:t>
+      </w:r>
+      <w:proofErr w:type="spellStart"/>
+      <w:r>
+        <w:t>threat</w:t>
+      </w:r>
+      <w:proofErr w:type="spellEnd"/>
+      <w:r>
+        <w:t xml:space="preserve"> tracking en automatische evaluatie, terwijl tekst-tools (</w:t>
+      </w:r>
+      <w:proofErr w:type="spellStart"/>
+      <w:r>
+        <w:t>pytm</w:t>
+      </w:r>
+      <w:proofErr w:type="spellEnd"/>
+      <w:r>
+        <w:t xml:space="preserve">, </w:t>
+      </w:r>
+      <w:proofErr w:type="spellStart"/>
+      <w:r>
+        <w:t>Threagile</w:t>
+      </w:r>
+      <w:proofErr w:type="spellEnd"/>
+      <w:r>
+        <w:t xml:space="preserve">) beter schalen voor versiebeheer maar minder gebruiksvriendelijk zijn. Commerciële tools zoals </w:t>
+      </w:r>
+      <w:proofErr w:type="spellStart"/>
+      <w:r>
+        <w:t>IriusRisk</w:t>
+      </w:r>
+      <w:proofErr w:type="spellEnd"/>
+      <w:r>
+        <w:t xml:space="preserve"> scoren hoger op </w:t>
+      </w:r>
+      <w:proofErr w:type="spellStart"/>
+      <w:r>
+        <w:t>completeness</w:t>
+      </w:r>
+      <w:proofErr w:type="spellEnd"/>
+      <w:r>
+        <w:t xml:space="preserve"> (grote </w:t>
+      </w:r>
+      <w:proofErr w:type="spellStart"/>
+      <w:r>
+        <w:t>libraries</w:t>
+      </w:r>
+      <w:proofErr w:type="spellEnd"/>
+      <w:r>
+        <w:t xml:space="preserve"> &gt;200 </w:t>
+      </w:r>
+      <w:proofErr w:type="spellStart"/>
+      <w:r>
+        <w:t>threats</w:t>
+      </w:r>
+      <w:proofErr w:type="spellEnd"/>
+      <w:r>
+        <w:t>, kostenramingen), maar open-source alternatieven blijven immature met beperkte functionaliteit.[1]</w:t>
+      </w:r>
+    </w:p>
+    <w:p>
+      <w:pPr>
+        <w:spacing w:afterLines="24" w:after="57" w:line="288" w:lineRule="auto"/>
+      </w:pPr>
+    </w:p>
+    <w:p>
+      <w:pPr>
+        <w:spacing w:afterLines="24" w:after="57" w:line="288" w:lineRule="auto"/>
+      </w:pPr>
+      <w:r>
+        <w:t xml:space="preserve">Dit werk positioneert de geïmplementeerde </w:t>
+      </w:r>
+      <w:proofErr w:type="spellStart"/>
+      <w:r>
+        <w:t>Fortunately</w:t>
+      </w:r>
+      <w:proofErr w:type="spellEnd"/>
+      <w:r>
+        <w:t>–</w:t>
+      </w:r>
+      <w:proofErr w:type="spellStart"/>
+      <w:r>
+        <w:t>Unfortunately</w:t>
+      </w:r>
+      <w:proofErr w:type="spellEnd"/>
+      <w:r>
+        <w:t xml:space="preserve"> </w:t>
+      </w:r>
+      <w:proofErr w:type="spellStart"/>
+      <w:r>
+        <w:t>webtool</w:t>
+      </w:r>
+      <w:proofErr w:type="spellEnd"/>
+      <w:r>
+        <w:t xml:space="preserve"> als een complementaire, </w:t>
+      </w:r>
+      <w:proofErr w:type="spellStart"/>
+      <w:r>
+        <w:t>lightweight</w:t>
+      </w:r>
+      <w:proofErr w:type="spellEnd"/>
+      <w:r>
+        <w:t xml:space="preserve"> oplossing tussen deze categorieën, met een diagram-gebaseerde fileview-boomstructuur die de </w:t>
+      </w:r>
+      <w:proofErr w:type="spellStart"/>
+      <w:r>
+        <w:t>intuïtiviteit</w:t>
+      </w:r>
+      <w:proofErr w:type="spellEnd"/>
+      <w:r>
+        <w:t xml:space="preserve"> van tools zoals TMT combineert met </w:t>
+      </w:r>
+      <w:proofErr w:type="spellStart"/>
+      <w:r>
+        <w:t>threat</w:t>
+      </w:r>
+      <w:proofErr w:type="spellEnd"/>
+      <w:r>
+        <w:t xml:space="preserve"> tracking (statusiconen: </w:t>
+      </w:r>
+      <w:proofErr w:type="spellStart"/>
+      <w:r>
+        <w:t>Weakness</w:t>
+      </w:r>
+      <w:proofErr w:type="spellEnd"/>
+      <w:r>
+        <w:t xml:space="preserve">, </w:t>
+      </w:r>
+      <w:proofErr w:type="spellStart"/>
+      <w:r>
+        <w:t>Verified</w:t>
+      </w:r>
+      <w:proofErr w:type="spellEnd"/>
+      <w:r>
+        <w:t xml:space="preserve"> </w:t>
+      </w:r>
+      <w:proofErr w:type="spellStart"/>
+      <w:r>
+        <w:t>Assumption</w:t>
+      </w:r>
+      <w:proofErr w:type="spellEnd"/>
+      <w:r>
+        <w:t>) en automatische evaluatie (</w:t>
+      </w:r>
+      <w:proofErr w:type="spellStart"/>
+      <w:r>
+        <w:t>danger</w:t>
+      </w:r>
+      <w:proofErr w:type="spellEnd"/>
+      <w:r>
+        <w:t xml:space="preserve"> ratings op basis van </w:t>
+      </w:r>
+      <w:proofErr w:type="spellStart"/>
+      <w:r>
+        <w:t>likelihood</w:t>
+      </w:r>
+      <w:proofErr w:type="spellEnd"/>
+      <w:r>
+        <w:t xml:space="preserve">/impact). Waar </w:t>
+      </w:r>
+      <w:proofErr w:type="spellStart"/>
+      <w:r>
+        <w:t>Shi</w:t>
+      </w:r>
+      <w:proofErr w:type="spellEnd"/>
+      <w:r>
+        <w:t xml:space="preserve"> et al. immature open-source tools en eenvoudige evaluatiemethoden identificeren als </w:t>
+      </w:r>
+      <w:proofErr w:type="spellStart"/>
+      <w:r>
+        <w:t>gaps</w:t>
+      </w:r>
+      <w:proofErr w:type="spellEnd"/>
+      <w:r>
+        <w:t xml:space="preserve">, evalueert deze masterproef empirisch (UEQ-scores, gebruikersonderzoek) hoe UX-features zoals filtering, sortering en </w:t>
+      </w:r>
+      <w:proofErr w:type="spellStart"/>
+      <w:r>
+        <w:t>branch</w:t>
+      </w:r>
+      <w:proofErr w:type="spellEnd"/>
+      <w:r>
+        <w:t xml:space="preserve"> </w:t>
+      </w:r>
+      <w:proofErr w:type="spellStart"/>
+      <w:r>
+        <w:t>summaries</w:t>
+      </w:r>
+      <w:proofErr w:type="spellEnd"/>
+      <w:r>
+        <w:t xml:space="preserve"> </w:t>
+      </w:r>
+      <w:proofErr w:type="spellStart"/>
+      <w:r>
+        <w:t>threat</w:t>
+      </w:r>
+      <w:proofErr w:type="spellEnd"/>
+      <w:r>
+        <w:t xml:space="preserve"> </w:t>
+      </w:r>
+      <w:proofErr w:type="spellStart"/>
+      <w:r>
+        <w:t>modeling</w:t>
+      </w:r>
+      <w:proofErr w:type="spellEnd"/>
+      <w:r>
+        <w:t xml:space="preserve"> efficiënter maken voor niet-security-experts, met versie 2 significant superieur aan basisfunctionaliteit.[1]</w:t>
+      </w:r>
+    </w:p>
+    <w:p>
+      <w:pPr>
+        <w:spacing w:afterLines="24" w:after="57" w:line="288" w:lineRule="auto"/>
+      </w:pPr>
     </w:p>
     <w:p>
       <w:pPr>
@@ -940,13 +1908,7 @@
         </w:rPr>
       </w:pPr>
       <w:r>
-        <w:rPr>
-          <w:b/>
-          <w:bCs/>
-          <w:sz w:val="36"/>
-          <w:szCs w:val="36"/>
-        </w:rPr>
-        <w:t>Gerelateerd werk</w:t>
+        <w:t>[1](https://www.semanticscholar.org/paper/Threat-Modeling-Tools:-A-Taxonomy-Shi-Graffi/62caab5d4cfe006ec9cf1536212aa32e02d61c04)</w:t>
       </w:r>
       <w:r>
         <w:rPr>
@@ -955,27 +1917,6 @@
           <w:sz w:val="32"/>
           <w:szCs w:val="32"/>
         </w:rPr>
-        <w:br w:type="page"/>
-      </w:r>
-    </w:p>
-    <w:p>
-      <w:pPr>
-        <w:spacing w:afterLines="24" w:after="57" w:line="288" w:lineRule="auto"/>
-        <w:rPr>
-          <w:b/>
-          <w:bCs/>
-          <w:sz w:val="32"/>
-          <w:szCs w:val="32"/>
-        </w:rPr>
-      </w:pPr>
-      <w:r>
-        <w:rPr>
-          <w:b/>
-          <w:bCs/>
-          <w:sz w:val="32"/>
-          <w:szCs w:val="32"/>
-        </w:rPr>
-        <w:lastRenderedPageBreak/>
         <w:br w:type="page"/>
       </w:r>
     </w:p>
@@ -1667,7 +2608,7 @@
                     <pic:cNvPicPr/>
                   </pic:nvPicPr>
                   <pic:blipFill>
-                    <a:blip r:embed="rId7" cstate="print">
+                    <a:blip r:embed="rId8" cstate="print">
                       <a:extLst>
                         <a:ext uri="{28A0092B-C50C-407E-A947-70E740481C1C}">
                           <a14:useLocalDpi xmlns:a14="http://schemas.microsoft.com/office/drawing/2010/main" val="0"/>
@@ -1725,7 +2666,7 @@
                     <pic:cNvPicPr/>
                   </pic:nvPicPr>
                   <pic:blipFill>
-                    <a:blip r:embed="rId8" cstate="print">
+                    <a:blip r:embed="rId9" cstate="print">
                       <a:extLst>
                         <a:ext uri="{28A0092B-C50C-407E-A947-70E740481C1C}">
                           <a14:useLocalDpi xmlns:a14="http://schemas.microsoft.com/office/drawing/2010/main" val="0"/>
@@ -1848,7 +2789,7 @@
                     <pic:cNvPicPr/>
                   </pic:nvPicPr>
                   <pic:blipFill>
-                    <a:blip r:embed="rId9">
+                    <a:blip r:embed="rId10">
                       <a:extLst>
                         <a:ext uri="{28A0092B-C50C-407E-A947-70E740481C1C}">
                           <a14:useLocalDpi xmlns:a14="http://schemas.microsoft.com/office/drawing/2010/main" val="0"/>
@@ -2186,7 +3127,7 @@
                     <pic:cNvPicPr/>
                   </pic:nvPicPr>
                   <pic:blipFill>
-                    <a:blip r:embed="rId10">
+                    <a:blip r:embed="rId11">
                       <a:extLst>
                         <a:ext uri="{28A0092B-C50C-407E-A947-70E740481C1C}">
                           <a14:useLocalDpi xmlns:a14="http://schemas.microsoft.com/office/drawing/2010/main" val="0"/>
@@ -2243,7 +3184,7 @@
                     <pic:cNvPicPr/>
                   </pic:nvPicPr>
                   <pic:blipFill>
-                    <a:blip r:embed="rId11">
+                    <a:blip r:embed="rId12">
                       <a:extLst>
                         <a:ext uri="{28A0092B-C50C-407E-A947-70E740481C1C}">
                           <a14:useLocalDpi xmlns:a14="http://schemas.microsoft.com/office/drawing/2010/main" val="0"/>
@@ -2649,7 +3590,7 @@
                     <pic:cNvPicPr/>
                   </pic:nvPicPr>
                   <pic:blipFill>
-                    <a:blip r:embed="rId12">
+                    <a:blip r:embed="rId13">
                       <a:extLst>
                         <a:ext uri="{28A0092B-C50C-407E-A947-70E740481C1C}">
                           <a14:useLocalDpi xmlns:a14="http://schemas.microsoft.com/office/drawing/2010/main" val="0"/>
@@ -2706,7 +3647,7 @@
                     <pic:cNvPicPr/>
                   </pic:nvPicPr>
                   <pic:blipFill>
-                    <a:blip r:embed="rId13">
+                    <a:blip r:embed="rId14">
                       <a:extLst>
                         <a:ext uri="{28A0092B-C50C-407E-A947-70E740481C1C}">
                           <a14:useLocalDpi xmlns:a14="http://schemas.microsoft.com/office/drawing/2010/main" val="0"/>
@@ -2763,7 +3704,7 @@
                     <pic:cNvPicPr/>
                   </pic:nvPicPr>
                   <pic:blipFill>
-                    <a:blip r:embed="rId14">
+                    <a:blip r:embed="rId15">
                       <a:extLst>
                         <a:ext uri="{28A0092B-C50C-407E-A947-70E740481C1C}">
                           <a14:useLocalDpi xmlns:a14="http://schemas.microsoft.com/office/drawing/2010/main" val="0"/>
@@ -2820,7 +3761,7 @@
                     <pic:cNvPicPr/>
                   </pic:nvPicPr>
                   <pic:blipFill>
-                    <a:blip r:embed="rId15">
+                    <a:blip r:embed="rId16">
                       <a:extLst>
                         <a:ext uri="{28A0092B-C50C-407E-A947-70E740481C1C}">
                           <a14:useLocalDpi xmlns:a14="http://schemas.microsoft.com/office/drawing/2010/main" val="0"/>
@@ -2962,7 +3903,7 @@
                     <pic:cNvPicPr/>
                   </pic:nvPicPr>
                   <pic:blipFill>
-                    <a:blip r:embed="rId16">
+                    <a:blip r:embed="rId17">
                       <a:extLst>
                         <a:ext uri="{28A0092B-C50C-407E-A947-70E740481C1C}">
                           <a14:useLocalDpi xmlns:a14="http://schemas.microsoft.com/office/drawing/2010/main" val="0"/>
@@ -3232,7 +4173,7 @@
                     <pic:cNvPicPr/>
                   </pic:nvPicPr>
                   <pic:blipFill>
-                    <a:blip r:embed="rId17">
+                    <a:blip r:embed="rId18">
                       <a:extLst>
                         <a:ext uri="{28A0092B-C50C-407E-A947-70E740481C1C}">
                           <a14:useLocalDpi xmlns:a14="http://schemas.microsoft.com/office/drawing/2010/main" val="0"/>
@@ -3435,7 +4376,7 @@
                     <pic:cNvPicPr/>
                   </pic:nvPicPr>
                   <pic:blipFill>
-                    <a:blip r:embed="rId18">
+                    <a:blip r:embed="rId19">
                       <a:extLst>
                         <a:ext uri="{28A0092B-C50C-407E-A947-70E740481C1C}">
                           <a14:useLocalDpi xmlns:a14="http://schemas.microsoft.com/office/drawing/2010/main" val="0"/>
@@ -3488,7 +4429,7 @@
                     <pic:cNvPicPr/>
                   </pic:nvPicPr>
                   <pic:blipFill>
-                    <a:blip r:embed="rId19">
+                    <a:blip r:embed="rId20">
                       <a:extLst>
                         <a:ext uri="{28A0092B-C50C-407E-A947-70E740481C1C}">
                           <a14:useLocalDpi xmlns:a14="http://schemas.microsoft.com/office/drawing/2010/main" val="0"/>
@@ -3545,7 +4486,7 @@
                     <pic:cNvPicPr/>
                   </pic:nvPicPr>
                   <pic:blipFill>
-                    <a:blip r:embed="rId20">
+                    <a:blip r:embed="rId21">
                       <a:extLst>
                         <a:ext uri="{28A0092B-C50C-407E-A947-70E740481C1C}">
                           <a14:useLocalDpi xmlns:a14="http://schemas.microsoft.com/office/drawing/2010/main" val="0"/>
@@ -3843,7 +4784,7 @@
                     <pic:cNvPicPr/>
                   </pic:nvPicPr>
                   <pic:blipFill>
-                    <a:blip r:embed="rId21">
+                    <a:blip r:embed="rId22">
                       <a:extLst>
                         <a:ext uri="{28A0092B-C50C-407E-A947-70E740481C1C}">
                           <a14:useLocalDpi xmlns:a14="http://schemas.microsoft.com/office/drawing/2010/main" val="0"/>
@@ -3916,7 +4857,7 @@
                     <pic:cNvPicPr/>
                   </pic:nvPicPr>
                   <pic:blipFill>
-                    <a:blip r:embed="rId22">
+                    <a:blip r:embed="rId23">
                       <a:extLst>
                         <a:ext uri="{28A0092B-C50C-407E-A947-70E740481C1C}">
                           <a14:useLocalDpi xmlns:a14="http://schemas.microsoft.com/office/drawing/2010/main" val="0"/>
@@ -4056,7 +4997,7 @@
                     <pic:cNvPicPr/>
                   </pic:nvPicPr>
                   <pic:blipFill>
-                    <a:blip r:embed="rId23">
+                    <a:blip r:embed="rId24">
                       <a:extLst>
                         <a:ext uri="{28A0092B-C50C-407E-A947-70E740481C1C}">
                           <a14:useLocalDpi xmlns:a14="http://schemas.microsoft.com/office/drawing/2010/main" val="0"/>
@@ -4113,7 +5054,7 @@
                     <pic:cNvPicPr/>
                   </pic:nvPicPr>
                   <pic:blipFill>
-                    <a:blip r:embed="rId24">
+                    <a:blip r:embed="rId25">
                       <a:extLst>
                         <a:ext uri="{28A0092B-C50C-407E-A947-70E740481C1C}">
                           <a14:useLocalDpi xmlns:a14="http://schemas.microsoft.com/office/drawing/2010/main" val="0"/>
@@ -4170,7 +5111,7 @@
                     <pic:cNvPicPr/>
                   </pic:nvPicPr>
                   <pic:blipFill>
-                    <a:blip r:embed="rId25">
+                    <a:blip r:embed="rId26">
                       <a:extLst>
                         <a:ext uri="{28A0092B-C50C-407E-A947-70E740481C1C}">
                           <a14:useLocalDpi xmlns:a14="http://schemas.microsoft.com/office/drawing/2010/main" val="0"/>
@@ -4227,7 +5168,7 @@
                     <pic:cNvPicPr/>
                   </pic:nvPicPr>
                   <pic:blipFill>
-                    <a:blip r:embed="rId26">
+                    <a:blip r:embed="rId27">
                       <a:extLst>
                         <a:ext uri="{28A0092B-C50C-407E-A947-70E740481C1C}">
                           <a14:useLocalDpi xmlns:a14="http://schemas.microsoft.com/office/drawing/2010/main" val="0"/>
@@ -6457,7 +7398,7 @@
                     <pic:cNvPicPr/>
                   </pic:nvPicPr>
                   <pic:blipFill>
-                    <a:blip r:embed="rId27">
+                    <a:blip r:embed="rId28">
                       <a:extLst>
                         <a:ext uri="{28A0092B-C50C-407E-A947-70E740481C1C}">
                           <a14:useLocalDpi xmlns:a14="http://schemas.microsoft.com/office/drawing/2010/main" val="0"/>
@@ -6521,7 +7462,7 @@
                     <pic:cNvPicPr/>
                   </pic:nvPicPr>
                   <pic:blipFill>
-                    <a:blip r:embed="rId28">
+                    <a:blip r:embed="rId29">
                       <a:extLst>
                         <a:ext uri="{28A0092B-C50C-407E-A947-70E740481C1C}">
                           <a14:useLocalDpi xmlns:a14="http://schemas.microsoft.com/office/drawing/2010/main" val="0"/>
@@ -6586,7 +7527,7 @@
                     <pic:cNvPicPr/>
                   </pic:nvPicPr>
                   <pic:blipFill>
-                    <a:blip r:embed="rId29" cstate="print">
+                    <a:blip r:embed="rId30" cstate="print">
                       <a:extLst>
                         <a:ext uri="{28A0092B-C50C-407E-A947-70E740481C1C}">
                           <a14:useLocalDpi xmlns:a14="http://schemas.microsoft.com/office/drawing/2010/main" val="0"/>
@@ -7613,7 +8554,7 @@
                     <pic:cNvPicPr/>
                   </pic:nvPicPr>
                   <pic:blipFill>
-                    <a:blip r:embed="rId30" cstate="print">
+                    <a:blip r:embed="rId31" cstate="print">
                       <a:extLst>
                         <a:ext uri="{28A0092B-C50C-407E-A947-70E740481C1C}">
                           <a14:useLocalDpi xmlns:a14="http://schemas.microsoft.com/office/drawing/2010/main" val="0"/>
@@ -9237,6 +10178,633 @@
         <w:spacing w:afterLines="24" w:after="57" w:line="288" w:lineRule="auto"/>
         <w:rPr>
           <w:rFonts w:eastAsia="Times New Roman" w:cs="Times New Roman"/>
+          <w:kern w:val="0"/>
+          <w:lang w:eastAsia="nl-BE"/>
+          <w14:ligatures w14:val="none"/>
+        </w:rPr>
+      </w:pPr>
+    </w:p>
+    <w:p>
+      <w:pPr>
+        <w:spacing w:afterLines="24" w:after="57" w:line="288" w:lineRule="auto"/>
+        <w:rPr>
+          <w:b/>
+          <w:bCs/>
+        </w:rPr>
+      </w:pPr>
+      <w:r>
+        <w:rPr>
+          <w:rFonts w:eastAsia="Times New Roman" w:cs="Times New Roman"/>
+          <w:kern w:val="0"/>
+          <w:lang w:eastAsia="nl-BE"/>
+          <w14:ligatures w14:val="none"/>
+        </w:rPr>
+        <w:t xml:space="preserve">De resultaten valideren en verfijnen inzichten uit recente literatuur over security visualisatie en </w:t>
+      </w:r>
+      <w:proofErr w:type="spellStart"/>
+      <w:r>
+        <w:rPr>
+          <w:rFonts w:eastAsia="Times New Roman" w:cs="Times New Roman"/>
+          <w:kern w:val="0"/>
+          <w:lang w:eastAsia="nl-BE"/>
+          <w14:ligatures w14:val="none"/>
+        </w:rPr>
+        <w:t>threat</w:t>
+      </w:r>
+      <w:proofErr w:type="spellEnd"/>
+      <w:r>
+        <w:rPr>
+          <w:rFonts w:eastAsia="Times New Roman" w:cs="Times New Roman"/>
+          <w:kern w:val="0"/>
+          <w:lang w:eastAsia="nl-BE"/>
+          <w14:ligatures w14:val="none"/>
+        </w:rPr>
+        <w:t xml:space="preserve"> </w:t>
+      </w:r>
+      <w:proofErr w:type="spellStart"/>
+      <w:r>
+        <w:rPr>
+          <w:rFonts w:eastAsia="Times New Roman" w:cs="Times New Roman"/>
+          <w:kern w:val="0"/>
+          <w:lang w:eastAsia="nl-BE"/>
+          <w14:ligatures w14:val="none"/>
+        </w:rPr>
+        <w:t>modeling</w:t>
+      </w:r>
+      <w:proofErr w:type="spellEnd"/>
+      <w:r>
+        <w:rPr>
+          <w:rFonts w:eastAsia="Times New Roman" w:cs="Times New Roman"/>
+          <w:kern w:val="0"/>
+          <w:lang w:eastAsia="nl-BE"/>
+          <w14:ligatures w14:val="none"/>
+        </w:rPr>
+        <w:t xml:space="preserve"> tools. </w:t>
+      </w:r>
+      <w:proofErr w:type="spellStart"/>
+      <w:r>
+        <w:rPr>
+          <w:rFonts w:eastAsia="Times New Roman" w:cs="Times New Roman"/>
+          <w:kern w:val="0"/>
+          <w:lang w:eastAsia="nl-BE"/>
+          <w14:ligatures w14:val="none"/>
+        </w:rPr>
+        <w:t>Devendra</w:t>
+      </w:r>
+      <w:proofErr w:type="spellEnd"/>
+      <w:r>
+        <w:rPr>
+          <w:rFonts w:eastAsia="Times New Roman" w:cs="Times New Roman"/>
+          <w:kern w:val="0"/>
+          <w:lang w:eastAsia="nl-BE"/>
+          <w14:ligatures w14:val="none"/>
+        </w:rPr>
+        <w:t xml:space="preserve"> et al. (2025) identificeren </w:t>
+      </w:r>
+      <w:proofErr w:type="spellStart"/>
+      <w:r>
+        <w:rPr>
+          <w:rFonts w:eastAsia="Times New Roman" w:cs="Times New Roman"/>
+          <w:kern w:val="0"/>
+          <w:lang w:eastAsia="nl-BE"/>
+          <w14:ligatures w14:val="none"/>
+        </w:rPr>
+        <w:t>graph-based</w:t>
+      </w:r>
+      <w:proofErr w:type="spellEnd"/>
+      <w:r>
+        <w:rPr>
+          <w:rFonts w:eastAsia="Times New Roman" w:cs="Times New Roman"/>
+          <w:kern w:val="0"/>
+          <w:lang w:eastAsia="nl-BE"/>
+          <w14:ligatures w14:val="none"/>
+        </w:rPr>
+        <w:t xml:space="preserve"> en </w:t>
+      </w:r>
+      <w:proofErr w:type="spellStart"/>
+      <w:r>
+        <w:rPr>
+          <w:rFonts w:eastAsia="Times New Roman" w:cs="Times New Roman"/>
+          <w:kern w:val="0"/>
+          <w:lang w:eastAsia="nl-BE"/>
+          <w14:ligatures w14:val="none"/>
+        </w:rPr>
+        <w:t>notation-based</w:t>
+      </w:r>
+      <w:proofErr w:type="spellEnd"/>
+      <w:r>
+        <w:rPr>
+          <w:rFonts w:eastAsia="Times New Roman" w:cs="Times New Roman"/>
+          <w:kern w:val="0"/>
+          <w:lang w:eastAsia="nl-BE"/>
+          <w14:ligatures w14:val="none"/>
+        </w:rPr>
+        <w:t xml:space="preserve"> visualisaties als dominante technieken, maar signaleren een gebrek aan toegankelijkheid voor non-experts en schaalbaarheid bij </w:t>
+      </w:r>
+      <w:proofErr w:type="spellStart"/>
+      <w:r>
+        <w:rPr>
+          <w:rFonts w:eastAsia="Times New Roman" w:cs="Times New Roman"/>
+          <w:kern w:val="0"/>
+          <w:lang w:eastAsia="nl-BE"/>
+          <w14:ligatures w14:val="none"/>
+        </w:rPr>
+        <w:t>hirarchische</w:t>
+      </w:r>
+      <w:proofErr w:type="spellEnd"/>
+      <w:r>
+        <w:rPr>
+          <w:rFonts w:eastAsia="Times New Roman" w:cs="Times New Roman"/>
+          <w:kern w:val="0"/>
+          <w:lang w:eastAsia="nl-BE"/>
+          <w14:ligatures w14:val="none"/>
+        </w:rPr>
+        <w:t xml:space="preserve"> data. De fileview-geïnspireerde boomstructuur met filtering en </w:t>
+      </w:r>
+      <w:proofErr w:type="spellStart"/>
+      <w:r>
+        <w:rPr>
+          <w:rFonts w:eastAsia="Times New Roman" w:cs="Times New Roman"/>
+          <w:kern w:val="0"/>
+          <w:lang w:eastAsia="nl-BE"/>
+          <w14:ligatures w14:val="none"/>
+        </w:rPr>
+        <w:t>danger</w:t>
+      </w:r>
+      <w:proofErr w:type="spellEnd"/>
+      <w:r>
+        <w:rPr>
+          <w:rFonts w:eastAsia="Times New Roman" w:cs="Times New Roman"/>
+          <w:kern w:val="0"/>
+          <w:lang w:eastAsia="nl-BE"/>
+          <w14:ligatures w14:val="none"/>
+        </w:rPr>
+        <w:t xml:space="preserve"> rating sortering adresseert deze </w:t>
+      </w:r>
+      <w:proofErr w:type="spellStart"/>
+      <w:r>
+        <w:rPr>
+          <w:rFonts w:eastAsia="Times New Roman" w:cs="Times New Roman"/>
+          <w:kern w:val="0"/>
+          <w:lang w:eastAsia="nl-BE"/>
+          <w14:ligatures w14:val="none"/>
+        </w:rPr>
+        <w:t>gaps</w:t>
+      </w:r>
+      <w:proofErr w:type="spellEnd"/>
+      <w:r>
+        <w:rPr>
+          <w:rFonts w:eastAsia="Times New Roman" w:cs="Times New Roman"/>
+          <w:kern w:val="0"/>
+          <w:lang w:eastAsia="nl-BE"/>
+          <w14:ligatures w14:val="none"/>
+        </w:rPr>
+        <w:t xml:space="preserve"> direct: versie 2 toont significante UEQ-verbeteringen op efficiëntie (+1.7) en stimulatie (+2.1), wat aantoont dat </w:t>
+      </w:r>
+      <w:proofErr w:type="spellStart"/>
+      <w:r>
+        <w:rPr>
+          <w:rFonts w:eastAsia="Times New Roman" w:cs="Times New Roman"/>
+          <w:kern w:val="0"/>
+          <w:lang w:eastAsia="nl-BE"/>
+          <w14:ligatures w14:val="none"/>
+        </w:rPr>
+        <w:t>domeinspecifieke</w:t>
+      </w:r>
+      <w:proofErr w:type="spellEnd"/>
+      <w:r>
+        <w:rPr>
+          <w:rFonts w:eastAsia="Times New Roman" w:cs="Times New Roman"/>
+          <w:kern w:val="0"/>
+          <w:lang w:eastAsia="nl-BE"/>
+          <w14:ligatures w14:val="none"/>
+        </w:rPr>
+        <w:t xml:space="preserve"> UX-features cognitieve load reduceren bij </w:t>
+      </w:r>
+      <w:proofErr w:type="spellStart"/>
+      <w:r>
+        <w:rPr>
+          <w:rFonts w:eastAsia="Times New Roman" w:cs="Times New Roman"/>
+          <w:kern w:val="0"/>
+          <w:lang w:eastAsia="nl-BE"/>
+          <w14:ligatures w14:val="none"/>
+        </w:rPr>
+        <w:t>threat</w:t>
+      </w:r>
+      <w:proofErr w:type="spellEnd"/>
+      <w:r>
+        <w:rPr>
+          <w:rFonts w:eastAsia="Times New Roman" w:cs="Times New Roman"/>
+          <w:kern w:val="0"/>
+          <w:lang w:eastAsia="nl-BE"/>
+          <w14:ligatures w14:val="none"/>
+        </w:rPr>
+        <w:t xml:space="preserve"> modeling.</w:t>
+      </w:r>
+      <w:r>
+        <w:rPr>
+          <w:rFonts w:eastAsia="Times New Roman" w:cs="Times New Roman"/>
+          <w:kern w:val="0"/>
+          <w:lang w:eastAsia="nl-BE"/>
+          <w14:ligatures w14:val="none"/>
+        </w:rPr>
+        <w:t xml:space="preserve"> </w:t>
+      </w:r>
+      <w:r>
+        <w:t>(</w:t>
+      </w:r>
+      <w:hyperlink r:id="rId32" w:history="1">
+        <w:r>
+          <w:rPr>
+            <w:rStyle w:val="Hyperlink"/>
+          </w:rPr>
+          <w:t>https://arxiv.org/html/2509.20385v1</w:t>
+        </w:r>
+      </w:hyperlink>
+      <w:r>
+        <w:t>)</w:t>
+      </w:r>
+    </w:p>
+    <w:p>
+      <w:pPr>
+        <w:spacing w:afterLines="24" w:after="57" w:line="288" w:lineRule="auto"/>
+        <w:rPr>
+          <w:b/>
+          <w:bCs/>
+        </w:rPr>
+      </w:pPr>
+    </w:p>
+    <w:p>
+      <w:pPr>
+        <w:spacing w:afterLines="24" w:after="57" w:line="288" w:lineRule="auto"/>
+      </w:pPr>
+      <w:proofErr w:type="spellStart"/>
+      <w:r>
+        <w:rPr>
+          <w:rFonts w:eastAsia="Times New Roman" w:cs="Times New Roman"/>
+          <w:kern w:val="0"/>
+          <w:lang w:eastAsia="nl-BE"/>
+          <w14:ligatures w14:val="none"/>
+        </w:rPr>
+        <w:t>Shi</w:t>
+      </w:r>
+      <w:proofErr w:type="spellEnd"/>
+      <w:r>
+        <w:rPr>
+          <w:rFonts w:eastAsia="Times New Roman" w:cs="Times New Roman"/>
+          <w:kern w:val="0"/>
+          <w:lang w:eastAsia="nl-BE"/>
+          <w14:ligatures w14:val="none"/>
+        </w:rPr>
+        <w:t xml:space="preserve"> et al. (2022) classificeren diagram-gebaseerde tools zoals Microsoft TMT en OWASP </w:t>
+      </w:r>
+      <w:proofErr w:type="spellStart"/>
+      <w:r>
+        <w:rPr>
+          <w:rFonts w:eastAsia="Times New Roman" w:cs="Times New Roman"/>
+          <w:kern w:val="0"/>
+          <w:lang w:eastAsia="nl-BE"/>
+          <w14:ligatures w14:val="none"/>
+        </w:rPr>
+        <w:t>Threat</w:t>
+      </w:r>
+      <w:proofErr w:type="spellEnd"/>
+      <w:r>
+        <w:rPr>
+          <w:rFonts w:eastAsia="Times New Roman" w:cs="Times New Roman"/>
+          <w:kern w:val="0"/>
+          <w:lang w:eastAsia="nl-BE"/>
+          <w14:ligatures w14:val="none"/>
+        </w:rPr>
+        <w:t xml:space="preserve"> Dragon als intuïtief maar beperkt in </w:t>
+      </w:r>
+      <w:proofErr w:type="spellStart"/>
+      <w:r>
+        <w:rPr>
+          <w:rFonts w:eastAsia="Times New Roman" w:cs="Times New Roman"/>
+          <w:kern w:val="0"/>
+          <w:lang w:eastAsia="nl-BE"/>
+          <w14:ligatures w14:val="none"/>
+        </w:rPr>
+        <w:t>threat</w:t>
+      </w:r>
+      <w:proofErr w:type="spellEnd"/>
+      <w:r>
+        <w:rPr>
+          <w:rFonts w:eastAsia="Times New Roman" w:cs="Times New Roman"/>
+          <w:kern w:val="0"/>
+          <w:lang w:eastAsia="nl-BE"/>
+          <w14:ligatures w14:val="none"/>
+        </w:rPr>
+        <w:t xml:space="preserve"> tracking. De geïmplementeerde </w:t>
+      </w:r>
+      <w:proofErr w:type="spellStart"/>
+      <w:r>
+        <w:rPr>
+          <w:rFonts w:eastAsia="Times New Roman" w:cs="Times New Roman"/>
+          <w:kern w:val="0"/>
+          <w:lang w:eastAsia="nl-BE"/>
+          <w14:ligatures w14:val="none"/>
+        </w:rPr>
+        <w:t>webtool</w:t>
+      </w:r>
+      <w:proofErr w:type="spellEnd"/>
+      <w:r>
+        <w:rPr>
+          <w:rFonts w:eastAsia="Times New Roman" w:cs="Times New Roman"/>
+          <w:kern w:val="0"/>
+          <w:lang w:eastAsia="nl-BE"/>
+          <w14:ligatures w14:val="none"/>
+        </w:rPr>
+        <w:t xml:space="preserve"> overtreft deze door statusiconen (</w:t>
+      </w:r>
+      <w:proofErr w:type="spellStart"/>
+      <w:r>
+        <w:rPr>
+          <w:rFonts w:eastAsia="Times New Roman" w:cs="Times New Roman"/>
+          <w:kern w:val="0"/>
+          <w:lang w:eastAsia="nl-BE"/>
+          <w14:ligatures w14:val="none"/>
+        </w:rPr>
+        <w:t>Weakness</w:t>
+      </w:r>
+      <w:proofErr w:type="spellEnd"/>
+      <w:r>
+        <w:rPr>
+          <w:rFonts w:eastAsia="Times New Roman" w:cs="Times New Roman"/>
+          <w:kern w:val="0"/>
+          <w:lang w:eastAsia="nl-BE"/>
+          <w14:ligatures w14:val="none"/>
+        </w:rPr>
+        <w:t xml:space="preserve">, </w:t>
+      </w:r>
+      <w:proofErr w:type="spellStart"/>
+      <w:r>
+        <w:rPr>
+          <w:rFonts w:eastAsia="Times New Roman" w:cs="Times New Roman"/>
+          <w:kern w:val="0"/>
+          <w:lang w:eastAsia="nl-BE"/>
+          <w14:ligatures w14:val="none"/>
+        </w:rPr>
+        <w:t>Weakness</w:t>
+      </w:r>
+      <w:proofErr w:type="spellEnd"/>
+      <w:r>
+        <w:rPr>
+          <w:rFonts w:eastAsia="Times New Roman" w:cs="Times New Roman"/>
+          <w:kern w:val="0"/>
+          <w:lang w:eastAsia="nl-BE"/>
+          <w14:ligatures w14:val="none"/>
+        </w:rPr>
+        <w:t xml:space="preserve"> Under Review, </w:t>
+      </w:r>
+      <w:proofErr w:type="spellStart"/>
+      <w:r>
+        <w:rPr>
+          <w:rFonts w:eastAsia="Times New Roman" w:cs="Times New Roman"/>
+          <w:kern w:val="0"/>
+          <w:lang w:eastAsia="nl-BE"/>
+          <w14:ligatures w14:val="none"/>
+        </w:rPr>
+        <w:t>Assumption</w:t>
+      </w:r>
+      <w:proofErr w:type="spellEnd"/>
+      <w:r>
+        <w:rPr>
+          <w:rFonts w:eastAsia="Times New Roman" w:cs="Times New Roman"/>
+          <w:kern w:val="0"/>
+          <w:lang w:eastAsia="nl-BE"/>
+          <w14:ligatures w14:val="none"/>
+        </w:rPr>
+        <w:t xml:space="preserve"> Under Review</w:t>
+      </w:r>
+      <w:r>
+        <w:rPr>
+          <w:rFonts w:eastAsia="Times New Roman" w:cs="Times New Roman"/>
+          <w:kern w:val="0"/>
+          <w:lang w:eastAsia="nl-BE"/>
+          <w14:ligatures w14:val="none"/>
+        </w:rPr>
+        <w:t xml:space="preserve">, </w:t>
+      </w:r>
+      <w:proofErr w:type="spellStart"/>
+      <w:r>
+        <w:rPr>
+          <w:rFonts w:eastAsia="Times New Roman" w:cs="Times New Roman"/>
+          <w:kern w:val="0"/>
+          <w:lang w:eastAsia="nl-BE"/>
+          <w14:ligatures w14:val="none"/>
+        </w:rPr>
+        <w:t>Verified</w:t>
+      </w:r>
+      <w:proofErr w:type="spellEnd"/>
+      <w:r>
+        <w:rPr>
+          <w:rFonts w:eastAsia="Times New Roman" w:cs="Times New Roman"/>
+          <w:kern w:val="0"/>
+          <w:lang w:eastAsia="nl-BE"/>
+          <w14:ligatures w14:val="none"/>
+        </w:rPr>
+        <w:t xml:space="preserve"> </w:t>
+      </w:r>
+      <w:proofErr w:type="spellStart"/>
+      <w:r>
+        <w:rPr>
+          <w:rFonts w:eastAsia="Times New Roman" w:cs="Times New Roman"/>
+          <w:kern w:val="0"/>
+          <w:lang w:eastAsia="nl-BE"/>
+          <w14:ligatures w14:val="none"/>
+        </w:rPr>
+        <w:t>Assumption</w:t>
+      </w:r>
+      <w:proofErr w:type="spellEnd"/>
+      <w:r>
+        <w:rPr>
+          <w:rFonts w:eastAsia="Times New Roman" w:cs="Times New Roman"/>
+          <w:kern w:val="0"/>
+          <w:lang w:eastAsia="nl-BE"/>
+          <w14:ligatures w14:val="none"/>
+        </w:rPr>
+        <w:t>) en automatische evaluatie (</w:t>
+      </w:r>
+      <w:proofErr w:type="spellStart"/>
+      <w:r>
+        <w:rPr>
+          <w:rFonts w:eastAsia="Times New Roman" w:cs="Times New Roman"/>
+          <w:kern w:val="0"/>
+          <w:lang w:eastAsia="nl-BE"/>
+          <w14:ligatures w14:val="none"/>
+        </w:rPr>
+        <w:t>danger</w:t>
+      </w:r>
+      <w:proofErr w:type="spellEnd"/>
+      <w:r>
+        <w:rPr>
+          <w:rFonts w:eastAsia="Times New Roman" w:cs="Times New Roman"/>
+          <w:kern w:val="0"/>
+          <w:lang w:eastAsia="nl-BE"/>
+          <w14:ligatures w14:val="none"/>
+        </w:rPr>
+        <w:t xml:space="preserve"> ratings), wat verklaart waarom filtering consequent als meest nuttig werd gerangschikt (meerdere rang 1-scores).</w:t>
+      </w:r>
+      <w:r>
+        <w:rPr>
+          <w:rFonts w:eastAsia="Times New Roman" w:cs="Times New Roman"/>
+          <w:kern w:val="0"/>
+          <w:lang w:eastAsia="nl-BE"/>
+          <w14:ligatures w14:val="none"/>
+        </w:rPr>
+        <w:t xml:space="preserve"> </w:t>
+      </w:r>
+      <w:r>
+        <w:t>(</w:t>
+      </w:r>
+      <w:hyperlink r:id="rId33" w:history="1">
+        <w:r>
+          <w:rPr>
+            <w:rStyle w:val="Hyperlink"/>
+          </w:rPr>
+          <w:t>https://www.semanticscholar.org/paper/Threat-Modeling-Tools:-A-Taxonomy-Shi-Graffi/62caab5d4cfe006ec9cf1536212aa32e02d61c04</w:t>
+        </w:r>
+      </w:hyperlink>
+      <w:r>
+        <w:t>)</w:t>
+      </w:r>
+    </w:p>
+    <w:p>
+      <w:pPr>
+        <w:spacing w:afterLines="24" w:after="57" w:line="288" w:lineRule="auto"/>
+        <w:rPr>
+          <w:rFonts w:eastAsia="Times New Roman" w:cs="Times New Roman"/>
+          <w:kern w:val="0"/>
+          <w:lang w:eastAsia="nl-BE"/>
+          <w14:ligatures w14:val="none"/>
+        </w:rPr>
+      </w:pPr>
+    </w:p>
+    <w:p>
+      <w:pPr>
+        <w:spacing w:afterLines="24" w:after="57" w:line="288" w:lineRule="auto"/>
+        <w:rPr>
+          <w:rFonts w:eastAsia="Times New Roman" w:cs="Times New Roman"/>
+          <w:kern w:val="0"/>
+          <w:lang w:eastAsia="nl-BE"/>
+          <w14:ligatures w14:val="none"/>
+        </w:rPr>
+      </w:pPr>
+      <w:r>
+        <w:rPr>
+          <w:rFonts w:eastAsia="Times New Roman" w:cs="Times New Roman"/>
+          <w:kern w:val="0"/>
+          <w:lang w:eastAsia="nl-BE"/>
+          <w14:ligatures w14:val="none"/>
+        </w:rPr>
+        <w:t>De sprong in ervaring-gerelateerde</w:t>
+      </w:r>
+      <w:r>
+        <w:rPr>
+          <w:rFonts w:eastAsia="Times New Roman" w:cs="Times New Roman"/>
+          <w:kern w:val="0"/>
+          <w:lang w:eastAsia="nl-BE"/>
+          <w14:ligatures w14:val="none"/>
+        </w:rPr>
+        <w:t xml:space="preserve"> </w:t>
+      </w:r>
+      <w:r>
+        <w:rPr>
+          <w:rFonts w:eastAsia="Times New Roman" w:cs="Times New Roman"/>
+          <w:kern w:val="0"/>
+          <w:lang w:eastAsia="nl-BE"/>
+          <w14:ligatures w14:val="none"/>
+        </w:rPr>
+        <w:t xml:space="preserve">UEQ-scores (stimulatie, originaliteit) onderstreept </w:t>
+      </w:r>
+      <w:proofErr w:type="spellStart"/>
+      <w:r>
+        <w:rPr>
+          <w:rFonts w:eastAsia="Times New Roman" w:cs="Times New Roman"/>
+          <w:kern w:val="0"/>
+          <w:lang w:eastAsia="nl-BE"/>
+          <w14:ligatures w14:val="none"/>
+        </w:rPr>
+        <w:t>Devendra's</w:t>
+      </w:r>
+      <w:proofErr w:type="spellEnd"/>
+      <w:r>
+        <w:rPr>
+          <w:rFonts w:eastAsia="Times New Roman" w:cs="Times New Roman"/>
+          <w:kern w:val="0"/>
+          <w:lang w:eastAsia="nl-BE"/>
+          <w14:ligatures w14:val="none"/>
+        </w:rPr>
+        <w:t xml:space="preserve"> oproep voor user-</w:t>
+      </w:r>
+      <w:proofErr w:type="spellStart"/>
+      <w:r>
+        <w:rPr>
+          <w:rFonts w:eastAsia="Times New Roman" w:cs="Times New Roman"/>
+          <w:kern w:val="0"/>
+          <w:lang w:eastAsia="nl-BE"/>
+          <w14:ligatures w14:val="none"/>
+        </w:rPr>
+        <w:t>centric</w:t>
+      </w:r>
+      <w:proofErr w:type="spellEnd"/>
+      <w:r>
+        <w:rPr>
+          <w:rFonts w:eastAsia="Times New Roman" w:cs="Times New Roman"/>
+          <w:kern w:val="0"/>
+          <w:lang w:eastAsia="nl-BE"/>
+          <w14:ligatures w14:val="none"/>
+        </w:rPr>
+        <w:t xml:space="preserve"> design in security visualisatie, terwijl de voorkeur voor pragmatische features (filtering &gt; tooltips) Nielsens heuristieken voor flexibiliteit en herkenning bevestigt als cruciaal voor </w:t>
+      </w:r>
+      <w:proofErr w:type="spellStart"/>
+      <w:r>
+        <w:rPr>
+          <w:rFonts w:eastAsia="Times New Roman" w:cs="Times New Roman"/>
+          <w:kern w:val="0"/>
+          <w:lang w:eastAsia="nl-BE"/>
+          <w14:ligatures w14:val="none"/>
+        </w:rPr>
+        <w:t>threat</w:t>
+      </w:r>
+      <w:proofErr w:type="spellEnd"/>
+      <w:r>
+        <w:rPr>
+          <w:rFonts w:eastAsia="Times New Roman" w:cs="Times New Roman"/>
+          <w:kern w:val="0"/>
+          <w:lang w:eastAsia="nl-BE"/>
+          <w14:ligatures w14:val="none"/>
+        </w:rPr>
+        <w:t xml:space="preserve"> </w:t>
+      </w:r>
+      <w:proofErr w:type="spellStart"/>
+      <w:r>
+        <w:rPr>
+          <w:rFonts w:eastAsia="Times New Roman" w:cs="Times New Roman"/>
+          <w:kern w:val="0"/>
+          <w:lang w:eastAsia="nl-BE"/>
+          <w14:ligatures w14:val="none"/>
+        </w:rPr>
+        <w:t>modeling</w:t>
+      </w:r>
+      <w:proofErr w:type="spellEnd"/>
+      <w:r>
+        <w:rPr>
+          <w:rFonts w:eastAsia="Times New Roman" w:cs="Times New Roman"/>
+          <w:kern w:val="0"/>
+          <w:lang w:eastAsia="nl-BE"/>
+          <w14:ligatures w14:val="none"/>
+        </w:rPr>
+        <w:t xml:space="preserve"> adoptie.</w:t>
+      </w:r>
+    </w:p>
+    <w:p>
+      <w:pPr>
+        <w:spacing w:afterLines="24" w:after="57" w:line="288" w:lineRule="auto"/>
+        <w:rPr>
+          <w:rFonts w:eastAsia="Times New Roman" w:cs="Times New Roman"/>
           <w:b/>
           <w:bCs/>
           <w:kern w:val="0"/>
@@ -9246,170 +10814,7 @@
           <w14:ligatures w14:val="none"/>
         </w:rPr>
       </w:pPr>
-    </w:p>
-    <w:p>
-      <w:pPr>
-        <w:spacing w:afterLines="24" w:after="57" w:line="288" w:lineRule="auto"/>
-        <w:rPr>
-          <w:rFonts w:eastAsia="Times New Roman" w:cs="Times New Roman"/>
-          <w:kern w:val="0"/>
-          <w:lang w:eastAsia="nl-BE"/>
-          <w14:ligatures w14:val="none"/>
-        </w:rPr>
-      </w:pPr>
-      <w:r>
-        <w:rPr>
-          <w:rFonts w:eastAsia="Times New Roman" w:cs="Times New Roman"/>
-          <w:kern w:val="0"/>
-          <w:lang w:eastAsia="nl-BE"/>
-          <w14:ligatures w14:val="none"/>
-        </w:rPr>
-        <w:t xml:space="preserve">De resultaten valideren inzichten uit HCI-security literatuur: visuele codering en filtering reduceren cognitieve load bij </w:t>
-      </w:r>
-      <w:proofErr w:type="spellStart"/>
-      <w:r>
-        <w:rPr>
-          <w:rFonts w:eastAsia="Times New Roman" w:cs="Times New Roman"/>
-          <w:kern w:val="0"/>
-          <w:lang w:eastAsia="nl-BE"/>
-          <w14:ligatures w14:val="none"/>
-        </w:rPr>
-        <w:t>hirarchische</w:t>
-      </w:r>
-      <w:proofErr w:type="spellEnd"/>
-      <w:r>
-        <w:rPr>
-          <w:rFonts w:eastAsia="Times New Roman" w:cs="Times New Roman"/>
-          <w:kern w:val="0"/>
-          <w:lang w:eastAsia="nl-BE"/>
-          <w14:ligatures w14:val="none"/>
-        </w:rPr>
-        <w:t xml:space="preserve"> </w:t>
-      </w:r>
-      <w:proofErr w:type="spellStart"/>
-      <w:r>
-        <w:rPr>
-          <w:rFonts w:eastAsia="Times New Roman" w:cs="Times New Roman"/>
-          <w:kern w:val="0"/>
-          <w:lang w:eastAsia="nl-BE"/>
-          <w14:ligatures w14:val="none"/>
-        </w:rPr>
-        <w:t>risico-analyse</w:t>
-      </w:r>
-      <w:proofErr w:type="spellEnd"/>
-      <w:r>
-        <w:rPr>
-          <w:rFonts w:eastAsia="Times New Roman" w:cs="Times New Roman"/>
-          <w:kern w:val="0"/>
-          <w:lang w:eastAsia="nl-BE"/>
-          <w14:ligatures w14:val="none"/>
-        </w:rPr>
-        <w:t xml:space="preserve">, zoals bij STRIDE of attack trees. De sprong </w:t>
-      </w:r>
-      <w:r>
-        <w:rPr>
-          <w:rFonts w:eastAsia="Times New Roman" w:cs="Times New Roman"/>
-          <w:kern w:val="0"/>
-          <w:lang w:eastAsia="nl-BE"/>
-          <w14:ligatures w14:val="none"/>
-        </w:rPr>
-        <w:t xml:space="preserve">in belevingsmatige </w:t>
-      </w:r>
-      <w:r>
-        <w:rPr>
-          <w:rFonts w:eastAsia="Times New Roman" w:cs="Times New Roman"/>
-          <w:kern w:val="0"/>
-          <w:lang w:eastAsia="nl-BE"/>
-          <w14:ligatures w14:val="none"/>
-        </w:rPr>
-        <w:t xml:space="preserve">UEQ-scores (stimulatie, originaliteit) ondersteunt de noodzaak voor aantrekkelijke interfaces om security-praktijken te integreren in </w:t>
-      </w:r>
-      <w:proofErr w:type="spellStart"/>
-      <w:r>
-        <w:rPr>
-          <w:rFonts w:eastAsia="Times New Roman" w:cs="Times New Roman"/>
-          <w:kern w:val="0"/>
-          <w:lang w:eastAsia="nl-BE"/>
-          <w14:ligatures w14:val="none"/>
-        </w:rPr>
-        <w:t>DevSecOps</w:t>
-      </w:r>
-      <w:proofErr w:type="spellEnd"/>
-      <w:r>
-        <w:rPr>
-          <w:rFonts w:eastAsia="Times New Roman" w:cs="Times New Roman"/>
-          <w:kern w:val="0"/>
-          <w:lang w:eastAsia="nl-BE"/>
-          <w14:ligatures w14:val="none"/>
-        </w:rPr>
-        <w:t xml:space="preserve">, waar generieke tools falen door gebrek aan motivatie. Tegelijk wijzen de voorkeuren voor filtering aan dat Nielsens heuristieken (zichtbaarheid status, foutpreventie) cruciaal zijn voor </w:t>
-      </w:r>
-      <w:proofErr w:type="spellStart"/>
-      <w:r>
-        <w:rPr>
-          <w:rFonts w:eastAsia="Times New Roman" w:cs="Times New Roman"/>
-          <w:kern w:val="0"/>
-          <w:lang w:eastAsia="nl-BE"/>
-          <w14:ligatures w14:val="none"/>
-        </w:rPr>
-        <w:t>threat</w:t>
-      </w:r>
-      <w:proofErr w:type="spellEnd"/>
-      <w:r>
-        <w:rPr>
-          <w:rFonts w:eastAsia="Times New Roman" w:cs="Times New Roman"/>
-          <w:kern w:val="0"/>
-          <w:lang w:eastAsia="nl-BE"/>
-          <w14:ligatures w14:val="none"/>
-        </w:rPr>
-        <w:t xml:space="preserve"> </w:t>
-      </w:r>
-      <w:proofErr w:type="spellStart"/>
-      <w:r>
-        <w:rPr>
-          <w:rFonts w:eastAsia="Times New Roman" w:cs="Times New Roman"/>
-          <w:kern w:val="0"/>
-          <w:lang w:eastAsia="nl-BE"/>
-          <w14:ligatures w14:val="none"/>
-        </w:rPr>
-        <w:t>modeling</w:t>
-      </w:r>
-      <w:proofErr w:type="spellEnd"/>
-      <w:r>
-        <w:rPr>
-          <w:rFonts w:eastAsia="Times New Roman" w:cs="Times New Roman"/>
-          <w:kern w:val="0"/>
-          <w:lang w:eastAsia="nl-BE"/>
-          <w14:ligatures w14:val="none"/>
-        </w:rPr>
-        <w:t xml:space="preserve"> tools.</w:t>
-      </w:r>
-    </w:p>
-    <w:p>
-      <w:pPr>
-        <w:spacing w:afterLines="24" w:after="57" w:line="288" w:lineRule="auto"/>
-        <w:rPr>
-          <w:rFonts w:eastAsia="Times New Roman" w:cs="Times New Roman"/>
-          <w:kern w:val="0"/>
-          <w:lang w:eastAsia="nl-BE"/>
-          <w14:ligatures w14:val="none"/>
-        </w:rPr>
-      </w:pPr>
-    </w:p>
-    <w:p>
-      <w:pPr>
-        <w:spacing w:afterLines="24" w:after="57" w:line="288" w:lineRule="auto"/>
-        <w:rPr>
-          <w:rFonts w:eastAsia="Times New Roman" w:cs="Times New Roman"/>
-          <w:kern w:val="0"/>
-          <w:lang w:eastAsia="nl-BE"/>
-          <w14:ligatures w14:val="none"/>
-        </w:rPr>
-      </w:pPr>
-    </w:p>
-    <w:p>
-      <w:pPr>
-        <w:spacing w:afterLines="24" w:after="57" w:line="288" w:lineRule="auto"/>
+      <w:r>
         <w:rPr>
           <w:rFonts w:eastAsia="Times New Roman" w:cs="Times New Roman"/>
           <w:b/>
@@ -9420,7 +10825,9 @@
           <w:lang w:eastAsia="nl-BE"/>
           <w14:ligatures w14:val="none"/>
         </w:rPr>
-      </w:pPr>
+        <w:lastRenderedPageBreak/>
+        <w:t xml:space="preserve">5.4 </w:t>
+      </w:r>
       <w:r>
         <w:rPr>
           <w:rFonts w:eastAsia="Times New Roman" w:cs="Times New Roman"/>
@@ -9432,9 +10839,12 @@
           <w:lang w:eastAsia="nl-BE"/>
           <w14:ligatures w14:val="none"/>
         </w:rPr>
-        <w:t xml:space="preserve">5.4 </w:t>
-      </w:r>
-      <w:r>
+        <w:t>Beperkingen van het onderzoek</w:t>
+      </w:r>
+    </w:p>
+    <w:p>
+      <w:pPr>
+        <w:spacing w:afterLines="24" w:after="57" w:line="288" w:lineRule="auto"/>
         <w:rPr>
           <w:rFonts w:eastAsia="Times New Roman" w:cs="Times New Roman"/>
           <w:b/>
@@ -9445,12 +10855,101 @@
           <w:lang w:eastAsia="nl-BE"/>
           <w14:ligatures w14:val="none"/>
         </w:rPr>
-        <w:t>Beperkingen van het onderzoek</w:t>
-      </w:r>
-    </w:p>
-    <w:p>
-      <w:pPr>
-        <w:spacing w:afterLines="24" w:after="57" w:line="288" w:lineRule="auto"/>
+      </w:pPr>
+    </w:p>
+    <w:p>
+      <w:pPr>
+        <w:spacing w:afterLines="24" w:after="57" w:line="288" w:lineRule="auto"/>
+        <w:rPr>
+          <w:rFonts w:eastAsia="Times New Roman" w:cs="Times New Roman"/>
+          <w:kern w:val="0"/>
+          <w:lang w:eastAsia="nl-BE"/>
+          <w14:ligatures w14:val="none"/>
+        </w:rPr>
+      </w:pPr>
+      <w:r>
+        <w:rPr>
+          <w:rFonts w:eastAsia="Times New Roman" w:cs="Times New Roman"/>
+          <w:kern w:val="0"/>
+          <w:lang w:eastAsia="nl-BE"/>
+          <w14:ligatures w14:val="none"/>
+        </w:rPr>
+        <w:t xml:space="preserve">De steekproef is klein (9 deelnemers), wat generaliseerbaarheid beperkt tot gelijkaardige populaties (ontwikkelaars met basiskennis). Zelfrapportage via UEQ en open vragen is subjectief en vat mogelijke </w:t>
+      </w:r>
+      <w:proofErr w:type="spellStart"/>
+      <w:r>
+        <w:rPr>
+          <w:rFonts w:eastAsia="Times New Roman" w:cs="Times New Roman"/>
+          <w:kern w:val="0"/>
+          <w:lang w:eastAsia="nl-BE"/>
+          <w14:ligatures w14:val="none"/>
+        </w:rPr>
+        <w:t>confirmation</w:t>
+      </w:r>
+      <w:proofErr w:type="spellEnd"/>
+      <w:r>
+        <w:rPr>
+          <w:rFonts w:eastAsia="Times New Roman" w:cs="Times New Roman"/>
+          <w:kern w:val="0"/>
+          <w:lang w:eastAsia="nl-BE"/>
+          <w14:ligatures w14:val="none"/>
+        </w:rPr>
+        <w:t xml:space="preserve"> bias. De studie vergelijkt met een interne basisversie, niet met externe tools zoals </w:t>
+      </w:r>
+      <w:proofErr w:type="spellStart"/>
+      <w:r>
+        <w:rPr>
+          <w:rFonts w:eastAsia="Times New Roman" w:cs="Times New Roman"/>
+          <w:kern w:val="0"/>
+          <w:lang w:eastAsia="nl-BE"/>
+          <w14:ligatures w14:val="none"/>
+        </w:rPr>
+        <w:t>MindMeister</w:t>
+      </w:r>
+      <w:proofErr w:type="spellEnd"/>
+      <w:r>
+        <w:rPr>
+          <w:rFonts w:eastAsia="Times New Roman" w:cs="Times New Roman"/>
+          <w:kern w:val="0"/>
+          <w:lang w:eastAsia="nl-BE"/>
+          <w14:ligatures w14:val="none"/>
+        </w:rPr>
+        <w:t xml:space="preserve"> of </w:t>
+      </w:r>
+      <w:proofErr w:type="spellStart"/>
+      <w:r>
+        <w:rPr>
+          <w:rFonts w:eastAsia="Times New Roman" w:cs="Times New Roman"/>
+          <w:kern w:val="0"/>
+          <w:lang w:eastAsia="nl-BE"/>
+          <w14:ligatures w14:val="none"/>
+        </w:rPr>
+        <w:t>Lucidchart</w:t>
+      </w:r>
+      <w:proofErr w:type="spellEnd"/>
+      <w:r>
+        <w:rPr>
+          <w:rFonts w:eastAsia="Times New Roman" w:cs="Times New Roman"/>
+          <w:kern w:val="0"/>
+          <w:lang w:eastAsia="nl-BE"/>
+          <w14:ligatures w14:val="none"/>
+        </w:rPr>
+        <w:t>, en focust op korte taken zonder langdurig gebruik.</w:t>
+      </w:r>
+    </w:p>
+    <w:p>
+      <w:pPr>
+        <w:spacing w:afterLines="24" w:after="57" w:line="288" w:lineRule="auto"/>
+        <w:rPr>
+          <w:rFonts w:eastAsia="Times New Roman" w:cs="Times New Roman"/>
+          <w:kern w:val="0"/>
+          <w:lang w:eastAsia="nl-BE"/>
+          <w14:ligatures w14:val="none"/>
+        </w:rPr>
+      </w:pPr>
+    </w:p>
+    <w:p>
+      <w:pPr>
         <w:rPr>
           <w:rFonts w:eastAsia="Times New Roman" w:cs="Times New Roman"/>
           <w:b/>
@@ -9468,147 +10967,6 @@
         <w:spacing w:afterLines="24" w:after="57" w:line="288" w:lineRule="auto"/>
         <w:rPr>
           <w:rFonts w:eastAsia="Times New Roman" w:cs="Times New Roman"/>
-          <w:kern w:val="0"/>
-          <w:lang w:eastAsia="nl-BE"/>
-          <w14:ligatures w14:val="none"/>
-        </w:rPr>
-      </w:pPr>
-      <w:r>
-        <w:rPr>
-          <w:rFonts w:eastAsia="Times New Roman" w:cs="Times New Roman"/>
-          <w:kern w:val="0"/>
-          <w:lang w:eastAsia="nl-BE"/>
-          <w14:ligatures w14:val="none"/>
-        </w:rPr>
-        <w:t xml:space="preserve">De steekproef is klein (9 deelnemers), wat generaliseerbaarheid beperkt tot gelijkaardige populaties (ontwikkelaars met basiskennis). Zelfrapportage via UEQ en open vragen is subjectief en vat mogelijke </w:t>
-      </w:r>
-      <w:proofErr w:type="spellStart"/>
-      <w:r>
-        <w:rPr>
-          <w:rFonts w:eastAsia="Times New Roman" w:cs="Times New Roman"/>
-          <w:kern w:val="0"/>
-          <w:lang w:eastAsia="nl-BE"/>
-          <w14:ligatures w14:val="none"/>
-        </w:rPr>
-        <w:t>confirmation</w:t>
-      </w:r>
-      <w:proofErr w:type="spellEnd"/>
-      <w:r>
-        <w:rPr>
-          <w:rFonts w:eastAsia="Times New Roman" w:cs="Times New Roman"/>
-          <w:kern w:val="0"/>
-          <w:lang w:eastAsia="nl-BE"/>
-          <w14:ligatures w14:val="none"/>
-        </w:rPr>
-        <w:t xml:space="preserve"> bias, terwijl objectieve </w:t>
-      </w:r>
-      <w:proofErr w:type="spellStart"/>
-      <w:r>
-        <w:rPr>
-          <w:rFonts w:eastAsia="Times New Roman" w:cs="Times New Roman"/>
-          <w:kern w:val="0"/>
-          <w:lang w:eastAsia="nl-BE"/>
-          <w14:ligatures w14:val="none"/>
-        </w:rPr>
-        <w:t>metrics</w:t>
-      </w:r>
-      <w:proofErr w:type="spellEnd"/>
-      <w:r>
-        <w:rPr>
-          <w:rFonts w:eastAsia="Times New Roman" w:cs="Times New Roman"/>
-          <w:kern w:val="0"/>
-          <w:lang w:eastAsia="nl-BE"/>
-          <w14:ligatures w14:val="none"/>
-        </w:rPr>
-        <w:t xml:space="preserve"> (tijd op taak, </w:t>
-      </w:r>
-      <w:proofErr w:type="spellStart"/>
-      <w:r>
-        <w:rPr>
-          <w:rFonts w:eastAsia="Times New Roman" w:cs="Times New Roman"/>
-          <w:kern w:val="0"/>
-          <w:lang w:eastAsia="nl-BE"/>
-          <w14:ligatures w14:val="none"/>
-        </w:rPr>
-        <w:t>foutenrate</w:t>
-      </w:r>
-      <w:proofErr w:type="spellEnd"/>
-      <w:r>
-        <w:rPr>
-          <w:rFonts w:eastAsia="Times New Roman" w:cs="Times New Roman"/>
-          <w:kern w:val="0"/>
-          <w:lang w:eastAsia="nl-BE"/>
-          <w14:ligatures w14:val="none"/>
-        </w:rPr>
-        <w:t xml:space="preserve">) ontbreken. De studie vergelijkt met een interne basisversie, niet met externe tools zoals </w:t>
-      </w:r>
-      <w:proofErr w:type="spellStart"/>
-      <w:r>
-        <w:rPr>
-          <w:rFonts w:eastAsia="Times New Roman" w:cs="Times New Roman"/>
-          <w:kern w:val="0"/>
-          <w:lang w:eastAsia="nl-BE"/>
-          <w14:ligatures w14:val="none"/>
-        </w:rPr>
-        <w:t>MindMeister</w:t>
-      </w:r>
-      <w:proofErr w:type="spellEnd"/>
-      <w:r>
-        <w:rPr>
-          <w:rFonts w:eastAsia="Times New Roman" w:cs="Times New Roman"/>
-          <w:kern w:val="0"/>
-          <w:lang w:eastAsia="nl-BE"/>
-          <w14:ligatures w14:val="none"/>
-        </w:rPr>
-        <w:t xml:space="preserve"> of </w:t>
-      </w:r>
-      <w:proofErr w:type="spellStart"/>
-      <w:r>
-        <w:rPr>
-          <w:rFonts w:eastAsia="Times New Roman" w:cs="Times New Roman"/>
-          <w:kern w:val="0"/>
-          <w:lang w:eastAsia="nl-BE"/>
-          <w14:ligatures w14:val="none"/>
-        </w:rPr>
-        <w:t>Lucidchart</w:t>
-      </w:r>
-      <w:proofErr w:type="spellEnd"/>
-      <w:r>
-        <w:rPr>
-          <w:rFonts w:eastAsia="Times New Roman" w:cs="Times New Roman"/>
-          <w:kern w:val="0"/>
-          <w:lang w:eastAsia="nl-BE"/>
-          <w14:ligatures w14:val="none"/>
-        </w:rPr>
-        <w:t>, en focust op korte taken zonder langdurig gebruik.</w:t>
-      </w:r>
-    </w:p>
-    <w:p>
-      <w:pPr>
-        <w:spacing w:afterLines="24" w:after="57" w:line="288" w:lineRule="auto"/>
-        <w:rPr>
-          <w:rFonts w:eastAsia="Times New Roman" w:cs="Times New Roman"/>
-          <w:kern w:val="0"/>
-          <w:lang w:eastAsia="nl-BE"/>
-          <w14:ligatures w14:val="none"/>
-        </w:rPr>
-      </w:pPr>
-    </w:p>
-    <w:p>
-      <w:pPr>
-        <w:spacing w:afterLines="24" w:after="57" w:line="288" w:lineRule="auto"/>
-        <w:rPr>
-          <w:rFonts w:eastAsia="Times New Roman" w:cs="Times New Roman"/>
-          <w:kern w:val="0"/>
-          <w:lang w:eastAsia="nl-BE"/>
-          <w14:ligatures w14:val="none"/>
-        </w:rPr>
-      </w:pPr>
-    </w:p>
-    <w:p>
-      <w:pPr>
-        <w:rPr>
-          <w:rFonts w:eastAsia="Times New Roman" w:cs="Times New Roman"/>
           <w:b/>
           <w:bCs/>
           <w:kern w:val="0"/>
@@ -9629,12 +10987,9 @@
           <w:lang w:eastAsia="nl-BE"/>
           <w14:ligatures w14:val="none"/>
         </w:rPr>
-        <w:br w:type="page"/>
-      </w:r>
-    </w:p>
-    <w:p>
-      <w:pPr>
-        <w:spacing w:afterLines="24" w:after="57" w:line="288" w:lineRule="auto"/>
+        <w:t xml:space="preserve">5.5 </w:t>
+      </w:r>
+      <w:r>
         <w:rPr>
           <w:rFonts w:eastAsia="Times New Roman" w:cs="Times New Roman"/>
           <w:b/>
@@ -9645,8 +11000,12 @@
           <w:lang w:eastAsia="nl-BE"/>
           <w14:ligatures w14:val="none"/>
         </w:rPr>
-      </w:pPr>
-      <w:r>
+        <w:t>Implicaties voor theorie en praktijk</w:t>
+      </w:r>
+    </w:p>
+    <w:p>
+      <w:pPr>
+        <w:spacing w:afterLines="24" w:after="57" w:line="288" w:lineRule="auto"/>
         <w:rPr>
           <w:rFonts w:eastAsia="Times New Roman" w:cs="Times New Roman"/>
           <w:b/>
@@ -9657,10 +11016,249 @@
           <w:lang w:eastAsia="nl-BE"/>
           <w14:ligatures w14:val="none"/>
         </w:rPr>
-        <w:lastRenderedPageBreak/>
-        <w:t xml:space="preserve">5.5 </w:t>
-      </w:r>
-      <w:r>
+      </w:pPr>
+    </w:p>
+    <w:p>
+      <w:pPr>
+        <w:spacing w:afterLines="24" w:after="57" w:line="288" w:lineRule="auto"/>
+        <w:rPr>
+          <w:rFonts w:eastAsia="Times New Roman" w:cs="Times New Roman"/>
+          <w:kern w:val="0"/>
+          <w:lang w:eastAsia="nl-BE"/>
+          <w14:ligatures w14:val="none"/>
+        </w:rPr>
+      </w:pPr>
+      <w:r>
+        <w:rPr>
+          <w:rFonts w:eastAsia="Times New Roman" w:cs="Times New Roman"/>
+          <w:kern w:val="0"/>
+          <w:lang w:eastAsia="nl-BE"/>
+          <w14:ligatures w14:val="none"/>
+        </w:rPr>
+        <w:t xml:space="preserve">Theoretisch draagt dit bij aan design </w:t>
+      </w:r>
+      <w:proofErr w:type="spellStart"/>
+      <w:r>
+        <w:rPr>
+          <w:rFonts w:eastAsia="Times New Roman" w:cs="Times New Roman"/>
+          <w:kern w:val="0"/>
+          <w:lang w:eastAsia="nl-BE"/>
+          <w14:ligatures w14:val="none"/>
+        </w:rPr>
+        <w:t>science</w:t>
+      </w:r>
+      <w:proofErr w:type="spellEnd"/>
+      <w:r>
+        <w:rPr>
+          <w:rFonts w:eastAsia="Times New Roman" w:cs="Times New Roman"/>
+          <w:kern w:val="0"/>
+          <w:lang w:eastAsia="nl-BE"/>
+          <w14:ligatures w14:val="none"/>
+        </w:rPr>
+        <w:t xml:space="preserve"> door empirisch bewijs voor UX-features in security </w:t>
+      </w:r>
+      <w:r>
+        <w:rPr>
+          <w:rFonts w:eastAsia="Times New Roman" w:cs="Times New Roman"/>
+          <w:kern w:val="0"/>
+          <w:lang w:eastAsia="nl-BE"/>
+          <w14:ligatures w14:val="none"/>
+        </w:rPr>
+        <w:t>modellering</w:t>
+      </w:r>
+      <w:r>
+        <w:rPr>
+          <w:rFonts w:eastAsia="Times New Roman" w:cs="Times New Roman"/>
+          <w:kern w:val="0"/>
+          <w:lang w:eastAsia="nl-BE"/>
+          <w14:ligatures w14:val="none"/>
+        </w:rPr>
+        <w:t xml:space="preserve">, met aanbeveling voor integratie van UEQ in </w:t>
+      </w:r>
+      <w:proofErr w:type="spellStart"/>
+      <w:r>
+        <w:rPr>
+          <w:rFonts w:eastAsia="Times New Roman" w:cs="Times New Roman"/>
+          <w:kern w:val="0"/>
+          <w:lang w:eastAsia="nl-BE"/>
+          <w14:ligatures w14:val="none"/>
+        </w:rPr>
+        <w:t>threat</w:t>
+      </w:r>
+      <w:proofErr w:type="spellEnd"/>
+      <w:r>
+        <w:rPr>
+          <w:rFonts w:eastAsia="Times New Roman" w:cs="Times New Roman"/>
+          <w:kern w:val="0"/>
+          <w:lang w:eastAsia="nl-BE"/>
+          <w14:ligatures w14:val="none"/>
+        </w:rPr>
+        <w:t xml:space="preserve"> </w:t>
+      </w:r>
+      <w:proofErr w:type="spellStart"/>
+      <w:r>
+        <w:rPr>
+          <w:rFonts w:eastAsia="Times New Roman" w:cs="Times New Roman"/>
+          <w:kern w:val="0"/>
+          <w:lang w:eastAsia="nl-BE"/>
+          <w14:ligatures w14:val="none"/>
+        </w:rPr>
+        <w:t>modeling</w:t>
+      </w:r>
+      <w:proofErr w:type="spellEnd"/>
+      <w:r>
+        <w:rPr>
+          <w:rFonts w:eastAsia="Times New Roman" w:cs="Times New Roman"/>
+          <w:kern w:val="0"/>
+          <w:lang w:eastAsia="nl-BE"/>
+          <w14:ligatures w14:val="none"/>
+        </w:rPr>
+        <w:t xml:space="preserve"> evaluaties. Praktisch kan de tool </w:t>
+      </w:r>
+      <w:proofErr w:type="spellStart"/>
+      <w:r>
+        <w:rPr>
+          <w:rFonts w:eastAsia="Times New Roman" w:cs="Times New Roman"/>
+          <w:kern w:val="0"/>
+          <w:lang w:eastAsia="nl-BE"/>
+          <w14:ligatures w14:val="none"/>
+        </w:rPr>
+        <w:t>DevSecOps</w:t>
+      </w:r>
+      <w:proofErr w:type="spellEnd"/>
+      <w:r>
+        <w:rPr>
+          <w:rFonts w:eastAsia="Times New Roman" w:cs="Times New Roman"/>
+          <w:kern w:val="0"/>
+          <w:lang w:eastAsia="nl-BE"/>
+          <w14:ligatures w14:val="none"/>
+        </w:rPr>
+        <w:t xml:space="preserve"> teams helpen door </w:t>
+      </w:r>
+      <w:proofErr w:type="spellStart"/>
+      <w:r>
+        <w:rPr>
+          <w:rFonts w:eastAsia="Times New Roman" w:cs="Times New Roman"/>
+          <w:kern w:val="0"/>
+          <w:lang w:eastAsia="nl-BE"/>
+          <w14:ligatures w14:val="none"/>
+        </w:rPr>
+        <w:t>threat</w:t>
+      </w:r>
+      <w:proofErr w:type="spellEnd"/>
+      <w:r>
+        <w:rPr>
+          <w:rFonts w:eastAsia="Times New Roman" w:cs="Times New Roman"/>
+          <w:kern w:val="0"/>
+          <w:lang w:eastAsia="nl-BE"/>
+          <w14:ligatures w14:val="none"/>
+        </w:rPr>
+        <w:t xml:space="preserve"> </w:t>
+      </w:r>
+      <w:proofErr w:type="spellStart"/>
+      <w:r>
+        <w:rPr>
+          <w:rFonts w:eastAsia="Times New Roman" w:cs="Times New Roman"/>
+          <w:kern w:val="0"/>
+          <w:lang w:eastAsia="nl-BE"/>
+          <w14:ligatures w14:val="none"/>
+        </w:rPr>
+        <w:t>modeling</w:t>
+      </w:r>
+      <w:proofErr w:type="spellEnd"/>
+      <w:r>
+        <w:rPr>
+          <w:rFonts w:eastAsia="Times New Roman" w:cs="Times New Roman"/>
+          <w:kern w:val="0"/>
+          <w:lang w:eastAsia="nl-BE"/>
+          <w14:ligatures w14:val="none"/>
+        </w:rPr>
+        <w:t xml:space="preserve"> laagdrempelig te maken</w:t>
+      </w:r>
+      <w:r>
+        <w:rPr>
+          <w:rFonts w:eastAsia="Times New Roman" w:cs="Times New Roman"/>
+          <w:kern w:val="0"/>
+          <w:lang w:eastAsia="nl-BE"/>
+          <w14:ligatures w14:val="none"/>
+        </w:rPr>
+        <w:t xml:space="preserve"> en</w:t>
+      </w:r>
+      <w:r>
+        <w:rPr>
+          <w:rFonts w:eastAsia="Times New Roman" w:cs="Times New Roman"/>
+          <w:kern w:val="0"/>
+          <w:lang w:eastAsia="nl-BE"/>
+          <w14:ligatures w14:val="none"/>
+        </w:rPr>
+        <w:t xml:space="preserve"> implementeer filtering en iconen in bestaande </w:t>
+      </w:r>
+      <w:proofErr w:type="spellStart"/>
+      <w:r>
+        <w:rPr>
+          <w:rFonts w:eastAsia="Times New Roman" w:cs="Times New Roman"/>
+          <w:kern w:val="0"/>
+          <w:lang w:eastAsia="nl-BE"/>
+          <w14:ligatures w14:val="none"/>
+        </w:rPr>
+        <w:t>pipelines</w:t>
+      </w:r>
+      <w:proofErr w:type="spellEnd"/>
+      <w:r>
+        <w:rPr>
+          <w:rFonts w:eastAsia="Times New Roman" w:cs="Times New Roman"/>
+          <w:kern w:val="0"/>
+          <w:lang w:eastAsia="nl-BE"/>
+          <w14:ligatures w14:val="none"/>
+        </w:rPr>
+        <w:t xml:space="preserve">. Voor onderwijs biedt het een didactisch prototype om </w:t>
+      </w:r>
+      <w:proofErr w:type="spellStart"/>
+      <w:r>
+        <w:rPr>
+          <w:rFonts w:eastAsia="Times New Roman" w:cs="Times New Roman"/>
+          <w:kern w:val="0"/>
+          <w:lang w:eastAsia="nl-BE"/>
+          <w14:ligatures w14:val="none"/>
+        </w:rPr>
+        <w:t>Fortunately-Unfortunately</w:t>
+      </w:r>
+      <w:proofErr w:type="spellEnd"/>
+      <w:r>
+        <w:rPr>
+          <w:rFonts w:eastAsia="Times New Roman" w:cs="Times New Roman"/>
+          <w:kern w:val="0"/>
+          <w:lang w:eastAsia="nl-BE"/>
+          <w14:ligatures w14:val="none"/>
+        </w:rPr>
+        <w:t xml:space="preserve"> te demonstreren.</w:t>
+      </w:r>
+    </w:p>
+    <w:p>
+      <w:pPr>
+        <w:spacing w:afterLines="24" w:after="57" w:line="288" w:lineRule="auto"/>
+        <w:rPr>
+          <w:rFonts w:eastAsia="Times New Roman" w:cs="Times New Roman"/>
+          <w:kern w:val="0"/>
+          <w:lang w:eastAsia="nl-BE"/>
+          <w14:ligatures w14:val="none"/>
+        </w:rPr>
+      </w:pPr>
+    </w:p>
+    <w:p>
+      <w:pPr>
+        <w:spacing w:afterLines="24" w:after="57" w:line="288" w:lineRule="auto"/>
+        <w:rPr>
+          <w:rFonts w:eastAsia="Times New Roman" w:cs="Times New Roman"/>
+          <w:kern w:val="0"/>
+          <w:lang w:eastAsia="nl-BE"/>
+          <w14:ligatures w14:val="none"/>
+        </w:rPr>
+      </w:pPr>
+    </w:p>
+    <w:p>
+      <w:pPr>
+        <w:spacing w:afterLines="24" w:after="57" w:line="288" w:lineRule="auto"/>
         <w:rPr>
           <w:rFonts w:eastAsia="Times New Roman" w:cs="Times New Roman"/>
           <w:b/>
@@ -9671,12 +11269,8 @@
           <w:lang w:eastAsia="nl-BE"/>
           <w14:ligatures w14:val="none"/>
         </w:rPr>
-        <w:t>Implicaties voor theorie en praktijk</w:t>
-      </w:r>
-    </w:p>
-    <w:p>
-      <w:pPr>
-        <w:spacing w:afterLines="24" w:after="57" w:line="288" w:lineRule="auto"/>
+      </w:pPr>
+      <w:r>
         <w:rPr>
           <w:rFonts w:eastAsia="Times New Roman" w:cs="Times New Roman"/>
           <w:b/>
@@ -9687,249 +11281,9 @@
           <w:lang w:eastAsia="nl-BE"/>
           <w14:ligatures w14:val="none"/>
         </w:rPr>
-      </w:pPr>
-    </w:p>
-    <w:p>
-      <w:pPr>
-        <w:spacing w:afterLines="24" w:after="57" w:line="288" w:lineRule="auto"/>
-        <w:rPr>
-          <w:rFonts w:eastAsia="Times New Roman" w:cs="Times New Roman"/>
-          <w:kern w:val="0"/>
-          <w:lang w:eastAsia="nl-BE"/>
-          <w14:ligatures w14:val="none"/>
-        </w:rPr>
-      </w:pPr>
-      <w:r>
-        <w:rPr>
-          <w:rFonts w:eastAsia="Times New Roman" w:cs="Times New Roman"/>
-          <w:kern w:val="0"/>
-          <w:lang w:eastAsia="nl-BE"/>
-          <w14:ligatures w14:val="none"/>
-        </w:rPr>
-        <w:t xml:space="preserve">Theoretisch draagt dit bij aan design </w:t>
-      </w:r>
-      <w:proofErr w:type="spellStart"/>
-      <w:r>
-        <w:rPr>
-          <w:rFonts w:eastAsia="Times New Roman" w:cs="Times New Roman"/>
-          <w:kern w:val="0"/>
-          <w:lang w:eastAsia="nl-BE"/>
-          <w14:ligatures w14:val="none"/>
-        </w:rPr>
-        <w:t>science</w:t>
-      </w:r>
-      <w:proofErr w:type="spellEnd"/>
-      <w:r>
-        <w:rPr>
-          <w:rFonts w:eastAsia="Times New Roman" w:cs="Times New Roman"/>
-          <w:kern w:val="0"/>
-          <w:lang w:eastAsia="nl-BE"/>
-          <w14:ligatures w14:val="none"/>
-        </w:rPr>
-        <w:t xml:space="preserve"> door empirisch bewijs voor UX-features in security </w:t>
-      </w:r>
-      <w:r>
-        <w:rPr>
-          <w:rFonts w:eastAsia="Times New Roman" w:cs="Times New Roman"/>
-          <w:kern w:val="0"/>
-          <w:lang w:eastAsia="nl-BE"/>
-          <w14:ligatures w14:val="none"/>
-        </w:rPr>
-        <w:t>modellering</w:t>
-      </w:r>
-      <w:r>
-        <w:rPr>
-          <w:rFonts w:eastAsia="Times New Roman" w:cs="Times New Roman"/>
-          <w:kern w:val="0"/>
-          <w:lang w:eastAsia="nl-BE"/>
-          <w14:ligatures w14:val="none"/>
-        </w:rPr>
-        <w:t xml:space="preserve">, met aanbeveling voor integratie van UEQ in </w:t>
-      </w:r>
-      <w:proofErr w:type="spellStart"/>
-      <w:r>
-        <w:rPr>
-          <w:rFonts w:eastAsia="Times New Roman" w:cs="Times New Roman"/>
-          <w:kern w:val="0"/>
-          <w:lang w:eastAsia="nl-BE"/>
-          <w14:ligatures w14:val="none"/>
-        </w:rPr>
-        <w:t>threat</w:t>
-      </w:r>
-      <w:proofErr w:type="spellEnd"/>
-      <w:r>
-        <w:rPr>
-          <w:rFonts w:eastAsia="Times New Roman" w:cs="Times New Roman"/>
-          <w:kern w:val="0"/>
-          <w:lang w:eastAsia="nl-BE"/>
-          <w14:ligatures w14:val="none"/>
-        </w:rPr>
-        <w:t xml:space="preserve"> </w:t>
-      </w:r>
-      <w:proofErr w:type="spellStart"/>
-      <w:r>
-        <w:rPr>
-          <w:rFonts w:eastAsia="Times New Roman" w:cs="Times New Roman"/>
-          <w:kern w:val="0"/>
-          <w:lang w:eastAsia="nl-BE"/>
-          <w14:ligatures w14:val="none"/>
-        </w:rPr>
-        <w:t>modeling</w:t>
-      </w:r>
-      <w:proofErr w:type="spellEnd"/>
-      <w:r>
-        <w:rPr>
-          <w:rFonts w:eastAsia="Times New Roman" w:cs="Times New Roman"/>
-          <w:kern w:val="0"/>
-          <w:lang w:eastAsia="nl-BE"/>
-          <w14:ligatures w14:val="none"/>
-        </w:rPr>
-        <w:t xml:space="preserve"> evaluaties. Praktisch kan de tool </w:t>
-      </w:r>
-      <w:proofErr w:type="spellStart"/>
-      <w:r>
-        <w:rPr>
-          <w:rFonts w:eastAsia="Times New Roman" w:cs="Times New Roman"/>
-          <w:kern w:val="0"/>
-          <w:lang w:eastAsia="nl-BE"/>
-          <w14:ligatures w14:val="none"/>
-        </w:rPr>
-        <w:t>DevSecOps</w:t>
-      </w:r>
-      <w:proofErr w:type="spellEnd"/>
-      <w:r>
-        <w:rPr>
-          <w:rFonts w:eastAsia="Times New Roman" w:cs="Times New Roman"/>
-          <w:kern w:val="0"/>
-          <w:lang w:eastAsia="nl-BE"/>
-          <w14:ligatures w14:val="none"/>
-        </w:rPr>
-        <w:t xml:space="preserve"> teams helpen door </w:t>
-      </w:r>
-      <w:proofErr w:type="spellStart"/>
-      <w:r>
-        <w:rPr>
-          <w:rFonts w:eastAsia="Times New Roman" w:cs="Times New Roman"/>
-          <w:kern w:val="0"/>
-          <w:lang w:eastAsia="nl-BE"/>
-          <w14:ligatures w14:val="none"/>
-        </w:rPr>
-        <w:t>threat</w:t>
-      </w:r>
-      <w:proofErr w:type="spellEnd"/>
-      <w:r>
-        <w:rPr>
-          <w:rFonts w:eastAsia="Times New Roman" w:cs="Times New Roman"/>
-          <w:kern w:val="0"/>
-          <w:lang w:eastAsia="nl-BE"/>
-          <w14:ligatures w14:val="none"/>
-        </w:rPr>
-        <w:t xml:space="preserve"> </w:t>
-      </w:r>
-      <w:proofErr w:type="spellStart"/>
-      <w:r>
-        <w:rPr>
-          <w:rFonts w:eastAsia="Times New Roman" w:cs="Times New Roman"/>
-          <w:kern w:val="0"/>
-          <w:lang w:eastAsia="nl-BE"/>
-          <w14:ligatures w14:val="none"/>
-        </w:rPr>
-        <w:t>modeling</w:t>
-      </w:r>
-      <w:proofErr w:type="spellEnd"/>
-      <w:r>
-        <w:rPr>
-          <w:rFonts w:eastAsia="Times New Roman" w:cs="Times New Roman"/>
-          <w:kern w:val="0"/>
-          <w:lang w:eastAsia="nl-BE"/>
-          <w14:ligatures w14:val="none"/>
-        </w:rPr>
-        <w:t xml:space="preserve"> laagdrempelig te maken</w:t>
-      </w:r>
-      <w:r>
-        <w:rPr>
-          <w:rFonts w:eastAsia="Times New Roman" w:cs="Times New Roman"/>
-          <w:kern w:val="0"/>
-          <w:lang w:eastAsia="nl-BE"/>
-          <w14:ligatures w14:val="none"/>
-        </w:rPr>
-        <w:t xml:space="preserve"> en</w:t>
-      </w:r>
-      <w:r>
-        <w:rPr>
-          <w:rFonts w:eastAsia="Times New Roman" w:cs="Times New Roman"/>
-          <w:kern w:val="0"/>
-          <w:lang w:eastAsia="nl-BE"/>
-          <w14:ligatures w14:val="none"/>
-        </w:rPr>
-        <w:t xml:space="preserve"> implementeer filtering en iconen in bestaande </w:t>
-      </w:r>
-      <w:proofErr w:type="spellStart"/>
-      <w:r>
-        <w:rPr>
-          <w:rFonts w:eastAsia="Times New Roman" w:cs="Times New Roman"/>
-          <w:kern w:val="0"/>
-          <w:lang w:eastAsia="nl-BE"/>
-          <w14:ligatures w14:val="none"/>
-        </w:rPr>
-        <w:t>pipelines</w:t>
-      </w:r>
-      <w:proofErr w:type="spellEnd"/>
-      <w:r>
-        <w:rPr>
-          <w:rFonts w:eastAsia="Times New Roman" w:cs="Times New Roman"/>
-          <w:kern w:val="0"/>
-          <w:lang w:eastAsia="nl-BE"/>
-          <w14:ligatures w14:val="none"/>
-        </w:rPr>
-        <w:t xml:space="preserve">. Voor onderwijs biedt het een didactisch prototype om </w:t>
-      </w:r>
-      <w:proofErr w:type="spellStart"/>
-      <w:r>
-        <w:rPr>
-          <w:rFonts w:eastAsia="Times New Roman" w:cs="Times New Roman"/>
-          <w:kern w:val="0"/>
-          <w:lang w:eastAsia="nl-BE"/>
-          <w14:ligatures w14:val="none"/>
-        </w:rPr>
-        <w:t>Fortunately-Unfortunately</w:t>
-      </w:r>
-      <w:proofErr w:type="spellEnd"/>
-      <w:r>
-        <w:rPr>
-          <w:rFonts w:eastAsia="Times New Roman" w:cs="Times New Roman"/>
-          <w:kern w:val="0"/>
-          <w:lang w:eastAsia="nl-BE"/>
-          <w14:ligatures w14:val="none"/>
-        </w:rPr>
-        <w:t xml:space="preserve"> te demonstreren.</w:t>
-      </w:r>
-    </w:p>
-    <w:p>
-      <w:pPr>
-        <w:spacing w:afterLines="24" w:after="57" w:line="288" w:lineRule="auto"/>
-        <w:rPr>
-          <w:rFonts w:eastAsia="Times New Roman" w:cs="Times New Roman"/>
-          <w:kern w:val="0"/>
-          <w:lang w:eastAsia="nl-BE"/>
-          <w14:ligatures w14:val="none"/>
-        </w:rPr>
-      </w:pPr>
-    </w:p>
-    <w:p>
-      <w:pPr>
-        <w:spacing w:afterLines="24" w:after="57" w:line="288" w:lineRule="auto"/>
-        <w:rPr>
-          <w:rFonts w:eastAsia="Times New Roman" w:cs="Times New Roman"/>
-          <w:kern w:val="0"/>
-          <w:lang w:eastAsia="nl-BE"/>
-          <w14:ligatures w14:val="none"/>
-        </w:rPr>
-      </w:pPr>
-    </w:p>
-    <w:p>
-      <w:pPr>
-        <w:spacing w:afterLines="24" w:after="57" w:line="288" w:lineRule="auto"/>
+        <w:t xml:space="preserve">5.6 </w:t>
+      </w:r>
+      <w:r>
         <w:rPr>
           <w:rFonts w:eastAsia="Times New Roman" w:cs="Times New Roman"/>
           <w:b/>
@@ -9940,8 +11294,12 @@
           <w:lang w:eastAsia="nl-BE"/>
           <w14:ligatures w14:val="none"/>
         </w:rPr>
-      </w:pPr>
-      <w:r>
+        <w:t>Aanbevelingen voor toekomstig onderzoek</w:t>
+      </w:r>
+    </w:p>
+    <w:p>
+      <w:pPr>
+        <w:spacing w:afterLines="24" w:after="57" w:line="288" w:lineRule="auto"/>
         <w:rPr>
           <w:rFonts w:eastAsia="Times New Roman" w:cs="Times New Roman"/>
           <w:b/>
@@ -9952,35 +11310,6 @@
           <w:lang w:eastAsia="nl-BE"/>
           <w14:ligatures w14:val="none"/>
         </w:rPr>
-        <w:t xml:space="preserve">5.6 </w:t>
-      </w:r>
-      <w:r>
-        <w:rPr>
-          <w:rFonts w:eastAsia="Times New Roman" w:cs="Times New Roman"/>
-          <w:b/>
-          <w:bCs/>
-          <w:kern w:val="0"/>
-          <w:sz w:val="28"/>
-          <w:szCs w:val="28"/>
-          <w:lang w:eastAsia="nl-BE"/>
-          <w14:ligatures w14:val="none"/>
-        </w:rPr>
-        <w:t>Aanbevelingen voor toekomstig onderzoek</w:t>
-      </w:r>
-    </w:p>
-    <w:p>
-      <w:pPr>
-        <w:spacing w:afterLines="24" w:after="57" w:line="288" w:lineRule="auto"/>
-        <w:rPr>
-          <w:rFonts w:eastAsia="Times New Roman" w:cs="Times New Roman"/>
-          <w:b/>
-          <w:bCs/>
-          <w:kern w:val="0"/>
-          <w:sz w:val="28"/>
-          <w:szCs w:val="28"/>
-          <w:lang w:eastAsia="nl-BE"/>
-          <w14:ligatures w14:val="none"/>
-        </w:rPr>
       </w:pPr>
     </w:p>
     <w:p>
@@ -10581,7 +11910,7 @@
       </w:r>
     </w:p>
     <w:sectPr>
-      <w:footerReference w:type="default" r:id="rId31"/>
+      <w:footerReference w:type="default" r:id="rId34"/>
       <w:pgSz w:w="11906" w:h="16838"/>
       <w:pgMar w:top="1134" w:right="1418" w:bottom="1134" w:left="1418" w:header="709" w:footer="709" w:gutter="0"/>
       <w:cols w:space="708"/>
@@ -10838,6 +12167,155 @@
     </w:lvl>
   </w:abstractNum>
   <w:abstractNum w:abstractNumId="1" w15:restartNumberingAfterBreak="0">
+    <w:nsid w:val="0B475800"/>
+    <w:multiLevelType w:val="multilevel"/>
+    <w:tmpl w:val="61267CBC"/>
+    <w:lvl w:ilvl="0">
+      <w:start w:val="1"/>
+      <w:numFmt w:val="bullet"/>
+      <w:lvlText w:val=""/>
+      <w:lvlJc w:val="left"/>
+      <w:pPr>
+        <w:tabs>
+          <w:tab w:val="num" w:pos="720"/>
+        </w:tabs>
+        <w:ind w:left="720" w:hanging="360"/>
+      </w:pPr>
+      <w:rPr>
+        <w:rFonts w:ascii="Symbol" w:hAnsi="Symbol" w:hint="default"/>
+        <w:sz w:val="20"/>
+      </w:rPr>
+    </w:lvl>
+    <w:lvl w:ilvl="1" w:tentative="1">
+      <w:start w:val="1"/>
+      <w:numFmt w:val="bullet"/>
+      <w:lvlText w:val="o"/>
+      <w:lvlJc w:val="left"/>
+      <w:pPr>
+        <w:tabs>
+          <w:tab w:val="num" w:pos="1440"/>
+        </w:tabs>
+        <w:ind w:left="1440" w:hanging="360"/>
+      </w:pPr>
+      <w:rPr>
+        <w:rFonts w:ascii="Courier New" w:hAnsi="Courier New" w:hint="default"/>
+        <w:sz w:val="20"/>
+      </w:rPr>
+    </w:lvl>
+    <w:lvl w:ilvl="2" w:tentative="1">
+      <w:start w:val="1"/>
+      <w:numFmt w:val="bullet"/>
+      <w:lvlText w:val=""/>
+      <w:lvlJc w:val="left"/>
+      <w:pPr>
+        <w:tabs>
+          <w:tab w:val="num" w:pos="2160"/>
+        </w:tabs>
+        <w:ind w:left="2160" w:hanging="360"/>
+      </w:pPr>
+      <w:rPr>
+        <w:rFonts w:ascii="Wingdings" w:hAnsi="Wingdings" w:hint="default"/>
+        <w:sz w:val="20"/>
+      </w:rPr>
+    </w:lvl>
+    <w:lvl w:ilvl="3" w:tentative="1">
+      <w:start w:val="1"/>
+      <w:numFmt w:val="bullet"/>
+      <w:lvlText w:val=""/>
+      <w:lvlJc w:val="left"/>
+      <w:pPr>
+        <w:tabs>
+          <w:tab w:val="num" w:pos="2880"/>
+        </w:tabs>
+        <w:ind w:left="2880" w:hanging="360"/>
+      </w:pPr>
+      <w:rPr>
+        <w:rFonts w:ascii="Wingdings" w:hAnsi="Wingdings" w:hint="default"/>
+        <w:sz w:val="20"/>
+      </w:rPr>
+    </w:lvl>
+    <w:lvl w:ilvl="4" w:tentative="1">
+      <w:start w:val="1"/>
+      <w:numFmt w:val="bullet"/>
+      <w:lvlText w:val=""/>
+      <w:lvlJc w:val="left"/>
+      <w:pPr>
+        <w:tabs>
+          <w:tab w:val="num" w:pos="3600"/>
+        </w:tabs>
+        <w:ind w:left="3600" w:hanging="360"/>
+      </w:pPr>
+      <w:rPr>
+        <w:rFonts w:ascii="Wingdings" w:hAnsi="Wingdings" w:hint="default"/>
+        <w:sz w:val="20"/>
+      </w:rPr>
+    </w:lvl>
+    <w:lvl w:ilvl="5" w:tentative="1">
+      <w:start w:val="1"/>
+      <w:numFmt w:val="bullet"/>
+      <w:lvlText w:val=""/>
+      <w:lvlJc w:val="left"/>
+      <w:pPr>
+        <w:tabs>
+          <w:tab w:val="num" w:pos="4320"/>
+        </w:tabs>
+        <w:ind w:left="4320" w:hanging="360"/>
+      </w:pPr>
+      <w:rPr>
+        <w:rFonts w:ascii="Wingdings" w:hAnsi="Wingdings" w:hint="default"/>
+        <w:sz w:val="20"/>
+      </w:rPr>
+    </w:lvl>
+    <w:lvl w:ilvl="6" w:tentative="1">
+      <w:start w:val="1"/>
+      <w:numFmt w:val="bullet"/>
+      <w:lvlText w:val=""/>
+      <w:lvlJc w:val="left"/>
+      <w:pPr>
+        <w:tabs>
+          <w:tab w:val="num" w:pos="5040"/>
+        </w:tabs>
+        <w:ind w:left="5040" w:hanging="360"/>
+      </w:pPr>
+      <w:rPr>
+        <w:rFonts w:ascii="Wingdings" w:hAnsi="Wingdings" w:hint="default"/>
+        <w:sz w:val="20"/>
+      </w:rPr>
+    </w:lvl>
+    <w:lvl w:ilvl="7" w:tentative="1">
+      <w:start w:val="1"/>
+      <w:numFmt w:val="bullet"/>
+      <w:lvlText w:val=""/>
+      <w:lvlJc w:val="left"/>
+      <w:pPr>
+        <w:tabs>
+          <w:tab w:val="num" w:pos="5760"/>
+        </w:tabs>
+        <w:ind w:left="5760" w:hanging="360"/>
+      </w:pPr>
+      <w:rPr>
+        <w:rFonts w:ascii="Wingdings" w:hAnsi="Wingdings" w:hint="default"/>
+        <w:sz w:val="20"/>
+      </w:rPr>
+    </w:lvl>
+    <w:lvl w:ilvl="8" w:tentative="1">
+      <w:start w:val="1"/>
+      <w:numFmt w:val="bullet"/>
+      <w:lvlText w:val=""/>
+      <w:lvlJc w:val="left"/>
+      <w:pPr>
+        <w:tabs>
+          <w:tab w:val="num" w:pos="6480"/>
+        </w:tabs>
+        <w:ind w:left="6480" w:hanging="360"/>
+      </w:pPr>
+      <w:rPr>
+        <w:rFonts w:ascii="Wingdings" w:hAnsi="Wingdings" w:hint="default"/>
+        <w:sz w:val="20"/>
+      </w:rPr>
+    </w:lvl>
+  </w:abstractNum>
+  <w:abstractNum w:abstractNumId="2" w15:restartNumberingAfterBreak="0">
     <w:nsid w:val="0BFD190E"/>
     <w:multiLevelType w:val="multilevel"/>
     <w:tmpl w:val="DB781E06"/>
@@ -10986,7 +12464,7 @@
       </w:rPr>
     </w:lvl>
   </w:abstractNum>
-  <w:abstractNum w:abstractNumId="2" w15:restartNumberingAfterBreak="0">
+  <w:abstractNum w:abstractNumId="3" w15:restartNumberingAfterBreak="0">
     <w:nsid w:val="1253347C"/>
     <w:multiLevelType w:val="multilevel"/>
     <w:tmpl w:val="600AE90C"/>
@@ -11135,7 +12613,242 @@
       </w:rPr>
     </w:lvl>
   </w:abstractNum>
-  <w:abstractNum w:abstractNumId="3" w15:restartNumberingAfterBreak="0">
+  <w:abstractNum w:abstractNumId="4" w15:restartNumberingAfterBreak="0">
+    <w:nsid w:val="1AA26A6F"/>
+    <w:multiLevelType w:val="hybridMultilevel"/>
+    <w:tmpl w:val="E53A9FB0"/>
+    <w:lvl w:ilvl="0" w:tplc="0813000F">
+      <w:start w:val="1"/>
+      <w:numFmt w:val="decimal"/>
+      <w:lvlText w:val="%1."/>
+      <w:lvlJc w:val="left"/>
+      <w:pPr>
+        <w:ind w:left="720" w:hanging="360"/>
+      </w:pPr>
+    </w:lvl>
+    <w:lvl w:ilvl="1" w:tplc="08130019" w:tentative="1">
+      <w:start w:val="1"/>
+      <w:numFmt w:val="lowerLetter"/>
+      <w:lvlText w:val="%2."/>
+      <w:lvlJc w:val="left"/>
+      <w:pPr>
+        <w:ind w:left="1440" w:hanging="360"/>
+      </w:pPr>
+    </w:lvl>
+    <w:lvl w:ilvl="2" w:tplc="0813001B" w:tentative="1">
+      <w:start w:val="1"/>
+      <w:numFmt w:val="lowerRoman"/>
+      <w:lvlText w:val="%3."/>
+      <w:lvlJc w:val="right"/>
+      <w:pPr>
+        <w:ind w:left="2160" w:hanging="180"/>
+      </w:pPr>
+    </w:lvl>
+    <w:lvl w:ilvl="3" w:tplc="0813000F" w:tentative="1">
+      <w:start w:val="1"/>
+      <w:numFmt w:val="decimal"/>
+      <w:lvlText w:val="%4."/>
+      <w:lvlJc w:val="left"/>
+      <w:pPr>
+        <w:ind w:left="2880" w:hanging="360"/>
+      </w:pPr>
+    </w:lvl>
+    <w:lvl w:ilvl="4" w:tplc="08130019" w:tentative="1">
+      <w:start w:val="1"/>
+      <w:numFmt w:val="lowerLetter"/>
+      <w:lvlText w:val="%5."/>
+      <w:lvlJc w:val="left"/>
+      <w:pPr>
+        <w:ind w:left="3600" w:hanging="360"/>
+      </w:pPr>
+    </w:lvl>
+    <w:lvl w:ilvl="5" w:tplc="0813001B" w:tentative="1">
+      <w:start w:val="1"/>
+      <w:numFmt w:val="lowerRoman"/>
+      <w:lvlText w:val="%6."/>
+      <w:lvlJc w:val="right"/>
+      <w:pPr>
+        <w:ind w:left="4320" w:hanging="180"/>
+      </w:pPr>
+    </w:lvl>
+    <w:lvl w:ilvl="6" w:tplc="0813000F" w:tentative="1">
+      <w:start w:val="1"/>
+      <w:numFmt w:val="decimal"/>
+      <w:lvlText w:val="%7."/>
+      <w:lvlJc w:val="left"/>
+      <w:pPr>
+        <w:ind w:left="5040" w:hanging="360"/>
+      </w:pPr>
+    </w:lvl>
+    <w:lvl w:ilvl="7" w:tplc="08130019" w:tentative="1">
+      <w:start w:val="1"/>
+      <w:numFmt w:val="lowerLetter"/>
+      <w:lvlText w:val="%8."/>
+      <w:lvlJc w:val="left"/>
+      <w:pPr>
+        <w:ind w:left="5760" w:hanging="360"/>
+      </w:pPr>
+    </w:lvl>
+    <w:lvl w:ilvl="8" w:tplc="0813001B" w:tentative="1">
+      <w:start w:val="1"/>
+      <w:numFmt w:val="lowerRoman"/>
+      <w:lvlText w:val="%9."/>
+      <w:lvlJc w:val="right"/>
+      <w:pPr>
+        <w:ind w:left="6480" w:hanging="180"/>
+      </w:pPr>
+    </w:lvl>
+  </w:abstractNum>
+  <w:abstractNum w:abstractNumId="5" w15:restartNumberingAfterBreak="0">
+    <w:nsid w:val="25B7158A"/>
+    <w:multiLevelType w:val="multilevel"/>
+    <w:tmpl w:val="E7C03836"/>
+    <w:lvl w:ilvl="0">
+      <w:start w:val="1"/>
+      <w:numFmt w:val="bullet"/>
+      <w:lvlText w:val=""/>
+      <w:lvlJc w:val="left"/>
+      <w:pPr>
+        <w:tabs>
+          <w:tab w:val="num" w:pos="720"/>
+        </w:tabs>
+        <w:ind w:left="720" w:hanging="360"/>
+      </w:pPr>
+      <w:rPr>
+        <w:rFonts w:ascii="Symbol" w:hAnsi="Symbol" w:hint="default"/>
+        <w:sz w:val="20"/>
+      </w:rPr>
+    </w:lvl>
+    <w:lvl w:ilvl="1" w:tentative="1">
+      <w:start w:val="1"/>
+      <w:numFmt w:val="bullet"/>
+      <w:lvlText w:val="o"/>
+      <w:lvlJc w:val="left"/>
+      <w:pPr>
+        <w:tabs>
+          <w:tab w:val="num" w:pos="1440"/>
+        </w:tabs>
+        <w:ind w:left="1440" w:hanging="360"/>
+      </w:pPr>
+      <w:rPr>
+        <w:rFonts w:ascii="Courier New" w:hAnsi="Courier New" w:hint="default"/>
+        <w:sz w:val="20"/>
+      </w:rPr>
+    </w:lvl>
+    <w:lvl w:ilvl="2" w:tentative="1">
+      <w:start w:val="1"/>
+      <w:numFmt w:val="bullet"/>
+      <w:lvlText w:val=""/>
+      <w:lvlJc w:val="left"/>
+      <w:pPr>
+        <w:tabs>
+          <w:tab w:val="num" w:pos="2160"/>
+        </w:tabs>
+        <w:ind w:left="2160" w:hanging="360"/>
+      </w:pPr>
+      <w:rPr>
+        <w:rFonts w:ascii="Wingdings" w:hAnsi="Wingdings" w:hint="default"/>
+        <w:sz w:val="20"/>
+      </w:rPr>
+    </w:lvl>
+    <w:lvl w:ilvl="3" w:tentative="1">
+      <w:start w:val="1"/>
+      <w:numFmt w:val="bullet"/>
+      <w:lvlText w:val=""/>
+      <w:lvlJc w:val="left"/>
+      <w:pPr>
+        <w:tabs>
+          <w:tab w:val="num" w:pos="2880"/>
+        </w:tabs>
+        <w:ind w:left="2880" w:hanging="360"/>
+      </w:pPr>
+      <w:rPr>
+        <w:rFonts w:ascii="Wingdings" w:hAnsi="Wingdings" w:hint="default"/>
+        <w:sz w:val="20"/>
+      </w:rPr>
+    </w:lvl>
+    <w:lvl w:ilvl="4" w:tentative="1">
+      <w:start w:val="1"/>
+      <w:numFmt w:val="bullet"/>
+      <w:lvlText w:val=""/>
+      <w:lvlJc w:val="left"/>
+      <w:pPr>
+        <w:tabs>
+          <w:tab w:val="num" w:pos="3600"/>
+        </w:tabs>
+        <w:ind w:left="3600" w:hanging="360"/>
+      </w:pPr>
+      <w:rPr>
+        <w:rFonts w:ascii="Wingdings" w:hAnsi="Wingdings" w:hint="default"/>
+        <w:sz w:val="20"/>
+      </w:rPr>
+    </w:lvl>
+    <w:lvl w:ilvl="5" w:tentative="1">
+      <w:start w:val="1"/>
+      <w:numFmt w:val="bullet"/>
+      <w:lvlText w:val=""/>
+      <w:lvlJc w:val="left"/>
+      <w:pPr>
+        <w:tabs>
+          <w:tab w:val="num" w:pos="4320"/>
+        </w:tabs>
+        <w:ind w:left="4320" w:hanging="360"/>
+      </w:pPr>
+      <w:rPr>
+        <w:rFonts w:ascii="Wingdings" w:hAnsi="Wingdings" w:hint="default"/>
+        <w:sz w:val="20"/>
+      </w:rPr>
+    </w:lvl>
+    <w:lvl w:ilvl="6" w:tentative="1">
+      <w:start w:val="1"/>
+      <w:numFmt w:val="bullet"/>
+      <w:lvlText w:val=""/>
+      <w:lvlJc w:val="left"/>
+      <w:pPr>
+        <w:tabs>
+          <w:tab w:val="num" w:pos="5040"/>
+        </w:tabs>
+        <w:ind w:left="5040" w:hanging="360"/>
+      </w:pPr>
+      <w:rPr>
+        <w:rFonts w:ascii="Wingdings" w:hAnsi="Wingdings" w:hint="default"/>
+        <w:sz w:val="20"/>
+      </w:rPr>
+    </w:lvl>
+    <w:lvl w:ilvl="7" w:tentative="1">
+      <w:start w:val="1"/>
+      <w:numFmt w:val="bullet"/>
+      <w:lvlText w:val=""/>
+      <w:lvlJc w:val="left"/>
+      <w:pPr>
+        <w:tabs>
+          <w:tab w:val="num" w:pos="5760"/>
+        </w:tabs>
+        <w:ind w:left="5760" w:hanging="360"/>
+      </w:pPr>
+      <w:rPr>
+        <w:rFonts w:ascii="Wingdings" w:hAnsi="Wingdings" w:hint="default"/>
+        <w:sz w:val="20"/>
+      </w:rPr>
+    </w:lvl>
+    <w:lvl w:ilvl="8" w:tentative="1">
+      <w:start w:val="1"/>
+      <w:numFmt w:val="bullet"/>
+      <w:lvlText w:val=""/>
+      <w:lvlJc w:val="left"/>
+      <w:pPr>
+        <w:tabs>
+          <w:tab w:val="num" w:pos="6480"/>
+        </w:tabs>
+        <w:ind w:left="6480" w:hanging="360"/>
+      </w:pPr>
+      <w:rPr>
+        <w:rFonts w:ascii="Wingdings" w:hAnsi="Wingdings" w:hint="default"/>
+        <w:sz w:val="20"/>
+      </w:rPr>
+    </w:lvl>
+  </w:abstractNum>
+  <w:abstractNum w:abstractNumId="6" w15:restartNumberingAfterBreak="0">
     <w:nsid w:val="3270236A"/>
     <w:multiLevelType w:val="multilevel"/>
     <w:tmpl w:val="A2063C10"/>
@@ -11248,7 +12961,7 @@
       </w:pPr>
     </w:lvl>
   </w:abstractNum>
-  <w:abstractNum w:abstractNumId="4" w15:restartNumberingAfterBreak="0">
+  <w:abstractNum w:abstractNumId="7" w15:restartNumberingAfterBreak="0">
     <w:nsid w:val="4D103668"/>
     <w:multiLevelType w:val="multilevel"/>
     <w:tmpl w:val="C3B20AC4"/>
@@ -11397,7 +13110,7 @@
       </w:rPr>
     </w:lvl>
   </w:abstractNum>
-  <w:abstractNum w:abstractNumId="5" w15:restartNumberingAfterBreak="0">
+  <w:abstractNum w:abstractNumId="8" w15:restartNumberingAfterBreak="0">
     <w:nsid w:val="5DEF75CC"/>
     <w:multiLevelType w:val="multilevel"/>
     <w:tmpl w:val="46546344"/>
@@ -11514,7 +13227,7 @@
       </w:pPr>
     </w:lvl>
   </w:abstractNum>
-  <w:abstractNum w:abstractNumId="6" w15:restartNumberingAfterBreak="0">
+  <w:abstractNum w:abstractNumId="9" w15:restartNumberingAfterBreak="0">
     <w:nsid w:val="5F557A8A"/>
     <w:multiLevelType w:val="multilevel"/>
     <w:tmpl w:val="802A707C"/>
@@ -11627,7 +13340,206 @@
       </w:pPr>
     </w:lvl>
   </w:abstractNum>
-  <w:abstractNum w:abstractNumId="7" w15:restartNumberingAfterBreak="0">
+  <w:abstractNum w:abstractNumId="10" w15:restartNumberingAfterBreak="0">
+    <w:nsid w:val="6E951F4D"/>
+    <w:multiLevelType w:val="hybridMultilevel"/>
+    <w:tmpl w:val="1D62BE6A"/>
+    <w:lvl w:ilvl="0" w:tplc="0813000F">
+      <w:start w:val="1"/>
+      <w:numFmt w:val="decimal"/>
+      <w:lvlText w:val="%1."/>
+      <w:lvlJc w:val="left"/>
+      <w:pPr>
+        <w:ind w:left="720" w:hanging="360"/>
+      </w:pPr>
+    </w:lvl>
+    <w:lvl w:ilvl="1" w:tplc="08130019" w:tentative="1">
+      <w:start w:val="1"/>
+      <w:numFmt w:val="lowerLetter"/>
+      <w:lvlText w:val="%2."/>
+      <w:lvlJc w:val="left"/>
+      <w:pPr>
+        <w:ind w:left="1440" w:hanging="360"/>
+      </w:pPr>
+    </w:lvl>
+    <w:lvl w:ilvl="2" w:tplc="0813001B" w:tentative="1">
+      <w:start w:val="1"/>
+      <w:numFmt w:val="lowerRoman"/>
+      <w:lvlText w:val="%3."/>
+      <w:lvlJc w:val="right"/>
+      <w:pPr>
+        <w:ind w:left="2160" w:hanging="180"/>
+      </w:pPr>
+    </w:lvl>
+    <w:lvl w:ilvl="3" w:tplc="0813000F" w:tentative="1">
+      <w:start w:val="1"/>
+      <w:numFmt w:val="decimal"/>
+      <w:lvlText w:val="%4."/>
+      <w:lvlJc w:val="left"/>
+      <w:pPr>
+        <w:ind w:left="2880" w:hanging="360"/>
+      </w:pPr>
+    </w:lvl>
+    <w:lvl w:ilvl="4" w:tplc="08130019" w:tentative="1">
+      <w:start w:val="1"/>
+      <w:numFmt w:val="lowerLetter"/>
+      <w:lvlText w:val="%5."/>
+      <w:lvlJc w:val="left"/>
+      <w:pPr>
+        <w:ind w:left="3600" w:hanging="360"/>
+      </w:pPr>
+    </w:lvl>
+    <w:lvl w:ilvl="5" w:tplc="0813001B" w:tentative="1">
+      <w:start w:val="1"/>
+      <w:numFmt w:val="lowerRoman"/>
+      <w:lvlText w:val="%6."/>
+      <w:lvlJc w:val="right"/>
+      <w:pPr>
+        <w:ind w:left="4320" w:hanging="180"/>
+      </w:pPr>
+    </w:lvl>
+    <w:lvl w:ilvl="6" w:tplc="0813000F" w:tentative="1">
+      <w:start w:val="1"/>
+      <w:numFmt w:val="decimal"/>
+      <w:lvlText w:val="%7."/>
+      <w:lvlJc w:val="left"/>
+      <w:pPr>
+        <w:ind w:left="5040" w:hanging="360"/>
+      </w:pPr>
+    </w:lvl>
+    <w:lvl w:ilvl="7" w:tplc="08130019" w:tentative="1">
+      <w:start w:val="1"/>
+      <w:numFmt w:val="lowerLetter"/>
+      <w:lvlText w:val="%8."/>
+      <w:lvlJc w:val="left"/>
+      <w:pPr>
+        <w:ind w:left="5760" w:hanging="360"/>
+      </w:pPr>
+    </w:lvl>
+    <w:lvl w:ilvl="8" w:tplc="0813001B" w:tentative="1">
+      <w:start w:val="1"/>
+      <w:numFmt w:val="lowerRoman"/>
+      <w:lvlText w:val="%9."/>
+      <w:lvlJc w:val="right"/>
+      <w:pPr>
+        <w:ind w:left="6480" w:hanging="180"/>
+      </w:pPr>
+    </w:lvl>
+  </w:abstractNum>
+  <w:abstractNum w:abstractNumId="11" w15:restartNumberingAfterBreak="0">
+    <w:nsid w:val="6F5E361A"/>
+    <w:multiLevelType w:val="multilevel"/>
+    <w:tmpl w:val="9E0CC59E"/>
+    <w:lvl w:ilvl="0">
+      <w:start w:val="1"/>
+      <w:numFmt w:val="decimal"/>
+      <w:lvlText w:val="%1."/>
+      <w:lvlJc w:val="left"/>
+      <w:pPr>
+        <w:tabs>
+          <w:tab w:val="num" w:pos="720"/>
+        </w:tabs>
+        <w:ind w:left="720" w:hanging="360"/>
+      </w:pPr>
+    </w:lvl>
+    <w:lvl w:ilvl="1" w:tentative="1">
+      <w:start w:val="1"/>
+      <w:numFmt w:val="decimal"/>
+      <w:lvlText w:val="%2."/>
+      <w:lvlJc w:val="left"/>
+      <w:pPr>
+        <w:tabs>
+          <w:tab w:val="num" w:pos="1440"/>
+        </w:tabs>
+        <w:ind w:left="1440" w:hanging="360"/>
+      </w:pPr>
+    </w:lvl>
+    <w:lvl w:ilvl="2" w:tentative="1">
+      <w:start w:val="1"/>
+      <w:numFmt w:val="decimal"/>
+      <w:lvlText w:val="%3."/>
+      <w:lvlJc w:val="left"/>
+      <w:pPr>
+        <w:tabs>
+          <w:tab w:val="num" w:pos="2160"/>
+        </w:tabs>
+        <w:ind w:left="2160" w:hanging="360"/>
+      </w:pPr>
+    </w:lvl>
+    <w:lvl w:ilvl="3" w:tentative="1">
+      <w:start w:val="1"/>
+      <w:numFmt w:val="decimal"/>
+      <w:lvlText w:val="%4."/>
+      <w:lvlJc w:val="left"/>
+      <w:pPr>
+        <w:tabs>
+          <w:tab w:val="num" w:pos="2880"/>
+        </w:tabs>
+        <w:ind w:left="2880" w:hanging="360"/>
+      </w:pPr>
+    </w:lvl>
+    <w:lvl w:ilvl="4" w:tentative="1">
+      <w:start w:val="1"/>
+      <w:numFmt w:val="decimal"/>
+      <w:lvlText w:val="%5."/>
+      <w:lvlJc w:val="left"/>
+      <w:pPr>
+        <w:tabs>
+          <w:tab w:val="num" w:pos="3600"/>
+        </w:tabs>
+        <w:ind w:left="3600" w:hanging="360"/>
+      </w:pPr>
+    </w:lvl>
+    <w:lvl w:ilvl="5" w:tentative="1">
+      <w:start w:val="1"/>
+      <w:numFmt w:val="decimal"/>
+      <w:lvlText w:val="%6."/>
+      <w:lvlJc w:val="left"/>
+      <w:pPr>
+        <w:tabs>
+          <w:tab w:val="num" w:pos="4320"/>
+        </w:tabs>
+        <w:ind w:left="4320" w:hanging="360"/>
+      </w:pPr>
+    </w:lvl>
+    <w:lvl w:ilvl="6" w:tentative="1">
+      <w:start w:val="1"/>
+      <w:numFmt w:val="decimal"/>
+      <w:lvlText w:val="%7."/>
+      <w:lvlJc w:val="left"/>
+      <w:pPr>
+        <w:tabs>
+          <w:tab w:val="num" w:pos="5040"/>
+        </w:tabs>
+        <w:ind w:left="5040" w:hanging="360"/>
+      </w:pPr>
+    </w:lvl>
+    <w:lvl w:ilvl="7" w:tentative="1">
+      <w:start w:val="1"/>
+      <w:numFmt w:val="decimal"/>
+      <w:lvlText w:val="%8."/>
+      <w:lvlJc w:val="left"/>
+      <w:pPr>
+        <w:tabs>
+          <w:tab w:val="num" w:pos="5760"/>
+        </w:tabs>
+        <w:ind w:left="5760" w:hanging="360"/>
+      </w:pPr>
+    </w:lvl>
+    <w:lvl w:ilvl="8" w:tentative="1">
+      <w:start w:val="1"/>
+      <w:numFmt w:val="decimal"/>
+      <w:lvlText w:val="%9."/>
+      <w:lvlJc w:val="left"/>
+      <w:pPr>
+        <w:tabs>
+          <w:tab w:val="num" w:pos="6480"/>
+        </w:tabs>
+        <w:ind w:left="6480" w:hanging="360"/>
+      </w:pPr>
+    </w:lvl>
+  </w:abstractNum>
+  <w:abstractNum w:abstractNumId="12" w15:restartNumberingAfterBreak="0">
     <w:nsid w:val="739E373C"/>
     <w:multiLevelType w:val="multilevel"/>
     <w:tmpl w:val="51FA6F6C"/>
@@ -11776,7 +13688,7 @@
       </w:rPr>
     </w:lvl>
   </w:abstractNum>
-  <w:abstractNum w:abstractNumId="8" w15:restartNumberingAfterBreak="0">
+  <w:abstractNum w:abstractNumId="13" w15:restartNumberingAfterBreak="0">
     <w:nsid w:val="73B23B94"/>
     <w:multiLevelType w:val="multilevel"/>
     <w:tmpl w:val="DD56EF6C"/>
@@ -11925,7 +13837,7 @@
       </w:rPr>
     </w:lvl>
   </w:abstractNum>
-  <w:abstractNum w:abstractNumId="9" w15:restartNumberingAfterBreak="0">
+  <w:abstractNum w:abstractNumId="14" w15:restartNumberingAfterBreak="0">
     <w:nsid w:val="74717386"/>
     <w:multiLevelType w:val="multilevel"/>
     <w:tmpl w:val="59BAA730"/>
@@ -12074,7 +13986,7 @@
       </w:rPr>
     </w:lvl>
   </w:abstractNum>
-  <w:abstractNum w:abstractNumId="10" w15:restartNumberingAfterBreak="0">
+  <w:abstractNum w:abstractNumId="15" w15:restartNumberingAfterBreak="0">
     <w:nsid w:val="787E42AC"/>
     <w:multiLevelType w:val="multilevel"/>
     <w:tmpl w:val="183AAC40"/>
@@ -12187,7 +14099,7 @@
       </w:pPr>
     </w:lvl>
   </w:abstractNum>
-  <w:abstractNum w:abstractNumId="11" w15:restartNumberingAfterBreak="0">
+  <w:abstractNum w:abstractNumId="16" w15:restartNumberingAfterBreak="0">
     <w:nsid w:val="7D4F047B"/>
     <w:multiLevelType w:val="multilevel"/>
     <w:tmpl w:val="00FE70FE"/>
@@ -12336,7 +14248,7 @@
       </w:rPr>
     </w:lvl>
   </w:abstractNum>
-  <w:abstractNum w:abstractNumId="12" w15:restartNumberingAfterBreak="0">
+  <w:abstractNum w:abstractNumId="17" w15:restartNumberingAfterBreak="0">
     <w:nsid w:val="7FB234BB"/>
     <w:multiLevelType w:val="multilevel"/>
     <w:tmpl w:val="57B67D44"/>
@@ -12489,40 +14401,55 @@
     <w:abstractNumId w:val="0"/>
   </w:num>
   <w:num w:numId="2" w16cid:durableId="285085652">
+    <w:abstractNumId w:val="2"/>
+  </w:num>
+  <w:num w:numId="3" w16cid:durableId="804390768">
+    <w:abstractNumId w:val="16"/>
+  </w:num>
+  <w:num w:numId="4" w16cid:durableId="740324678">
+    <w:abstractNumId w:val="14"/>
+  </w:num>
+  <w:num w:numId="5" w16cid:durableId="959729964">
+    <w:abstractNumId w:val="7"/>
+  </w:num>
+  <w:num w:numId="6" w16cid:durableId="521011932">
+    <w:abstractNumId w:val="17"/>
+  </w:num>
+  <w:num w:numId="7" w16cid:durableId="2095086216">
+    <w:abstractNumId w:val="12"/>
+  </w:num>
+  <w:num w:numId="8" w16cid:durableId="803812241">
+    <w:abstractNumId w:val="8"/>
+  </w:num>
+  <w:num w:numId="9" w16cid:durableId="189876946">
+    <w:abstractNumId w:val="3"/>
+  </w:num>
+  <w:num w:numId="10" w16cid:durableId="1285310722">
+    <w:abstractNumId w:val="13"/>
+  </w:num>
+  <w:num w:numId="11" w16cid:durableId="1317300852">
+    <w:abstractNumId w:val="15"/>
+  </w:num>
+  <w:num w:numId="12" w16cid:durableId="1607344221">
+    <w:abstractNumId w:val="6"/>
+  </w:num>
+  <w:num w:numId="13" w16cid:durableId="1828588209">
+    <w:abstractNumId w:val="9"/>
+  </w:num>
+  <w:num w:numId="14" w16cid:durableId="1929537873">
+    <w:abstractNumId w:val="5"/>
+  </w:num>
+  <w:num w:numId="15" w16cid:durableId="1450203414">
     <w:abstractNumId w:val="1"/>
   </w:num>
-  <w:num w:numId="3" w16cid:durableId="804390768">
+  <w:num w:numId="16" w16cid:durableId="1606230509">
     <w:abstractNumId w:val="11"/>
   </w:num>
-  <w:num w:numId="4" w16cid:durableId="740324678">
-    <w:abstractNumId w:val="9"/>
-  </w:num>
-  <w:num w:numId="5" w16cid:durableId="959729964">
+  <w:num w:numId="17" w16cid:durableId="2126999199">
     <w:abstractNumId w:val="4"/>
   </w:num>
-  <w:num w:numId="6" w16cid:durableId="521011932">
-    <w:abstractNumId w:val="12"/>
-  </w:num>
-  <w:num w:numId="7" w16cid:durableId="2095086216">
-    <w:abstractNumId w:val="7"/>
-  </w:num>
-  <w:num w:numId="8" w16cid:durableId="803812241">
-    <w:abstractNumId w:val="5"/>
-  </w:num>
-  <w:num w:numId="9" w16cid:durableId="189876946">
-    <w:abstractNumId w:val="2"/>
-  </w:num>
-  <w:num w:numId="10" w16cid:durableId="1285310722">
-    <w:abstractNumId w:val="8"/>
-  </w:num>
-  <w:num w:numId="11" w16cid:durableId="1317300852">
+  <w:num w:numId="18" w16cid:durableId="752900601">
     <w:abstractNumId w:val="10"/>
-  </w:num>
-  <w:num w:numId="12" w16cid:durableId="1607344221">
-    <w:abstractNumId w:val="3"/>
-  </w:num>
-  <w:num w:numId="13" w16cid:durableId="1828588209">
-    <w:abstractNumId w:val="6"/>
   </w:num>
 </w:numbering>
 </file>
@@ -13129,7 +15056,6 @@
   <w:style w:type="character" w:default="1" w:styleId="Standaardalinea-lettertype">
     <w:name w:val="Default Paragraph Font"/>
     <w:uiPriority w:val="1"/>
-    <w:semiHidden/>
     <w:unhideWhenUsed/>
   </w:style>
   <w:style w:type="table" w:default="1" w:styleId="Standaardtabel">

</xml_diff>

<commit_message>
finished version 2 of master thesis
</commit_message>
<xml_diff>
--- a/Master_scriptie_tekst.docx
+++ b/Master_scriptie_tekst.docx
@@ -195,10 +195,281 @@
           <w:bCs/>
           <w:sz w:val="36"/>
           <w:szCs w:val="36"/>
-          <w:lang w:val="en-GB"/>
-        </w:rPr>
-      </w:pPr>
-      <w:r>
+        </w:rPr>
+      </w:pPr>
+      <w:r>
+        <w:rPr>
+          <w:b/>
+          <w:bCs/>
+          <w:sz w:val="36"/>
+          <w:szCs w:val="36"/>
+        </w:rPr>
+        <w:lastRenderedPageBreak/>
+        <w:t>Abstract</w:t>
+      </w:r>
+    </w:p>
+    <w:p>
+      <w:pPr>
+        <w:spacing w:afterLines="24" w:after="57"/>
+        <w:rPr>
+          <w:b/>
+          <w:bCs/>
+          <w:sz w:val="36"/>
+          <w:szCs w:val="36"/>
+        </w:rPr>
+      </w:pPr>
+    </w:p>
+    <w:p>
+      <w:pPr>
+        <w:spacing w:afterLines="24" w:after="57"/>
+      </w:pPr>
+      <w:proofErr w:type="spellStart"/>
+      <w:r>
+        <w:t>Threat</w:t>
+      </w:r>
+      <w:proofErr w:type="spellEnd"/>
+      <w:r>
+        <w:t xml:space="preserve"> </w:t>
+      </w:r>
+      <w:proofErr w:type="spellStart"/>
+      <w:r>
+        <w:t>modeling</w:t>
+      </w:r>
+      <w:proofErr w:type="spellEnd"/>
+      <w:r>
+        <w:t xml:space="preserve"> is een systematische methode binnen softwareontwikkeling om potentiële beveiligingsrisico’s vroegtijdig te identificeren en te mitigeren. Ondanks het belang ervan ervaren veel ontwikkelaars het proces als complex en tijdsintensief, wat vaak leidt tot onvolledige risicoanalyses. Dit onderzoek ontwikkelt en evalueert een gebruiksvriendelijke tool, gebaseerd op de </w:t>
+      </w:r>
+      <w:proofErr w:type="spellStart"/>
+      <w:r>
+        <w:t>Fortunately</w:t>
+      </w:r>
+      <w:proofErr w:type="spellEnd"/>
+      <w:r>
+        <w:t>-</w:t>
+      </w:r>
+      <w:proofErr w:type="spellStart"/>
+      <w:r>
+        <w:t>Unfortunately</w:t>
+      </w:r>
+      <w:proofErr w:type="spellEnd"/>
+      <w:r>
+        <w:t xml:space="preserve">-methode, om het </w:t>
+      </w:r>
+      <w:proofErr w:type="spellStart"/>
+      <w:r>
+        <w:t>threat</w:t>
+      </w:r>
+      <w:proofErr w:type="spellEnd"/>
+      <w:r>
+        <w:t xml:space="preserve"> </w:t>
+      </w:r>
+      <w:proofErr w:type="spellStart"/>
+      <w:r>
+        <w:t>modeling</w:t>
+      </w:r>
+      <w:proofErr w:type="spellEnd"/>
+      <w:r>
+        <w:t>-proces toegankelijker en effectiever te maken.</w:t>
+      </w:r>
+    </w:p>
+    <w:p>
+      <w:pPr>
+        <w:spacing w:afterLines="24" w:after="57"/>
+      </w:pPr>
+    </w:p>
+    <w:p>
+      <w:pPr>
+        <w:spacing w:afterLines="24" w:after="57"/>
+      </w:pPr>
+      <w:r>
+        <w:t xml:space="preserve">Een literatuurstudie brengt bestaande </w:t>
+      </w:r>
+      <w:proofErr w:type="spellStart"/>
+      <w:r>
+        <w:t>threat</w:t>
+      </w:r>
+      <w:proofErr w:type="spellEnd"/>
+      <w:r>
+        <w:t xml:space="preserve"> </w:t>
+      </w:r>
+      <w:proofErr w:type="spellStart"/>
+      <w:r>
+        <w:t>modeling</w:t>
+      </w:r>
+      <w:proofErr w:type="spellEnd"/>
+      <w:r>
+        <w:t xml:space="preserve">-raamwerken, </w:t>
+      </w:r>
+      <w:proofErr w:type="spellStart"/>
+      <w:r>
+        <w:t>mindmaptools</w:t>
+      </w:r>
+      <w:proofErr w:type="spellEnd"/>
+      <w:r>
+        <w:t xml:space="preserve"> en visualisatietechnieken in kaart. Op basis daarvan wordt een eisenlijst opgesteld met zowel generieke functies als mogelijkheden specifiek voor </w:t>
+      </w:r>
+      <w:proofErr w:type="spellStart"/>
+      <w:r>
+        <w:t>Fortunately</w:t>
+      </w:r>
+      <w:proofErr w:type="spellEnd"/>
+      <w:r>
+        <w:t>-</w:t>
+      </w:r>
+      <w:proofErr w:type="spellStart"/>
+      <w:r>
+        <w:t>Unfortunately</w:t>
+      </w:r>
+      <w:proofErr w:type="spellEnd"/>
+      <w:r>
+        <w:t xml:space="preserve">-treemodellering. Vervolgens wordt een </w:t>
+      </w:r>
+      <w:proofErr w:type="spellStart"/>
+      <w:r>
+        <w:t>webgebaseerd</w:t>
+      </w:r>
+      <w:proofErr w:type="spellEnd"/>
+      <w:r>
+        <w:t xml:space="preserve"> prototype ontwikkeld in </w:t>
+      </w:r>
+      <w:proofErr w:type="spellStart"/>
+      <w:r>
+        <w:t>React</w:t>
+      </w:r>
+      <w:proofErr w:type="spellEnd"/>
+      <w:r>
+        <w:t xml:space="preserve"> en D3, uitgebreid met zoek- en filterfuncties, visuele coderingen en ondersteunende interacties. De tool wordt geëvalueerd via een gebruikersonderzoek met negen deelnemers, die een scenario doorlopen, taken uitvoeren en hun ervaring rapporteren via een open vragenlijst en de User </w:t>
+      </w:r>
+      <w:proofErr w:type="spellStart"/>
+      <w:r>
+        <w:t>Experience</w:t>
+      </w:r>
+      <w:proofErr w:type="spellEnd"/>
+      <w:r>
+        <w:t xml:space="preserve"> Questionnaire (UEQ).</w:t>
+      </w:r>
+    </w:p>
+    <w:p>
+      <w:pPr>
+        <w:spacing w:afterLines="24" w:after="57"/>
+      </w:pPr>
+    </w:p>
+    <w:p>
+      <w:pPr>
+        <w:spacing w:afterLines="24" w:after="57"/>
+        <w:rPr>
+          <w:b/>
+          <w:bCs/>
+          <w:sz w:val="32"/>
+          <w:szCs w:val="32"/>
+        </w:rPr>
+      </w:pPr>
+      <w:r>
+        <w:t xml:space="preserve">De resultaten tonen een duidelijke verbetering in gebruiksvriendelijkheid ten opzichte van generieke </w:t>
+      </w:r>
+      <w:proofErr w:type="spellStart"/>
+      <w:r>
+        <w:t>mindmapsoftware</w:t>
+      </w:r>
+      <w:proofErr w:type="spellEnd"/>
+      <w:r>
+        <w:t>, met positieve UEQ-scores op alle dimensies (aantrekkelijkheid</w:t>
+      </w:r>
+      <w:r>
+        <w:rPr>
+          <w:rFonts w:ascii="Arial" w:hAnsi="Arial" w:cs="Arial"/>
+        </w:rPr>
+        <w:t> </w:t>
+      </w:r>
+      <w:r>
+        <w:t>+1.2, effici</w:t>
+      </w:r>
+      <w:r>
+        <w:rPr>
+          <w:rFonts w:cs="Aptos"/>
+        </w:rPr>
+        <w:t>ë</w:t>
+      </w:r>
+      <w:r>
+        <w:t>ntie</w:t>
+      </w:r>
+      <w:r>
+        <w:rPr>
+          <w:rFonts w:ascii="Arial" w:hAnsi="Arial" w:cs="Arial"/>
+        </w:rPr>
+        <w:t> </w:t>
+      </w:r>
+      <w:r>
+        <w:t>+1.5, stimulatie</w:t>
+      </w:r>
+      <w:r>
+        <w:rPr>
+          <w:rFonts w:ascii="Arial" w:hAnsi="Arial" w:cs="Arial"/>
+        </w:rPr>
+        <w:t> </w:t>
+      </w:r>
+      <w:r>
+        <w:t xml:space="preserve">+2.1) tegenover negatieve scores voor de basisversie. De tool verhoogt zo de toegankelijkheid van </w:t>
+      </w:r>
+      <w:proofErr w:type="spellStart"/>
+      <w:r>
+        <w:t>threat</w:t>
+      </w:r>
+      <w:proofErr w:type="spellEnd"/>
+      <w:r>
+        <w:t xml:space="preserve"> </w:t>
+      </w:r>
+      <w:proofErr w:type="spellStart"/>
+      <w:r>
+        <w:t>modeling</w:t>
+      </w:r>
+      <w:proofErr w:type="spellEnd"/>
+      <w:r>
+        <w:t xml:space="preserve"> voor niet-experts en biedt intu</w:t>
+      </w:r>
+      <w:r>
+        <w:rPr>
+          <w:rFonts w:cs="Aptos"/>
+        </w:rPr>
+        <w:t>ï</w:t>
+      </w:r>
+      <w:r>
+        <w:t>tieve ondersteuning binnen het beveiligingsproces.</w:t>
+      </w:r>
+      <w:r>
+        <w:rPr>
+          <w:b/>
+          <w:bCs/>
+          <w:sz w:val="32"/>
+          <w:szCs w:val="32"/>
+        </w:rPr>
+        <w:br w:type="page"/>
+      </w:r>
+    </w:p>
+    <w:p>
+      <w:pPr>
+        <w:spacing w:afterLines="24" w:after="57"/>
+        <w:rPr>
+          <w:b/>
+          <w:bCs/>
+          <w:sz w:val="32"/>
+          <w:szCs w:val="32"/>
+        </w:rPr>
+      </w:pPr>
+      <w:r>
+        <w:rPr>
+          <w:b/>
+          <w:bCs/>
+          <w:sz w:val="32"/>
+          <w:szCs w:val="32"/>
+        </w:rPr>
+        <w:lastRenderedPageBreak/>
+        <w:br w:type="page"/>
+      </w:r>
+    </w:p>
+    <w:p>
+      <w:pPr>
+        <w:spacing w:afterLines="24" w:after="57"/>
         <w:rPr>
           <w:b/>
           <w:bCs/>
@@ -206,13 +477,8 @@
           <w:szCs w:val="36"/>
           <w:lang w:val="en-GB"/>
         </w:rPr>
-        <w:lastRenderedPageBreak/>
-        <w:t>Abstract</w:t>
-      </w:r>
-    </w:p>
-    <w:p>
-      <w:pPr>
-        <w:spacing w:afterLines="24" w:after="57"/>
+      </w:pPr>
+      <w:r>
         <w:rPr>
           <w:b/>
           <w:bCs/>
@@ -220,254 +486,8 @@
           <w:szCs w:val="36"/>
           <w:lang w:val="en-GB"/>
         </w:rPr>
-      </w:pPr>
-    </w:p>
-    <w:p>
-      <w:pPr>
-        <w:spacing w:afterLines="24" w:after="57"/>
-      </w:pPr>
-      <w:proofErr w:type="spellStart"/>
-      <w:r>
-        <w:t>Threat</w:t>
-      </w:r>
-      <w:proofErr w:type="spellEnd"/>
-      <w:r>
-        <w:t xml:space="preserve"> </w:t>
-      </w:r>
-      <w:proofErr w:type="spellStart"/>
-      <w:r>
-        <w:t>modeling</w:t>
-      </w:r>
-      <w:proofErr w:type="spellEnd"/>
-      <w:r>
-        <w:t xml:space="preserve"> is een systematische methode binnen softwareontwikkeling om potentiële beveiligingsrisico’s vroegtijdig te identificeren en te mitigeren. Ondanks het belang ervan ervaren veel ontwikkelaars het proces als complex en tijdsintensief, wat vaak leidt tot onvolledige risicoanalyses. Dit onderzoek ontwikkelt en evalueert een gebruiksvriendelijke tool, gebaseerd op de </w:t>
-      </w:r>
-      <w:proofErr w:type="spellStart"/>
-      <w:r>
-        <w:t>Fortunately</w:t>
-      </w:r>
-      <w:proofErr w:type="spellEnd"/>
-      <w:r>
-        <w:t>-</w:t>
-      </w:r>
-      <w:proofErr w:type="spellStart"/>
-      <w:r>
-        <w:t>Unfortunately</w:t>
-      </w:r>
-      <w:proofErr w:type="spellEnd"/>
-      <w:r>
-        <w:t xml:space="preserve">-methode, om het </w:t>
-      </w:r>
-      <w:proofErr w:type="spellStart"/>
-      <w:r>
-        <w:t>threat</w:t>
-      </w:r>
-      <w:proofErr w:type="spellEnd"/>
-      <w:r>
-        <w:t xml:space="preserve"> </w:t>
-      </w:r>
-      <w:proofErr w:type="spellStart"/>
-      <w:r>
-        <w:t>modeling</w:t>
-      </w:r>
-      <w:proofErr w:type="spellEnd"/>
-      <w:r>
-        <w:t>-proces toegankelijker en effectiever te maken.</w:t>
-      </w:r>
-    </w:p>
-    <w:p>
-      <w:pPr>
-        <w:spacing w:afterLines="24" w:after="57"/>
-      </w:pPr>
-    </w:p>
-    <w:p>
-      <w:pPr>
-        <w:spacing w:afterLines="24" w:after="57"/>
-      </w:pPr>
-      <w:r>
-        <w:t xml:space="preserve">Een literatuurstudie brengt bestaande </w:t>
-      </w:r>
-      <w:proofErr w:type="spellStart"/>
-      <w:r>
-        <w:t>threat</w:t>
-      </w:r>
-      <w:proofErr w:type="spellEnd"/>
-      <w:r>
-        <w:t xml:space="preserve"> </w:t>
-      </w:r>
-      <w:proofErr w:type="spellStart"/>
-      <w:r>
-        <w:t>modeling</w:t>
-      </w:r>
-      <w:proofErr w:type="spellEnd"/>
-      <w:r>
-        <w:t xml:space="preserve">-raamwerken, </w:t>
-      </w:r>
-      <w:proofErr w:type="spellStart"/>
-      <w:r>
-        <w:t>mindmaptools</w:t>
-      </w:r>
-      <w:proofErr w:type="spellEnd"/>
-      <w:r>
-        <w:t xml:space="preserve"> en visualisatietechnieken in kaart. Op basis daarvan wordt een eisenlijst opgesteld met zowel generieke functies als mogelijkheden specifiek voor </w:t>
-      </w:r>
-      <w:proofErr w:type="spellStart"/>
-      <w:r>
-        <w:t>Fortunately</w:t>
-      </w:r>
-      <w:proofErr w:type="spellEnd"/>
-      <w:r>
-        <w:t>-</w:t>
-      </w:r>
-      <w:proofErr w:type="spellStart"/>
-      <w:r>
-        <w:t>Unfortunately</w:t>
-      </w:r>
-      <w:proofErr w:type="spellEnd"/>
-      <w:r>
-        <w:t xml:space="preserve">-treemodellering. Vervolgens wordt een </w:t>
-      </w:r>
-      <w:proofErr w:type="spellStart"/>
-      <w:r>
-        <w:t>webgebaseerd</w:t>
-      </w:r>
-      <w:proofErr w:type="spellEnd"/>
-      <w:r>
-        <w:t xml:space="preserve"> prototype ontwikkeld in </w:t>
-      </w:r>
-      <w:proofErr w:type="spellStart"/>
-      <w:r>
-        <w:t>React</w:t>
-      </w:r>
-      <w:proofErr w:type="spellEnd"/>
-      <w:r>
-        <w:t xml:space="preserve"> en D3, uitgebreid met zoek- en filterfuncties, visuele coderingen en ondersteunende interacties. De tool wordt geëvalueerd via een gebruikersonderzoek met negen deelnemers, die een scenario doorlopen, taken uitvoeren en hun ervaring rapporteren via een open vragenlijst en de User </w:t>
-      </w:r>
-      <w:proofErr w:type="spellStart"/>
-      <w:r>
-        <w:t>Experience</w:t>
-      </w:r>
-      <w:proofErr w:type="spellEnd"/>
-      <w:r>
-        <w:t xml:space="preserve"> Questionnaire (UEQ).</w:t>
-      </w:r>
-    </w:p>
-    <w:p>
-      <w:pPr>
-        <w:spacing w:afterLines="24" w:after="57"/>
-      </w:pPr>
-    </w:p>
-    <w:p>
-      <w:pPr>
-        <w:spacing w:afterLines="24" w:after="57"/>
-        <w:rPr>
-          <w:b/>
-          <w:bCs/>
-          <w:sz w:val="32"/>
-          <w:szCs w:val="32"/>
-        </w:rPr>
-      </w:pPr>
-      <w:r>
-        <w:t xml:space="preserve">De resultaten tonen een duidelijke verbetering in gebruiksvriendelijkheid ten opzichte van generieke </w:t>
-      </w:r>
-      <w:proofErr w:type="spellStart"/>
-      <w:r>
-        <w:t>mindmapsoftware</w:t>
-      </w:r>
-      <w:proofErr w:type="spellEnd"/>
-      <w:r>
-        <w:t>, met positieve UEQ-scores op alle dimensies (aantrekkelijkheid</w:t>
-      </w:r>
-      <w:r>
-        <w:rPr>
-          <w:rFonts w:ascii="Arial" w:hAnsi="Arial" w:cs="Arial"/>
-        </w:rPr>
-        <w:t> </w:t>
-      </w:r>
-      <w:r>
-        <w:t>+1.2, effici</w:t>
-      </w:r>
-      <w:r>
-        <w:rPr>
-          <w:rFonts w:cs="Aptos"/>
-        </w:rPr>
-        <w:t>ë</w:t>
-      </w:r>
-      <w:r>
-        <w:t>ntie</w:t>
-      </w:r>
-      <w:r>
-        <w:rPr>
-          <w:rFonts w:ascii="Arial" w:hAnsi="Arial" w:cs="Arial"/>
-        </w:rPr>
-        <w:t> </w:t>
-      </w:r>
-      <w:r>
-        <w:t>+1.5, stimulatie</w:t>
-      </w:r>
-      <w:r>
-        <w:rPr>
-          <w:rFonts w:ascii="Arial" w:hAnsi="Arial" w:cs="Arial"/>
-        </w:rPr>
-        <w:t> </w:t>
-      </w:r>
-      <w:r>
-        <w:t xml:space="preserve">+2.1) tegenover negatieve scores voor de basisversie. De tool verhoogt zo de toegankelijkheid van </w:t>
-      </w:r>
-      <w:proofErr w:type="spellStart"/>
-      <w:r>
-        <w:t>threat</w:t>
-      </w:r>
-      <w:proofErr w:type="spellEnd"/>
-      <w:r>
-        <w:t xml:space="preserve"> </w:t>
-      </w:r>
-      <w:proofErr w:type="spellStart"/>
-      <w:r>
-        <w:t>modeling</w:t>
-      </w:r>
-      <w:proofErr w:type="spellEnd"/>
-      <w:r>
-        <w:t xml:space="preserve"> voor niet-experts en biedt intu</w:t>
-      </w:r>
-      <w:r>
-        <w:rPr>
-          <w:rFonts w:cs="Aptos"/>
-        </w:rPr>
-        <w:t>ï</w:t>
-      </w:r>
-      <w:r>
-        <w:t>tieve ondersteuning binnen het beveiligingsproces.</w:t>
-      </w:r>
-      <w:r>
-        <w:rPr>
-          <w:b/>
-          <w:bCs/>
-          <w:sz w:val="32"/>
-          <w:szCs w:val="32"/>
-        </w:rPr>
-        <w:br w:type="page"/>
-      </w:r>
-    </w:p>
-    <w:p>
-      <w:pPr>
-        <w:spacing w:afterLines="24" w:after="57"/>
-        <w:rPr>
-          <w:b/>
-          <w:bCs/>
-          <w:sz w:val="32"/>
-          <w:szCs w:val="32"/>
-        </w:rPr>
-      </w:pPr>
-      <w:r>
-        <w:rPr>
-          <w:b/>
-          <w:bCs/>
-          <w:sz w:val="32"/>
-          <w:szCs w:val="32"/>
-        </w:rPr>
         <w:lastRenderedPageBreak/>
-        <w:br w:type="page"/>
+        <w:t>Abstract in English</w:t>
       </w:r>
     </w:p>
     <w:p>
@@ -481,29 +501,6 @@
           <w:lang w:val="en-GB"/>
         </w:rPr>
       </w:pPr>
-      <w:r>
-        <w:rPr>
-          <w:b/>
-          <w:bCs/>
-          <w:sz w:val="36"/>
-          <w:szCs w:val="36"/>
-          <w:lang w:val="en-GB"/>
-        </w:rPr>
-        <w:lastRenderedPageBreak/>
-        <w:t>Abstract in English</w:t>
-      </w:r>
-    </w:p>
-    <w:p>
-      <w:pPr>
-        <w:spacing w:afterLines="24" w:after="57"/>
-        <w:rPr>
-          <w:b/>
-          <w:bCs/>
-          <w:sz w:val="36"/>
-          <w:szCs w:val="36"/>
-          <w:lang w:val="en-GB"/>
-        </w:rPr>
-      </w:pPr>
     </w:p>
     <w:p>
       <w:pPr>
@@ -730,31 +727,17 @@
           <w:bCs/>
           <w:sz w:val="36"/>
           <w:szCs w:val="36"/>
-          <w:lang w:val="en-GB"/>
-        </w:rPr>
-      </w:pPr>
-      <w:proofErr w:type="spellStart"/>
+        </w:rPr>
+      </w:pPr>
       <w:r>
         <w:rPr>
           <w:b/>
           <w:bCs/>
           <w:sz w:val="36"/>
           <w:szCs w:val="36"/>
-          <w:lang w:val="en-GB"/>
         </w:rPr>
         <w:lastRenderedPageBreak/>
-        <w:t>Hoofdstuk</w:t>
-      </w:r>
-      <w:proofErr w:type="spellEnd"/>
-      <w:r>
-        <w:rPr>
-          <w:b/>
-          <w:bCs/>
-          <w:sz w:val="36"/>
-          <w:szCs w:val="36"/>
-          <w:lang w:val="en-GB"/>
-        </w:rPr>
-        <w:t xml:space="preserve"> 1</w:t>
+        <w:t>Hoofdstuk 1</w:t>
       </w:r>
     </w:p>
     <w:p>
@@ -1460,58 +1443,100 @@
           <w:bCs/>
           <w:sz w:val="36"/>
           <w:szCs w:val="36"/>
-        </w:rPr>
-      </w:pPr>
+          <w:lang w:val="en-GB"/>
+        </w:rPr>
+      </w:pPr>
+      <w:proofErr w:type="spellStart"/>
       <w:r>
         <w:rPr>
           <w:b/>
           <w:bCs/>
           <w:sz w:val="36"/>
           <w:szCs w:val="36"/>
+          <w:lang w:val="en-GB"/>
         </w:rPr>
         <w:lastRenderedPageBreak/>
-        <w:t>Hoofdstuk 2</w:t>
-      </w:r>
-    </w:p>
-    <w:p>
-      <w:pPr>
-        <w:spacing w:afterLines="24" w:after="57" w:line="288" w:lineRule="auto"/>
+        <w:t>Hoofdstuk</w:t>
+      </w:r>
+      <w:proofErr w:type="spellEnd"/>
+      <w:r>
         <w:rPr>
           <w:b/>
           <w:bCs/>
           <w:sz w:val="36"/>
           <w:szCs w:val="36"/>
-        </w:rPr>
-      </w:pPr>
-      <w:r>
+          <w:lang w:val="en-GB"/>
+        </w:rPr>
+        <w:t xml:space="preserve"> 2</w:t>
+      </w:r>
+    </w:p>
+    <w:p>
+      <w:pPr>
+        <w:spacing w:afterLines="24" w:after="57" w:line="288" w:lineRule="auto"/>
         <w:rPr>
           <w:b/>
           <w:bCs/>
           <w:sz w:val="36"/>
           <w:szCs w:val="36"/>
-        </w:rPr>
-        <w:t>Gerelateerd werk</w:t>
-      </w:r>
-    </w:p>
-    <w:p>
-      <w:pPr>
-        <w:spacing w:afterLines="24" w:after="57" w:line="288" w:lineRule="auto"/>
+          <w:lang w:val="en-GB"/>
+        </w:rPr>
+      </w:pPr>
+      <w:proofErr w:type="spellStart"/>
+      <w:r>
         <w:rPr>
           <w:b/>
           <w:bCs/>
           <w:sz w:val="36"/>
           <w:szCs w:val="36"/>
-        </w:rPr>
-      </w:pPr>
-    </w:p>
-    <w:p>
-      <w:pPr>
-        <w:spacing w:afterLines="24" w:after="57" w:line="288" w:lineRule="auto"/>
+          <w:lang w:val="en-GB"/>
+        </w:rPr>
+        <w:t>Gerelateerd</w:t>
+      </w:r>
+      <w:proofErr w:type="spellEnd"/>
+      <w:r>
         <w:rPr>
           <w:b/>
           <w:bCs/>
           <w:sz w:val="36"/>
           <w:szCs w:val="36"/>
+          <w:lang w:val="en-GB"/>
+        </w:rPr>
+        <w:t xml:space="preserve"> </w:t>
+      </w:r>
+      <w:proofErr w:type="spellStart"/>
+      <w:r>
+        <w:rPr>
+          <w:b/>
+          <w:bCs/>
+          <w:sz w:val="36"/>
+          <w:szCs w:val="36"/>
+          <w:lang w:val="en-GB"/>
+        </w:rPr>
+        <w:t>werk</w:t>
+      </w:r>
+      <w:proofErr w:type="spellEnd"/>
+    </w:p>
+    <w:p>
+      <w:pPr>
+        <w:spacing w:afterLines="24" w:after="57" w:line="288" w:lineRule="auto"/>
+        <w:rPr>
+          <w:b/>
+          <w:bCs/>
+          <w:sz w:val="36"/>
+          <w:szCs w:val="36"/>
+          <w:lang w:val="en-GB"/>
+        </w:rPr>
+      </w:pPr>
+    </w:p>
+    <w:p>
+      <w:pPr>
+        <w:spacing w:afterLines="24" w:after="57" w:line="288" w:lineRule="auto"/>
+        <w:rPr>
+          <w:b/>
+          <w:bCs/>
+          <w:sz w:val="36"/>
+          <w:szCs w:val="36"/>
+          <w:lang w:val="en-GB"/>
         </w:rPr>
       </w:pPr>
     </w:p>
@@ -1544,17 +1569,7 @@
           <w:szCs w:val="28"/>
           <w:lang w:val="en-GB"/>
         </w:rPr>
-        <w:t xml:space="preserve"> </w:t>
-      </w:r>
-      <w:r>
-        <w:rPr>
-          <w:b/>
-          <w:bCs/>
-          <w:sz w:val="28"/>
-          <w:szCs w:val="28"/>
-          <w:lang w:val="en-GB"/>
-        </w:rPr>
-        <w:t>State-of-the-Art in Software Security Visualization: A Systematic Review</w:t>
+        <w:t xml:space="preserve"> State-of-the-Art in Software Security Visualization: A Systematic Review</w:t>
       </w:r>
     </w:p>
     <w:p>
@@ -2039,13 +2054,14 @@
       <w:pPr>
         <w:spacing w:afterLines="24" w:after="57" w:line="288" w:lineRule="auto"/>
       </w:pPr>
-      <w:proofErr w:type="spellStart"/>
-      <w:r>
-        <w:t>Shi</w:t>
-      </w:r>
-      <w:proofErr w:type="spellEnd"/>
-      <w:r>
-        <w:t xml:space="preserve"> et al. (2022) bieden een taxonomie en kwalitatieve vergelijking van </w:t>
+      <w:r>
+        <w:rPr>
+          <w:lang w:val="en-GB"/>
+        </w:rPr>
+        <w:t xml:space="preserve">Shi et al. </w:t>
+      </w:r>
+      <w:r>
+        <w:t xml:space="preserve">(2022) bieden een taxonomie en kwalitatieve vergelijking van </w:t>
       </w:r>
       <w:proofErr w:type="spellStart"/>
       <w:r>
@@ -3019,7 +3035,7 @@
           <w:noProof/>
         </w:rPr>
         <w:drawing>
-          <wp:inline distT="0" distB="0" distL="0" distR="0" wp14:anchorId="128D5ED9" wp14:editId="5A846830">
+          <wp:inline distT="0" distB="0" distL="0" distR="0" wp14:anchorId="128D5ED9" wp14:editId="51C07A6A">
             <wp:extent cx="5759450" cy="2856865"/>
             <wp:effectExtent l="0" t="0" r="0" b="635"/>
             <wp:docPr id="234035025" name="Afbeelding 1" descr="Afbeelding met diagram, schermopname, lijn, ontwerp&#10;&#10;Door AI gegenereerde inhoud is mogelijk onjuist."/>
@@ -3077,7 +3093,7 @@
         </w:rPr>
         <w:lastRenderedPageBreak/>
         <w:drawing>
-          <wp:inline distT="0" distB="0" distL="0" distR="0" wp14:anchorId="7D672503" wp14:editId="2AB41B34">
+          <wp:inline distT="0" distB="0" distL="0" distR="0" wp14:anchorId="7D672503" wp14:editId="7BDFBF72">
             <wp:extent cx="5759450" cy="1689735"/>
             <wp:effectExtent l="0" t="0" r="0" b="5715"/>
             <wp:docPr id="373297823" name="Afbeelding 2" descr="Afbeelding met diagram, lijn, origami, ontwerp&#10;&#10;Door AI gegenereerde inhoud is mogelijk onjuist."/>
@@ -6016,7 +6032,7 @@
         <w:t>Nodes</w:t>
       </w:r>
       <w:r>
-        <w:t xml:space="preserve"> zijn expliciet getypeerd als level = "</w:t>
+        <w:t xml:space="preserve"> zijn expliciet getypeerd als level "</w:t>
       </w:r>
       <w:proofErr w:type="spellStart"/>
       <w:r>
@@ -6211,7 +6227,15 @@
       </w:r>
       <w:proofErr w:type="spellEnd"/>
       <w:r>
-        <w:t>) of nieuwe kinderen toevoegen (</w:t>
+        <w:t xml:space="preserve">) of nieuwe </w:t>
+      </w:r>
+      <w:proofErr w:type="spellStart"/>
+      <w:r>
+        <w:t>children</w:t>
+      </w:r>
+      <w:proofErr w:type="spellEnd"/>
+      <w:r>
+        <w:t xml:space="preserve"> toevoegen (</w:t>
       </w:r>
       <w:proofErr w:type="spellStart"/>
       <w:r>
@@ -6267,7 +6291,13 @@
       </w:r>
       <w:proofErr w:type="spellEnd"/>
       <w:r>
-        <w:t>) kunnen naar believen worden geopend en gesloten, zodat gebruikers vrij kunnen schakelen tussen een compacte en een meer gedetailleerde weergave.</w:t>
+        <w:t xml:space="preserve">) kunnen naar </w:t>
+      </w:r>
+      <w:r>
+        <w:t>wens</w:t>
+      </w:r>
+      <w:r>
+        <w:t xml:space="preserve"> worden geopend en gesloten, zodat gebruikers vrij kunnen schakelen tussen een compacte en een meer gedetailleerde weergave.</w:t>
       </w:r>
     </w:p>
     <w:p>
@@ -6490,9 +6520,12 @@
       </w:r>
       <w:proofErr w:type="spellStart"/>
       <w:r>
-        <w:t>kindknoop</w:t>
-      </w:r>
-      <w:proofErr w:type="spellEnd"/>
+        <w:t>childe</w:t>
+      </w:r>
+      <w:proofErr w:type="spellEnd"/>
+      <w:r>
+        <w:t xml:space="preserve"> node</w:t>
+      </w:r>
       <w:r>
         <w:t xml:space="preserve"> bepaalt de applicatie automatisch het type (</w:t>
       </w:r>
@@ -6510,7 +6543,15 @@
       </w:r>
       <w:proofErr w:type="spellEnd"/>
       <w:r>
-        <w:t>) op basis van het level van de ouder, waardoor semantisch inconsistente ketens vermeden worden. Destructieve acties zoals het verwijderen van een knoop of het resetten van de volledige boom vereisen expliciete bevestiging via </w:t>
+        <w:t xml:space="preserve">) op basis van het level van de </w:t>
+      </w:r>
+      <w:proofErr w:type="spellStart"/>
+      <w:r>
+        <w:t>parent</w:t>
+      </w:r>
+      <w:proofErr w:type="spellEnd"/>
+      <w:r>
+        <w:t>, waardoor semantisch inconsistente ketens vermeden worden. Destructieve acties zoals het verwijderen van een knoop of het resetten van de volledige boom vereisen expliciete bevestiging via </w:t>
       </w:r>
       <w:proofErr w:type="spellStart"/>
       <w:r>
@@ -6682,7 +6723,19 @@
       </w:r>
       <w:proofErr w:type="spellEnd"/>
       <w:r>
-        <w:t xml:space="preserve"> laat gebruikers zoeken op knoopnaam; gevonden </w:t>
+        <w:t> laat gebruikers zoeken op knoopnaam</w:t>
+      </w:r>
+      <w:r>
+        <w:t>.</w:t>
+      </w:r>
+      <w:r>
+        <w:t xml:space="preserve"> </w:t>
+      </w:r>
+      <w:r>
+        <w:t xml:space="preserve">De </w:t>
+      </w:r>
+      <w:r>
+        <w:t xml:space="preserve">gevonden </w:t>
       </w:r>
       <w:proofErr w:type="spellStart"/>
       <w:r>
@@ -6863,7 +6916,7 @@
       </w:r>
       <w:r>
         <w:noBreakHyphen/>
-        <w:t xml:space="preserve">out met terughoudende visuele elementen. De centrale boomweergave is dominant en gebruikt een beperkt kleurenpalet (groen/rood/grijs) om de belangrijkste semantische verschillen te markeren. Secundaire acties verschijnen pas bij </w:t>
+        <w:t xml:space="preserve">out met terughoudende visuele elementen. De centrale boomweergave is dominant en gebruikt een beperkt kleurenpalet (groen/rood) om de belangrijkste semantische verschillen te markeren. Secundaire acties verschijnen pas bij </w:t>
       </w:r>
       <w:proofErr w:type="spellStart"/>
       <w:r>
@@ -6871,7 +6924,7 @@
       </w:r>
       <w:proofErr w:type="spellEnd"/>
       <w:r>
-        <w:t xml:space="preserve"> (group-hover:opacity-100), waardoor de standaardweergave relatief schoon blijft. De rechterzijbalk is standaard samengevouwen tot compacte “</w:t>
+        <w:t>, waardoor de standaardweergave relatief schoon blijft. De rechterzijbalk is standaard samengevouwen tot compacte “</w:t>
       </w:r>
       <w:proofErr w:type="spellStart"/>
       <w:r>
@@ -6879,8 +6932,29 @@
       </w:r>
       <w:proofErr w:type="spellEnd"/>
       <w:r>
-        <w:t>”-knoppen; het volledige overzichtspaneel wordt alleen getoond wanneer de gebruiker hier expliciet voor kiest. Tooltips zijn kort en beperkt tot contextuele uitleg, zodat er geen overdadige tekst of iconografie ontstaat die de cognitieve belasting zou verhogen.</w:t>
-      </w:r>
+        <w:t>”-knoppen</w:t>
+      </w:r>
+      <w:r>
+        <w:t>.</w:t>
+      </w:r>
+      <w:r>
+        <w:t xml:space="preserve"> </w:t>
+      </w:r>
+      <w:r>
+        <w:t>H</w:t>
+      </w:r>
+      <w:r>
+        <w:t>et volledige overzichtspaneel wordt alleen getoond wanneer de gebruiker hier expliciet voor kiest. Tooltips zijn kort en beperkt tot contextuele uitleg, zodat er geen overdadige tekst of iconografie ontstaat die de cognitieve belasting zou verhogen.</w:t>
+      </w:r>
+    </w:p>
+    <w:p>
+      <w:pPr>
+        <w:spacing w:afterLines="24" w:after="57" w:line="288" w:lineRule="auto"/>
+        <w:rPr>
+          <w:b/>
+          <w:bCs/>
+        </w:rPr>
+      </w:pPr>
     </w:p>
     <w:p>
       <w:pPr>
@@ -6948,9 +7022,6 @@
       </w:r>
       <w:proofErr w:type="spellEnd"/>
       <w:r>
-        <w:t xml:space="preserve"> </w:t>
-      </w:r>
-      <w:r>
         <w:t xml:space="preserve"> rating, impact en </w:t>
       </w:r>
       <w:proofErr w:type="spellStart"/>
@@ -7016,6 +7087,13 @@
           <w:bCs/>
         </w:rPr>
         <w:t>3.11.11</w:t>
+      </w:r>
+      <w:r>
+        <w:rPr>
+          <w:b/>
+          <w:bCs/>
+        </w:rPr>
+        <w:t xml:space="preserve"> </w:t>
       </w:r>
       <w:r>
         <w:rPr>
@@ -7323,15 +7401,13 @@
       </w:r>
       <w:r>
         <w:noBreakHyphen/>
-        <w:t xml:space="preserve">beslissingen in de </w:t>
-      </w:r>
-      <w:proofErr w:type="spellStart"/>
-      <w:r>
-        <w:t>gebruikerstudie</w:t>
-      </w:r>
-      <w:proofErr w:type="spellEnd"/>
-      <w:r>
-        <w:t xml:space="preserve"> te evalueren, zonder afgeleid te worden door infrastructuur of integraties.</w:t>
+        <w:t>beslissingen in de gebruiker</w:t>
+      </w:r>
+      <w:r>
+        <w:t>s</w:t>
+      </w:r>
+      <w:r>
+        <w:t>studie te evalueren, zonder afgeleid te worden door infrastructuur of integraties.</w:t>
       </w:r>
     </w:p>
     <w:p>
@@ -7427,7 +7503,13 @@
         <w:t>De studie had als doel de bruikbaarheid, duidelijkheid en efficiëntie van de dreigingsmodelleringstool te evalueren bij het analyseren</w:t>
       </w:r>
       <w:r>
-        <w:t xml:space="preserve"> aan de hand van 2 scenario’s, namelijk</w:t>
+        <w:t xml:space="preserve"> aan de hand van </w:t>
+      </w:r>
+      <w:r>
+        <w:t>twee</w:t>
+      </w:r>
+      <w:r>
+        <w:t xml:space="preserve"> scenario’s, namelijk</w:t>
       </w:r>
       <w:r>
         <w:t xml:space="preserve"> </w:t>
@@ -7543,11 +7625,9 @@
       <w:r>
         <w:t xml:space="preserve"> twee </w:t>
       </w:r>
-      <w:proofErr w:type="spellStart"/>
-      <w:r>
-        <w:t>scenaruisn</w:t>
-      </w:r>
-      <w:proofErr w:type="spellEnd"/>
+      <w:r>
+        <w:t>scenario’s</w:t>
+      </w:r>
       <w:r>
         <w:t xml:space="preserve">, </w:t>
       </w:r>
@@ -7939,7 +8019,7 @@
           <w:noProof/>
         </w:rPr>
         <w:drawing>
-          <wp:inline distT="0" distB="0" distL="0" distR="0" wp14:anchorId="385A938B" wp14:editId="49DC7CFF">
+          <wp:inline distT="0" distB="0" distL="0" distR="0" wp14:anchorId="385A938B" wp14:editId="60F39674">
             <wp:extent cx="5759450" cy="2903855"/>
             <wp:effectExtent l="0" t="0" r="0" b="0"/>
             <wp:docPr id="254494346" name="Afbeelding 25" descr="Afbeelding met tekst, schermopname, Lettertype, nummer&#10;&#10;Door AI gegenereerde inhoud is mogelijk onjuist."/>
@@ -8293,27 +8373,7 @@
       </w:r>
       <w:proofErr w:type="spellEnd"/>
       <w:r>
-        <w:t xml:space="preserve"> als kwalitatieve feedback over de toegevoegde visualisatiefeatures ten opzichte van de basisfunctionaliteit. Alle gegevens werden </w:t>
-      </w:r>
-      <w:proofErr w:type="spellStart"/>
-      <w:r>
-        <w:t>gepseudonimiseerd</w:t>
-      </w:r>
-      <w:proofErr w:type="spellEnd"/>
-      <w:r>
-        <w:t xml:space="preserve"> en enkel gebruikt voor onderzoeksdoeleinden, conform de </w:t>
-      </w:r>
-      <w:proofErr w:type="spellStart"/>
-      <w:r>
-        <w:t>informed</w:t>
-      </w:r>
-      <w:proofErr w:type="spellEnd"/>
-      <w:r>
-        <w:noBreakHyphen/>
-        <w:t>consentprocedure</w:t>
-      </w:r>
-      <w:r>
-        <w:t>.</w:t>
+        <w:t xml:space="preserve"> als kwalitatieve feedback over de toegevoegde visualisatiefeatures ten opzichte van de basisfunctionaliteit.</w:t>
       </w:r>
     </w:p>
     <w:p>
@@ -8425,13 +8485,11 @@
         </w:rPr>
       </w:pPr>
       <w:r>
-        <w:t xml:space="preserve">Deze schalen omvatten zowel pragmatische bruikbaarheidsaspecten als hedonistische </w:t>
-      </w:r>
-      <w:proofErr w:type="spellStart"/>
-      <w:r>
-        <w:t>gebruikerservaringselementen</w:t>
-      </w:r>
-      <w:proofErr w:type="spellEnd"/>
+        <w:t>Deze schalen omvatten zowel pragmatische bruikbaarheidsaspecten als</w:t>
+      </w:r>
+      <w:r>
+        <w:t xml:space="preserve"> elementen van de gebruikerservaring</w:t>
+      </w:r>
       <w:r>
         <w:t>, en de vragenlijst is beschikbaar in meer dan 30 talen, vergezeld van gratis hulpmiddelen zoals PDF-versies, Excel-analysebladen en een verkorte UEQ-S-versie met acht items voor specifieke scenario's.</w:t>
       </w:r>
@@ -8741,7 +8799,13 @@
       </w:r>
       <w:proofErr w:type="spellEnd"/>
       <w:r>
-        <w:t>-tools, door pragmatische schalen (duidelijkheid, efficiëntie, betrouwbaarheid) te combineren met hedonistische aspecten (stimulatie, nieuwheid), wat directe vergelijkingen tussen prototypes, softwareversies of benchmarks mogelijk maakt.</w:t>
+        <w:t xml:space="preserve">-tools, door pragmatische schalen (duidelijkheid, efficiëntie, betrouwbaarheid) te combineren met </w:t>
+      </w:r>
+      <w:r>
+        <w:t>belevingsgerichte</w:t>
+      </w:r>
+      <w:r>
+        <w:t xml:space="preserve"> aspecten (stimulatie, nieuwheid), wat directe vergelijkingen tussen prototypes, softwareversies of benchmarks mogelijk maakt.</w:t>
       </w:r>
       <w:r>
         <w:rPr>
@@ -11128,25 +11192,7 @@
           <w:lang w:eastAsia="nl-BE"/>
           <w14:ligatures w14:val="none"/>
         </w:rPr>
-        <w:t>De sprong in ervaring-gerelateerde</w:t>
-      </w:r>
-      <w:r>
-        <w:rPr>
-          <w:rFonts w:eastAsia="Times New Roman" w:cs="Times New Roman"/>
-          <w:kern w:val="0"/>
-          <w:lang w:eastAsia="nl-BE"/>
-          <w14:ligatures w14:val="none"/>
-        </w:rPr>
-        <w:t xml:space="preserve"> </w:t>
-      </w:r>
-      <w:r>
-        <w:rPr>
-          <w:rFonts w:eastAsia="Times New Roman" w:cs="Times New Roman"/>
-          <w:kern w:val="0"/>
-          <w:lang w:eastAsia="nl-BE"/>
-          <w14:ligatures w14:val="none"/>
-        </w:rPr>
-        <w:t xml:space="preserve">UEQ-scores (stimulatie, originaliteit) onderstreept </w:t>
+        <w:t xml:space="preserve">De sprong in ervaring-gerelateerde UEQ-scores (stimulatie, originaliteit) onderstreept </w:t>
       </w:r>
       <w:proofErr w:type="spellStart"/>
       <w:r>

</xml_diff>

<commit_message>
added intro to hsft 3 and a chapter about the basic and extra features
</commit_message>
<xml_diff>
--- a/Master_scriptie_tekst.docx
+++ b/Master_scriptie_tekst.docx
@@ -3071,7 +3071,13 @@
         <w:t>‑</w:t>
       </w:r>
       <w:r>
-        <w:t xml:space="preserve">verband te tonen.  Dit onderstreept een leemte in de literatuur: er is veel kennis over ruimtelijke verdeling van boomknooppunten, maar weinig over </w:t>
+        <w:t xml:space="preserve">verband te tonen.  Dit onderstreept een </w:t>
+      </w:r>
+      <w:r>
+        <w:t>weinig onderzocht gebied</w:t>
+      </w:r>
+      <w:r>
+        <w:t xml:space="preserve"> in de literatuur: er is veel kennis over ruimtelijke verdeling van boomknooppunten, maar weinig over </w:t>
       </w:r>
       <w:proofErr w:type="spellStart"/>
       <w:r>
@@ -3196,7 +3202,11 @@
       </w:r>
       <w:proofErr w:type="spellEnd"/>
       <w:r>
-        <w:t xml:space="preserve"> redeneringen ondersteunen.  In de visualisatie worden </w:t>
+        <w:t xml:space="preserve"> </w:t>
+      </w:r>
+      <w:r>
+        <w:lastRenderedPageBreak/>
+        <w:t xml:space="preserve">redeneringen ondersteunen.  In de visualisatie worden </w:t>
       </w:r>
       <w:proofErr w:type="spellStart"/>
       <w:r>
@@ -3213,11 +3223,7 @@
       </w:r>
       <w:proofErr w:type="spellEnd"/>
       <w:r>
-        <w:t xml:space="preserve"> relaties aangeduid </w:t>
-      </w:r>
-      <w:r>
-        <w:lastRenderedPageBreak/>
-        <w:t>met zowel tekst (</w:t>
+        <w:t xml:space="preserve"> relaties aangeduid met zowel tekst (</w:t>
       </w:r>
       <w:r>
         <w:rPr>
@@ -3812,6 +3818,128 @@
     <w:p>
       <w:pPr>
         <w:spacing w:afterLines="24" w:after="57" w:line="288" w:lineRule="auto"/>
+      </w:pPr>
+      <w:r>
+        <w:t xml:space="preserve">In dit hoofdstuk wordt het ontwerp en de implementatie van de </w:t>
+      </w:r>
+      <w:proofErr w:type="spellStart"/>
+      <w:r>
+        <w:t>threat</w:t>
+      </w:r>
+      <w:r>
+        <w:rPr>
+          <w:rFonts w:ascii="Cambria Math" w:hAnsi="Cambria Math" w:cs="Cambria Math"/>
+        </w:rPr>
+        <w:t>‑</w:t>
+      </w:r>
+      <w:r>
+        <w:t>modelingtool</w:t>
+      </w:r>
+      <w:proofErr w:type="spellEnd"/>
+      <w:r>
+        <w:t xml:space="preserve"> beschreven. Eerst wordt de gekozen architectuur en gebruikte technologie</w:t>
+      </w:r>
+      <w:r>
+        <w:rPr>
+          <w:rFonts w:cs="Aptos"/>
+        </w:rPr>
+        <w:t>ë</w:t>
+      </w:r>
+      <w:r>
+        <w:t>n toegelicht, om te verantwoorden waarom deze stack geschikt is voor interactieve boomvisualisaties en snelle iteratie. Vervolgens worden alternatieve visualisatielay</w:t>
+      </w:r>
+      <w:r>
+        <w:rPr>
+          <w:rFonts w:ascii="Cambria Math" w:hAnsi="Cambria Math" w:cs="Cambria Math"/>
+        </w:rPr>
+        <w:t>‑</w:t>
+      </w:r>
+      <w:r>
+        <w:t>outs besproken en gemotiveerd, zodat duidelijk wordt waarom uiteindelijk voor de fileview</w:t>
+      </w:r>
+      <w:r>
+        <w:rPr>
+          <w:rFonts w:ascii="Cambria Math" w:hAnsi="Cambria Math" w:cs="Cambria Math"/>
+        </w:rPr>
+        <w:t>‑</w:t>
+      </w:r>
+      <w:r>
+        <w:t>representatie is gekozen. Daarna volgt een gedetailleerde beschrijving van de belangrijkste interface</w:t>
+      </w:r>
+      <w:r>
+        <w:rPr>
+          <w:rFonts w:ascii="Cambria Math" w:hAnsi="Cambria Math" w:cs="Cambria Math"/>
+        </w:rPr>
+        <w:t>‑</w:t>
+      </w:r>
+      <w:r>
+        <w:t>componenten en UX</w:t>
+      </w:r>
+      <w:r>
+        <w:rPr>
+          <w:rFonts w:ascii="Cambria Math" w:hAnsi="Cambria Math" w:cs="Cambria Math"/>
+        </w:rPr>
+        <w:t>‑</w:t>
+      </w:r>
+      <w:r>
+        <w:t xml:space="preserve">features (kleurcodering, statusiconen, filtering, </w:t>
+      </w:r>
+      <w:proofErr w:type="spellStart"/>
+      <w:r>
+        <w:t>branch</w:t>
+      </w:r>
+      <w:proofErr w:type="spellEnd"/>
+      <w:r>
+        <w:t xml:space="preserve"> </w:t>
+      </w:r>
+      <w:proofErr w:type="spellStart"/>
+      <w:r>
+        <w:t>summaries</w:t>
+      </w:r>
+      <w:proofErr w:type="spellEnd"/>
+      <w:r>
+        <w:t xml:space="preserve">), die samen de ondersteuning voor de </w:t>
+      </w:r>
+      <w:proofErr w:type="spellStart"/>
+      <w:r>
+        <w:t>Fortunately</w:t>
+      </w:r>
+      <w:proofErr w:type="spellEnd"/>
+      <w:r>
+        <w:rPr>
+          <w:rFonts w:cs="Aptos"/>
+        </w:rPr>
+        <w:t>–</w:t>
+      </w:r>
+      <w:proofErr w:type="spellStart"/>
+      <w:r>
+        <w:t>Unfortunately</w:t>
+      </w:r>
+      <w:proofErr w:type="spellEnd"/>
+      <w:r>
+        <w:rPr>
+          <w:rFonts w:ascii="Cambria Math" w:hAnsi="Cambria Math" w:cs="Cambria Math"/>
+        </w:rPr>
+        <w:t>‑</w:t>
+      </w:r>
+      <w:r>
+        <w:t>methode concretiseren. Tot slot worden prototypebeperkingen en designkeuzes samengevat als voorbereiding op de gebruikersstudie in het volgende hoofdstuk.</w:t>
+      </w:r>
+    </w:p>
+    <w:p>
+      <w:pPr>
+        <w:spacing w:afterLines="24" w:after="57" w:line="288" w:lineRule="auto"/>
+        <w:rPr>
+          <w:b/>
+          <w:bCs/>
+          <w:sz w:val="28"/>
+          <w:szCs w:val="28"/>
+        </w:rPr>
+      </w:pPr>
+    </w:p>
+    <w:p>
+      <w:pPr>
+        <w:spacing w:afterLines="24" w:after="57" w:line="288" w:lineRule="auto"/>
         <w:rPr>
           <w:b/>
           <w:bCs/>
@@ -4116,6 +4244,7 @@
         <w:spacing w:afterLines="24" w:after="57" w:line="288" w:lineRule="auto"/>
       </w:pPr>
       <w:r>
+        <w:lastRenderedPageBreak/>
         <w:t xml:space="preserve">hulpfuncties om paden naar de root te berekenen (voor </w:t>
       </w:r>
       <w:proofErr w:type="spellStart"/>
@@ -4170,11 +4299,6 @@
       <w:r>
         <w:t xml:space="preserve"> onmiddellijk leidt tot een hertekening van de corresponderende componenten.</w:t>
       </w:r>
-    </w:p>
-    <w:p>
-      <w:pPr>
-        <w:spacing w:afterLines="24" w:after="57" w:line="288" w:lineRule="auto"/>
-      </w:pPr>
     </w:p>
     <w:p>
       <w:pPr>
@@ -4191,26 +4315,26 @@
           <w:szCs w:val="28"/>
         </w:rPr>
       </w:pPr>
-      <w:r>
+    </w:p>
+    <w:p>
+      <w:pPr>
+        <w:spacing w:afterLines="24" w:after="57" w:line="288" w:lineRule="auto"/>
         <w:rPr>
           <w:b/>
           <w:bCs/>
           <w:sz w:val="28"/>
           <w:szCs w:val="28"/>
         </w:rPr>
-        <w:br w:type="page"/>
-      </w:r>
-    </w:p>
-    <w:p>
-      <w:pPr>
-        <w:spacing w:afterLines="24" w:after="57" w:line="288" w:lineRule="auto"/>
+      </w:pPr>
+      <w:r>
         <w:rPr>
           <w:b/>
           <w:bCs/>
           <w:sz w:val="28"/>
           <w:szCs w:val="28"/>
         </w:rPr>
-      </w:pPr>
+        <w:t xml:space="preserve">3.3 </w:t>
+      </w:r>
       <w:r>
         <w:rPr>
           <w:b/>
@@ -4218,16 +4342,6 @@
           <w:sz w:val="28"/>
           <w:szCs w:val="28"/>
         </w:rPr>
-        <w:lastRenderedPageBreak/>
-        <w:t xml:space="preserve">3.3 </w:t>
-      </w:r>
-      <w:r>
-        <w:rPr>
-          <w:b/>
-          <w:bCs/>
-          <w:sz w:val="28"/>
-          <w:szCs w:val="28"/>
-        </w:rPr>
         <w:t>Niet-geïmplementeerde alternatieven</w:t>
       </w:r>
     </w:p>
@@ -4360,6 +4474,220 @@
     <w:p>
       <w:pPr>
         <w:spacing w:afterLines="24" w:after="57" w:line="288" w:lineRule="auto"/>
+        <w:jc w:val="center"/>
+      </w:pPr>
+      <w:r>
+        <w:drawing>
+          <wp:inline distT="0" distB="0" distL="0" distR="0" wp14:anchorId="08B97142" wp14:editId="1A53555F">
+            <wp:extent cx="4068347" cy="2070955"/>
+            <wp:effectExtent l="0" t="0" r="8890" b="5715"/>
+            <wp:docPr id="163695878" name="Afbeelding 1" descr="Afbeelding met tekst, schermopname, Lettertype, nummer&#10;&#10;Door AI gegenereerde inhoud is mogelijk onjuist."/>
+            <wp:cNvGraphicFramePr>
+              <a:graphicFrameLocks xmlns:a="http://schemas.openxmlformats.org/drawingml/2006/main" noChangeAspect="1"/>
+            </wp:cNvGraphicFramePr>
+            <a:graphic xmlns:a="http://schemas.openxmlformats.org/drawingml/2006/main">
+              <a:graphicData uri="http://schemas.openxmlformats.org/drawingml/2006/picture">
+                <pic:pic xmlns:pic="http://schemas.openxmlformats.org/drawingml/2006/picture">
+                  <pic:nvPicPr>
+                    <pic:cNvPr id="163695878" name="Afbeelding 1" descr="Afbeelding met tekst, schermopname, Lettertype, nummer&#10;&#10;Door AI gegenereerde inhoud is mogelijk onjuist."/>
+                    <pic:cNvPicPr/>
+                  </pic:nvPicPr>
+                  <pic:blipFill>
+                    <a:blip r:embed="rId8"/>
+                    <a:stretch>
+                      <a:fillRect/>
+                    </a:stretch>
+                  </pic:blipFill>
+                  <pic:spPr>
+                    <a:xfrm>
+                      <a:off x="0" y="0"/>
+                      <a:ext cx="4078503" cy="2076125"/>
+                    </a:xfrm>
+                    <a:prstGeom prst="rect">
+                      <a:avLst/>
+                    </a:prstGeom>
+                  </pic:spPr>
+                </pic:pic>
+              </a:graphicData>
+            </a:graphic>
+          </wp:inline>
+        </w:drawing>
+      </w:r>
+    </w:p>
+    <w:p>
+      <w:pPr>
+        <w:spacing w:afterLines="24" w:after="57" w:line="288" w:lineRule="auto"/>
+        <w:rPr>
+          <w:lang w:val="en-US"/>
+        </w:rPr>
+      </w:pPr>
+      <w:r>
+        <w:rPr>
+          <w:lang w:val="en-US"/>
+        </w:rPr>
+        <w:t>West, M.. Tree Maps http://mjwest.org/vis/treemaps/ (last access 12/05/2017)</w:t>
+      </w:r>
+    </w:p>
+    <w:p>
+      <w:pPr>
+        <w:spacing w:afterLines="24" w:after="57" w:line="288" w:lineRule="auto"/>
+        <w:jc w:val="center"/>
+        <w:rPr>
+          <w:lang w:val="en-US"/>
+        </w:rPr>
+      </w:pPr>
+    </w:p>
+    <w:p>
+      <w:pPr>
+        <w:spacing w:afterLines="24" w:after="57" w:line="288" w:lineRule="auto"/>
+        <w:jc w:val="center"/>
+        <w:rPr>
+          <w:lang w:val="en-US"/>
+        </w:rPr>
+      </w:pPr>
+    </w:p>
+    <w:p>
+      <w:pPr>
+        <w:spacing w:afterLines="24" w:after="57" w:line="288" w:lineRule="auto"/>
+        <w:jc w:val="center"/>
+      </w:pPr>
+      <w:r>
+        <w:lastRenderedPageBreak/>
+        <w:drawing>
+          <wp:inline distT="0" distB="0" distL="0" distR="0" wp14:anchorId="0D354DE9" wp14:editId="0878A3D7">
+            <wp:extent cx="2748899" cy="2298225"/>
+            <wp:effectExtent l="0" t="0" r="0" b="6985"/>
+            <wp:docPr id="935087861" name="Afbeelding 1" descr="Afbeelding met cirkel, schermopname&#10;&#10;Door AI gegenereerde inhoud is mogelijk onjuist."/>
+            <wp:cNvGraphicFramePr>
+              <a:graphicFrameLocks xmlns:a="http://schemas.openxmlformats.org/drawingml/2006/main" noChangeAspect="1"/>
+            </wp:cNvGraphicFramePr>
+            <a:graphic xmlns:a="http://schemas.openxmlformats.org/drawingml/2006/main">
+              <a:graphicData uri="http://schemas.openxmlformats.org/drawingml/2006/picture">
+                <pic:pic xmlns:pic="http://schemas.openxmlformats.org/drawingml/2006/picture">
+                  <pic:nvPicPr>
+                    <pic:cNvPr id="935087861" name="Afbeelding 1" descr="Afbeelding met cirkel, schermopname&#10;&#10;Door AI gegenereerde inhoud is mogelijk onjuist."/>
+                    <pic:cNvPicPr/>
+                  </pic:nvPicPr>
+                  <pic:blipFill>
+                    <a:blip r:embed="rId9"/>
+                    <a:stretch>
+                      <a:fillRect/>
+                    </a:stretch>
+                  </pic:blipFill>
+                  <pic:spPr>
+                    <a:xfrm>
+                      <a:off x="0" y="0"/>
+                      <a:ext cx="2760320" cy="2307773"/>
+                    </a:xfrm>
+                    <a:prstGeom prst="rect">
+                      <a:avLst/>
+                    </a:prstGeom>
+                  </pic:spPr>
+                </pic:pic>
+              </a:graphicData>
+            </a:graphic>
+          </wp:inline>
+        </w:drawing>
+      </w:r>
+    </w:p>
+    <w:p>
+      <w:pPr>
+        <w:rPr>
+          <w:lang w:val="en-US"/>
+        </w:rPr>
+      </w:pPr>
+      <w:r>
+        <w:rPr>
+          <w:lang w:val="en-US"/>
+        </w:rPr>
+        <w:t xml:space="preserve">Fischer, F. Fuchs, J. and Mansmann, F., </w:t>
+      </w:r>
+      <w:proofErr w:type="spellStart"/>
+      <w:r>
+        <w:rPr>
+          <w:lang w:val="en-US"/>
+        </w:rPr>
+        <w:t>ClockMap</w:t>
+      </w:r>
+      <w:proofErr w:type="spellEnd"/>
+      <w:r>
+        <w:rPr>
+          <w:lang w:val="en-US"/>
+        </w:rPr>
+        <w:t xml:space="preserve">: Enhancing Circular </w:t>
+      </w:r>
+      <w:proofErr w:type="spellStart"/>
+      <w:r>
+        <w:rPr>
+          <w:lang w:val="en-US"/>
+        </w:rPr>
+        <w:t>Treemaps</w:t>
+      </w:r>
+      <w:proofErr w:type="spellEnd"/>
+      <w:r>
+        <w:rPr>
+          <w:lang w:val="en-US"/>
+        </w:rPr>
+        <w:t xml:space="preserve"> with Temporal Glyphs for Time-Series Data. </w:t>
+      </w:r>
+      <w:r>
+        <w:t xml:space="preserve">In </w:t>
+      </w:r>
+      <w:proofErr w:type="spellStart"/>
+      <w:r>
+        <w:t>Proceedings</w:t>
+      </w:r>
+      <w:proofErr w:type="spellEnd"/>
+      <w:r>
+        <w:t xml:space="preserve"> of </w:t>
+      </w:r>
+      <w:proofErr w:type="spellStart"/>
+      <w:r>
+        <w:t>the</w:t>
+      </w:r>
+      <w:proofErr w:type="spellEnd"/>
+      <w:r>
+        <w:t xml:space="preserve"> </w:t>
+      </w:r>
+      <w:proofErr w:type="spellStart"/>
+      <w:r>
+        <w:t>Eurographics</w:t>
+      </w:r>
+      <w:proofErr w:type="spellEnd"/>
+      <w:r>
+        <w:t xml:space="preserve"> Conference on </w:t>
+      </w:r>
+      <w:proofErr w:type="spellStart"/>
+      <w:r>
+        <w:t>Visualization</w:t>
+      </w:r>
+      <w:proofErr w:type="spellEnd"/>
+      <w:r>
+        <w:t xml:space="preserve"> (</w:t>
+      </w:r>
+      <w:proofErr w:type="spellStart"/>
+      <w:r>
+        <w:t>EuroVis</w:t>
+      </w:r>
+      <w:proofErr w:type="spellEnd"/>
+      <w:r>
+        <w:t xml:space="preserve"> 2012), 2012</w:t>
+      </w:r>
+    </w:p>
+    <w:p>
+      <w:pPr>
+        <w:spacing w:afterLines="24" w:after="57" w:line="288" w:lineRule="auto"/>
+        <w:rPr>
+          <w:lang w:val="en-US"/>
+        </w:rPr>
+      </w:pPr>
+    </w:p>
+    <w:p>
+      <w:pPr>
+        <w:spacing w:afterLines="24" w:after="57" w:line="288" w:lineRule="auto"/>
+        <w:rPr>
+          <w:lang w:val="en-US"/>
+        </w:rPr>
       </w:pPr>
     </w:p>
     <w:p>
@@ -4446,7 +4774,7 @@
                     <pic:cNvPicPr/>
                   </pic:nvPicPr>
                   <pic:blipFill>
-                    <a:blip r:embed="rId8" cstate="print">
+                    <a:blip r:embed="rId10" cstate="print">
                       <a:extLst>
                         <a:ext uri="{28A0092B-C50C-407E-A947-70E740481C1C}">
                           <a14:useLocalDpi xmlns:a14="http://schemas.microsoft.com/office/drawing/2010/main" val="0"/>
@@ -4487,7 +4815,6 @@
         <w:rPr>
           <w:noProof/>
         </w:rPr>
-        <w:lastRenderedPageBreak/>
         <w:drawing>
           <wp:inline distT="0" distB="0" distL="0" distR="0" wp14:anchorId="7D672503" wp14:editId="58DCD359">
             <wp:extent cx="5759450" cy="1689735"/>
@@ -4504,7 +4831,7 @@
                     <pic:cNvPicPr/>
                   </pic:nvPicPr>
                   <pic:blipFill>
-                    <a:blip r:embed="rId9" cstate="print">
+                    <a:blip r:embed="rId11" cstate="print">
                       <a:extLst>
                         <a:ext uri="{28A0092B-C50C-407E-A947-70E740481C1C}">
                           <a14:useLocalDpi xmlns:a14="http://schemas.microsoft.com/office/drawing/2010/main" val="0"/>
@@ -4627,7 +4954,7 @@
                     <pic:cNvPicPr/>
                   </pic:nvPicPr>
                   <pic:blipFill>
-                    <a:blip r:embed="rId10">
+                    <a:blip r:embed="rId12">
                       <a:extLst>
                         <a:ext uri="{28A0092B-C50C-407E-A947-70E740481C1C}">
                           <a14:useLocalDpi xmlns:a14="http://schemas.microsoft.com/office/drawing/2010/main" val="0"/>
@@ -4663,26 +4990,320 @@
       <w:pPr>
         <w:spacing w:afterLines="24" w:after="57" w:line="288" w:lineRule="auto"/>
       </w:pPr>
-    </w:p>
-    <w:p>
-      <w:pPr>
-        <w:spacing w:afterLines="24" w:after="57" w:line="288" w:lineRule="auto"/>
+      <w:r>
         <w:rPr>
           <w:b/>
           <w:bCs/>
           <w:sz w:val="28"/>
           <w:szCs w:val="28"/>
         </w:rPr>
-      </w:pPr>
-      <w:r>
+        <w:lastRenderedPageBreak/>
+        <w:t>3.6 Basisfunctionaliteit en uitbreidingen</w:t>
+      </w:r>
+    </w:p>
+    <w:p>
+      <w:pPr>
+        <w:spacing w:afterLines="24" w:after="57" w:line="288" w:lineRule="auto"/>
         <w:rPr>
           <w:b/>
           <w:bCs/>
           <w:sz w:val="28"/>
           <w:szCs w:val="28"/>
         </w:rPr>
-        <w:lastRenderedPageBreak/>
-        <w:t xml:space="preserve">3.6 </w:t>
+      </w:pPr>
+    </w:p>
+    <w:p>
+      <w:pPr>
+        <w:spacing w:afterLines="24" w:after="57" w:line="288" w:lineRule="auto"/>
+      </w:pPr>
+      <w:r>
+        <w:t xml:space="preserve">Dit hoofdstuk beschrijft het ontwerp van de </w:t>
+      </w:r>
+      <w:proofErr w:type="spellStart"/>
+      <w:r>
+        <w:t>threat</w:t>
+      </w:r>
+      <w:r>
+        <w:noBreakHyphen/>
+        <w:t>modelingtool</w:t>
+      </w:r>
+      <w:proofErr w:type="spellEnd"/>
+      <w:r>
+        <w:t xml:space="preserve"> als combinatie van een minimale kern en een reeks UX</w:t>
+      </w:r>
+      <w:r>
+        <w:noBreakHyphen/>
+        <w:t xml:space="preserve">gerichte uitbreidingen. De basisfunctionaliteit omvat alle elementen die nodig zijn om </w:t>
+      </w:r>
+      <w:proofErr w:type="spellStart"/>
+      <w:r>
+        <w:t>Fortunately</w:t>
+      </w:r>
+      <w:proofErr w:type="spellEnd"/>
+      <w:r>
+        <w:t>–</w:t>
+      </w:r>
+      <w:proofErr w:type="spellStart"/>
+      <w:r>
+        <w:t>Unfortunately</w:t>
+      </w:r>
+      <w:proofErr w:type="spellEnd"/>
+      <w:r>
+        <w:noBreakHyphen/>
+        <w:t xml:space="preserve">trees überhaupt te kunnen modelleren: het aanmaken, hernoemen en verwijderen van </w:t>
+      </w:r>
+      <w:proofErr w:type="spellStart"/>
+      <w:r>
+        <w:t>nodes</w:t>
+      </w:r>
+      <w:proofErr w:type="spellEnd"/>
+      <w:r>
+        <w:t>, het uit</w:t>
+      </w:r>
+      <w:r>
+        <w:noBreakHyphen/>
+        <w:t xml:space="preserve"> en inklappen van takken, een consistente boom</w:t>
+      </w:r>
+      <w:r>
+        <w:noBreakHyphen/>
+      </w:r>
+      <w:proofErr w:type="spellStart"/>
+      <w:r>
+        <w:t>layout</w:t>
+      </w:r>
+      <w:proofErr w:type="spellEnd"/>
+      <w:r>
+        <w:t xml:space="preserve"> (fileview</w:t>
+      </w:r>
+      <w:r>
+        <w:noBreakHyphen/>
+        <w:t>representatie) en een eenvoudige zoekfunctie over node</w:t>
+      </w:r>
+      <w:r>
+        <w:noBreakHyphen/>
+        <w:t>namen. Deze kern is onafhankelijk van de extra visualisatie</w:t>
+      </w:r>
+      <w:r>
+        <w:noBreakHyphen/>
+        <w:t xml:space="preserve"> en analyselagen en komt overeen met wat ook in generieke </w:t>
+      </w:r>
+      <w:proofErr w:type="spellStart"/>
+      <w:r>
+        <w:t>mindmap</w:t>
+      </w:r>
+      <w:proofErr w:type="spellEnd"/>
+      <w:r>
+        <w:noBreakHyphen/>
+        <w:t xml:space="preserve"> of diagramsoftware terug te vinden is.</w:t>
+      </w:r>
+    </w:p>
+    <w:p>
+      <w:pPr>
+        <w:spacing w:afterLines="24" w:after="57" w:line="288" w:lineRule="auto"/>
+      </w:pPr>
+    </w:p>
+    <w:p>
+      <w:pPr>
+        <w:spacing w:afterLines="24" w:after="57" w:line="288" w:lineRule="auto"/>
+      </w:pPr>
+      <w:r>
+        <w:t xml:space="preserve">Bovenop deze </w:t>
+      </w:r>
+      <w:proofErr w:type="spellStart"/>
+      <w:r>
+        <w:t>basislaag</w:t>
+      </w:r>
+      <w:proofErr w:type="spellEnd"/>
+      <w:r>
+        <w:t xml:space="preserve"> zijn vervolgens uitbreidingen ontworpen die specifiek inspelen op </w:t>
+      </w:r>
+      <w:proofErr w:type="spellStart"/>
+      <w:r>
+        <w:t>threat</w:t>
+      </w:r>
+      <w:proofErr w:type="spellEnd"/>
+      <w:r>
+        <w:t xml:space="preserve"> </w:t>
+      </w:r>
+      <w:proofErr w:type="spellStart"/>
+      <w:r>
+        <w:t>modeling</w:t>
+      </w:r>
+      <w:proofErr w:type="spellEnd"/>
+      <w:r>
+        <w:t xml:space="preserve"> met de </w:t>
+      </w:r>
+      <w:proofErr w:type="spellStart"/>
+      <w:r>
+        <w:t>Fortunately</w:t>
+      </w:r>
+      <w:proofErr w:type="spellEnd"/>
+      <w:r>
+        <w:t>–</w:t>
+      </w:r>
+      <w:proofErr w:type="spellStart"/>
+      <w:r>
+        <w:t>Unfortunately</w:t>
+      </w:r>
+      <w:proofErr w:type="spellEnd"/>
+      <w:r>
+        <w:noBreakHyphen/>
+        <w:t xml:space="preserve">methode. Het gaat onder meer om kleurcodering voor </w:t>
+      </w:r>
+      <w:proofErr w:type="spellStart"/>
+      <w:r>
+        <w:t>fortunately</w:t>
+      </w:r>
+      <w:proofErr w:type="spellEnd"/>
+      <w:r>
+        <w:t>/</w:t>
+      </w:r>
+      <w:proofErr w:type="spellStart"/>
+      <w:r>
+        <w:t>unfortunately</w:t>
+      </w:r>
+      <w:r>
+        <w:noBreakHyphen/>
+        <w:t>nodes</w:t>
+      </w:r>
+      <w:proofErr w:type="spellEnd"/>
+      <w:r>
+        <w:t xml:space="preserve">, statusiconen voor </w:t>
+      </w:r>
+      <w:proofErr w:type="spellStart"/>
+      <w:r>
+        <w:t>weaknesses</w:t>
+      </w:r>
+      <w:proofErr w:type="spellEnd"/>
+      <w:r>
+        <w:t xml:space="preserve"> en aannames, </w:t>
+      </w:r>
+      <w:proofErr w:type="spellStart"/>
+      <w:r>
+        <w:t>danger</w:t>
+      </w:r>
+      <w:proofErr w:type="spellEnd"/>
+      <w:r>
+        <w:t xml:space="preserve"> ratings op basis van </w:t>
+      </w:r>
+      <w:proofErr w:type="spellStart"/>
+      <w:r>
+        <w:t>likelihood</w:t>
+      </w:r>
+      <w:proofErr w:type="spellEnd"/>
+      <w:r>
+        <w:t xml:space="preserve"> en impact, filtering en sorteren in een </w:t>
+      </w:r>
+      <w:proofErr w:type="spellStart"/>
+      <w:r>
+        <w:t>zijbalk</w:t>
+      </w:r>
+      <w:proofErr w:type="spellEnd"/>
+      <w:r>
+        <w:t xml:space="preserve">, </w:t>
+      </w:r>
+      <w:proofErr w:type="spellStart"/>
+      <w:r>
+        <w:t>highlighten</w:t>
+      </w:r>
+      <w:proofErr w:type="spellEnd"/>
+      <w:r>
+        <w:t xml:space="preserve"> van geselecteerde </w:t>
+      </w:r>
+      <w:proofErr w:type="spellStart"/>
+      <w:r>
+        <w:t>nodes</w:t>
+      </w:r>
+      <w:proofErr w:type="spellEnd"/>
+      <w:r>
+        <w:t xml:space="preserve"> en </w:t>
+      </w:r>
+      <w:proofErr w:type="spellStart"/>
+      <w:r>
+        <w:t>branch</w:t>
+      </w:r>
+      <w:proofErr w:type="spellEnd"/>
+      <w:r>
+        <w:t xml:space="preserve"> </w:t>
+      </w:r>
+      <w:proofErr w:type="spellStart"/>
+      <w:r>
+        <w:t>summaries</w:t>
+      </w:r>
+      <w:proofErr w:type="spellEnd"/>
+      <w:r>
+        <w:t>. In de rest van dit hoofdstuk wordt eerst de implementatie van de basisfunctionaliteit toegelicht (architectuur, fileview</w:t>
+      </w:r>
+      <w:r>
+        <w:noBreakHyphen/>
+      </w:r>
+      <w:proofErr w:type="spellStart"/>
+      <w:r>
+        <w:t>layout</w:t>
+      </w:r>
+      <w:proofErr w:type="spellEnd"/>
+      <w:r>
+        <w:t>), waarna de verschillende uitbreidingen afzonderlijk worden besproken. Deze opdeling maakt het mogelijk om in de resultaten en discussie duidelijk te onderscheiden welke effecten toe te schrijven zijn aan de minimaal noodzakelijke functionaliteit en welke aan de ontworpen toevoegingen.</w:t>
+      </w:r>
+    </w:p>
+    <w:p>
+      <w:pPr>
+        <w:spacing w:afterLines="24" w:after="57" w:line="288" w:lineRule="auto"/>
+        <w:rPr>
+          <w:b/>
+          <w:bCs/>
+          <w:sz w:val="28"/>
+          <w:szCs w:val="28"/>
+        </w:rPr>
+      </w:pPr>
+    </w:p>
+    <w:p>
+      <w:pPr>
+        <w:spacing w:afterLines="24" w:after="57" w:line="288" w:lineRule="auto"/>
+        <w:rPr>
+          <w:b/>
+          <w:bCs/>
+          <w:sz w:val="28"/>
+          <w:szCs w:val="28"/>
+        </w:rPr>
+      </w:pPr>
+    </w:p>
+    <w:p>
+      <w:pPr>
+        <w:spacing w:afterLines="24" w:after="57" w:line="288" w:lineRule="auto"/>
+        <w:rPr>
+          <w:b/>
+          <w:bCs/>
+          <w:sz w:val="28"/>
+          <w:szCs w:val="28"/>
+        </w:rPr>
+      </w:pPr>
+      <w:r>
+        <w:rPr>
+          <w:b/>
+          <w:bCs/>
+          <w:sz w:val="28"/>
+          <w:szCs w:val="28"/>
+        </w:rPr>
+        <w:t>3.</w:t>
+      </w:r>
+      <w:r>
+        <w:rPr>
+          <w:b/>
+          <w:bCs/>
+          <w:sz w:val="28"/>
+          <w:szCs w:val="28"/>
+        </w:rPr>
+        <w:t>7</w:t>
+      </w:r>
+      <w:r>
+        <w:rPr>
+          <w:b/>
+          <w:bCs/>
+          <w:sz w:val="28"/>
+          <w:szCs w:val="28"/>
+        </w:rPr>
+        <w:t xml:space="preserve"> </w:t>
       </w:r>
       <w:r>
         <w:rPr>
@@ -4908,7 +5529,11 @@
         <w:t xml:space="preserve"> </w:t>
       </w:r>
       <w:r>
-        <w:t>weergegeven, zodat de betekenis van de kleurcodering ook tekstueel ondersteund wordt. De kleurcodering</w:t>
+        <w:t xml:space="preserve">weergegeven, zodat de </w:t>
+      </w:r>
+      <w:r>
+        <w:lastRenderedPageBreak/>
+        <w:t>betekenis van de kleurcodering ook tekstueel ondersteund wordt. De kleurcodering</w:t>
       </w:r>
       <w:r>
         <w:t xml:space="preserve"> en la</w:t>
@@ -4965,7 +5590,7 @@
                     <pic:cNvPicPr/>
                   </pic:nvPicPr>
                   <pic:blipFill>
-                    <a:blip r:embed="rId11">
+                    <a:blip r:embed="rId13">
                       <a:extLst>
                         <a:ext uri="{28A0092B-C50C-407E-A947-70E740481C1C}">
                           <a14:useLocalDpi xmlns:a14="http://schemas.microsoft.com/office/drawing/2010/main" val="0"/>
@@ -5022,7 +5647,7 @@
                     <pic:cNvPicPr/>
                   </pic:nvPicPr>
                   <pic:blipFill>
-                    <a:blip r:embed="rId12">
+                    <a:blip r:embed="rId14">
                       <a:extLst>
                         <a:ext uri="{28A0092B-C50C-407E-A947-70E740481C1C}">
                           <a14:useLocalDpi xmlns:a14="http://schemas.microsoft.com/office/drawing/2010/main" val="0"/>
@@ -5076,7 +5701,7 @@
           <w:sz w:val="28"/>
           <w:szCs w:val="28"/>
         </w:rPr>
-        <w:t xml:space="preserve">3.7 </w:t>
+        <w:t>3.</w:t>
       </w:r>
       <w:r>
         <w:rPr>
@@ -5085,9 +5710,8 @@
           <w:sz w:val="28"/>
           <w:szCs w:val="28"/>
         </w:rPr>
-        <w:t xml:space="preserve">Statusiconen en </w:t>
-      </w:r>
-      <w:proofErr w:type="spellStart"/>
+        <w:t>8</w:t>
+      </w:r>
       <w:r>
         <w:rPr>
           <w:b/>
@@ -5095,9 +5719,8 @@
           <w:sz w:val="28"/>
           <w:szCs w:val="28"/>
         </w:rPr>
-        <w:t>danger</w:t>
-      </w:r>
-      <w:proofErr w:type="spellEnd"/>
+        <w:t xml:space="preserve"> </w:t>
+      </w:r>
       <w:r>
         <w:rPr>
           <w:b/>
@@ -5105,18 +5728,38 @@
           <w:sz w:val="28"/>
           <w:szCs w:val="28"/>
         </w:rPr>
-        <w:t xml:space="preserve"> rating</w:t>
-      </w:r>
-    </w:p>
-    <w:p>
-      <w:pPr>
-        <w:spacing w:afterLines="24" w:after="57" w:line="288" w:lineRule="auto"/>
+        <w:t xml:space="preserve">Statusiconen en </w:t>
+      </w:r>
+      <w:proofErr w:type="spellStart"/>
+      <w:r>
         <w:rPr>
           <w:b/>
           <w:bCs/>
           <w:sz w:val="28"/>
           <w:szCs w:val="28"/>
         </w:rPr>
+        <w:t>danger</w:t>
+      </w:r>
+      <w:proofErr w:type="spellEnd"/>
+      <w:r>
+        <w:rPr>
+          <w:b/>
+          <w:bCs/>
+          <w:sz w:val="28"/>
+          <w:szCs w:val="28"/>
+        </w:rPr>
+        <w:t xml:space="preserve"> rating</w:t>
+      </w:r>
+    </w:p>
+    <w:p>
+      <w:pPr>
+        <w:spacing w:afterLines="24" w:after="57" w:line="288" w:lineRule="auto"/>
+        <w:rPr>
+          <w:b/>
+          <w:bCs/>
+          <w:sz w:val="28"/>
+          <w:szCs w:val="28"/>
+        </w:rPr>
       </w:pPr>
     </w:p>
     <w:p>
@@ -5187,14 +5830,7 @@
         <w:rPr>
           <w:lang w:val="en-US"/>
         </w:rPr>
-        <w:t xml:space="preserve"> </w:t>
-      </w:r>
-      <w:r>
-        <w:rPr>
-          <w:lang w:val="en-US"/>
-        </w:rPr>
-        <w:lastRenderedPageBreak/>
-        <w:t xml:space="preserve">Weakness (rood </w:t>
+        <w:t xml:space="preserve"> Weakness (rood </w:t>
       </w:r>
       <w:proofErr w:type="spellStart"/>
       <w:r>
@@ -5428,7 +6064,7 @@
                     <pic:cNvPicPr/>
                   </pic:nvPicPr>
                   <pic:blipFill>
-                    <a:blip r:embed="rId13">
+                    <a:blip r:embed="rId15">
                       <a:extLst>
                         <a:ext uri="{28A0092B-C50C-407E-A947-70E740481C1C}">
                           <a14:useLocalDpi xmlns:a14="http://schemas.microsoft.com/office/drawing/2010/main" val="0"/>
@@ -5469,6 +6105,7 @@
         <w:rPr>
           <w:noProof/>
         </w:rPr>
+        <w:lastRenderedPageBreak/>
         <w:drawing>
           <wp:inline distT="0" distB="0" distL="0" distR="0" wp14:anchorId="0B2C1B6F" wp14:editId="36252DA4">
             <wp:extent cx="838273" cy="784928"/>
@@ -5485,7 +6122,7 @@
                     <pic:cNvPicPr/>
                   </pic:nvPicPr>
                   <pic:blipFill>
-                    <a:blip r:embed="rId14">
+                    <a:blip r:embed="rId16">
                       <a:extLst>
                         <a:ext uri="{28A0092B-C50C-407E-A947-70E740481C1C}">
                           <a14:useLocalDpi xmlns:a14="http://schemas.microsoft.com/office/drawing/2010/main" val="0"/>
@@ -5542,7 +6179,7 @@
                     <pic:cNvPicPr/>
                   </pic:nvPicPr>
                   <pic:blipFill>
-                    <a:blip r:embed="rId15">
+                    <a:blip r:embed="rId17">
                       <a:extLst>
                         <a:ext uri="{28A0092B-C50C-407E-A947-70E740481C1C}">
                           <a14:useLocalDpi xmlns:a14="http://schemas.microsoft.com/office/drawing/2010/main" val="0"/>
@@ -5599,7 +6236,7 @@
                     <pic:cNvPicPr/>
                   </pic:nvPicPr>
                   <pic:blipFill>
-                    <a:blip r:embed="rId16">
+                    <a:blip r:embed="rId18">
                       <a:extLst>
                         <a:ext uri="{28A0092B-C50C-407E-A947-70E740481C1C}">
                           <a14:useLocalDpi xmlns:a14="http://schemas.microsoft.com/office/drawing/2010/main" val="0"/>
@@ -5741,7 +6378,7 @@
                     <pic:cNvPicPr/>
                   </pic:nvPicPr>
                   <pic:blipFill>
-                    <a:blip r:embed="rId17">
+                    <a:blip r:embed="rId19">
                       <a:extLst>
                         <a:ext uri="{28A0092B-C50C-407E-A947-70E740481C1C}">
                           <a14:useLocalDpi xmlns:a14="http://schemas.microsoft.com/office/drawing/2010/main" val="0"/>
@@ -5801,26 +6438,28 @@
           <w:szCs w:val="28"/>
         </w:rPr>
       </w:pPr>
-      <w:r>
+    </w:p>
+    <w:p>
+      <w:pPr>
+        <w:spacing w:afterLines="24" w:after="57" w:line="288" w:lineRule="auto"/>
         <w:rPr>
           <w:b/>
           <w:bCs/>
           <w:sz w:val="28"/>
           <w:szCs w:val="28"/>
         </w:rPr>
-        <w:t xml:space="preserve">3.8 </w:t>
-      </w:r>
-      <w:proofErr w:type="spellStart"/>
-      <w:r>
+      </w:pPr>
+    </w:p>
+    <w:p>
+      <w:pPr>
+        <w:spacing w:afterLines="24" w:after="57" w:line="288" w:lineRule="auto"/>
         <w:rPr>
           <w:b/>
           <w:bCs/>
           <w:sz w:val="28"/>
           <w:szCs w:val="28"/>
         </w:rPr>
-        <w:t>Branch</w:t>
-      </w:r>
-      <w:proofErr w:type="spellEnd"/>
+      </w:pPr>
       <w:r>
         <w:rPr>
           <w:b/>
@@ -5828,18 +6467,57 @@
           <w:sz w:val="28"/>
           <w:szCs w:val="28"/>
         </w:rPr>
-        <w:t xml:space="preserve"> summary en filterlogica</w:t>
-      </w:r>
-    </w:p>
-    <w:p>
-      <w:pPr>
-        <w:spacing w:afterLines="24" w:after="57" w:line="288" w:lineRule="auto"/>
+        <w:lastRenderedPageBreak/>
+        <w:t>3.</w:t>
+      </w:r>
+      <w:r>
         <w:rPr>
           <w:b/>
           <w:bCs/>
           <w:sz w:val="28"/>
           <w:szCs w:val="28"/>
         </w:rPr>
+        <w:t>9</w:t>
+      </w:r>
+      <w:r>
+        <w:rPr>
+          <w:b/>
+          <w:bCs/>
+          <w:sz w:val="28"/>
+          <w:szCs w:val="28"/>
+        </w:rPr>
+        <w:t xml:space="preserve"> </w:t>
+      </w:r>
+      <w:proofErr w:type="spellStart"/>
+      <w:r>
+        <w:rPr>
+          <w:b/>
+          <w:bCs/>
+          <w:sz w:val="28"/>
+          <w:szCs w:val="28"/>
+        </w:rPr>
+        <w:t>Branch</w:t>
+      </w:r>
+      <w:proofErr w:type="spellEnd"/>
+      <w:r>
+        <w:rPr>
+          <w:b/>
+          <w:bCs/>
+          <w:sz w:val="28"/>
+          <w:szCs w:val="28"/>
+        </w:rPr>
+        <w:t xml:space="preserve"> summary en filterlogica</w:t>
+      </w:r>
+    </w:p>
+    <w:p>
+      <w:pPr>
+        <w:spacing w:afterLines="24" w:after="57" w:line="288" w:lineRule="auto"/>
+        <w:rPr>
+          <w:b/>
+          <w:bCs/>
+          <w:sz w:val="28"/>
+          <w:szCs w:val="28"/>
+        </w:rPr>
       </w:pPr>
     </w:p>
     <w:p>
@@ -5994,7 +6672,6 @@
         <w:rPr>
           <w:noProof/>
         </w:rPr>
-        <w:lastRenderedPageBreak/>
         <w:drawing>
           <wp:inline distT="0" distB="0" distL="0" distR="0" wp14:anchorId="440E2E1B" wp14:editId="7443895A">
             <wp:extent cx="3355211" cy="4831080"/>
@@ -6011,7 +6688,7 @@
                     <pic:cNvPicPr/>
                   </pic:nvPicPr>
                   <pic:blipFill>
-                    <a:blip r:embed="rId18">
+                    <a:blip r:embed="rId20">
                       <a:extLst>
                         <a:ext uri="{28A0092B-C50C-407E-A947-70E740481C1C}">
                           <a14:useLocalDpi xmlns:a14="http://schemas.microsoft.com/office/drawing/2010/main" val="0"/>
@@ -6048,6 +6725,7 @@
         <w:spacing w:afterLines="24" w:after="57" w:line="288" w:lineRule="auto"/>
       </w:pPr>
       <w:r>
+        <w:lastRenderedPageBreak/>
         <w:t xml:space="preserve">De filterfunctionaliteit groepeert </w:t>
       </w:r>
       <w:proofErr w:type="spellStart"/>
@@ -6214,7 +6892,7 @@
                     <pic:cNvPicPr/>
                   </pic:nvPicPr>
                   <pic:blipFill>
-                    <a:blip r:embed="rId19">
+                    <a:blip r:embed="rId21">
                       <a:extLst>
                         <a:ext uri="{28A0092B-C50C-407E-A947-70E740481C1C}">
                           <a14:useLocalDpi xmlns:a14="http://schemas.microsoft.com/office/drawing/2010/main" val="0"/>
@@ -6250,7 +6928,6 @@
         <w:rPr>
           <w:noProof/>
         </w:rPr>
-        <w:lastRenderedPageBreak/>
         <w:drawing>
           <wp:inline distT="0" distB="0" distL="0" distR="0" wp14:anchorId="06AFC8F0" wp14:editId="05558874">
             <wp:extent cx="4831898" cy="4267200"/>
@@ -6267,7 +6944,7 @@
                     <pic:cNvPicPr/>
                   </pic:nvPicPr>
                   <pic:blipFill>
-                    <a:blip r:embed="rId20">
+                    <a:blip r:embed="rId22">
                       <a:extLst>
                         <a:ext uri="{28A0092B-C50C-407E-A947-70E740481C1C}">
                           <a14:useLocalDpi xmlns:a14="http://schemas.microsoft.com/office/drawing/2010/main" val="0"/>
@@ -6308,6 +6985,7 @@
         <w:rPr>
           <w:noProof/>
         </w:rPr>
+        <w:lastRenderedPageBreak/>
         <w:drawing>
           <wp:inline distT="0" distB="0" distL="0" distR="0" wp14:anchorId="41AE1910" wp14:editId="7E9A46DC">
             <wp:extent cx="4840522" cy="4137660"/>
@@ -6324,7 +7002,7 @@
                     <pic:cNvPicPr/>
                   </pic:nvPicPr>
                   <pic:blipFill>
-                    <a:blip r:embed="rId21">
+                    <a:blip r:embed="rId23">
                       <a:extLst>
                         <a:ext uri="{28A0092B-C50C-407E-A947-70E740481C1C}">
                           <a14:useLocalDpi xmlns:a14="http://schemas.microsoft.com/office/drawing/2010/main" val="0"/>
@@ -6361,7 +7039,6 @@
         <w:spacing w:afterLines="24" w:after="57" w:line="288" w:lineRule="auto"/>
       </w:pPr>
       <w:r>
-        <w:lastRenderedPageBreak/>
         <w:t xml:space="preserve">Deze implementatie verbindt de abstracte datastructuur (statussen, </w:t>
       </w:r>
       <w:proofErr w:type="spellStart"/>
@@ -6476,7 +7153,7 @@
           <w:sz w:val="28"/>
           <w:szCs w:val="28"/>
         </w:rPr>
-        <w:t xml:space="preserve">3.9 </w:t>
+        <w:t>3.</w:t>
       </w:r>
       <w:r>
         <w:rPr>
@@ -6485,9 +7162,8 @@
           <w:sz w:val="28"/>
           <w:szCs w:val="28"/>
         </w:rPr>
-        <w:t xml:space="preserve">Hover-functionaliteit voor </w:t>
-      </w:r>
-      <w:proofErr w:type="spellStart"/>
+        <w:t>10</w:t>
+      </w:r>
       <w:r>
         <w:rPr>
           <w:b/>
@@ -6495,9 +7171,8 @@
           <w:sz w:val="28"/>
           <w:szCs w:val="28"/>
         </w:rPr>
-        <w:t>parent</w:t>
-      </w:r>
-      <w:proofErr w:type="spellEnd"/>
+        <w:t xml:space="preserve"> </w:t>
+      </w:r>
       <w:r>
         <w:rPr>
           <w:b/>
@@ -6505,18 +7180,38 @@
           <w:sz w:val="28"/>
           <w:szCs w:val="28"/>
         </w:rPr>
-        <w:t>-context</w:t>
-      </w:r>
-    </w:p>
-    <w:p>
-      <w:pPr>
-        <w:spacing w:afterLines="24" w:after="57" w:line="288" w:lineRule="auto"/>
+        <w:t xml:space="preserve">Hover-functionaliteit voor </w:t>
+      </w:r>
+      <w:proofErr w:type="spellStart"/>
+      <w:r>
         <w:rPr>
           <w:b/>
           <w:bCs/>
           <w:sz w:val="28"/>
           <w:szCs w:val="28"/>
         </w:rPr>
+        <w:t>parent</w:t>
+      </w:r>
+      <w:proofErr w:type="spellEnd"/>
+      <w:r>
+        <w:rPr>
+          <w:b/>
+          <w:bCs/>
+          <w:sz w:val="28"/>
+          <w:szCs w:val="28"/>
+        </w:rPr>
+        <w:t>-context</w:t>
+      </w:r>
+    </w:p>
+    <w:p>
+      <w:pPr>
+        <w:spacing w:afterLines="24" w:after="57" w:line="288" w:lineRule="auto"/>
+        <w:rPr>
+          <w:b/>
+          <w:bCs/>
+          <w:sz w:val="28"/>
+          <w:szCs w:val="28"/>
+        </w:rPr>
       </w:pPr>
     </w:p>
     <w:p>
@@ -6573,7 +7268,11 @@
       </w:r>
       <w:proofErr w:type="spellEnd"/>
       <w:r>
-        <w:t xml:space="preserve">-weergave voorkomt dat kritieke relaties verloren gaan in een lijstcontext en biedt snelle contextuele inspectie vóór navigatie (bijv. "welke </w:t>
+        <w:t xml:space="preserve">-weergave voorkomt dat kritieke relaties verloren gaan in een lijstcontext en biedt </w:t>
+      </w:r>
+      <w:r>
+        <w:lastRenderedPageBreak/>
+        <w:t xml:space="preserve">snelle contextuele inspectie vóór navigatie (bijv. "welke </w:t>
       </w:r>
       <w:proofErr w:type="spellStart"/>
       <w:r>
@@ -6622,7 +7321,7 @@
                     <pic:cNvPicPr/>
                   </pic:nvPicPr>
                   <pic:blipFill>
-                    <a:blip r:embed="rId22">
+                    <a:blip r:embed="rId24">
                       <a:extLst>
                         <a:ext uri="{28A0092B-C50C-407E-A947-70E740481C1C}">
                           <a14:useLocalDpi xmlns:a14="http://schemas.microsoft.com/office/drawing/2010/main" val="0"/>
@@ -6695,7 +7394,7 @@
                     <pic:cNvPicPr/>
                   </pic:nvPicPr>
                   <pic:blipFill>
-                    <a:blip r:embed="rId23">
+                    <a:blip r:embed="rId25">
                       <a:extLst>
                         <a:ext uri="{28A0092B-C50C-407E-A947-70E740481C1C}">
                           <a14:useLocalDpi xmlns:a14="http://schemas.microsoft.com/office/drawing/2010/main" val="0"/>
@@ -6739,8 +7438,25 @@
           <w:sz w:val="28"/>
           <w:szCs w:val="28"/>
         </w:rPr>
-        <w:lastRenderedPageBreak/>
-        <w:t xml:space="preserve">3.10 </w:t>
+        <w:t>3.</w:t>
+      </w:r>
+      <w:r>
+        <w:rPr>
+          <w:b/>
+          <w:bCs/>
+          <w:sz w:val="28"/>
+          <w:szCs w:val="28"/>
+        </w:rPr>
+        <w:t>11</w:t>
+      </w:r>
+      <w:r>
+        <w:rPr>
+          <w:b/>
+          <w:bCs/>
+          <w:sz w:val="28"/>
+          <w:szCs w:val="28"/>
+        </w:rPr>
+        <w:t xml:space="preserve"> </w:t>
       </w:r>
       <w:r>
         <w:rPr>
@@ -6835,7 +7551,7 @@
                     <pic:cNvPicPr/>
                   </pic:nvPicPr>
                   <pic:blipFill>
-                    <a:blip r:embed="rId24">
+                    <a:blip r:embed="rId26">
                       <a:extLst>
                         <a:ext uri="{28A0092B-C50C-407E-A947-70E740481C1C}">
                           <a14:useLocalDpi xmlns:a14="http://schemas.microsoft.com/office/drawing/2010/main" val="0"/>
@@ -6876,6 +7592,7 @@
         <w:rPr>
           <w:noProof/>
         </w:rPr>
+        <w:lastRenderedPageBreak/>
         <w:drawing>
           <wp:inline distT="0" distB="0" distL="0" distR="0" wp14:anchorId="7D6C2D13" wp14:editId="03A32116">
             <wp:extent cx="3558848" cy="1257409"/>
@@ -6892,7 +7609,7 @@
                     <pic:cNvPicPr/>
                   </pic:nvPicPr>
                   <pic:blipFill>
-                    <a:blip r:embed="rId25">
+                    <a:blip r:embed="rId27">
                       <a:extLst>
                         <a:ext uri="{28A0092B-C50C-407E-A947-70E740481C1C}">
                           <a14:useLocalDpi xmlns:a14="http://schemas.microsoft.com/office/drawing/2010/main" val="0"/>
@@ -6949,7 +7666,7 @@
                     <pic:cNvPicPr/>
                   </pic:nvPicPr>
                   <pic:blipFill>
-                    <a:blip r:embed="rId26">
+                    <a:blip r:embed="rId28">
                       <a:extLst>
                         <a:ext uri="{28A0092B-C50C-407E-A947-70E740481C1C}">
                           <a14:useLocalDpi xmlns:a14="http://schemas.microsoft.com/office/drawing/2010/main" val="0"/>
@@ -7006,7 +7723,7 @@
                     <pic:cNvPicPr/>
                   </pic:nvPicPr>
                   <pic:blipFill>
-                    <a:blip r:embed="rId27">
+                    <a:blip r:embed="rId29">
                       <a:extLst>
                         <a:ext uri="{28A0092B-C50C-407E-A947-70E740481C1C}">
                           <a14:useLocalDpi xmlns:a14="http://schemas.microsoft.com/office/drawing/2010/main" val="0"/>
@@ -7043,26 +7760,28 @@
           <w:szCs w:val="28"/>
         </w:rPr>
       </w:pPr>
-      <w:r>
+    </w:p>
+    <w:p>
+      <w:pPr>
+        <w:spacing w:afterLines="24" w:after="57" w:line="288" w:lineRule="auto"/>
         <w:rPr>
           <w:b/>
           <w:bCs/>
           <w:sz w:val="28"/>
           <w:szCs w:val="28"/>
         </w:rPr>
-        <w:lastRenderedPageBreak/>
-        <w:t xml:space="preserve">3.11 </w:t>
-      </w:r>
-      <w:r>
+      </w:pPr>
+    </w:p>
+    <w:p>
+      <w:pPr>
+        <w:spacing w:afterLines="24" w:after="57" w:line="288" w:lineRule="auto"/>
         <w:rPr>
           <w:b/>
           <w:bCs/>
           <w:sz w:val="28"/>
           <w:szCs w:val="28"/>
         </w:rPr>
-        <w:t xml:space="preserve">Toepassing van </w:t>
-      </w:r>
-      <w:proofErr w:type="spellStart"/>
+      </w:pPr>
       <w:r>
         <w:rPr>
           <w:b/>
@@ -7070,9 +7789,8 @@
           <w:sz w:val="28"/>
           <w:szCs w:val="28"/>
         </w:rPr>
-        <w:t>Nielsen’s</w:t>
-      </w:r>
-      <w:proofErr w:type="spellEnd"/>
+        <w:t>3.1</w:t>
+      </w:r>
       <w:r>
         <w:rPr>
           <w:b/>
@@ -7080,9 +7798,8 @@
           <w:sz w:val="28"/>
           <w:szCs w:val="28"/>
         </w:rPr>
-        <w:t xml:space="preserve"> </w:t>
-      </w:r>
-      <w:proofErr w:type="spellStart"/>
+        <w:t>2</w:t>
+      </w:r>
       <w:r>
         <w:rPr>
           <w:b/>
@@ -7090,9 +7807,8 @@
           <w:sz w:val="28"/>
           <w:szCs w:val="28"/>
         </w:rPr>
-        <w:t>usability</w:t>
-      </w:r>
-      <w:proofErr w:type="spellEnd"/>
+        <w:t xml:space="preserve"> </w:t>
+      </w:r>
       <w:r>
         <w:rPr>
           <w:b/>
@@ -7100,6 +7816,46 @@
           <w:sz w:val="28"/>
           <w:szCs w:val="28"/>
         </w:rPr>
+        <w:t xml:space="preserve">Toepassing van </w:t>
+      </w:r>
+      <w:proofErr w:type="spellStart"/>
+      <w:r>
+        <w:rPr>
+          <w:b/>
+          <w:bCs/>
+          <w:sz w:val="28"/>
+          <w:szCs w:val="28"/>
+        </w:rPr>
+        <w:t>Nielsen’s</w:t>
+      </w:r>
+      <w:proofErr w:type="spellEnd"/>
+      <w:r>
+        <w:rPr>
+          <w:b/>
+          <w:bCs/>
+          <w:sz w:val="28"/>
+          <w:szCs w:val="28"/>
+        </w:rPr>
+        <w:t xml:space="preserve"> </w:t>
+      </w:r>
+      <w:proofErr w:type="spellStart"/>
+      <w:r>
+        <w:rPr>
+          <w:b/>
+          <w:bCs/>
+          <w:sz w:val="28"/>
+          <w:szCs w:val="28"/>
+        </w:rPr>
+        <w:t>usability</w:t>
+      </w:r>
+      <w:proofErr w:type="spellEnd"/>
+      <w:r>
+        <w:rPr>
+          <w:b/>
+          <w:bCs/>
+          <w:sz w:val="28"/>
+          <w:szCs w:val="28"/>
+        </w:rPr>
         <w:noBreakHyphen/>
         <w:t xml:space="preserve">heuristieken in de </w:t>
       </w:r>
@@ -7227,7 +7983,21 @@
           <w:b/>
           <w:bCs/>
         </w:rPr>
-        <w:t xml:space="preserve">3.11.1 </w:t>
+        <w:t>3.1</w:t>
+      </w:r>
+      <w:r>
+        <w:rPr>
+          <w:b/>
+          <w:bCs/>
+        </w:rPr>
+        <w:t>2.1</w:t>
+      </w:r>
+      <w:r>
+        <w:rPr>
+          <w:b/>
+          <w:bCs/>
+        </w:rPr>
+        <w:t xml:space="preserve"> </w:t>
       </w:r>
       <w:r>
         <w:rPr>
@@ -7329,7 +8099,11 @@
         <w:t xml:space="preserve">tonen </w:t>
       </w:r>
       <w:r>
-        <w:t>onmiddellijk na gebruikersinteractie</w:t>
+        <w:t xml:space="preserve">onmiddellijk na </w:t>
+      </w:r>
+      <w:r>
+        <w:lastRenderedPageBreak/>
+        <w:t>gebruikersinteractie</w:t>
       </w:r>
       <w:r>
         <w:t xml:space="preserve"> </w:t>
@@ -7394,7 +8168,21 @@
           <w:b/>
           <w:bCs/>
         </w:rPr>
-        <w:t xml:space="preserve">3.11.2 </w:t>
+        <w:t>3.1</w:t>
+      </w:r>
+      <w:r>
+        <w:rPr>
+          <w:b/>
+          <w:bCs/>
+        </w:rPr>
+        <w:t>3</w:t>
+      </w:r>
+      <w:r>
+        <w:rPr>
+          <w:b/>
+          <w:bCs/>
+        </w:rPr>
+        <w:t xml:space="preserve">.2 </w:t>
       </w:r>
       <w:r>
         <w:rPr>
@@ -7563,35 +8351,32 @@
     </w:p>
     <w:p>
       <w:pPr>
-        <w:spacing w:afterLines="24" w:after="57"/>
-        <w:rPr>
-          <w:b/>
-          <w:bCs/>
-        </w:rPr>
-      </w:pPr>
-      <w:r>
-        <w:rPr>
-          <w:b/>
-          <w:bCs/>
-        </w:rPr>
-        <w:br w:type="page"/>
-      </w:r>
-    </w:p>
-    <w:p>
-      <w:pPr>
-        <w:spacing w:afterLines="24" w:after="57" w:line="288" w:lineRule="auto"/>
-        <w:rPr>
-          <w:b/>
-          <w:bCs/>
-        </w:rPr>
-      </w:pPr>
-      <w:r>
-        <w:rPr>
-          <w:b/>
-          <w:bCs/>
-        </w:rPr>
-        <w:lastRenderedPageBreak/>
-        <w:t xml:space="preserve">3.11.3 </w:t>
+        <w:spacing w:afterLines="24" w:after="57" w:line="288" w:lineRule="auto"/>
+        <w:rPr>
+          <w:b/>
+          <w:bCs/>
+        </w:rPr>
+      </w:pPr>
+      <w:r>
+        <w:rPr>
+          <w:b/>
+          <w:bCs/>
+        </w:rPr>
+        <w:t>3.1</w:t>
+      </w:r>
+      <w:r>
+        <w:rPr>
+          <w:b/>
+          <w:bCs/>
+        </w:rPr>
+        <w:t>2</w:t>
+      </w:r>
+      <w:r>
+        <w:rPr>
+          <w:b/>
+          <w:bCs/>
+        </w:rPr>
+        <w:t xml:space="preserve">.3 </w:t>
       </w:r>
       <w:r>
         <w:rPr>
@@ -7735,7 +8520,21 @@
           <w:b/>
           <w:bCs/>
         </w:rPr>
-        <w:t xml:space="preserve">3.11.4 </w:t>
+        <w:t>3.1</w:t>
+      </w:r>
+      <w:r>
+        <w:rPr>
+          <w:b/>
+          <w:bCs/>
+        </w:rPr>
+        <w:t>2</w:t>
+      </w:r>
+      <w:r>
+        <w:rPr>
+          <w:b/>
+          <w:bCs/>
+        </w:rPr>
+        <w:t xml:space="preserve">.4 </w:t>
       </w:r>
       <w:r>
         <w:rPr>
@@ -7795,7 +8594,11 @@
       </w:r>
       <w:proofErr w:type="spellEnd"/>
       <w:r>
-        <w:t>). De betekenis van iconen blijft overal gelijk: </w:t>
+        <w:t xml:space="preserve">). De betekenis van iconen blijft </w:t>
+      </w:r>
+      <w:r>
+        <w:lastRenderedPageBreak/>
+        <w:t>overal gelijk: </w:t>
       </w:r>
       <w:proofErr w:type="spellStart"/>
       <w:r>
@@ -7906,7 +8709,21 @@
           <w:b/>
           <w:bCs/>
         </w:rPr>
-        <w:t xml:space="preserve">3.11.5 </w:t>
+        <w:t>3.1</w:t>
+      </w:r>
+      <w:r>
+        <w:rPr>
+          <w:b/>
+          <w:bCs/>
+        </w:rPr>
+        <w:t>2</w:t>
+      </w:r>
+      <w:r>
+        <w:rPr>
+          <w:b/>
+          <w:bCs/>
+        </w:rPr>
+        <w:t xml:space="preserve">.5 </w:t>
       </w:r>
       <w:r>
         <w:rPr>
@@ -8003,201 +8820,254 @@
       <w:pPr>
         <w:spacing w:afterLines="24" w:after="57" w:line="288" w:lineRule="auto"/>
       </w:pPr>
+    </w:p>
+    <w:p>
+      <w:pPr>
+        <w:spacing w:afterLines="24" w:after="57" w:line="288" w:lineRule="auto"/>
+      </w:pPr>
+    </w:p>
+    <w:p>
+      <w:pPr>
+        <w:spacing w:afterLines="24" w:after="57" w:line="288" w:lineRule="auto"/>
+      </w:pPr>
+      <w:r>
+        <w:rPr>
+          <w:b/>
+          <w:bCs/>
+        </w:rPr>
+        <w:t>3.1</w:t>
+      </w:r>
+      <w:r>
+        <w:rPr>
+          <w:b/>
+          <w:bCs/>
+        </w:rPr>
+        <w:t>2</w:t>
+      </w:r>
+      <w:r>
+        <w:rPr>
+          <w:b/>
+          <w:bCs/>
+        </w:rPr>
+        <w:t xml:space="preserve">.6 </w:t>
+      </w:r>
+      <w:r>
+        <w:rPr>
+          <w:b/>
+          <w:bCs/>
+        </w:rPr>
+        <w:t>Herkenning boven herinnering</w:t>
+      </w:r>
+      <w:r>
+        <w:br/>
+      </w:r>
+    </w:p>
+    <w:p>
+      <w:pPr>
+        <w:spacing w:afterLines="24" w:after="57" w:line="288" w:lineRule="auto"/>
+      </w:pPr>
+      <w:r>
+        <w:t>De interface is zo ontworpen dat relevante acties en informatie zichtbaar worden aangeboden in plaats van uit het geheugen te moeten worden opgeroepen. Contextuele knoppen rond elke knoop (</w:t>
+      </w:r>
+      <w:proofErr w:type="spellStart"/>
+      <w:r>
+        <w:t>iconselector</w:t>
+      </w:r>
+      <w:proofErr w:type="spellEnd"/>
+      <w:r>
+        <w:t xml:space="preserve">, </w:t>
+      </w:r>
+      <w:proofErr w:type="spellStart"/>
+      <w:r>
+        <w:t>expand</w:t>
+      </w:r>
+      <w:proofErr w:type="spellEnd"/>
+      <w:r>
+        <w:t>/</w:t>
+      </w:r>
+      <w:proofErr w:type="spellStart"/>
+      <w:r>
+        <w:t>collapse</w:t>
+      </w:r>
+      <w:proofErr w:type="spellEnd"/>
+      <w:r>
+        <w:t xml:space="preserve">, delete, </w:t>
+      </w:r>
+      <w:proofErr w:type="spellStart"/>
+      <w:r>
+        <w:t>add</w:t>
+      </w:r>
+      <w:proofErr w:type="spellEnd"/>
+      <w:r>
+        <w:t xml:space="preserve"> </w:t>
+      </w:r>
+      <w:proofErr w:type="spellStart"/>
+      <w:r>
+        <w:t>child</w:t>
+      </w:r>
+      <w:proofErr w:type="spellEnd"/>
+      <w:r>
+        <w:t xml:space="preserve">) verschijnen bij </w:t>
+      </w:r>
+      <w:proofErr w:type="spellStart"/>
+      <w:r>
+        <w:t>hover</w:t>
+      </w:r>
+      <w:proofErr w:type="spellEnd"/>
+      <w:r>
+        <w:t>, zodat gebruikers zien welke handelingen mogelijk zijn zonder menu’s of commando’s te onthouden. De </w:t>
+      </w:r>
+      <w:proofErr w:type="spellStart"/>
+      <w:r>
+        <w:t>IconSelectorButton</w:t>
+      </w:r>
+      <w:proofErr w:type="spellEnd"/>
+      <w:r>
+        <w:t xml:space="preserve"> toont bij </w:t>
+      </w:r>
+      <w:proofErr w:type="spellStart"/>
+      <w:r>
+        <w:t>hover</w:t>
+      </w:r>
+      <w:proofErr w:type="spellEnd"/>
+      <w:r>
+        <w:t xml:space="preserve"> een korte tekstuele uitleg (“</w:t>
+      </w:r>
+      <w:proofErr w:type="spellStart"/>
+      <w:r>
+        <w:t>Weakness</w:t>
+      </w:r>
+      <w:proofErr w:type="spellEnd"/>
+      <w:r>
+        <w:t>”, “</w:t>
+      </w:r>
+      <w:proofErr w:type="spellStart"/>
+      <w:r>
+        <w:t>Assumption</w:t>
+      </w:r>
+      <w:proofErr w:type="spellEnd"/>
+      <w:r>
+        <w:t xml:space="preserve"> Under Review”, “</w:t>
+      </w:r>
+      <w:proofErr w:type="spellStart"/>
+      <w:r>
+        <w:t>Verified</w:t>
+      </w:r>
+      <w:proofErr w:type="spellEnd"/>
+      <w:r>
+        <w:t xml:space="preserve"> </w:t>
+      </w:r>
+      <w:proofErr w:type="spellStart"/>
+      <w:r>
+        <w:t>assumption</w:t>
+      </w:r>
+      <w:proofErr w:type="spellEnd"/>
+      <w:r>
+        <w:t>”, enz.), waardoor de betekenis van de iconen direct herkenbaar is. De </w:t>
+      </w:r>
+      <w:proofErr w:type="spellStart"/>
+      <w:r>
+        <w:t>SearchBar</w:t>
+      </w:r>
+      <w:proofErr w:type="spellEnd"/>
+      <w:r>
+        <w:t> laat gebruikers zoeken op knoopnaam</w:t>
+      </w:r>
+      <w:r>
+        <w:t>.</w:t>
+      </w:r>
+      <w:r>
+        <w:t xml:space="preserve"> </w:t>
+      </w:r>
+      <w:r>
+        <w:t xml:space="preserve">De </w:t>
+      </w:r>
+      <w:r>
+        <w:t xml:space="preserve">gevonden </w:t>
+      </w:r>
+      <w:proofErr w:type="spellStart"/>
+      <w:r>
+        <w:t>nodes</w:t>
+      </w:r>
+      <w:proofErr w:type="spellEnd"/>
+      <w:r>
+        <w:t xml:space="preserve"> worden automatisch </w:t>
+      </w:r>
+      <w:proofErr w:type="spellStart"/>
+      <w:r>
+        <w:t>gehighlight</w:t>
+      </w:r>
+      <w:proofErr w:type="spellEnd"/>
+      <w:r>
+        <w:t xml:space="preserve"> en centraal in beeld gescrold (</w:t>
+      </w:r>
+      <w:proofErr w:type="spellStart"/>
+      <w:r>
+        <w:t>scrollIntoView</w:t>
+      </w:r>
+      <w:proofErr w:type="spellEnd"/>
+      <w:r>
+        <w:t>), waardoor de gebruiker de exacte positie in de boomstructuur niet hoeft te onthouden.</w:t>
+      </w:r>
+    </w:p>
+    <w:p>
+      <w:pPr>
+        <w:spacing w:afterLines="24" w:after="57" w:line="288" w:lineRule="auto"/>
+        <w:rPr>
+          <w:b/>
+          <w:bCs/>
+        </w:rPr>
+      </w:pPr>
+    </w:p>
+    <w:p>
+      <w:pPr>
+        <w:spacing w:afterLines="24" w:after="57" w:line="288" w:lineRule="auto"/>
+        <w:rPr>
+          <w:b/>
+          <w:bCs/>
+        </w:rPr>
+      </w:pPr>
+    </w:p>
+    <w:p>
+      <w:pPr>
+        <w:rPr>
+          <w:b/>
+          <w:bCs/>
+        </w:rPr>
+      </w:pPr>
+      <w:r>
+        <w:rPr>
+          <w:b/>
+          <w:bCs/>
+        </w:rPr>
+        <w:br w:type="page"/>
+      </w:r>
+    </w:p>
+    <w:p>
+      <w:pPr>
+        <w:spacing w:afterLines="24" w:after="57" w:line="288" w:lineRule="auto"/>
+      </w:pPr>
       <w:r>
         <w:rPr>
           <w:b/>
           <w:bCs/>
         </w:rPr>
         <w:lastRenderedPageBreak/>
-        <w:t xml:space="preserve">3.11.6 </w:t>
-      </w:r>
-      <w:r>
-        <w:rPr>
-          <w:b/>
-          <w:bCs/>
-        </w:rPr>
-        <w:t>Herkenning boven herinnering</w:t>
-      </w:r>
-      <w:r>
-        <w:br/>
-      </w:r>
-    </w:p>
-    <w:p>
-      <w:pPr>
-        <w:spacing w:afterLines="24" w:after="57" w:line="288" w:lineRule="auto"/>
-      </w:pPr>
-      <w:r>
-        <w:t>De interface is zo ontworpen dat relevante acties en informatie zichtbaar worden aangeboden in plaats van uit het geheugen te moeten worden opgeroepen. Contextuele knoppen rond elke knoop (</w:t>
-      </w:r>
-      <w:proofErr w:type="spellStart"/>
-      <w:r>
-        <w:t>iconselector</w:t>
-      </w:r>
-      <w:proofErr w:type="spellEnd"/>
-      <w:r>
-        <w:t xml:space="preserve">, </w:t>
-      </w:r>
-      <w:proofErr w:type="spellStart"/>
-      <w:r>
-        <w:t>expand</w:t>
-      </w:r>
-      <w:proofErr w:type="spellEnd"/>
-      <w:r>
-        <w:t>/</w:t>
-      </w:r>
-      <w:proofErr w:type="spellStart"/>
-      <w:r>
-        <w:t>collapse</w:t>
-      </w:r>
-      <w:proofErr w:type="spellEnd"/>
-      <w:r>
-        <w:t xml:space="preserve">, delete, </w:t>
-      </w:r>
-      <w:proofErr w:type="spellStart"/>
-      <w:r>
-        <w:t>add</w:t>
-      </w:r>
-      <w:proofErr w:type="spellEnd"/>
-      <w:r>
-        <w:t xml:space="preserve"> </w:t>
-      </w:r>
-      <w:proofErr w:type="spellStart"/>
-      <w:r>
-        <w:t>child</w:t>
-      </w:r>
-      <w:proofErr w:type="spellEnd"/>
-      <w:r>
-        <w:t xml:space="preserve">) verschijnen bij </w:t>
-      </w:r>
-      <w:proofErr w:type="spellStart"/>
-      <w:r>
-        <w:t>hover</w:t>
-      </w:r>
-      <w:proofErr w:type="spellEnd"/>
-      <w:r>
-        <w:t>, zodat gebruikers zien welke handelingen mogelijk zijn zonder menu’s of commando’s te onthouden. De </w:t>
-      </w:r>
-      <w:proofErr w:type="spellStart"/>
-      <w:r>
-        <w:t>IconSelectorButton</w:t>
-      </w:r>
-      <w:proofErr w:type="spellEnd"/>
-      <w:r>
-        <w:t xml:space="preserve"> toont bij </w:t>
-      </w:r>
-      <w:proofErr w:type="spellStart"/>
-      <w:r>
-        <w:t>hover</w:t>
-      </w:r>
-      <w:proofErr w:type="spellEnd"/>
-      <w:r>
-        <w:t xml:space="preserve"> een korte tekstuele uitleg (“</w:t>
-      </w:r>
-      <w:proofErr w:type="spellStart"/>
-      <w:r>
-        <w:t>Weakness</w:t>
-      </w:r>
-      <w:proofErr w:type="spellEnd"/>
-      <w:r>
-        <w:t>”, “</w:t>
-      </w:r>
-      <w:proofErr w:type="spellStart"/>
-      <w:r>
-        <w:t>Assumption</w:t>
-      </w:r>
-      <w:proofErr w:type="spellEnd"/>
-      <w:r>
-        <w:t xml:space="preserve"> Under Review”, “</w:t>
-      </w:r>
-      <w:proofErr w:type="spellStart"/>
-      <w:r>
-        <w:t>Verified</w:t>
-      </w:r>
-      <w:proofErr w:type="spellEnd"/>
-      <w:r>
-        <w:t xml:space="preserve"> </w:t>
-      </w:r>
-      <w:proofErr w:type="spellStart"/>
-      <w:r>
-        <w:t>assumption</w:t>
-      </w:r>
-      <w:proofErr w:type="spellEnd"/>
-      <w:r>
-        <w:t>”, enz.), waardoor de betekenis van de iconen direct herkenbaar is. De </w:t>
-      </w:r>
-      <w:proofErr w:type="spellStart"/>
-      <w:r>
-        <w:t>SearchBar</w:t>
-      </w:r>
-      <w:proofErr w:type="spellEnd"/>
-      <w:r>
-        <w:t> laat gebruikers zoeken op knoopnaam</w:t>
-      </w:r>
-      <w:r>
-        <w:t>.</w:t>
-      </w:r>
-      <w:r>
-        <w:t xml:space="preserve"> </w:t>
-      </w:r>
-      <w:r>
-        <w:t xml:space="preserve">De </w:t>
-      </w:r>
-      <w:r>
-        <w:t xml:space="preserve">gevonden </w:t>
-      </w:r>
-      <w:proofErr w:type="spellStart"/>
-      <w:r>
-        <w:t>nodes</w:t>
-      </w:r>
-      <w:proofErr w:type="spellEnd"/>
-      <w:r>
-        <w:t xml:space="preserve"> worden automatisch </w:t>
-      </w:r>
-      <w:proofErr w:type="spellStart"/>
-      <w:r>
-        <w:t>gehighlight</w:t>
-      </w:r>
-      <w:proofErr w:type="spellEnd"/>
-      <w:r>
-        <w:t xml:space="preserve"> en centraal in beeld gescrold (</w:t>
-      </w:r>
-      <w:proofErr w:type="spellStart"/>
-      <w:r>
-        <w:t>scrollIntoView</w:t>
-      </w:r>
-      <w:proofErr w:type="spellEnd"/>
-      <w:r>
-        <w:t>), waardoor de gebruiker de exacte positie in de boomstructuur niet hoeft te onthouden.</w:t>
-      </w:r>
-    </w:p>
-    <w:p>
-      <w:pPr>
-        <w:spacing w:afterLines="24" w:after="57" w:line="288" w:lineRule="auto"/>
-        <w:rPr>
-          <w:b/>
-          <w:bCs/>
-        </w:rPr>
-      </w:pPr>
-    </w:p>
-    <w:p>
-      <w:pPr>
-        <w:spacing w:afterLines="24" w:after="57" w:line="288" w:lineRule="auto"/>
-        <w:rPr>
-          <w:b/>
-          <w:bCs/>
-        </w:rPr>
-      </w:pPr>
-    </w:p>
-    <w:p>
-      <w:pPr>
-        <w:spacing w:afterLines="24" w:after="57" w:line="288" w:lineRule="auto"/>
-      </w:pPr>
-      <w:r>
-        <w:rPr>
-          <w:b/>
-          <w:bCs/>
-        </w:rPr>
-        <w:t xml:space="preserve">3.11.7 </w:t>
+        <w:t>3.1</w:t>
+      </w:r>
+      <w:r>
+        <w:rPr>
+          <w:b/>
+          <w:bCs/>
+        </w:rPr>
+        <w:t>2</w:t>
+      </w:r>
+      <w:r>
+        <w:rPr>
+          <w:b/>
+          <w:bCs/>
+        </w:rPr>
+        <w:t xml:space="preserve">.7 </w:t>
       </w:r>
       <w:r>
         <w:rPr>
@@ -8302,7 +9172,21 @@
           <w:b/>
           <w:bCs/>
         </w:rPr>
-        <w:t xml:space="preserve">3.11.8 </w:t>
+        <w:t>3.1</w:t>
+      </w:r>
+      <w:r>
+        <w:rPr>
+          <w:b/>
+          <w:bCs/>
+        </w:rPr>
+        <w:t>2</w:t>
+      </w:r>
+      <w:r>
+        <w:rPr>
+          <w:b/>
+          <w:bCs/>
+        </w:rPr>
+        <w:t xml:space="preserve">.8 </w:t>
       </w:r>
       <w:r>
         <w:rPr>
@@ -8367,14 +9251,36 @@
     <w:p>
       <w:pPr>
         <w:spacing w:afterLines="24" w:after="57" w:line="288" w:lineRule="auto"/>
-      </w:pPr>
-      <w:r>
-        <w:rPr>
-          <w:b/>
-          <w:bCs/>
-        </w:rPr>
-        <w:lastRenderedPageBreak/>
-        <w:t xml:space="preserve">3.11.10 </w:t>
+        <w:rPr>
+          <w:b/>
+          <w:bCs/>
+        </w:rPr>
+      </w:pPr>
+    </w:p>
+    <w:p>
+      <w:pPr>
+        <w:spacing w:afterLines="24" w:after="57" w:line="288" w:lineRule="auto"/>
+      </w:pPr>
+      <w:r>
+        <w:rPr>
+          <w:b/>
+          <w:bCs/>
+        </w:rPr>
+        <w:t>3.1</w:t>
+      </w:r>
+      <w:r>
+        <w:rPr>
+          <w:b/>
+          <w:bCs/>
+        </w:rPr>
+        <w:t>2</w:t>
+      </w:r>
+      <w:r>
+        <w:rPr>
+          <w:b/>
+          <w:bCs/>
+        </w:rPr>
+        <w:t xml:space="preserve">.10 </w:t>
       </w:r>
       <w:r>
         <w:rPr>
@@ -8479,22 +9385,28 @@
     <w:p>
       <w:pPr>
         <w:spacing w:afterLines="24" w:after="57" w:line="288" w:lineRule="auto"/>
-        <w:rPr>
-          <w:b/>
-          <w:bCs/>
-        </w:rPr>
-      </w:pPr>
-    </w:p>
-    <w:p>
-      <w:pPr>
-        <w:spacing w:afterLines="24" w:after="57" w:line="288" w:lineRule="auto"/>
-      </w:pPr>
-      <w:r>
-        <w:rPr>
-          <w:b/>
-          <w:bCs/>
-        </w:rPr>
-        <w:t>3.11.11</w:t>
+      </w:pPr>
+      <w:r>
+        <w:rPr>
+          <w:b/>
+          <w:bCs/>
+        </w:rPr>
+        <w:lastRenderedPageBreak/>
+        <w:t>3.1</w:t>
+      </w:r>
+      <w:r>
+        <w:rPr>
+          <w:b/>
+          <w:bCs/>
+        </w:rPr>
+        <w:t>2</w:t>
+      </w:r>
+      <w:r>
+        <w:rPr>
+          <w:b/>
+          <w:bCs/>
+        </w:rPr>
+        <w:t>.11</w:t>
       </w:r>
       <w:r>
         <w:rPr>
@@ -8679,7 +9591,25 @@
           <w:sz w:val="28"/>
           <w:szCs w:val="28"/>
         </w:rPr>
-        <w:t xml:space="preserve">3.12 </w:t>
+        <w:t>3.1</w:t>
+      </w:r>
+      <w:r>
+        <w:rPr>
+          <w:b/>
+          <w:bCs/>
+          <w:sz w:val="28"/>
+          <w:szCs w:val="28"/>
+        </w:rPr>
+        <w:t>3</w:t>
+      </w:r>
+      <w:r>
+        <w:rPr>
+          <w:b/>
+          <w:bCs/>
+          <w:sz w:val="28"/>
+          <w:szCs w:val="28"/>
+        </w:rPr>
+        <w:t xml:space="preserve"> </w:t>
       </w:r>
       <w:r>
         <w:rPr>
@@ -8800,7 +9730,6 @@
         <w:spacing w:afterLines="24" w:after="57" w:line="288" w:lineRule="auto"/>
       </w:pPr>
       <w:r>
-        <w:lastRenderedPageBreak/>
         <w:t>Deze keuzes houden de implementatie beheersbaar en laten toe om de impact van de visualisatie</w:t>
       </w:r>
       <w:r>
@@ -8844,26 +9773,6 @@
           <w:sz w:val="28"/>
           <w:szCs w:val="28"/>
         </w:rPr>
-        <w:br w:type="page"/>
-      </w:r>
-    </w:p>
-    <w:p>
-      <w:pPr>
-        <w:rPr>
-          <w:b/>
-          <w:bCs/>
-          <w:sz w:val="28"/>
-          <w:szCs w:val="28"/>
-        </w:rPr>
-      </w:pPr>
-      <w:r>
-        <w:rPr>
-          <w:b/>
-          <w:bCs/>
-          <w:sz w:val="28"/>
-          <w:szCs w:val="28"/>
-        </w:rPr>
-        <w:lastRenderedPageBreak/>
         <w:br w:type="page"/>
       </w:r>
     </w:p>
@@ -9591,7 +10500,7 @@
                     <pic:cNvPicPr/>
                   </pic:nvPicPr>
                   <pic:blipFill>
-                    <a:blip r:embed="rId28">
+                    <a:blip r:embed="rId30">
                       <a:extLst>
                         <a:ext uri="{28A0092B-C50C-407E-A947-70E740481C1C}">
                           <a14:useLocalDpi xmlns:a14="http://schemas.microsoft.com/office/drawing/2010/main" val="0"/>
@@ -9655,7 +10564,7 @@
                     <pic:cNvPicPr/>
                   </pic:nvPicPr>
                   <pic:blipFill>
-                    <a:blip r:embed="rId29">
+                    <a:blip r:embed="rId31">
                       <a:extLst>
                         <a:ext uri="{28A0092B-C50C-407E-A947-70E740481C1C}">
                           <a14:useLocalDpi xmlns:a14="http://schemas.microsoft.com/office/drawing/2010/main" val="0"/>
@@ -9720,7 +10629,7 @@
                     <pic:cNvPicPr/>
                   </pic:nvPicPr>
                   <pic:blipFill>
-                    <a:blip r:embed="rId30" cstate="print">
+                    <a:blip r:embed="rId32" cstate="print">
                       <a:extLst>
                         <a:ext uri="{28A0092B-C50C-407E-A947-70E740481C1C}">
                           <a14:useLocalDpi xmlns:a14="http://schemas.microsoft.com/office/drawing/2010/main" val="0"/>
@@ -10624,7 +11533,7 @@
       <w:r>
         <w:t xml:space="preserve"> </w:t>
       </w:r>
-      <w:hyperlink r:id="rId31" w:history="1">
+      <w:hyperlink r:id="rId33" w:history="1">
         <w:r>
           <w:rPr>
             <w:rStyle w:val="Hyperlink"/>
@@ -11264,7 +12173,7 @@
                     <pic:cNvPicPr/>
                   </pic:nvPicPr>
                   <pic:blipFill>
-                    <a:blip r:embed="rId32" cstate="print">
+                    <a:blip r:embed="rId34" cstate="print">
                       <a:extLst>
                         <a:ext uri="{28A0092B-C50C-407E-A947-70E740481C1C}">
                           <a14:useLocalDpi xmlns:a14="http://schemas.microsoft.com/office/drawing/2010/main" val="0"/>
@@ -13341,7 +14250,7 @@
       <w:r>
         <w:t>(</w:t>
       </w:r>
-      <w:hyperlink r:id="rId33" w:history="1">
+      <w:hyperlink r:id="rId35" w:history="1">
         <w:r>
           <w:rPr>
             <w:rStyle w:val="Hyperlink"/>
@@ -13587,7 +14496,7 @@
       <w:r>
         <w:t>(</w:t>
       </w:r>
-      <w:hyperlink r:id="rId34" w:history="1">
+      <w:hyperlink r:id="rId36" w:history="1">
         <w:r>
           <w:rPr>
             <w:rStyle w:val="Hyperlink"/>
@@ -14920,7 +15829,7 @@
       </w:r>
     </w:p>
     <w:sectPr>
-      <w:footerReference w:type="default" r:id="rId35"/>
+      <w:footerReference w:type="default" r:id="rId37"/>
       <w:pgSz w:w="11906" w:h="16838"/>
       <w:pgMar w:top="1134" w:right="1418" w:bottom="1134" w:left="1418" w:header="709" w:footer="709" w:gutter="0"/>
       <w:cols w:space="708"/>

</xml_diff>

<commit_message>
rewritten 3.9 to fit the feedback
</commit_message>
<xml_diff>
--- a/Master_scriptie_tekst.docx
+++ b/Master_scriptie_tekst.docx
@@ -3582,7 +3582,13 @@
         <w:spacing w:afterLines="24" w:after="57" w:line="288" w:lineRule="auto"/>
       </w:pPr>
       <w:r>
-        <w:t xml:space="preserve">Er is bewust gekozen voor compacte iconen in plaats van louter tekstlabels, omdat symbolen en kleuren sneller visueel scanbaar zijn dan woorden en minder </w:t>
+        <w:t xml:space="preserve">Er is bewust gekozen voor compacte iconen in plaats van louter </w:t>
+      </w:r>
+      <w:r>
+        <w:t>tekst labels</w:t>
+      </w:r>
+      <w:r>
+        <w:t xml:space="preserve">, omdat symbolen en kleuren sneller visueel scanbaar zijn dan woorden en minder </w:t>
       </w:r>
       <w:r>
         <w:lastRenderedPageBreak/>
@@ -3590,7 +3596,13 @@
       </w:r>
       <w:r>
         <w:noBreakHyphen/>
-        <w:t>principes rond zichtbaarheid van de systeemstatus en herkenning boven herinnering: gebruikers kunnen de betekenis van een status op basis van vorm en kleur herkennen zonder steeds volledige labels te moeten lezen. Deze visuele codering maakt het makkelijker om tijdens een sessie snel te zien waar nog beslissingen of acties nodig zijn en ondersteunt collaboratieve communicatie binnen het team. Een nadeel van deze keuze is dat puur kleurgecodeerde iconen minder toegankelijk kunnen zijn voor kleurenblinde gebruikers; dit wordt deels opgevangen door consistente vormverschillen (schild versus checkschild) en door de mogelijkheid om de betekenis van een icoon via een tooltip op te vragen, maar toekomstige iteraties kunnen nog explicietere textuele labels of alternatieve patronen toevoegen om de toegankelijkheid verder te verbeteren.</w:t>
+        <w:t xml:space="preserve">principes rond zichtbaarheid van de systeemstatus en herkenning boven herinnering: gebruikers kunnen de betekenis van een status op basis van vorm en kleur herkennen zonder steeds volledige labels te moeten lezen. Deze visuele codering maakt het makkelijker om tijdens een sessie snel te zien waar nog beslissingen of acties nodig zijn en ondersteunt collaboratieve communicatie binnen het team. Een nadeel van deze keuze is dat puur </w:t>
+      </w:r>
+      <w:r>
+        <w:t>kleur gecodeerde</w:t>
+      </w:r>
+      <w:r>
+        <w:t xml:space="preserve"> iconen minder toegankelijk kunnen zijn voor kleurenblinde gebruikers; dit wordt deels opgevangen door consistente vormverschillen (schild versus checkschild) en door de mogelijkheid om de betekenis van een icoon via een tooltip op te vragen, maar toekomstige iteraties kunnen nog explicietere textuele labels of alternatieve patronen toevoegen om de toegankelijkheid verder te verbeteren.</w:t>
       </w:r>
       <w:r>
         <w:br/>
@@ -3858,7 +3870,19 @@
       </w:r>
       <w:r>
         <w:lastRenderedPageBreak/>
-        <w:t>zichtbaar te houden, in plaats van ze achter extra kliks te verbergen, wordt prioriteren en risicotriage sterk vereenvoudigd en hoeven gebruikers minder te onthouden. Tegelijk is gekozen om secundaire acties (zoals add, delete en collapse) pas bij hover te tonen, om visuele overbelasting te vermijden en de focus op de kerninformatie – status en gevaar – te leggen. De centrale berekening en hergebruik van dezelfde rating in zowel de boom als de filterlijsten zorgen voor consistentie in de interface en sluiten aan bij usability</w:t>
+        <w:t>zichtbaar te houden, in plaats van ze achter extra kliks te verbergen, wordt prioriteren en risicotriage sterk vereenvoudigd en hoeven gebruikers minder te onthouden. Tegelijk is gekozen om secundaire acties (zoals add, delete en collapse) pas bij hover te tonen, om visuele overbelasting te vermijden en de focus op de kerninformatie</w:t>
+      </w:r>
+      <w:r>
+        <w:t xml:space="preserve">, </w:t>
+      </w:r>
+      <w:r>
+        <w:t>status en gevaar</w:t>
+      </w:r>
+      <w:r>
+        <w:t xml:space="preserve">, </w:t>
+      </w:r>
+      <w:r>
+        <w:t>te leggen. De centrale berekening en hergebruik van dezelfde rating in zowel de boom als de filterlijsten zorgen voor consistentie in de interface en sluiten aan bij usability</w:t>
       </w:r>
       <w:r>
         <w:rPr>
@@ -3930,12 +3954,6 @@
     <w:p>
       <w:pPr>
         <w:spacing w:afterLines="24" w:after="57" w:line="288" w:lineRule="auto"/>
-        <w:rPr>
-          <w:b/>
-          <w:bCs/>
-          <w:sz w:val="28"/>
-          <w:szCs w:val="28"/>
-        </w:rPr>
       </w:pPr>
     </w:p>
     <w:p>
@@ -4001,57 +4019,79 @@
         <w:spacing w:afterLines="24" w:after="57" w:line="288" w:lineRule="auto"/>
       </w:pPr>
       <w:r>
-        <w:t>De branch summary en filterfunctionaliteit zijn geïmplementeerd als aparte zijpanelen en ondersteunende hulpfuncties, die de fileview-navigatie faciliteren door globale context en taakgerichte prioritering te bieden.</w:t>
-      </w:r>
-    </w:p>
-    <w:p>
-      <w:pPr>
-        <w:spacing w:afterLines="24" w:after="57" w:line="288" w:lineRule="auto"/>
-      </w:pPr>
-    </w:p>
-    <w:p>
-      <w:pPr>
-        <w:spacing w:afterLines="24" w:after="57" w:line="288" w:lineRule="auto"/>
-      </w:pPr>
-      <w:r>
-        <w:t xml:space="preserve">De branch summary reconstrueert het hiërarchische pad van de rootnode tot de geselecteerde node via parent-relaties. Hiertoe worden algoritmes zoals getImmediateParent en getParentsAbove aangewend om bovenliggende nodes recursief op te bouwen. Het resulterende pad wordt </w:t>
-      </w:r>
-      <w:r>
-        <w:t>samenvoegt</w:t>
-      </w:r>
-      <w:r>
-        <w:rPr>
-          <w:b/>
-          <w:bCs/>
-        </w:rPr>
+        <w:t>De branch</w:t>
+      </w:r>
+      <w:r>
+        <w:rPr>
+          <w:rFonts w:ascii="Cambria Math" w:hAnsi="Cambria Math" w:cs="Cambria Math"/>
+        </w:rPr>
+        <w:t>‑</w:t>
+      </w:r>
+      <w:r>
+        <w:t>samenvatting en filterfunctionaliteit zijn toegevoegd om twee terugkerende problemen bij het werken met grotere Fortunately</w:t>
+      </w:r>
+      <w:r>
+        <w:rPr>
+          <w:rFonts w:ascii="Aptos" w:hAnsi="Aptos" w:cs="Aptos"/>
+        </w:rPr>
+        <w:t>–</w:t>
+      </w:r>
+      <w:r>
+        <w:t>Unfortunately</w:t>
+      </w:r>
+      <w:r>
+        <w:rPr>
+          <w:rFonts w:ascii="Cambria Math" w:hAnsi="Cambria Math" w:cs="Cambria Math"/>
+        </w:rPr>
+        <w:t>‑</w:t>
+      </w:r>
+      <w:r>
+        <w:t>trees op te lossen: het verlies van overzicht over de volledige redeneringsketen en de moeilijkheid om snel naar de belangrijkste weaknesses te navigeren. In de basisversie moesten gebruikers hiervoor handmatig door de boom scrollen en zelf bijhouden welke paden relevant waren, wat tijdrovend en foutgevoelig is bij complexere modellen. De zijpanelen voor branch summary en filtering bieden daarom enerzijds globale context (waar bevind ik mij in de tree?) en anderzijds taakgerichte prioritering (welke nodes moet ik nu eerst bekijken?).</w:t>
+      </w:r>
+    </w:p>
+    <w:p>
+      <w:pPr>
+        <w:spacing w:afterLines="24" w:after="57" w:line="288" w:lineRule="auto"/>
+      </w:pPr>
+    </w:p>
+    <w:p>
+      <w:pPr>
+        <w:spacing w:afterLines="24" w:after="57" w:line="288" w:lineRule="auto"/>
+      </w:pPr>
+      <w:r>
+        <w:t>De branch</w:t>
+      </w:r>
+      <w:r>
+        <w:t xml:space="preserve"> summary</w:t>
+      </w:r>
+      <w:r>
+        <w:t xml:space="preserve"> reconstrueert het pad van de rootnode tot de geselecteerde node en toont dit als compacte lijst in een zijpaneel. Hierdoor kan een gebruiker tijdens een sessie snel zien welke fortunately</w:t>
+      </w:r>
+      <w:r>
+        <w:noBreakHyphen/>
+        <w:t xml:space="preserve"> en unfortunately</w:t>
+      </w:r>
+      <w:r>
+        <w:noBreakHyphen/>
+        <w:t>stappen aan een bepaalde beslissing voorafgaan, zonder telkens terug te moeten scrollen naar het begin van de tree. Dit ondersteunt typische taken zoals het voorbereiden van een samenvatting richting een teamlead of het controleren of een bepaalde mitigatie wel op de juiste plaats in de keten hangt. De samenvatting vult zo de fileview</w:t>
+      </w:r>
+      <w:r>
+        <w:noBreakHyphen/>
+        <w:t>representatie aan met een lineaire, leesbare weergave van de context, wat aansluit bij UX</w:t>
+      </w:r>
+      <w:r>
+        <w:noBreakHyphen/>
+        <w:t>principes rond oriëntatie en minimalisering van onnodige navigatiestappen.</w:t>
+      </w:r>
+      <w:r>
         <w:t xml:space="preserve"> </w:t>
       </w:r>
       <w:r>
-        <w:t xml:space="preserve">tot een compacte tekstuele </w:t>
-      </w:r>
-      <w:r>
-        <w:t>en</w:t>
-      </w:r>
-      <w:r>
-        <w:t xml:space="preserve"> visuele samenvatting, gepresenteerd in een </w:t>
-      </w:r>
-      <w:r>
-        <w:t>zijpaneel</w:t>
-      </w:r>
-      <w:r>
-        <w:t xml:space="preserve"> weergave die voor optimale leesbaarheid</w:t>
-      </w:r>
-      <w:r>
-        <w:t xml:space="preserve"> zorgt</w:t>
-      </w:r>
-      <w:r>
-        <w:t>.</w:t>
-      </w:r>
-      <w:r>
-        <w:t xml:space="preserve"> </w:t>
-      </w:r>
-      <w:r>
-        <w:t>Selectie van een gefilterde node triggert een state-update met de corresponderende node-ID, wat in de Node-component resulteert in visuele highlighting (bijv. border- of kleurverandering) en scrolling naar de relevante positie in de fileview.</w:t>
+        <w:t xml:space="preserve">Doordat deze context in een aparte maar gekoppelde visualisatie wordt aangeboden, kunnen gebruikers de volledige </w:t>
+      </w:r>
+      <w:r>
+        <w:lastRenderedPageBreak/>
+        <w:t>redeneringsketen los van de detailweergave bestuderen, wat het begrijpen en bespreken van de logica binnen een specifieke branch verder vergemakkelijkt.</w:t>
       </w:r>
     </w:p>
     <w:p>
@@ -4068,7 +4108,6 @@
         <w:rPr>
           <w:noProof/>
         </w:rPr>
-        <w:lastRenderedPageBreak/>
         <w:drawing>
           <wp:inline distT="0" distB="0" distL="0" distR="0" wp14:anchorId="440E2E1B" wp14:editId="7443895A">
             <wp:extent cx="3355211" cy="4831080"/>
@@ -4122,64 +4161,22 @@
         <w:spacing w:afterLines="24" w:after="57" w:line="288" w:lineRule="auto"/>
       </w:pPr>
       <w:r>
-        <w:t xml:space="preserve">De filterfunctionaliteit groepeert nodes op statuscategorie (bijv. </w:t>
-      </w:r>
-      <w:r>
-        <w:t xml:space="preserve">Weakness, Weakness Under Review, Assumption Under Review, Verified Assumption) met behulp van een </w:t>
-      </w:r>
-      <w:r>
-        <w:t>m</w:t>
-      </w:r>
-      <w:r>
-        <w:t xml:space="preserve">ap-structuur, waarbij </w:t>
-      </w:r>
-      <w:r>
-        <w:t>index in de map</w:t>
-      </w:r>
-      <w:r>
-        <w:t xml:space="preserve"> als sleutel fungeert. </w:t>
-      </w:r>
-      <w:r>
-        <w:t xml:space="preserve">Binnen weakness-categorieën vindt sortering plaats op danger rating (dalend), zodat kritieke items </w:t>
-      </w:r>
-      <w:r>
-        <w:t xml:space="preserve">vooraanstaand </w:t>
-      </w:r>
-      <w:r>
-        <w:t xml:space="preserve">worden gepositioneerd. </w:t>
-      </w:r>
-      <w:r>
-        <w:t xml:space="preserve">Ook in dit zijpaneel </w:t>
-      </w:r>
-      <w:r>
-        <w:t>resulteert</w:t>
-      </w:r>
-      <w:r>
-        <w:t xml:space="preserve"> een nodeklik</w:t>
-      </w:r>
-      <w:r>
-        <w:t xml:space="preserve"> in </w:t>
-      </w:r>
-      <w:r>
-        <w:t>een</w:t>
+        <w:t>De filterlogica is ontworpen om gebruikers direct naar de belangrijkste risico’s te leiden. Nodes worden gegroepeerd per statuscategorie (Weakness, Weakness Under Review, Assumption Under Review, Verified Assumption) en binnen elke groep op aflopende danger rating gesorteerd. Hierdoor verschijnen de meest kritieke weaknesses automatisch bovenaan en kan een analist met één klik naar de relevante plaats in de boom springen, waarbij de gekozen node visueel wordt gehighlight. Dit ontwerp sluit aan bij de doelstelling om threat modeling efficiënter te maken: in plaats van handmatig te zoeken, kunnen gebruikers systematisch “top</w:t>
+      </w:r>
+      <w:r>
+        <w:noBreakHyphen/>
+        <w:t>down” door hun werkvoorraad van openstaande risico’s en aannames gaan.</w:t>
       </w:r>
       <w:r>
         <w:t xml:space="preserve"> </w:t>
       </w:r>
       <w:r>
-        <w:t xml:space="preserve">visuele highlighting (bijv. border- of kleurverandering) en scrolling naar de relevante positie in de </w:t>
-      </w:r>
-      <w:r>
-        <w:t>boom</w:t>
-      </w:r>
-      <w:r>
-        <w:t>.</w:t>
-      </w:r>
-    </w:p>
-    <w:p>
-      <w:pPr>
-        <w:spacing w:afterLines="24" w:after="57" w:line="288" w:lineRule="auto"/>
-      </w:pPr>
+        <w:t>In ingeklapte toestand toont de filterbalk bovendien per statuscategorie een compacte schild</w:t>
+      </w:r>
+      <w:r>
+        <w:noBreakHyphen/>
+        <w:t>knop met het aantal bijhorende nodes, waardoor gebruikers in één oogopslag een overzicht hebben van de globale voortgang van het model zonder extra schermruimte in te nemen.</w:t>
+      </w:r>
     </w:p>
     <w:p>
       <w:pPr>
@@ -4190,6 +4187,7 @@
         <w:rPr>
           <w:noProof/>
         </w:rPr>
+        <w:lastRenderedPageBreak/>
         <w:drawing>
           <wp:inline distT="0" distB="0" distL="0" distR="0" wp14:anchorId="7C3A18CA" wp14:editId="0264EB89">
             <wp:extent cx="723900" cy="1465601"/>
@@ -4242,7 +4240,6 @@
         <w:rPr>
           <w:noProof/>
         </w:rPr>
-        <w:lastRenderedPageBreak/>
         <w:drawing>
           <wp:inline distT="0" distB="0" distL="0" distR="0" wp14:anchorId="06AFC8F0" wp14:editId="05558874">
             <wp:extent cx="4831898" cy="4267200"/>
@@ -4300,6 +4297,7 @@
         <w:rPr>
           <w:noProof/>
         </w:rPr>
+        <w:lastRenderedPageBreak/>
         <w:drawing>
           <wp:inline distT="0" distB="0" distL="0" distR="0" wp14:anchorId="41AE1910" wp14:editId="7E9A46DC">
             <wp:extent cx="4840522" cy="4137660"/>
@@ -4353,73 +4351,86 @@
         <w:spacing w:afterLines="24" w:after="57" w:line="288" w:lineRule="auto"/>
       </w:pPr>
       <w:r>
+        <w:t>Bij het ontwerp is ook overwogen om deze functies op een aparte pagina of in een modaal popup</w:t>
+      </w:r>
+      <w:r>
+        <w:noBreakHyphen/>
+        <w:t xml:space="preserve">venster onder te brengen. </w:t>
+      </w:r>
+      <w:r>
+        <w:t>Dit alternatief</w:t>
+      </w:r>
+      <w:r>
+        <w:t xml:space="preserve"> zou het zicht op de boom volledig of gedeeltelijk wegnemen en maakt het minder duidelijk naar welke exacte plaats in de structuur wordt genavigeerd wanneer een node geselecteerd wordt, waardoor de ruimtelijke oriëntatie van de gebruiker afneemt.</w:t>
+      </w:r>
+      <w:r>
+        <w:t xml:space="preserve"> </w:t>
+      </w:r>
+      <w:r>
+        <w:t>Dergelijke oplossing zou bovendien meer cognitieve schakelmomenten vereisen tussen lijst en boom, en minder direct aangeven welke items het meest urgent zijn. Door filtering en sortering te integreren in een zijpaneel dat direct naar nodes navigeert, wordt voldaan aan heuristieken rond zichtbaarheid van systeemstatus en herkenning boven herinnering: de tool toont expliciet welke weaknesses bestaan, welke nog “under review” zijn en welke veronderstellingen al geverifieerd zijn, zonder dat gebruikers dit zelf moeten onthouden. Een mogelijke beperking is dat het zijpaneel extra schermruimte inneemt en dat gebruikers de betekenis van de verschillende statussen moeten leren</w:t>
+      </w:r>
+      <w:r>
+        <w:t>.</w:t>
+      </w:r>
+      <w:r>
+        <w:t xml:space="preserve"> </w:t>
+      </w:r>
+      <w:r>
+        <w:t>D</w:t>
+      </w:r>
+      <w:r>
+        <w:t>it wordt deels opgevangen door consistente kleur</w:t>
+      </w:r>
+      <w:r>
+        <w:noBreakHyphen/>
+        <w:t xml:space="preserve"> en iconencodering en door het </w:t>
+      </w:r>
+      <w:r>
+        <w:t>fortunately/unfortunately</w:t>
+      </w:r>
+      <w:r>
+        <w:noBreakHyphen/>
+        <w:t>label op de nodes, maar verdere onboarding of een korte legend kan in toekomstig werk nog voorzien worden.</w:t>
+      </w:r>
+    </w:p>
+    <w:p>
+      <w:pPr>
+        <w:spacing w:afterLines="24" w:after="57" w:line="288" w:lineRule="auto"/>
+      </w:pPr>
+    </w:p>
+    <w:p>
+      <w:pPr>
+        <w:spacing w:afterLines="24" w:after="57" w:line="288" w:lineRule="auto"/>
+      </w:pPr>
+    </w:p>
+    <w:p>
+      <w:pPr>
+        <w:spacing w:afterLines="24" w:after="57" w:line="288" w:lineRule="auto"/>
+      </w:pPr>
+    </w:p>
+    <w:p>
+      <w:pPr>
+        <w:spacing w:afterLines="24" w:after="57" w:line="288" w:lineRule="auto"/>
+      </w:pPr>
+    </w:p>
+    <w:p>
+      <w:pPr>
+        <w:spacing w:afterLines="24" w:after="57" w:line="288" w:lineRule="auto"/>
+        <w:rPr>
+          <w:b/>
+          <w:bCs/>
+          <w:sz w:val="28"/>
+          <w:szCs w:val="28"/>
+        </w:rPr>
+      </w:pPr>
+      <w:r>
+        <w:rPr>
+          <w:b/>
+          <w:bCs/>
+          <w:sz w:val="28"/>
+          <w:szCs w:val="28"/>
+        </w:rPr>
         <w:lastRenderedPageBreak/>
-        <w:t>Deze implementatie verbindt de abstracte datastructuur (statussen, danger ratings, parent-relaties) naadloos met concrete interface-interacties, waardoor gebruikers zowel lokale detailanalyse als globale oriëntatie kunnen uitvoeren zonder significante contextverlies.</w:t>
-      </w:r>
-      <w:r>
-        <w:t xml:space="preserve"> </w:t>
-      </w:r>
-      <w:r>
-        <w:t>Naast de visuele kleurcodering van nodes wordt bovendien een letterlabel toegevoegd</w:t>
-      </w:r>
-      <w:r>
-        <w:t>,</w:t>
-      </w:r>
-      <w:r>
-        <w:t> </w:t>
-      </w:r>
-      <w:r>
-        <w:t>F</w:t>
-      </w:r>
-      <w:r>
-        <w:t> (Fortunately) of </w:t>
-      </w:r>
-      <w:r>
-        <w:t>U</w:t>
-      </w:r>
-      <w:r>
-        <w:t> (Unfortunately)</w:t>
-      </w:r>
-      <w:r>
-        <w:t xml:space="preserve">, </w:t>
-      </w:r>
-      <w:r>
-        <w:t>dat semantisch aangeeft of de node een positief dan wel negatief geëvalueerde uitkomst vertegenwoordigt. Dit bevordert snelle interpretatie, vooral bij dense weergaven of wanneer kleuronderscheid minder prominent is.</w:t>
-      </w:r>
-    </w:p>
-    <w:p>
-      <w:pPr>
-        <w:spacing w:afterLines="24" w:after="57" w:line="288" w:lineRule="auto"/>
-      </w:pPr>
-    </w:p>
-    <w:p>
-      <w:pPr>
-        <w:spacing w:afterLines="24" w:after="57" w:line="288" w:lineRule="auto"/>
-        <w:rPr>
-          <w:b/>
-          <w:bCs/>
-          <w:sz w:val="28"/>
-          <w:szCs w:val="28"/>
-        </w:rPr>
-      </w:pPr>
-    </w:p>
-    <w:p>
-      <w:pPr>
-        <w:spacing w:afterLines="24" w:after="57" w:line="288" w:lineRule="auto"/>
-        <w:rPr>
-          <w:b/>
-          <w:bCs/>
-          <w:sz w:val="28"/>
-          <w:szCs w:val="28"/>
-        </w:rPr>
-      </w:pPr>
-      <w:r>
-        <w:rPr>
-          <w:b/>
-          <w:bCs/>
-          <w:sz w:val="28"/>
-          <w:szCs w:val="28"/>
-        </w:rPr>
         <w:t>3.</w:t>
       </w:r>
       <w:r>
@@ -4625,7 +4636,6 @@
           <w:sz w:val="28"/>
           <w:szCs w:val="28"/>
         </w:rPr>
-        <w:lastRenderedPageBreak/>
         <w:t>3.</w:t>
       </w:r>
       <w:r>
@@ -4710,6 +4720,7 @@
         <w:rPr>
           <w:noProof/>
         </w:rPr>
+        <w:lastRenderedPageBreak/>
         <w:drawing>
           <wp:inline distT="0" distB="0" distL="0" distR="0" wp14:anchorId="22E8EBBC" wp14:editId="58704B30">
             <wp:extent cx="2248095" cy="1806097"/>
@@ -5271,7 +5282,6 @@
         <w:spacing w:afterLines="24" w:after="57" w:line="288" w:lineRule="auto"/>
       </w:pPr>
       <w:r>
-        <w:lastRenderedPageBreak/>
         <w:br/>
         <w:t>De implementatie voorziet diverse mechanismen die de gebruiker controle geven over het modelleerproces. Via “Reset Tree” kan op elk moment naar een lege beginsituatie worden teruggekeerd</w:t>
       </w:r>
@@ -5521,7 +5531,11 @@
         <w:spacing w:afterLines="24" w:after="57" w:line="288" w:lineRule="auto"/>
       </w:pPr>
       <w:r>
-        <w:t>De interface is zo ontworpen dat relevante acties en informatie zichtbaar worden aangeboden in plaats van uit het geheugen te moeten worden opgeroepen. Contextuele knoppen rond elke knoop (iconselector, expand/collapse, delete, add child) verschijnen bij hover, zodat gebruikers zien welke handelingen mogelijk zijn zonder menu’s of commando’s te onthouden. De IconSelectorButton toont bij hover een korte tekstuele uitleg (“Weakness”, “Assumption Under Review”, “Verified assumption”, enz.), waardoor de betekenis van de iconen direct herkenbaar is. De SearchBar laat gebruikers zoeken op knoopnaam</w:t>
+        <w:t xml:space="preserve">De interface is zo ontworpen dat relevante acties en informatie zichtbaar worden aangeboden in plaats van uit het geheugen te moeten worden opgeroepen. Contextuele knoppen rond elke knoop (iconselector, expand/collapse, delete, add child) verschijnen bij hover, zodat gebruikers zien welke handelingen mogelijk zijn zonder menu’s of commando’s te onthouden. De IconSelectorButton toont bij hover een korte tekstuele uitleg (“Weakness”, “Assumption Under Review”, “Verified assumption”, enz.), waardoor de betekenis van de iconen direct herkenbaar is. De SearchBar laat gebruikers zoeken </w:t>
+      </w:r>
+      <w:r>
+        <w:lastRenderedPageBreak/>
+        <w:t>op knoopnaam</w:t>
       </w:r>
       <w:r>
         <w:t>.</w:t>

</xml_diff>

<commit_message>
hfst 6 and 7 rewritten
</commit_message>
<xml_diff>
--- a/Master_scriptie_tekst.docx
+++ b/Master_scriptie_tekst.docx
@@ -11614,6 +11614,15 @@
         <w:rPr>
           <w:b/>
           <w:bCs/>
+        </w:rPr>
+      </w:pPr>
+    </w:p>
+    <w:p>
+      <w:pPr>
+        <w:spacing w:afterLines="24" w:after="57" w:line="288" w:lineRule="auto"/>
+        <w:rPr>
+          <w:b/>
+          <w:bCs/>
           <w:sz w:val="28"/>
           <w:szCs w:val="28"/>
         </w:rPr>
@@ -11831,7 +11840,11 @@
         <w:spacing w:afterLines="24" w:after="57" w:line="288" w:lineRule="auto"/>
       </w:pPr>
       <w:r>
-        <w:t>In dit onderdeel werden een reeks open vragen en een rangschikkingsopdracht gebruikt om dieper inzicht te verkrijgen in de ervaren meerwaarde van de nieuwe functionaliteiten ten opzichte van de basissoftware. De vragen richtten zich op zowel de begrijpelijkheid van de gehanteerde methode (de “</w:t>
+        <w:t xml:space="preserve">In dit onderdeel werden een reeks open vragen en een rangschikkingsopdracht gebruikt om dieper inzicht te verkrijgen in de ervaren meerwaarde van de nieuwe functionaliteiten ten opzichte van de basissoftware. De vragen richtten zich op zowel de </w:t>
+      </w:r>
+      <w:r>
+        <w:lastRenderedPageBreak/>
+        <w:t>begrijpelijkheid van de gehanteerde methode (de “</w:t>
       </w:r>
       <w:proofErr w:type="spellStart"/>
       <w:r>
@@ -11855,7 +11868,6 @@
         <w:spacing w:afterLines="24" w:after="57" w:line="288" w:lineRule="auto"/>
       </w:pPr>
       <w:r>
-        <w:lastRenderedPageBreak/>
         <w:t>De deelnemers werd eerst gevraagd of de gebruikte methode duidelijk was, om zo de basis van de evaluatie te controleren. Vervolgens moesten zij de nieuwe features rangschikken van meest nuttig (1) tot minst nuttig (8). Wanneer een feature niet was opgemerkt, konden zij dit aanduiden met een score van –1. Hierdoor kon een onderscheid gemaakt worden tussen functies die effectief gebruikt werden en functies die minder opvielen tijdens de takenuitvoering.</w:t>
       </w:r>
     </w:p>
@@ -13524,7 +13536,7 @@
           <w:lang w:eastAsia="nl-BE"/>
           <w14:ligatures w14:val="none"/>
         </w:rPr>
-        <w:t>7</w:t>
+        <w:t>6</w:t>
       </w:r>
       <w:r>
         <w:rPr>
@@ -13568,604 +13580,6 @@
       <w:pPr>
         <w:spacing w:afterLines="24" w:after="57" w:line="288" w:lineRule="auto"/>
         <w:rPr>
-          <w:b/>
-          <w:bCs/>
-        </w:rPr>
-      </w:pPr>
-      <w:r>
-        <w:rPr>
-          <w:rFonts w:eastAsia="Times New Roman" w:cs="Times New Roman"/>
-          <w:kern w:val="0"/>
-          <w:lang w:eastAsia="nl-BE"/>
-          <w14:ligatures w14:val="none"/>
-        </w:rPr>
-        <w:t xml:space="preserve">De resultaten valideren en verfijnen inzichten uit recente literatuur over security visualisatie en </w:t>
-      </w:r>
-      <w:proofErr w:type="spellStart"/>
-      <w:r>
-        <w:rPr>
-          <w:rFonts w:eastAsia="Times New Roman" w:cs="Times New Roman"/>
-          <w:kern w:val="0"/>
-          <w:lang w:eastAsia="nl-BE"/>
-          <w14:ligatures w14:val="none"/>
-        </w:rPr>
-        <w:t>threat</w:t>
-      </w:r>
-      <w:proofErr w:type="spellEnd"/>
-      <w:r>
-        <w:rPr>
-          <w:rFonts w:eastAsia="Times New Roman" w:cs="Times New Roman"/>
-          <w:kern w:val="0"/>
-          <w:lang w:eastAsia="nl-BE"/>
-          <w14:ligatures w14:val="none"/>
-        </w:rPr>
-        <w:t xml:space="preserve"> </w:t>
-      </w:r>
-      <w:proofErr w:type="spellStart"/>
-      <w:r>
-        <w:rPr>
-          <w:rFonts w:eastAsia="Times New Roman" w:cs="Times New Roman"/>
-          <w:kern w:val="0"/>
-          <w:lang w:eastAsia="nl-BE"/>
-          <w14:ligatures w14:val="none"/>
-        </w:rPr>
-        <w:t>modeling</w:t>
-      </w:r>
-      <w:proofErr w:type="spellEnd"/>
-      <w:r>
-        <w:rPr>
-          <w:rFonts w:eastAsia="Times New Roman" w:cs="Times New Roman"/>
-          <w:kern w:val="0"/>
-          <w:lang w:eastAsia="nl-BE"/>
-          <w14:ligatures w14:val="none"/>
-        </w:rPr>
-        <w:t xml:space="preserve"> tools. </w:t>
-      </w:r>
-      <w:proofErr w:type="spellStart"/>
-      <w:r>
-        <w:rPr>
-          <w:rFonts w:eastAsia="Times New Roman" w:cs="Times New Roman"/>
-          <w:kern w:val="0"/>
-          <w:lang w:eastAsia="nl-BE"/>
-          <w14:ligatures w14:val="none"/>
-        </w:rPr>
-        <w:t>Devendra</w:t>
-      </w:r>
-      <w:proofErr w:type="spellEnd"/>
-      <w:r>
-        <w:rPr>
-          <w:rFonts w:eastAsia="Times New Roman" w:cs="Times New Roman"/>
-          <w:kern w:val="0"/>
-          <w:lang w:eastAsia="nl-BE"/>
-          <w14:ligatures w14:val="none"/>
-        </w:rPr>
-        <w:t xml:space="preserve"> et al. (2025) identificeren </w:t>
-      </w:r>
-      <w:proofErr w:type="spellStart"/>
-      <w:r>
-        <w:rPr>
-          <w:rFonts w:eastAsia="Times New Roman" w:cs="Times New Roman"/>
-          <w:kern w:val="0"/>
-          <w:lang w:eastAsia="nl-BE"/>
-          <w14:ligatures w14:val="none"/>
-        </w:rPr>
-        <w:t>graph-based</w:t>
-      </w:r>
-      <w:proofErr w:type="spellEnd"/>
-      <w:r>
-        <w:rPr>
-          <w:rFonts w:eastAsia="Times New Roman" w:cs="Times New Roman"/>
-          <w:kern w:val="0"/>
-          <w:lang w:eastAsia="nl-BE"/>
-          <w14:ligatures w14:val="none"/>
-        </w:rPr>
-        <w:t xml:space="preserve"> en </w:t>
-      </w:r>
-      <w:proofErr w:type="spellStart"/>
-      <w:r>
-        <w:rPr>
-          <w:rFonts w:eastAsia="Times New Roman" w:cs="Times New Roman"/>
-          <w:kern w:val="0"/>
-          <w:lang w:eastAsia="nl-BE"/>
-          <w14:ligatures w14:val="none"/>
-        </w:rPr>
-        <w:t>notation-based</w:t>
-      </w:r>
-      <w:proofErr w:type="spellEnd"/>
-      <w:r>
-        <w:rPr>
-          <w:rFonts w:eastAsia="Times New Roman" w:cs="Times New Roman"/>
-          <w:kern w:val="0"/>
-          <w:lang w:eastAsia="nl-BE"/>
-          <w14:ligatures w14:val="none"/>
-        </w:rPr>
-        <w:t xml:space="preserve"> visualisaties als dominante technieken, maar signaleren een gebrek aan toegankelijkheid voor non-experts en schaalbaarheid bij </w:t>
-      </w:r>
-      <w:proofErr w:type="spellStart"/>
-      <w:r>
-        <w:rPr>
-          <w:rFonts w:eastAsia="Times New Roman" w:cs="Times New Roman"/>
-          <w:kern w:val="0"/>
-          <w:lang w:eastAsia="nl-BE"/>
-          <w14:ligatures w14:val="none"/>
-        </w:rPr>
-        <w:t>hirarchische</w:t>
-      </w:r>
-      <w:proofErr w:type="spellEnd"/>
-      <w:r>
-        <w:rPr>
-          <w:rFonts w:eastAsia="Times New Roman" w:cs="Times New Roman"/>
-          <w:kern w:val="0"/>
-          <w:lang w:eastAsia="nl-BE"/>
-          <w14:ligatures w14:val="none"/>
-        </w:rPr>
-        <w:t xml:space="preserve"> data. De fileview-geïnspireerde boomstructuur met filtering en </w:t>
-      </w:r>
-      <w:proofErr w:type="spellStart"/>
-      <w:r>
-        <w:rPr>
-          <w:rFonts w:eastAsia="Times New Roman" w:cs="Times New Roman"/>
-          <w:kern w:val="0"/>
-          <w:lang w:eastAsia="nl-BE"/>
-          <w14:ligatures w14:val="none"/>
-        </w:rPr>
-        <w:t>danger</w:t>
-      </w:r>
-      <w:proofErr w:type="spellEnd"/>
-      <w:r>
-        <w:rPr>
-          <w:rFonts w:eastAsia="Times New Roman" w:cs="Times New Roman"/>
-          <w:kern w:val="0"/>
-          <w:lang w:eastAsia="nl-BE"/>
-          <w14:ligatures w14:val="none"/>
-        </w:rPr>
-        <w:t xml:space="preserve"> rating sortering adresseert deze </w:t>
-      </w:r>
-      <w:proofErr w:type="spellStart"/>
-      <w:r>
-        <w:rPr>
-          <w:rFonts w:eastAsia="Times New Roman" w:cs="Times New Roman"/>
-          <w:kern w:val="0"/>
-          <w:lang w:eastAsia="nl-BE"/>
-          <w14:ligatures w14:val="none"/>
-        </w:rPr>
-        <w:t>gaps</w:t>
-      </w:r>
-      <w:proofErr w:type="spellEnd"/>
-      <w:r>
-        <w:rPr>
-          <w:rFonts w:eastAsia="Times New Roman" w:cs="Times New Roman"/>
-          <w:kern w:val="0"/>
-          <w:lang w:eastAsia="nl-BE"/>
-          <w14:ligatures w14:val="none"/>
-        </w:rPr>
-        <w:t xml:space="preserve"> direct: versie 2 toont significante UEQ-verbeteringen op efficiëntie (+1.7) en stimulatie (+2.1), wat aantoont dat </w:t>
-      </w:r>
-      <w:proofErr w:type="spellStart"/>
-      <w:r>
-        <w:rPr>
-          <w:rFonts w:eastAsia="Times New Roman" w:cs="Times New Roman"/>
-          <w:kern w:val="0"/>
-          <w:lang w:eastAsia="nl-BE"/>
-          <w14:ligatures w14:val="none"/>
-        </w:rPr>
-        <w:t>domeinspecifieke</w:t>
-      </w:r>
-      <w:proofErr w:type="spellEnd"/>
-      <w:r>
-        <w:rPr>
-          <w:rFonts w:eastAsia="Times New Roman" w:cs="Times New Roman"/>
-          <w:kern w:val="0"/>
-          <w:lang w:eastAsia="nl-BE"/>
-          <w14:ligatures w14:val="none"/>
-        </w:rPr>
-        <w:t xml:space="preserve"> UX-features cognitieve load reduceren bij </w:t>
-      </w:r>
-      <w:proofErr w:type="spellStart"/>
-      <w:r>
-        <w:rPr>
-          <w:rFonts w:eastAsia="Times New Roman" w:cs="Times New Roman"/>
-          <w:kern w:val="0"/>
-          <w:lang w:eastAsia="nl-BE"/>
-          <w14:ligatures w14:val="none"/>
-        </w:rPr>
-        <w:t>threat</w:t>
-      </w:r>
-      <w:proofErr w:type="spellEnd"/>
-      <w:r>
-        <w:rPr>
-          <w:rFonts w:eastAsia="Times New Roman" w:cs="Times New Roman"/>
-          <w:kern w:val="0"/>
-          <w:lang w:eastAsia="nl-BE"/>
-          <w14:ligatures w14:val="none"/>
-        </w:rPr>
-        <w:t xml:space="preserve"> modeling.</w:t>
-      </w:r>
-      <w:r>
-        <w:rPr>
-          <w:rFonts w:eastAsia="Times New Roman" w:cs="Times New Roman"/>
-          <w:kern w:val="0"/>
-          <w:lang w:eastAsia="nl-BE"/>
-          <w14:ligatures w14:val="none"/>
-        </w:rPr>
-        <w:t xml:space="preserve"> </w:t>
-      </w:r>
-      <w:r>
-        <w:t>(</w:t>
-      </w:r>
-      <w:hyperlink r:id="rId35" w:history="1">
-        <w:r>
-          <w:rPr>
-            <w:rStyle w:val="Hyperlink"/>
-          </w:rPr>
-          <w:t>https://arxiv.org/html/2509.20385v1</w:t>
-        </w:r>
-      </w:hyperlink>
-      <w:r>
-        <w:t>)</w:t>
-      </w:r>
-    </w:p>
-    <w:p>
-      <w:pPr>
-        <w:spacing w:afterLines="24" w:after="57" w:line="288" w:lineRule="auto"/>
-        <w:rPr>
-          <w:b/>
-          <w:bCs/>
-        </w:rPr>
-      </w:pPr>
-    </w:p>
-    <w:p>
-      <w:pPr>
-        <w:spacing w:afterLines="24" w:after="57" w:line="288" w:lineRule="auto"/>
-      </w:pPr>
-      <w:proofErr w:type="spellStart"/>
-      <w:r>
-        <w:rPr>
-          <w:rFonts w:eastAsia="Times New Roman" w:cs="Times New Roman"/>
-          <w:kern w:val="0"/>
-          <w:lang w:eastAsia="nl-BE"/>
-          <w14:ligatures w14:val="none"/>
-        </w:rPr>
-        <w:t>Shi</w:t>
-      </w:r>
-      <w:proofErr w:type="spellEnd"/>
-      <w:r>
-        <w:rPr>
-          <w:rFonts w:eastAsia="Times New Roman" w:cs="Times New Roman"/>
-          <w:kern w:val="0"/>
-          <w:lang w:eastAsia="nl-BE"/>
-          <w14:ligatures w14:val="none"/>
-        </w:rPr>
-        <w:t xml:space="preserve"> et al. (2022) classificeren diagram-gebaseerde tools zoals Microsoft TMT en OWASP </w:t>
-      </w:r>
-      <w:proofErr w:type="spellStart"/>
-      <w:r>
-        <w:rPr>
-          <w:rFonts w:eastAsia="Times New Roman" w:cs="Times New Roman"/>
-          <w:kern w:val="0"/>
-          <w:lang w:eastAsia="nl-BE"/>
-          <w14:ligatures w14:val="none"/>
-        </w:rPr>
-        <w:t>Threat</w:t>
-      </w:r>
-      <w:proofErr w:type="spellEnd"/>
-      <w:r>
-        <w:rPr>
-          <w:rFonts w:eastAsia="Times New Roman" w:cs="Times New Roman"/>
-          <w:kern w:val="0"/>
-          <w:lang w:eastAsia="nl-BE"/>
-          <w14:ligatures w14:val="none"/>
-        </w:rPr>
-        <w:t xml:space="preserve"> Dragon als intuïtief maar beperkt in </w:t>
-      </w:r>
-      <w:proofErr w:type="spellStart"/>
-      <w:r>
-        <w:rPr>
-          <w:rFonts w:eastAsia="Times New Roman" w:cs="Times New Roman"/>
-          <w:kern w:val="0"/>
-          <w:lang w:eastAsia="nl-BE"/>
-          <w14:ligatures w14:val="none"/>
-        </w:rPr>
-        <w:t>threat</w:t>
-      </w:r>
-      <w:proofErr w:type="spellEnd"/>
-      <w:r>
-        <w:rPr>
-          <w:rFonts w:eastAsia="Times New Roman" w:cs="Times New Roman"/>
-          <w:kern w:val="0"/>
-          <w:lang w:eastAsia="nl-BE"/>
-          <w14:ligatures w14:val="none"/>
-        </w:rPr>
-        <w:t xml:space="preserve"> tracking. De geïmplementeerde </w:t>
-      </w:r>
-      <w:proofErr w:type="spellStart"/>
-      <w:r>
-        <w:rPr>
-          <w:rFonts w:eastAsia="Times New Roman" w:cs="Times New Roman"/>
-          <w:kern w:val="0"/>
-          <w:lang w:eastAsia="nl-BE"/>
-          <w14:ligatures w14:val="none"/>
-        </w:rPr>
-        <w:t>webtool</w:t>
-      </w:r>
-      <w:proofErr w:type="spellEnd"/>
-      <w:r>
-        <w:rPr>
-          <w:rFonts w:eastAsia="Times New Roman" w:cs="Times New Roman"/>
-          <w:kern w:val="0"/>
-          <w:lang w:eastAsia="nl-BE"/>
-          <w14:ligatures w14:val="none"/>
-        </w:rPr>
-        <w:t xml:space="preserve"> overtreft deze door statusiconen (</w:t>
-      </w:r>
-      <w:proofErr w:type="spellStart"/>
-      <w:r>
-        <w:rPr>
-          <w:rFonts w:eastAsia="Times New Roman" w:cs="Times New Roman"/>
-          <w:kern w:val="0"/>
-          <w:lang w:eastAsia="nl-BE"/>
-          <w14:ligatures w14:val="none"/>
-        </w:rPr>
-        <w:t>Weakness</w:t>
-      </w:r>
-      <w:proofErr w:type="spellEnd"/>
-      <w:r>
-        <w:rPr>
-          <w:rFonts w:eastAsia="Times New Roman" w:cs="Times New Roman"/>
-          <w:kern w:val="0"/>
-          <w:lang w:eastAsia="nl-BE"/>
-          <w14:ligatures w14:val="none"/>
-        </w:rPr>
-        <w:t xml:space="preserve">, </w:t>
-      </w:r>
-      <w:proofErr w:type="spellStart"/>
-      <w:r>
-        <w:rPr>
-          <w:rFonts w:eastAsia="Times New Roman" w:cs="Times New Roman"/>
-          <w:kern w:val="0"/>
-          <w:lang w:eastAsia="nl-BE"/>
-          <w14:ligatures w14:val="none"/>
-        </w:rPr>
-        <w:t>Weakness</w:t>
-      </w:r>
-      <w:proofErr w:type="spellEnd"/>
-      <w:r>
-        <w:rPr>
-          <w:rFonts w:eastAsia="Times New Roman" w:cs="Times New Roman"/>
-          <w:kern w:val="0"/>
-          <w:lang w:eastAsia="nl-BE"/>
-          <w14:ligatures w14:val="none"/>
-        </w:rPr>
-        <w:t xml:space="preserve"> Under Review, </w:t>
-      </w:r>
-      <w:proofErr w:type="spellStart"/>
-      <w:r>
-        <w:rPr>
-          <w:rFonts w:eastAsia="Times New Roman" w:cs="Times New Roman"/>
-          <w:kern w:val="0"/>
-          <w:lang w:eastAsia="nl-BE"/>
-          <w14:ligatures w14:val="none"/>
-        </w:rPr>
-        <w:t>Assumption</w:t>
-      </w:r>
-      <w:proofErr w:type="spellEnd"/>
-      <w:r>
-        <w:rPr>
-          <w:rFonts w:eastAsia="Times New Roman" w:cs="Times New Roman"/>
-          <w:kern w:val="0"/>
-          <w:lang w:eastAsia="nl-BE"/>
-          <w14:ligatures w14:val="none"/>
-        </w:rPr>
-        <w:t xml:space="preserve"> Under Review</w:t>
-      </w:r>
-      <w:r>
-        <w:rPr>
-          <w:rFonts w:eastAsia="Times New Roman" w:cs="Times New Roman"/>
-          <w:kern w:val="0"/>
-          <w:lang w:eastAsia="nl-BE"/>
-          <w14:ligatures w14:val="none"/>
-        </w:rPr>
-        <w:t xml:space="preserve">, </w:t>
-      </w:r>
-      <w:proofErr w:type="spellStart"/>
-      <w:r>
-        <w:rPr>
-          <w:rFonts w:eastAsia="Times New Roman" w:cs="Times New Roman"/>
-          <w:kern w:val="0"/>
-          <w:lang w:eastAsia="nl-BE"/>
-          <w14:ligatures w14:val="none"/>
-        </w:rPr>
-        <w:t>Verified</w:t>
-      </w:r>
-      <w:proofErr w:type="spellEnd"/>
-      <w:r>
-        <w:rPr>
-          <w:rFonts w:eastAsia="Times New Roman" w:cs="Times New Roman"/>
-          <w:kern w:val="0"/>
-          <w:lang w:eastAsia="nl-BE"/>
-          <w14:ligatures w14:val="none"/>
-        </w:rPr>
-        <w:t xml:space="preserve"> </w:t>
-      </w:r>
-      <w:proofErr w:type="spellStart"/>
-      <w:r>
-        <w:rPr>
-          <w:rFonts w:eastAsia="Times New Roman" w:cs="Times New Roman"/>
-          <w:kern w:val="0"/>
-          <w:lang w:eastAsia="nl-BE"/>
-          <w14:ligatures w14:val="none"/>
-        </w:rPr>
-        <w:t>Assumption</w:t>
-      </w:r>
-      <w:proofErr w:type="spellEnd"/>
-      <w:r>
-        <w:rPr>
-          <w:rFonts w:eastAsia="Times New Roman" w:cs="Times New Roman"/>
-          <w:kern w:val="0"/>
-          <w:lang w:eastAsia="nl-BE"/>
-          <w14:ligatures w14:val="none"/>
-        </w:rPr>
-        <w:t>) en automatische evaluatie (</w:t>
-      </w:r>
-      <w:proofErr w:type="spellStart"/>
-      <w:r>
-        <w:rPr>
-          <w:rFonts w:eastAsia="Times New Roman" w:cs="Times New Roman"/>
-          <w:kern w:val="0"/>
-          <w:lang w:eastAsia="nl-BE"/>
-          <w14:ligatures w14:val="none"/>
-        </w:rPr>
-        <w:t>danger</w:t>
-      </w:r>
-      <w:proofErr w:type="spellEnd"/>
-      <w:r>
-        <w:rPr>
-          <w:rFonts w:eastAsia="Times New Roman" w:cs="Times New Roman"/>
-          <w:kern w:val="0"/>
-          <w:lang w:eastAsia="nl-BE"/>
-          <w14:ligatures w14:val="none"/>
-        </w:rPr>
-        <w:t xml:space="preserve"> ratings), wat verklaart waarom filtering consequent als meest nuttig werd gerangschikt (meerdere rang 1-scores).</w:t>
-      </w:r>
-      <w:r>
-        <w:rPr>
-          <w:rFonts w:eastAsia="Times New Roman" w:cs="Times New Roman"/>
-          <w:kern w:val="0"/>
-          <w:lang w:eastAsia="nl-BE"/>
-          <w14:ligatures w14:val="none"/>
-        </w:rPr>
-        <w:t xml:space="preserve"> </w:t>
-      </w:r>
-      <w:r>
-        <w:t>(</w:t>
-      </w:r>
-      <w:hyperlink r:id="rId36" w:history="1">
-        <w:r>
-          <w:rPr>
-            <w:rStyle w:val="Hyperlink"/>
-          </w:rPr>
-          <w:t>https://www.semanticscholar.org/paper/Threat-Modeling-Tools:-A-Taxonomy-Shi-Graffi/62caab5d4cfe006ec9cf1536212aa32e02d61c04</w:t>
-        </w:r>
-      </w:hyperlink>
-      <w:r>
-        <w:t>)</w:t>
-      </w:r>
-    </w:p>
-    <w:p>
-      <w:pPr>
-        <w:spacing w:afterLines="24" w:after="57" w:line="288" w:lineRule="auto"/>
-        <w:rPr>
-          <w:rFonts w:eastAsia="Times New Roman" w:cs="Times New Roman"/>
-          <w:kern w:val="0"/>
-          <w:lang w:eastAsia="nl-BE"/>
-          <w14:ligatures w14:val="none"/>
-        </w:rPr>
-      </w:pPr>
-    </w:p>
-    <w:p>
-      <w:pPr>
-        <w:spacing w:afterLines="24" w:after="57" w:line="288" w:lineRule="auto"/>
-        <w:rPr>
-          <w:rFonts w:eastAsia="Times New Roman" w:cs="Times New Roman"/>
-          <w:kern w:val="0"/>
-          <w:lang w:eastAsia="nl-BE"/>
-          <w14:ligatures w14:val="none"/>
-        </w:rPr>
-      </w:pPr>
-      <w:r>
-        <w:rPr>
-          <w:rFonts w:eastAsia="Times New Roman" w:cs="Times New Roman"/>
-          <w:kern w:val="0"/>
-          <w:lang w:eastAsia="nl-BE"/>
-          <w14:ligatures w14:val="none"/>
-        </w:rPr>
-        <w:t xml:space="preserve">De sprong in ervaring-gerelateerde UEQ-scores (stimulatie, originaliteit) onderstreept </w:t>
-      </w:r>
-      <w:proofErr w:type="spellStart"/>
-      <w:r>
-        <w:rPr>
-          <w:rFonts w:eastAsia="Times New Roman" w:cs="Times New Roman"/>
-          <w:kern w:val="0"/>
-          <w:lang w:eastAsia="nl-BE"/>
-          <w14:ligatures w14:val="none"/>
-        </w:rPr>
-        <w:t>Devendra's</w:t>
-      </w:r>
-      <w:proofErr w:type="spellEnd"/>
-      <w:r>
-        <w:rPr>
-          <w:rFonts w:eastAsia="Times New Roman" w:cs="Times New Roman"/>
-          <w:kern w:val="0"/>
-          <w:lang w:eastAsia="nl-BE"/>
-          <w14:ligatures w14:val="none"/>
-        </w:rPr>
-        <w:t xml:space="preserve"> oproep voor user-</w:t>
-      </w:r>
-      <w:proofErr w:type="spellStart"/>
-      <w:r>
-        <w:rPr>
-          <w:rFonts w:eastAsia="Times New Roman" w:cs="Times New Roman"/>
-          <w:kern w:val="0"/>
-          <w:lang w:eastAsia="nl-BE"/>
-          <w14:ligatures w14:val="none"/>
-        </w:rPr>
-        <w:t>centric</w:t>
-      </w:r>
-      <w:proofErr w:type="spellEnd"/>
-      <w:r>
-        <w:rPr>
-          <w:rFonts w:eastAsia="Times New Roman" w:cs="Times New Roman"/>
-          <w:kern w:val="0"/>
-          <w:lang w:eastAsia="nl-BE"/>
-          <w14:ligatures w14:val="none"/>
-        </w:rPr>
-        <w:t xml:space="preserve"> design in security visualisatie, terwijl de voorkeur voor pragmatische features (filtering &gt; tooltips) Nielsens heuristieken voor flexibiliteit en herkenning bevestigt als cruciaal voor </w:t>
-      </w:r>
-      <w:proofErr w:type="spellStart"/>
-      <w:r>
-        <w:rPr>
-          <w:rFonts w:eastAsia="Times New Roman" w:cs="Times New Roman"/>
-          <w:kern w:val="0"/>
-          <w:lang w:eastAsia="nl-BE"/>
-          <w14:ligatures w14:val="none"/>
-        </w:rPr>
-        <w:t>threat</w:t>
-      </w:r>
-      <w:proofErr w:type="spellEnd"/>
-      <w:r>
-        <w:rPr>
-          <w:rFonts w:eastAsia="Times New Roman" w:cs="Times New Roman"/>
-          <w:kern w:val="0"/>
-          <w:lang w:eastAsia="nl-BE"/>
-          <w14:ligatures w14:val="none"/>
-        </w:rPr>
-        <w:t xml:space="preserve"> </w:t>
-      </w:r>
-      <w:proofErr w:type="spellStart"/>
-      <w:r>
-        <w:rPr>
-          <w:rFonts w:eastAsia="Times New Roman" w:cs="Times New Roman"/>
-          <w:kern w:val="0"/>
-          <w:lang w:eastAsia="nl-BE"/>
-          <w14:ligatures w14:val="none"/>
-        </w:rPr>
-        <w:t>modeling</w:t>
-      </w:r>
-      <w:proofErr w:type="spellEnd"/>
-      <w:r>
-        <w:rPr>
-          <w:rFonts w:eastAsia="Times New Roman" w:cs="Times New Roman"/>
-          <w:kern w:val="0"/>
-          <w:lang w:eastAsia="nl-BE"/>
-          <w14:ligatures w14:val="none"/>
-        </w:rPr>
-        <w:t xml:space="preserve"> adoptie.</w:t>
-      </w:r>
-    </w:p>
-    <w:p>
-      <w:pPr>
-        <w:spacing w:afterLines="24" w:after="57" w:line="288" w:lineRule="auto"/>
-        <w:rPr>
           <w:rFonts w:eastAsia="Times New Roman" w:cs="Times New Roman"/>
           <w:b/>
           <w:bCs/>
@@ -14217,7 +13631,7 @@
           <w:lang w:eastAsia="nl-BE"/>
           <w14:ligatures w14:val="none"/>
         </w:rPr>
-        <w:t>7</w:t>
+        <w:t>6</w:t>
       </w:r>
       <w:r>
         <w:rPr>
@@ -14251,6 +13665,306 @@
         <w:spacing w:afterLines="24" w:after="57" w:line="288" w:lineRule="auto"/>
         <w:rPr>
           <w:rFonts w:eastAsia="Times New Roman" w:cs="Times New Roman"/>
+          <w:kern w:val="0"/>
+          <w:lang w:eastAsia="nl-BE"/>
+          <w14:ligatures w14:val="none"/>
+        </w:rPr>
+      </w:pPr>
+    </w:p>
+    <w:p>
+      <w:pPr>
+        <w:spacing w:afterLines="24" w:after="57" w:line="288" w:lineRule="auto"/>
+        <w:rPr>
+          <w:rFonts w:eastAsia="Times New Roman" w:cs="Times New Roman"/>
+          <w:kern w:val="0"/>
+          <w:lang w:eastAsia="nl-BE"/>
+          <w14:ligatures w14:val="none"/>
+        </w:rPr>
+      </w:pPr>
+      <w:r>
+        <w:rPr>
+          <w:rFonts w:eastAsia="Times New Roman" w:cs="Times New Roman"/>
+          <w:kern w:val="0"/>
+          <w:lang w:eastAsia="nl-BE"/>
+          <w14:ligatures w14:val="none"/>
+        </w:rPr>
+        <w:t>Kleine steekproef en populatie. De steekproef is klein (9 deelnemers), waardoor de statistische kracht en externe validiteit beperkt zijn en conclusies enkel voorzichtig kunnen worden veralgemeend naar gelijkaardige profielen (ontwikkelaars met informatica</w:t>
+      </w:r>
+      <w:r>
+        <w:rPr>
+          <w:rFonts w:eastAsia="Times New Roman" w:cs="Times New Roman"/>
+          <w:kern w:val="0"/>
+          <w:lang w:eastAsia="nl-BE"/>
+          <w14:ligatures w14:val="none"/>
+        </w:rPr>
+        <w:noBreakHyphen/>
+        <w:t xml:space="preserve">ervaring). Dit risico is deels beperkt door bewust deelnemers te rekruteren met een achtergrond die aansluit bij de beoogde doelgroep van de tool en door taken te formuleren die realistische acties en situaties in een </w:t>
+      </w:r>
+      <w:proofErr w:type="spellStart"/>
+      <w:r>
+        <w:rPr>
+          <w:rFonts w:eastAsia="Times New Roman" w:cs="Times New Roman"/>
+          <w:kern w:val="0"/>
+          <w:lang w:eastAsia="nl-BE"/>
+          <w14:ligatures w14:val="none"/>
+        </w:rPr>
+        <w:t>threat</w:t>
+      </w:r>
+      <w:r>
+        <w:rPr>
+          <w:rFonts w:eastAsia="Times New Roman" w:cs="Times New Roman"/>
+          <w:kern w:val="0"/>
+          <w:lang w:eastAsia="nl-BE"/>
+          <w14:ligatures w14:val="none"/>
+        </w:rPr>
+        <w:noBreakHyphen/>
+        <w:t>modelingcontext</w:t>
+      </w:r>
+      <w:proofErr w:type="spellEnd"/>
+      <w:r>
+        <w:rPr>
+          <w:rFonts w:eastAsia="Times New Roman" w:cs="Times New Roman"/>
+          <w:kern w:val="0"/>
+          <w:lang w:eastAsia="nl-BE"/>
+          <w14:ligatures w14:val="none"/>
+        </w:rPr>
+        <w:t xml:space="preserve"> simuleren. Tegelijk blijven belangrijke gebruikersgroepen onderbelicht, zoals security</w:t>
+      </w:r>
+      <w:r>
+        <w:rPr>
+          <w:rFonts w:eastAsia="Times New Roman" w:cs="Times New Roman"/>
+          <w:kern w:val="0"/>
+          <w:lang w:eastAsia="nl-BE"/>
+          <w14:ligatures w14:val="none"/>
+        </w:rPr>
+        <w:noBreakHyphen/>
+        <w:t>experts met diepere domeinkennis en absolute leken, zodat vervolgonderzoek met een grotere en meer diverse steekproef nodig is om de bevindingen breder te valideren.</w:t>
+      </w:r>
+      <w:r>
+        <w:rPr>
+          <w:rFonts w:eastAsia="Times New Roman" w:cs="Times New Roman"/>
+          <w:kern w:val="0"/>
+          <w:lang w:eastAsia="nl-BE"/>
+          <w14:ligatures w14:val="none"/>
+        </w:rPr>
+        <w:br/>
+      </w:r>
+    </w:p>
+    <w:p>
+      <w:pPr>
+        <w:spacing w:afterLines="24" w:after="57" w:line="288" w:lineRule="auto"/>
+        <w:rPr>
+          <w:rFonts w:eastAsia="Times New Roman" w:cs="Times New Roman"/>
+          <w:kern w:val="0"/>
+          <w:lang w:eastAsia="nl-BE"/>
+          <w14:ligatures w14:val="none"/>
+        </w:rPr>
+      </w:pPr>
+      <w:r>
+        <w:rPr>
+          <w:rFonts w:eastAsia="Times New Roman" w:cs="Times New Roman"/>
+          <w:kern w:val="0"/>
+          <w:lang w:eastAsia="nl-BE"/>
+          <w14:ligatures w14:val="none"/>
+        </w:rPr>
+        <w:t>Zelfrapportage en bias. Het gebruik van UEQ</w:t>
+      </w:r>
+      <w:r>
+        <w:rPr>
+          <w:rFonts w:eastAsia="Times New Roman" w:cs="Times New Roman"/>
+          <w:kern w:val="0"/>
+          <w:lang w:eastAsia="nl-BE"/>
+          <w14:ligatures w14:val="none"/>
+        </w:rPr>
+        <w:noBreakHyphen/>
+        <w:t xml:space="preserve">scores en open vragen introduceert subjectiviteit en mogelijke </w:t>
+      </w:r>
+      <w:proofErr w:type="spellStart"/>
+      <w:r>
+        <w:rPr>
+          <w:rFonts w:eastAsia="Times New Roman" w:cs="Times New Roman"/>
+          <w:kern w:val="0"/>
+          <w:lang w:eastAsia="nl-BE"/>
+          <w14:ligatures w14:val="none"/>
+        </w:rPr>
+        <w:t>confirmation</w:t>
+      </w:r>
+      <w:proofErr w:type="spellEnd"/>
+      <w:r>
+        <w:rPr>
+          <w:rFonts w:eastAsia="Times New Roman" w:cs="Times New Roman"/>
+          <w:kern w:val="0"/>
+          <w:lang w:eastAsia="nl-BE"/>
+          <w14:ligatures w14:val="none"/>
+        </w:rPr>
+        <w:t xml:space="preserve"> bias: deelnemers kunnen antwoorden geven die ze als “gewenst” inschatten of achteraf hun ervaring vertekenen. Dit is deels opgevangen door de vragenlijst na concrete taken af te nemen, door observatie van gedrag tijdens de sessies én door de volgorde van de geteste versies per deelnemer te variëren, zodat volgorde</w:t>
+      </w:r>
+      <w:r>
+        <w:rPr>
+          <w:rFonts w:eastAsia="Times New Roman" w:cs="Times New Roman"/>
+          <w:kern w:val="0"/>
+          <w:lang w:eastAsia="nl-BE"/>
+          <w14:ligatures w14:val="none"/>
+        </w:rPr>
+        <w:noBreakHyphen/>
+        <w:t>effecten (zoals gewenning of vermoeidheid) beperkt worden. De resultaten moeten daarom vooral geïnterpreteerd worden als indicaties van ervaren bruikbaarheid en voorkeur, niet als harde maat voor objectieve prestatie.</w:t>
+      </w:r>
+    </w:p>
+    <w:p>
+      <w:pPr>
+        <w:spacing w:afterLines="24" w:after="57" w:line="288" w:lineRule="auto"/>
+        <w:rPr>
+          <w:rFonts w:eastAsia="Times New Roman" w:cs="Times New Roman"/>
+          <w:b/>
+          <w:bCs/>
+          <w:kern w:val="0"/>
+          <w:lang w:eastAsia="nl-BE"/>
+          <w14:ligatures w14:val="none"/>
+        </w:rPr>
+      </w:pPr>
+    </w:p>
+    <w:p>
+      <w:pPr>
+        <w:spacing w:afterLines="24" w:after="57" w:line="288" w:lineRule="auto"/>
+        <w:rPr>
+          <w:rFonts w:eastAsia="Times New Roman" w:cs="Times New Roman"/>
+          <w:kern w:val="0"/>
+          <w:lang w:eastAsia="nl-BE"/>
+          <w14:ligatures w14:val="none"/>
+        </w:rPr>
+      </w:pPr>
+      <w:r>
+        <w:rPr>
+          <w:rFonts w:eastAsia="Times New Roman" w:cs="Times New Roman"/>
+          <w:kern w:val="0"/>
+          <w:lang w:eastAsia="nl-BE"/>
+          <w14:ligatures w14:val="none"/>
+        </w:rPr>
+        <w:t>Beperkte vergelijkingsbasis en duur. De studie vergelijkt de prototype</w:t>
+      </w:r>
+      <w:r>
+        <w:rPr>
+          <w:rFonts w:eastAsia="Times New Roman" w:cs="Times New Roman"/>
+          <w:kern w:val="0"/>
+          <w:lang w:eastAsia="nl-BE"/>
+          <w14:ligatures w14:val="none"/>
+        </w:rPr>
+        <w:noBreakHyphen/>
+        <w:t xml:space="preserve">tool enkel met een interne basisversie en niet met gevestigde externe tools zoals </w:t>
+      </w:r>
+      <w:proofErr w:type="spellStart"/>
+      <w:r>
+        <w:rPr>
+          <w:rFonts w:eastAsia="Times New Roman" w:cs="Times New Roman"/>
+          <w:kern w:val="0"/>
+          <w:lang w:eastAsia="nl-BE"/>
+          <w14:ligatures w14:val="none"/>
+        </w:rPr>
+        <w:t>MindMeister</w:t>
+      </w:r>
+      <w:proofErr w:type="spellEnd"/>
+      <w:r>
+        <w:rPr>
+          <w:rFonts w:eastAsia="Times New Roman" w:cs="Times New Roman"/>
+          <w:kern w:val="0"/>
+          <w:lang w:eastAsia="nl-BE"/>
+          <w14:ligatures w14:val="none"/>
+        </w:rPr>
+        <w:t xml:space="preserve"> of </w:t>
+      </w:r>
+      <w:proofErr w:type="spellStart"/>
+      <w:r>
+        <w:rPr>
+          <w:rFonts w:eastAsia="Times New Roman" w:cs="Times New Roman"/>
+          <w:kern w:val="0"/>
+          <w:lang w:eastAsia="nl-BE"/>
+          <w14:ligatures w14:val="none"/>
+        </w:rPr>
+        <w:t>Lucidchart</w:t>
+      </w:r>
+      <w:proofErr w:type="spellEnd"/>
+      <w:r>
+        <w:rPr>
+          <w:rFonts w:eastAsia="Times New Roman" w:cs="Times New Roman"/>
+          <w:kern w:val="0"/>
+          <w:lang w:eastAsia="nl-BE"/>
+          <w14:ligatures w14:val="none"/>
+        </w:rPr>
+        <w:t>, waardoor onduidelijk blijft hoe het ontwerp zich houdt in een breder tool</w:t>
+      </w:r>
+      <w:r>
+        <w:rPr>
+          <w:rFonts w:eastAsia="Times New Roman" w:cs="Times New Roman"/>
+          <w:kern w:val="0"/>
+          <w:lang w:eastAsia="nl-BE"/>
+          <w14:ligatures w14:val="none"/>
+        </w:rPr>
+        <w:noBreakHyphen/>
+        <w:t>ecosysteem. Het gebruik van de basisversie bood een gecontroleerd referentiepunt met gelijkaardige functionaliteit en domeinlogica, zonder verschillen in accountvereisten</w:t>
+      </w:r>
+      <w:r>
+        <w:rPr>
+          <w:rFonts w:eastAsia="Times New Roman" w:cs="Times New Roman"/>
+          <w:kern w:val="0"/>
+          <w:lang w:eastAsia="nl-BE"/>
+          <w14:ligatures w14:val="none"/>
+        </w:rPr>
+        <w:t xml:space="preserve"> </w:t>
+      </w:r>
+      <w:r>
+        <w:rPr>
+          <w:rFonts w:eastAsia="Times New Roman" w:cs="Times New Roman"/>
+          <w:kern w:val="0"/>
+          <w:lang w:eastAsia="nl-BE"/>
+          <w14:ligatures w14:val="none"/>
+        </w:rPr>
+        <w:t xml:space="preserve">of bijkomende features in externe tools die de resultaten zouden kunnen vertekenen. Bovendien focuste het onderzoek op korte, eenmalige taken, zodat effecten van leercurve, langdurig gebruik en samenwerking niet zijn meegenomen. De </w:t>
+      </w:r>
+      <w:r>
+        <w:rPr>
+          <w:rFonts w:eastAsia="Times New Roman" w:cs="Times New Roman"/>
+          <w:kern w:val="0"/>
+          <w:lang w:eastAsia="nl-BE"/>
+          <w14:ligatures w14:val="none"/>
+        </w:rPr>
+        <w:lastRenderedPageBreak/>
+        <w:t xml:space="preserve">bevindingen zijn dus vooral geldig als eerste indicatie van bruikbaarheid binnen deze specifieke context en niet als evaluatie van </w:t>
+      </w:r>
+      <w:proofErr w:type="spellStart"/>
+      <w:r>
+        <w:rPr>
+          <w:rFonts w:eastAsia="Times New Roman" w:cs="Times New Roman"/>
+          <w:kern w:val="0"/>
+          <w:lang w:eastAsia="nl-BE"/>
+          <w14:ligatures w14:val="none"/>
+        </w:rPr>
+        <w:t>langetermijnproductiviteit</w:t>
+      </w:r>
+      <w:proofErr w:type="spellEnd"/>
+      <w:r>
+        <w:rPr>
+          <w:rFonts w:eastAsia="Times New Roman" w:cs="Times New Roman"/>
+          <w:kern w:val="0"/>
+          <w:lang w:eastAsia="nl-BE"/>
+          <w14:ligatures w14:val="none"/>
+        </w:rPr>
+        <w:t xml:space="preserve"> of concurrentievergelijking.</w:t>
+      </w:r>
+      <w:r>
+        <w:rPr>
+          <w:rFonts w:eastAsia="Times New Roman" w:cs="Times New Roman"/>
+          <w:kern w:val="0"/>
+          <w:lang w:eastAsia="nl-BE"/>
+          <w14:ligatures w14:val="none"/>
+        </w:rPr>
+        <w:br/>
+      </w:r>
+    </w:p>
+    <w:p>
+      <w:pPr>
+        <w:spacing w:afterLines="24" w:after="57"/>
+        <w:rPr>
+          <w:rFonts w:eastAsia="Times New Roman" w:cs="Times New Roman"/>
           <w:b/>
           <w:bCs/>
           <w:kern w:val="0"/>
@@ -14266,97 +13980,6 @@
         <w:spacing w:afterLines="24" w:after="57" w:line="288" w:lineRule="auto"/>
         <w:rPr>
           <w:rFonts w:eastAsia="Times New Roman" w:cs="Times New Roman"/>
-          <w:kern w:val="0"/>
-          <w:lang w:eastAsia="nl-BE"/>
-          <w14:ligatures w14:val="none"/>
-        </w:rPr>
-      </w:pPr>
-      <w:r>
-        <w:rPr>
-          <w:rFonts w:eastAsia="Times New Roman" w:cs="Times New Roman"/>
-          <w:kern w:val="0"/>
-          <w:lang w:eastAsia="nl-BE"/>
-          <w14:ligatures w14:val="none"/>
-        </w:rPr>
-        <w:t xml:space="preserve">De steekproef is klein (9 deelnemers), wat generaliseerbaarheid beperkt tot gelijkaardige populaties (ontwikkelaars met basiskennis). Zelfrapportage via UEQ en open vragen is subjectief en vat mogelijke </w:t>
-      </w:r>
-      <w:proofErr w:type="spellStart"/>
-      <w:r>
-        <w:rPr>
-          <w:rFonts w:eastAsia="Times New Roman" w:cs="Times New Roman"/>
-          <w:kern w:val="0"/>
-          <w:lang w:eastAsia="nl-BE"/>
-          <w14:ligatures w14:val="none"/>
-        </w:rPr>
-        <w:t>confirmation</w:t>
-      </w:r>
-      <w:proofErr w:type="spellEnd"/>
-      <w:r>
-        <w:rPr>
-          <w:rFonts w:eastAsia="Times New Roman" w:cs="Times New Roman"/>
-          <w:kern w:val="0"/>
-          <w:lang w:eastAsia="nl-BE"/>
-          <w14:ligatures w14:val="none"/>
-        </w:rPr>
-        <w:t xml:space="preserve"> bias. De studie vergelijkt met een interne basisversie, niet met externe tools zoals </w:t>
-      </w:r>
-      <w:proofErr w:type="spellStart"/>
-      <w:r>
-        <w:rPr>
-          <w:rFonts w:eastAsia="Times New Roman" w:cs="Times New Roman"/>
-          <w:kern w:val="0"/>
-          <w:lang w:eastAsia="nl-BE"/>
-          <w14:ligatures w14:val="none"/>
-        </w:rPr>
-        <w:t>MindMeister</w:t>
-      </w:r>
-      <w:proofErr w:type="spellEnd"/>
-      <w:r>
-        <w:rPr>
-          <w:rFonts w:eastAsia="Times New Roman" w:cs="Times New Roman"/>
-          <w:kern w:val="0"/>
-          <w:lang w:eastAsia="nl-BE"/>
-          <w14:ligatures w14:val="none"/>
-        </w:rPr>
-        <w:t xml:space="preserve"> of </w:t>
-      </w:r>
-      <w:proofErr w:type="spellStart"/>
-      <w:r>
-        <w:rPr>
-          <w:rFonts w:eastAsia="Times New Roman" w:cs="Times New Roman"/>
-          <w:kern w:val="0"/>
-          <w:lang w:eastAsia="nl-BE"/>
-          <w14:ligatures w14:val="none"/>
-        </w:rPr>
-        <w:t>Lucidchart</w:t>
-      </w:r>
-      <w:proofErr w:type="spellEnd"/>
-      <w:r>
-        <w:rPr>
-          <w:rFonts w:eastAsia="Times New Roman" w:cs="Times New Roman"/>
-          <w:kern w:val="0"/>
-          <w:lang w:eastAsia="nl-BE"/>
-          <w14:ligatures w14:val="none"/>
-        </w:rPr>
-        <w:t>, en focust op korte taken zonder langdurig gebruik.</w:t>
-      </w:r>
-    </w:p>
-    <w:p>
-      <w:pPr>
-        <w:spacing w:afterLines="24" w:after="57" w:line="288" w:lineRule="auto"/>
-        <w:rPr>
-          <w:rFonts w:eastAsia="Times New Roman" w:cs="Times New Roman"/>
-          <w:kern w:val="0"/>
-          <w:lang w:eastAsia="nl-BE"/>
-          <w14:ligatures w14:val="none"/>
-        </w:rPr>
-      </w:pPr>
-    </w:p>
-    <w:p>
-      <w:pPr>
-        <w:spacing w:afterLines="24" w:after="57"/>
-        <w:rPr>
-          <w:rFonts w:eastAsia="Times New Roman" w:cs="Times New Roman"/>
           <w:b/>
           <w:bCs/>
           <w:kern w:val="0"/>
@@ -14366,10 +13989,7 @@
           <w14:ligatures w14:val="none"/>
         </w:rPr>
       </w:pPr>
-    </w:p>
-    <w:p>
-      <w:pPr>
-        <w:spacing w:afterLines="24" w:after="57" w:line="288" w:lineRule="auto"/>
+      <w:r>
         <w:rPr>
           <w:rFonts w:eastAsia="Times New Roman" w:cs="Times New Roman"/>
           <w:b/>
@@ -14380,7 +14000,8 @@
           <w:lang w:eastAsia="nl-BE"/>
           <w14:ligatures w14:val="none"/>
         </w:rPr>
-      </w:pPr>
+        <w:t>6</w:t>
+      </w:r>
       <w:r>
         <w:rPr>
           <w:rFonts w:eastAsia="Times New Roman" w:cs="Times New Roman"/>
@@ -14392,7 +14013,7 @@
           <w:lang w:eastAsia="nl-BE"/>
           <w14:ligatures w14:val="none"/>
         </w:rPr>
-        <w:t>7</w:t>
+        <w:t xml:space="preserve">.5 </w:t>
       </w:r>
       <w:r>
         <w:rPr>
@@ -14405,9 +14026,12 @@
           <w:lang w:eastAsia="nl-BE"/>
           <w14:ligatures w14:val="none"/>
         </w:rPr>
-        <w:t xml:space="preserve">.5 </w:t>
-      </w:r>
-      <w:r>
+        <w:t>Implicaties voor theorie en praktijk</w:t>
+      </w:r>
+    </w:p>
+    <w:p>
+      <w:pPr>
+        <w:spacing w:afterLines="24" w:after="57" w:line="288" w:lineRule="auto"/>
         <w:rPr>
           <w:rFonts w:eastAsia="Times New Roman" w:cs="Times New Roman"/>
           <w:b/>
@@ -14418,8 +14042,525 @@
           <w:lang w:eastAsia="nl-BE"/>
           <w14:ligatures w14:val="none"/>
         </w:rPr>
-        <w:t>Implicaties voor theorie en praktijk</w:t>
-      </w:r>
+      </w:pPr>
+    </w:p>
+    <w:p>
+      <w:pPr>
+        <w:spacing w:afterLines="24" w:after="57" w:line="288" w:lineRule="auto"/>
+        <w:rPr>
+          <w:rFonts w:eastAsia="Times New Roman" w:cs="Times New Roman"/>
+          <w:kern w:val="0"/>
+          <w:lang w:eastAsia="nl-BE"/>
+          <w14:ligatures w14:val="none"/>
+        </w:rPr>
+      </w:pPr>
+      <w:r>
+        <w:rPr>
+          <w:rFonts w:eastAsia="Times New Roman" w:cs="Times New Roman"/>
+          <w:kern w:val="0"/>
+          <w:lang w:eastAsia="nl-BE"/>
+          <w14:ligatures w14:val="none"/>
+        </w:rPr>
+        <w:t>Theoretisch sluit dit werk aan bij design</w:t>
+      </w:r>
+      <w:r>
+        <w:rPr>
+          <w:rFonts w:eastAsia="Times New Roman" w:cs="Times New Roman"/>
+          <w:kern w:val="0"/>
+          <w:lang w:eastAsia="nl-BE"/>
+          <w14:ligatures w14:val="none"/>
+        </w:rPr>
+        <w:noBreakHyphen/>
+      </w:r>
+      <w:proofErr w:type="spellStart"/>
+      <w:r>
+        <w:rPr>
+          <w:rFonts w:eastAsia="Times New Roman" w:cs="Times New Roman"/>
+          <w:kern w:val="0"/>
+          <w:lang w:eastAsia="nl-BE"/>
+          <w14:ligatures w14:val="none"/>
+        </w:rPr>
+        <w:t>science</w:t>
+      </w:r>
+      <w:proofErr w:type="spellEnd"/>
+      <w:r>
+        <w:rPr>
+          <w:rFonts w:eastAsia="Times New Roman" w:cs="Times New Roman"/>
+          <w:kern w:val="0"/>
+          <w:lang w:eastAsia="nl-BE"/>
+          <w14:ligatures w14:val="none"/>
+        </w:rPr>
+        <w:noBreakHyphen/>
+        <w:t>onderzoek, omdat een concreet artefact werd ontworpen, geïmplementeerd en geëvalueerd rond de vraag hoe UX</w:t>
+      </w:r>
+      <w:r>
+        <w:rPr>
+          <w:rFonts w:eastAsia="Times New Roman" w:cs="Times New Roman"/>
+          <w:kern w:val="0"/>
+          <w:lang w:eastAsia="nl-BE"/>
+          <w14:ligatures w14:val="none"/>
+        </w:rPr>
+        <w:noBreakHyphen/>
+        <w:t xml:space="preserve">principes </w:t>
+      </w:r>
+      <w:proofErr w:type="spellStart"/>
+      <w:r>
+        <w:rPr>
+          <w:rFonts w:eastAsia="Times New Roman" w:cs="Times New Roman"/>
+          <w:kern w:val="0"/>
+          <w:lang w:eastAsia="nl-BE"/>
+          <w14:ligatures w14:val="none"/>
+        </w:rPr>
+        <w:t>threat</w:t>
+      </w:r>
+      <w:proofErr w:type="spellEnd"/>
+      <w:r>
+        <w:rPr>
+          <w:rFonts w:eastAsia="Times New Roman" w:cs="Times New Roman"/>
+          <w:kern w:val="0"/>
+          <w:lang w:eastAsia="nl-BE"/>
+          <w14:ligatures w14:val="none"/>
+        </w:rPr>
+        <w:t xml:space="preserve"> </w:t>
+      </w:r>
+      <w:proofErr w:type="spellStart"/>
+      <w:r>
+        <w:rPr>
+          <w:rFonts w:eastAsia="Times New Roman" w:cs="Times New Roman"/>
+          <w:kern w:val="0"/>
+          <w:lang w:eastAsia="nl-BE"/>
+          <w14:ligatures w14:val="none"/>
+        </w:rPr>
+        <w:t>modeling</w:t>
+      </w:r>
+      <w:proofErr w:type="spellEnd"/>
+      <w:r>
+        <w:rPr>
+          <w:rFonts w:eastAsia="Times New Roman" w:cs="Times New Roman"/>
+          <w:kern w:val="0"/>
+          <w:lang w:eastAsia="nl-BE"/>
+          <w14:ligatures w14:val="none"/>
+        </w:rPr>
+        <w:t xml:space="preserve"> kunnen ondersteunen. De resultaten suggereren dat elementen zoals visuele hiërarchie, expliciete statussen en herkenning boven herinnering niet alleen de “gebruiksvriendelijkheid” verhogen, maar ook de toegankelijkheid van security</w:t>
+      </w:r>
+      <w:r>
+        <w:rPr>
+          <w:rFonts w:eastAsia="Times New Roman" w:cs="Times New Roman"/>
+          <w:kern w:val="0"/>
+          <w:lang w:eastAsia="nl-BE"/>
+          <w14:ligatures w14:val="none"/>
+        </w:rPr>
+        <w:noBreakHyphen/>
+        <w:t>redeneringen voor ontwikkelaars met beperkte security</w:t>
+      </w:r>
+      <w:r>
+        <w:rPr>
+          <w:rFonts w:eastAsia="Times New Roman" w:cs="Times New Roman"/>
+          <w:kern w:val="0"/>
+          <w:lang w:eastAsia="nl-BE"/>
+          <w14:ligatures w14:val="none"/>
+        </w:rPr>
+        <w:noBreakHyphen/>
+        <w:t>expertise. Daarnaast tonen de UEQ</w:t>
+      </w:r>
+      <w:r>
+        <w:rPr>
+          <w:rFonts w:eastAsia="Times New Roman" w:cs="Times New Roman"/>
+          <w:kern w:val="0"/>
+          <w:lang w:eastAsia="nl-BE"/>
+          <w14:ligatures w14:val="none"/>
+        </w:rPr>
+        <w:noBreakHyphen/>
+        <w:t>scores en kwalitatieve feedback dat generieke UX</w:t>
+      </w:r>
+      <w:r>
+        <w:rPr>
+          <w:rFonts w:eastAsia="Times New Roman" w:cs="Times New Roman"/>
+          <w:kern w:val="0"/>
+          <w:lang w:eastAsia="nl-BE"/>
+          <w14:ligatures w14:val="none"/>
+        </w:rPr>
+        <w:noBreakHyphen/>
+        <w:t xml:space="preserve">instrumenten zinvol kunnen worden ingezet in de evaluatie van security tools, en dat dimensies zoals duidelijkheid en stimulatie mogelijk een rol spelen in de adoptie binnen </w:t>
+      </w:r>
+      <w:proofErr w:type="spellStart"/>
+      <w:r>
+        <w:rPr>
+          <w:rFonts w:eastAsia="Times New Roman" w:cs="Times New Roman"/>
+          <w:kern w:val="0"/>
+          <w:lang w:eastAsia="nl-BE"/>
+          <w14:ligatures w14:val="none"/>
+        </w:rPr>
+        <w:t>DevSecOps</w:t>
+      </w:r>
+      <w:r>
+        <w:rPr>
+          <w:rFonts w:eastAsia="Times New Roman" w:cs="Times New Roman"/>
+          <w:kern w:val="0"/>
+          <w:lang w:eastAsia="nl-BE"/>
+          <w14:ligatures w14:val="none"/>
+        </w:rPr>
+        <w:noBreakHyphen/>
+        <w:t>settings</w:t>
+      </w:r>
+      <w:proofErr w:type="spellEnd"/>
+      <w:r>
+        <w:rPr>
+          <w:rFonts w:eastAsia="Times New Roman" w:cs="Times New Roman"/>
+          <w:kern w:val="0"/>
+          <w:lang w:eastAsia="nl-BE"/>
+          <w14:ligatures w14:val="none"/>
+        </w:rPr>
+        <w:t>.</w:t>
+      </w:r>
+    </w:p>
+    <w:p>
+      <w:pPr>
+        <w:spacing w:afterLines="24" w:after="57" w:line="288" w:lineRule="auto"/>
+        <w:rPr>
+          <w:rFonts w:eastAsia="Times New Roman" w:cs="Times New Roman"/>
+          <w:kern w:val="0"/>
+          <w:lang w:eastAsia="nl-BE"/>
+          <w14:ligatures w14:val="none"/>
+        </w:rPr>
+      </w:pPr>
+    </w:p>
+    <w:p>
+      <w:pPr>
+        <w:spacing w:afterLines="24" w:after="57" w:line="288" w:lineRule="auto"/>
+        <w:rPr>
+          <w:rFonts w:eastAsia="Times New Roman" w:cs="Times New Roman"/>
+          <w:kern w:val="0"/>
+          <w:lang w:eastAsia="nl-BE"/>
+          <w14:ligatures w14:val="none"/>
+        </w:rPr>
+      </w:pPr>
+      <w:r>
+        <w:rPr>
+          <w:rFonts w:eastAsia="Times New Roman" w:cs="Times New Roman"/>
+          <w:kern w:val="0"/>
+          <w:lang w:eastAsia="nl-BE"/>
+          <w14:ligatures w14:val="none"/>
+        </w:rPr>
+        <w:t xml:space="preserve">In de praktijk kan de ontwikkelde tool dienen als laagdrempelige ondersteuning voor </w:t>
+      </w:r>
+      <w:proofErr w:type="spellStart"/>
+      <w:r>
+        <w:rPr>
+          <w:rFonts w:eastAsia="Times New Roman" w:cs="Times New Roman"/>
+          <w:kern w:val="0"/>
+          <w:lang w:eastAsia="nl-BE"/>
+          <w14:ligatures w14:val="none"/>
+        </w:rPr>
+        <w:t>DevSecOps</w:t>
+      </w:r>
+      <w:proofErr w:type="spellEnd"/>
+      <w:r>
+        <w:rPr>
+          <w:rFonts w:eastAsia="Times New Roman" w:cs="Times New Roman"/>
+          <w:kern w:val="0"/>
+          <w:lang w:eastAsia="nl-BE"/>
+          <w14:ligatures w14:val="none"/>
+        </w:rPr>
+        <w:noBreakHyphen/>
+        <w:t xml:space="preserve">teams die </w:t>
+      </w:r>
+      <w:proofErr w:type="spellStart"/>
+      <w:r>
+        <w:rPr>
+          <w:rFonts w:eastAsia="Times New Roman" w:cs="Times New Roman"/>
+          <w:kern w:val="0"/>
+          <w:lang w:eastAsia="nl-BE"/>
+          <w14:ligatures w14:val="none"/>
+        </w:rPr>
+        <w:t>threat</w:t>
+      </w:r>
+      <w:proofErr w:type="spellEnd"/>
+      <w:r>
+        <w:rPr>
+          <w:rFonts w:eastAsia="Times New Roman" w:cs="Times New Roman"/>
+          <w:kern w:val="0"/>
+          <w:lang w:eastAsia="nl-BE"/>
+          <w14:ligatures w14:val="none"/>
+        </w:rPr>
+        <w:t xml:space="preserve"> </w:t>
+      </w:r>
+      <w:proofErr w:type="spellStart"/>
+      <w:r>
+        <w:rPr>
+          <w:rFonts w:eastAsia="Times New Roman" w:cs="Times New Roman"/>
+          <w:kern w:val="0"/>
+          <w:lang w:eastAsia="nl-BE"/>
+          <w14:ligatures w14:val="none"/>
+        </w:rPr>
+        <w:t>modeling</w:t>
+      </w:r>
+      <w:proofErr w:type="spellEnd"/>
+      <w:r>
+        <w:rPr>
+          <w:rFonts w:eastAsia="Times New Roman" w:cs="Times New Roman"/>
+          <w:kern w:val="0"/>
+          <w:lang w:eastAsia="nl-BE"/>
+          <w14:ligatures w14:val="none"/>
+        </w:rPr>
+        <w:t xml:space="preserve"> in hun bestaande </w:t>
+      </w:r>
+      <w:proofErr w:type="spellStart"/>
+      <w:r>
+        <w:rPr>
+          <w:rFonts w:eastAsia="Times New Roman" w:cs="Times New Roman"/>
+          <w:kern w:val="0"/>
+          <w:lang w:eastAsia="nl-BE"/>
+          <w14:ligatures w14:val="none"/>
+        </w:rPr>
+        <w:t>workflows</w:t>
+      </w:r>
+      <w:proofErr w:type="spellEnd"/>
+      <w:r>
+        <w:rPr>
+          <w:rFonts w:eastAsia="Times New Roman" w:cs="Times New Roman"/>
+          <w:kern w:val="0"/>
+          <w:lang w:eastAsia="nl-BE"/>
+          <w14:ligatures w14:val="none"/>
+        </w:rPr>
+        <w:t xml:space="preserve"> willen integreren zonder zware methodologische drempel. De </w:t>
+      </w:r>
+      <w:proofErr w:type="spellStart"/>
+      <w:r>
+        <w:rPr>
+          <w:rFonts w:eastAsia="Times New Roman" w:cs="Times New Roman"/>
+          <w:kern w:val="0"/>
+          <w:lang w:eastAsia="nl-BE"/>
+          <w14:ligatures w14:val="none"/>
+        </w:rPr>
+        <w:t>branch</w:t>
+      </w:r>
+      <w:proofErr w:type="spellEnd"/>
+      <w:r>
+        <w:rPr>
+          <w:rFonts w:eastAsia="Times New Roman" w:cs="Times New Roman"/>
+          <w:kern w:val="0"/>
+          <w:lang w:eastAsia="nl-BE"/>
+          <w14:ligatures w14:val="none"/>
+        </w:rPr>
+        <w:noBreakHyphen/>
+        <w:t xml:space="preserve">summary, statusiconen en filterlogica bieden ontwikkelaars een manier om risico’s systematisch te prioriteren, openstaande aannames bij te houden en beslissingen traceerbaar te documenteren, wat aansluit bij iteratieve ontwikkelcycli. Bestaande tools en </w:t>
+      </w:r>
+      <w:proofErr w:type="spellStart"/>
+      <w:r>
+        <w:rPr>
+          <w:rFonts w:eastAsia="Times New Roman" w:cs="Times New Roman"/>
+          <w:kern w:val="0"/>
+          <w:lang w:eastAsia="nl-BE"/>
+          <w14:ligatures w14:val="none"/>
+        </w:rPr>
+        <w:t>pipelines</w:t>
+      </w:r>
+      <w:proofErr w:type="spellEnd"/>
+      <w:r>
+        <w:rPr>
+          <w:rFonts w:eastAsia="Times New Roman" w:cs="Times New Roman"/>
+          <w:kern w:val="0"/>
+          <w:lang w:eastAsia="nl-BE"/>
+          <w14:ligatures w14:val="none"/>
+        </w:rPr>
+        <w:t xml:space="preserve"> kunnen bovendien inspiratie halen uit specifieke ontwerpkeuzes, zoals het expliciet maken van verifieerbare aannames en het combineren van boom</w:t>
+      </w:r>
+      <w:r>
+        <w:rPr>
+          <w:rFonts w:eastAsia="Times New Roman" w:cs="Times New Roman"/>
+          <w:kern w:val="0"/>
+          <w:lang w:eastAsia="nl-BE"/>
+          <w14:ligatures w14:val="none"/>
+        </w:rPr>
+        <w:noBreakHyphen/>
+        <w:t>weergave met lijst</w:t>
+      </w:r>
+      <w:r>
+        <w:rPr>
+          <w:rFonts w:eastAsia="Times New Roman" w:cs="Times New Roman"/>
+          <w:kern w:val="0"/>
+          <w:lang w:eastAsia="nl-BE"/>
+          <w14:ligatures w14:val="none"/>
+        </w:rPr>
+        <w:noBreakHyphen/>
+        <w:t>gebaseerde prioritering, zonder noodzakelijk het volledige prototype over te nemen.</w:t>
+      </w:r>
+    </w:p>
+    <w:p>
+      <w:pPr>
+        <w:spacing w:afterLines="24" w:after="57" w:line="288" w:lineRule="auto"/>
+        <w:rPr>
+          <w:rFonts w:eastAsia="Times New Roman" w:cs="Times New Roman"/>
+          <w:kern w:val="0"/>
+          <w:lang w:eastAsia="nl-BE"/>
+          <w14:ligatures w14:val="none"/>
+        </w:rPr>
+      </w:pPr>
+    </w:p>
+    <w:p>
+      <w:pPr>
+        <w:spacing w:afterLines="24" w:after="57" w:line="288" w:lineRule="auto"/>
+        <w:rPr>
+          <w:rFonts w:eastAsia="Times New Roman" w:cs="Times New Roman"/>
+          <w:kern w:val="0"/>
+          <w:lang w:eastAsia="nl-BE"/>
+          <w14:ligatures w14:val="none"/>
+        </w:rPr>
+      </w:pPr>
+      <w:r>
+        <w:rPr>
+          <w:rFonts w:eastAsia="Times New Roman" w:cs="Times New Roman"/>
+          <w:kern w:val="0"/>
+          <w:lang w:eastAsia="nl-BE"/>
+          <w14:ligatures w14:val="none"/>
+        </w:rPr>
+        <w:t xml:space="preserve">Voor onderwijs illustreert het prototype hoe </w:t>
+      </w:r>
+      <w:proofErr w:type="spellStart"/>
+      <w:r>
+        <w:rPr>
+          <w:rFonts w:eastAsia="Times New Roman" w:cs="Times New Roman"/>
+          <w:kern w:val="0"/>
+          <w:lang w:eastAsia="nl-BE"/>
+          <w14:ligatures w14:val="none"/>
+        </w:rPr>
+        <w:t>Fortunately</w:t>
+      </w:r>
+      <w:proofErr w:type="spellEnd"/>
+      <w:r>
+        <w:rPr>
+          <w:rFonts w:eastAsia="Times New Roman" w:cs="Times New Roman"/>
+          <w:kern w:val="0"/>
+          <w:lang w:eastAsia="nl-BE"/>
+          <w14:ligatures w14:val="none"/>
+        </w:rPr>
+        <w:t>–</w:t>
+      </w:r>
+      <w:proofErr w:type="spellStart"/>
+      <w:r>
+        <w:rPr>
+          <w:rFonts w:eastAsia="Times New Roman" w:cs="Times New Roman"/>
+          <w:kern w:val="0"/>
+          <w:lang w:eastAsia="nl-BE"/>
+          <w14:ligatures w14:val="none"/>
+        </w:rPr>
+        <w:t>Unfortunately</w:t>
+      </w:r>
+      <w:proofErr w:type="spellEnd"/>
+      <w:r>
+        <w:rPr>
+          <w:rFonts w:eastAsia="Times New Roman" w:cs="Times New Roman"/>
+          <w:kern w:val="0"/>
+          <w:lang w:eastAsia="nl-BE"/>
+          <w14:ligatures w14:val="none"/>
+        </w:rPr>
+        <w:noBreakHyphen/>
+        <w:t xml:space="preserve">structuren concreet kunnen worden ingezet om studenten redeneringsketens rond risico’s, mitigaties en afhankelijkheden te laten verkennen. Docenten kunnen de tool gebruiken als oefenomgeving waarin studenten bestaande modellen analyseren of zelf een </w:t>
+      </w:r>
+      <w:proofErr w:type="spellStart"/>
+      <w:r>
+        <w:rPr>
+          <w:rFonts w:eastAsia="Times New Roman" w:cs="Times New Roman"/>
+          <w:kern w:val="0"/>
+          <w:lang w:eastAsia="nl-BE"/>
+          <w14:ligatures w14:val="none"/>
+        </w:rPr>
+        <w:t>threat</w:t>
+      </w:r>
+      <w:proofErr w:type="spellEnd"/>
+      <w:r>
+        <w:rPr>
+          <w:rFonts w:eastAsia="Times New Roman" w:cs="Times New Roman"/>
+          <w:kern w:val="0"/>
+          <w:lang w:eastAsia="nl-BE"/>
+          <w14:ligatures w14:val="none"/>
+        </w:rPr>
+        <w:noBreakHyphen/>
+        <w:t xml:space="preserve">model opbouwen, met directe visuele feedback via iconen en </w:t>
+      </w:r>
+      <w:proofErr w:type="spellStart"/>
+      <w:r>
+        <w:rPr>
+          <w:rFonts w:eastAsia="Times New Roman" w:cs="Times New Roman"/>
+          <w:kern w:val="0"/>
+          <w:lang w:eastAsia="nl-BE"/>
+          <w14:ligatures w14:val="none"/>
+        </w:rPr>
+        <w:t>danger</w:t>
+      </w:r>
+      <w:proofErr w:type="spellEnd"/>
+      <w:r>
+        <w:rPr>
+          <w:rFonts w:eastAsia="Times New Roman" w:cs="Times New Roman"/>
+          <w:kern w:val="0"/>
+          <w:lang w:eastAsia="nl-BE"/>
+          <w14:ligatures w14:val="none"/>
+        </w:rPr>
+        <w:t xml:space="preserve"> ratings. Dit kan helpen om abstracte concepten uit </w:t>
+      </w:r>
+      <w:proofErr w:type="spellStart"/>
+      <w:r>
+        <w:rPr>
+          <w:rFonts w:eastAsia="Times New Roman" w:cs="Times New Roman"/>
+          <w:kern w:val="0"/>
+          <w:lang w:eastAsia="nl-BE"/>
+          <w14:ligatures w14:val="none"/>
+        </w:rPr>
+        <w:t>threat</w:t>
+      </w:r>
+      <w:proofErr w:type="spellEnd"/>
+      <w:r>
+        <w:rPr>
+          <w:rFonts w:eastAsia="Times New Roman" w:cs="Times New Roman"/>
+          <w:kern w:val="0"/>
+          <w:lang w:eastAsia="nl-BE"/>
+          <w14:ligatures w14:val="none"/>
+        </w:rPr>
+        <w:t xml:space="preserve"> </w:t>
+      </w:r>
+      <w:proofErr w:type="spellStart"/>
+      <w:r>
+        <w:rPr>
+          <w:rFonts w:eastAsia="Times New Roman" w:cs="Times New Roman"/>
+          <w:kern w:val="0"/>
+          <w:lang w:eastAsia="nl-BE"/>
+          <w14:ligatures w14:val="none"/>
+        </w:rPr>
+        <w:t>modeling</w:t>
+      </w:r>
+      <w:proofErr w:type="spellEnd"/>
+      <w:r>
+        <w:rPr>
+          <w:rFonts w:eastAsia="Times New Roman" w:cs="Times New Roman"/>
+          <w:kern w:val="0"/>
+          <w:lang w:eastAsia="nl-BE"/>
+          <w14:ligatures w14:val="none"/>
+        </w:rPr>
+        <w:t xml:space="preserve"> tastbaarder te maken en de kloof tussen theoretische methodes en praktische toepassing in softwareprojecten te verkleinen.</w:t>
+      </w:r>
+    </w:p>
+    <w:p>
+      <w:pPr>
+        <w:spacing w:afterLines="24" w:after="57" w:line="288" w:lineRule="auto"/>
+        <w:rPr>
+          <w:rFonts w:eastAsia="Times New Roman" w:cs="Times New Roman"/>
+          <w:kern w:val="0"/>
+          <w:lang w:eastAsia="nl-BE"/>
+          <w14:ligatures w14:val="none"/>
+        </w:rPr>
+      </w:pPr>
+    </w:p>
+    <w:p>
+      <w:pPr>
+        <w:spacing w:afterLines="24" w:after="57" w:line="288" w:lineRule="auto"/>
+        <w:rPr>
+          <w:rFonts w:eastAsia="Times New Roman" w:cs="Times New Roman"/>
+          <w:kern w:val="0"/>
+          <w:lang w:eastAsia="nl-BE"/>
+          <w14:ligatures w14:val="none"/>
+        </w:rPr>
+      </w:pPr>
     </w:p>
     <w:p>
       <w:pPr>
@@ -14435,248 +14576,7 @@
           <w14:ligatures w14:val="none"/>
         </w:rPr>
       </w:pPr>
-    </w:p>
-    <w:p>
-      <w:pPr>
-        <w:spacing w:afterLines="24" w:after="57" w:line="288" w:lineRule="auto"/>
-        <w:rPr>
-          <w:rFonts w:eastAsia="Times New Roman" w:cs="Times New Roman"/>
-          <w:kern w:val="0"/>
-          <w:lang w:eastAsia="nl-BE"/>
-          <w14:ligatures w14:val="none"/>
-        </w:rPr>
-      </w:pPr>
-      <w:r>
-        <w:rPr>
-          <w:rFonts w:eastAsia="Times New Roman" w:cs="Times New Roman"/>
-          <w:kern w:val="0"/>
-          <w:lang w:eastAsia="nl-BE"/>
-          <w14:ligatures w14:val="none"/>
-        </w:rPr>
-        <w:t xml:space="preserve">Theoretisch draagt dit bij aan design </w:t>
-      </w:r>
-      <w:proofErr w:type="spellStart"/>
-      <w:r>
-        <w:rPr>
-          <w:rFonts w:eastAsia="Times New Roman" w:cs="Times New Roman"/>
-          <w:kern w:val="0"/>
-          <w:lang w:eastAsia="nl-BE"/>
-          <w14:ligatures w14:val="none"/>
-        </w:rPr>
-        <w:t>science</w:t>
-      </w:r>
-      <w:proofErr w:type="spellEnd"/>
-      <w:r>
-        <w:rPr>
-          <w:rFonts w:eastAsia="Times New Roman" w:cs="Times New Roman"/>
-          <w:kern w:val="0"/>
-          <w:lang w:eastAsia="nl-BE"/>
-          <w14:ligatures w14:val="none"/>
-        </w:rPr>
-        <w:t xml:space="preserve"> door empirisch bewijs voor UX-features in security </w:t>
-      </w:r>
-      <w:r>
-        <w:rPr>
-          <w:rFonts w:eastAsia="Times New Roman" w:cs="Times New Roman"/>
-          <w:kern w:val="0"/>
-          <w:lang w:eastAsia="nl-BE"/>
-          <w14:ligatures w14:val="none"/>
-        </w:rPr>
-        <w:t>modellering</w:t>
-      </w:r>
-      <w:r>
-        <w:rPr>
-          <w:rFonts w:eastAsia="Times New Roman" w:cs="Times New Roman"/>
-          <w:kern w:val="0"/>
-          <w:lang w:eastAsia="nl-BE"/>
-          <w14:ligatures w14:val="none"/>
-        </w:rPr>
-        <w:t xml:space="preserve">, met aanbeveling voor integratie van UEQ in </w:t>
-      </w:r>
-      <w:proofErr w:type="spellStart"/>
-      <w:r>
-        <w:rPr>
-          <w:rFonts w:eastAsia="Times New Roman" w:cs="Times New Roman"/>
-          <w:kern w:val="0"/>
-          <w:lang w:eastAsia="nl-BE"/>
-          <w14:ligatures w14:val="none"/>
-        </w:rPr>
-        <w:t>threat</w:t>
-      </w:r>
-      <w:proofErr w:type="spellEnd"/>
-      <w:r>
-        <w:rPr>
-          <w:rFonts w:eastAsia="Times New Roman" w:cs="Times New Roman"/>
-          <w:kern w:val="0"/>
-          <w:lang w:eastAsia="nl-BE"/>
-          <w14:ligatures w14:val="none"/>
-        </w:rPr>
-        <w:t xml:space="preserve"> </w:t>
-      </w:r>
-      <w:proofErr w:type="spellStart"/>
-      <w:r>
-        <w:rPr>
-          <w:rFonts w:eastAsia="Times New Roman" w:cs="Times New Roman"/>
-          <w:kern w:val="0"/>
-          <w:lang w:eastAsia="nl-BE"/>
-          <w14:ligatures w14:val="none"/>
-        </w:rPr>
-        <w:t>modeling</w:t>
-      </w:r>
-      <w:proofErr w:type="spellEnd"/>
-      <w:r>
-        <w:rPr>
-          <w:rFonts w:eastAsia="Times New Roman" w:cs="Times New Roman"/>
-          <w:kern w:val="0"/>
-          <w:lang w:eastAsia="nl-BE"/>
-          <w14:ligatures w14:val="none"/>
-        </w:rPr>
-        <w:t xml:space="preserve"> evaluaties. Praktisch kan de tool </w:t>
-      </w:r>
-      <w:proofErr w:type="spellStart"/>
-      <w:r>
-        <w:rPr>
-          <w:rFonts w:eastAsia="Times New Roman" w:cs="Times New Roman"/>
-          <w:kern w:val="0"/>
-          <w:lang w:eastAsia="nl-BE"/>
-          <w14:ligatures w14:val="none"/>
-        </w:rPr>
-        <w:t>DevSecOps</w:t>
-      </w:r>
-      <w:proofErr w:type="spellEnd"/>
-      <w:r>
-        <w:rPr>
-          <w:rFonts w:eastAsia="Times New Roman" w:cs="Times New Roman"/>
-          <w:kern w:val="0"/>
-          <w:lang w:eastAsia="nl-BE"/>
-          <w14:ligatures w14:val="none"/>
-        </w:rPr>
-        <w:t xml:space="preserve"> teams helpen door </w:t>
-      </w:r>
-      <w:proofErr w:type="spellStart"/>
-      <w:r>
-        <w:rPr>
-          <w:rFonts w:eastAsia="Times New Roman" w:cs="Times New Roman"/>
-          <w:kern w:val="0"/>
-          <w:lang w:eastAsia="nl-BE"/>
-          <w14:ligatures w14:val="none"/>
-        </w:rPr>
-        <w:t>threat</w:t>
-      </w:r>
-      <w:proofErr w:type="spellEnd"/>
-      <w:r>
-        <w:rPr>
-          <w:rFonts w:eastAsia="Times New Roman" w:cs="Times New Roman"/>
-          <w:kern w:val="0"/>
-          <w:lang w:eastAsia="nl-BE"/>
-          <w14:ligatures w14:val="none"/>
-        </w:rPr>
-        <w:t xml:space="preserve"> </w:t>
-      </w:r>
-      <w:proofErr w:type="spellStart"/>
-      <w:r>
-        <w:rPr>
-          <w:rFonts w:eastAsia="Times New Roman" w:cs="Times New Roman"/>
-          <w:kern w:val="0"/>
-          <w:lang w:eastAsia="nl-BE"/>
-          <w14:ligatures w14:val="none"/>
-        </w:rPr>
-        <w:t>modeling</w:t>
-      </w:r>
-      <w:proofErr w:type="spellEnd"/>
-      <w:r>
-        <w:rPr>
-          <w:rFonts w:eastAsia="Times New Roman" w:cs="Times New Roman"/>
-          <w:kern w:val="0"/>
-          <w:lang w:eastAsia="nl-BE"/>
-          <w14:ligatures w14:val="none"/>
-        </w:rPr>
-        <w:t xml:space="preserve"> laagdrempelig te maken</w:t>
-      </w:r>
-      <w:r>
-        <w:rPr>
-          <w:rFonts w:eastAsia="Times New Roman" w:cs="Times New Roman"/>
-          <w:kern w:val="0"/>
-          <w:lang w:eastAsia="nl-BE"/>
-          <w14:ligatures w14:val="none"/>
-        </w:rPr>
-        <w:t xml:space="preserve"> en</w:t>
-      </w:r>
-      <w:r>
-        <w:rPr>
-          <w:rFonts w:eastAsia="Times New Roman" w:cs="Times New Roman"/>
-          <w:kern w:val="0"/>
-          <w:lang w:eastAsia="nl-BE"/>
-          <w14:ligatures w14:val="none"/>
-        </w:rPr>
-        <w:t xml:space="preserve"> implementeer filtering en iconen in bestaande </w:t>
-      </w:r>
-      <w:proofErr w:type="spellStart"/>
-      <w:r>
-        <w:rPr>
-          <w:rFonts w:eastAsia="Times New Roman" w:cs="Times New Roman"/>
-          <w:kern w:val="0"/>
-          <w:lang w:eastAsia="nl-BE"/>
-          <w14:ligatures w14:val="none"/>
-        </w:rPr>
-        <w:t>pipelines</w:t>
-      </w:r>
-      <w:proofErr w:type="spellEnd"/>
-      <w:r>
-        <w:rPr>
-          <w:rFonts w:eastAsia="Times New Roman" w:cs="Times New Roman"/>
-          <w:kern w:val="0"/>
-          <w:lang w:eastAsia="nl-BE"/>
-          <w14:ligatures w14:val="none"/>
-        </w:rPr>
-        <w:t xml:space="preserve">. Voor onderwijs biedt het een didactisch prototype om </w:t>
-      </w:r>
-      <w:proofErr w:type="spellStart"/>
-      <w:r>
-        <w:rPr>
-          <w:rFonts w:eastAsia="Times New Roman" w:cs="Times New Roman"/>
-          <w:kern w:val="0"/>
-          <w:lang w:eastAsia="nl-BE"/>
-          <w14:ligatures w14:val="none"/>
-        </w:rPr>
-        <w:t>Fortunately-Unfortunately</w:t>
-      </w:r>
-      <w:proofErr w:type="spellEnd"/>
-      <w:r>
-        <w:rPr>
-          <w:rFonts w:eastAsia="Times New Roman" w:cs="Times New Roman"/>
-          <w:kern w:val="0"/>
-          <w:lang w:eastAsia="nl-BE"/>
-          <w14:ligatures w14:val="none"/>
-        </w:rPr>
-        <w:t xml:space="preserve"> te demonstreren.</w:t>
-      </w:r>
-    </w:p>
-    <w:p>
-      <w:pPr>
-        <w:spacing w:afterLines="24" w:after="57" w:line="288" w:lineRule="auto"/>
-        <w:rPr>
-          <w:rFonts w:eastAsia="Times New Roman" w:cs="Times New Roman"/>
-          <w:kern w:val="0"/>
-          <w:lang w:eastAsia="nl-BE"/>
-          <w14:ligatures w14:val="none"/>
-        </w:rPr>
-      </w:pPr>
-    </w:p>
-    <w:p>
-      <w:pPr>
-        <w:spacing w:afterLines="24" w:after="57" w:line="288" w:lineRule="auto"/>
-        <w:rPr>
-          <w:rFonts w:eastAsia="Times New Roman" w:cs="Times New Roman"/>
-          <w:kern w:val="0"/>
-          <w:lang w:eastAsia="nl-BE"/>
-          <w14:ligatures w14:val="none"/>
-        </w:rPr>
-      </w:pPr>
-    </w:p>
-    <w:p>
-      <w:pPr>
-        <w:spacing w:afterLines="24" w:after="57" w:line="288" w:lineRule="auto"/>
+      <w:r>
         <w:rPr>
           <w:rFonts w:eastAsia="Times New Roman" w:cs="Times New Roman"/>
           <w:b/>
@@ -14687,7 +14587,9 @@
           <w:lang w:eastAsia="nl-BE"/>
           <w14:ligatures w14:val="none"/>
         </w:rPr>
-      </w:pPr>
+        <w:lastRenderedPageBreak/>
+        <w:t>6</w:t>
+      </w:r>
       <w:r>
         <w:rPr>
           <w:rFonts w:eastAsia="Times New Roman" w:cs="Times New Roman"/>
@@ -14699,7 +14601,7 @@
           <w:lang w:eastAsia="nl-BE"/>
           <w14:ligatures w14:val="none"/>
         </w:rPr>
-        <w:t>7</w:t>
+        <w:t xml:space="preserve">.6 </w:t>
       </w:r>
       <w:r>
         <w:rPr>
@@ -14712,9 +14614,12 @@
           <w:lang w:eastAsia="nl-BE"/>
           <w14:ligatures w14:val="none"/>
         </w:rPr>
-        <w:t xml:space="preserve">.6 </w:t>
-      </w:r>
-      <w:r>
+        <w:t>Aanbevelingen voor toekomstig onderzoek</w:t>
+      </w:r>
+    </w:p>
+    <w:p>
+      <w:pPr>
+        <w:spacing w:afterLines="24" w:after="57" w:line="288" w:lineRule="auto"/>
         <w:rPr>
           <w:rFonts w:eastAsia="Times New Roman" w:cs="Times New Roman"/>
           <w:b/>
@@ -14725,23 +14630,404 @@
           <w:lang w:eastAsia="nl-BE"/>
           <w14:ligatures w14:val="none"/>
         </w:rPr>
-        <w:t>Aanbevelingen voor toekomstig onderzoek</w:t>
-      </w:r>
-    </w:p>
-    <w:p>
-      <w:pPr>
-        <w:spacing w:afterLines="24" w:after="57" w:line="288" w:lineRule="auto"/>
-        <w:rPr>
-          <w:rFonts w:eastAsia="Times New Roman" w:cs="Times New Roman"/>
-          <w:b/>
-          <w:bCs/>
-          <w:kern w:val="0"/>
-          <w:sz w:val="28"/>
-          <w:szCs w:val="28"/>
-          <w:lang w:eastAsia="nl-BE"/>
-          <w14:ligatures w14:val="none"/>
-        </w:rPr>
-      </w:pPr>
+      </w:pPr>
+    </w:p>
+    <w:p>
+      <w:pPr>
+        <w:spacing w:afterLines="24" w:after="57" w:line="288" w:lineRule="auto"/>
+        <w:rPr>
+          <w:rFonts w:eastAsia="Times New Roman" w:cs="Times New Roman"/>
+          <w:kern w:val="0"/>
+          <w:lang w:eastAsia="nl-BE"/>
+          <w14:ligatures w14:val="none"/>
+        </w:rPr>
+      </w:pPr>
+      <w:r>
+        <w:rPr>
+          <w:rFonts w:eastAsia="Times New Roman" w:cs="Times New Roman"/>
+          <w:kern w:val="0"/>
+          <w:lang w:eastAsia="nl-BE"/>
+          <w14:ligatures w14:val="none"/>
+        </w:rPr>
+        <w:t>Een eerste aanbeveling is om vervolgonderzoek uit te voeren met grotere en meer diverse steekproeven, inclusief security</w:t>
+      </w:r>
+      <w:r>
+        <w:rPr>
+          <w:rFonts w:eastAsia="Times New Roman" w:cs="Times New Roman"/>
+          <w:kern w:val="0"/>
+          <w:lang w:eastAsia="nl-BE"/>
+          <w14:ligatures w14:val="none"/>
+        </w:rPr>
+        <w:noBreakHyphen/>
+        <w:t>experts en gebruikers zonder technische achtergrond, om de generaliseerbaarheid van de bevindingen te vergroten. Longitudinale studies waarin teams de tool gedurende langere tijd in reële projecten gebruiken, zouden bovendien inzicht kunnen geven in leercurves, duurzame adoptie en effecten op samenwerking en documentatiekwaliteit.</w:t>
+      </w:r>
+    </w:p>
+    <w:p>
+      <w:pPr>
+        <w:spacing w:afterLines="24" w:after="57" w:line="288" w:lineRule="auto"/>
+        <w:rPr>
+          <w:rFonts w:eastAsia="Times New Roman" w:cs="Times New Roman"/>
+          <w:kern w:val="0"/>
+          <w:lang w:eastAsia="nl-BE"/>
+          <w14:ligatures w14:val="none"/>
+        </w:rPr>
+      </w:pPr>
+    </w:p>
+    <w:p>
+      <w:pPr>
+        <w:spacing w:afterLines="24" w:after="57" w:line="288" w:lineRule="auto"/>
+        <w:rPr>
+          <w:rFonts w:eastAsia="Times New Roman" w:cs="Times New Roman"/>
+          <w:kern w:val="0"/>
+          <w:lang w:eastAsia="nl-BE"/>
+          <w14:ligatures w14:val="none"/>
+        </w:rPr>
+      </w:pPr>
+      <w:r>
+        <w:rPr>
+          <w:rFonts w:eastAsia="Times New Roman" w:cs="Times New Roman"/>
+          <w:kern w:val="0"/>
+          <w:lang w:eastAsia="nl-BE"/>
+          <w14:ligatures w14:val="none"/>
+        </w:rPr>
+        <w:t xml:space="preserve">Ten tweede is het zinvol om de tool systematisch te vergelijken met commerciële </w:t>
+      </w:r>
+      <w:proofErr w:type="spellStart"/>
+      <w:r>
+        <w:rPr>
+          <w:rFonts w:eastAsia="Times New Roman" w:cs="Times New Roman"/>
+          <w:kern w:val="0"/>
+          <w:lang w:eastAsia="nl-BE"/>
+          <w14:ligatures w14:val="none"/>
+        </w:rPr>
+        <w:t>mindmap</w:t>
+      </w:r>
+      <w:proofErr w:type="spellEnd"/>
+      <w:r>
+        <w:rPr>
+          <w:rFonts w:eastAsia="Times New Roman" w:cs="Times New Roman"/>
+          <w:kern w:val="0"/>
+          <w:lang w:eastAsia="nl-BE"/>
+          <w14:ligatures w14:val="none"/>
+        </w:rPr>
+        <w:noBreakHyphen/>
+        <w:t xml:space="preserve"> en diagramsoftware via gecontroleerde A/B</w:t>
+      </w:r>
+      <w:r>
+        <w:rPr>
+          <w:rFonts w:eastAsia="Times New Roman" w:cs="Times New Roman"/>
+          <w:kern w:val="0"/>
+          <w:lang w:eastAsia="nl-BE"/>
+          <w14:ligatures w14:val="none"/>
+        </w:rPr>
+        <w:noBreakHyphen/>
+        <w:t xml:space="preserve">studies. Door het prototype naast tools zoals </w:t>
+      </w:r>
+      <w:proofErr w:type="spellStart"/>
+      <w:r>
+        <w:rPr>
+          <w:rFonts w:eastAsia="Times New Roman" w:cs="Times New Roman"/>
+          <w:kern w:val="0"/>
+          <w:lang w:eastAsia="nl-BE"/>
+          <w14:ligatures w14:val="none"/>
+        </w:rPr>
+        <w:t>MindMeister</w:t>
+      </w:r>
+      <w:proofErr w:type="spellEnd"/>
+      <w:r>
+        <w:rPr>
+          <w:rFonts w:eastAsia="Times New Roman" w:cs="Times New Roman"/>
+          <w:kern w:val="0"/>
+          <w:lang w:eastAsia="nl-BE"/>
+          <w14:ligatures w14:val="none"/>
+        </w:rPr>
+        <w:t xml:space="preserve"> of </w:t>
+      </w:r>
+      <w:proofErr w:type="spellStart"/>
+      <w:r>
+        <w:rPr>
+          <w:rFonts w:eastAsia="Times New Roman" w:cs="Times New Roman"/>
+          <w:kern w:val="0"/>
+          <w:lang w:eastAsia="nl-BE"/>
+          <w14:ligatures w14:val="none"/>
+        </w:rPr>
+        <w:t>Lucidchart</w:t>
+      </w:r>
+      <w:proofErr w:type="spellEnd"/>
+      <w:r>
+        <w:rPr>
+          <w:rFonts w:eastAsia="Times New Roman" w:cs="Times New Roman"/>
+          <w:kern w:val="0"/>
+          <w:lang w:eastAsia="nl-BE"/>
+          <w14:ligatures w14:val="none"/>
+        </w:rPr>
+        <w:t xml:space="preserve"> te plaatsen, kan beter worden bepaald in welke mate de specifieke UX</w:t>
+      </w:r>
+      <w:r>
+        <w:rPr>
+          <w:rFonts w:eastAsia="Times New Roman" w:cs="Times New Roman"/>
+          <w:kern w:val="0"/>
+          <w:lang w:eastAsia="nl-BE"/>
+          <w14:ligatures w14:val="none"/>
+        </w:rPr>
+        <w:noBreakHyphen/>
+        <w:t xml:space="preserve">features (zoals </w:t>
+      </w:r>
+      <w:proofErr w:type="spellStart"/>
+      <w:r>
+        <w:rPr>
+          <w:rFonts w:eastAsia="Times New Roman" w:cs="Times New Roman"/>
+          <w:kern w:val="0"/>
+          <w:lang w:eastAsia="nl-BE"/>
+          <w14:ligatures w14:val="none"/>
+        </w:rPr>
+        <w:t>branch</w:t>
+      </w:r>
+      <w:proofErr w:type="spellEnd"/>
+      <w:r>
+        <w:rPr>
+          <w:rFonts w:eastAsia="Times New Roman" w:cs="Times New Roman"/>
+          <w:kern w:val="0"/>
+          <w:lang w:eastAsia="nl-BE"/>
+          <w14:ligatures w14:val="none"/>
+        </w:rPr>
+        <w:noBreakHyphen/>
+        <w:t xml:space="preserve">summary, statussen en </w:t>
+      </w:r>
+      <w:proofErr w:type="spellStart"/>
+      <w:r>
+        <w:rPr>
+          <w:rFonts w:eastAsia="Times New Roman" w:cs="Times New Roman"/>
+          <w:kern w:val="0"/>
+          <w:lang w:eastAsia="nl-BE"/>
+          <w14:ligatures w14:val="none"/>
+        </w:rPr>
+        <w:t>danger</w:t>
+      </w:r>
+      <w:proofErr w:type="spellEnd"/>
+      <w:r>
+        <w:rPr>
+          <w:rFonts w:eastAsia="Times New Roman" w:cs="Times New Roman"/>
+          <w:kern w:val="0"/>
+          <w:lang w:eastAsia="nl-BE"/>
+          <w14:ligatures w14:val="none"/>
+        </w:rPr>
+        <w:t xml:space="preserve"> ratings) daadwerkelijk meerwaarde bieden boven generieke </w:t>
+      </w:r>
+      <w:proofErr w:type="spellStart"/>
+      <w:r>
+        <w:rPr>
+          <w:rFonts w:eastAsia="Times New Roman" w:cs="Times New Roman"/>
+          <w:kern w:val="0"/>
+          <w:lang w:eastAsia="nl-BE"/>
+          <w14:ligatures w14:val="none"/>
+        </w:rPr>
+        <w:t>mindmapping</w:t>
+      </w:r>
+      <w:proofErr w:type="spellEnd"/>
+      <w:r>
+        <w:rPr>
+          <w:rFonts w:eastAsia="Times New Roman" w:cs="Times New Roman"/>
+          <w:kern w:val="0"/>
+          <w:lang w:eastAsia="nl-BE"/>
+          <w14:ligatures w14:val="none"/>
+        </w:rPr>
+        <w:noBreakHyphen/>
+        <w:t>functionaliteit, zowel qua efficiëntie als qua begrip van bedreigingen en mitigaties.</w:t>
+      </w:r>
+    </w:p>
+    <w:p>
+      <w:pPr>
+        <w:spacing w:afterLines="24" w:after="57" w:line="288" w:lineRule="auto"/>
+        <w:rPr>
+          <w:rFonts w:eastAsia="Times New Roman" w:cs="Times New Roman"/>
+          <w:kern w:val="0"/>
+          <w:lang w:eastAsia="nl-BE"/>
+          <w14:ligatures w14:val="none"/>
+        </w:rPr>
+      </w:pPr>
+    </w:p>
+    <w:p>
+      <w:pPr>
+        <w:spacing w:afterLines="24" w:after="57" w:line="288" w:lineRule="auto"/>
+        <w:rPr>
+          <w:rFonts w:eastAsia="Times New Roman" w:cs="Times New Roman"/>
+          <w:kern w:val="0"/>
+          <w:lang w:eastAsia="nl-BE"/>
+          <w14:ligatures w14:val="none"/>
+        </w:rPr>
+      </w:pPr>
+      <w:r>
+        <w:rPr>
+          <w:rFonts w:eastAsia="Times New Roman" w:cs="Times New Roman"/>
+          <w:kern w:val="0"/>
+          <w:lang w:eastAsia="nl-BE"/>
+          <w14:ligatures w14:val="none"/>
+        </w:rPr>
+        <w:t>Verder onderzoek kan zich ook richten op de uitbreiding van functionaliteit die in deze studie slechts gedeeltelijk of conceptueel werd uitgewerkt. Features zoals collaps</w:t>
+      </w:r>
+      <w:r>
+        <w:rPr>
+          <w:rFonts w:eastAsia="Times New Roman" w:cs="Times New Roman"/>
+          <w:kern w:val="0"/>
+          <w:lang w:eastAsia="nl-BE"/>
+          <w14:ligatures w14:val="none"/>
+        </w:rPr>
+        <w:noBreakHyphen/>
+      </w:r>
+      <w:proofErr w:type="spellStart"/>
+      <w:r>
+        <w:rPr>
+          <w:rFonts w:eastAsia="Times New Roman" w:cs="Times New Roman"/>
+          <w:kern w:val="0"/>
+          <w:lang w:eastAsia="nl-BE"/>
+          <w14:ligatures w14:val="none"/>
+        </w:rPr>
+        <w:t>children</w:t>
+      </w:r>
+      <w:proofErr w:type="spellEnd"/>
+      <w:r>
+        <w:rPr>
+          <w:rFonts w:eastAsia="Times New Roman" w:cs="Times New Roman"/>
+          <w:kern w:val="0"/>
+          <w:lang w:eastAsia="nl-BE"/>
+          <w14:ligatures w14:val="none"/>
+        </w:rPr>
+        <w:noBreakHyphen/>
+        <w:t xml:space="preserve">knoppen, </w:t>
+      </w:r>
+      <w:proofErr w:type="spellStart"/>
+      <w:r>
+        <w:rPr>
+          <w:rFonts w:eastAsia="Times New Roman" w:cs="Times New Roman"/>
+          <w:kern w:val="0"/>
+          <w:lang w:eastAsia="nl-BE"/>
+          <w14:ligatures w14:val="none"/>
+        </w:rPr>
+        <w:t>branch</w:t>
+      </w:r>
+      <w:proofErr w:type="spellEnd"/>
+      <w:r>
+        <w:rPr>
+          <w:rFonts w:eastAsia="Times New Roman" w:cs="Times New Roman"/>
+          <w:kern w:val="0"/>
+          <w:lang w:eastAsia="nl-BE"/>
+          <w14:ligatures w14:val="none"/>
+        </w:rPr>
+        <w:noBreakHyphen/>
+        <w:t>zoom en real</w:t>
+      </w:r>
+      <w:r>
+        <w:rPr>
+          <w:rFonts w:eastAsia="Times New Roman" w:cs="Times New Roman"/>
+          <w:kern w:val="0"/>
+          <w:lang w:eastAsia="nl-BE"/>
+          <w14:ligatures w14:val="none"/>
+        </w:rPr>
+        <w:noBreakHyphen/>
+        <w:t xml:space="preserve">time </w:t>
+      </w:r>
+      <w:proofErr w:type="spellStart"/>
+      <w:r>
+        <w:rPr>
+          <w:rFonts w:eastAsia="Times New Roman" w:cs="Times New Roman"/>
+          <w:kern w:val="0"/>
+          <w:lang w:eastAsia="nl-BE"/>
+          <w14:ligatures w14:val="none"/>
+        </w:rPr>
+        <w:t>multi</w:t>
+      </w:r>
+      <w:proofErr w:type="spellEnd"/>
+      <w:r>
+        <w:rPr>
+          <w:rFonts w:eastAsia="Times New Roman" w:cs="Times New Roman"/>
+          <w:kern w:val="0"/>
+          <w:lang w:eastAsia="nl-BE"/>
+          <w14:ligatures w14:val="none"/>
+        </w:rPr>
+        <w:noBreakHyphen/>
+        <w:t>user</w:t>
+      </w:r>
+      <w:r>
+        <w:rPr>
+          <w:rFonts w:eastAsia="Times New Roman" w:cs="Times New Roman"/>
+          <w:kern w:val="0"/>
+          <w:lang w:eastAsia="nl-BE"/>
+          <w14:ligatures w14:val="none"/>
+        </w:rPr>
+        <w:noBreakHyphen/>
+        <w:t xml:space="preserve">samenwerking zijn vooral relevant voor grotere modellen en </w:t>
+      </w:r>
+      <w:proofErr w:type="spellStart"/>
+      <w:r>
+        <w:rPr>
+          <w:rFonts w:eastAsia="Times New Roman" w:cs="Times New Roman"/>
+          <w:kern w:val="0"/>
+          <w:lang w:eastAsia="nl-BE"/>
+          <w14:ligatures w14:val="none"/>
+        </w:rPr>
+        <w:t>distribu</w:t>
+      </w:r>
+      <w:r>
+        <w:rPr>
+          <w:rFonts w:eastAsia="Times New Roman" w:cs="Times New Roman"/>
+          <w:kern w:val="0"/>
+          <w:lang w:eastAsia="nl-BE"/>
+          <w14:ligatures w14:val="none"/>
+        </w:rPr>
+        <w:softHyphen/>
+        <w:t>te</w:t>
+      </w:r>
+      <w:proofErr w:type="spellEnd"/>
+      <w:r>
+        <w:rPr>
+          <w:rFonts w:eastAsia="Times New Roman" w:cs="Times New Roman"/>
+          <w:kern w:val="0"/>
+          <w:lang w:eastAsia="nl-BE"/>
+          <w14:ligatures w14:val="none"/>
+        </w:rPr>
+        <w:t xml:space="preserve"> teams, maar vragen afzonderlijke evaluatie op vlak van bruikbaarheid en performance. Ten slotte vormen AI</w:t>
+      </w:r>
+      <w:r>
+        <w:rPr>
+          <w:rFonts w:eastAsia="Times New Roman" w:cs="Times New Roman"/>
+          <w:kern w:val="0"/>
+          <w:lang w:eastAsia="nl-BE"/>
+          <w14:ligatures w14:val="none"/>
+        </w:rPr>
+        <w:noBreakHyphen/>
+        <w:t xml:space="preserve">gebaseerde aanbevelingen voor </w:t>
+      </w:r>
+      <w:proofErr w:type="spellStart"/>
+      <w:r>
+        <w:rPr>
+          <w:rFonts w:eastAsia="Times New Roman" w:cs="Times New Roman"/>
+          <w:kern w:val="0"/>
+          <w:lang w:eastAsia="nl-BE"/>
+          <w14:ligatures w14:val="none"/>
+        </w:rPr>
+        <w:t>threats</w:t>
+      </w:r>
+      <w:proofErr w:type="spellEnd"/>
+      <w:r>
+        <w:rPr>
+          <w:rFonts w:eastAsia="Times New Roman" w:cs="Times New Roman"/>
+          <w:kern w:val="0"/>
+          <w:lang w:eastAsia="nl-BE"/>
+          <w14:ligatures w14:val="none"/>
+        </w:rPr>
+        <w:t xml:space="preserve"> en mitigaties een interessant spoor: automatische suggesties kunnen de drempel voor minder ervaren gebruikers verlagen, maar roepen tegelijk vragen op rond betrouwbaarheid, transparantie en mogelijke over</w:t>
+      </w:r>
+      <w:r>
+        <w:rPr>
+          <w:rFonts w:eastAsia="Times New Roman" w:cs="Times New Roman"/>
+          <w:kern w:val="0"/>
+          <w:lang w:eastAsia="nl-BE"/>
+          <w14:ligatures w14:val="none"/>
+        </w:rPr>
+        <w:noBreakHyphen/>
+        <w:t>afhankelijkheid, wat zorgvuldig empirisch onderzoek vereist.</w:t>
+      </w:r>
     </w:p>
     <w:p>
       <w:pPr>
@@ -14753,202 +15039,6 @@
           <w14:ligatures w14:val="none"/>
         </w:rPr>
       </w:pPr>
-      <w:r>
-        <w:rPr>
-          <w:rFonts w:eastAsia="Times New Roman" w:cs="Times New Roman"/>
-          <w:kern w:val="0"/>
-          <w:lang w:eastAsia="nl-BE"/>
-          <w14:ligatures w14:val="none"/>
-        </w:rPr>
-        <w:t>Test de tool met grotere groepen en longitudinale sessies, inclusief A/B-</w:t>
-      </w:r>
-      <w:proofErr w:type="spellStart"/>
-      <w:r>
-        <w:rPr>
-          <w:rFonts w:eastAsia="Times New Roman" w:cs="Times New Roman"/>
-          <w:kern w:val="0"/>
-          <w:lang w:eastAsia="nl-BE"/>
-          <w14:ligatures w14:val="none"/>
-        </w:rPr>
-        <w:t>testing</w:t>
-      </w:r>
-      <w:proofErr w:type="spellEnd"/>
-      <w:r>
-        <w:rPr>
-          <w:rFonts w:eastAsia="Times New Roman" w:cs="Times New Roman"/>
-          <w:kern w:val="0"/>
-          <w:lang w:eastAsia="nl-BE"/>
-          <w14:ligatures w14:val="none"/>
-        </w:rPr>
-        <w:t xml:space="preserve"> met commerciële </w:t>
-      </w:r>
-      <w:proofErr w:type="spellStart"/>
-      <w:r>
-        <w:rPr>
-          <w:rFonts w:eastAsia="Times New Roman" w:cs="Times New Roman"/>
-          <w:kern w:val="0"/>
-          <w:lang w:eastAsia="nl-BE"/>
-          <w14:ligatures w14:val="none"/>
-        </w:rPr>
-        <w:t>mindmap</w:t>
-      </w:r>
-      <w:proofErr w:type="spellEnd"/>
-      <w:r>
-        <w:rPr>
-          <w:rFonts w:eastAsia="Times New Roman" w:cs="Times New Roman"/>
-          <w:kern w:val="0"/>
-          <w:lang w:eastAsia="nl-BE"/>
-          <w14:ligatures w14:val="none"/>
-        </w:rPr>
-        <w:t>-software. Implementeer voorgestelde features zoals collaps</w:t>
-      </w:r>
-      <w:r>
-        <w:rPr>
-          <w:rFonts w:eastAsia="Times New Roman" w:cs="Times New Roman"/>
-          <w:kern w:val="0"/>
-          <w:lang w:eastAsia="nl-BE"/>
-          <w14:ligatures w14:val="none"/>
-        </w:rPr>
-        <w:t xml:space="preserve"> </w:t>
-      </w:r>
-      <w:proofErr w:type="spellStart"/>
-      <w:r>
-        <w:rPr>
-          <w:rFonts w:eastAsia="Times New Roman" w:cs="Times New Roman"/>
-          <w:kern w:val="0"/>
-          <w:lang w:eastAsia="nl-BE"/>
-          <w14:ligatures w14:val="none"/>
-        </w:rPr>
-        <w:t>child</w:t>
-      </w:r>
-      <w:r>
-        <w:rPr>
-          <w:rFonts w:eastAsia="Times New Roman" w:cs="Times New Roman"/>
-          <w:kern w:val="0"/>
-          <w:lang w:eastAsia="nl-BE"/>
-          <w14:ligatures w14:val="none"/>
-        </w:rPr>
-        <w:t>ren</w:t>
-      </w:r>
-      <w:proofErr w:type="spellEnd"/>
-      <w:r>
-        <w:rPr>
-          <w:rFonts w:eastAsia="Times New Roman" w:cs="Times New Roman"/>
-          <w:kern w:val="0"/>
-          <w:lang w:eastAsia="nl-BE"/>
-          <w14:ligatures w14:val="none"/>
-        </w:rPr>
-        <w:t xml:space="preserve"> </w:t>
-      </w:r>
-      <w:r>
-        <w:rPr>
-          <w:rFonts w:eastAsia="Times New Roman" w:cs="Times New Roman"/>
-          <w:kern w:val="0"/>
-          <w:lang w:eastAsia="nl-BE"/>
-          <w14:ligatures w14:val="none"/>
-        </w:rPr>
-        <w:t xml:space="preserve">knoppen en </w:t>
-      </w:r>
-      <w:proofErr w:type="spellStart"/>
-      <w:r>
-        <w:rPr>
-          <w:rFonts w:eastAsia="Times New Roman" w:cs="Times New Roman"/>
-          <w:kern w:val="0"/>
-          <w:lang w:eastAsia="nl-BE"/>
-          <w14:ligatures w14:val="none"/>
-        </w:rPr>
-        <w:t>branch</w:t>
-      </w:r>
-      <w:proofErr w:type="spellEnd"/>
-      <w:r>
-        <w:rPr>
-          <w:rFonts w:eastAsia="Times New Roman" w:cs="Times New Roman"/>
-          <w:kern w:val="0"/>
-          <w:lang w:eastAsia="nl-BE"/>
-          <w14:ligatures w14:val="none"/>
-        </w:rPr>
-        <w:t xml:space="preserve">-zoom, en evalueer collaboratieve </w:t>
-      </w:r>
-      <w:proofErr w:type="spellStart"/>
-      <w:r>
-        <w:rPr>
-          <w:rFonts w:eastAsia="Times New Roman" w:cs="Times New Roman"/>
-          <w:kern w:val="0"/>
-          <w:lang w:eastAsia="nl-BE"/>
-          <w14:ligatures w14:val="none"/>
-        </w:rPr>
-        <w:t>multi</w:t>
-      </w:r>
-      <w:proofErr w:type="spellEnd"/>
-      <w:r>
-        <w:rPr>
-          <w:rFonts w:eastAsia="Times New Roman" w:cs="Times New Roman"/>
-          <w:kern w:val="0"/>
-          <w:lang w:eastAsia="nl-BE"/>
-          <w14:ligatures w14:val="none"/>
-        </w:rPr>
-        <w:t xml:space="preserve">-user functionaliteit. Voeg AI-ondersteuning toe voor automatische </w:t>
-      </w:r>
-      <w:proofErr w:type="spellStart"/>
-      <w:r>
-        <w:rPr>
-          <w:rFonts w:eastAsia="Times New Roman" w:cs="Times New Roman"/>
-          <w:kern w:val="0"/>
-          <w:lang w:eastAsia="nl-BE"/>
-          <w14:ligatures w14:val="none"/>
-        </w:rPr>
-        <w:t>threat</w:t>
-      </w:r>
-      <w:proofErr w:type="spellEnd"/>
-      <w:r>
-        <w:rPr>
-          <w:rFonts w:eastAsia="Times New Roman" w:cs="Times New Roman"/>
-          <w:kern w:val="0"/>
-          <w:lang w:eastAsia="nl-BE"/>
-          <w14:ligatures w14:val="none"/>
-        </w:rPr>
-        <w:t xml:space="preserve">-suggesties en valideer tegen meer </w:t>
-      </w:r>
-      <w:proofErr w:type="spellStart"/>
-      <w:r>
-        <w:rPr>
-          <w:rFonts w:eastAsia="Times New Roman" w:cs="Times New Roman"/>
-          <w:kern w:val="0"/>
-          <w:lang w:eastAsia="nl-BE"/>
-          <w14:ligatures w14:val="none"/>
-        </w:rPr>
-        <w:t>threat</w:t>
-      </w:r>
-      <w:proofErr w:type="spellEnd"/>
-      <w:r>
-        <w:rPr>
-          <w:rFonts w:eastAsia="Times New Roman" w:cs="Times New Roman"/>
-          <w:kern w:val="0"/>
-          <w:lang w:eastAsia="nl-BE"/>
-          <w14:ligatures w14:val="none"/>
-        </w:rPr>
-        <w:t xml:space="preserve"> </w:t>
-      </w:r>
-      <w:proofErr w:type="spellStart"/>
-      <w:r>
-        <w:rPr>
-          <w:rFonts w:eastAsia="Times New Roman" w:cs="Times New Roman"/>
-          <w:kern w:val="0"/>
-          <w:lang w:eastAsia="nl-BE"/>
-          <w14:ligatures w14:val="none"/>
-        </w:rPr>
-        <w:t>modeling</w:t>
-      </w:r>
-      <w:proofErr w:type="spellEnd"/>
-      <w:r>
-        <w:rPr>
-          <w:rFonts w:eastAsia="Times New Roman" w:cs="Times New Roman"/>
-          <w:kern w:val="0"/>
-          <w:lang w:eastAsia="nl-BE"/>
-          <w14:ligatures w14:val="none"/>
-        </w:rPr>
-        <w:t xml:space="preserve"> methoden (STRIDE).</w:t>
-      </w:r>
       <w:r>
         <w:rPr>
           <w:b/>
@@ -14956,20 +15046,696 @@
           <w:sz w:val="32"/>
           <w:szCs w:val="32"/>
         </w:rPr>
-        <w:t xml:space="preserve"> </w:t>
-      </w:r>
-      <w:r>
+        <w:br w:type="page"/>
+      </w:r>
+    </w:p>
+    <w:p>
+      <w:pPr>
+        <w:rPr>
+          <w:b/>
+          <w:bCs/>
+          <w:sz w:val="36"/>
+          <w:szCs w:val="36"/>
+        </w:rPr>
+      </w:pPr>
+      <w:r>
+        <w:rPr>
+          <w:b/>
+          <w:bCs/>
+          <w:sz w:val="36"/>
+          <w:szCs w:val="36"/>
+        </w:rPr>
+        <w:lastRenderedPageBreak/>
+        <w:br w:type="page"/>
+      </w:r>
+    </w:p>
+    <w:p>
+      <w:pPr>
+        <w:spacing w:afterLines="24" w:after="57"/>
+        <w:rPr>
+          <w:b/>
+          <w:bCs/>
+          <w:sz w:val="36"/>
+          <w:szCs w:val="36"/>
+        </w:rPr>
+      </w:pPr>
+      <w:r>
+        <w:rPr>
+          <w:b/>
+          <w:bCs/>
+          <w:sz w:val="36"/>
+          <w:szCs w:val="36"/>
+        </w:rPr>
+        <w:lastRenderedPageBreak/>
+        <w:t xml:space="preserve">Hoofdstuk </w:t>
+      </w:r>
+      <w:r>
+        <w:rPr>
+          <w:b/>
+          <w:bCs/>
+          <w:sz w:val="36"/>
+          <w:szCs w:val="36"/>
+        </w:rPr>
+        <w:t>7</w:t>
+      </w:r>
+    </w:p>
+    <w:p>
+      <w:pPr>
+        <w:spacing w:afterLines="24" w:after="57" w:line="288" w:lineRule="auto"/>
+        <w:rPr>
+          <w:b/>
+          <w:bCs/>
+          <w:sz w:val="36"/>
+          <w:szCs w:val="36"/>
+        </w:rPr>
+      </w:pPr>
+      <w:r>
+        <w:rPr>
+          <w:b/>
+          <w:bCs/>
+          <w:sz w:val="36"/>
+          <w:szCs w:val="36"/>
+        </w:rPr>
+        <w:t>Conclusie</w:t>
+      </w:r>
+    </w:p>
+    <w:p>
+      <w:pPr>
+        <w:spacing w:afterLines="24" w:after="57" w:line="288" w:lineRule="auto"/>
         <w:rPr>
           <w:b/>
           <w:bCs/>
           <w:sz w:val="32"/>
           <w:szCs w:val="32"/>
         </w:rPr>
+      </w:pPr>
+    </w:p>
+    <w:p>
+      <w:pPr>
+        <w:spacing w:afterLines="24" w:after="57"/>
+      </w:pPr>
+      <w:proofErr w:type="spellStart"/>
+      <w:r>
+        <w:t>Threat</w:t>
+      </w:r>
+      <w:proofErr w:type="spellEnd"/>
+      <w:r>
+        <w:t xml:space="preserve"> </w:t>
+      </w:r>
+      <w:proofErr w:type="spellStart"/>
+      <w:r>
+        <w:t>modeling</w:t>
+      </w:r>
+      <w:proofErr w:type="spellEnd"/>
+      <w:r>
+        <w:t xml:space="preserve"> is een systematische aanpak om mogelijke bedreigingen, kwetsbaarheden en misbruikscenario’s in een softwaresysteem te identificeren en te mitigeren vóór implementatie. In de praktijk blijft deze stap echter vaak achterwege door de perceptie dat </w:t>
+      </w:r>
+      <w:proofErr w:type="spellStart"/>
+      <w:r>
+        <w:t>threat</w:t>
+      </w:r>
+      <w:proofErr w:type="spellEnd"/>
+      <w:r>
+        <w:t xml:space="preserve"> </w:t>
+      </w:r>
+      <w:proofErr w:type="spellStart"/>
+      <w:r>
+        <w:t>modeling</w:t>
+      </w:r>
+      <w:proofErr w:type="spellEnd"/>
+      <w:r>
+        <w:t xml:space="preserve"> complex, tijdsintensief en voorbehouden aan security</w:t>
+      </w:r>
+      <w:r>
+        <w:noBreakHyphen/>
+        <w:t xml:space="preserve">experts is. De </w:t>
+      </w:r>
+      <w:proofErr w:type="spellStart"/>
+      <w:r>
+        <w:t>Fortunately</w:t>
+      </w:r>
+      <w:proofErr w:type="spellEnd"/>
+      <w:r>
+        <w:t>–</w:t>
+      </w:r>
+      <w:proofErr w:type="spellStart"/>
+      <w:r>
+        <w:t>Unfortunately</w:t>
+      </w:r>
+      <w:proofErr w:type="spellEnd"/>
+      <w:r>
+        <w:noBreakHyphen/>
+        <w:t xml:space="preserve">methode biedt een meer verhalende, iteratieve manier om risico’s en mitigaties als ketens van “gelukkig/helaas”-stappen te structureren, maar er ontbrak een toegankelijke, gespecialiseerde tool om deze aanpak in </w:t>
+      </w:r>
+      <w:proofErr w:type="spellStart"/>
+      <w:r>
+        <w:t>DevSecOps</w:t>
+      </w:r>
+      <w:proofErr w:type="spellEnd"/>
+      <w:r>
+        <w:noBreakHyphen/>
+        <w:t xml:space="preserve">context te ondersteunen. In dit werk werd daarom een </w:t>
+      </w:r>
+      <w:proofErr w:type="spellStart"/>
+      <w:r>
+        <w:t>domeinspecifieke</w:t>
+      </w:r>
+      <w:proofErr w:type="spellEnd"/>
+      <w:r>
+        <w:t xml:space="preserve"> </w:t>
+      </w:r>
+      <w:proofErr w:type="spellStart"/>
+      <w:r>
+        <w:t>webtool</w:t>
+      </w:r>
+      <w:proofErr w:type="spellEnd"/>
+      <w:r>
+        <w:t xml:space="preserve"> ontworpen, geïmplementeerd en geëvalueerd, met als doel </w:t>
+      </w:r>
+      <w:proofErr w:type="spellStart"/>
+      <w:r>
+        <w:t>threat</w:t>
+      </w:r>
+      <w:proofErr w:type="spellEnd"/>
+      <w:r>
+        <w:t xml:space="preserve"> </w:t>
+      </w:r>
+      <w:proofErr w:type="spellStart"/>
+      <w:r>
+        <w:t>modeling</w:t>
+      </w:r>
+      <w:proofErr w:type="spellEnd"/>
+      <w:r>
+        <w:t xml:space="preserve"> laagdrempeliger te maken voor ontwikkelaars met beperkte security</w:t>
+      </w:r>
+      <w:r>
+        <w:noBreakHyphen/>
+        <w:t>expertise.</w:t>
+      </w:r>
+    </w:p>
+    <w:p>
+      <w:pPr>
+        <w:spacing w:afterLines="24" w:after="57"/>
+      </w:pPr>
+    </w:p>
+    <w:p>
+      <w:pPr>
+        <w:spacing w:afterLines="24" w:after="57"/>
+      </w:pPr>
+      <w:r>
+        <w:t>Centraal stonden</w:t>
+      </w:r>
+      <w:r>
+        <w:t xml:space="preserve"> de volgende</w:t>
+      </w:r>
+      <w:r>
+        <w:t xml:space="preserve"> drie onderzoeksvragen:</w:t>
+      </w:r>
+      <w:r>
+        <w:t xml:space="preserve"> </w:t>
+      </w:r>
+    </w:p>
+    <w:p>
+      <w:pPr>
+        <w:pStyle w:val="Lijstalinea"/>
+        <w:numPr>
+          <w:ilvl w:val="0"/>
+          <w:numId w:val="26"/>
+        </w:numPr>
+        <w:spacing w:afterLines="24" w:after="57"/>
+      </w:pPr>
+      <w:r>
+        <w:t xml:space="preserve">welke basisfunctionaliteit minimaal noodzakelijk is om </w:t>
+      </w:r>
+      <w:proofErr w:type="spellStart"/>
+      <w:r>
+        <w:t>threat</w:t>
+      </w:r>
+      <w:proofErr w:type="spellEnd"/>
+      <w:r>
+        <w:t xml:space="preserve"> </w:t>
+      </w:r>
+      <w:proofErr w:type="spellStart"/>
+      <w:r>
+        <w:t>modeling</w:t>
+      </w:r>
+      <w:proofErr w:type="spellEnd"/>
+      <w:r>
+        <w:t xml:space="preserve"> met </w:t>
+      </w:r>
+      <w:proofErr w:type="spellStart"/>
+      <w:r>
+        <w:t>Fortunately</w:t>
+      </w:r>
+      <w:proofErr w:type="spellEnd"/>
+      <w:r>
+        <w:t>–</w:t>
+      </w:r>
+      <w:proofErr w:type="spellStart"/>
+      <w:r>
+        <w:t>Unfortunately</w:t>
+      </w:r>
+      <w:proofErr w:type="spellEnd"/>
+      <w:r>
+        <w:noBreakHyphen/>
+        <w:t>trees te ondersteunen</w:t>
+      </w:r>
+      <w:r>
+        <w:t xml:space="preserve">; </w:t>
+      </w:r>
+    </w:p>
+    <w:p>
+      <w:pPr>
+        <w:pStyle w:val="Lijstalinea"/>
+        <w:numPr>
+          <w:ilvl w:val="0"/>
+          <w:numId w:val="26"/>
+        </w:numPr>
+        <w:spacing w:afterLines="24" w:after="57"/>
+      </w:pPr>
+      <w:r>
+        <w:t>welke bijkomende UX</w:t>
+      </w:r>
+      <w:r>
+        <w:noBreakHyphen/>
+        <w:t>features verhogen de bruikbaarheid en verlagen de cognitieve belasting;</w:t>
+      </w:r>
+    </w:p>
+    <w:p>
+      <w:pPr>
+        <w:pStyle w:val="Lijstalinea"/>
+        <w:numPr>
+          <w:ilvl w:val="0"/>
+          <w:numId w:val="26"/>
+        </w:numPr>
+        <w:spacing w:afterLines="24" w:after="57"/>
+      </w:pPr>
+      <w:r>
+        <w:t xml:space="preserve">hoe verhoudt een uitgebreide versie van de tool zich tot een basisversie op vlak van gebruiksvriendelijkheid en effectiviteit. </w:t>
+      </w:r>
+    </w:p>
+    <w:p>
+      <w:pPr>
+        <w:spacing w:afterLines="24" w:after="57"/>
+        <w:rPr>
+          <w:i/>
+          <w:iCs/>
+        </w:rPr>
+      </w:pPr>
+      <w:r>
+        <w:t>Om deze vragen te beantwoorden werd eerst een basisprototype ontwikkeld met kernfunctionaliteit (</w:t>
+      </w:r>
+      <w:proofErr w:type="spellStart"/>
+      <w:r>
+        <w:t>nodecreatie</w:t>
+      </w:r>
+      <w:proofErr w:type="spellEnd"/>
+      <w:r>
+        <w:t xml:space="preserve">, inklappen/uitklappen, zoeken), gevolgd door een uitgebreide versie met onder meer statusiconen, </w:t>
+      </w:r>
+      <w:proofErr w:type="spellStart"/>
+      <w:r>
+        <w:t>danger</w:t>
+      </w:r>
+      <w:proofErr w:type="spellEnd"/>
+      <w:r>
+        <w:t xml:space="preserve"> ratings, </w:t>
+      </w:r>
+      <w:proofErr w:type="spellStart"/>
+      <w:r>
+        <w:t>branch</w:t>
+      </w:r>
+      <w:proofErr w:type="spellEnd"/>
+      <w:r>
+        <w:noBreakHyphen/>
+        <w:t>summary en filterzijpanelen. Beide versies werden vervolgens vergeleken in een gebruikersstudie met ontwikkelaars, waarbij zowel kwantitatieve metingen (UEQ</w:t>
+      </w:r>
+      <w:r>
+        <w:noBreakHyphen/>
+        <w:t>scores, taakprestaties) als kwalitatieve feedback werden verzameld.</w:t>
+      </w:r>
+    </w:p>
+    <w:p>
+      <w:pPr>
+        <w:spacing w:afterLines="24" w:after="57"/>
+      </w:pPr>
+    </w:p>
+    <w:p>
+      <w:pPr>
+        <w:spacing w:afterLines="24" w:after="57"/>
+      </w:pPr>
+      <w:r>
+        <w:t xml:space="preserve">Met betrekking tot onderzoeksvraag 1 tonen de resultaten dat de minimale basisfunctionaliteit weliswaar voldoende is om </w:t>
+      </w:r>
+      <w:proofErr w:type="spellStart"/>
+      <w:r>
+        <w:t>Fortunately</w:t>
+      </w:r>
+      <w:proofErr w:type="spellEnd"/>
+      <w:r>
+        <w:t>–</w:t>
+      </w:r>
+      <w:proofErr w:type="spellStart"/>
+      <w:r>
+        <w:t>Unfortunately</w:t>
+      </w:r>
+      <w:proofErr w:type="spellEnd"/>
+      <w:r>
+        <w:noBreakHyphen/>
+        <w:t xml:space="preserve">trees structureel op te bouwen, maar ontoereikend blijft voor efficiënte </w:t>
+      </w:r>
+      <w:proofErr w:type="spellStart"/>
+      <w:r>
+        <w:t>threat</w:t>
+      </w:r>
+      <w:proofErr w:type="spellEnd"/>
+      <w:r>
+        <w:t xml:space="preserve"> </w:t>
+      </w:r>
+      <w:proofErr w:type="spellStart"/>
+      <w:r>
+        <w:t>modeling</w:t>
+      </w:r>
+      <w:proofErr w:type="spellEnd"/>
+      <w:r>
+        <w:t xml:space="preserve"> zonder bijkomende ondersteuning. De negatieve UEQ</w:t>
+      </w:r>
+      <w:r>
+        <w:noBreakHyphen/>
+        <w:t xml:space="preserve">scores van versie 1 en de gerapporteerde moeite om overzicht te houden op grotere trees suggereren dat gebruikers snel het noorden verliezen en veel tijd kwijt zijn aan navigatie en handmatig prioriteren. Dit bevestigt dat een “platte” </w:t>
+      </w:r>
+      <w:proofErr w:type="spellStart"/>
+      <w:r>
+        <w:t>mindmap</w:t>
+      </w:r>
+      <w:proofErr w:type="spellEnd"/>
+      <w:r>
+        <w:noBreakHyphen/>
+        <w:t>benadering niet volstaat om niet</w:t>
+      </w:r>
+      <w:r>
+        <w:noBreakHyphen/>
+        <w:t>experts effectief door complexere security</w:t>
+      </w:r>
+      <w:r>
+        <w:noBreakHyphen/>
+        <w:t>redeneringen te loodsen.</w:t>
+      </w:r>
+    </w:p>
+    <w:p>
+      <w:pPr>
+        <w:spacing w:afterLines="24" w:after="57"/>
+      </w:pPr>
+    </w:p>
+    <w:p>
+      <w:pPr>
+        <w:spacing w:afterLines="24" w:after="57"/>
+      </w:pPr>
+      <w:r>
+        <w:t>Voor onderzoeksvraag 2 blijkt uit zowel de vragenlijsten als de observaties dat gebruikers vooral de pragmatische UX</w:t>
+      </w:r>
+      <w:r>
+        <w:noBreakHyphen/>
+        <w:t>features waarderen: filtering op node</w:t>
+      </w:r>
+      <w:r>
+        <w:noBreakHyphen/>
+        <w:t xml:space="preserve">status, tellingen per </w:t>
+      </w:r>
+      <w:r>
+        <w:lastRenderedPageBreak/>
+        <w:t xml:space="preserve">status en directe </w:t>
+      </w:r>
+      <w:proofErr w:type="spellStart"/>
+      <w:r>
+        <w:t>highlighting</w:t>
+      </w:r>
+      <w:proofErr w:type="spellEnd"/>
+      <w:r>
+        <w:t xml:space="preserve"> vanuit de filterbalk worden als bijzonder nuttig ervaren, gevolgd door visuele codering via kleuren en iconen. Deze elementen helpen gebruikers om snel de belangrijkste </w:t>
+      </w:r>
+      <w:proofErr w:type="spellStart"/>
+      <w:r>
+        <w:t>weaknesses</w:t>
+      </w:r>
+      <w:proofErr w:type="spellEnd"/>
+      <w:r>
+        <w:t xml:space="preserve"> en aannames te identificeren, de voortgang van hun model in te schatten en relevante delen van de boom terug te vinden zonder langdurig scrollen. De resultaten wijzen erop dat dergelijke features de cognitieve belasting merkbaar verlagen door “herkenning boven herinnering” te ondersteunen en onnodige zoek- en navigeeracties te beperken.</w:t>
+      </w:r>
+    </w:p>
+    <w:p>
+      <w:pPr>
+        <w:spacing w:afterLines="24" w:after="57"/>
+      </w:pPr>
+    </w:p>
+    <w:p>
+      <w:pPr>
+        <w:spacing w:afterLines="24" w:after="57"/>
+      </w:pPr>
+      <w:r>
+        <w:t>Bij onderzoeksvraag 3 laat de vergelijking tussen de basisversie en de uitgebreide versie zien dat de doorgevoerde UX</w:t>
+      </w:r>
+      <w:r>
+        <w:noBreakHyphen/>
+        <w:t>verbeteringen zich vertalen in zowel subjectieve als objectieve winst. De uitgebreide tool (versie 2) scoort duidelijk positiever op de meeste UEQ</w:t>
+      </w:r>
+      <w:r>
+        <w:noBreakHyphen/>
+        <w:t xml:space="preserve">schalen dan de basisversie, en deelnemers rapporteren een hogere mate van controle, overzicht en efficiëntie. Tegelijkertijd wijzen observaties en taakmetingen op tijdswinst en minder fouten bij het lokaliseren en beoordelen van risico’s, wat erop wijst dat </w:t>
+      </w:r>
+      <w:proofErr w:type="spellStart"/>
+      <w:r>
+        <w:t>threat</w:t>
+      </w:r>
+      <w:proofErr w:type="spellEnd"/>
+      <w:r>
+        <w:t xml:space="preserve"> </w:t>
+      </w:r>
+      <w:proofErr w:type="spellStart"/>
+      <w:r>
+        <w:t>modeling</w:t>
+      </w:r>
+      <w:proofErr w:type="spellEnd"/>
+      <w:r>
+        <w:t xml:space="preserve"> met deze uitgebreide tool toegankelijker wordt voor niet</w:t>
+      </w:r>
+      <w:r>
+        <w:noBreakHyphen/>
+        <w:t xml:space="preserve">experts dan met een generieke </w:t>
+      </w:r>
+      <w:proofErr w:type="spellStart"/>
+      <w:r>
+        <w:t>mindmap</w:t>
+      </w:r>
+      <w:proofErr w:type="spellEnd"/>
+      <w:r>
+        <w:noBreakHyphen/>
+        <w:t>opzet.</w:t>
+      </w:r>
+    </w:p>
+    <w:p>
+      <w:pPr>
+        <w:spacing w:afterLines="24" w:after="57"/>
+      </w:pPr>
+    </w:p>
+    <w:p>
+      <w:pPr>
+        <w:spacing w:afterLines="24" w:after="57"/>
+      </w:pPr>
+      <w:r>
+        <w:t xml:space="preserve">Overkoepelend voldoet de tool in belangrijke mate aan bekende </w:t>
+      </w:r>
+      <w:proofErr w:type="spellStart"/>
+      <w:r>
+        <w:t>usability</w:t>
+      </w:r>
+      <w:proofErr w:type="spellEnd"/>
+      <w:r>
+        <w:noBreakHyphen/>
+        <w:t xml:space="preserve">heuristieken van </w:t>
+      </w:r>
+      <w:proofErr w:type="spellStart"/>
+      <w:r>
+        <w:t>Nielsen</w:t>
+      </w:r>
+      <w:proofErr w:type="spellEnd"/>
+      <w:r>
+        <w:t>, zoals zichtbaarheid van systeemstatus, overeenstemming tussen systeem en mentale modellen, en minimalisatie van geheugenlast. Het UX</w:t>
+      </w:r>
+      <w:r>
+        <w:noBreakHyphen/>
+        <w:t>profiel verschuift van overwegend negatief in de basisversie naar duidelijk positief in de uitgebreide versie, met name op dimensies als efficiëntie, stimulatie en originaliteit. Praktisch impliceert dit dat development teams vergelijkbare UX</w:t>
+      </w:r>
+      <w:r>
+        <w:noBreakHyphen/>
+        <w:t xml:space="preserve">patronen – filtering op status, automatische </w:t>
+      </w:r>
+      <w:proofErr w:type="spellStart"/>
+      <w:r>
+        <w:t>danger</w:t>
+      </w:r>
+      <w:proofErr w:type="spellEnd"/>
+      <w:r>
+        <w:t xml:space="preserve"> ratings, expliciete statusiconen en </w:t>
+      </w:r>
+      <w:proofErr w:type="spellStart"/>
+      <w:r>
+        <w:t>branch</w:t>
+      </w:r>
+      <w:proofErr w:type="spellEnd"/>
+      <w:r>
+        <w:noBreakHyphen/>
+        <w:t xml:space="preserve">samenvattingen – kunnen integreren in bestaande </w:t>
+      </w:r>
+      <w:proofErr w:type="spellStart"/>
+      <w:r>
+        <w:t>threat</w:t>
+      </w:r>
+      <w:r>
+        <w:noBreakHyphen/>
+        <w:t>modelingtools</w:t>
+      </w:r>
+      <w:proofErr w:type="spellEnd"/>
+      <w:r>
+        <w:t xml:space="preserve"> of </w:t>
+      </w:r>
+      <w:proofErr w:type="spellStart"/>
+      <w:r>
+        <w:t>DevSecOps</w:t>
+      </w:r>
+      <w:r>
+        <w:noBreakHyphen/>
+        <w:t>pipelines</w:t>
+      </w:r>
+      <w:proofErr w:type="spellEnd"/>
+      <w:r>
+        <w:t xml:space="preserve"> om de drempel tot structurele security</w:t>
+      </w:r>
+      <w:r>
+        <w:noBreakHyphen/>
+        <w:t>analyses te verlagen.</w:t>
+      </w:r>
+    </w:p>
+    <w:p>
+      <w:pPr>
+        <w:spacing w:afterLines="24" w:after="57"/>
+      </w:pPr>
+    </w:p>
+    <w:p>
+      <w:pPr>
+        <w:spacing w:afterLines="24" w:after="57"/>
+      </w:pPr>
+      <w:r>
+        <w:t xml:space="preserve">Voor de praktijk biedt het werk daarmee een concreet, laagdrempelig startpunt voor organisaties die </w:t>
+      </w:r>
+      <w:proofErr w:type="spellStart"/>
+      <w:r>
+        <w:t>threat</w:t>
+      </w:r>
+      <w:proofErr w:type="spellEnd"/>
+      <w:r>
+        <w:t xml:space="preserve"> </w:t>
+      </w:r>
+      <w:proofErr w:type="spellStart"/>
+      <w:r>
+        <w:t>modeling</w:t>
+      </w:r>
+      <w:proofErr w:type="spellEnd"/>
+      <w:r>
+        <w:t xml:space="preserve"> willen verankeren in hun ontwikkelprocessen zonder zware methodologische of toolmatige instap. Voor het onderwijs vormt het prototype een didactische omgeving waarin studenten </w:t>
+      </w:r>
+      <w:proofErr w:type="spellStart"/>
+      <w:r>
+        <w:t>Fortunately</w:t>
+      </w:r>
+      <w:proofErr w:type="spellEnd"/>
+      <w:r>
+        <w:t>–</w:t>
+      </w:r>
+      <w:proofErr w:type="spellStart"/>
+      <w:r>
+        <w:t>Unfortunately</w:t>
+      </w:r>
+      <w:proofErr w:type="spellEnd"/>
+      <w:r>
+        <w:noBreakHyphen/>
+        <w:t xml:space="preserve">ketens kunnen opbouwen en analyseren, en zo op een visuele en interactieve manier kennismaken met kernconcepten uit </w:t>
+      </w:r>
+      <w:proofErr w:type="spellStart"/>
+      <w:r>
+        <w:t>threat</w:t>
+      </w:r>
+      <w:proofErr w:type="spellEnd"/>
+      <w:r>
+        <w:t xml:space="preserve"> modeling. Toekomstig onderzoek kan voortbouwen op deze basis door de tool te testen in grotere en meer diverse </w:t>
+      </w:r>
+      <w:proofErr w:type="spellStart"/>
+      <w:r>
+        <w:t>settings</w:t>
+      </w:r>
+      <w:proofErr w:type="spellEnd"/>
+      <w:r>
+        <w:t xml:space="preserve">, de voorgestelde verbeteringen (zoals globale </w:t>
+      </w:r>
+      <w:proofErr w:type="spellStart"/>
+      <w:r>
+        <w:t>collapse</w:t>
+      </w:r>
+      <w:proofErr w:type="spellEnd"/>
+      <w:r>
+        <w:noBreakHyphen/>
+        <w:t xml:space="preserve">knoppen, </w:t>
+      </w:r>
+      <w:proofErr w:type="spellStart"/>
+      <w:r>
+        <w:t>branch</w:t>
+      </w:r>
+      <w:proofErr w:type="spellEnd"/>
+      <w:r>
+        <w:noBreakHyphen/>
+        <w:t>zoom en real</w:t>
+      </w:r>
+      <w:r>
+        <w:noBreakHyphen/>
+        <w:t>time samenwerking) te implementeren en de rol van AI</w:t>
+      </w:r>
+      <w:r>
+        <w:noBreakHyphen/>
+        <w:t xml:space="preserve">ondersteuning voor </w:t>
+      </w:r>
+      <w:proofErr w:type="spellStart"/>
+      <w:r>
+        <w:t>threat</w:t>
+      </w:r>
+      <w:proofErr w:type="spellEnd"/>
+      <w:r>
+        <w:noBreakHyphen/>
+        <w:t xml:space="preserve">suggesties verder te verkennen. Zo kan de hier gepresenteerde tool uitgroeien van </w:t>
+      </w:r>
+      <w:proofErr w:type="spellStart"/>
+      <w:r>
+        <w:t>onderzoeksprototype</w:t>
+      </w:r>
+      <w:proofErr w:type="spellEnd"/>
+      <w:r>
+        <w:t xml:space="preserve"> tot een volwaardig instrument voor zowel industrie als security</w:t>
+      </w:r>
+      <w:r>
+        <w:noBreakHyphen/>
+        <w:t>onderwijs.</w:t>
+      </w:r>
+    </w:p>
+    <w:p>
+      <w:pPr>
+        <w:spacing w:afterLines="24" w:after="57"/>
+      </w:pPr>
+      <w:r>
         <w:br w:type="page"/>
       </w:r>
     </w:p>
     <w:p>
       <w:pPr>
+        <w:spacing w:afterLines="24" w:after="57"/>
         <w:rPr>
           <w:b/>
           <w:bCs/>
@@ -14985,384 +15751,11 @@
           <w:szCs w:val="36"/>
         </w:rPr>
         <w:lastRenderedPageBreak/>
-        <w:br w:type="page"/>
-      </w:r>
-    </w:p>
-    <w:p>
-      <w:pPr>
-        <w:spacing w:afterLines="24" w:after="57"/>
-        <w:rPr>
-          <w:b/>
-          <w:bCs/>
-          <w:sz w:val="36"/>
-          <w:szCs w:val="36"/>
-        </w:rPr>
-      </w:pPr>
-      <w:r>
-        <w:rPr>
-          <w:b/>
-          <w:bCs/>
-          <w:sz w:val="36"/>
-          <w:szCs w:val="36"/>
-        </w:rPr>
-        <w:lastRenderedPageBreak/>
-        <w:t xml:space="preserve">Hoofdstuk </w:t>
-      </w:r>
-      <w:r>
-        <w:rPr>
-          <w:b/>
-          <w:bCs/>
-          <w:sz w:val="36"/>
-          <w:szCs w:val="36"/>
-        </w:rPr>
-        <w:t>7</w:t>
-      </w:r>
-    </w:p>
-    <w:p>
-      <w:pPr>
-        <w:spacing w:afterLines="24" w:after="57" w:line="288" w:lineRule="auto"/>
-        <w:rPr>
-          <w:b/>
-          <w:bCs/>
-          <w:sz w:val="36"/>
-          <w:szCs w:val="36"/>
-        </w:rPr>
-      </w:pPr>
-      <w:r>
-        <w:rPr>
-          <w:b/>
-          <w:bCs/>
-          <w:sz w:val="36"/>
-          <w:szCs w:val="36"/>
-        </w:rPr>
-        <w:t>Conclusie</w:t>
-      </w:r>
-    </w:p>
-    <w:p>
-      <w:pPr>
-        <w:spacing w:afterLines="24" w:after="57" w:line="288" w:lineRule="auto"/>
-        <w:rPr>
-          <w:b/>
-          <w:bCs/>
-          <w:sz w:val="32"/>
-          <w:szCs w:val="32"/>
-        </w:rPr>
-      </w:pPr>
-    </w:p>
-    <w:p>
-      <w:pPr>
-        <w:spacing w:afterLines="24" w:after="57" w:line="288" w:lineRule="auto"/>
-      </w:pPr>
-      <w:proofErr w:type="spellStart"/>
-      <w:r>
-        <w:t>Threat</w:t>
-      </w:r>
-      <w:proofErr w:type="spellEnd"/>
-      <w:r>
-        <w:t xml:space="preserve"> </w:t>
-      </w:r>
-      <w:proofErr w:type="spellStart"/>
-      <w:r>
-        <w:t>modeling</w:t>
-      </w:r>
-      <w:proofErr w:type="spellEnd"/>
-      <w:r>
-        <w:t xml:space="preserve"> blijft in de praktijk vaak achterwege door complexiteit en gebrek aan toegankelijke tools, ondanks erkenning als essentieel voor secure software engineering. Dit onderzoek toont aan dat een </w:t>
-      </w:r>
-      <w:proofErr w:type="spellStart"/>
-      <w:r>
-        <w:t>domeinspecifieke</w:t>
-      </w:r>
-      <w:proofErr w:type="spellEnd"/>
-      <w:r>
-        <w:t xml:space="preserve"> </w:t>
-      </w:r>
-      <w:proofErr w:type="spellStart"/>
-      <w:r>
-        <w:t>webtool</w:t>
-      </w:r>
-      <w:proofErr w:type="spellEnd"/>
-      <w:r>
-        <w:t xml:space="preserve"> gebaseerd op de </w:t>
-      </w:r>
-      <w:proofErr w:type="spellStart"/>
-      <w:r>
-        <w:t>Fortunately</w:t>
-      </w:r>
-      <w:proofErr w:type="spellEnd"/>
-      <w:r>
-        <w:t>-</w:t>
-      </w:r>
-      <w:proofErr w:type="spellStart"/>
-      <w:r>
-        <w:t>Unfortunately</w:t>
-      </w:r>
-      <w:proofErr w:type="spellEnd"/>
-      <w:r>
-        <w:t>-methode, verrijkt met visuele UX-features, deze kloof effectief kan dichten.</w:t>
-      </w:r>
-    </w:p>
-    <w:p>
-      <w:pPr>
-        <w:spacing w:afterLines="24" w:after="57" w:line="288" w:lineRule="auto"/>
-      </w:pPr>
-    </w:p>
-    <w:p>
-      <w:pPr>
-        <w:spacing w:afterLines="24" w:after="57" w:line="288" w:lineRule="auto"/>
-      </w:pPr>
-      <w:r>
-        <w:rPr>
-          <w:b/>
-          <w:bCs/>
-        </w:rPr>
-        <w:t>Onderzoeksvraag 1</w:t>
-      </w:r>
-      <w:r>
-        <w:t xml:space="preserve">: De minimale basisfunctionaliteit (node-creatie, uitklappen/inklappen, zoeken) ondersteunt </w:t>
-      </w:r>
-      <w:proofErr w:type="spellStart"/>
-      <w:r>
-        <w:t>Fortunately-Unfortunately</w:t>
-      </w:r>
-      <w:proofErr w:type="spellEnd"/>
-      <w:r>
-        <w:t xml:space="preserve"> trees, maar blijkt ontoereikend voor efficiënte </w:t>
-      </w:r>
-      <w:proofErr w:type="spellStart"/>
-      <w:r>
-        <w:t>threat</w:t>
-      </w:r>
-      <w:proofErr w:type="spellEnd"/>
-      <w:r>
-        <w:t xml:space="preserve"> </w:t>
-      </w:r>
-      <w:proofErr w:type="spellStart"/>
-      <w:r>
-        <w:t>modeling</w:t>
-      </w:r>
-      <w:proofErr w:type="spellEnd"/>
-      <w:r>
-        <w:t xml:space="preserve"> zonder security-expertise, zoals blijkt uit de negatieve UEQ-scores van versie 1.</w:t>
-      </w:r>
-    </w:p>
-    <w:p>
-      <w:pPr>
-        <w:spacing w:afterLines="24" w:after="57" w:line="288" w:lineRule="auto"/>
-      </w:pPr>
-    </w:p>
-    <w:p>
-      <w:pPr>
-        <w:spacing w:afterLines="24" w:after="57" w:line="288" w:lineRule="auto"/>
-      </w:pPr>
-      <w:r>
-        <w:rPr>
-          <w:b/>
-          <w:bCs/>
-        </w:rPr>
-        <w:t>Onderzoeksvraag 2</w:t>
-      </w:r>
-      <w:r>
-        <w:t xml:space="preserve">: Gebruikers ervaren filtering op node-status, tellingen per status en </w:t>
-      </w:r>
-      <w:proofErr w:type="spellStart"/>
-      <w:r>
-        <w:t>highlighting</w:t>
-      </w:r>
-      <w:proofErr w:type="spellEnd"/>
-      <w:r>
-        <w:t xml:space="preserve"> vanuit de filterbalk als meest nuttig, gevolgd door visuele codering (kleuren, iconen). </w:t>
-      </w:r>
-      <w:r>
-        <w:t>Deze pragmatische features reduceren cognitieve belasting significant.</w:t>
-      </w:r>
-    </w:p>
-    <w:p>
-      <w:pPr>
-        <w:spacing w:afterLines="24" w:after="57" w:line="288" w:lineRule="auto"/>
-      </w:pPr>
-    </w:p>
-    <w:p>
-      <w:pPr>
-        <w:spacing w:afterLines="24" w:after="57" w:line="288" w:lineRule="auto"/>
-      </w:pPr>
-      <w:r>
-        <w:rPr>
-          <w:b/>
-          <w:bCs/>
-        </w:rPr>
-        <w:t>Onderzoeksvraag 3</w:t>
-      </w:r>
-      <w:r>
-        <w:t xml:space="preserve">: De uitgebreide tool (versie 2) overtreft </w:t>
-      </w:r>
-      <w:r>
-        <w:t>de basisversie van de</w:t>
-      </w:r>
-      <w:r>
-        <w:t xml:space="preserve"> </w:t>
-      </w:r>
-      <w:proofErr w:type="spellStart"/>
-      <w:r>
-        <w:t>mindmap</w:t>
-      </w:r>
-      <w:proofErr w:type="spellEnd"/>
-      <w:r>
-        <w:t xml:space="preserve">-software op gebruiksvriendelijkheid (positieve UEQ-scores vs. negatief) en effectiviteit (tijdsbesparing, foutreductie), waardoor </w:t>
-      </w:r>
-      <w:proofErr w:type="spellStart"/>
-      <w:r>
-        <w:t>threat</w:t>
-      </w:r>
-      <w:proofErr w:type="spellEnd"/>
-      <w:r>
-        <w:t xml:space="preserve"> </w:t>
-      </w:r>
-      <w:proofErr w:type="spellStart"/>
-      <w:r>
-        <w:t>modeling</w:t>
-      </w:r>
-      <w:proofErr w:type="spellEnd"/>
-      <w:r>
-        <w:t xml:space="preserve"> toegankelijk wordt voor niet-experts.</w:t>
-      </w:r>
-    </w:p>
-    <w:p>
-      <w:pPr>
-        <w:spacing w:afterLines="24" w:after="57" w:line="288" w:lineRule="auto"/>
-      </w:pPr>
-    </w:p>
-    <w:p>
-      <w:pPr>
-        <w:spacing w:afterLines="24" w:after="57" w:line="288" w:lineRule="auto"/>
-      </w:pPr>
-      <w:r>
-        <w:t xml:space="preserve">De tool voldoet aan Nielsens </w:t>
-      </w:r>
-      <w:proofErr w:type="spellStart"/>
-      <w:r>
-        <w:t>usability</w:t>
-      </w:r>
-      <w:proofErr w:type="spellEnd"/>
-      <w:r>
-        <w:t xml:space="preserve">-heuristieken en verschuift het UX-profiel van negatief naar duidelijk positief, vooral op efficiëntie, stimulatie en originaliteit. Praktisch betekent dit dat development teams filtering, automatische </w:t>
-      </w:r>
-      <w:proofErr w:type="spellStart"/>
-      <w:r>
-        <w:t>danger</w:t>
-      </w:r>
-      <w:proofErr w:type="spellEnd"/>
-      <w:r>
-        <w:t xml:space="preserve"> ratings en status-iconen kunnen integreren om </w:t>
-      </w:r>
-      <w:proofErr w:type="spellStart"/>
-      <w:r>
-        <w:t>threat</w:t>
-      </w:r>
-      <w:proofErr w:type="spellEnd"/>
-      <w:r>
-        <w:t xml:space="preserve"> </w:t>
-      </w:r>
-      <w:proofErr w:type="spellStart"/>
-      <w:r>
-        <w:t>modeling</w:t>
-      </w:r>
-      <w:proofErr w:type="spellEnd"/>
-      <w:r>
-        <w:t xml:space="preserve"> structureel op te nemen in </w:t>
-      </w:r>
-      <w:proofErr w:type="spellStart"/>
-      <w:r>
-        <w:t>DevSecOps</w:t>
-      </w:r>
-      <w:proofErr w:type="spellEnd"/>
-      <w:r>
-        <w:t>-processen</w:t>
-      </w:r>
-      <w:r>
-        <w:t>.</w:t>
-      </w:r>
-    </w:p>
-    <w:p>
-      <w:pPr>
-        <w:spacing w:afterLines="24" w:after="57" w:line="288" w:lineRule="auto"/>
-      </w:pPr>
-    </w:p>
-    <w:p>
-      <w:pPr>
-        <w:spacing w:afterLines="24" w:after="57" w:line="288" w:lineRule="auto"/>
-      </w:pPr>
-      <w:r>
-        <w:t xml:space="preserve">Toekomstig werk kan de voorgestelde verbeteringen (globale </w:t>
-      </w:r>
-      <w:proofErr w:type="spellStart"/>
-      <w:r>
-        <w:t>collapse</w:t>
-      </w:r>
-      <w:proofErr w:type="spellEnd"/>
-      <w:r>
-        <w:t xml:space="preserve">-knoppen, </w:t>
-      </w:r>
-      <w:proofErr w:type="spellStart"/>
-      <w:r>
-        <w:t>branch</w:t>
-      </w:r>
-      <w:proofErr w:type="spellEnd"/>
-      <w:r>
-        <w:t xml:space="preserve">-zoom) implementeren, collaboratieve features toevoegen en AI-ondersteuning voor </w:t>
-      </w:r>
-      <w:proofErr w:type="spellStart"/>
-      <w:r>
-        <w:t>threat</w:t>
-      </w:r>
-      <w:proofErr w:type="spellEnd"/>
-      <w:r>
-        <w:t>-suggesties verkennen. Deze tool biedt daarmee een laagdrempelig startpunt voor zowel industrie als security-onderwijs</w:t>
-      </w:r>
-      <w:r>
-        <w:t>.</w:t>
-      </w:r>
-    </w:p>
-    <w:p>
-      <w:pPr>
-        <w:spacing w:afterLines="24" w:after="57"/>
-      </w:pPr>
-      <w:r>
-        <w:br w:type="page"/>
-      </w:r>
-    </w:p>
-    <w:p>
-      <w:pPr>
-        <w:spacing w:afterLines="24" w:after="57"/>
-      </w:pPr>
-      <w:r>
-        <w:lastRenderedPageBreak/>
-        <w:br w:type="page"/>
-      </w:r>
-    </w:p>
-    <w:p>
-      <w:pPr>
-        <w:spacing w:afterLines="24" w:after="57" w:line="288" w:lineRule="auto"/>
-        <w:rPr>
-          <w:b/>
-          <w:bCs/>
-          <w:sz w:val="36"/>
-          <w:szCs w:val="36"/>
-        </w:rPr>
-      </w:pPr>
-      <w:r>
-        <w:rPr>
-          <w:b/>
-          <w:bCs/>
-          <w:sz w:val="36"/>
-          <w:szCs w:val="36"/>
-        </w:rPr>
-        <w:lastRenderedPageBreak/>
         <w:t>Referentielijst</w:t>
       </w:r>
     </w:p>
     <w:sectPr>
-      <w:footerReference w:type="default" r:id="rId37"/>
+      <w:footerReference w:type="default" r:id="rId35"/>
       <w:pgSz w:w="11906" w:h="16838"/>
       <w:pgMar w:top="1134" w:right="1418" w:bottom="1134" w:left="1418" w:header="709" w:footer="709" w:gutter="0"/>
       <w:cols w:space="708"/>
@@ -17074,6 +17467,92 @@
     </w:lvl>
   </w:abstractNum>
   <w:abstractNum w:abstractNumId="13" w15:restartNumberingAfterBreak="0">
+    <w:nsid w:val="4D476FE9"/>
+    <w:multiLevelType w:val="hybridMultilevel"/>
+    <w:tmpl w:val="24866D22"/>
+    <w:lvl w:ilvl="0" w:tplc="0813000F">
+      <w:start w:val="1"/>
+      <w:numFmt w:val="decimal"/>
+      <w:lvlText w:val="%1."/>
+      <w:lvlJc w:val="left"/>
+      <w:pPr>
+        <w:ind w:left="720" w:hanging="360"/>
+      </w:pPr>
+    </w:lvl>
+    <w:lvl w:ilvl="1" w:tplc="08130019" w:tentative="1">
+      <w:start w:val="1"/>
+      <w:numFmt w:val="lowerLetter"/>
+      <w:lvlText w:val="%2."/>
+      <w:lvlJc w:val="left"/>
+      <w:pPr>
+        <w:ind w:left="1440" w:hanging="360"/>
+      </w:pPr>
+    </w:lvl>
+    <w:lvl w:ilvl="2" w:tplc="0813001B" w:tentative="1">
+      <w:start w:val="1"/>
+      <w:numFmt w:val="lowerRoman"/>
+      <w:lvlText w:val="%3."/>
+      <w:lvlJc w:val="right"/>
+      <w:pPr>
+        <w:ind w:left="2160" w:hanging="180"/>
+      </w:pPr>
+    </w:lvl>
+    <w:lvl w:ilvl="3" w:tplc="0813000F" w:tentative="1">
+      <w:start w:val="1"/>
+      <w:numFmt w:val="decimal"/>
+      <w:lvlText w:val="%4."/>
+      <w:lvlJc w:val="left"/>
+      <w:pPr>
+        <w:ind w:left="2880" w:hanging="360"/>
+      </w:pPr>
+    </w:lvl>
+    <w:lvl w:ilvl="4" w:tplc="08130019" w:tentative="1">
+      <w:start w:val="1"/>
+      <w:numFmt w:val="lowerLetter"/>
+      <w:lvlText w:val="%5."/>
+      <w:lvlJc w:val="left"/>
+      <w:pPr>
+        <w:ind w:left="3600" w:hanging="360"/>
+      </w:pPr>
+    </w:lvl>
+    <w:lvl w:ilvl="5" w:tplc="0813001B" w:tentative="1">
+      <w:start w:val="1"/>
+      <w:numFmt w:val="lowerRoman"/>
+      <w:lvlText w:val="%6."/>
+      <w:lvlJc w:val="right"/>
+      <w:pPr>
+        <w:ind w:left="4320" w:hanging="180"/>
+      </w:pPr>
+    </w:lvl>
+    <w:lvl w:ilvl="6" w:tplc="0813000F" w:tentative="1">
+      <w:start w:val="1"/>
+      <w:numFmt w:val="decimal"/>
+      <w:lvlText w:val="%7."/>
+      <w:lvlJc w:val="left"/>
+      <w:pPr>
+        <w:ind w:left="5040" w:hanging="360"/>
+      </w:pPr>
+    </w:lvl>
+    <w:lvl w:ilvl="7" w:tplc="08130019" w:tentative="1">
+      <w:start w:val="1"/>
+      <w:numFmt w:val="lowerLetter"/>
+      <w:lvlText w:val="%8."/>
+      <w:lvlJc w:val="left"/>
+      <w:pPr>
+        <w:ind w:left="5760" w:hanging="360"/>
+      </w:pPr>
+    </w:lvl>
+    <w:lvl w:ilvl="8" w:tplc="0813001B" w:tentative="1">
+      <w:start w:val="1"/>
+      <w:numFmt w:val="lowerRoman"/>
+      <w:lvlText w:val="%9."/>
+      <w:lvlJc w:val="right"/>
+      <w:pPr>
+        <w:ind w:left="6480" w:hanging="180"/>
+      </w:pPr>
+    </w:lvl>
+  </w:abstractNum>
+  <w:abstractNum w:abstractNumId="14" w15:restartNumberingAfterBreak="0">
     <w:nsid w:val="51FE45A0"/>
     <w:multiLevelType w:val="multilevel"/>
     <w:tmpl w:val="AFAE3370"/>
@@ -17186,7 +17665,7 @@
       </w:pPr>
     </w:lvl>
   </w:abstractNum>
-  <w:abstractNum w:abstractNumId="14" w15:restartNumberingAfterBreak="0">
+  <w:abstractNum w:abstractNumId="15" w15:restartNumberingAfterBreak="0">
     <w:nsid w:val="5DEF75CC"/>
     <w:multiLevelType w:val="multilevel"/>
     <w:tmpl w:val="46546344"/>
@@ -17303,7 +17782,7 @@
       </w:pPr>
     </w:lvl>
   </w:abstractNum>
-  <w:abstractNum w:abstractNumId="15" w15:restartNumberingAfterBreak="0">
+  <w:abstractNum w:abstractNumId="16" w15:restartNumberingAfterBreak="0">
     <w:nsid w:val="5F557A8A"/>
     <w:multiLevelType w:val="multilevel"/>
     <w:tmpl w:val="802A707C"/>
@@ -17416,7 +17895,156 @@
       </w:pPr>
     </w:lvl>
   </w:abstractNum>
-  <w:abstractNum w:abstractNumId="16" w15:restartNumberingAfterBreak="0">
+  <w:abstractNum w:abstractNumId="17" w15:restartNumberingAfterBreak="0">
+    <w:nsid w:val="5F5F1671"/>
+    <w:multiLevelType w:val="multilevel"/>
+    <w:tmpl w:val="45F06466"/>
+    <w:lvl w:ilvl="0">
+      <w:start w:val="1"/>
+      <w:numFmt w:val="bullet"/>
+      <w:lvlText w:val=""/>
+      <w:lvlJc w:val="left"/>
+      <w:pPr>
+        <w:tabs>
+          <w:tab w:val="num" w:pos="720"/>
+        </w:tabs>
+        <w:ind w:left="720" w:hanging="360"/>
+      </w:pPr>
+      <w:rPr>
+        <w:rFonts w:ascii="Symbol" w:hAnsi="Symbol" w:hint="default"/>
+        <w:sz w:val="20"/>
+      </w:rPr>
+    </w:lvl>
+    <w:lvl w:ilvl="1" w:tentative="1">
+      <w:start w:val="1"/>
+      <w:numFmt w:val="bullet"/>
+      <w:lvlText w:val=""/>
+      <w:lvlJc w:val="left"/>
+      <w:pPr>
+        <w:tabs>
+          <w:tab w:val="num" w:pos="1440"/>
+        </w:tabs>
+        <w:ind w:left="1440" w:hanging="360"/>
+      </w:pPr>
+      <w:rPr>
+        <w:rFonts w:ascii="Symbol" w:hAnsi="Symbol" w:hint="default"/>
+        <w:sz w:val="20"/>
+      </w:rPr>
+    </w:lvl>
+    <w:lvl w:ilvl="2" w:tentative="1">
+      <w:start w:val="1"/>
+      <w:numFmt w:val="bullet"/>
+      <w:lvlText w:val=""/>
+      <w:lvlJc w:val="left"/>
+      <w:pPr>
+        <w:tabs>
+          <w:tab w:val="num" w:pos="2160"/>
+        </w:tabs>
+        <w:ind w:left="2160" w:hanging="360"/>
+      </w:pPr>
+      <w:rPr>
+        <w:rFonts w:ascii="Symbol" w:hAnsi="Symbol" w:hint="default"/>
+        <w:sz w:val="20"/>
+      </w:rPr>
+    </w:lvl>
+    <w:lvl w:ilvl="3" w:tentative="1">
+      <w:start w:val="1"/>
+      <w:numFmt w:val="bullet"/>
+      <w:lvlText w:val=""/>
+      <w:lvlJc w:val="left"/>
+      <w:pPr>
+        <w:tabs>
+          <w:tab w:val="num" w:pos="2880"/>
+        </w:tabs>
+        <w:ind w:left="2880" w:hanging="360"/>
+      </w:pPr>
+      <w:rPr>
+        <w:rFonts w:ascii="Symbol" w:hAnsi="Symbol" w:hint="default"/>
+        <w:sz w:val="20"/>
+      </w:rPr>
+    </w:lvl>
+    <w:lvl w:ilvl="4" w:tentative="1">
+      <w:start w:val="1"/>
+      <w:numFmt w:val="bullet"/>
+      <w:lvlText w:val=""/>
+      <w:lvlJc w:val="left"/>
+      <w:pPr>
+        <w:tabs>
+          <w:tab w:val="num" w:pos="3600"/>
+        </w:tabs>
+        <w:ind w:left="3600" w:hanging="360"/>
+      </w:pPr>
+      <w:rPr>
+        <w:rFonts w:ascii="Symbol" w:hAnsi="Symbol" w:hint="default"/>
+        <w:sz w:val="20"/>
+      </w:rPr>
+    </w:lvl>
+    <w:lvl w:ilvl="5" w:tentative="1">
+      <w:start w:val="1"/>
+      <w:numFmt w:val="bullet"/>
+      <w:lvlText w:val=""/>
+      <w:lvlJc w:val="left"/>
+      <w:pPr>
+        <w:tabs>
+          <w:tab w:val="num" w:pos="4320"/>
+        </w:tabs>
+        <w:ind w:left="4320" w:hanging="360"/>
+      </w:pPr>
+      <w:rPr>
+        <w:rFonts w:ascii="Symbol" w:hAnsi="Symbol" w:hint="default"/>
+        <w:sz w:val="20"/>
+      </w:rPr>
+    </w:lvl>
+    <w:lvl w:ilvl="6" w:tentative="1">
+      <w:start w:val="1"/>
+      <w:numFmt w:val="bullet"/>
+      <w:lvlText w:val=""/>
+      <w:lvlJc w:val="left"/>
+      <w:pPr>
+        <w:tabs>
+          <w:tab w:val="num" w:pos="5040"/>
+        </w:tabs>
+        <w:ind w:left="5040" w:hanging="360"/>
+      </w:pPr>
+      <w:rPr>
+        <w:rFonts w:ascii="Symbol" w:hAnsi="Symbol" w:hint="default"/>
+        <w:sz w:val="20"/>
+      </w:rPr>
+    </w:lvl>
+    <w:lvl w:ilvl="7" w:tentative="1">
+      <w:start w:val="1"/>
+      <w:numFmt w:val="bullet"/>
+      <w:lvlText w:val=""/>
+      <w:lvlJc w:val="left"/>
+      <w:pPr>
+        <w:tabs>
+          <w:tab w:val="num" w:pos="5760"/>
+        </w:tabs>
+        <w:ind w:left="5760" w:hanging="360"/>
+      </w:pPr>
+      <w:rPr>
+        <w:rFonts w:ascii="Symbol" w:hAnsi="Symbol" w:hint="default"/>
+        <w:sz w:val="20"/>
+      </w:rPr>
+    </w:lvl>
+    <w:lvl w:ilvl="8" w:tentative="1">
+      <w:start w:val="1"/>
+      <w:numFmt w:val="bullet"/>
+      <w:lvlText w:val=""/>
+      <w:lvlJc w:val="left"/>
+      <w:pPr>
+        <w:tabs>
+          <w:tab w:val="num" w:pos="6480"/>
+        </w:tabs>
+        <w:ind w:left="6480" w:hanging="360"/>
+      </w:pPr>
+      <w:rPr>
+        <w:rFonts w:ascii="Symbol" w:hAnsi="Symbol" w:hint="default"/>
+        <w:sz w:val="20"/>
+      </w:rPr>
+    </w:lvl>
+  </w:abstractNum>
+  <w:abstractNum w:abstractNumId="18" w15:restartNumberingAfterBreak="0">
     <w:nsid w:val="6E951F4D"/>
     <w:multiLevelType w:val="hybridMultilevel"/>
     <w:tmpl w:val="1D62BE6A"/>
@@ -17502,7 +18130,7 @@
       </w:pPr>
     </w:lvl>
   </w:abstractNum>
-  <w:abstractNum w:abstractNumId="17" w15:restartNumberingAfterBreak="0">
+  <w:abstractNum w:abstractNumId="19" w15:restartNumberingAfterBreak="0">
     <w:nsid w:val="6F5E361A"/>
     <w:multiLevelType w:val="multilevel"/>
     <w:tmpl w:val="9E0CC59E"/>
@@ -17615,7 +18243,7 @@
       </w:pPr>
     </w:lvl>
   </w:abstractNum>
-  <w:abstractNum w:abstractNumId="18" w15:restartNumberingAfterBreak="0">
+  <w:abstractNum w:abstractNumId="20" w15:restartNumberingAfterBreak="0">
     <w:nsid w:val="739E373C"/>
     <w:multiLevelType w:val="multilevel"/>
     <w:tmpl w:val="51FA6F6C"/>
@@ -17764,7 +18392,7 @@
       </w:rPr>
     </w:lvl>
   </w:abstractNum>
-  <w:abstractNum w:abstractNumId="19" w15:restartNumberingAfterBreak="0">
+  <w:abstractNum w:abstractNumId="21" w15:restartNumberingAfterBreak="0">
     <w:nsid w:val="73B23B94"/>
     <w:multiLevelType w:val="multilevel"/>
     <w:tmpl w:val="DD56EF6C"/>
@@ -17913,7 +18541,7 @@
       </w:rPr>
     </w:lvl>
   </w:abstractNum>
-  <w:abstractNum w:abstractNumId="20" w15:restartNumberingAfterBreak="0">
+  <w:abstractNum w:abstractNumId="22" w15:restartNumberingAfterBreak="0">
     <w:nsid w:val="74717386"/>
     <w:multiLevelType w:val="multilevel"/>
     <w:tmpl w:val="59BAA730"/>
@@ -18062,7 +18690,7 @@
       </w:rPr>
     </w:lvl>
   </w:abstractNum>
-  <w:abstractNum w:abstractNumId="21" w15:restartNumberingAfterBreak="0">
+  <w:abstractNum w:abstractNumId="23" w15:restartNumberingAfterBreak="0">
     <w:nsid w:val="787E42AC"/>
     <w:multiLevelType w:val="multilevel"/>
     <w:tmpl w:val="183AAC40"/>
@@ -18175,7 +18803,7 @@
       </w:pPr>
     </w:lvl>
   </w:abstractNum>
-  <w:abstractNum w:abstractNumId="22" w15:restartNumberingAfterBreak="0">
+  <w:abstractNum w:abstractNumId="24" w15:restartNumberingAfterBreak="0">
     <w:nsid w:val="7D4F047B"/>
     <w:multiLevelType w:val="multilevel"/>
     <w:tmpl w:val="00FE70FE"/>
@@ -18324,7 +18952,7 @@
       </w:rPr>
     </w:lvl>
   </w:abstractNum>
-  <w:abstractNum w:abstractNumId="23" w15:restartNumberingAfterBreak="0">
+  <w:abstractNum w:abstractNumId="25" w15:restartNumberingAfterBreak="0">
     <w:nsid w:val="7FB234BB"/>
     <w:multiLevelType w:val="multilevel"/>
     <w:tmpl w:val="57B67D44"/>
@@ -18480,37 +19108,37 @@
     <w:abstractNumId w:val="2"/>
   </w:num>
   <w:num w:numId="3" w16cid:durableId="804390768">
-    <w:abstractNumId w:val="22"/>
+    <w:abstractNumId w:val="24"/>
   </w:num>
   <w:num w:numId="4" w16cid:durableId="740324678">
-    <w:abstractNumId w:val="20"/>
+    <w:abstractNumId w:val="22"/>
   </w:num>
   <w:num w:numId="5" w16cid:durableId="959729964">
     <w:abstractNumId w:val="12"/>
   </w:num>
   <w:num w:numId="6" w16cid:durableId="521011932">
-    <w:abstractNumId w:val="23"/>
+    <w:abstractNumId w:val="25"/>
   </w:num>
   <w:num w:numId="7" w16cid:durableId="2095086216">
-    <w:abstractNumId w:val="18"/>
+    <w:abstractNumId w:val="20"/>
   </w:num>
   <w:num w:numId="8" w16cid:durableId="803812241">
-    <w:abstractNumId w:val="14"/>
+    <w:abstractNumId w:val="15"/>
   </w:num>
   <w:num w:numId="9" w16cid:durableId="189876946">
     <w:abstractNumId w:val="3"/>
   </w:num>
   <w:num w:numId="10" w16cid:durableId="1285310722">
-    <w:abstractNumId w:val="19"/>
+    <w:abstractNumId w:val="21"/>
   </w:num>
   <w:num w:numId="11" w16cid:durableId="1317300852">
-    <w:abstractNumId w:val="21"/>
+    <w:abstractNumId w:val="23"/>
   </w:num>
   <w:num w:numId="12" w16cid:durableId="1607344221">
     <w:abstractNumId w:val="10"/>
   </w:num>
   <w:num w:numId="13" w16cid:durableId="1828588209">
-    <w:abstractNumId w:val="15"/>
+    <w:abstractNumId w:val="16"/>
   </w:num>
   <w:num w:numId="14" w16cid:durableId="1929537873">
     <w:abstractNumId w:val="6"/>
@@ -18519,13 +19147,13 @@
     <w:abstractNumId w:val="1"/>
   </w:num>
   <w:num w:numId="16" w16cid:durableId="1606230509">
-    <w:abstractNumId w:val="17"/>
+    <w:abstractNumId w:val="19"/>
   </w:num>
   <w:num w:numId="17" w16cid:durableId="2126999199">
     <w:abstractNumId w:val="4"/>
   </w:num>
   <w:num w:numId="18" w16cid:durableId="752900601">
-    <w:abstractNumId w:val="16"/>
+    <w:abstractNumId w:val="18"/>
   </w:num>
   <w:num w:numId="19" w16cid:durableId="777993394">
     <w:abstractNumId w:val="8"/>
@@ -18534,7 +19162,7 @@
     <w:abstractNumId w:val="11"/>
   </w:num>
   <w:num w:numId="21" w16cid:durableId="1507402035">
-    <w:abstractNumId w:val="13"/>
+    <w:abstractNumId w:val="14"/>
   </w:num>
   <w:num w:numId="22" w16cid:durableId="1655909782">
     <w:abstractNumId w:val="5"/>
@@ -18544,6 +19172,12 @@
   </w:num>
   <w:num w:numId="24" w16cid:durableId="411583272">
     <w:abstractNumId w:val="7"/>
+  </w:num>
+  <w:num w:numId="25" w16cid:durableId="498885374">
+    <w:abstractNumId w:val="17"/>
+  </w:num>
+  <w:num w:numId="26" w16cid:durableId="1303121982">
+    <w:abstractNumId w:val="13"/>
   </w:num>
 </w:numbering>
 </file>

</xml_diff>

<commit_message>
added deelnemers part to thesis
</commit_message>
<xml_diff>
--- a/Master_scriptie_tekst.docx
+++ b/Master_scriptie_tekst.docx
@@ -95,7 +95,13 @@
     <w:sdt>
       <w:sdtPr>
         <w:rPr>
-          <w:lang w:val="nl-NL"/>
+          <w:rFonts w:asciiTheme="minorHAnsi" w:eastAsiaTheme="minorHAnsi" w:hAnsiTheme="minorHAnsi" w:cstheme="minorBidi"/>
+          <w:color w:val="auto"/>
+          <w:kern w:val="2"/>
+          <w:sz w:val="24"/>
+          <w:szCs w:val="24"/>
+          <w:lang w:val="nl-NL" w:eastAsia="en-US"/>
+          <w14:ligatures w14:val="standardContextual"/>
         </w:rPr>
         <w:id w:val="339434683"/>
         <w:docPartObj>
@@ -105,15 +111,8 @@
       </w:sdtPr>
       <w:sdtEndPr>
         <w:rPr>
-          <w:rFonts w:asciiTheme="minorHAnsi" w:eastAsiaTheme="minorHAnsi" w:hAnsiTheme="minorHAnsi" w:cstheme="minorBidi"/>
-          <w:b/>
-          <w:bCs/>
-          <w:color w:val="auto"/>
-          <w:kern w:val="2"/>
-          <w:sz w:val="24"/>
-          <w:szCs w:val="24"/>
-          <w:lang w:eastAsia="en-US"/>
-          <w14:ligatures w14:val="standardContextual"/>
+          <w:b/>
+          <w:bCs/>
         </w:rPr>
       </w:sdtEndPr>
       <w:sdtContent>
@@ -4216,7 +4215,7 @@
                 <w:webHidden/>
                 <w:color w:val="000000" w:themeColor="text1"/>
               </w:rPr>
-              <w:t>42</w:t>
+              <w:t>43</w:t>
             </w:r>
             <w:r>
               <w:rPr>
@@ -4414,7 +4413,7 @@
                 <w:webHidden/>
                 <w:color w:val="000000" w:themeColor="text1"/>
               </w:rPr>
-              <w:t>45</w:t>
+              <w:t>46</w:t>
             </w:r>
             <w:r>
               <w:rPr>
@@ -4515,7 +4514,7 @@
                 <w:webHidden/>
                 <w:color w:val="000000" w:themeColor="text1"/>
               </w:rPr>
-              <w:t>45</w:t>
+              <w:t>46</w:t>
             </w:r>
             <w:r>
               <w:rPr>
@@ -4616,7 +4615,7 @@
                 <w:webHidden/>
                 <w:color w:val="000000" w:themeColor="text1"/>
               </w:rPr>
-              <w:t>46</w:t>
+              <w:t>47</w:t>
             </w:r>
             <w:r>
               <w:rPr>
@@ -4717,7 +4716,7 @@
                 <w:webHidden/>
                 <w:color w:val="000000" w:themeColor="text1"/>
               </w:rPr>
-              <w:t>46</w:t>
+              <w:t>47</w:t>
             </w:r>
             <w:r>
               <w:rPr>
@@ -4818,7 +4817,7 @@
                 <w:webHidden/>
                 <w:color w:val="000000" w:themeColor="text1"/>
               </w:rPr>
-              <w:t>46</w:t>
+              <w:t>47</w:t>
             </w:r>
             <w:r>
               <w:rPr>
@@ -4919,7 +4918,7 @@
                 <w:webHidden/>
                 <w:color w:val="000000" w:themeColor="text1"/>
               </w:rPr>
-              <w:t>47</w:t>
+              <w:t>48</w:t>
             </w:r>
             <w:r>
               <w:rPr>
@@ -5018,7 +5017,7 @@
                 <w:webHidden/>
                 <w:color w:val="000000" w:themeColor="text1"/>
               </w:rPr>
-              <w:t>47</w:t>
+              <w:t>48</w:t>
             </w:r>
             <w:r>
               <w:rPr>
@@ -5117,7 +5116,7 @@
                 <w:webHidden/>
                 <w:color w:val="000000" w:themeColor="text1"/>
               </w:rPr>
-              <w:t>47</w:t>
+              <w:t>48</w:t>
             </w:r>
             <w:r>
               <w:rPr>
@@ -5216,7 +5215,7 @@
                 <w:webHidden/>
                 <w:color w:val="000000" w:themeColor="text1"/>
               </w:rPr>
-              <w:t>47</w:t>
+              <w:t>48</w:t>
             </w:r>
             <w:r>
               <w:rPr>
@@ -5315,7 +5314,7 @@
                 <w:webHidden/>
                 <w:color w:val="000000" w:themeColor="text1"/>
               </w:rPr>
-              <w:t>48</w:t>
+              <w:t>49</w:t>
             </w:r>
             <w:r>
               <w:rPr>
@@ -5414,7 +5413,7 @@
                 <w:webHidden/>
                 <w:color w:val="000000" w:themeColor="text1"/>
               </w:rPr>
-              <w:t>48</w:t>
+              <w:t>49</w:t>
             </w:r>
             <w:r>
               <w:rPr>
@@ -5513,7 +5512,7 @@
                 <w:webHidden/>
                 <w:color w:val="000000" w:themeColor="text1"/>
               </w:rPr>
-              <w:t>49</w:t>
+              <w:t>50</w:t>
             </w:r>
             <w:r>
               <w:rPr>
@@ -5614,7 +5613,7 @@
                 <w:webHidden/>
                 <w:color w:val="000000" w:themeColor="text1"/>
               </w:rPr>
-              <w:t>49</w:t>
+              <w:t>50</w:t>
             </w:r>
             <w:r>
               <w:rPr>
@@ -5715,7 +5714,7 @@
                 <w:webHidden/>
                 <w:color w:val="000000" w:themeColor="text1"/>
               </w:rPr>
-              <w:t>49</w:t>
+              <w:t>52</w:t>
             </w:r>
             <w:r>
               <w:rPr>
@@ -5816,7 +5815,7 @@
                 <w:webHidden/>
                 <w:color w:val="000000" w:themeColor="text1"/>
               </w:rPr>
-              <w:t>50</w:t>
+              <w:t>52</w:t>
             </w:r>
             <w:r>
               <w:rPr>
@@ -5917,7 +5916,7 @@
                 <w:webHidden/>
                 <w:color w:val="000000" w:themeColor="text1"/>
               </w:rPr>
-              <w:t>51</w:t>
+              <w:t>53</w:t>
             </w:r>
             <w:r>
               <w:rPr>
@@ -6016,7 +6015,7 @@
                 <w:webHidden/>
                 <w:color w:val="000000" w:themeColor="text1"/>
               </w:rPr>
-              <w:t>53</w:t>
+              <w:t>56</w:t>
             </w:r>
             <w:r>
               <w:rPr>
@@ -6114,7 +6113,7 @@
                 <w:webHidden/>
                 <w:color w:val="000000" w:themeColor="text1"/>
               </w:rPr>
-              <w:t>55</w:t>
+              <w:t>58</w:t>
             </w:r>
             <w:r>
               <w:rPr>
@@ -9795,45 +9794,10 @@
           <w:b/>
           <w:bCs/>
           <w:color w:val="000000" w:themeColor="text1"/>
-          <w:lang w:val="en-GB"/>
-        </w:rPr>
-        <w:t xml:space="preserve">2.2 </w:t>
-      </w:r>
-      <w:proofErr w:type="spellStart"/>
-      <w:r>
-        <w:rPr>
-          <w:rFonts w:asciiTheme="minorHAnsi" w:hAnsiTheme="minorHAnsi"/>
-          <w:b/>
-          <w:bCs/>
-          <w:color w:val="000000" w:themeColor="text1"/>
-          <w:lang w:val="en-GB"/>
-        </w:rPr>
-        <w:t>Gerelateerd</w:t>
-      </w:r>
-      <w:proofErr w:type="spellEnd"/>
-      <w:r>
-        <w:rPr>
-          <w:rFonts w:asciiTheme="minorHAnsi" w:hAnsiTheme="minorHAnsi"/>
-          <w:b/>
-          <w:bCs/>
-          <w:color w:val="000000" w:themeColor="text1"/>
-          <w:lang w:val="en-GB"/>
-        </w:rPr>
-        <w:t xml:space="preserve"> </w:t>
-      </w:r>
-      <w:proofErr w:type="spellStart"/>
-      <w:r>
-        <w:rPr>
-          <w:rFonts w:asciiTheme="minorHAnsi" w:hAnsiTheme="minorHAnsi"/>
-          <w:b/>
-          <w:bCs/>
-          <w:color w:val="000000" w:themeColor="text1"/>
-          <w:lang w:val="en-GB"/>
-        </w:rPr>
-        <w:t>werk</w:t>
+        </w:rPr>
+        <w:t>2.2 Gerelateerd werk</w:t>
       </w:r>
       <w:bookmarkEnd w:id="10"/>
-      <w:proofErr w:type="spellEnd"/>
     </w:p>
     <w:p>
       <w:pPr>
@@ -12984,6 +12948,7 @@
       </w:pPr>
       <w:r>
         <w:rPr>
+          <w:noProof/>
           <w:color w:val="000000" w:themeColor="text1"/>
         </w:rPr>
         <w:drawing>
@@ -13069,6 +13034,7 @@
       </w:pPr>
       <w:r>
         <w:rPr>
+          <w:noProof/>
           <w:color w:val="000000" w:themeColor="text1"/>
         </w:rPr>
         <w:lastRenderedPageBreak/>
@@ -13159,134 +13125,156 @@
       <w:r>
         <w:rPr>
           <w:color w:val="000000" w:themeColor="text1"/>
-        </w:rPr>
-        <w:t xml:space="preserve">In </w:t>
-      </w:r>
-      <w:proofErr w:type="spellStart"/>
-      <w:r>
-        <w:rPr>
-          <w:color w:val="000000" w:themeColor="text1"/>
-        </w:rPr>
-        <w:t>Proceedings</w:t>
-      </w:r>
-      <w:proofErr w:type="spellEnd"/>
-      <w:r>
-        <w:rPr>
-          <w:color w:val="000000" w:themeColor="text1"/>
-        </w:rPr>
-        <w:t xml:space="preserve"> of </w:t>
-      </w:r>
-      <w:proofErr w:type="spellStart"/>
-      <w:r>
-        <w:rPr>
-          <w:color w:val="000000" w:themeColor="text1"/>
-        </w:rPr>
-        <w:t>the</w:t>
-      </w:r>
-      <w:proofErr w:type="spellEnd"/>
-      <w:r>
-        <w:rPr>
-          <w:color w:val="000000" w:themeColor="text1"/>
+          <w:lang w:val="en-GB"/>
+        </w:rPr>
+        <w:t xml:space="preserve">In Proceedings of the </w:t>
+      </w:r>
+      <w:proofErr w:type="spellStart"/>
+      <w:r>
+        <w:rPr>
+          <w:color w:val="000000" w:themeColor="text1"/>
+          <w:lang w:val="en-GB"/>
+        </w:rPr>
+        <w:t>Eurographics</w:t>
+      </w:r>
+      <w:proofErr w:type="spellEnd"/>
+      <w:r>
+        <w:rPr>
+          <w:color w:val="000000" w:themeColor="text1"/>
+          <w:lang w:val="en-GB"/>
+        </w:rPr>
+        <w:t xml:space="preserve"> Conference on Visualization (</w:t>
+      </w:r>
+      <w:proofErr w:type="spellStart"/>
+      <w:r>
+        <w:rPr>
+          <w:color w:val="000000" w:themeColor="text1"/>
+          <w:lang w:val="en-GB"/>
+        </w:rPr>
+        <w:t>EuroVis</w:t>
+      </w:r>
+      <w:proofErr w:type="spellEnd"/>
+      <w:r>
+        <w:rPr>
+          <w:color w:val="000000" w:themeColor="text1"/>
+          <w:lang w:val="en-GB"/>
+        </w:rPr>
+        <w:t xml:space="preserve"> 2012), 2012</w:t>
+      </w:r>
+    </w:p>
+    <w:p>
+      <w:pPr>
+        <w:spacing w:afterLines="24" w:after="57" w:line="288" w:lineRule="auto"/>
+        <w:rPr>
+          <w:color w:val="000000" w:themeColor="text1"/>
+          <w:lang w:val="en-US"/>
+        </w:rPr>
+      </w:pPr>
+    </w:p>
+    <w:p>
+      <w:pPr>
+        <w:spacing w:afterLines="24" w:after="57" w:line="288" w:lineRule="auto"/>
+        <w:rPr>
+          <w:color w:val="000000" w:themeColor="text1"/>
+          <w:lang w:val="en-US"/>
+        </w:rPr>
+      </w:pPr>
+    </w:p>
+    <w:p>
+      <w:pPr>
+        <w:pStyle w:val="Kop2"/>
+        <w:rPr>
+          <w:rFonts w:asciiTheme="minorHAnsi" w:hAnsiTheme="minorHAnsi"/>
+          <w:b/>
+          <w:bCs/>
+          <w:color w:val="000000" w:themeColor="text1"/>
+          <w:lang w:val="en-GB"/>
+        </w:rPr>
+      </w:pPr>
+      <w:bookmarkStart w:id="15" w:name="_Toc218798902"/>
+      <w:r>
+        <w:rPr>
+          <w:rFonts w:asciiTheme="minorHAnsi" w:hAnsiTheme="minorHAnsi"/>
+          <w:b/>
+          <w:bCs/>
+          <w:color w:val="000000" w:themeColor="text1"/>
+          <w:lang w:val="en-GB"/>
+        </w:rPr>
+        <w:t xml:space="preserve">3.4 </w:t>
+      </w:r>
+      <w:proofErr w:type="spellStart"/>
+      <w:r>
+        <w:rPr>
+          <w:rFonts w:asciiTheme="minorHAnsi" w:hAnsiTheme="minorHAnsi"/>
+          <w:b/>
+          <w:bCs/>
+          <w:color w:val="000000" w:themeColor="text1"/>
+          <w:lang w:val="en-GB"/>
+        </w:rPr>
+        <w:t>Geïmplementeerde</w:t>
+      </w:r>
+      <w:proofErr w:type="spellEnd"/>
+      <w:r>
+        <w:rPr>
+          <w:rFonts w:asciiTheme="minorHAnsi" w:hAnsiTheme="minorHAnsi"/>
+          <w:b/>
+          <w:bCs/>
+          <w:color w:val="000000" w:themeColor="text1"/>
+          <w:lang w:val="en-GB"/>
         </w:rPr>
         <w:t xml:space="preserve"> </w:t>
       </w:r>
       <w:proofErr w:type="spellStart"/>
       <w:r>
         <w:rPr>
-          <w:color w:val="000000" w:themeColor="text1"/>
-        </w:rPr>
-        <w:t>Eurographics</w:t>
-      </w:r>
-      <w:proofErr w:type="spellEnd"/>
-      <w:r>
-        <w:rPr>
-          <w:color w:val="000000" w:themeColor="text1"/>
-        </w:rPr>
-        <w:t xml:space="preserve"> Conference on </w:t>
-      </w:r>
-      <w:proofErr w:type="spellStart"/>
-      <w:r>
-        <w:rPr>
-          <w:color w:val="000000" w:themeColor="text1"/>
-        </w:rPr>
-        <w:t>Visualization</w:t>
-      </w:r>
-      <w:proofErr w:type="spellEnd"/>
-      <w:r>
-        <w:rPr>
-          <w:color w:val="000000" w:themeColor="text1"/>
-        </w:rPr>
-        <w:t xml:space="preserve"> (</w:t>
-      </w:r>
-      <w:proofErr w:type="spellStart"/>
-      <w:r>
-        <w:rPr>
-          <w:color w:val="000000" w:themeColor="text1"/>
-        </w:rPr>
-        <w:t>EuroVis</w:t>
-      </w:r>
-      <w:proofErr w:type="spellEnd"/>
-      <w:r>
-        <w:rPr>
-          <w:color w:val="000000" w:themeColor="text1"/>
-        </w:rPr>
-        <w:t xml:space="preserve"> 2012), 2012</w:t>
-      </w:r>
+          <w:rFonts w:asciiTheme="minorHAnsi" w:hAnsiTheme="minorHAnsi"/>
+          <w:b/>
+          <w:bCs/>
+          <w:color w:val="000000" w:themeColor="text1"/>
+          <w:lang w:val="en-GB"/>
+        </w:rPr>
+        <w:t>en</w:t>
+      </w:r>
+      <w:proofErr w:type="spellEnd"/>
+      <w:r>
+        <w:rPr>
+          <w:rFonts w:asciiTheme="minorHAnsi" w:hAnsiTheme="minorHAnsi"/>
+          <w:b/>
+          <w:bCs/>
+          <w:color w:val="000000" w:themeColor="text1"/>
+          <w:lang w:val="en-GB"/>
+        </w:rPr>
+        <w:t xml:space="preserve"> </w:t>
+      </w:r>
+      <w:proofErr w:type="spellStart"/>
+      <w:r>
+        <w:rPr>
+          <w:rFonts w:asciiTheme="minorHAnsi" w:hAnsiTheme="minorHAnsi"/>
+          <w:b/>
+          <w:bCs/>
+          <w:color w:val="000000" w:themeColor="text1"/>
+          <w:lang w:val="en-GB"/>
+        </w:rPr>
+        <w:t>afgewezen</w:t>
+      </w:r>
+      <w:proofErr w:type="spellEnd"/>
+      <w:r>
+        <w:rPr>
+          <w:rFonts w:asciiTheme="minorHAnsi" w:hAnsiTheme="minorHAnsi"/>
+          <w:b/>
+          <w:bCs/>
+          <w:color w:val="000000" w:themeColor="text1"/>
+          <w:lang w:val="en-GB"/>
+        </w:rPr>
+        <w:t xml:space="preserve"> lay-outs</w:t>
+      </w:r>
+      <w:bookmarkEnd w:id="15"/>
     </w:p>
     <w:p>
       <w:pPr>
         <w:spacing w:afterLines="24" w:after="57" w:line="288" w:lineRule="auto"/>
         <w:rPr>
           <w:color w:val="000000" w:themeColor="text1"/>
-          <w:lang w:val="en-US"/>
-        </w:rPr>
-      </w:pPr>
-    </w:p>
-    <w:p>
-      <w:pPr>
-        <w:spacing w:afterLines="24" w:after="57" w:line="288" w:lineRule="auto"/>
-        <w:rPr>
-          <w:color w:val="000000" w:themeColor="text1"/>
-          <w:lang w:val="en-US"/>
-        </w:rPr>
-      </w:pPr>
-    </w:p>
-    <w:p>
-      <w:pPr>
-        <w:pStyle w:val="Kop2"/>
-        <w:rPr>
-          <w:rFonts w:asciiTheme="minorHAnsi" w:hAnsiTheme="minorHAnsi"/>
-          <w:b/>
-          <w:bCs/>
-          <w:color w:val="000000" w:themeColor="text1"/>
-        </w:rPr>
-      </w:pPr>
-      <w:bookmarkStart w:id="15" w:name="_Toc218798902"/>
-      <w:r>
-        <w:rPr>
-          <w:rFonts w:asciiTheme="minorHAnsi" w:hAnsiTheme="minorHAnsi"/>
-          <w:b/>
-          <w:bCs/>
-          <w:color w:val="000000" w:themeColor="text1"/>
-        </w:rPr>
-        <w:t xml:space="preserve">3.4 </w:t>
-      </w:r>
-      <w:r>
-        <w:rPr>
-          <w:rFonts w:asciiTheme="minorHAnsi" w:hAnsiTheme="minorHAnsi"/>
-          <w:b/>
-          <w:bCs/>
-          <w:color w:val="000000" w:themeColor="text1"/>
-        </w:rPr>
-        <w:t>Geïmplementeerde en afgewezen lay-outs</w:t>
-      </w:r>
-      <w:bookmarkEnd w:id="15"/>
-    </w:p>
-    <w:p>
-      <w:pPr>
-        <w:spacing w:afterLines="24" w:after="57" w:line="288" w:lineRule="auto"/>
-        <w:rPr>
-          <w:color w:val="000000" w:themeColor="text1"/>
         </w:rPr>
       </w:pPr>
       <w:r>
@@ -13294,6 +13282,11 @@
           <w:color w:val="000000" w:themeColor="text1"/>
         </w:rPr>
         <w:br/>
+      </w:r>
+      <w:r>
+        <w:rPr>
+          <w:color w:val="000000" w:themeColor="text1"/>
+        </w:rPr>
         <w:t xml:space="preserve">Horizontale en verticale boomlay-outs werden concreet geïmplementeerd en intern geëvalueerd. De horizontale variant visualiseert </w:t>
       </w:r>
       <w:proofErr w:type="spellStart"/>
@@ -13347,7 +13340,7 @@
           <w:color w:val="000000" w:themeColor="text1"/>
         </w:rPr>
         <w:drawing>
-          <wp:inline distT="0" distB="0" distL="0" distR="0" wp14:anchorId="128D5ED9" wp14:editId="2AA4DE4A">
+          <wp:inline distT="0" distB="0" distL="0" distR="0" wp14:anchorId="128D5ED9" wp14:editId="7E4CE97E">
             <wp:extent cx="5759450" cy="2856865"/>
             <wp:effectExtent l="0" t="0" r="0" b="635"/>
             <wp:docPr id="234035025" name="Afbeelding 1" descr="Afbeelding met diagram, schermopname, lijn, ontwerp&#10;&#10;Door AI gegenereerde inhoud is mogelijk onjuist."/>
@@ -13411,7 +13404,7 @@
           <w:color w:val="000000" w:themeColor="text1"/>
         </w:rPr>
         <w:drawing>
-          <wp:inline distT="0" distB="0" distL="0" distR="0" wp14:anchorId="7D672503" wp14:editId="58DCD359">
+          <wp:inline distT="0" distB="0" distL="0" distR="0" wp14:anchorId="7D672503" wp14:editId="14077CD6">
             <wp:extent cx="5759450" cy="1689735"/>
             <wp:effectExtent l="0" t="0" r="0" b="5715"/>
             <wp:docPr id="373297823" name="Afbeelding 2" descr="Afbeelding met diagram, lijn, origami, ontwerp&#10;&#10;Door AI gegenereerde inhoud is mogelijk onjuist."/>
@@ -14329,31 +14322,7 @@
         <w:rPr>
           <w:color w:val="000000" w:themeColor="text1"/>
         </w:rPr>
-        <w:t xml:space="preserve"> worden via één generieke component opgebouwd, zodat </w:t>
-      </w:r>
-      <w:r>
-        <w:rPr>
-          <w:color w:val="000000" w:themeColor="text1"/>
-        </w:rPr>
-        <w:t xml:space="preserve">maximum </w:t>
-      </w:r>
-      <w:r>
-        <w:rPr>
-          <w:color w:val="000000" w:themeColor="text1"/>
-        </w:rPr>
-        <w:t xml:space="preserve">breedte, tekstomloop, padding en borders overal identiek zijn. Dit voorkomt visuele </w:t>
-      </w:r>
-      <w:r>
-        <w:rPr>
-          <w:color w:val="000000" w:themeColor="text1"/>
-        </w:rPr>
-        <w:t>r</w:t>
-      </w:r>
-      <w:r>
-        <w:rPr>
-          <w:color w:val="000000" w:themeColor="text1"/>
-        </w:rPr>
-        <w:t>uis en zorgt ervoor dat gebruikers zich kunnen concentreren op de inhoud (de scenario</w:t>
+        <w:t xml:space="preserve"> worden via één generieke component opgebouwd, zodat maximum breedte, tekstomloop, padding en borders overal identiek zijn. Dit voorkomt visuele ruis en zorgt ervoor dat gebruikers zich kunnen concentreren op de inhoud (de scenario</w:t>
       </w:r>
       <w:r>
         <w:rPr>
@@ -14796,13 +14765,7 @@
         <w:rPr>
           <w:color w:val="000000" w:themeColor="text1"/>
         </w:rPr>
-        <w:t xml:space="preserve"> </w:t>
-      </w:r>
-      <w:r>
-        <w:rPr>
-          <w:color w:val="000000" w:themeColor="text1"/>
-        </w:rPr>
-        <w:t>Daarnaast is gekozen voor een schild</w:t>
+        <w:t xml:space="preserve"> Daarnaast is gekozen voor een schild</w:t>
       </w:r>
       <w:r>
         <w:rPr>
@@ -14884,7 +14847,19 @@
         <w:rPr>
           <w:color w:val="000000" w:themeColor="text1"/>
         </w:rPr>
-        <w:t xml:space="preserve"> iconen minder toegankelijk kunnen zijn voor kleurenblinde gebruikers; dit wordt deels opgevangen door consistente vormverschillen (schild versus checkschild) en door de mogelijkheid om de betekenis van een icoon via een </w:t>
+        <w:t xml:space="preserve"> iconen minder toegankelijk kunnen zijn voor kleurenblinde gebruikers</w:t>
+      </w:r>
+      <w:r>
+        <w:rPr>
+          <w:color w:val="000000" w:themeColor="text1"/>
+        </w:rPr>
+        <w:t>. D</w:t>
+      </w:r>
+      <w:r>
+        <w:rPr>
+          <w:color w:val="000000" w:themeColor="text1"/>
+        </w:rPr>
+        <w:t xml:space="preserve">it wordt deels opgevangen door consistente vormverschillen (schild versus checkschild) en door de mogelijkheid om de betekenis van een icoon via een </w:t>
       </w:r>
       <w:proofErr w:type="spellStart"/>
       <w:r>
@@ -15271,13 +15246,7 @@
         <w:rPr>
           <w:color w:val="000000" w:themeColor="text1"/>
         </w:rPr>
-        <w:t>D</w:t>
-      </w:r>
-      <w:r>
-        <w:rPr>
-          <w:color w:val="000000" w:themeColor="text1"/>
-        </w:rPr>
-        <w:t xml:space="preserve">e </w:t>
+        <w:t xml:space="preserve">De </w:t>
       </w:r>
       <w:proofErr w:type="spellStart"/>
       <w:r>
@@ -15319,13 +15288,7 @@
         <w:rPr>
           <w:color w:val="000000" w:themeColor="text1"/>
         </w:rPr>
-        <w:t xml:space="preserve"> sneller te herkennen zonder bijkomende uitleg.</w:t>
-      </w:r>
-      <w:r>
-        <w:rPr>
-          <w:color w:val="000000" w:themeColor="text1"/>
-        </w:rPr>
-        <w:t xml:space="preserve"> </w:t>
+        <w:t xml:space="preserve"> sneller te herkennen zonder bijkomende uitleg. </w:t>
       </w:r>
       <w:r>
         <w:rPr>
@@ -15779,19 +15742,7 @@
           <w:color w:val="000000" w:themeColor="text1"/>
         </w:rPr>
         <w:noBreakHyphen/>
-        <w:t>principes rond oriëntatie en minimalisering van onnodige navigatiestappen.</w:t>
-      </w:r>
-      <w:r>
-        <w:rPr>
-          <w:color w:val="000000" w:themeColor="text1"/>
-        </w:rPr>
-        <w:t xml:space="preserve"> </w:t>
-      </w:r>
-      <w:r>
-        <w:rPr>
-          <w:color w:val="000000" w:themeColor="text1"/>
-        </w:rPr>
-        <w:t xml:space="preserve">Doordat deze context in een aparte </w:t>
+        <w:t xml:space="preserve">principes rond oriëntatie en minimalisering van onnodige navigatiestappen. Doordat deze context in een aparte </w:t>
       </w:r>
       <w:r>
         <w:rPr>
@@ -16045,19 +15996,7 @@
           <w:color w:val="000000" w:themeColor="text1"/>
         </w:rPr>
         <w:noBreakHyphen/>
-        <w:t>down” door hun werkvoorraad van openstaande risico’s en aannames gaan.</w:t>
-      </w:r>
-      <w:r>
-        <w:rPr>
-          <w:color w:val="000000" w:themeColor="text1"/>
-        </w:rPr>
-        <w:t xml:space="preserve"> </w:t>
-      </w:r>
-      <w:r>
-        <w:rPr>
-          <w:color w:val="000000" w:themeColor="text1"/>
-        </w:rPr>
-        <w:t>In ingeklapte toestand toont de filterbalk bovendien per statuscategorie een compacte schild</w:t>
+        <w:t>down” door hun werkvoorraad van openstaande risico’s en aannames gaan. In ingeklapte toestand toont de filterbalk bovendien per statuscategorie een compacte schild</w:t>
       </w:r>
       <w:r>
         <w:rPr>
@@ -16314,19 +16253,7 @@
         <w:rPr>
           <w:color w:val="000000" w:themeColor="text1"/>
         </w:rPr>
-        <w:t xml:space="preserve"> zou het zicht op de boom volledig of gedeeltelijk wegnemen en maakt het minder duidelijk naar welke exacte plaats in de structuur wordt genavigeerd wanneer een node geselecteerd wordt, waardoor de ruimtelijke oriëntatie van de gebruiker afneemt.</w:t>
-      </w:r>
-      <w:r>
-        <w:rPr>
-          <w:color w:val="000000" w:themeColor="text1"/>
-        </w:rPr>
-        <w:t xml:space="preserve"> </w:t>
-      </w:r>
-      <w:r>
-        <w:rPr>
-          <w:color w:val="000000" w:themeColor="text1"/>
-        </w:rPr>
-        <w:t xml:space="preserve">Dergelijke oplossing zou bovendien meer cognitieve schakelmomenten vereisen tussen lijst en boom, en minder direct aangeven welke items het meest urgent zijn. Door filtering en sortering te integreren in een zijpaneel dat direct naar </w:t>
+        <w:t xml:space="preserve"> zou het zicht op de boom volledig of gedeeltelijk wegnemen en maakt het minder duidelijk naar welke exacte plaats in de structuur wordt genavigeerd wanneer een node geselecteerd wordt, waardoor de ruimtelijke oriëntatie van de gebruiker afneemt. Dergelijke oplossing zou bovendien meer cognitieve schakelmomenten vereisen tussen lijst en boom, en minder direct aangeven welke items het meest urgent zijn. Door filtering en sortering te integreren in een zijpaneel dat direct naar </w:t>
       </w:r>
       <w:proofErr w:type="spellStart"/>
       <w:r>
@@ -16750,19 +16677,7 @@
         <w:rPr>
           <w:color w:val="000000" w:themeColor="text1"/>
         </w:rPr>
-        <w:t xml:space="preserve"> de volledige context op te vragen</w:t>
-      </w:r>
-      <w:r>
-        <w:rPr>
-          <w:color w:val="000000" w:themeColor="text1"/>
-        </w:rPr>
-        <w:t>. D</w:t>
-      </w:r>
-      <w:r>
-        <w:rPr>
-          <w:color w:val="000000" w:themeColor="text1"/>
-        </w:rPr>
-        <w:t>it werd aanvaard als compromis om schermruimte en visuele ruis te beperken, in lijn met UX</w:t>
+        <w:t xml:space="preserve"> de volledige context op te vragen. Dit werd aanvaard als compromis om schermruimte en visuele ruis te beperken, in lijn met UX</w:t>
       </w:r>
       <w:r>
         <w:rPr>
@@ -17151,55 +17066,13 @@
         <w:rPr>
           <w:color w:val="000000" w:themeColor="text1"/>
         </w:rPr>
-        <w:t xml:space="preserve"> om extra uitleg te krijgen</w:t>
-      </w:r>
-      <w:r>
-        <w:rPr>
-          <w:color w:val="000000" w:themeColor="text1"/>
-        </w:rPr>
-        <w:t>. D</w:t>
-      </w:r>
-      <w:r>
-        <w:rPr>
-          <w:color w:val="000000" w:themeColor="text1"/>
-        </w:rPr>
-        <w:t>it werd aanvaard als compromis om de interface visueel</w:t>
-      </w:r>
-      <w:r>
-        <w:rPr>
-          <w:color w:val="000000" w:themeColor="text1"/>
-        </w:rPr>
-        <w:t xml:space="preserve"> zo</w:t>
-      </w:r>
-      <w:r>
-        <w:rPr>
-          <w:color w:val="000000" w:themeColor="text1"/>
-        </w:rPr>
-        <w:t xml:space="preserve"> eenvoudig </w:t>
-      </w:r>
-      <w:r>
-        <w:rPr>
-          <w:color w:val="000000" w:themeColor="text1"/>
-        </w:rPr>
-        <w:t xml:space="preserve">mogelijk </w:t>
-      </w:r>
-      <w:r>
-        <w:rPr>
-          <w:color w:val="000000" w:themeColor="text1"/>
-        </w:rPr>
-        <w:t>te houden.</w:t>
-      </w:r>
-      <w:r>
-        <w:rPr>
-          <w:color w:val="000000" w:themeColor="text1"/>
-        </w:rPr>
-        <w:t xml:space="preserve"> </w:t>
-      </w:r>
-      <w:r>
-        <w:rPr>
-          <w:color w:val="000000" w:themeColor="text1"/>
-        </w:rPr>
-        <w:t xml:space="preserve">Er is bovendien bewust niet gekozen voor een ingebouwde rondleiding of </w:t>
+        <w:t xml:space="preserve"> om extra uitleg te krijgen. Dit werd aanvaard als compromis om de interface visueel zo eenvoudig mogelijk te houden.</w:t>
+      </w:r>
+      <w:r>
+        <w:rPr>
+          <w:color w:val="000000" w:themeColor="text1"/>
+        </w:rPr>
+        <w:t xml:space="preserve"> Er is bovendien bewust niet gekozen voor een ingebouwde rondleiding of </w:t>
       </w:r>
       <w:proofErr w:type="spellStart"/>
       <w:r>
@@ -21188,11 +21061,252 @@
       <w:pPr>
         <w:spacing w:after="24"/>
         <w:rPr>
-          <w:b/>
-          <w:bCs/>
-          <w:color w:val="000000" w:themeColor="text1"/>
-        </w:rPr>
-      </w:pPr>
+          <w:color w:val="000000" w:themeColor="text1"/>
+        </w:rPr>
+      </w:pPr>
+      <w:r>
+        <w:rPr>
+          <w:color w:val="000000" w:themeColor="text1"/>
+        </w:rPr>
+        <w:t>In totaal namen acht deelnemers deel aan de hoofdgebruikersstudie, aangevuld met één deelnemer in een voorafgaande pilotstudie. De leeftijd van de deelnemers in de hoofdstudie varieerde van 20 tot 28 jaar en allen hadden een achtergrond in (toegepaste) informatica of industriële wetenschappen informatica.</w:t>
+      </w:r>
+    </w:p>
+    <w:p>
+      <w:pPr>
+        <w:spacing w:after="24"/>
+        <w:rPr>
+          <w:color w:val="000000" w:themeColor="text1"/>
+        </w:rPr>
+      </w:pPr>
+    </w:p>
+    <w:p>
+      <w:pPr>
+        <w:spacing w:after="24"/>
+        <w:rPr>
+          <w:color w:val="000000" w:themeColor="text1"/>
+        </w:rPr>
+      </w:pPr>
+      <w:r>
+        <w:rPr>
+          <w:color w:val="000000" w:themeColor="text1"/>
+        </w:rPr>
+        <w:t>Zeven van de acht deelnemers in de hoofdstudie gaven expliciet aan géén ervaring te hebben met security</w:t>
+      </w:r>
+      <w:r>
+        <w:rPr>
+          <w:color w:val="000000" w:themeColor="text1"/>
+        </w:rPr>
+        <w:noBreakHyphen/>
+        <w:t>modellering</w:t>
+      </w:r>
+      <w:r>
+        <w:rPr>
+          <w:color w:val="000000" w:themeColor="text1"/>
+        </w:rPr>
+        <w:t>.</w:t>
+      </w:r>
+      <w:r>
+        <w:rPr>
+          <w:color w:val="000000" w:themeColor="text1"/>
+        </w:rPr>
+        <w:t xml:space="preserve"> </w:t>
+      </w:r>
+      <w:r>
+        <w:rPr>
+          <w:color w:val="000000" w:themeColor="text1"/>
+        </w:rPr>
+        <w:t>E</w:t>
+      </w:r>
+      <w:r>
+        <w:rPr>
+          <w:color w:val="000000" w:themeColor="text1"/>
+        </w:rPr>
+        <w:t>én deelnemer rapporteerde beperkte ervaring met security</w:t>
+      </w:r>
+      <w:r>
+        <w:rPr>
+          <w:color w:val="000000" w:themeColor="text1"/>
+        </w:rPr>
+        <w:noBreakHyphen/>
+        <w:t>modellering in het kader van opleiding en non</w:t>
+      </w:r>
+      <w:r>
+        <w:rPr>
+          <w:color w:val="000000" w:themeColor="text1"/>
+        </w:rPr>
+        <w:noBreakHyphen/>
+        <w:t>functionele security</w:t>
+      </w:r>
+      <w:r>
+        <w:rPr>
+          <w:color w:val="000000" w:themeColor="text1"/>
+        </w:rPr>
+        <w:noBreakHyphen/>
+      </w:r>
+      <w:proofErr w:type="spellStart"/>
+      <w:r>
+        <w:rPr>
+          <w:color w:val="000000" w:themeColor="text1"/>
+        </w:rPr>
+        <w:t>requirements</w:t>
+      </w:r>
+      <w:proofErr w:type="spellEnd"/>
+      <w:r>
+        <w:rPr>
+          <w:color w:val="000000" w:themeColor="text1"/>
+        </w:rPr>
+        <w:t>. Wel hadden de meeste deelnemers enige ervaring met security in bredere zin, bijvoorbeeld via security</w:t>
+      </w:r>
+      <w:r>
+        <w:rPr>
+          <w:color w:val="000000" w:themeColor="text1"/>
+        </w:rPr>
+        <w:noBreakHyphen/>
+        <w:t>vakken, een cybersecurity</w:t>
+      </w:r>
+      <w:r>
+        <w:rPr>
+          <w:color w:val="000000" w:themeColor="text1"/>
+        </w:rPr>
+        <w:noBreakHyphen/>
+      </w:r>
+      <w:proofErr w:type="spellStart"/>
+      <w:r>
+        <w:rPr>
+          <w:color w:val="000000" w:themeColor="text1"/>
+        </w:rPr>
+        <w:t>challenge</w:t>
+      </w:r>
+      <w:proofErr w:type="spellEnd"/>
+      <w:r>
+        <w:rPr>
+          <w:color w:val="000000" w:themeColor="text1"/>
+        </w:rPr>
+        <w:t xml:space="preserve"> of een lopend vak cybersecurity. De huidige functies omvatten studenten, (junior) software </w:t>
+      </w:r>
+      <w:proofErr w:type="spellStart"/>
+      <w:r>
+        <w:rPr>
+          <w:color w:val="000000" w:themeColor="text1"/>
+        </w:rPr>
+        <w:t>developers</w:t>
+      </w:r>
+      <w:proofErr w:type="spellEnd"/>
+      <w:r>
+        <w:rPr>
+          <w:color w:val="000000" w:themeColor="text1"/>
+        </w:rPr>
+        <w:t>, een data engineer/consultant en een scrum master/</w:t>
+      </w:r>
+      <w:proofErr w:type="spellStart"/>
+      <w:r>
+        <w:rPr>
+          <w:color w:val="000000" w:themeColor="text1"/>
+        </w:rPr>
+        <w:t>functional</w:t>
+      </w:r>
+      <w:proofErr w:type="spellEnd"/>
+      <w:r>
+        <w:rPr>
+          <w:color w:val="000000" w:themeColor="text1"/>
+        </w:rPr>
+        <w:t xml:space="preserve"> </w:t>
+      </w:r>
+      <w:proofErr w:type="spellStart"/>
+      <w:r>
+        <w:rPr>
+          <w:color w:val="000000" w:themeColor="text1"/>
+        </w:rPr>
+        <w:t>analyst</w:t>
+      </w:r>
+      <w:proofErr w:type="spellEnd"/>
+      <w:r>
+        <w:rPr>
+          <w:color w:val="000000" w:themeColor="text1"/>
+        </w:rPr>
+        <w:t>, wat overeenkomt met de beoogde doelgroep van ontwikkelaars met basiskennis maar zonder diepgaande security</w:t>
+      </w:r>
+      <w:r>
+        <w:rPr>
+          <w:color w:val="000000" w:themeColor="text1"/>
+        </w:rPr>
+        <w:noBreakHyphen/>
+        <w:t>expertise.</w:t>
+      </w:r>
+    </w:p>
+    <w:p>
+      <w:pPr>
+        <w:spacing w:after="24"/>
+        <w:rPr>
+          <w:color w:val="000000" w:themeColor="text1"/>
+        </w:rPr>
+      </w:pPr>
+    </w:p>
+    <w:p>
+      <w:pPr>
+        <w:spacing w:after="24"/>
+        <w:rPr>
+          <w:color w:val="000000" w:themeColor="text1"/>
+        </w:rPr>
+      </w:pPr>
+      <w:r>
+        <w:rPr>
+          <w:color w:val="000000" w:themeColor="text1"/>
+        </w:rPr>
+        <w:t>De pilootdeelnemer had een vergelijkbare opleiding (industriële wetenschappen informatica), maar beschikte wél over expliciete ervaring met security</w:t>
+      </w:r>
+      <w:r>
+        <w:rPr>
+          <w:rFonts w:ascii="Cambria Math" w:hAnsi="Cambria Math" w:cs="Cambria Math"/>
+          <w:color w:val="000000" w:themeColor="text1"/>
+        </w:rPr>
+        <w:t>‑</w:t>
+      </w:r>
+      <w:r>
+        <w:rPr>
+          <w:color w:val="000000" w:themeColor="text1"/>
+        </w:rPr>
+        <w:t>modelleringstechnieken zoals STRIDE en attack trees en werkte als MES</w:t>
+      </w:r>
+      <w:r>
+        <w:rPr>
+          <w:rFonts w:ascii="Cambria Math" w:hAnsi="Cambria Math" w:cs="Cambria Math"/>
+          <w:color w:val="000000" w:themeColor="text1"/>
+        </w:rPr>
+        <w:t>‑</w:t>
+      </w:r>
+      <w:r>
+        <w:rPr>
+          <w:color w:val="000000" w:themeColor="text1"/>
+        </w:rPr>
+        <w:t>software engineer. De pilot werd gebruikt om het studieprotocol en de taken te verfijnen</w:t>
+      </w:r>
+      <w:r>
+        <w:rPr>
+          <w:color w:val="000000" w:themeColor="text1"/>
+        </w:rPr>
+        <w:t xml:space="preserve">. </w:t>
+      </w:r>
+      <w:r>
+        <w:rPr>
+          <w:color w:val="000000" w:themeColor="text1"/>
+        </w:rPr>
+        <w:t xml:space="preserve">De gegevens van de pilootdeelnemer zijn selectief meegenomen in de analyses. Voor de User </w:t>
+      </w:r>
+      <w:proofErr w:type="spellStart"/>
+      <w:r>
+        <w:rPr>
+          <w:color w:val="000000" w:themeColor="text1"/>
+        </w:rPr>
+        <w:t>Experience</w:t>
+      </w:r>
+      <w:proofErr w:type="spellEnd"/>
+      <w:r>
+        <w:rPr>
+          <w:color w:val="000000" w:themeColor="text1"/>
+        </w:rPr>
+        <w:t xml:space="preserve"> Questionnaire (UEQ) werd deze deelnemer wél opgenomen, omdat hij/zij op basis van de uitgevoerde taken beide versies van de tool inhoudelijk kon beoordelen en zo extra inzicht gaf in de ervaren gebruikservaring. Voor de prestatiematen, zoals taakduur en aantal gemaakte fouten, is de piloot echter uitgesloten om vertekening door het eerdere testkarakter van de sessie te vermijden.</w:t>
+      </w:r>
     </w:p>
     <w:p>
       <w:pPr>
@@ -21481,7 +21595,14 @@
           <w:color w:val="000000" w:themeColor="text1"/>
         </w:rPr>
         <w:noBreakHyphen/>
-        <w:t xml:space="preserve"> en analysefeatures, zoals kleurcodering voor het soort node, iconen voor classificatie, filtering op status, telling van </w:t>
+        <w:t xml:space="preserve"> en analysefeatures, zoals kleurcodering voor het soort node, iconen voor classificatie, </w:t>
+      </w:r>
+      <w:r>
+        <w:rPr>
+          <w:color w:val="000000" w:themeColor="text1"/>
+        </w:rPr>
+        <w:lastRenderedPageBreak/>
+        <w:t xml:space="preserve">filtering op status, telling van </w:t>
       </w:r>
       <w:proofErr w:type="spellStart"/>
       <w:r>
@@ -21746,9 +21867,8 @@
           <w:noProof/>
           <w:color w:val="000000" w:themeColor="text1"/>
         </w:rPr>
-        <w:lastRenderedPageBreak/>
         <w:drawing>
-          <wp:inline distT="0" distB="0" distL="0" distR="0" wp14:anchorId="385A938B" wp14:editId="291D01DA">
+          <wp:inline distT="0" distB="0" distL="0" distR="0" wp14:anchorId="385A938B" wp14:editId="3BC1C74C">
             <wp:extent cx="5759450" cy="2903855"/>
             <wp:effectExtent l="0" t="0" r="0" b="0"/>
             <wp:docPr id="254494346" name="Afbeelding 25" descr="Afbeelding met tekst, schermopname, Lettertype, nummer&#10;&#10;Door AI gegenereerde inhoud is mogelijk onjuist."/>
@@ -22084,6 +22204,7 @@
         <w:rPr>
           <w:color w:val="000000" w:themeColor="text1"/>
         </w:rPr>
+        <w:lastRenderedPageBreak/>
         <w:t xml:space="preserve">Daarnaast voerden deelnemers </w:t>
       </w:r>
       <w:r>
@@ -22386,14 +22507,7 @@
         <w:rPr>
           <w:color w:val="000000" w:themeColor="text1"/>
         </w:rPr>
-        <w:t xml:space="preserve"> 'Sommige werknemers weigeren wachtwoordmanagers' </w:t>
-      </w:r>
-      <w:r>
-        <w:rPr>
-          <w:color w:val="000000" w:themeColor="text1"/>
-        </w:rPr>
-        <w:lastRenderedPageBreak/>
-        <w:t xml:space="preserve">(Low </w:t>
+        <w:t xml:space="preserve"> 'Sommige werknemers weigeren wachtwoordmanagers' (Low </w:t>
       </w:r>
       <w:proofErr w:type="spellStart"/>
       <w:r>
@@ -23053,6 +23167,7 @@
         <w:rPr>
           <w:color w:val="000000" w:themeColor="text1"/>
         </w:rPr>
+        <w:lastRenderedPageBreak/>
         <w:t xml:space="preserve">De studie verzamelde zo zowel kwantitatieve </w:t>
       </w:r>
       <w:proofErr w:type="spellStart"/>
@@ -23441,6 +23556,7 @@
         <w:rPr>
           <w:color w:val="000000" w:themeColor="text1"/>
         </w:rPr>
+        <w:lastRenderedPageBreak/>
         <w:t xml:space="preserve">De daaropvolgende open vragen waren bedoeld om kwalitatieve feedback te verzamelen over mogelijke verbeterpunten in </w:t>
       </w:r>
       <w:r>
@@ -24598,18 +24714,131 @@
           <w:bCs/>
           <w:color w:val="000000" w:themeColor="text1"/>
         </w:rPr>
-        <w:t>5.6</w:t>
-      </w:r>
-      <w:r>
+        <w:t>5.6 Samenvatting van de belangrijkste resultaten</w:t>
+      </w:r>
+      <w:bookmarkEnd w:id="49"/>
+    </w:p>
+    <w:p>
+      <w:pPr>
+        <w:spacing w:afterLines="24" w:after="57" w:line="288" w:lineRule="auto"/>
+        <w:rPr>
+          <w:b/>
+          <w:bCs/>
+          <w:color w:val="000000" w:themeColor="text1"/>
+        </w:rPr>
+      </w:pPr>
+    </w:p>
+    <w:p>
+      <w:pPr>
+        <w:spacing w:afterLines="24" w:after="57" w:line="288" w:lineRule="auto"/>
+        <w:rPr>
+          <w:color w:val="000000" w:themeColor="text1"/>
+        </w:rPr>
+      </w:pPr>
+      <w:r>
+        <w:rPr>
+          <w:color w:val="000000" w:themeColor="text1"/>
+        </w:rPr>
+        <w:t xml:space="preserve">De empirische resultaten bevestigen dat de basisfunctionaliteit van de tool voldoende is voor minimale ondersteuning van </w:t>
+      </w:r>
+      <w:proofErr w:type="spellStart"/>
+      <w:r>
+        <w:rPr>
+          <w:color w:val="000000" w:themeColor="text1"/>
+        </w:rPr>
+        <w:t>Fortunately-Unfortunately</w:t>
+      </w:r>
+      <w:proofErr w:type="spellEnd"/>
+      <w:r>
+        <w:rPr>
+          <w:color w:val="000000" w:themeColor="text1"/>
+        </w:rPr>
+        <w:t xml:space="preserve"> trees, maar dat de toegevoegde UX-features een substantiële verbetering opleveren in gebruiksvriendelijkheid en efficiëntie. Versie 2 scoort op alle UEQ-dimensies positief en wordt door alle deelnemers unaniem verkozen boven de basis </w:t>
+      </w:r>
+      <w:proofErr w:type="spellStart"/>
+      <w:r>
+        <w:rPr>
+          <w:color w:val="000000" w:themeColor="text1"/>
+        </w:rPr>
+        <w:t>mindmap</w:t>
+      </w:r>
+      <w:proofErr w:type="spellEnd"/>
+      <w:r>
+        <w:rPr>
+          <w:color w:val="000000" w:themeColor="text1"/>
+        </w:rPr>
+        <w:t xml:space="preserve">-tool, dankzij features zoals filtering en visuele codering. Deze bevindingen beantwoorden de onderzoeksvragen direct en onderbouwen de waarde van </w:t>
+      </w:r>
+      <w:proofErr w:type="spellStart"/>
+      <w:r>
+        <w:rPr>
+          <w:color w:val="000000" w:themeColor="text1"/>
+        </w:rPr>
+        <w:t>domeinspecifieke</w:t>
+      </w:r>
+      <w:proofErr w:type="spellEnd"/>
+      <w:r>
+        <w:rPr>
+          <w:color w:val="000000" w:themeColor="text1"/>
+        </w:rPr>
+        <w:t xml:space="preserve"> UX in </w:t>
+      </w:r>
+      <w:proofErr w:type="spellStart"/>
+      <w:r>
+        <w:rPr>
+          <w:color w:val="000000" w:themeColor="text1"/>
+        </w:rPr>
+        <w:t>threat</w:t>
+      </w:r>
+      <w:proofErr w:type="spellEnd"/>
+      <w:r>
+        <w:rPr>
+          <w:color w:val="000000" w:themeColor="text1"/>
+        </w:rPr>
+        <w:t xml:space="preserve"> modeling.</w:t>
+      </w:r>
+    </w:p>
+    <w:p>
+      <w:pPr>
+        <w:spacing w:afterLines="24" w:after="57" w:line="288" w:lineRule="auto"/>
+        <w:rPr>
+          <w:b/>
+          <w:bCs/>
+          <w:color w:val="000000" w:themeColor="text1"/>
+        </w:rPr>
+      </w:pPr>
+    </w:p>
+    <w:p>
+      <w:pPr>
+        <w:spacing w:afterLines="24" w:after="57" w:line="288" w:lineRule="auto"/>
+        <w:rPr>
+          <w:b/>
+          <w:bCs/>
+          <w:color w:val="000000" w:themeColor="text1"/>
+        </w:rPr>
+      </w:pPr>
+    </w:p>
+    <w:p>
+      <w:pPr>
+        <w:pStyle w:val="Kop2"/>
         <w:rPr>
           <w:rFonts w:asciiTheme="minorHAnsi" w:hAnsiTheme="minorHAnsi"/>
           <w:b/>
           <w:bCs/>
           <w:color w:val="000000" w:themeColor="text1"/>
         </w:rPr>
-        <w:t xml:space="preserve"> Samenvatting van de belangrijkste resultaten</w:t>
-      </w:r>
-      <w:bookmarkEnd w:id="49"/>
+      </w:pPr>
+      <w:bookmarkStart w:id="50" w:name="_Toc218798937"/>
+      <w:r>
+        <w:rPr>
+          <w:rFonts w:asciiTheme="minorHAnsi" w:hAnsiTheme="minorHAnsi"/>
+          <w:b/>
+          <w:bCs/>
+          <w:color w:val="000000" w:themeColor="text1"/>
+        </w:rPr>
+        <w:t>5.7 Beantwoording van de onderzoeksvragen</w:t>
+      </w:r>
+      <w:bookmarkEnd w:id="50"/>
     </w:p>
     <w:p>
       <w:pPr>
@@ -24623,137 +24852,6 @@
     </w:p>
     <w:p>
       <w:pPr>
-        <w:spacing w:afterLines="24" w:after="57" w:line="288" w:lineRule="auto"/>
-        <w:rPr>
-          <w:color w:val="000000" w:themeColor="text1"/>
-        </w:rPr>
-      </w:pPr>
-      <w:r>
-        <w:rPr>
-          <w:color w:val="000000" w:themeColor="text1"/>
-        </w:rPr>
-        <w:t xml:space="preserve">De empirische resultaten bevestigen dat de basisfunctionaliteit van de tool voldoende is voor minimale ondersteuning van </w:t>
-      </w:r>
-      <w:proofErr w:type="spellStart"/>
-      <w:r>
-        <w:rPr>
-          <w:color w:val="000000" w:themeColor="text1"/>
-        </w:rPr>
-        <w:t>Fortunately-Unfortunately</w:t>
-      </w:r>
-      <w:proofErr w:type="spellEnd"/>
-      <w:r>
-        <w:rPr>
-          <w:color w:val="000000" w:themeColor="text1"/>
-        </w:rPr>
-        <w:t xml:space="preserve"> trees, maar dat de toegevoegde UX-features een substantiële verbetering opleveren in gebruiksvriendelijkheid en efficiëntie. Versie 2 scoort op alle UEQ-dimensies positief en wordt door alle deelnemers unaniem verkozen boven de basis </w:t>
-      </w:r>
-      <w:proofErr w:type="spellStart"/>
-      <w:r>
-        <w:rPr>
-          <w:color w:val="000000" w:themeColor="text1"/>
-        </w:rPr>
-        <w:t>mindmap</w:t>
-      </w:r>
-      <w:proofErr w:type="spellEnd"/>
-      <w:r>
-        <w:rPr>
-          <w:color w:val="000000" w:themeColor="text1"/>
-        </w:rPr>
-        <w:t xml:space="preserve">-tool, dankzij features zoals filtering en visuele codering. Deze bevindingen beantwoorden de onderzoeksvragen direct en onderbouwen de waarde van </w:t>
-      </w:r>
-      <w:proofErr w:type="spellStart"/>
-      <w:r>
-        <w:rPr>
-          <w:color w:val="000000" w:themeColor="text1"/>
-        </w:rPr>
-        <w:t>domeinspecifieke</w:t>
-      </w:r>
-      <w:proofErr w:type="spellEnd"/>
-      <w:r>
-        <w:rPr>
-          <w:color w:val="000000" w:themeColor="text1"/>
-        </w:rPr>
-        <w:t xml:space="preserve"> UX in </w:t>
-      </w:r>
-      <w:proofErr w:type="spellStart"/>
-      <w:r>
-        <w:rPr>
-          <w:color w:val="000000" w:themeColor="text1"/>
-        </w:rPr>
-        <w:t>threat</w:t>
-      </w:r>
-      <w:proofErr w:type="spellEnd"/>
-      <w:r>
-        <w:rPr>
-          <w:color w:val="000000" w:themeColor="text1"/>
-        </w:rPr>
-        <w:t xml:space="preserve"> modeling.</w:t>
-      </w:r>
-    </w:p>
-    <w:p>
-      <w:pPr>
-        <w:spacing w:afterLines="24" w:after="57" w:line="288" w:lineRule="auto"/>
-        <w:rPr>
-          <w:b/>
-          <w:bCs/>
-          <w:color w:val="000000" w:themeColor="text1"/>
-        </w:rPr>
-      </w:pPr>
-    </w:p>
-    <w:p>
-      <w:pPr>
-        <w:spacing w:afterLines="24" w:after="57" w:line="288" w:lineRule="auto"/>
-        <w:rPr>
-          <w:b/>
-          <w:bCs/>
-          <w:color w:val="000000" w:themeColor="text1"/>
-        </w:rPr>
-      </w:pPr>
-    </w:p>
-    <w:p>
-      <w:pPr>
-        <w:pStyle w:val="Kop2"/>
-        <w:rPr>
-          <w:rFonts w:asciiTheme="minorHAnsi" w:hAnsiTheme="minorHAnsi"/>
-          <w:b/>
-          <w:bCs/>
-          <w:color w:val="000000" w:themeColor="text1"/>
-        </w:rPr>
-      </w:pPr>
-      <w:bookmarkStart w:id="50" w:name="_Toc218798937"/>
-      <w:r>
-        <w:rPr>
-          <w:rFonts w:asciiTheme="minorHAnsi" w:hAnsiTheme="minorHAnsi"/>
-          <w:b/>
-          <w:bCs/>
-          <w:color w:val="000000" w:themeColor="text1"/>
-        </w:rPr>
-        <w:t>5.7</w:t>
-      </w:r>
-      <w:r>
-        <w:rPr>
-          <w:rFonts w:asciiTheme="minorHAnsi" w:hAnsiTheme="minorHAnsi"/>
-          <w:b/>
-          <w:bCs/>
-          <w:color w:val="000000" w:themeColor="text1"/>
-        </w:rPr>
-        <w:t xml:space="preserve"> Beantwoording van de onderzoeksvragen</w:t>
-      </w:r>
-      <w:bookmarkEnd w:id="50"/>
-    </w:p>
-    <w:p>
-      <w:pPr>
-        <w:spacing w:afterLines="24" w:after="57" w:line="288" w:lineRule="auto"/>
-        <w:rPr>
-          <w:b/>
-          <w:bCs/>
-          <w:color w:val="000000" w:themeColor="text1"/>
-        </w:rPr>
-      </w:pPr>
-    </w:p>
-    <w:p>
-      <w:pPr>
         <w:pStyle w:val="Kop3"/>
         <w:rPr>
           <w:b/>
@@ -24768,31 +24866,7 @@
           <w:bCs/>
           <w:color w:val="000000" w:themeColor="text1"/>
         </w:rPr>
-        <w:t>5</w:t>
-      </w:r>
-      <w:r>
-        <w:rPr>
-          <w:b/>
-          <w:bCs/>
-          <w:color w:val="000000" w:themeColor="text1"/>
-        </w:rPr>
-        <w:t>.</w:t>
-      </w:r>
-      <w:r>
-        <w:rPr>
-          <w:b/>
-          <w:bCs/>
-          <w:color w:val="000000" w:themeColor="text1"/>
-        </w:rPr>
-        <w:t>7</w:t>
-      </w:r>
-      <w:r>
-        <w:rPr>
-          <w:b/>
-          <w:bCs/>
-          <w:color w:val="000000" w:themeColor="text1"/>
-        </w:rPr>
-        <w:t>.1 Onderzoeksvraag 1: Minimale basisfunctionaliteit</w:t>
+        <w:t>5.7.1 Onderzoeksvraag 1: Minimale basisfunctionaliteit</w:t>
       </w:r>
       <w:bookmarkEnd w:id="51"/>
     </w:p>
@@ -24947,31 +25021,7 @@
           <w:bCs/>
           <w:color w:val="000000" w:themeColor="text1"/>
         </w:rPr>
-        <w:t>5</w:t>
-      </w:r>
-      <w:r>
-        <w:rPr>
-          <w:b/>
-          <w:bCs/>
-          <w:color w:val="000000" w:themeColor="text1"/>
-        </w:rPr>
-        <w:t>.</w:t>
-      </w:r>
-      <w:r>
-        <w:rPr>
-          <w:b/>
-          <w:bCs/>
-          <w:color w:val="000000" w:themeColor="text1"/>
-        </w:rPr>
-        <w:t>7</w:t>
-      </w:r>
-      <w:r>
-        <w:rPr>
-          <w:b/>
-          <w:bCs/>
-          <w:color w:val="000000" w:themeColor="text1"/>
-        </w:rPr>
-        <w:t>.2 Onderzoeksvraag 2: Meest nuttige extra functies</w:t>
+        <w:t>5.7.2 Onderzoeksvraag 2: Meest nuttige extra functies</w:t>
       </w:r>
       <w:bookmarkEnd w:id="52"/>
     </w:p>
@@ -25091,15 +25141,7 @@
           <w:bCs/>
           <w:color w:val="000000" w:themeColor="text1"/>
         </w:rPr>
-        <w:t>5.7</w:t>
-      </w:r>
-      <w:r>
-        <w:rPr>
-          <w:b/>
-          <w:bCs/>
-          <w:color w:val="000000" w:themeColor="text1"/>
-        </w:rPr>
-        <w:t>.3 Onderzoeksvraag 3: Vergelijking met een basisversie</w:t>
+        <w:t>5.7.3 Onderzoeksvraag 3: Vergelijking met een basisversie</w:t>
       </w:r>
       <w:bookmarkEnd w:id="53"/>
     </w:p>
@@ -27475,27 +27517,7 @@
           <w14:ligatures w14:val="none"/>
         </w:rPr>
         <w:noBreakHyphen/>
-        <w:t>ecosysteem. Het gebruik van de basisversie bood een gecontroleerd referentiepunt met gelijkaardige functionaliteit en domeinlogica, zonder verschillen in accountvereisten</w:t>
-      </w:r>
-      <w:r>
-        <w:rPr>
-          <w:rFonts w:eastAsia="Times New Roman" w:cs="Times New Roman"/>
-          <w:color w:val="000000" w:themeColor="text1"/>
-          <w:kern w:val="0"/>
-          <w:lang w:eastAsia="nl-BE"/>
-          <w14:ligatures w14:val="none"/>
-        </w:rPr>
-        <w:t xml:space="preserve"> </w:t>
-      </w:r>
-      <w:r>
-        <w:rPr>
-          <w:rFonts w:eastAsia="Times New Roman" w:cs="Times New Roman"/>
-          <w:color w:val="000000" w:themeColor="text1"/>
-          <w:kern w:val="0"/>
-          <w:lang w:eastAsia="nl-BE"/>
-          <w14:ligatures w14:val="none"/>
-        </w:rPr>
-        <w:t xml:space="preserve">of bijkomende features in externe tools die de resultaten zouden kunnen vertekenen. Bovendien focuste het onderzoek op korte, eenmalige taken, zodat effecten van leercurve, langdurig gebruik en samenwerking niet zijn meegenomen. De bevindingen zijn dus vooral geldig als eerste indicatie van bruikbaarheid binnen deze specifieke context en niet als evaluatie van </w:t>
+        <w:t xml:space="preserve">ecosysteem. Het gebruik van de basisversie bood een gecontroleerd referentiepunt met gelijkaardige functionaliteit en domeinlogica, zonder verschillen in accountvereisten of bijkomende features in externe tools die de resultaten zouden kunnen vertekenen. Bovendien focuste het onderzoek op korte, eenmalige taken, zodat effecten van leercurve, langdurig gebruik en samenwerking niet zijn meegenomen. De bevindingen zijn dus vooral geldig als eerste indicatie van bruikbaarheid binnen deze specifieke context en niet als evaluatie van </w:t>
       </w:r>
       <w:proofErr w:type="spellStart"/>
       <w:r>

</xml_diff>

<commit_message>
some changes in inleiding
</commit_message>
<xml_diff>
--- a/Master_scriptie_tekst.docx
+++ b/Master_scriptie_tekst.docx
@@ -6859,7 +6859,91 @@
         <w:rPr>
           <w:color w:val="000000" w:themeColor="text1"/>
         </w:rPr>
-        <w:t>Binnen de softwareontwikkelingscyclus kan threat modeling op verschillende momenten worden ingezet, bijvoorbeeld tijdens requirementsanalyse, architectuurontwerp of bij grote refactorings. In een ideale DevSecOps-context wordt threat modeling iteratief uitgevoerd, parallel aan sprints, zodat nieuwe features meteen op beveiligingsimpact worden beoordeeld. In de praktijk blijkt dit echter moeilijk vol te houden: tijdsdruk, beperkte securityexpertise en een gebrek aan passende tooling zorgen ervoor dat threat modeling vaak wordt uitgesteld, oppervlakkig uitgevoerd of volledig overgeslagen.</w:t>
+        <w:t>Binnen de softwareontwikkelingscyclus kan threat modeling op verschillende momenten worden ingezet</w:t>
+      </w:r>
+      <w:r>
+        <w:rPr>
+          <w:color w:val="000000" w:themeColor="text1"/>
+        </w:rPr>
+        <w:t>. Dit kan</w:t>
+      </w:r>
+      <w:r>
+        <w:rPr>
+          <w:color w:val="000000" w:themeColor="text1"/>
+        </w:rPr>
+        <w:t xml:space="preserve"> bijvoorbeeld tijdens</w:t>
+      </w:r>
+      <w:r>
+        <w:rPr>
+          <w:color w:val="000000" w:themeColor="text1"/>
+        </w:rPr>
+        <w:t xml:space="preserve"> de</w:t>
+      </w:r>
+      <w:r>
+        <w:rPr>
+          <w:color w:val="000000" w:themeColor="text1"/>
+        </w:rPr>
+        <w:t xml:space="preserve"> requirementsanalyse, </w:t>
+      </w:r>
+      <w:r>
+        <w:rPr>
+          <w:color w:val="000000" w:themeColor="text1"/>
+        </w:rPr>
+        <w:t xml:space="preserve">het </w:t>
+      </w:r>
+      <w:r>
+        <w:rPr>
+          <w:color w:val="000000" w:themeColor="text1"/>
+        </w:rPr>
+        <w:t xml:space="preserve">architectuurontwerp of bij </w:t>
+      </w:r>
+      <w:r>
+        <w:rPr>
+          <w:color w:val="000000" w:themeColor="text1"/>
+        </w:rPr>
+        <w:t xml:space="preserve">de </w:t>
+      </w:r>
+      <w:r>
+        <w:rPr>
+          <w:color w:val="000000" w:themeColor="text1"/>
+        </w:rPr>
+        <w:t>grote refactorings. In een ideale DevSecOps-context wordt threat modeling iteratief uitgevoerd</w:t>
+      </w:r>
+      <w:r>
+        <w:rPr>
+          <w:color w:val="000000" w:themeColor="text1"/>
+        </w:rPr>
+        <w:t xml:space="preserve"> </w:t>
+      </w:r>
+      <w:r>
+        <w:rPr>
+          <w:color w:val="000000" w:themeColor="text1"/>
+        </w:rPr>
+        <w:t>zodat nieuwe features meteen op beveiligingsimpact worden beoordeeld. In de praktijk blijkt dit echter moeilijk vol te houden</w:t>
+      </w:r>
+      <w:r>
+        <w:rPr>
+          <w:color w:val="000000" w:themeColor="text1"/>
+        </w:rPr>
+        <w:t>. T</w:t>
+      </w:r>
+      <w:r>
+        <w:rPr>
+          <w:color w:val="000000" w:themeColor="text1"/>
+        </w:rPr>
+        <w:t>ijdsdruk, beperkte securityexpertise en een gebrek aan passende tooling zorgen ervoor dat threat modeling vaak uitgesteld, oppervlakkig uitgevoerd of volledig overgeslagen</w:t>
+      </w:r>
+      <w:r>
+        <w:rPr>
+          <w:color w:val="000000" w:themeColor="text1"/>
+        </w:rPr>
+        <w:t xml:space="preserve"> wordt</w:t>
+      </w:r>
+      <w:r>
+        <w:rPr>
+          <w:color w:val="000000" w:themeColor="text1"/>
+        </w:rPr>
+        <w:t>.</w:t>
       </w:r>
       <w:r>
         <w:rPr>
@@ -6889,7 +6973,55 @@
         <w:rPr>
           <w:color w:val="000000" w:themeColor="text1"/>
         </w:rPr>
-        <w:t>Door de jaren heen zijn diverse methoden ontwikkeld om threat modeling te structureren. Een bekende categorie zijn taxonomie-gebaseerde benaderingen, zoals STRIDE, die dreigingen klasseren op basis van hun effect (bijvoorbeeld spoofing, tampering, repudiation, information disclosure, denial of service, elevation of privilege). Andere benaderingen maken gebruik van attack trees of misuse cases, waarin ongewenst gedrag hiërarchisch wordt opgesplitst in deelstappen en varianten. In meer industriële context worden deze methoden vaak ondersteund door generieke diagramtools of mindmapsoftware, die wel flexibiliteit bieden maar weinig domeinspecifieke ondersteuning voor prioritering</w:t>
+        <w:t>Door de jaren heen zijn diverse methoden ontwikkeld om threat modeling te structureren. Een bekende categorie zijn taxonomie-gebaseerde benaderingen, zoals STRIDE, die dreigingen klasseren op basis van hun effect (bijvoorbeeld spoofing, tampering, repudiation, information disclosure, denial of service, elevation of privilege). Andere benaderingen maken gebruik van attack trees of misuse cases</w:t>
+      </w:r>
+      <w:r>
+        <w:rPr>
+          <w:color w:val="000000" w:themeColor="text1"/>
+        </w:rPr>
+        <w:t>. Hierin wordt</w:t>
+      </w:r>
+      <w:r>
+        <w:rPr>
+          <w:color w:val="000000" w:themeColor="text1"/>
+        </w:rPr>
+        <w:t xml:space="preserve"> ongewenst gedrag hiërarchisch opgesplitst in deelstappen en varianten. In meer industriële context worden deze methoden vaak ondersteund door generieke diagramtools of mindmapsoftware</w:t>
+      </w:r>
+      <w:r>
+        <w:rPr>
+          <w:color w:val="000000" w:themeColor="text1"/>
+        </w:rPr>
+        <w:t>.</w:t>
+      </w:r>
+      <w:r>
+        <w:rPr>
+          <w:color w:val="000000" w:themeColor="text1"/>
+        </w:rPr>
+        <w:t xml:space="preserve"> </w:t>
+      </w:r>
+      <w:r>
+        <w:rPr>
+          <w:color w:val="000000" w:themeColor="text1"/>
+        </w:rPr>
+        <w:t>Deze bieden</w:t>
+      </w:r>
+      <w:r>
+        <w:rPr>
+          <w:color w:val="000000" w:themeColor="text1"/>
+        </w:rPr>
+        <w:t xml:space="preserve"> wel flexibiliteit</w:t>
+      </w:r>
+      <w:r>
+        <w:rPr>
+          <w:color w:val="000000" w:themeColor="text1"/>
+        </w:rPr>
+        <w:t xml:space="preserve">, </w:t>
+      </w:r>
+      <w:r>
+        <w:rPr>
+          <w:color w:val="000000" w:themeColor="text1"/>
+        </w:rPr>
+        <w:t>maar weinig domeinspecifieke ondersteuning voor prioritering</w:t>
       </w:r>
       <w:r>
         <w:rPr>
@@ -6930,14 +7062,38 @@
         <w:rPr>
           <w:color w:val="000000" w:themeColor="text1"/>
         </w:rPr>
-        <w:t xml:space="preserve">Voor ontwikkelaars zonder diepgaande securityachtergrond vorm deze klassieke methoden een aanzienlijke drempel: ze vergen vertrouwdheid met beveiligingsconcepten, formele notaties en lijsten van standaarddreigingen, terwijl de beschikbare tools zelden gericht zijn op gebruiksgemak of leerbaarheid. Hierdoor dreigt threat modeling een specialistische activiteit te blijven, in plaats van een breed gedragen ontwerpraktijk binnen ontwikkelteams. Deze kloof tussen theoretisch </w:t>
+        <w:t>Voor ontwikkelaars zonder diepgaande securityachtergrond vorm deze klassieke methoden een aanzienlijke drempel</w:t>
+      </w:r>
+      <w:r>
+        <w:rPr>
+          <w:color w:val="000000" w:themeColor="text1"/>
+        </w:rPr>
+        <w:t>.</w:t>
+      </w:r>
+      <w:r>
+        <w:rPr>
+          <w:color w:val="000000" w:themeColor="text1"/>
+        </w:rPr>
+        <w:t xml:space="preserve"> </w:t>
+      </w:r>
+      <w:r>
+        <w:rPr>
+          <w:color w:val="000000" w:themeColor="text1"/>
+        </w:rPr>
+        <w:t>Z</w:t>
+      </w:r>
+      <w:r>
+        <w:rPr>
+          <w:color w:val="000000" w:themeColor="text1"/>
+        </w:rPr>
+        <w:t xml:space="preserve">e vergen vertrouwdheid met beveiligingsconcepten, formele notaties en lijsten van standaarddreigingen, terwijl de beschikbare tools zelden gericht zijn op gebruiksgemak of leerbaarheid. Hierdoor dreigt threat modeling een specialistische activiteit te blijven, in plaats van een breed gedragen ontwerpraktijk binnen ontwikkelteams. Deze kloof tussen theoretisch aanbevolen werkwijzen en feitelijke toepassing in de praktijk vormt een belangrijk motief </w:t>
       </w:r>
       <w:r>
         <w:rPr>
           <w:color w:val="000000" w:themeColor="text1"/>
         </w:rPr>
         <w:lastRenderedPageBreak/>
-        <w:t>aanbevolen werkwijzen en feitelijke toepassing in de praktijk vormt een belangrijk motief voor onderzoek naar meer toegankelijke, visueel ondersteunde en gebruiksvriendelijke threat-modelingbenaderingen</w:t>
+        <w:t>voor onderzoek naar meer toegankelijke, visueel ondersteunde en gebruiksvriendelijke threat-modelingbenaderingen</w:t>
       </w:r>
       <w:r>
         <w:rPr>
@@ -6966,7 +7122,43 @@
         <w:rPr>
           <w:color w:val="000000" w:themeColor="text1"/>
         </w:rPr>
-        <w:t>Dit onderzoek speelt in op deze drempels door een gebruiksvriendelijke webtool te ontwerpen en evalueren, gebaseerd op de Fortunately–Unfortunately-methode, waarin dreigingen en tegenmaatregelen in een intuïtieve boomstructuur worden voorgesteld. De tool integreert specifieke UX-features zoals kleurcodering, statusiconen, danger rating, branch summary en filtering om zowel navigatie als prioritering te ondersteunen en wordt geëvalueerd in een gebruikersonderzoek waarin de tool wordt vergeleken met een meer generieke</w:t>
+        <w:t>Dit onderzoek speelt in op deze drempels door een gebruiksvriendelijke webtool te ontwerpen en evalueren</w:t>
+      </w:r>
+      <w:r>
+        <w:rPr>
+          <w:color w:val="000000" w:themeColor="text1"/>
+        </w:rPr>
+        <w:t>. Deze tool is</w:t>
+      </w:r>
+      <w:r>
+        <w:rPr>
+          <w:color w:val="000000" w:themeColor="text1"/>
+        </w:rPr>
+        <w:t xml:space="preserve"> gebaseerd op de Fortunately–Unfortunately-methode, waarin dreigingen en tegenmaatregelen in een intuïtieve boomstructuur worden voorgesteld. De tool integreert specifieke UX-features zoals kleurcodering, statusiconen, danger rating, branch summary en filtering om zowel navigatie als prioritering te ondersteunen</w:t>
+      </w:r>
+      <w:r>
+        <w:rPr>
+          <w:color w:val="000000" w:themeColor="text1"/>
+        </w:rPr>
+        <w:t>. Om de tool te e</w:t>
+      </w:r>
+      <w:r>
+        <w:rPr>
+          <w:color w:val="000000" w:themeColor="text1"/>
+        </w:rPr>
+        <w:t>value</w:t>
+      </w:r>
+      <w:r>
+        <w:rPr>
+          <w:color w:val="000000" w:themeColor="text1"/>
+        </w:rPr>
+        <w:t xml:space="preserve">ren wordt </w:t>
+      </w:r>
+      <w:r>
+        <w:rPr>
+          <w:color w:val="000000" w:themeColor="text1"/>
+        </w:rPr>
+        <w:t>in een gebruikersonderzoek de tool vergeleken met een meer generieke</w:t>
       </w:r>
       <w:r>
         <w:rPr>
@@ -6978,13 +7170,40 @@
         <w:rPr>
           <w:color w:val="000000" w:themeColor="text1"/>
         </w:rPr>
-        <w:t xml:space="preserve"> referentiesoftware. Het doel van de masterproef is na te gaan in welke mate deze combinatie van visuele representatie en UX-features</w:t>
-      </w:r>
-      <w:r>
-        <w:rPr>
-          <w:color w:val="000000" w:themeColor="text1"/>
-        </w:rPr>
-        <w:t xml:space="preserve"> in combinatie met de </w:t>
+        <w:t xml:space="preserve"> referentiesoftware. </w:t>
+      </w:r>
+      <w:r>
+        <w:rPr>
+          <w:color w:val="000000" w:themeColor="text1"/>
+        </w:rPr>
+        <w:t xml:space="preserve">Het doel van deze thesis is een </w:t>
+      </w:r>
+      <w:r>
+        <w:rPr>
+          <w:color w:val="000000" w:themeColor="text1"/>
+        </w:rPr>
+        <w:t>gebruiksvriendelijke webtool te ontwerpen en te evalueren die gebruikers ondersteunt om de Fortunately–Unfortunately</w:t>
+      </w:r>
+      <w:r>
+        <w:rPr>
+          <w:color w:val="000000" w:themeColor="text1"/>
+        </w:rPr>
+        <w:noBreakHyphen/>
+        <w:t>methode op een efficiënte en toegankelijke manier uit te voeren voor threat modeling door niet</w:t>
+      </w:r>
+      <w:r>
+        <w:rPr>
+          <w:color w:val="000000" w:themeColor="text1"/>
+        </w:rPr>
+        <w:noBreakHyphen/>
+        <w:t>security</w:t>
+      </w:r>
+      <w:r>
+        <w:rPr>
+          <w:color w:val="000000" w:themeColor="text1"/>
+        </w:rPr>
+        <w:noBreakHyphen/>
+        <w:t>experts.</w:t>
       </w:r>
       <w:r>
         <w:rPr>
@@ -6994,29 +7213,10 @@
       </w:r>
       <w:r>
         <w:rPr>
-          <w:color w:val="000000" w:themeColor="text1"/>
-        </w:rPr>
-        <w:t xml:space="preserve">Fortunately–Unfortunately-methode, </w:t>
-      </w:r>
-      <w:r>
-        <w:rPr>
-          <w:color w:val="000000" w:themeColor="text1"/>
-        </w:rPr>
-        <w:t>threat modeling toegankelijker, efficiënter en effectiever maakt voor niet-security-experts.</w:t>
-      </w:r>
-      <w:r>
-        <w:rPr>
-          <w:rFonts w:ascii="Arial" w:hAnsi="Arial" w:cs="Arial"/>
-          <w:color w:val="000000" w:themeColor="text1"/>
-        </w:rPr>
-        <w:t>​</w:t>
-      </w:r>
-      <w:r>
-        <w:rPr>
           <w:rFonts w:cs="Arial"/>
           <w:color w:val="000000" w:themeColor="text1"/>
         </w:rPr>
-        <w:t xml:space="preserve"> Om dit doel te bereiken, beantwoordt dit onderzoek de volgende onderzoeksvragen:</w:t>
+        <w:t>Om dit doel te bereiken, beantwoordt dit onderzoek de volgende onderzoeksvragen:</w:t>
       </w:r>
     </w:p>
     <w:p>
@@ -7107,7 +7307,31 @@
         <w:rPr>
           <w:color w:val="000000" w:themeColor="text1"/>
         </w:rPr>
-        <w:t>Het belang van dit onderzoek ligt enerzijds in het verlagen van de instapdrempel voor threat modeling, zodat ook ontwikkelaars zonder uitgesproken securityprofiel beter onderbouwde risicoanalyses kunnen uitvoeren. Anderzijds draagt het werk bij aan HCI-onderzoek rond gebruiksvriendelijke security-tools door empirisch te onderzoeken welke interface-elementen (zoals kleuren, iconen, filters en tooltips) daadwerkelijk bijdragen aan taakprestatie, gebruikservaring en feature-voorkeur. Daarmee sluit de masterproef aan bij een bredere verschuiving van puur technische security-oplossingen naar mensgerichte, visueel ondersteunde hulpmiddelen.</w:t>
+        <w:t>Het belang van dit onderzoek ligt enerzijds in het verlagen van de instapdrempel voor threat modeling</w:t>
+      </w:r>
+      <w:r>
+        <w:rPr>
+          <w:color w:val="000000" w:themeColor="text1"/>
+        </w:rPr>
+        <w:t>.</w:t>
+      </w:r>
+      <w:r>
+        <w:rPr>
+          <w:color w:val="000000" w:themeColor="text1"/>
+        </w:rPr>
+        <w:t xml:space="preserve"> </w:t>
+      </w:r>
+      <w:r>
+        <w:rPr>
+          <w:color w:val="000000" w:themeColor="text1"/>
+        </w:rPr>
+        <w:t>Zo kunnen</w:t>
+      </w:r>
+      <w:r>
+        <w:rPr>
+          <w:color w:val="000000" w:themeColor="text1"/>
+        </w:rPr>
+        <w:t xml:space="preserve"> ook ontwikkelaars zonder uitgesproken securityprofiel beter onderbouwde risicoanalyses uitvoeren. Anderzijds draagt het werk bij aan HCI-onderzoek rond gebruiksvriendelijke security-tools door empirisch te onderzoeken welke interface-elementen (zoals kleuren, iconen, filters en tooltips) daadwerkelijk bijdragen aan taakprestatie, gebruikservaring en feature-voorkeur. Daarmee sluit de masterproef aan bij een bredere verschuiving van puur technische security-oplossingen naar mensgerichte, visueel ondersteunde hulpmiddelen.</w:t>
       </w:r>
     </w:p>
     <w:p>
@@ -7216,14 +7440,14 @@
         <w:rPr>
           <w:color w:val="000000" w:themeColor="text1"/>
         </w:rPr>
-        <w:t xml:space="preserve"> waarin deze bevindingen worden geïnterpreteerd, gekoppeld </w:t>
+        <w:t xml:space="preserve"> waarin deze bevindingen worden geïnterpreteerd, gekoppeld aan de literatuur en aangevuld met beperkingen en implicaties voor praktijk en </w:t>
       </w:r>
       <w:r>
         <w:rPr>
           <w:color w:val="000000" w:themeColor="text1"/>
         </w:rPr>
         <w:lastRenderedPageBreak/>
-        <w:t xml:space="preserve">aan de literatuur en aangevuld met beperkingen en implicaties voor praktijk en toekomstig onderzoek. Hoofdstuk </w:t>
+        <w:t xml:space="preserve">toekomstig onderzoek. Hoofdstuk </w:t>
       </w:r>
       <w:r>
         <w:rPr>
@@ -10300,7 +10524,7 @@
         </w:rPr>
         <w:lastRenderedPageBreak/>
         <w:drawing>
-          <wp:inline distT="0" distB="0" distL="0" distR="0" wp14:anchorId="128D5ED9" wp14:editId="35A93400">
+          <wp:inline distT="0" distB="0" distL="0" distR="0" wp14:anchorId="128D5ED9" wp14:editId="739EEDAC">
             <wp:extent cx="5759450" cy="2856865"/>
             <wp:effectExtent l="0" t="0" r="0" b="635"/>
             <wp:docPr id="234035025" name="Afbeelding 1" descr="Afbeelding met diagram, schermopname, lijn, ontwerp&#10;&#10;Door AI gegenereerde inhoud is mogelijk onjuist."/>
@@ -10409,7 +10633,7 @@
           <w:color w:val="000000" w:themeColor="text1"/>
         </w:rPr>
         <w:drawing>
-          <wp:inline distT="0" distB="0" distL="0" distR="0" wp14:anchorId="7D672503" wp14:editId="7D9419A8">
+          <wp:inline distT="0" distB="0" distL="0" distR="0" wp14:anchorId="7D672503" wp14:editId="32E76F20">
             <wp:extent cx="5759450" cy="1689735"/>
             <wp:effectExtent l="0" t="0" r="0" b="5715"/>
             <wp:docPr id="373297823" name="Afbeelding 2" descr="Afbeelding met diagram, lijn, origami, ontwerp&#10;&#10;Door AI gegenereerde inhoud is mogelijk onjuist."/>
@@ -17626,7 +17850,7 @@
           <w:color w:val="000000" w:themeColor="text1"/>
         </w:rPr>
         <w:drawing>
-          <wp:inline distT="0" distB="0" distL="0" distR="0" wp14:anchorId="1D6CEF09" wp14:editId="1AD5225D">
+          <wp:inline distT="0" distB="0" distL="0" distR="0" wp14:anchorId="1D6CEF09" wp14:editId="75540241">
             <wp:extent cx="5759450" cy="2903855"/>
             <wp:effectExtent l="0" t="0" r="0" b="0"/>
             <wp:docPr id="254494346" name="Afbeelding 25" descr="Afbeelding met tekst, schermopname, Lettertype, nummer&#10;&#10;Door AI gegenereerde inhoud is mogelijk onjuist."/>
@@ -28182,7 +28406,6 @@
   <w:style w:type="character" w:default="1" w:styleId="Standaardalinea-lettertype">
     <w:name w:val="Default Paragraph Font"/>
     <w:uiPriority w:val="1"/>
-    <w:semiHidden/>
     <w:unhideWhenUsed/>
   </w:style>
   <w:style w:type="table" w:default="1" w:styleId="Standaardtabel">

</xml_diff>

<commit_message>
revised to feedback and corrected current whitespace lay out
</commit_message>
<xml_diff>
--- a/Master_scriptie_tekst.docx
+++ b/Master_scriptie_tekst.docx
@@ -12,7 +12,7 @@
           <w:color w:val="000000" w:themeColor="text1"/>
         </w:rPr>
       </w:pPr>
-      <w:bookmarkStart w:id="0" w:name="_Toc219064400"/>
+      <w:bookmarkStart w:id="0" w:name="_Toc219313848"/>
       <w:r>
         <w:rPr>
           <w:rFonts w:asciiTheme="minorHAnsi" w:hAnsiTheme="minorHAnsi"/>
@@ -154,10 +154,12 @@
             </w:rPr>
             <w:fldChar w:fldCharType="separate"/>
           </w:r>
-          <w:hyperlink w:anchor="_Toc219064400" w:history="1">
+          <w:hyperlink w:anchor="_Toc219313848" w:history="1">
             <w:r>
               <w:rPr>
                 <w:rStyle w:val="Hyperlink"/>
+                <w:b/>
+                <w:bCs/>
                 <w:noProof/>
               </w:rPr>
               <w:t>Woord vooraf</w:t>
@@ -181,7 +183,7 @@
                 <w:noProof/>
                 <w:webHidden/>
               </w:rPr>
-              <w:instrText xml:space="preserve"> PAGEREF _Toc219064400 \h </w:instrText>
+              <w:instrText xml:space="preserve"> PAGEREF _Toc219313848 \h </w:instrText>
             </w:r>
             <w:r>
               <w:rPr>
@@ -224,10 +226,12 @@
               <w:lang w:eastAsia="nl-BE"/>
             </w:rPr>
           </w:pPr>
-          <w:hyperlink w:anchor="_Toc219064401" w:history="1">
+          <w:hyperlink w:anchor="_Toc219313849" w:history="1">
             <w:r>
               <w:rPr>
                 <w:rStyle w:val="Hyperlink"/>
+                <w:b/>
+                <w:bCs/>
                 <w:noProof/>
               </w:rPr>
               <w:t>Lijst van figuren</w:t>
@@ -251,7 +255,7 @@
                 <w:noProof/>
                 <w:webHidden/>
               </w:rPr>
-              <w:instrText xml:space="preserve"> PAGEREF _Toc219064401 \h </w:instrText>
+              <w:instrText xml:space="preserve"> PAGEREF _Toc219313849 \h </w:instrText>
             </w:r>
             <w:r>
               <w:rPr>
@@ -294,10 +298,12 @@
               <w:lang w:eastAsia="nl-BE"/>
             </w:rPr>
           </w:pPr>
-          <w:hyperlink w:anchor="_Toc219064402" w:history="1">
+          <w:hyperlink w:anchor="_Toc219313850" w:history="1">
             <w:r>
               <w:rPr>
                 <w:rStyle w:val="Hyperlink"/>
+                <w:b/>
+                <w:bCs/>
                 <w:noProof/>
               </w:rPr>
               <w:t>Abstract</w:t>
@@ -321,7 +327,7 @@
                 <w:noProof/>
                 <w:webHidden/>
               </w:rPr>
-              <w:instrText xml:space="preserve"> PAGEREF _Toc219064402 \h </w:instrText>
+              <w:instrText xml:space="preserve"> PAGEREF _Toc219313850 \h </w:instrText>
             </w:r>
             <w:r>
               <w:rPr>
@@ -364,10 +370,12 @@
               <w:lang w:eastAsia="nl-BE"/>
             </w:rPr>
           </w:pPr>
-          <w:hyperlink w:anchor="_Toc219064403" w:history="1">
+          <w:hyperlink w:anchor="_Toc219313851" w:history="1">
             <w:r>
               <w:rPr>
                 <w:rStyle w:val="Hyperlink"/>
+                <w:b/>
+                <w:bCs/>
                 <w:noProof/>
                 <w:lang w:val="en-GB"/>
               </w:rPr>
@@ -392,7 +400,7 @@
                 <w:noProof/>
                 <w:webHidden/>
               </w:rPr>
-              <w:instrText xml:space="preserve"> PAGEREF _Toc219064403 \h </w:instrText>
+              <w:instrText xml:space="preserve"> PAGEREF _Toc219313851 \h </w:instrText>
             </w:r>
             <w:r>
               <w:rPr>
@@ -435,10 +443,12 @@
               <w:lang w:eastAsia="nl-BE"/>
             </w:rPr>
           </w:pPr>
-          <w:hyperlink w:anchor="_Toc219064404" w:history="1">
+          <w:hyperlink w:anchor="_Toc219313852" w:history="1">
             <w:r>
               <w:rPr>
                 <w:rStyle w:val="Hyperlink"/>
+                <w:b/>
+                <w:bCs/>
                 <w:noProof/>
               </w:rPr>
               <w:t>Inleiding</w:t>
@@ -462,7 +472,7 @@
                 <w:noProof/>
                 <w:webHidden/>
               </w:rPr>
-              <w:instrText xml:space="preserve"> PAGEREF _Toc219064404 \h </w:instrText>
+              <w:instrText xml:space="preserve"> PAGEREF _Toc219313852 \h </w:instrText>
             </w:r>
             <w:r>
               <w:rPr>
@@ -505,10 +515,12 @@
               <w:lang w:eastAsia="nl-BE"/>
             </w:rPr>
           </w:pPr>
-          <w:hyperlink w:anchor="_Toc219064405" w:history="1">
+          <w:hyperlink w:anchor="_Toc219313853" w:history="1">
             <w:r>
               <w:rPr>
                 <w:rStyle w:val="Hyperlink"/>
+                <w:b/>
+                <w:bCs/>
                 <w:noProof/>
               </w:rPr>
               <w:t>Achtergrond en gerelateerd werk</w:t>
@@ -532,7 +544,7 @@
                 <w:noProof/>
                 <w:webHidden/>
               </w:rPr>
-              <w:instrText xml:space="preserve"> PAGEREF _Toc219064405 \h </w:instrText>
+              <w:instrText xml:space="preserve"> PAGEREF _Toc219313853 \h </w:instrText>
             </w:r>
             <w:r>
               <w:rPr>
@@ -575,10 +587,12 @@
               <w:lang w:eastAsia="nl-BE"/>
             </w:rPr>
           </w:pPr>
-          <w:hyperlink w:anchor="_Toc219064406" w:history="1">
+          <w:hyperlink w:anchor="_Toc219313854" w:history="1">
             <w:r>
               <w:rPr>
                 <w:rStyle w:val="Hyperlink"/>
+                <w:b/>
+                <w:bCs/>
                 <w:noProof/>
               </w:rPr>
               <w:t>2.1 Fortunately-unfortunately methode</w:t>
@@ -602,7 +616,7 @@
                 <w:noProof/>
                 <w:webHidden/>
               </w:rPr>
-              <w:instrText xml:space="preserve"> PAGEREF _Toc219064406 \h </w:instrText>
+              <w:instrText xml:space="preserve"> PAGEREF _Toc219313854 \h </w:instrText>
             </w:r>
             <w:r>
               <w:rPr>
@@ -645,10 +659,12 @@
               <w:lang w:eastAsia="nl-BE"/>
             </w:rPr>
           </w:pPr>
-          <w:hyperlink w:anchor="_Toc219064407" w:history="1">
+          <w:hyperlink w:anchor="_Toc219313855" w:history="1">
             <w:r>
               <w:rPr>
                 <w:rStyle w:val="Hyperlink"/>
+                <w:b/>
+                <w:bCs/>
                 <w:noProof/>
               </w:rPr>
               <w:t>2.1.1 Beschrijving van de methode</w:t>
@@ -672,7 +688,7 @@
                 <w:noProof/>
                 <w:webHidden/>
               </w:rPr>
-              <w:instrText xml:space="preserve"> PAGEREF _Toc219064407 \h </w:instrText>
+              <w:instrText xml:space="preserve"> PAGEREF _Toc219313855 \h </w:instrText>
             </w:r>
             <w:r>
               <w:rPr>
@@ -715,10 +731,12 @@
               <w:lang w:eastAsia="nl-BE"/>
             </w:rPr>
           </w:pPr>
-          <w:hyperlink w:anchor="_Toc219064408" w:history="1">
+          <w:hyperlink w:anchor="_Toc219313856" w:history="1">
             <w:r>
               <w:rPr>
                 <w:rStyle w:val="Hyperlink"/>
+                <w:b/>
+                <w:bCs/>
                 <w:noProof/>
               </w:rPr>
               <w:t>2.1.2 Bestaande tool-ondersteuning</w:t>
@@ -742,7 +760,7 @@
                 <w:noProof/>
                 <w:webHidden/>
               </w:rPr>
-              <w:instrText xml:space="preserve"> PAGEREF _Toc219064408 \h </w:instrText>
+              <w:instrText xml:space="preserve"> PAGEREF _Toc219313856 \h </w:instrText>
             </w:r>
             <w:r>
               <w:rPr>
@@ -785,10 +803,12 @@
               <w:lang w:eastAsia="nl-BE"/>
             </w:rPr>
           </w:pPr>
-          <w:hyperlink w:anchor="_Toc219064409" w:history="1">
+          <w:hyperlink w:anchor="_Toc219313857" w:history="1">
             <w:r>
               <w:rPr>
                 <w:rStyle w:val="Hyperlink"/>
+                <w:b/>
+                <w:bCs/>
                 <w:noProof/>
               </w:rPr>
               <w:t>2.2 Gerelateerd werk</w:t>
@@ -812,7 +832,7 @@
                 <w:noProof/>
                 <w:webHidden/>
               </w:rPr>
-              <w:instrText xml:space="preserve"> PAGEREF _Toc219064409 \h </w:instrText>
+              <w:instrText xml:space="preserve"> PAGEREF _Toc219313857 \h </w:instrText>
             </w:r>
             <w:r>
               <w:rPr>
@@ -855,10 +875,12 @@
               <w:lang w:eastAsia="nl-BE"/>
             </w:rPr>
           </w:pPr>
-          <w:hyperlink w:anchor="_Toc219064410" w:history="1">
+          <w:hyperlink w:anchor="_Toc219313858" w:history="1">
             <w:r>
               <w:rPr>
                 <w:rStyle w:val="Hyperlink"/>
+                <w:b/>
+                <w:bCs/>
                 <w:noProof/>
               </w:rPr>
               <w:t>Ontwerp en implementatie</w:t>
@@ -882,7 +904,7 @@
                 <w:noProof/>
                 <w:webHidden/>
               </w:rPr>
-              <w:instrText xml:space="preserve"> PAGEREF _Toc219064410 \h </w:instrText>
+              <w:instrText xml:space="preserve"> PAGEREF _Toc219313858 \h </w:instrText>
             </w:r>
             <w:r>
               <w:rPr>
@@ -925,10 +947,12 @@
               <w:lang w:eastAsia="nl-BE"/>
             </w:rPr>
           </w:pPr>
-          <w:hyperlink w:anchor="_Toc219064411" w:history="1">
+          <w:hyperlink w:anchor="_Toc219313859" w:history="1">
             <w:r>
               <w:rPr>
                 <w:rStyle w:val="Hyperlink"/>
+                <w:b/>
+                <w:bCs/>
                 <w:noProof/>
               </w:rPr>
               <w:t>3.1 Ontwerpdoelstellingen</w:t>
@@ -952,7 +976,7 @@
                 <w:noProof/>
                 <w:webHidden/>
               </w:rPr>
-              <w:instrText xml:space="preserve"> PAGEREF _Toc219064411 \h </w:instrText>
+              <w:instrText xml:space="preserve"> PAGEREF _Toc219313859 \h </w:instrText>
             </w:r>
             <w:r>
               <w:rPr>
@@ -995,10 +1019,12 @@
               <w:lang w:eastAsia="nl-BE"/>
             </w:rPr>
           </w:pPr>
-          <w:hyperlink w:anchor="_Toc219064412" w:history="1">
+          <w:hyperlink w:anchor="_Toc219313860" w:history="1">
             <w:r>
               <w:rPr>
                 <w:rStyle w:val="Hyperlink"/>
+                <w:b/>
+                <w:bCs/>
                 <w:noProof/>
               </w:rPr>
               <w:t>3.2 Architectuur en technologie</w:t>
@@ -1022,7 +1048,7 @@
                 <w:noProof/>
                 <w:webHidden/>
               </w:rPr>
-              <w:instrText xml:space="preserve"> PAGEREF _Toc219064412 \h </w:instrText>
+              <w:instrText xml:space="preserve"> PAGEREF _Toc219313860 \h </w:instrText>
             </w:r>
             <w:r>
               <w:rPr>
@@ -1065,10 +1091,12 @@
               <w:lang w:eastAsia="nl-BE"/>
             </w:rPr>
           </w:pPr>
-          <w:hyperlink w:anchor="_Toc219064413" w:history="1">
+          <w:hyperlink w:anchor="_Toc219313861" w:history="1">
             <w:r>
               <w:rPr>
                 <w:rStyle w:val="Hyperlink"/>
+                <w:b/>
+                <w:bCs/>
                 <w:noProof/>
               </w:rPr>
               <w:t>3.3 Niet-geïmplementeerde alternatieven</w:t>
@@ -1092,7 +1120,7 @@
                 <w:noProof/>
                 <w:webHidden/>
               </w:rPr>
-              <w:instrText xml:space="preserve"> PAGEREF _Toc219064413 \h </w:instrText>
+              <w:instrText xml:space="preserve"> PAGEREF _Toc219313861 \h </w:instrText>
             </w:r>
             <w:r>
               <w:rPr>
@@ -1135,10 +1163,12 @@
               <w:lang w:eastAsia="nl-BE"/>
             </w:rPr>
           </w:pPr>
-          <w:hyperlink w:anchor="_Toc219064414" w:history="1">
+          <w:hyperlink w:anchor="_Toc219313862" w:history="1">
             <w:r>
               <w:rPr>
                 <w:rStyle w:val="Hyperlink"/>
+                <w:b/>
+                <w:bCs/>
                 <w:noProof/>
                 <w:lang w:val="en-GB"/>
               </w:rPr>
@@ -1163,7 +1193,7 @@
                 <w:noProof/>
                 <w:webHidden/>
               </w:rPr>
-              <w:instrText xml:space="preserve"> PAGEREF _Toc219064414 \h </w:instrText>
+              <w:instrText xml:space="preserve"> PAGEREF _Toc219313862 \h </w:instrText>
             </w:r>
             <w:r>
               <w:rPr>
@@ -1206,10 +1236,12 @@
               <w:lang w:eastAsia="nl-BE"/>
             </w:rPr>
           </w:pPr>
-          <w:hyperlink w:anchor="_Toc219064415" w:history="1">
+          <w:hyperlink w:anchor="_Toc219313863" w:history="1">
             <w:r>
               <w:rPr>
                 <w:rStyle w:val="Hyperlink"/>
+                <w:b/>
+                <w:bCs/>
                 <w:noProof/>
               </w:rPr>
               <w:t>3.5 Gekozen fileview-visualisatie</w:t>
@@ -1233,7 +1265,7 @@
                 <w:noProof/>
                 <w:webHidden/>
               </w:rPr>
-              <w:instrText xml:space="preserve"> PAGEREF _Toc219064415 \h </w:instrText>
+              <w:instrText xml:space="preserve"> PAGEREF _Toc219313863 \h </w:instrText>
             </w:r>
             <w:r>
               <w:rPr>
@@ -1276,10 +1308,12 @@
               <w:lang w:eastAsia="nl-BE"/>
             </w:rPr>
           </w:pPr>
-          <w:hyperlink w:anchor="_Toc219064416" w:history="1">
+          <w:hyperlink w:anchor="_Toc219313864" w:history="1">
             <w:r>
               <w:rPr>
                 <w:rStyle w:val="Hyperlink"/>
+                <w:b/>
+                <w:bCs/>
                 <w:noProof/>
               </w:rPr>
               <w:t>3.6 Basisfunctionaliteit en uitbreidingen</w:t>
@@ -1303,7 +1337,7 @@
                 <w:noProof/>
                 <w:webHidden/>
               </w:rPr>
-              <w:instrText xml:space="preserve"> PAGEREF _Toc219064416 \h </w:instrText>
+              <w:instrText xml:space="preserve"> PAGEREF _Toc219313864 \h </w:instrText>
             </w:r>
             <w:r>
               <w:rPr>
@@ -1346,10 +1380,12 @@
               <w:lang w:eastAsia="nl-BE"/>
             </w:rPr>
           </w:pPr>
-          <w:hyperlink w:anchor="_Toc219064417" w:history="1">
+          <w:hyperlink w:anchor="_Toc219313865" w:history="1">
             <w:r>
               <w:rPr>
                 <w:rStyle w:val="Hyperlink"/>
+                <w:b/>
+                <w:bCs/>
                 <w:noProof/>
               </w:rPr>
               <w:t>3.7 Node</w:t>
@@ -1357,6 +1393,8 @@
             <w:r>
               <w:rPr>
                 <w:rStyle w:val="Hyperlink"/>
+                <w:b/>
+                <w:bCs/>
                 <w:noProof/>
               </w:rPr>
               <w:noBreakHyphen/>
@@ -1381,7 +1419,7 @@
                 <w:noProof/>
                 <w:webHidden/>
               </w:rPr>
-              <w:instrText xml:space="preserve"> PAGEREF _Toc219064417 \h </w:instrText>
+              <w:instrText xml:space="preserve"> PAGEREF _Toc219313865 \h </w:instrText>
             </w:r>
             <w:r>
               <w:rPr>
@@ -1424,10 +1462,12 @@
               <w:lang w:eastAsia="nl-BE"/>
             </w:rPr>
           </w:pPr>
-          <w:hyperlink w:anchor="_Toc219064418" w:history="1">
+          <w:hyperlink w:anchor="_Toc219313866" w:history="1">
             <w:r>
               <w:rPr>
                 <w:rStyle w:val="Hyperlink"/>
+                <w:b/>
+                <w:bCs/>
                 <w:noProof/>
               </w:rPr>
               <w:t>3.8 Statusiconen en danger rating</w:t>
@@ -1451,7 +1491,7 @@
                 <w:noProof/>
                 <w:webHidden/>
               </w:rPr>
-              <w:instrText xml:space="preserve"> PAGEREF _Toc219064418 \h </w:instrText>
+              <w:instrText xml:space="preserve"> PAGEREF _Toc219313866 \h </w:instrText>
             </w:r>
             <w:r>
               <w:rPr>
@@ -1494,10 +1534,12 @@
               <w:lang w:eastAsia="nl-BE"/>
             </w:rPr>
           </w:pPr>
-          <w:hyperlink w:anchor="_Toc219064419" w:history="1">
+          <w:hyperlink w:anchor="_Toc219313867" w:history="1">
             <w:r>
               <w:rPr>
                 <w:rStyle w:val="Hyperlink"/>
+                <w:b/>
+                <w:bCs/>
                 <w:noProof/>
               </w:rPr>
               <w:t>3.9 Branch summary en filterlogica</w:t>
@@ -1521,7 +1563,7 @@
                 <w:noProof/>
                 <w:webHidden/>
               </w:rPr>
-              <w:instrText xml:space="preserve"> PAGEREF _Toc219064419 \h </w:instrText>
+              <w:instrText xml:space="preserve"> PAGEREF _Toc219313867 \h </w:instrText>
             </w:r>
             <w:r>
               <w:rPr>
@@ -1564,10 +1606,12 @@
               <w:lang w:eastAsia="nl-BE"/>
             </w:rPr>
           </w:pPr>
-          <w:hyperlink w:anchor="_Toc219064420" w:history="1">
+          <w:hyperlink w:anchor="_Toc219313868" w:history="1">
             <w:r>
               <w:rPr>
                 <w:rStyle w:val="Hyperlink"/>
+                <w:b/>
+                <w:bCs/>
                 <w:noProof/>
               </w:rPr>
               <w:t>3.10 Hover-functionaliteit voor parent-context</w:t>
@@ -1591,7 +1635,7 @@
                 <w:noProof/>
                 <w:webHidden/>
               </w:rPr>
-              <w:instrText xml:space="preserve"> PAGEREF _Toc219064420 \h </w:instrText>
+              <w:instrText xml:space="preserve"> PAGEREF _Toc219313868 \h </w:instrText>
             </w:r>
             <w:r>
               <w:rPr>
@@ -1634,10 +1678,12 @@
               <w:lang w:eastAsia="nl-BE"/>
             </w:rPr>
           </w:pPr>
-          <w:hyperlink w:anchor="_Toc219064421" w:history="1">
+          <w:hyperlink w:anchor="_Toc219313869" w:history="1">
             <w:r>
               <w:rPr>
                 <w:rStyle w:val="Hyperlink"/>
+                <w:b/>
+                <w:bCs/>
                 <w:noProof/>
               </w:rPr>
               <w:t>3.11 Ondersteuning en feedback in de UI</w:t>
@@ -1661,7 +1707,7 @@
                 <w:noProof/>
                 <w:webHidden/>
               </w:rPr>
-              <w:instrText xml:space="preserve"> PAGEREF _Toc219064421 \h </w:instrText>
+              <w:instrText xml:space="preserve"> PAGEREF _Toc219313869 \h </w:instrText>
             </w:r>
             <w:r>
               <w:rPr>
@@ -1704,10 +1750,12 @@
               <w:lang w:eastAsia="nl-BE"/>
             </w:rPr>
           </w:pPr>
-          <w:hyperlink w:anchor="_Toc219064422" w:history="1">
+          <w:hyperlink w:anchor="_Toc219313870" w:history="1">
             <w:r>
               <w:rPr>
                 <w:rStyle w:val="Hyperlink"/>
+                <w:b/>
+                <w:bCs/>
                 <w:noProof/>
               </w:rPr>
               <w:t>3.12 Toepassing van Nielsen’s usability</w:t>
@@ -1715,6 +1763,8 @@
             <w:r>
               <w:rPr>
                 <w:rStyle w:val="Hyperlink"/>
+                <w:b/>
+                <w:bCs/>
                 <w:noProof/>
               </w:rPr>
               <w:noBreakHyphen/>
@@ -1739,7 +1789,7 @@
                 <w:noProof/>
                 <w:webHidden/>
               </w:rPr>
-              <w:instrText xml:space="preserve"> PAGEREF _Toc219064422 \h </w:instrText>
+              <w:instrText xml:space="preserve"> PAGEREF _Toc219313870 \h </w:instrText>
             </w:r>
             <w:r>
               <w:rPr>
@@ -1782,10 +1832,12 @@
               <w:lang w:eastAsia="nl-BE"/>
             </w:rPr>
           </w:pPr>
-          <w:hyperlink w:anchor="_Toc219064423" w:history="1">
+          <w:hyperlink w:anchor="_Toc219313871" w:history="1">
             <w:r>
               <w:rPr>
                 <w:rStyle w:val="Hyperlink"/>
+                <w:b/>
+                <w:bCs/>
                 <w:noProof/>
               </w:rPr>
               <w:t>3.12.1 Zichtbaarheid van de systeemstatus</w:t>
@@ -1809,7 +1861,7 @@
                 <w:noProof/>
                 <w:webHidden/>
               </w:rPr>
-              <w:instrText xml:space="preserve"> PAGEREF _Toc219064423 \h </w:instrText>
+              <w:instrText xml:space="preserve"> PAGEREF _Toc219313871 \h </w:instrText>
             </w:r>
             <w:r>
               <w:rPr>
@@ -1852,10 +1904,12 @@
               <w:lang w:eastAsia="nl-BE"/>
             </w:rPr>
           </w:pPr>
-          <w:hyperlink w:anchor="_Toc219064424" w:history="1">
+          <w:hyperlink w:anchor="_Toc219313872" w:history="1">
             <w:r>
               <w:rPr>
                 <w:rStyle w:val="Hyperlink"/>
+                <w:b/>
+                <w:bCs/>
                 <w:noProof/>
               </w:rPr>
               <w:t>3.13.2 Overeenkomst tussen systeem en de echte wereld</w:t>
@@ -1879,7 +1933,7 @@
                 <w:noProof/>
                 <w:webHidden/>
               </w:rPr>
-              <w:instrText xml:space="preserve"> PAGEREF _Toc219064424 \h </w:instrText>
+              <w:instrText xml:space="preserve"> PAGEREF _Toc219313872 \h </w:instrText>
             </w:r>
             <w:r>
               <w:rPr>
@@ -1922,10 +1976,12 @@
               <w:lang w:eastAsia="nl-BE"/>
             </w:rPr>
           </w:pPr>
-          <w:hyperlink w:anchor="_Toc219064425" w:history="1">
+          <w:hyperlink w:anchor="_Toc219313873" w:history="1">
             <w:r>
               <w:rPr>
                 <w:rStyle w:val="Hyperlink"/>
+                <w:b/>
+                <w:bCs/>
                 <w:noProof/>
               </w:rPr>
               <w:t>3.12.3 Gebruikerscontrole en vrijheid</w:t>
@@ -1949,7 +2005,7 @@
                 <w:noProof/>
                 <w:webHidden/>
               </w:rPr>
-              <w:instrText xml:space="preserve"> PAGEREF _Toc219064425 \h </w:instrText>
+              <w:instrText xml:space="preserve"> PAGEREF _Toc219313873 \h </w:instrText>
             </w:r>
             <w:r>
               <w:rPr>
@@ -1992,10 +2048,12 @@
               <w:lang w:eastAsia="nl-BE"/>
             </w:rPr>
           </w:pPr>
-          <w:hyperlink w:anchor="_Toc219064426" w:history="1">
+          <w:hyperlink w:anchor="_Toc219313874" w:history="1">
             <w:r>
               <w:rPr>
                 <w:rStyle w:val="Hyperlink"/>
+                <w:b/>
+                <w:bCs/>
                 <w:noProof/>
               </w:rPr>
               <w:t>3.12.4 Consistentie en standaarden</w:t>
@@ -2019,7 +2077,7 @@
                 <w:noProof/>
                 <w:webHidden/>
               </w:rPr>
-              <w:instrText xml:space="preserve"> PAGEREF _Toc219064426 \h </w:instrText>
+              <w:instrText xml:space="preserve"> PAGEREF _Toc219313874 \h </w:instrText>
             </w:r>
             <w:r>
               <w:rPr>
@@ -2062,10 +2120,12 @@
               <w:lang w:eastAsia="nl-BE"/>
             </w:rPr>
           </w:pPr>
-          <w:hyperlink w:anchor="_Toc219064427" w:history="1">
+          <w:hyperlink w:anchor="_Toc219313875" w:history="1">
             <w:r>
               <w:rPr>
                 <w:rStyle w:val="Hyperlink"/>
+                <w:b/>
+                <w:bCs/>
                 <w:noProof/>
               </w:rPr>
               <w:t>3.12.5 Foutpreventie</w:t>
@@ -2089,7 +2149,7 @@
                 <w:noProof/>
                 <w:webHidden/>
               </w:rPr>
-              <w:instrText xml:space="preserve"> PAGEREF _Toc219064427 \h </w:instrText>
+              <w:instrText xml:space="preserve"> PAGEREF _Toc219313875 \h </w:instrText>
             </w:r>
             <w:r>
               <w:rPr>
@@ -2132,10 +2192,12 @@
               <w:lang w:eastAsia="nl-BE"/>
             </w:rPr>
           </w:pPr>
-          <w:hyperlink w:anchor="_Toc219064428" w:history="1">
+          <w:hyperlink w:anchor="_Toc219313876" w:history="1">
             <w:r>
               <w:rPr>
                 <w:rStyle w:val="Hyperlink"/>
+                <w:b/>
+                <w:bCs/>
                 <w:noProof/>
               </w:rPr>
               <w:t>3.12.6 Herkenning boven herinnering</w:t>
@@ -2159,7 +2221,7 @@
                 <w:noProof/>
                 <w:webHidden/>
               </w:rPr>
-              <w:instrText xml:space="preserve"> PAGEREF _Toc219064428 \h </w:instrText>
+              <w:instrText xml:space="preserve"> PAGEREF _Toc219313876 \h </w:instrText>
             </w:r>
             <w:r>
               <w:rPr>
@@ -2202,10 +2264,12 @@
               <w:lang w:eastAsia="nl-BE"/>
             </w:rPr>
           </w:pPr>
-          <w:hyperlink w:anchor="_Toc219064429" w:history="1">
+          <w:hyperlink w:anchor="_Toc219313877" w:history="1">
             <w:r>
               <w:rPr>
                 <w:rStyle w:val="Hyperlink"/>
+                <w:b/>
+                <w:bCs/>
                 <w:noProof/>
               </w:rPr>
               <w:t>3.12.7 Flexibiliteit en efficiëntie van gebruik</w:t>
@@ -2229,7 +2293,7 @@
                 <w:noProof/>
                 <w:webHidden/>
               </w:rPr>
-              <w:instrText xml:space="preserve"> PAGEREF _Toc219064429 \h </w:instrText>
+              <w:instrText xml:space="preserve"> PAGEREF _Toc219313877 \h </w:instrText>
             </w:r>
             <w:r>
               <w:rPr>
@@ -2272,10 +2336,12 @@
               <w:lang w:eastAsia="nl-BE"/>
             </w:rPr>
           </w:pPr>
-          <w:hyperlink w:anchor="_Toc219064430" w:history="1">
+          <w:hyperlink w:anchor="_Toc219313878" w:history="1">
             <w:r>
               <w:rPr>
                 <w:rStyle w:val="Hyperlink"/>
+                <w:b/>
+                <w:bCs/>
                 <w:noProof/>
               </w:rPr>
               <w:t>3.12.8 Esthetisch en minimalistisch ontwerp</w:t>
@@ -2299,7 +2365,7 @@
                 <w:noProof/>
                 <w:webHidden/>
               </w:rPr>
-              <w:instrText xml:space="preserve"> PAGEREF _Toc219064430 \h </w:instrText>
+              <w:instrText xml:space="preserve"> PAGEREF _Toc219313878 \h </w:instrText>
             </w:r>
             <w:r>
               <w:rPr>
@@ -2342,10 +2408,12 @@
               <w:lang w:eastAsia="nl-BE"/>
             </w:rPr>
           </w:pPr>
-          <w:hyperlink w:anchor="_Toc219064431" w:history="1">
+          <w:hyperlink w:anchor="_Toc219313879" w:history="1">
             <w:r>
               <w:rPr>
                 <w:rStyle w:val="Hyperlink"/>
+                <w:b/>
+                <w:bCs/>
                 <w:noProof/>
               </w:rPr>
               <w:t>3.12.10 Helpen bij herkennen, diagnosticeren en herstellen van fouten</w:t>
@@ -2369,7 +2437,7 @@
                 <w:noProof/>
                 <w:webHidden/>
               </w:rPr>
-              <w:instrText xml:space="preserve"> PAGEREF _Toc219064431 \h </w:instrText>
+              <w:instrText xml:space="preserve"> PAGEREF _Toc219313879 \h </w:instrText>
             </w:r>
             <w:r>
               <w:rPr>
@@ -2412,10 +2480,12 @@
               <w:lang w:eastAsia="nl-BE"/>
             </w:rPr>
           </w:pPr>
-          <w:hyperlink w:anchor="_Toc219064432" w:history="1">
+          <w:hyperlink w:anchor="_Toc219313880" w:history="1">
             <w:r>
               <w:rPr>
                 <w:rStyle w:val="Hyperlink"/>
+                <w:b/>
+                <w:bCs/>
                 <w:noProof/>
               </w:rPr>
               <w:t>3.12.11 Help en documentatie</w:t>
@@ -2439,7 +2509,7 @@
                 <w:noProof/>
                 <w:webHidden/>
               </w:rPr>
-              <w:instrText xml:space="preserve"> PAGEREF _Toc219064432 \h </w:instrText>
+              <w:instrText xml:space="preserve"> PAGEREF _Toc219313880 \h </w:instrText>
             </w:r>
             <w:r>
               <w:rPr>
@@ -2482,10 +2552,12 @@
               <w:lang w:eastAsia="nl-BE"/>
             </w:rPr>
           </w:pPr>
-          <w:hyperlink w:anchor="_Toc219064433" w:history="1">
+          <w:hyperlink w:anchor="_Toc219313881" w:history="1">
             <w:r>
               <w:rPr>
                 <w:rStyle w:val="Hyperlink"/>
+                <w:b/>
+                <w:bCs/>
                 <w:noProof/>
               </w:rPr>
               <w:t>3.13 Prototypebeperkingen</w:t>
@@ -2509,7 +2581,7 @@
                 <w:noProof/>
                 <w:webHidden/>
               </w:rPr>
-              <w:instrText xml:space="preserve"> PAGEREF _Toc219064433 \h </w:instrText>
+              <w:instrText xml:space="preserve"> PAGEREF _Toc219313881 \h </w:instrText>
             </w:r>
             <w:r>
               <w:rPr>
@@ -2552,10 +2624,12 @@
               <w:lang w:eastAsia="nl-BE"/>
             </w:rPr>
           </w:pPr>
-          <w:hyperlink w:anchor="_Toc219064434" w:history="1">
+          <w:hyperlink w:anchor="_Toc219313882" w:history="1">
             <w:r>
               <w:rPr>
                 <w:rStyle w:val="Hyperlink"/>
+                <w:b/>
+                <w:bCs/>
                 <w:noProof/>
               </w:rPr>
               <w:t>Gebruikersstudie</w:t>
@@ -2579,7 +2653,7 @@
                 <w:noProof/>
                 <w:webHidden/>
               </w:rPr>
-              <w:instrText xml:space="preserve"> PAGEREF _Toc219064434 \h </w:instrText>
+              <w:instrText xml:space="preserve"> PAGEREF _Toc219313882 \h </w:instrText>
             </w:r>
             <w:r>
               <w:rPr>
@@ -2622,10 +2696,12 @@
               <w:lang w:eastAsia="nl-BE"/>
             </w:rPr>
           </w:pPr>
-          <w:hyperlink w:anchor="_Toc219064435" w:history="1">
+          <w:hyperlink w:anchor="_Toc219313883" w:history="1">
             <w:r>
               <w:rPr>
                 <w:rStyle w:val="Hyperlink"/>
+                <w:b/>
+                <w:bCs/>
                 <w:noProof/>
               </w:rPr>
               <w:t>4.1 Doel van de gebruikersstudie</w:t>
@@ -2649,7 +2725,7 @@
                 <w:noProof/>
                 <w:webHidden/>
               </w:rPr>
-              <w:instrText xml:space="preserve"> PAGEREF _Toc219064435 \h </w:instrText>
+              <w:instrText xml:space="preserve"> PAGEREF _Toc219313883 \h </w:instrText>
             </w:r>
             <w:r>
               <w:rPr>
@@ -2692,10 +2768,12 @@
               <w:lang w:eastAsia="nl-BE"/>
             </w:rPr>
           </w:pPr>
-          <w:hyperlink w:anchor="_Toc219064436" w:history="1">
+          <w:hyperlink w:anchor="_Toc219313884" w:history="1">
             <w:r>
               <w:rPr>
                 <w:rStyle w:val="Hyperlink"/>
+                <w:b/>
+                <w:bCs/>
                 <w:noProof/>
               </w:rPr>
               <w:t>4.2 Verloop van de gebruikersstudie</w:t>
@@ -2719,7 +2797,7 @@
                 <w:noProof/>
                 <w:webHidden/>
               </w:rPr>
-              <w:instrText xml:space="preserve"> PAGEREF _Toc219064436 \h </w:instrText>
+              <w:instrText xml:space="preserve"> PAGEREF _Toc219313884 \h </w:instrText>
             </w:r>
             <w:r>
               <w:rPr>
@@ -2762,10 +2840,12 @@
               <w:lang w:eastAsia="nl-BE"/>
             </w:rPr>
           </w:pPr>
-          <w:hyperlink w:anchor="_Toc219064437" w:history="1">
+          <w:hyperlink w:anchor="_Toc219313885" w:history="1">
             <w:r>
               <w:rPr>
                 <w:rStyle w:val="Hyperlink"/>
+                <w:b/>
+                <w:bCs/>
                 <w:noProof/>
               </w:rPr>
               <w:t>4.3 Deelnemers</w:t>
@@ -2789,7 +2869,7 @@
                 <w:noProof/>
                 <w:webHidden/>
               </w:rPr>
-              <w:instrText xml:space="preserve"> PAGEREF _Toc219064437 \h </w:instrText>
+              <w:instrText xml:space="preserve"> PAGEREF _Toc219313885 \h </w:instrText>
             </w:r>
             <w:r>
               <w:rPr>
@@ -2832,13 +2912,15 @@
               <w:lang w:eastAsia="nl-BE"/>
             </w:rPr>
           </w:pPr>
-          <w:hyperlink w:anchor="_Toc219064438" w:history="1">
+          <w:hyperlink w:anchor="_Toc219313886" w:history="1">
             <w:r>
               <w:rPr>
                 <w:rStyle w:val="Hyperlink"/>
-                <w:noProof/>
-              </w:rPr>
-              <w:t>4.4 Softwareversies</w:t>
+                <w:b/>
+                <w:bCs/>
+                <w:noProof/>
+              </w:rPr>
+              <w:t>4.4 Functionele verschillen tussen basis- en uitgebreide software versie</w:t>
             </w:r>
             <w:r>
               <w:rPr>
@@ -2859,7 +2941,7 @@
                 <w:noProof/>
                 <w:webHidden/>
               </w:rPr>
-              <w:instrText xml:space="preserve"> PAGEREF _Toc219064438 \h </w:instrText>
+              <w:instrText xml:space="preserve"> PAGEREF _Toc219313886 \h </w:instrText>
             </w:r>
             <w:r>
               <w:rPr>
@@ -2902,10 +2984,12 @@
               <w:lang w:eastAsia="nl-BE"/>
             </w:rPr>
           </w:pPr>
-          <w:hyperlink w:anchor="_Toc219064439" w:history="1">
+          <w:hyperlink w:anchor="_Toc219313887" w:history="1">
             <w:r>
               <w:rPr>
                 <w:rStyle w:val="Hyperlink"/>
+                <w:b/>
+                <w:bCs/>
                 <w:noProof/>
               </w:rPr>
               <w:t>4.5 Taken en procedure</w:t>
@@ -2929,7 +3013,7 @@
                 <w:noProof/>
                 <w:webHidden/>
               </w:rPr>
-              <w:instrText xml:space="preserve"> PAGEREF _Toc219064439 \h </w:instrText>
+              <w:instrText xml:space="preserve"> PAGEREF _Toc219313887 \h </w:instrText>
             </w:r>
             <w:r>
               <w:rPr>
@@ -2972,10 +3056,12 @@
               <w:lang w:eastAsia="nl-BE"/>
             </w:rPr>
           </w:pPr>
-          <w:hyperlink w:anchor="_Toc219064440" w:history="1">
+          <w:hyperlink w:anchor="_Toc219313888" w:history="1">
             <w:r>
               <w:rPr>
                 <w:rStyle w:val="Hyperlink"/>
+                <w:b/>
+                <w:bCs/>
                 <w:noProof/>
               </w:rPr>
               <w:t>4.6 Dataverzameling</w:t>
@@ -2999,7 +3085,7 @@
                 <w:noProof/>
                 <w:webHidden/>
               </w:rPr>
-              <w:instrText xml:space="preserve"> PAGEREF _Toc219064440 \h </w:instrText>
+              <w:instrText xml:space="preserve"> PAGEREF _Toc219313888 \h </w:instrText>
             </w:r>
             <w:r>
               <w:rPr>
@@ -3042,10 +3128,12 @@
               <w:lang w:eastAsia="nl-BE"/>
             </w:rPr>
           </w:pPr>
-          <w:hyperlink w:anchor="_Toc219064441" w:history="1">
+          <w:hyperlink w:anchor="_Toc219313889" w:history="1">
             <w:r>
               <w:rPr>
                 <w:rStyle w:val="Hyperlink"/>
+                <w:b/>
+                <w:bCs/>
                 <w:noProof/>
               </w:rPr>
               <w:t>4.7 User Experience Questionaire</w:t>
@@ -3069,7 +3157,7 @@
                 <w:noProof/>
                 <w:webHidden/>
               </w:rPr>
-              <w:instrText xml:space="preserve"> PAGEREF _Toc219064441 \h </w:instrText>
+              <w:instrText xml:space="preserve"> PAGEREF _Toc219313889 \h </w:instrText>
             </w:r>
             <w:r>
               <w:rPr>
@@ -3112,10 +3200,12 @@
               <w:lang w:eastAsia="nl-BE"/>
             </w:rPr>
           </w:pPr>
-          <w:hyperlink w:anchor="_Toc219064442" w:history="1">
+          <w:hyperlink w:anchor="_Toc219313890" w:history="1">
             <w:r>
               <w:rPr>
                 <w:rStyle w:val="Hyperlink"/>
+                <w:b/>
+                <w:bCs/>
                 <w:noProof/>
               </w:rPr>
               <w:t>4.8 Open vragen en rangschikking</w:t>
@@ -3139,7 +3229,7 @@
                 <w:noProof/>
                 <w:webHidden/>
               </w:rPr>
-              <w:instrText xml:space="preserve"> PAGEREF _Toc219064442 \h </w:instrText>
+              <w:instrText xml:space="preserve"> PAGEREF _Toc219313890 \h </w:instrText>
             </w:r>
             <w:r>
               <w:rPr>
@@ -3182,10 +3272,12 @@
               <w:lang w:eastAsia="nl-BE"/>
             </w:rPr>
           </w:pPr>
-          <w:hyperlink w:anchor="_Toc219064443" w:history="1">
+          <w:hyperlink w:anchor="_Toc219313891" w:history="1">
             <w:r>
               <w:rPr>
                 <w:rStyle w:val="Hyperlink"/>
+                <w:b/>
+                <w:bCs/>
                 <w:noProof/>
               </w:rPr>
               <w:t>Resultaten</w:t>
@@ -3209,7 +3301,7 @@
                 <w:noProof/>
                 <w:webHidden/>
               </w:rPr>
-              <w:instrText xml:space="preserve"> PAGEREF _Toc219064443 \h </w:instrText>
+              <w:instrText xml:space="preserve"> PAGEREF _Toc219313891 \h </w:instrText>
             </w:r>
             <w:r>
               <w:rPr>
@@ -3252,11 +3344,13 @@
               <w:lang w:eastAsia="nl-BE"/>
             </w:rPr>
           </w:pPr>
-          <w:hyperlink w:anchor="_Toc219064444" w:history="1">
+          <w:hyperlink w:anchor="_Toc219313892" w:history="1">
             <w:r>
               <w:rPr>
                 <w:rStyle w:val="Hyperlink"/>
                 <w:rFonts w:eastAsia="Times New Roman"/>
+                <w:b/>
+                <w:bCs/>
                 <w:noProof/>
                 <w:lang w:eastAsia="nl-BE"/>
               </w:rPr>
@@ -3281,7 +3375,7 @@
                 <w:noProof/>
                 <w:webHidden/>
               </w:rPr>
-              <w:instrText xml:space="preserve"> PAGEREF _Toc219064444 \h </w:instrText>
+              <w:instrText xml:space="preserve"> PAGEREF _Toc219313892 \h </w:instrText>
             </w:r>
             <w:r>
               <w:rPr>
@@ -3324,11 +3418,13 @@
               <w:lang w:eastAsia="nl-BE"/>
             </w:rPr>
           </w:pPr>
-          <w:hyperlink w:anchor="_Toc219064445" w:history="1">
+          <w:hyperlink w:anchor="_Toc219313893" w:history="1">
             <w:r>
               <w:rPr>
                 <w:rStyle w:val="Hyperlink"/>
                 <w:rFonts w:eastAsia="Times New Roman"/>
+                <w:b/>
+                <w:bCs/>
                 <w:noProof/>
                 <w:lang w:eastAsia="nl-BE"/>
               </w:rPr>
@@ -3353,7 +3449,7 @@
                 <w:noProof/>
                 <w:webHidden/>
               </w:rPr>
-              <w:instrText xml:space="preserve"> PAGEREF _Toc219064445 \h </w:instrText>
+              <w:instrText xml:space="preserve"> PAGEREF _Toc219313893 \h </w:instrText>
             </w:r>
             <w:r>
               <w:rPr>
@@ -3396,11 +3492,13 @@
               <w:lang w:eastAsia="nl-BE"/>
             </w:rPr>
           </w:pPr>
-          <w:hyperlink w:anchor="_Toc219064446" w:history="1">
+          <w:hyperlink w:anchor="_Toc219313894" w:history="1">
             <w:r>
               <w:rPr>
                 <w:rStyle w:val="Hyperlink"/>
                 <w:rFonts w:eastAsia="Times New Roman"/>
+                <w:b/>
+                <w:bCs/>
                 <w:noProof/>
                 <w:lang w:eastAsia="nl-BE"/>
               </w:rPr>
@@ -3425,7 +3523,7 @@
                 <w:noProof/>
                 <w:webHidden/>
               </w:rPr>
-              <w:instrText xml:space="preserve"> PAGEREF _Toc219064446 \h </w:instrText>
+              <w:instrText xml:space="preserve"> PAGEREF _Toc219313894 \h </w:instrText>
             </w:r>
             <w:r>
               <w:rPr>
@@ -3468,11 +3566,13 @@
               <w:lang w:eastAsia="nl-BE"/>
             </w:rPr>
           </w:pPr>
-          <w:hyperlink w:anchor="_Toc219064447" w:history="1">
+          <w:hyperlink w:anchor="_Toc219313895" w:history="1">
             <w:r>
               <w:rPr>
                 <w:rStyle w:val="Hyperlink"/>
                 <w:rFonts w:eastAsia="Times New Roman"/>
+                <w:b/>
+                <w:bCs/>
                 <w:noProof/>
                 <w:lang w:eastAsia="nl-BE"/>
               </w:rPr>
@@ -3497,7 +3597,7 @@
                 <w:noProof/>
                 <w:webHidden/>
               </w:rPr>
-              <w:instrText xml:space="preserve"> PAGEREF _Toc219064447 \h </w:instrText>
+              <w:instrText xml:space="preserve"> PAGEREF _Toc219313895 \h </w:instrText>
             </w:r>
             <w:r>
               <w:rPr>
@@ -3540,11 +3640,13 @@
               <w:lang w:eastAsia="nl-BE"/>
             </w:rPr>
           </w:pPr>
-          <w:hyperlink w:anchor="_Toc219064448" w:history="1">
+          <w:hyperlink w:anchor="_Toc219313896" w:history="1">
             <w:r>
               <w:rPr>
                 <w:rStyle w:val="Hyperlink"/>
                 <w:rFonts w:eastAsia="Times New Roman"/>
+                <w:b/>
+                <w:bCs/>
                 <w:noProof/>
                 <w:lang w:eastAsia="nl-BE"/>
               </w:rPr>
@@ -3569,7 +3671,7 @@
                 <w:noProof/>
                 <w:webHidden/>
               </w:rPr>
-              <w:instrText xml:space="preserve"> PAGEREF _Toc219064448 \h </w:instrText>
+              <w:instrText xml:space="preserve"> PAGEREF _Toc219313896 \h </w:instrText>
             </w:r>
             <w:r>
               <w:rPr>
@@ -3612,15 +3714,17 @@
               <w:lang w:eastAsia="nl-BE"/>
             </w:rPr>
           </w:pPr>
-          <w:hyperlink w:anchor="_Toc219064449" w:history="1">
+          <w:hyperlink w:anchor="_Toc219313897" w:history="1">
             <w:r>
               <w:rPr>
                 <w:rStyle w:val="Hyperlink"/>
                 <w:rFonts w:eastAsia="Times New Roman"/>
+                <w:b/>
+                <w:bCs/>
                 <w:noProof/>
                 <w:lang w:eastAsia="nl-BE"/>
               </w:rPr>
-              <w:t>5.6 Synthese</w:t>
+              <w:t>5.6 Samenvatting en synthese van de belangrijkste resultaten</w:t>
             </w:r>
             <w:r>
               <w:rPr>
@@ -3641,7 +3745,7 @@
                 <w:noProof/>
                 <w:webHidden/>
               </w:rPr>
-              <w:instrText xml:space="preserve"> PAGEREF _Toc219064449 \h </w:instrText>
+              <w:instrText xml:space="preserve"> PAGEREF _Toc219313897 \h </w:instrText>
             </w:r>
             <w:r>
               <w:rPr>
@@ -3684,13 +3788,15 @@
               <w:lang w:eastAsia="nl-BE"/>
             </w:rPr>
           </w:pPr>
-          <w:hyperlink w:anchor="_Toc219064450" w:history="1">
+          <w:hyperlink w:anchor="_Toc219313898" w:history="1">
             <w:r>
               <w:rPr>
                 <w:rStyle w:val="Hyperlink"/>
-                <w:noProof/>
-              </w:rPr>
-              <w:t>5.7 Samenvatting van de belangrijkste resultaten</w:t>
+                <w:b/>
+                <w:bCs/>
+                <w:noProof/>
+              </w:rPr>
+              <w:t>5.7 Beantwoording van de onderzoeksvragen</w:t>
             </w:r>
             <w:r>
               <w:rPr>
@@ -3711,7 +3817,7 @@
                 <w:noProof/>
                 <w:webHidden/>
               </w:rPr>
-              <w:instrText xml:space="preserve"> PAGEREF _Toc219064450 \h </w:instrText>
+              <w:instrText xml:space="preserve"> PAGEREF _Toc219313898 \h </w:instrText>
             </w:r>
             <w:r>
               <w:rPr>
@@ -3732,6 +3838,294 @@
                 <w:webHidden/>
               </w:rPr>
               <w:t>48</w:t>
+            </w:r>
+            <w:r>
+              <w:rPr>
+                <w:noProof/>
+                <w:webHidden/>
+              </w:rPr>
+              <w:fldChar w:fldCharType="end"/>
+            </w:r>
+          </w:hyperlink>
+        </w:p>
+        <w:p>
+          <w:pPr>
+            <w:pStyle w:val="Inhopg3"/>
+            <w:tabs>
+              <w:tab w:val="right" w:leader="dot" w:pos="9060"/>
+            </w:tabs>
+            <w:rPr>
+              <w:rFonts w:eastAsiaTheme="minorEastAsia"/>
+              <w:noProof/>
+              <w:lang w:eastAsia="nl-BE"/>
+            </w:rPr>
+          </w:pPr>
+          <w:hyperlink w:anchor="_Toc219313899" w:history="1">
+            <w:r>
+              <w:rPr>
+                <w:rStyle w:val="Hyperlink"/>
+                <w:b/>
+                <w:bCs/>
+                <w:noProof/>
+              </w:rPr>
+              <w:t>5.7.1 Onderzoeksvraag 1: Minimale basisfunctionaliteit</w:t>
+            </w:r>
+            <w:r>
+              <w:rPr>
+                <w:noProof/>
+                <w:webHidden/>
+              </w:rPr>
+              <w:tab/>
+            </w:r>
+            <w:r>
+              <w:rPr>
+                <w:noProof/>
+                <w:webHidden/>
+              </w:rPr>
+              <w:fldChar w:fldCharType="begin"/>
+            </w:r>
+            <w:r>
+              <w:rPr>
+                <w:noProof/>
+                <w:webHidden/>
+              </w:rPr>
+              <w:instrText xml:space="preserve"> PAGEREF _Toc219313899 \h </w:instrText>
+            </w:r>
+            <w:r>
+              <w:rPr>
+                <w:noProof/>
+                <w:webHidden/>
+              </w:rPr>
+            </w:r>
+            <w:r>
+              <w:rPr>
+                <w:noProof/>
+                <w:webHidden/>
+              </w:rPr>
+              <w:fldChar w:fldCharType="separate"/>
+            </w:r>
+            <w:r>
+              <w:rPr>
+                <w:noProof/>
+                <w:webHidden/>
+              </w:rPr>
+              <w:t>48</w:t>
+            </w:r>
+            <w:r>
+              <w:rPr>
+                <w:noProof/>
+                <w:webHidden/>
+              </w:rPr>
+              <w:fldChar w:fldCharType="end"/>
+            </w:r>
+          </w:hyperlink>
+        </w:p>
+        <w:p>
+          <w:pPr>
+            <w:pStyle w:val="Inhopg3"/>
+            <w:tabs>
+              <w:tab w:val="right" w:leader="dot" w:pos="9060"/>
+            </w:tabs>
+            <w:rPr>
+              <w:rFonts w:eastAsiaTheme="minorEastAsia"/>
+              <w:noProof/>
+              <w:lang w:eastAsia="nl-BE"/>
+            </w:rPr>
+          </w:pPr>
+          <w:hyperlink w:anchor="_Toc219313900" w:history="1">
+            <w:r>
+              <w:rPr>
+                <w:rStyle w:val="Hyperlink"/>
+                <w:b/>
+                <w:bCs/>
+                <w:noProof/>
+              </w:rPr>
+              <w:t>5.7.2 Onderzoeksvraag 2: Meest nuttige extra functies</w:t>
+            </w:r>
+            <w:r>
+              <w:rPr>
+                <w:noProof/>
+                <w:webHidden/>
+              </w:rPr>
+              <w:tab/>
+            </w:r>
+            <w:r>
+              <w:rPr>
+                <w:noProof/>
+                <w:webHidden/>
+              </w:rPr>
+              <w:fldChar w:fldCharType="begin"/>
+            </w:r>
+            <w:r>
+              <w:rPr>
+                <w:noProof/>
+                <w:webHidden/>
+              </w:rPr>
+              <w:instrText xml:space="preserve"> PAGEREF _Toc219313900 \h </w:instrText>
+            </w:r>
+            <w:r>
+              <w:rPr>
+                <w:noProof/>
+                <w:webHidden/>
+              </w:rPr>
+            </w:r>
+            <w:r>
+              <w:rPr>
+                <w:noProof/>
+                <w:webHidden/>
+              </w:rPr>
+              <w:fldChar w:fldCharType="separate"/>
+            </w:r>
+            <w:r>
+              <w:rPr>
+                <w:noProof/>
+                <w:webHidden/>
+              </w:rPr>
+              <w:t>49</w:t>
+            </w:r>
+            <w:r>
+              <w:rPr>
+                <w:noProof/>
+                <w:webHidden/>
+              </w:rPr>
+              <w:fldChar w:fldCharType="end"/>
+            </w:r>
+          </w:hyperlink>
+        </w:p>
+        <w:p>
+          <w:pPr>
+            <w:pStyle w:val="Inhopg3"/>
+            <w:tabs>
+              <w:tab w:val="right" w:leader="dot" w:pos="9060"/>
+            </w:tabs>
+            <w:rPr>
+              <w:rFonts w:eastAsiaTheme="minorEastAsia"/>
+              <w:noProof/>
+              <w:lang w:eastAsia="nl-BE"/>
+            </w:rPr>
+          </w:pPr>
+          <w:hyperlink w:anchor="_Toc219313901" w:history="1">
+            <w:r>
+              <w:rPr>
+                <w:rStyle w:val="Hyperlink"/>
+                <w:b/>
+                <w:bCs/>
+                <w:noProof/>
+              </w:rPr>
+              <w:t>5.7.3 Onderzoeksvraag 3: Gebruiksvriendelijkheid en effectiviteit ten opzichte van de basisversie</w:t>
+            </w:r>
+            <w:r>
+              <w:rPr>
+                <w:noProof/>
+                <w:webHidden/>
+              </w:rPr>
+              <w:tab/>
+            </w:r>
+            <w:r>
+              <w:rPr>
+                <w:noProof/>
+                <w:webHidden/>
+              </w:rPr>
+              <w:fldChar w:fldCharType="begin"/>
+            </w:r>
+            <w:r>
+              <w:rPr>
+                <w:noProof/>
+                <w:webHidden/>
+              </w:rPr>
+              <w:instrText xml:space="preserve"> PAGEREF _Toc219313901 \h </w:instrText>
+            </w:r>
+            <w:r>
+              <w:rPr>
+                <w:noProof/>
+                <w:webHidden/>
+              </w:rPr>
+            </w:r>
+            <w:r>
+              <w:rPr>
+                <w:noProof/>
+                <w:webHidden/>
+              </w:rPr>
+              <w:fldChar w:fldCharType="separate"/>
+            </w:r>
+            <w:r>
+              <w:rPr>
+                <w:noProof/>
+                <w:webHidden/>
+              </w:rPr>
+              <w:t>49</w:t>
+            </w:r>
+            <w:r>
+              <w:rPr>
+                <w:noProof/>
+                <w:webHidden/>
+              </w:rPr>
+              <w:fldChar w:fldCharType="end"/>
+            </w:r>
+          </w:hyperlink>
+        </w:p>
+        <w:p>
+          <w:pPr>
+            <w:pStyle w:val="Inhopg1"/>
+            <w:tabs>
+              <w:tab w:val="right" w:leader="dot" w:pos="9060"/>
+            </w:tabs>
+            <w:rPr>
+              <w:rFonts w:eastAsiaTheme="minorEastAsia"/>
+              <w:noProof/>
+              <w:lang w:eastAsia="nl-BE"/>
+            </w:rPr>
+          </w:pPr>
+          <w:hyperlink w:anchor="_Toc219313902" w:history="1">
+            <w:r>
+              <w:rPr>
+                <w:rStyle w:val="Hyperlink"/>
+                <w:b/>
+                <w:bCs/>
+                <w:noProof/>
+              </w:rPr>
+              <w:t>Discussie</w:t>
+            </w:r>
+            <w:r>
+              <w:rPr>
+                <w:noProof/>
+                <w:webHidden/>
+              </w:rPr>
+              <w:tab/>
+            </w:r>
+            <w:r>
+              <w:rPr>
+                <w:noProof/>
+                <w:webHidden/>
+              </w:rPr>
+              <w:fldChar w:fldCharType="begin"/>
+            </w:r>
+            <w:r>
+              <w:rPr>
+                <w:noProof/>
+                <w:webHidden/>
+              </w:rPr>
+              <w:instrText xml:space="preserve"> PAGEREF _Toc219313902 \h </w:instrText>
+            </w:r>
+            <w:r>
+              <w:rPr>
+                <w:noProof/>
+                <w:webHidden/>
+              </w:rPr>
+            </w:r>
+            <w:r>
+              <w:rPr>
+                <w:noProof/>
+                <w:webHidden/>
+              </w:rPr>
+              <w:fldChar w:fldCharType="separate"/>
+            </w:r>
+            <w:r>
+              <w:rPr>
+                <w:noProof/>
+                <w:webHidden/>
+              </w:rPr>
+              <w:t>51</w:t>
             </w:r>
             <w:r>
               <w:rPr>
@@ -3754,13 +4148,17 @@
               <w:lang w:eastAsia="nl-BE"/>
             </w:rPr>
           </w:pPr>
-          <w:hyperlink w:anchor="_Toc219064451" w:history="1">
+          <w:hyperlink w:anchor="_Toc219313903" w:history="1">
             <w:r>
               <w:rPr>
                 <w:rStyle w:val="Hyperlink"/>
-                <w:noProof/>
-              </w:rPr>
-              <w:t>5.8 Beantwoording van de onderzoeksvragen</w:t>
+                <w:rFonts w:eastAsia="Times New Roman"/>
+                <w:b/>
+                <w:bCs/>
+                <w:noProof/>
+                <w:lang w:eastAsia="nl-BE"/>
+              </w:rPr>
+              <w:t>6.1 Relatie met literatuur en theorie</w:t>
             </w:r>
             <w:r>
               <w:rPr>
@@ -3781,7 +4179,7 @@
                 <w:noProof/>
                 <w:webHidden/>
               </w:rPr>
-              <w:instrText xml:space="preserve"> PAGEREF _Toc219064451 \h </w:instrText>
+              <w:instrText xml:space="preserve"> PAGEREF _Toc219313903 \h </w:instrText>
             </w:r>
             <w:r>
               <w:rPr>
@@ -3801,7 +4199,7 @@
                 <w:noProof/>
                 <w:webHidden/>
               </w:rPr>
-              <w:t>48</w:t>
+              <w:t>51</w:t>
             </w:r>
             <w:r>
               <w:rPr>
@@ -3814,7 +4212,7 @@
         </w:p>
         <w:p>
           <w:pPr>
-            <w:pStyle w:val="Inhopg3"/>
+            <w:pStyle w:val="Inhopg2"/>
             <w:tabs>
               <w:tab w:val="right" w:leader="dot" w:pos="9060"/>
             </w:tabs>
@@ -3824,13 +4222,17 @@
               <w:lang w:eastAsia="nl-BE"/>
             </w:rPr>
           </w:pPr>
-          <w:hyperlink w:anchor="_Toc219064452" w:history="1">
+          <w:hyperlink w:anchor="_Toc219313904" w:history="1">
             <w:r>
               <w:rPr>
                 <w:rStyle w:val="Hyperlink"/>
-                <w:noProof/>
-              </w:rPr>
-              <w:t>5.8.1 Onderzoeksvraag 1: Minimale basisfunctionaliteit</w:t>
+                <w:rFonts w:eastAsia="Times New Roman"/>
+                <w:b/>
+                <w:bCs/>
+                <w:noProof/>
+                <w:lang w:eastAsia="nl-BE"/>
+              </w:rPr>
+              <w:t>6.2 Beperkingen van het onderzoek</w:t>
             </w:r>
             <w:r>
               <w:rPr>
@@ -3851,7 +4253,7 @@
                 <w:noProof/>
                 <w:webHidden/>
               </w:rPr>
-              <w:instrText xml:space="preserve"> PAGEREF _Toc219064452 \h </w:instrText>
+              <w:instrText xml:space="preserve"> PAGEREF _Toc219313904 \h </w:instrText>
             </w:r>
             <w:r>
               <w:rPr>
@@ -3871,7 +4273,7 @@
                 <w:noProof/>
                 <w:webHidden/>
               </w:rPr>
-              <w:t>48</w:t>
+              <w:t>52</w:t>
             </w:r>
             <w:r>
               <w:rPr>
@@ -3884,7 +4286,7 @@
         </w:p>
         <w:p>
           <w:pPr>
-            <w:pStyle w:val="Inhopg3"/>
+            <w:pStyle w:val="Inhopg2"/>
             <w:tabs>
               <w:tab w:val="right" w:leader="dot" w:pos="9060"/>
             </w:tabs>
@@ -3894,13 +4296,17 @@
               <w:lang w:eastAsia="nl-BE"/>
             </w:rPr>
           </w:pPr>
-          <w:hyperlink w:anchor="_Toc219064453" w:history="1">
+          <w:hyperlink w:anchor="_Toc219313905" w:history="1">
             <w:r>
               <w:rPr>
                 <w:rStyle w:val="Hyperlink"/>
-                <w:noProof/>
-              </w:rPr>
-              <w:t>5.8.2 Onderzoeksvraag 2: Meest nuttige extra functies</w:t>
+                <w:rFonts w:eastAsia="Times New Roman"/>
+                <w:b/>
+                <w:bCs/>
+                <w:noProof/>
+                <w:lang w:eastAsia="nl-BE"/>
+              </w:rPr>
+              <w:t>6.3 Implicaties voor theorie en praktijk</w:t>
             </w:r>
             <w:r>
               <w:rPr>
@@ -3921,7 +4327,7 @@
                 <w:noProof/>
                 <w:webHidden/>
               </w:rPr>
-              <w:instrText xml:space="preserve"> PAGEREF _Toc219064453 \h </w:instrText>
+              <w:instrText xml:space="preserve"> PAGEREF _Toc219313905 \h </w:instrText>
             </w:r>
             <w:r>
               <w:rPr>
@@ -3941,7 +4347,7 @@
                 <w:noProof/>
                 <w:webHidden/>
               </w:rPr>
-              <w:t>49</w:t>
+              <w:t>53</w:t>
             </w:r>
             <w:r>
               <w:rPr>
@@ -3954,7 +4360,7 @@
         </w:p>
         <w:p>
           <w:pPr>
-            <w:pStyle w:val="Inhopg3"/>
+            <w:pStyle w:val="Inhopg2"/>
             <w:tabs>
               <w:tab w:val="right" w:leader="dot" w:pos="9060"/>
             </w:tabs>
@@ -3964,13 +4370,17 @@
               <w:lang w:eastAsia="nl-BE"/>
             </w:rPr>
           </w:pPr>
-          <w:hyperlink w:anchor="_Toc219064454" w:history="1">
+          <w:hyperlink w:anchor="_Toc219313906" w:history="1">
             <w:r>
               <w:rPr>
                 <w:rStyle w:val="Hyperlink"/>
-                <w:noProof/>
-              </w:rPr>
-              <w:t>5.8.3 Onderzoeksvraag 3: Vergelijking met een basisversie</w:t>
+                <w:rFonts w:eastAsia="Times New Roman"/>
+                <w:b/>
+                <w:bCs/>
+                <w:noProof/>
+                <w:lang w:eastAsia="nl-BE"/>
+              </w:rPr>
+              <w:t>6.4 Aanbevelingen voor toekomstig onderzoek</w:t>
             </w:r>
             <w:r>
               <w:rPr>
@@ -3991,7 +4401,7 @@
                 <w:noProof/>
                 <w:webHidden/>
               </w:rPr>
-              <w:instrText xml:space="preserve"> PAGEREF _Toc219064454 \h </w:instrText>
+              <w:instrText xml:space="preserve"> PAGEREF _Toc219313906 \h </w:instrText>
             </w:r>
             <w:r>
               <w:rPr>
@@ -4011,7 +4421,7 @@
                 <w:noProof/>
                 <w:webHidden/>
               </w:rPr>
-              <w:t>49</w:t>
+              <w:t>54</w:t>
             </w:r>
             <w:r>
               <w:rPr>
@@ -4034,13 +4444,15 @@
               <w:lang w:eastAsia="nl-BE"/>
             </w:rPr>
           </w:pPr>
-          <w:hyperlink w:anchor="_Toc219064455" w:history="1">
+          <w:hyperlink w:anchor="_Toc219313907" w:history="1">
             <w:r>
               <w:rPr>
                 <w:rStyle w:val="Hyperlink"/>
-                <w:noProof/>
-              </w:rPr>
-              <w:t>Discussie</w:t>
+                <w:b/>
+                <w:bCs/>
+                <w:noProof/>
+              </w:rPr>
+              <w:t>Conclusie</w:t>
             </w:r>
             <w:r>
               <w:rPr>
@@ -4061,7 +4473,7 @@
                 <w:noProof/>
                 <w:webHidden/>
               </w:rPr>
-              <w:instrText xml:space="preserve"> PAGEREF _Toc219064455 \h </w:instrText>
+              <w:instrText xml:space="preserve"> PAGEREF _Toc219313907 \h </w:instrText>
             </w:r>
             <w:r>
               <w:rPr>
@@ -4081,295 +4493,7 @@
                 <w:noProof/>
                 <w:webHidden/>
               </w:rPr>
-              <w:t>51</w:t>
-            </w:r>
-            <w:r>
-              <w:rPr>
-                <w:noProof/>
-                <w:webHidden/>
-              </w:rPr>
-              <w:fldChar w:fldCharType="end"/>
-            </w:r>
-          </w:hyperlink>
-        </w:p>
-        <w:p>
-          <w:pPr>
-            <w:pStyle w:val="Inhopg2"/>
-            <w:tabs>
-              <w:tab w:val="right" w:leader="dot" w:pos="9060"/>
-            </w:tabs>
-            <w:rPr>
-              <w:rFonts w:eastAsiaTheme="minorEastAsia"/>
-              <w:noProof/>
-              <w:lang w:eastAsia="nl-BE"/>
-            </w:rPr>
-          </w:pPr>
-          <w:hyperlink w:anchor="_Toc219064456" w:history="1">
-            <w:r>
-              <w:rPr>
-                <w:rStyle w:val="Hyperlink"/>
-                <w:rFonts w:eastAsia="Times New Roman"/>
-                <w:noProof/>
-                <w:lang w:eastAsia="nl-BE"/>
-              </w:rPr>
-              <w:t>6.1 Relatie met literatuur en theorie</w:t>
-            </w:r>
-            <w:r>
-              <w:rPr>
-                <w:noProof/>
-                <w:webHidden/>
-              </w:rPr>
-              <w:tab/>
-            </w:r>
-            <w:r>
-              <w:rPr>
-                <w:noProof/>
-                <w:webHidden/>
-              </w:rPr>
-              <w:fldChar w:fldCharType="begin"/>
-            </w:r>
-            <w:r>
-              <w:rPr>
-                <w:noProof/>
-                <w:webHidden/>
-              </w:rPr>
-              <w:instrText xml:space="preserve"> PAGEREF _Toc219064456 \h </w:instrText>
-            </w:r>
-            <w:r>
-              <w:rPr>
-                <w:noProof/>
-                <w:webHidden/>
-              </w:rPr>
-            </w:r>
-            <w:r>
-              <w:rPr>
-                <w:noProof/>
-                <w:webHidden/>
-              </w:rPr>
-              <w:fldChar w:fldCharType="separate"/>
-            </w:r>
-            <w:r>
-              <w:rPr>
-                <w:noProof/>
-                <w:webHidden/>
-              </w:rPr>
-              <w:t>51</w:t>
-            </w:r>
-            <w:r>
-              <w:rPr>
-                <w:noProof/>
-                <w:webHidden/>
-              </w:rPr>
-              <w:fldChar w:fldCharType="end"/>
-            </w:r>
-          </w:hyperlink>
-        </w:p>
-        <w:p>
-          <w:pPr>
-            <w:pStyle w:val="Inhopg2"/>
-            <w:tabs>
-              <w:tab w:val="right" w:leader="dot" w:pos="9060"/>
-            </w:tabs>
-            <w:rPr>
-              <w:rFonts w:eastAsiaTheme="minorEastAsia"/>
-              <w:noProof/>
-              <w:lang w:eastAsia="nl-BE"/>
-            </w:rPr>
-          </w:pPr>
-          <w:hyperlink w:anchor="_Toc219064457" w:history="1">
-            <w:r>
-              <w:rPr>
-                <w:rStyle w:val="Hyperlink"/>
-                <w:rFonts w:eastAsia="Times New Roman"/>
-                <w:noProof/>
-                <w:lang w:eastAsia="nl-BE"/>
-              </w:rPr>
-              <w:t>6.2 Beperkingen van het onderzoek</w:t>
-            </w:r>
-            <w:r>
-              <w:rPr>
-                <w:noProof/>
-                <w:webHidden/>
-              </w:rPr>
-              <w:tab/>
-            </w:r>
-            <w:r>
-              <w:rPr>
-                <w:noProof/>
-                <w:webHidden/>
-              </w:rPr>
-              <w:fldChar w:fldCharType="begin"/>
-            </w:r>
-            <w:r>
-              <w:rPr>
-                <w:noProof/>
-                <w:webHidden/>
-              </w:rPr>
-              <w:instrText xml:space="preserve"> PAGEREF _Toc219064457 \h </w:instrText>
-            </w:r>
-            <w:r>
-              <w:rPr>
-                <w:noProof/>
-                <w:webHidden/>
-              </w:rPr>
-            </w:r>
-            <w:r>
-              <w:rPr>
-                <w:noProof/>
-                <w:webHidden/>
-              </w:rPr>
-              <w:fldChar w:fldCharType="separate"/>
-            </w:r>
-            <w:r>
-              <w:rPr>
-                <w:noProof/>
-                <w:webHidden/>
-              </w:rPr>
-              <w:t>52</w:t>
-            </w:r>
-            <w:r>
-              <w:rPr>
-                <w:noProof/>
-                <w:webHidden/>
-              </w:rPr>
-              <w:fldChar w:fldCharType="end"/>
-            </w:r>
-          </w:hyperlink>
-        </w:p>
-        <w:p>
-          <w:pPr>
-            <w:pStyle w:val="Inhopg2"/>
-            <w:tabs>
-              <w:tab w:val="right" w:leader="dot" w:pos="9060"/>
-            </w:tabs>
-            <w:rPr>
-              <w:rFonts w:eastAsiaTheme="minorEastAsia"/>
-              <w:noProof/>
-              <w:lang w:eastAsia="nl-BE"/>
-            </w:rPr>
-          </w:pPr>
-          <w:hyperlink w:anchor="_Toc219064458" w:history="1">
-            <w:r>
-              <w:rPr>
-                <w:rStyle w:val="Hyperlink"/>
-                <w:rFonts w:eastAsia="Times New Roman"/>
-                <w:noProof/>
-                <w:lang w:eastAsia="nl-BE"/>
-              </w:rPr>
-              <w:t>6.3 Implicaties voor theorie en praktijk</w:t>
-            </w:r>
-            <w:r>
-              <w:rPr>
-                <w:noProof/>
-                <w:webHidden/>
-              </w:rPr>
-              <w:tab/>
-            </w:r>
-            <w:r>
-              <w:rPr>
-                <w:noProof/>
-                <w:webHidden/>
-              </w:rPr>
-              <w:fldChar w:fldCharType="begin"/>
-            </w:r>
-            <w:r>
-              <w:rPr>
-                <w:noProof/>
-                <w:webHidden/>
-              </w:rPr>
-              <w:instrText xml:space="preserve"> PAGEREF _Toc219064458 \h </w:instrText>
-            </w:r>
-            <w:r>
-              <w:rPr>
-                <w:noProof/>
-                <w:webHidden/>
-              </w:rPr>
-            </w:r>
-            <w:r>
-              <w:rPr>
-                <w:noProof/>
-                <w:webHidden/>
-              </w:rPr>
-              <w:fldChar w:fldCharType="separate"/>
-            </w:r>
-            <w:r>
-              <w:rPr>
-                <w:noProof/>
-                <w:webHidden/>
-              </w:rPr>
-              <w:t>53</w:t>
-            </w:r>
-            <w:r>
-              <w:rPr>
-                <w:noProof/>
-                <w:webHidden/>
-              </w:rPr>
-              <w:fldChar w:fldCharType="end"/>
-            </w:r>
-          </w:hyperlink>
-        </w:p>
-        <w:p>
-          <w:pPr>
-            <w:pStyle w:val="Inhopg2"/>
-            <w:tabs>
-              <w:tab w:val="right" w:leader="dot" w:pos="9060"/>
-            </w:tabs>
-            <w:rPr>
-              <w:rFonts w:eastAsiaTheme="minorEastAsia"/>
-              <w:noProof/>
-              <w:lang w:eastAsia="nl-BE"/>
-            </w:rPr>
-          </w:pPr>
-          <w:hyperlink w:anchor="_Toc219064459" w:history="1">
-            <w:r>
-              <w:rPr>
-                <w:rStyle w:val="Hyperlink"/>
-                <w:rFonts w:eastAsia="Times New Roman"/>
-                <w:noProof/>
-                <w:lang w:eastAsia="nl-BE"/>
-              </w:rPr>
-              <w:t>6.4 Aanbevelingen voor toekomstig onderzoek</w:t>
-            </w:r>
-            <w:r>
-              <w:rPr>
-                <w:noProof/>
-                <w:webHidden/>
-              </w:rPr>
-              <w:tab/>
-            </w:r>
-            <w:r>
-              <w:rPr>
-                <w:noProof/>
-                <w:webHidden/>
-              </w:rPr>
-              <w:fldChar w:fldCharType="begin"/>
-            </w:r>
-            <w:r>
-              <w:rPr>
-                <w:noProof/>
-                <w:webHidden/>
-              </w:rPr>
-              <w:instrText xml:space="preserve"> PAGEREF _Toc219064459 \h </w:instrText>
-            </w:r>
-            <w:r>
-              <w:rPr>
-                <w:noProof/>
-                <w:webHidden/>
-              </w:rPr>
-            </w:r>
-            <w:r>
-              <w:rPr>
-                <w:noProof/>
-                <w:webHidden/>
-              </w:rPr>
-              <w:fldChar w:fldCharType="separate"/>
-            </w:r>
-            <w:r>
-              <w:rPr>
-                <w:noProof/>
-                <w:webHidden/>
-              </w:rPr>
-              <w:t>54</w:t>
+              <w:t>55</w:t>
             </w:r>
             <w:r>
               <w:rPr>
@@ -4392,13 +4516,16 @@
               <w:lang w:eastAsia="nl-BE"/>
             </w:rPr>
           </w:pPr>
-          <w:hyperlink w:anchor="_Toc219064460" w:history="1">
+          <w:hyperlink w:anchor="_Toc219313908" w:history="1">
             <w:r>
               <w:rPr>
                 <w:rStyle w:val="Hyperlink"/>
-                <w:noProof/>
-              </w:rPr>
-              <w:t>Conclusie</w:t>
+                <w:b/>
+                <w:bCs/>
+                <w:noProof/>
+                <w:lang w:val="en-US"/>
+              </w:rPr>
+              <w:t>Referentielijst</w:t>
             </w:r>
             <w:r>
               <w:rPr>
@@ -4419,78 +4546,7 @@
                 <w:noProof/>
                 <w:webHidden/>
               </w:rPr>
-              <w:instrText xml:space="preserve"> PAGEREF _Toc219064460 \h </w:instrText>
-            </w:r>
-            <w:r>
-              <w:rPr>
-                <w:noProof/>
-                <w:webHidden/>
-              </w:rPr>
-            </w:r>
-            <w:r>
-              <w:rPr>
-                <w:noProof/>
-                <w:webHidden/>
-              </w:rPr>
-              <w:fldChar w:fldCharType="separate"/>
-            </w:r>
-            <w:r>
-              <w:rPr>
-                <w:noProof/>
-                <w:webHidden/>
-              </w:rPr>
-              <w:t>55</w:t>
-            </w:r>
-            <w:r>
-              <w:rPr>
-                <w:noProof/>
-                <w:webHidden/>
-              </w:rPr>
-              <w:fldChar w:fldCharType="end"/>
-            </w:r>
-          </w:hyperlink>
-        </w:p>
-        <w:p>
-          <w:pPr>
-            <w:pStyle w:val="Inhopg1"/>
-            <w:tabs>
-              <w:tab w:val="right" w:leader="dot" w:pos="9060"/>
-            </w:tabs>
-            <w:rPr>
-              <w:rFonts w:eastAsiaTheme="minorEastAsia"/>
-              <w:noProof/>
-              <w:lang w:eastAsia="nl-BE"/>
-            </w:rPr>
-          </w:pPr>
-          <w:hyperlink w:anchor="_Toc219064461" w:history="1">
-            <w:r>
-              <w:rPr>
-                <w:rStyle w:val="Hyperlink"/>
-                <w:noProof/>
-                <w:lang w:val="en-US"/>
-              </w:rPr>
-              <w:t>Referentielijst</w:t>
-            </w:r>
-            <w:r>
-              <w:rPr>
-                <w:noProof/>
-                <w:webHidden/>
-              </w:rPr>
-              <w:tab/>
-            </w:r>
-            <w:r>
-              <w:rPr>
-                <w:noProof/>
-                <w:webHidden/>
-              </w:rPr>
-              <w:fldChar w:fldCharType="begin"/>
-            </w:r>
-            <w:r>
-              <w:rPr>
-                <w:noProof/>
-                <w:webHidden/>
-              </w:rPr>
-              <w:instrText xml:space="preserve"> PAGEREF _Toc219064461 \h </w:instrText>
+              <w:instrText xml:space="preserve"> PAGEREF _Toc219313908 \h </w:instrText>
             </w:r>
             <w:r>
               <w:rPr>
@@ -4543,7 +4599,7 @@
           <w:color w:val="000000" w:themeColor="text1"/>
         </w:rPr>
       </w:pPr>
-      <w:bookmarkStart w:id="1" w:name="_Toc219064401"/>
+      <w:bookmarkStart w:id="1" w:name="_Toc219313849"/>
       <w:r>
         <w:rPr>
           <w:rFonts w:asciiTheme="minorHAnsi" w:hAnsiTheme="minorHAnsi"/>
@@ -6273,7 +6329,7 @@
           <w:color w:val="000000" w:themeColor="text1"/>
         </w:rPr>
       </w:pPr>
-      <w:bookmarkStart w:id="2" w:name="_Toc219064402"/>
+      <w:bookmarkStart w:id="2" w:name="_Toc219313850"/>
       <w:r>
         <w:rPr>
           <w:rFonts w:asciiTheme="minorHAnsi" w:hAnsiTheme="minorHAnsi"/>
@@ -6517,7 +6573,7 @@
           <w:lang w:val="en-GB"/>
         </w:rPr>
       </w:pPr>
-      <w:bookmarkStart w:id="3" w:name="_Toc219064403"/>
+      <w:bookmarkStart w:id="3" w:name="_Toc219313851"/>
       <w:r>
         <w:rPr>
           <w:rFonts w:asciiTheme="minorHAnsi" w:hAnsiTheme="minorHAnsi"/>
@@ -6795,7 +6851,7 @@
           <w:color w:val="000000" w:themeColor="text1"/>
         </w:rPr>
       </w:pPr>
-      <w:bookmarkStart w:id="4" w:name="_Toc219064404"/>
+      <w:bookmarkStart w:id="4" w:name="_Toc219313852"/>
       <w:r>
         <w:rPr>
           <w:rFonts w:asciiTheme="minorHAnsi" w:hAnsiTheme="minorHAnsi"/>
@@ -7518,7 +7574,7 @@
           <w:color w:val="000000" w:themeColor="text1"/>
         </w:rPr>
       </w:pPr>
-      <w:bookmarkStart w:id="6" w:name="_Toc219064405"/>
+      <w:bookmarkStart w:id="6" w:name="_Toc219313853"/>
       <w:r>
         <w:rPr>
           <w:rFonts w:asciiTheme="minorHAnsi" w:hAnsiTheme="minorHAnsi"/>
@@ -7573,7 +7629,7 @@
           <w:color w:val="000000" w:themeColor="text1"/>
         </w:rPr>
       </w:pPr>
-      <w:bookmarkStart w:id="7" w:name="_Toc219064406"/>
+      <w:bookmarkStart w:id="7" w:name="_Toc219313854"/>
       <w:r>
         <w:rPr>
           <w:rFonts w:asciiTheme="minorHAnsi" w:hAnsiTheme="minorHAnsi"/>
@@ -7636,7 +7692,7 @@
           <w:color w:val="000000" w:themeColor="text1"/>
         </w:rPr>
       </w:pPr>
-      <w:bookmarkStart w:id="8" w:name="_Toc219064407"/>
+      <w:bookmarkStart w:id="8" w:name="_Toc219313855"/>
       <w:r>
         <w:rPr>
           <w:b/>
@@ -7899,19 +7955,7 @@
         <w:rPr>
           <w:color w:val="000000" w:themeColor="text1"/>
         </w:rPr>
-        <w:t xml:space="preserve"> [Assumption Under Review]</w:t>
-      </w:r>
-      <w:r>
-        <w:rPr>
-          <w:color w:val="000000" w:themeColor="text1"/>
-        </w:rPr>
-        <w:t>"</w:t>
-      </w:r>
-      <w:r>
-        <w:rPr>
-          <w:color w:val="000000" w:themeColor="text1"/>
-        </w:rPr>
-        <w:t>;</w:t>
+        <w:t>”</w:t>
       </w:r>
     </w:p>
     <w:p>
@@ -7932,21 +7976,7 @@
           <w:color w:val="000000" w:themeColor="text1"/>
           <w:lang w:val="en-GB"/>
         </w:rPr>
-        <w:t xml:space="preserve">Unfortunately: "Werknemers weigeren wachtwoordmanagers" </w:t>
-      </w:r>
-      <w:r>
-        <w:rPr>
-          <w:color w:val="000000" w:themeColor="text1"/>
-          <w:lang w:val="en-GB"/>
-        </w:rPr>
-        <w:t xml:space="preserve">(danger rating: 6) </w:t>
-      </w:r>
-      <w:r>
-        <w:rPr>
-          <w:color w:val="000000" w:themeColor="text1"/>
-          <w:lang w:val="en-GB"/>
-        </w:rPr>
-        <w:t>[Low Importance]</w:t>
+        <w:t>Unfortunately: "Werknemers weigeren wachtwoordmanagers</w:t>
       </w:r>
       <w:r>
         <w:rPr>
@@ -7974,7 +8004,7 @@
           <w:color w:val="000000" w:themeColor="text1"/>
           <w:lang w:val="en-GB"/>
         </w:rPr>
-        <w:t>Fortunately: "Training verlaagt drempel" [Verified Assumption]</w:t>
+        <w:t>Fortunately: "Training verlaagt drempel"</w:t>
       </w:r>
       <w:r>
         <w:rPr>
@@ -7986,14 +8016,23 @@
     </w:p>
     <w:p>
       <w:pPr>
-        <w:spacing w:after="24"/>
-        <w:rPr>
-          <w:b/>
-          <w:bCs/>
-          <w:color w:val="000000" w:themeColor="text1"/>
-          <w:lang w:val="en-US"/>
-        </w:rPr>
-      </w:pPr>
+        <w:rPr>
+          <w:rFonts w:eastAsiaTheme="majorEastAsia" w:cstheme="majorBidi"/>
+          <w:b/>
+          <w:bCs/>
+          <w:color w:val="000000" w:themeColor="text1"/>
+          <w:sz w:val="28"/>
+          <w:szCs w:val="28"/>
+        </w:rPr>
+      </w:pPr>
+      <w:r>
+        <w:rPr>
+          <w:b/>
+          <w:bCs/>
+          <w:color w:val="000000" w:themeColor="text1"/>
+        </w:rPr>
+        <w:br w:type="page"/>
+      </w:r>
     </w:p>
     <w:p>
       <w:pPr>
@@ -8004,7 +8043,7 @@
           <w:color w:val="000000" w:themeColor="text1"/>
         </w:rPr>
       </w:pPr>
-      <w:bookmarkStart w:id="9" w:name="_Toc219064408"/>
+      <w:bookmarkStart w:id="9" w:name="_Toc219313856"/>
       <w:r>
         <w:rPr>
           <w:b/>
@@ -8084,7 +8123,7 @@
         <w:rPr>
           <w:color w:val="000000" w:themeColor="text1"/>
         </w:rPr>
-        <w:t xml:space="preserve"> ondersteuning voor statussen of danger ratings.[</w:t>
+        <w:t xml:space="preserve"> ondersteuning voor statussen of danger ratings[</w:t>
       </w:r>
       <w:r>
         <w:rPr>
@@ -8109,6 +8148,12 @@
           <w:color w:val="000000" w:themeColor="text1"/>
         </w:rPr>
         <w:t>]</w:t>
+      </w:r>
+      <w:r>
+        <w:rPr>
+          <w:color w:val="000000" w:themeColor="text1"/>
+        </w:rPr>
+        <w:t>.</w:t>
       </w:r>
     </w:p>
     <w:p>
@@ -8302,20 +8347,7 @@
         <w:rPr>
           <w:color w:val="000000" w:themeColor="text1"/>
         </w:rPr>
-        <w:t>De Fortunately–Unfortunately-methode biedt verschillende voordelen en kent enkele beperkingen. De narratieve flow verlaagt de instapdrempel aanzienlijk voor niet-security-experts, terwijl de iteratieve ketens bestaande trade-offs tussen risico's en mitigerende maatregelen expliciet zichtbaar maken. Tegelijk is de inherent lineaire structuur minder geschikt voor het modelleren van niet-hiërarchische of parallelle risico's die gelijktijdig optreden binnen een systeem.</w:t>
-      </w:r>
-      <w:r>
-        <w:rPr>
-          <w:rFonts w:ascii="Arial" w:hAnsi="Arial" w:cs="Arial"/>
-          <w:color w:val="000000" w:themeColor="text1"/>
-        </w:rPr>
-        <w:t>​</w:t>
-      </w:r>
-      <w:r>
-        <w:rPr>
-          <w:color w:val="000000" w:themeColor="text1"/>
-        </w:rPr>
-        <w:t xml:space="preserve"> </w:t>
+        <w:t>De Fortunately–Unfortunately-methode biedt verschillende voordelen en kent enkele beperkingen. De narratieve flow verlaagt de instapdrempel aanzienlijk voor niet-security-experts, terwijl de iteratieve ketens bestaande trade-offs tussen risico's en mitigerende maatregelen expliciet zichtbaar maken. Tegelijk is de inherent lineaire structuur minder geschikt voor het modelleren van niet-hiërarchische of parallelle risico's die gelijktijdig optreden binnen een systeem</w:t>
       </w:r>
       <w:r>
         <w:rPr>
@@ -8334,6 +8366,12 @@
           <w:color w:val="000000" w:themeColor="text1"/>
         </w:rPr>
         <w:t>]</w:t>
+      </w:r>
+      <w:r>
+        <w:rPr>
+          <w:color w:val="000000" w:themeColor="text1"/>
+        </w:rPr>
+        <w:t>.</w:t>
       </w:r>
     </w:p>
     <w:p>
@@ -8370,7 +8408,7 @@
           <w:color w:val="000000" w:themeColor="text1"/>
         </w:rPr>
       </w:pPr>
-      <w:bookmarkStart w:id="10" w:name="_Toc219064409"/>
+      <w:bookmarkStart w:id="10" w:name="_Toc219313857"/>
       <w:r>
         <w:rPr>
           <w:rFonts w:asciiTheme="minorHAnsi" w:hAnsiTheme="minorHAnsi"/>
@@ -8564,7 +8602,7 @@
         <w:rPr>
           <w:color w:val="000000" w:themeColor="text1"/>
         </w:rPr>
-        <w:t>afhankelijk is.[</w:t>
+        <w:t>afhankelijk is[</w:t>
       </w:r>
       <w:r>
         <w:rPr>
@@ -8578,6 +8616,12 @@
         </w:rPr>
         <w:t>]</w:t>
       </w:r>
+      <w:r>
+        <w:rPr>
+          <w:color w:val="000000" w:themeColor="text1"/>
+        </w:rPr>
+        <w:t>.</w:t>
+      </w:r>
     </w:p>
     <w:p>
       <w:pPr>
@@ -8735,7 +8779,7 @@
         <w:rPr>
           <w:color w:val="000000" w:themeColor="text1"/>
         </w:rPr>
-        <w:t>ontwerpargumentatie zoals in deze thesis.[</w:t>
+        <w:t>ontwerpargumentatie zoals in deze thesis[</w:t>
       </w:r>
       <w:r>
         <w:rPr>
@@ -8749,6 +8793,12 @@
         </w:rPr>
         <w:t>]</w:t>
       </w:r>
+      <w:r>
+        <w:rPr>
+          <w:color w:val="000000" w:themeColor="text1"/>
+        </w:rPr>
+        <w:t>.</w:t>
+      </w:r>
     </w:p>
     <w:p>
       <w:pPr>
@@ -8964,7 +9014,7 @@
         <w:rPr>
           <w:color w:val="000000" w:themeColor="text1"/>
         </w:rPr>
-        <w:t>mappingtools om hun beperkte automatische layout, instabiele hertekeningen en gebrek aan controle over de volgorde van kinderen, wat direct raakt aan de leesbaarheid van redeneringen.[</w:t>
+        <w:t>mappingtools om hun beperkte automatische layout, instabiele hertekeningen en gebrek aan controle over de volgorde van kinderen, wat direct raakt aan de leesbaarheid van redeneringen[</w:t>
       </w:r>
       <w:r>
         <w:rPr>
@@ -8978,6 +9028,12 @@
         </w:rPr>
         <w:t>]</w:t>
       </w:r>
+      <w:r>
+        <w:rPr>
+          <w:color w:val="000000" w:themeColor="text1"/>
+        </w:rPr>
+        <w:t>.</w:t>
+      </w:r>
     </w:p>
     <w:p>
       <w:pPr>
@@ -9102,7 +9158,7 @@
         <w:rPr>
           <w:color w:val="000000" w:themeColor="text1"/>
         </w:rPr>
-        <w:t>purpose argumentanalyse.[</w:t>
+        <w:t>purpose argumentanalyse[</w:t>
       </w:r>
       <w:r>
         <w:rPr>
@@ -9116,6 +9172,12 @@
         </w:rPr>
         <w:t>]</w:t>
       </w:r>
+      <w:r>
+        <w:rPr>
+          <w:color w:val="000000" w:themeColor="text1"/>
+        </w:rPr>
+        <w:t>.</w:t>
+      </w:r>
     </w:p>
     <w:p>
       <w:pPr>
@@ -9338,7 +9400,7 @@
         <w:rPr>
           <w:color w:val="000000" w:themeColor="text1"/>
         </w:rPr>
-        <w:t>experts.[</w:t>
+        <w:t>experts[</w:t>
       </w:r>
       <w:r>
         <w:rPr>
@@ -9352,6 +9414,12 @@
         </w:rPr>
         <w:t>]</w:t>
       </w:r>
+      <w:r>
+        <w:rPr>
+          <w:color w:val="000000" w:themeColor="text1"/>
+        </w:rPr>
+        <w:t>.</w:t>
+      </w:r>
     </w:p>
     <w:p>
       <w:pPr>
@@ -9489,7 +9557,7 @@
         <w:rPr>
           <w:color w:val="000000" w:themeColor="text1"/>
         </w:rPr>
-        <w:t>experts.[</w:t>
+        <w:t>experts[</w:t>
       </w:r>
       <w:r>
         <w:rPr>
@@ -9514,6 +9582,12 @@
           <w:color w:val="000000" w:themeColor="text1"/>
         </w:rPr>
         <w:t>]</w:t>
+      </w:r>
+      <w:r>
+        <w:rPr>
+          <w:color w:val="000000" w:themeColor="text1"/>
+        </w:rPr>
+        <w:t>.</w:t>
       </w:r>
       <w:r>
         <w:rPr>
@@ -9551,7 +9625,7 @@
           <w:color w:val="000000" w:themeColor="text1"/>
         </w:rPr>
       </w:pPr>
-      <w:bookmarkStart w:id="11" w:name="_Toc219064410"/>
+      <w:bookmarkStart w:id="11" w:name="_Toc219313858"/>
       <w:r>
         <w:rPr>
           <w:rFonts w:asciiTheme="minorHAnsi" w:hAnsiTheme="minorHAnsi"/>
@@ -9727,7 +9801,7 @@
           <w:color w:val="000000" w:themeColor="text1"/>
         </w:rPr>
       </w:pPr>
-      <w:bookmarkStart w:id="12" w:name="_Toc219064411"/>
+      <w:bookmarkStart w:id="12" w:name="_Toc219313859"/>
       <w:r>
         <w:rPr>
           <w:rFonts w:asciiTheme="minorHAnsi" w:hAnsiTheme="minorHAnsi"/>
@@ -9821,7 +9895,7 @@
           <w:color w:val="000000" w:themeColor="text1"/>
         </w:rPr>
       </w:pPr>
-      <w:bookmarkStart w:id="13" w:name="_Toc219064412"/>
+      <w:bookmarkStart w:id="13" w:name="_Toc219313860"/>
       <w:r>
         <w:rPr>
           <w:rFonts w:asciiTheme="minorHAnsi" w:hAnsiTheme="minorHAnsi"/>
@@ -10052,7 +10126,7 @@
           <w:color w:val="000000" w:themeColor="text1"/>
         </w:rPr>
       </w:pPr>
-      <w:bookmarkStart w:id="14" w:name="_Toc219064413"/>
+      <w:bookmarkStart w:id="14" w:name="_Toc219313861"/>
       <w:r>
         <w:rPr>
           <w:rFonts w:asciiTheme="minorHAnsi" w:hAnsiTheme="minorHAnsi"/>
@@ -10080,12 +10154,14 @@
           <w:color w:val="000000" w:themeColor="text1"/>
         </w:rPr>
       </w:pPr>
-      <w:r>
-        <w:rPr>
-          <w:color w:val="000000" w:themeColor="text1"/>
-        </w:rPr>
-        <w:br/>
-      </w:r>
+    </w:p>
+    <w:p>
+      <w:pPr>
+        <w:spacing w:afterLines="24" w:after="57" w:line="288" w:lineRule="auto"/>
+        <w:rPr>
+          <w:color w:val="000000" w:themeColor="text1"/>
+        </w:rPr>
+      </w:pPr>
       <w:r>
         <w:rPr>
           <w:color w:val="000000" w:themeColor="text1"/>
@@ -10418,7 +10494,7 @@
           <w:lang w:val="en-GB"/>
         </w:rPr>
       </w:pPr>
-      <w:bookmarkStart w:id="17" w:name="_Toc219064414"/>
+      <w:bookmarkStart w:id="17" w:name="_Toc219313862"/>
       <w:r>
         <w:rPr>
           <w:rFonts w:asciiTheme="minorHAnsi" w:hAnsiTheme="minorHAnsi"/>
@@ -10446,14 +10522,17 @@
         <w:spacing w:afterLines="24" w:after="57" w:line="288" w:lineRule="auto"/>
         <w:rPr>
           <w:color w:val="000000" w:themeColor="text1"/>
-        </w:rPr>
-      </w:pPr>
-      <w:r>
-        <w:rPr>
-          <w:color w:val="000000" w:themeColor="text1"/>
-        </w:rPr>
-        <w:br/>
-      </w:r>
+          <w:lang w:val="en-US"/>
+        </w:rPr>
+      </w:pPr>
+    </w:p>
+    <w:p>
+      <w:pPr>
+        <w:spacing w:afterLines="24" w:after="57" w:line="288" w:lineRule="auto"/>
+        <w:rPr>
+          <w:color w:val="000000" w:themeColor="text1"/>
+        </w:rPr>
+      </w:pPr>
       <w:r>
         <w:rPr>
           <w:color w:val="000000" w:themeColor="text1"/>
@@ -10524,7 +10603,7 @@
         </w:rPr>
         <w:lastRenderedPageBreak/>
         <w:drawing>
-          <wp:inline distT="0" distB="0" distL="0" distR="0" wp14:anchorId="128D5ED9" wp14:editId="739EEDAC">
+          <wp:inline distT="0" distB="0" distL="0" distR="0" wp14:anchorId="128D5ED9" wp14:editId="7621686A">
             <wp:extent cx="5759450" cy="2856865"/>
             <wp:effectExtent l="0" t="0" r="0" b="635"/>
             <wp:docPr id="234035025" name="Afbeelding 1" descr="Afbeelding met diagram, schermopname, lijn, ontwerp&#10;&#10;Door AI gegenereerde inhoud is mogelijk onjuist."/>
@@ -10633,7 +10712,7 @@
           <w:color w:val="000000" w:themeColor="text1"/>
         </w:rPr>
         <w:drawing>
-          <wp:inline distT="0" distB="0" distL="0" distR="0" wp14:anchorId="7D672503" wp14:editId="32E76F20">
+          <wp:inline distT="0" distB="0" distL="0" distR="0" wp14:anchorId="7D672503" wp14:editId="2ACF84AB">
             <wp:extent cx="5759450" cy="1689735"/>
             <wp:effectExtent l="0" t="0" r="0" b="5715"/>
             <wp:docPr id="373297823" name="Afbeelding 2" descr="Afbeelding met diagram, lijn, origami, ontwerp&#10;&#10;Door AI gegenereerde inhoud is mogelijk onjuist."/>
@@ -10755,7 +10834,7 @@
           <w:color w:val="000000" w:themeColor="text1"/>
         </w:rPr>
       </w:pPr>
-      <w:bookmarkStart w:id="20" w:name="_Toc219064415"/>
+      <w:bookmarkStart w:id="20" w:name="_Toc219313863"/>
       <w:r>
         <w:rPr>
           <w:rFonts w:asciiTheme="minorHAnsi" w:hAnsiTheme="minorHAnsi"/>
@@ -10783,11 +10862,18 @@
           <w:color w:val="000000" w:themeColor="text1"/>
         </w:rPr>
       </w:pPr>
-      <w:r>
-        <w:rPr>
-          <w:color w:val="000000" w:themeColor="text1"/>
-        </w:rPr>
-        <w:br/>
+    </w:p>
+    <w:p>
+      <w:pPr>
+        <w:spacing w:afterLines="24" w:after="57" w:line="288" w:lineRule="auto"/>
+        <w:rPr>
+          <w:color w:val="000000" w:themeColor="text1"/>
+        </w:rPr>
+      </w:pPr>
+      <w:r>
+        <w:rPr>
+          <w:color w:val="000000" w:themeColor="text1"/>
+        </w:rPr>
         <w:t>De definitieve visualisatie maakt gebruik van een fileview</w:t>
       </w:r>
       <w:r>
@@ -10972,7 +11058,7 @@
           <w:color w:val="000000" w:themeColor="text1"/>
         </w:rPr>
       </w:pPr>
-      <w:bookmarkStart w:id="22" w:name="_Toc219064416"/>
+      <w:bookmarkStart w:id="22" w:name="_Toc219313864"/>
       <w:r>
         <w:rPr>
           <w:rFonts w:asciiTheme="minorHAnsi" w:hAnsiTheme="minorHAnsi"/>
@@ -11120,30 +11206,6 @@
     </w:p>
     <w:p>
       <w:pPr>
-        <w:spacing w:afterLines="24" w:after="57" w:line="288" w:lineRule="auto"/>
-        <w:rPr>
-          <w:b/>
-          <w:bCs/>
-          <w:color w:val="000000" w:themeColor="text1"/>
-          <w:sz w:val="28"/>
-          <w:szCs w:val="28"/>
-        </w:rPr>
-      </w:pPr>
-    </w:p>
-    <w:p>
-      <w:pPr>
-        <w:spacing w:afterLines="24" w:after="57" w:line="288" w:lineRule="auto"/>
-        <w:rPr>
-          <w:b/>
-          <w:bCs/>
-          <w:color w:val="000000" w:themeColor="text1"/>
-          <w:sz w:val="28"/>
-          <w:szCs w:val="28"/>
-        </w:rPr>
-      </w:pPr>
-    </w:p>
-    <w:p>
-      <w:pPr>
         <w:pStyle w:val="Kop2"/>
         <w:rPr>
           <w:rFonts w:asciiTheme="minorHAnsi" w:hAnsiTheme="minorHAnsi"/>
@@ -11152,7 +11214,7 @@
           <w:color w:val="000000" w:themeColor="text1"/>
         </w:rPr>
       </w:pPr>
-      <w:bookmarkStart w:id="23" w:name="_Toc219064417"/>
+      <w:bookmarkStart w:id="23" w:name="_Toc219313865"/>
       <w:r>
         <w:rPr>
           <w:rFonts w:asciiTheme="minorHAnsi" w:hAnsiTheme="minorHAnsi"/>
@@ -11160,6 +11222,7 @@
           <w:bCs/>
           <w:color w:val="000000" w:themeColor="text1"/>
         </w:rPr>
+        <w:lastRenderedPageBreak/>
         <w:t xml:space="preserve">3.7 </w:t>
       </w:r>
       <w:r>
@@ -11625,7 +11688,7 @@
           <w:color w:val="000000" w:themeColor="text1"/>
         </w:rPr>
       </w:pPr>
-      <w:bookmarkStart w:id="26" w:name="_Toc219064418"/>
+      <w:bookmarkStart w:id="26" w:name="_Toc219313866"/>
       <w:r>
         <w:rPr>
           <w:rFonts w:asciiTheme="minorHAnsi" w:hAnsiTheme="minorHAnsi"/>
@@ -11633,6 +11696,7 @@
           <w:bCs/>
           <w:color w:val="000000" w:themeColor="text1"/>
         </w:rPr>
+        <w:lastRenderedPageBreak/>
         <w:t>3.</w:t>
       </w:r>
       <w:r>
@@ -12953,18 +13017,6 @@
     </w:p>
     <w:p>
       <w:pPr>
-        <w:spacing w:afterLines="24" w:after="57" w:line="288" w:lineRule="auto"/>
-        <w:rPr>
-          <w:b/>
-          <w:bCs/>
-          <w:color w:val="000000" w:themeColor="text1"/>
-          <w:sz w:val="28"/>
-          <w:szCs w:val="28"/>
-        </w:rPr>
-      </w:pPr>
-    </w:p>
-    <w:p>
-      <w:pPr>
         <w:pStyle w:val="Kop2"/>
         <w:rPr>
           <w:rFonts w:asciiTheme="minorHAnsi" w:hAnsiTheme="minorHAnsi"/>
@@ -12973,7 +13025,7 @@
           <w:color w:val="auto"/>
         </w:rPr>
       </w:pPr>
-      <w:bookmarkStart w:id="32" w:name="_Toc219064419"/>
+      <w:bookmarkStart w:id="32" w:name="_Toc219313867"/>
       <w:r>
         <w:rPr>
           <w:rFonts w:asciiTheme="minorHAnsi" w:hAnsiTheme="minorHAnsi"/>
@@ -12981,6 +13033,7 @@
           <w:bCs/>
           <w:color w:val="auto"/>
         </w:rPr>
+        <w:lastRenderedPageBreak/>
         <w:t>3.</w:t>
       </w:r>
       <w:r>
@@ -13921,7 +13974,7 @@
           <w:color w:val="000000" w:themeColor="text1"/>
         </w:rPr>
       </w:pPr>
-      <w:bookmarkStart w:id="38" w:name="_Toc219064420"/>
+      <w:bookmarkStart w:id="38" w:name="_Toc219313868"/>
       <w:r>
         <w:rPr>
           <w:rFonts w:asciiTheme="minorHAnsi" w:hAnsiTheme="minorHAnsi"/>
@@ -14469,18 +14522,6 @@
     </w:p>
     <w:p>
       <w:pPr>
-        <w:spacing w:afterLines="24" w:after="57" w:line="288" w:lineRule="auto"/>
-        <w:rPr>
-          <w:b/>
-          <w:bCs/>
-          <w:color w:val="000000" w:themeColor="text1"/>
-          <w:sz w:val="28"/>
-          <w:szCs w:val="28"/>
-        </w:rPr>
-      </w:pPr>
-    </w:p>
-    <w:p>
-      <w:pPr>
         <w:pStyle w:val="Kop2"/>
         <w:rPr>
           <w:rFonts w:asciiTheme="minorHAnsi" w:hAnsiTheme="minorHAnsi"/>
@@ -14489,7 +14530,7 @@
           <w:color w:val="000000" w:themeColor="text1"/>
         </w:rPr>
       </w:pPr>
-      <w:bookmarkStart w:id="41" w:name="_Toc219064421"/>
+      <w:bookmarkStart w:id="41" w:name="_Toc219313869"/>
       <w:r>
         <w:rPr>
           <w:rFonts w:asciiTheme="minorHAnsi" w:hAnsiTheme="minorHAnsi"/>
@@ -14497,6 +14538,7 @@
           <w:bCs/>
           <w:color w:val="000000" w:themeColor="text1"/>
         </w:rPr>
+        <w:lastRenderedPageBreak/>
         <w:t>3.</w:t>
       </w:r>
       <w:r>
@@ -15206,7 +15248,7 @@
           <w:color w:val="000000" w:themeColor="text1"/>
         </w:rPr>
       </w:pPr>
-      <w:bookmarkStart w:id="46" w:name="_Toc219064422"/>
+      <w:bookmarkStart w:id="46" w:name="_Toc219313870"/>
       <w:r>
         <w:rPr>
           <w:rFonts w:asciiTheme="minorHAnsi" w:hAnsiTheme="minorHAnsi"/>
@@ -15327,7 +15369,7 @@
           <w:color w:val="000000" w:themeColor="text1"/>
         </w:rPr>
       </w:pPr>
-      <w:bookmarkStart w:id="47" w:name="_Toc219064423"/>
+      <w:bookmarkStart w:id="47" w:name="_Toc219313871"/>
       <w:r>
         <w:rPr>
           <w:b/>
@@ -15369,11 +15411,18 @@
           <w:color w:val="000000" w:themeColor="text1"/>
         </w:rPr>
       </w:pPr>
-      <w:r>
-        <w:rPr>
-          <w:color w:val="000000" w:themeColor="text1"/>
-        </w:rPr>
-        <w:br/>
+    </w:p>
+    <w:p>
+      <w:pPr>
+        <w:spacing w:afterLines="24" w:after="57" w:line="288" w:lineRule="auto"/>
+        <w:rPr>
+          <w:color w:val="000000" w:themeColor="text1"/>
+        </w:rPr>
+      </w:pPr>
+      <w:r>
+        <w:rPr>
+          <w:color w:val="000000" w:themeColor="text1"/>
+        </w:rPr>
         <w:t xml:space="preserve">De tool geeft gebruikers voortdurend feedback over de huidige toestand van het systeem. De boomweergave in TreeVisualizer wordt onmiddellijk geüpdatet na toevoeging, bewerking of verwijdering van </w:t>
       </w:r>
       <w:r>
@@ -15477,7 +15526,7 @@
           <w:color w:val="000000" w:themeColor="text1"/>
         </w:rPr>
       </w:pPr>
-      <w:bookmarkStart w:id="48" w:name="_Toc219064424"/>
+      <w:bookmarkStart w:id="48" w:name="_Toc219313872"/>
       <w:r>
         <w:rPr>
           <w:b/>
@@ -15519,11 +15568,18 @@
           <w:color w:val="000000" w:themeColor="text1"/>
         </w:rPr>
       </w:pPr>
-      <w:r>
-        <w:rPr>
-          <w:color w:val="000000" w:themeColor="text1"/>
-        </w:rPr>
-        <w:br/>
+    </w:p>
+    <w:p>
+      <w:pPr>
+        <w:spacing w:afterLines="24" w:after="57" w:line="288" w:lineRule="auto"/>
+        <w:rPr>
+          <w:color w:val="000000" w:themeColor="text1"/>
+        </w:rPr>
+      </w:pPr>
+      <w:r>
+        <w:rPr>
+          <w:color w:val="000000" w:themeColor="text1"/>
+        </w:rPr>
         <w:t>De webtool gebruikt terminologie en structuren die aansluiten bij gangbare praktijken in security</w:t>
       </w:r>
       <w:r>
@@ -15601,7 +15657,7 @@
           <w:color w:val="000000" w:themeColor="text1"/>
         </w:rPr>
       </w:pPr>
-      <w:bookmarkStart w:id="49" w:name="_Toc219064425"/>
+      <w:bookmarkStart w:id="49" w:name="_Toc219313873"/>
       <w:r>
         <w:rPr>
           <w:b/>
@@ -15643,11 +15699,18 @@
           <w:color w:val="000000" w:themeColor="text1"/>
         </w:rPr>
       </w:pPr>
-      <w:r>
-        <w:rPr>
-          <w:color w:val="000000" w:themeColor="text1"/>
-        </w:rPr>
-        <w:br/>
+    </w:p>
+    <w:p>
+      <w:pPr>
+        <w:spacing w:afterLines="24" w:after="57" w:line="288" w:lineRule="auto"/>
+        <w:rPr>
+          <w:color w:val="000000" w:themeColor="text1"/>
+        </w:rPr>
+      </w:pPr>
+      <w:r>
+        <w:rPr>
+          <w:color w:val="000000" w:themeColor="text1"/>
+        </w:rPr>
         <w:t>De implementatie voorziet diverse mechanismen die de gebruiker controle geven over het modelleerproces. Via “Reset Tree” kan op elk moment naar een lege beginsituatie worden teruggekeerd</w:t>
       </w:r>
       <w:r>
@@ -15728,7 +15791,7 @@
           <w:color w:val="000000" w:themeColor="text1"/>
         </w:rPr>
       </w:pPr>
-      <w:bookmarkStart w:id="50" w:name="_Toc219064426"/>
+      <w:bookmarkStart w:id="50" w:name="_Toc219313874"/>
       <w:r>
         <w:rPr>
           <w:b/>
@@ -15841,6 +15904,14 @@
     </w:p>
     <w:p>
       <w:pPr>
+        <w:spacing w:afterLines="24" w:after="57" w:line="288" w:lineRule="auto"/>
+        <w:rPr>
+          <w:color w:val="000000" w:themeColor="text1"/>
+        </w:rPr>
+      </w:pPr>
+    </w:p>
+    <w:p>
+      <w:pPr>
         <w:pStyle w:val="Kop3"/>
         <w:rPr>
           <w:b/>
@@ -15848,7 +15919,7 @@
           <w:color w:val="000000" w:themeColor="text1"/>
         </w:rPr>
       </w:pPr>
-      <w:bookmarkStart w:id="51" w:name="_Toc219064427"/>
+      <w:bookmarkStart w:id="51" w:name="_Toc219313875"/>
       <w:r>
         <w:rPr>
           <w:b/>
@@ -15968,7 +16039,7 @@
           <w:color w:val="000000" w:themeColor="text1"/>
         </w:rPr>
       </w:pPr>
-      <w:bookmarkStart w:id="52" w:name="_Toc219064428"/>
+      <w:bookmarkStart w:id="52" w:name="_Toc219313876"/>
       <w:r>
         <w:rPr>
           <w:b/>
@@ -16108,7 +16179,7 @@
           <w:color w:val="000000" w:themeColor="text1"/>
         </w:rPr>
       </w:pPr>
-      <w:bookmarkStart w:id="53" w:name="_Toc219064429"/>
+      <w:bookmarkStart w:id="53" w:name="_Toc219313877"/>
       <w:r>
         <w:rPr>
           <w:b/>
@@ -16214,7 +16285,7 @@
           <w:color w:val="000000" w:themeColor="text1"/>
         </w:rPr>
       </w:pPr>
-      <w:bookmarkStart w:id="54" w:name="_Toc219064430"/>
+      <w:bookmarkStart w:id="54" w:name="_Toc219313878"/>
       <w:r>
         <w:rPr>
           <w:b/>
@@ -16331,7 +16402,7 @@
           <w:color w:val="000000" w:themeColor="text1"/>
         </w:rPr>
       </w:pPr>
-      <w:bookmarkStart w:id="55" w:name="_Toc219064431"/>
+      <w:bookmarkStart w:id="55" w:name="_Toc219313879"/>
       <w:r>
         <w:rPr>
           <w:b/>
@@ -16484,7 +16555,7 @@
           <w:color w:val="000000" w:themeColor="text1"/>
         </w:rPr>
       </w:pPr>
-      <w:bookmarkStart w:id="56" w:name="_Toc219064432"/>
+      <w:bookmarkStart w:id="56" w:name="_Toc219313880"/>
       <w:r>
         <w:rPr>
           <w:b/>
@@ -16604,7 +16675,7 @@
           <w:color w:val="000000" w:themeColor="text1"/>
         </w:rPr>
       </w:pPr>
-      <w:bookmarkStart w:id="57" w:name="_Toc219064433"/>
+      <w:bookmarkStart w:id="57" w:name="_Toc219313881"/>
       <w:r>
         <w:rPr>
           <w:rFonts w:asciiTheme="minorHAnsi" w:hAnsiTheme="minorHAnsi"/>
@@ -16895,7 +16966,7 @@
           <w:color w:val="000000" w:themeColor="text1"/>
         </w:rPr>
       </w:pPr>
-      <w:bookmarkStart w:id="58" w:name="_Toc219064434"/>
+      <w:bookmarkStart w:id="58" w:name="_Toc219313882"/>
       <w:r>
         <w:rPr>
           <w:rFonts w:asciiTheme="minorHAnsi" w:hAnsiTheme="minorHAnsi"/>
@@ -16941,7 +17012,7 @@
           <w:color w:val="000000" w:themeColor="text1"/>
         </w:rPr>
       </w:pPr>
-      <w:bookmarkStart w:id="59" w:name="_Toc219064435"/>
+      <w:bookmarkStart w:id="59" w:name="_Toc219313883"/>
       <w:r>
         <w:rPr>
           <w:rFonts w:asciiTheme="minorHAnsi" w:hAnsiTheme="minorHAnsi"/>
@@ -17095,7 +17166,7 @@
           <w:color w:val="000000" w:themeColor="text1"/>
         </w:rPr>
       </w:pPr>
-      <w:bookmarkStart w:id="60" w:name="_Toc219064436"/>
+      <w:bookmarkStart w:id="60" w:name="_Toc219313884"/>
       <w:r>
         <w:rPr>
           <w:rFonts w:asciiTheme="minorHAnsi" w:hAnsiTheme="minorHAnsi"/>
@@ -17196,7 +17267,19 @@
         <w:rPr>
           <w:color w:val="000000" w:themeColor="text1"/>
         </w:rPr>
-        <w:t>Bij de gebruikers werd afgewisseld in de volgorde van de scenario’s: de ene helft (4</w:t>
+        <w:t xml:space="preserve">Bij de gebruikers </w:t>
+      </w:r>
+      <w:r>
+        <w:rPr>
+          <w:color w:val="000000" w:themeColor="text1"/>
+        </w:rPr>
+        <w:t>de volgorde van de scenario’s gerandomiseerd</w:t>
+      </w:r>
+      <w:r>
+        <w:rPr>
+          <w:color w:val="000000" w:themeColor="text1"/>
+        </w:rPr>
+        <w:t>: de ene helft (4</w:t>
       </w:r>
       <w:r>
         <w:rPr>
@@ -17240,7 +17323,67 @@
         <w:rPr>
           <w:color w:val="000000" w:themeColor="text1"/>
         </w:rPr>
-        <w:t>2, terwijl de andere helft (4 deelnemers) de omgekeerde volgorde volgde. De pilotstudie werd uitgevoerd met eerst de basisversie en daarna de versie met extra functionaliteiten. Deze wisseling van volgorde had tot doel de invloed van de learning curve van de fortunately</w:t>
+        <w:t xml:space="preserve">2, terwijl de andere helft (4 deelnemers) de omgekeerde volgorde volgde. De </w:t>
+      </w:r>
+      <w:r>
+        <w:rPr>
+          <w:color w:val="000000" w:themeColor="text1"/>
+        </w:rPr>
+        <w:t>pilootstudie</w:t>
+      </w:r>
+      <w:r>
+        <w:rPr>
+          <w:color w:val="000000" w:themeColor="text1"/>
+        </w:rPr>
+        <w:t xml:space="preserve"> werd uitgevoerd met eerst de basisversie en daarna de versie met extra functionaliteiten. Deze </w:t>
+      </w:r>
+      <w:r>
+        <w:rPr>
+          <w:color w:val="000000" w:themeColor="text1"/>
+        </w:rPr>
+        <w:t>afwisseling</w:t>
+      </w:r>
+      <w:r>
+        <w:rPr>
+          <w:color w:val="000000" w:themeColor="text1"/>
+        </w:rPr>
+        <w:t xml:space="preserve"> </w:t>
+      </w:r>
+      <w:r>
+        <w:rPr>
+          <w:color w:val="000000" w:themeColor="text1"/>
+        </w:rPr>
+        <w:t>in</w:t>
+      </w:r>
+      <w:r>
+        <w:rPr>
+          <w:color w:val="000000" w:themeColor="text1"/>
+        </w:rPr>
+        <w:t xml:space="preserve"> volgorde had </w:t>
+      </w:r>
+      <w:r>
+        <w:rPr>
+          <w:color w:val="000000" w:themeColor="text1"/>
+        </w:rPr>
+        <w:t>als</w:t>
+      </w:r>
+      <w:r>
+        <w:rPr>
+          <w:color w:val="000000" w:themeColor="text1"/>
+        </w:rPr>
+        <w:t xml:space="preserve"> doel de invloed van de </w:t>
+      </w:r>
+      <w:r>
+        <w:rPr>
+          <w:color w:val="000000" w:themeColor="text1"/>
+        </w:rPr>
+        <w:t>leercurve</w:t>
+      </w:r>
+      <w:r>
+        <w:rPr>
+          <w:color w:val="000000" w:themeColor="text1"/>
+        </w:rPr>
+        <w:t xml:space="preserve"> van de fortunately</w:t>
       </w:r>
       <w:r>
         <w:rPr>
@@ -17303,7 +17446,7 @@
           <w:color w:val="000000" w:themeColor="text1"/>
         </w:rPr>
       </w:pPr>
-      <w:bookmarkStart w:id="61" w:name="_Toc219064437"/>
+      <w:bookmarkStart w:id="61" w:name="_Toc219313885"/>
       <w:r>
         <w:rPr>
           <w:rFonts w:asciiTheme="minorHAnsi" w:hAnsiTheme="minorHAnsi"/>
@@ -17337,7 +17480,31 @@
         <w:rPr>
           <w:color w:val="000000" w:themeColor="text1"/>
         </w:rPr>
-        <w:t>In totaal namen acht deelnemers deel aan de hoofdgebruikersstudie, aangevuld met één deelnemer in een voorafgaande pilotstudie. De leeftijd van de deelnemers in de hoofdstudie varieerde van 20 tot 28 jaar en allen hadden een achtergrond in (toegepaste) informatica of industriële wetenschappen informatica.</w:t>
+        <w:t>In totaal namen acht deelnemers deel aan de gebruikersstudie, aangevuld met één deelnemer in een voorafgaande pilo</w:t>
+      </w:r>
+      <w:r>
+        <w:rPr>
+          <w:color w:val="000000" w:themeColor="text1"/>
+        </w:rPr>
+        <w:t>o</w:t>
+      </w:r>
+      <w:r>
+        <w:rPr>
+          <w:color w:val="000000" w:themeColor="text1"/>
+        </w:rPr>
+        <w:t xml:space="preserve">tstudie. De leeftijd van de deelnemers in de </w:t>
+      </w:r>
+      <w:r>
+        <w:rPr>
+          <w:color w:val="000000" w:themeColor="text1"/>
+        </w:rPr>
+        <w:t>gebruikers</w:t>
+      </w:r>
+      <w:r>
+        <w:rPr>
+          <w:color w:val="000000" w:themeColor="text1"/>
+        </w:rPr>
+        <w:t>studie varieerde van 20 tot 28 jaar en allen hadden een achtergrond in (toegepaste) informatica of industriële wetenschappen informatica.</w:t>
       </w:r>
     </w:p>
     <w:p>
@@ -17359,7 +17526,31 @@
         <w:rPr>
           <w:color w:val="000000" w:themeColor="text1"/>
         </w:rPr>
-        <w:t>Zeven van de acht deelnemers in de hoofdstudie gaven expliciet aan géén ervaring te hebben met security</w:t>
+        <w:t xml:space="preserve">Zeven van de acht deelnemers </w:t>
+      </w:r>
+      <w:r>
+        <w:rPr>
+          <w:color w:val="000000" w:themeColor="text1"/>
+        </w:rPr>
+        <w:t>van</w:t>
+      </w:r>
+      <w:r>
+        <w:rPr>
+          <w:color w:val="000000" w:themeColor="text1"/>
+        </w:rPr>
+        <w:t xml:space="preserve"> </w:t>
+      </w:r>
+      <w:r>
+        <w:rPr>
+          <w:color w:val="000000" w:themeColor="text1"/>
+        </w:rPr>
+        <w:t xml:space="preserve">het experiment </w:t>
+      </w:r>
+      <w:r>
+        <w:rPr>
+          <w:color w:val="000000" w:themeColor="text1"/>
+        </w:rPr>
+        <w:t>gaven expliciet aan géén ervaring te hebben met security</w:t>
       </w:r>
       <w:r>
         <w:rPr>
@@ -17397,21 +17588,19 @@
           <w:color w:val="000000" w:themeColor="text1"/>
         </w:rPr>
         <w:noBreakHyphen/>
-        <w:t>modellering in het kader van opleiding en non</w:t>
-      </w:r>
-      <w:r>
-        <w:rPr>
-          <w:color w:val="000000" w:themeColor="text1"/>
-        </w:rPr>
-        <w:noBreakHyphen/>
-        <w:t>functionele security</w:t>
-      </w:r>
-      <w:r>
-        <w:rPr>
-          <w:color w:val="000000" w:themeColor="text1"/>
-        </w:rPr>
-        <w:noBreakHyphen/>
-        <w:t>requirements. Wel hadden de meeste deelnemers enige ervaring met security in bredere zin, bijvoorbeeld via security</w:t>
+        <w:t xml:space="preserve">modellering in het kader van </w:t>
+      </w:r>
+      <w:r>
+        <w:rPr>
+          <w:color w:val="000000" w:themeColor="text1"/>
+        </w:rPr>
+        <w:t xml:space="preserve">de </w:t>
+      </w:r>
+      <w:r>
+        <w:rPr>
+          <w:color w:val="000000" w:themeColor="text1"/>
+        </w:rPr>
+        <w:t>opleiding. Wel hadden de meeste deelnemers enige ervaring met security in bredere zin, bijvoorbeeld via security</w:t>
       </w:r>
       <w:r>
         <w:rPr>
@@ -17492,7 +17681,19 @@
         <w:rPr>
           <w:color w:val="000000" w:themeColor="text1"/>
         </w:rPr>
-        <w:t>De gegevens van de pilootdeelnemer zijn selectief meegenomen in de analyses. Voor de User Experience Questionnaire (UEQ) werd deze deelnemer wél opgenomen, omdat hij/zij op basis van de uitgevoerde taken beide versies van de tool inhoudelijk kon beoordelen en zo extra inzicht gaf in de ervaren gebruikservaring. Voor de prestatiematen, zoals taakduur en aantal gemaakte fouten, is de piloot echter uitgesloten om vertekening door het eerdere testkarakter van de sessie te vermijden.</w:t>
+        <w:t>De gegevens van de pilootdeelnemer zijn selectief meegenomen in de analyses. Voor de User Experience Questionnaire (UEQ) werd deze deelnemer wél opgenomen, omdat hij/zij op basis van de uitgevoerde taken beide versies van de tool inhoudelijk kon beoordelen en zo extra inzicht gaf in de ervaren gebruikservaring. Voor de prestatiematen, zoals taakduur en gemaakte fouten, is de</w:t>
+      </w:r>
+      <w:r>
+        <w:rPr>
+          <w:color w:val="000000" w:themeColor="text1"/>
+        </w:rPr>
+        <w:t xml:space="preserve">ze deelnemer </w:t>
+      </w:r>
+      <w:r>
+        <w:rPr>
+          <w:color w:val="000000" w:themeColor="text1"/>
+        </w:rPr>
+        <w:t>echter uitgesloten om vertekening door het eerdere testkarakter van de sessie te vermijden.</w:t>
       </w:r>
     </w:p>
     <w:p>
@@ -17525,7 +17726,7 @@
           <w:color w:val="000000" w:themeColor="text1"/>
         </w:rPr>
       </w:pPr>
-      <w:bookmarkStart w:id="62" w:name="_Toc219064438"/>
+      <w:bookmarkStart w:id="62" w:name="_Toc219313886"/>
       <w:r>
         <w:rPr>
           <w:rFonts w:asciiTheme="minorHAnsi" w:hAnsiTheme="minorHAnsi"/>
@@ -17560,9 +17761,18 @@
           <w:bCs/>
           <w:color w:val="000000" w:themeColor="text1"/>
         </w:rPr>
-        <w:t>Softwareversies</w:t>
+        <w:t>Functionele verschillen tussen basis- en uitgebreide software versie</w:t>
       </w:r>
       <w:bookmarkEnd w:id="62"/>
+      <w:r>
+        <w:rPr>
+          <w:rFonts w:asciiTheme="minorHAnsi" w:hAnsiTheme="minorHAnsi"/>
+          <w:b/>
+          <w:bCs/>
+          <w:color w:val="000000" w:themeColor="text1"/>
+        </w:rPr>
+        <w:t xml:space="preserve"> </w:t>
+      </w:r>
     </w:p>
     <w:p>
       <w:pPr>
@@ -17728,28 +17938,28 @@
           <w:rFonts w:cs="Arial"/>
           <w:color w:val="000000" w:themeColor="text1"/>
         </w:rPr>
-        <w:t>Figuur 2</w:t>
+        <w:t xml:space="preserve">Figuur </w:t>
       </w:r>
       <w:r>
         <w:rPr>
           <w:rFonts w:cs="Arial"/>
           <w:color w:val="000000" w:themeColor="text1"/>
         </w:rPr>
-        <w:t>2</w:t>
+        <w:t>21</w:t>
       </w:r>
       <w:r>
         <w:rPr>
           <w:rFonts w:cs="Arial"/>
           <w:color w:val="000000" w:themeColor="text1"/>
         </w:rPr>
-        <w:t xml:space="preserve"> toont de visualisatie van een fortunately-node in de basisversie, terwijl Figuur 2</w:t>
+        <w:t xml:space="preserve"> toont de visualisatie van een fortunately-node in de basisversie, terwijl Figuur </w:t>
       </w:r>
       <w:r>
         <w:rPr>
           <w:rFonts w:cs="Arial"/>
           <w:color w:val="000000" w:themeColor="text1"/>
         </w:rPr>
-        <w:t>3</w:t>
+        <w:t>22</w:t>
       </w:r>
       <w:r>
         <w:rPr>
@@ -17763,14 +17973,6 @@
       <w:pPr>
         <w:spacing w:afterLines="24" w:after="57" w:line="288" w:lineRule="auto"/>
         <w:rPr>
-          <w:color w:val="000000" w:themeColor="text1"/>
-        </w:rPr>
-      </w:pPr>
-    </w:p>
-    <w:p>
-      <w:pPr>
-        <w:spacing w:afterLines="24" w:after="57" w:line="288" w:lineRule="auto"/>
-        <w:rPr>
           <w:rFonts w:cs="Arial"/>
           <w:color w:val="000000" w:themeColor="text1"/>
         </w:rPr>
@@ -17779,6 +17981,7 @@
         <w:rPr>
           <w:color w:val="000000" w:themeColor="text1"/>
         </w:rPr>
+        <w:lastRenderedPageBreak/>
         <w:t>De uitgebreide versie bouwde hierop voort met bijkomende visualisatie</w:t>
       </w:r>
       <w:r>
@@ -17818,7 +18021,19 @@
           <w:color w:val="000000" w:themeColor="text1"/>
         </w:rPr>
         <w:noBreakHyphen/>
-        <w:t>model, geïmplementeerd in de codebasis van de prototypeapplicatie.</w:t>
+        <w:t xml:space="preserve">model, geïmplementeerd in de </w:t>
+      </w:r>
+      <w:r>
+        <w:rPr>
+          <w:color w:val="000000" w:themeColor="text1"/>
+        </w:rPr>
+        <w:t xml:space="preserve">code </w:t>
+      </w:r>
+      <w:r>
+        <w:rPr>
+          <w:color w:val="000000" w:themeColor="text1"/>
+        </w:rPr>
+        <w:t>van de prototypeapplicatie.</w:t>
       </w:r>
       <w:r>
         <w:rPr>
@@ -17850,7 +18065,7 @@
           <w:color w:val="000000" w:themeColor="text1"/>
         </w:rPr>
         <w:drawing>
-          <wp:inline distT="0" distB="0" distL="0" distR="0" wp14:anchorId="1D6CEF09" wp14:editId="75540241">
+          <wp:inline distT="0" distB="0" distL="0" distR="0" wp14:anchorId="1D6CEF09" wp14:editId="51D67190">
             <wp:extent cx="5759450" cy="2903855"/>
             <wp:effectExtent l="0" t="0" r="0" b="0"/>
             <wp:docPr id="254494346" name="Afbeelding 25" descr="Afbeelding met tekst, schermopname, Lettertype, nummer&#10;&#10;Door AI gegenereerde inhoud is mogelijk onjuist."/>
@@ -18193,11 +18408,23 @@
     </w:p>
     <w:p>
       <w:pPr>
-        <w:spacing w:afterLines="24" w:after="57" w:line="288" w:lineRule="auto"/>
-        <w:rPr>
-          <w:color w:val="000000" w:themeColor="text1"/>
-        </w:rPr>
-      </w:pPr>
+        <w:rPr>
+          <w:rFonts w:eastAsiaTheme="majorEastAsia" w:cstheme="majorBidi"/>
+          <w:b/>
+          <w:bCs/>
+          <w:color w:val="000000" w:themeColor="text1"/>
+          <w:sz w:val="32"/>
+          <w:szCs w:val="32"/>
+        </w:rPr>
+      </w:pPr>
+      <w:r>
+        <w:rPr>
+          <w:b/>
+          <w:bCs/>
+          <w:color w:val="000000" w:themeColor="text1"/>
+        </w:rPr>
+        <w:br w:type="page"/>
+      </w:r>
     </w:p>
     <w:p>
       <w:pPr>
@@ -18209,7 +18436,7 @@
           <w:color w:val="000000" w:themeColor="text1"/>
         </w:rPr>
       </w:pPr>
-      <w:bookmarkStart w:id="66" w:name="_Toc219064439"/>
+      <w:bookmarkStart w:id="66" w:name="_Toc219313887"/>
       <w:r>
         <w:rPr>
           <w:rFonts w:asciiTheme="minorHAnsi" w:hAnsiTheme="minorHAnsi"/>
@@ -18773,7 +19000,7 @@
           <w:color w:val="000000" w:themeColor="text1"/>
         </w:rPr>
       </w:pPr>
-      <w:bookmarkStart w:id="67" w:name="_Toc219064440"/>
+      <w:bookmarkStart w:id="67" w:name="_Toc219313888"/>
       <w:r>
         <w:rPr>
           <w:rFonts w:asciiTheme="minorHAnsi" w:hAnsiTheme="minorHAnsi"/>
@@ -18834,7 +19061,19 @@
         <w:rPr>
           <w:color w:val="000000" w:themeColor="text1"/>
         </w:rPr>
-        <w:t>Tijdens de sessie werd het scherm van de deelnemer opgenomen en live gevolgd, zodat interactiepatronen en fouten later kwalitatief konden worden geanalyseerd. Na elke versie vulden deelnemers de</w:t>
+        <w:t>Tijdens de sessie werd het scherm van de deelnemer opgenomen en live gevolgd</w:t>
+      </w:r>
+      <w:r>
+        <w:rPr>
+          <w:color w:val="000000" w:themeColor="text1"/>
+        </w:rPr>
+        <w:t xml:space="preserve"> via een tweede scherm</w:t>
+      </w:r>
+      <w:r>
+        <w:rPr>
+          <w:color w:val="000000" w:themeColor="text1"/>
+        </w:rPr>
+        <w:t>, zodat interactiepatronen en fouten later kwalitatief konden worden geanalyseerd. Na elke versie vulden deelnemers de</w:t>
       </w:r>
       <w:r>
         <w:rPr>
@@ -18953,7 +19192,7 @@
           <w:color w:val="000000" w:themeColor="text1"/>
         </w:rPr>
       </w:pPr>
-      <w:bookmarkStart w:id="68" w:name="_Toc219064441"/>
+      <w:bookmarkStart w:id="68" w:name="_Toc219313889"/>
       <w:r>
         <w:rPr>
           <w:rFonts w:asciiTheme="minorHAnsi" w:hAnsiTheme="minorHAnsi"/>
@@ -19128,7 +19367,7 @@
           <w:color w:val="000000" w:themeColor="text1"/>
         </w:rPr>
       </w:pPr>
-      <w:bookmarkStart w:id="69" w:name="_Toc219064442"/>
+      <w:bookmarkStart w:id="69" w:name="_Toc219313890"/>
       <w:r>
         <w:rPr>
           <w:rFonts w:asciiTheme="minorHAnsi" w:hAnsiTheme="minorHAnsi"/>
@@ -19163,14 +19402,20 @@
         <w:rPr>
           <w:color w:val="000000" w:themeColor="text1"/>
         </w:rPr>
-        <w:t xml:space="preserve">In dit onderdeel werden een reeks open vragen en een rangschikkingsopdracht gebruikt om dieper inzicht te verkrijgen in de ervaren meerwaarde van de nieuwe functionaliteiten ten opzichte van de basissoftware. De vragen richtten zich op zowel de </w:t>
+        <w:t>Na het overlopen van de beide scenario’s,</w:t>
+      </w:r>
+      <w:r>
+        <w:rPr>
+          <w:color w:val="000000" w:themeColor="text1"/>
+        </w:rPr>
+        <w:t xml:space="preserve"> werden een reeks open vragen en een rangschikkingsopdracht gebruikt om dieper inzicht te verkrijgen in de ervaren </w:t>
       </w:r>
       <w:r>
         <w:rPr>
           <w:color w:val="000000" w:themeColor="text1"/>
         </w:rPr>
         <w:lastRenderedPageBreak/>
-        <w:t>begrijpelijkheid van de gehanteerde methode (de “Fortunately–Unfortunately”-aanpak) als op de perceptie van nut en bruikbaarheid van de toegevoegde features.</w:t>
+        <w:t>meerwaarde van de nieuwe functionaliteiten ten opzichte van de basissoftware. De vragen richtten zich op zowel de begrijpelijkheid van de gehanteerde methode (de “Fortunately–Unfortunately”-aanpak) als op de perceptie van nut en bruikbaarheid van de toegevoegde features.</w:t>
       </w:r>
     </w:p>
     <w:p>
@@ -19296,7 +19541,7 @@
           <w:color w:val="000000" w:themeColor="text1"/>
         </w:rPr>
       </w:pPr>
-      <w:bookmarkStart w:id="70" w:name="_Toc219064443"/>
+      <w:bookmarkStart w:id="70" w:name="_Toc219313891"/>
       <w:r>
         <w:rPr>
           <w:rFonts w:asciiTheme="minorHAnsi" w:hAnsiTheme="minorHAnsi"/>
@@ -19455,7 +19700,7 @@
           <w:lang w:eastAsia="nl-BE"/>
         </w:rPr>
       </w:pPr>
-      <w:bookmarkStart w:id="71" w:name="_Toc219064444"/>
+      <w:bookmarkStart w:id="71" w:name="_Toc219313892"/>
       <w:r>
         <w:rPr>
           <w:rFonts w:asciiTheme="minorHAnsi" w:eastAsia="Times New Roman" w:hAnsiTheme="minorHAnsi"/>
@@ -19544,7 +19789,27 @@
           <w:lang w:eastAsia="nl-BE"/>
           <w14:ligatures w14:val="none"/>
         </w:rPr>
-        <w:t xml:space="preserve">(Fig. 24) </w:t>
+        <w:t xml:space="preserve">(Fig. </w:t>
+      </w:r>
+      <w:r>
+        <w:rPr>
+          <w:rFonts w:eastAsia="Times New Roman" w:cs="Times New Roman"/>
+          <w:color w:val="000000" w:themeColor="text1"/>
+          <w:kern w:val="0"/>
+          <w:lang w:eastAsia="nl-BE"/>
+          <w14:ligatures w14:val="none"/>
+        </w:rPr>
+        <w:t>23</w:t>
+      </w:r>
+      <w:r>
+        <w:rPr>
+          <w:rFonts w:eastAsia="Times New Roman" w:cs="Times New Roman"/>
+          <w:color w:val="000000" w:themeColor="text1"/>
+          <w:kern w:val="0"/>
+          <w:lang w:eastAsia="nl-BE"/>
+          <w14:ligatures w14:val="none"/>
+        </w:rPr>
+        <w:t xml:space="preserve">) </w:t>
       </w:r>
       <w:r>
         <w:rPr>
@@ -19977,7 +20242,7 @@
           <w:lang w:eastAsia="nl-BE"/>
         </w:rPr>
       </w:pPr>
-      <w:bookmarkStart w:id="73" w:name="_Toc219064445"/>
+      <w:bookmarkStart w:id="73" w:name="_Toc219313893"/>
       <w:r>
         <w:rPr>
           <w:rFonts w:asciiTheme="minorHAnsi" w:eastAsia="Times New Roman" w:hAnsiTheme="minorHAnsi"/>
@@ -20097,7 +20362,19 @@
         <w:rPr>
           <w:lang w:eastAsia="nl-BE"/>
         </w:rPr>
-        <w:t xml:space="preserve">. De krijgen standaard al </w:t>
+        <w:t>. De</w:t>
+      </w:r>
+      <w:r>
+        <w:rPr>
+          <w:lang w:eastAsia="nl-BE"/>
+        </w:rPr>
+        <w:t xml:space="preserve"> nodes</w:t>
+      </w:r>
+      <w:r>
+        <w:rPr>
+          <w:lang w:eastAsia="nl-BE"/>
+        </w:rPr>
+        <w:t xml:space="preserve"> krijgen standaard al </w:t>
       </w:r>
       <w:r>
         <w:rPr>
@@ -20225,20 +20502,6 @@
     </w:p>
     <w:p>
       <w:pPr>
-        <w:rPr>
-          <w:lang w:eastAsia="nl-BE"/>
-        </w:rPr>
-      </w:pPr>
-    </w:p>
-    <w:p>
-      <w:pPr>
-        <w:rPr>
-          <w:lang w:eastAsia="nl-BE"/>
-        </w:rPr>
-      </w:pPr>
-    </w:p>
-    <w:p>
-      <w:pPr>
         <w:pStyle w:val="Kop2"/>
         <w:rPr>
           <w:rFonts w:asciiTheme="minorHAnsi" w:eastAsia="Times New Roman" w:hAnsiTheme="minorHAnsi"/>
@@ -20248,7 +20511,7 @@
           <w:lang w:eastAsia="nl-BE"/>
         </w:rPr>
       </w:pPr>
-      <w:bookmarkStart w:id="74" w:name="_Toc219064446"/>
+      <w:bookmarkStart w:id="74" w:name="_Toc219313894"/>
       <w:r>
         <w:rPr>
           <w:rFonts w:asciiTheme="minorHAnsi" w:eastAsia="Times New Roman" w:hAnsiTheme="minorHAnsi"/>
@@ -20257,6 +20520,7 @@
           <w:color w:val="000000" w:themeColor="text1"/>
           <w:lang w:eastAsia="nl-BE"/>
         </w:rPr>
+        <w:lastRenderedPageBreak/>
         <w:t>5</w:t>
       </w:r>
       <w:r>
@@ -20414,7 +20678,7 @@
           <w:lang w:eastAsia="nl-BE"/>
         </w:rPr>
       </w:pPr>
-      <w:bookmarkStart w:id="75" w:name="_Toc219064447"/>
+      <w:bookmarkStart w:id="75" w:name="_Toc219313895"/>
       <w:r>
         <w:rPr>
           <w:rFonts w:asciiTheme="minorHAnsi" w:eastAsia="Times New Roman" w:hAnsiTheme="minorHAnsi"/>
@@ -20560,7 +20824,7 @@
           <w:lang w:eastAsia="nl-BE"/>
         </w:rPr>
       </w:pPr>
-      <w:bookmarkStart w:id="76" w:name="_Toc219064448"/>
+      <w:bookmarkStart w:id="76" w:name="_Toc219313896"/>
       <w:r>
         <w:rPr>
           <w:rFonts w:asciiTheme="minorHAnsi" w:eastAsia="Times New Roman" w:hAnsiTheme="minorHAnsi"/>
@@ -20648,7 +20912,7 @@
           <w:lang w:eastAsia="nl-BE"/>
           <w14:ligatures w14:val="none"/>
         </w:rPr>
-        <w:t xml:space="preserve">Ondanks de duidelijke voorkeur voor versie 2 formuleren deelnemers ook concrete verbeterpunten, wat waardevolle input biedt voor verdere iteraties van het ontwerp. Genoemde suggesties zijn onder meer het compacter weergeven van de tree zodat er meer op het scherm past, intuïtievere manieren om nodes in en uit te klappen en snellere navigatie binnen lange branches. Daarnaast worden uitbreidingen rond statusbeheer voorgesteld, zoals custom statussen, een duidelijkere indicatie van de collapse/expand-knoppen en een eenvoudigere manier om per ongeluk aangemaakte </w:t>
+        <w:t xml:space="preserve">Ondanks de duidelijke voorkeur voor versie 2 formuleren deelnemers ook concrete verbeterpunten, wat waardevolle input biedt voor verdere iteraties van het ontwerp. Genoemde suggesties zijn onder meer het compacter weergeven van de tree zodat er meer op het scherm past, intuïtievere manieren om nodes in en uit te klappen en snellere navigatie binnen lange branches. Daarnaast worden uitbreidingen rond statusbeheer voorgesteld, zoals custom statussen, een duidelijkere indicatie van de collapse/expand-knoppen en een eenvoudigere manier om per ongeluk aangemaakte nodes te annuleren. Tot slot worden ideeën geopperd voor verdere kwaliteitsverbeteringen, zoals een globale knop om alle branches behalve de </w:t>
       </w:r>
       <w:r>
         <w:rPr>
@@ -20659,7 +20923,7 @@
           <w14:ligatures w14:val="none"/>
         </w:rPr>
         <w:lastRenderedPageBreak/>
-        <w:t>nodes te annuleren. Tot slot worden ideeën geopperd voor verdere kwaliteitsverbeteringen, zoals een globale knop om alle branches behalve de geselecteerde in te klappen, zoom op een specifieke branch als nieuwe tree en een zoekbalk binnen de filterbalk.</w:t>
+        <w:t>geselecteerde in te klappen, zoom op een specifieke branch als nieuwe tree en een zoekbalk binnen de filterbalk.</w:t>
       </w:r>
     </w:p>
     <w:p>
@@ -20697,7 +20961,7 @@
           <w:lang w:eastAsia="nl-BE"/>
         </w:rPr>
       </w:pPr>
-      <w:bookmarkStart w:id="77" w:name="_Toc219064449"/>
+      <w:bookmarkStart w:id="77" w:name="_Toc219313897"/>
       <w:r>
         <w:rPr>
           <w:rFonts w:asciiTheme="minorHAnsi" w:eastAsia="Times New Roman" w:hAnsiTheme="minorHAnsi"/>
@@ -20746,7 +21010,7 @@
           <w:color w:val="000000" w:themeColor="text1"/>
           <w:lang w:eastAsia="nl-BE"/>
         </w:rPr>
-        <w:t>Synthese</w:t>
+        <w:t>Samenvatting en synthese van de belangrijkste resultaten</w:t>
       </w:r>
       <w:bookmarkEnd w:id="77"/>
     </w:p>
@@ -20754,21 +21018,46 @@
       <w:pPr>
         <w:spacing w:afterLines="24" w:after="57" w:line="288" w:lineRule="auto"/>
         <w:rPr>
+          <w:b/>
+          <w:bCs/>
+          <w:color w:val="000000" w:themeColor="text1"/>
+        </w:rPr>
+      </w:pPr>
+    </w:p>
+    <w:p>
+      <w:pPr>
+        <w:spacing w:afterLines="24" w:after="57" w:line="288" w:lineRule="auto"/>
+        <w:rPr>
+          <w:color w:val="000000" w:themeColor="text1"/>
+        </w:rPr>
+      </w:pPr>
+      <w:r>
+        <w:rPr>
+          <w:color w:val="000000" w:themeColor="text1"/>
+        </w:rPr>
+        <w:t>De empirische resultaten bevestigen dat de basisfunctionaliteit van de tool voldoende is voor minimale ondersteuning van Fortunately-Unfortunately trees, maar dat de toegevoegde UX-features een substantiële verbetering opleveren in gebruiksvriendelijkheid en efficiëntie. Versie 2 scoort op alle UEQ-dimensies positief en wordt door alle deelnemers unaniem verkozen boven de basis mindmap-tool, dankzij features zoals filtering en visuele codering. Deze bevindingen beantwoorden de onderzoeksvragen direct en onderbouwen de waarde van domeinspecifieke UX in threat modeling.</w:t>
+      </w:r>
+    </w:p>
+    <w:p>
+      <w:pPr>
+        <w:spacing w:afterLines="24" w:after="57" w:line="288" w:lineRule="auto"/>
+        <w:rPr>
+          <w:color w:val="000000" w:themeColor="text1"/>
+        </w:rPr>
+      </w:pPr>
+    </w:p>
+    <w:p>
+      <w:pPr>
+        <w:spacing w:afterLines="24" w:after="57" w:line="288" w:lineRule="auto"/>
+        <w:rPr>
           <w:rFonts w:eastAsia="Times New Roman" w:cs="Times New Roman"/>
-          <w:b/>
-          <w:bCs/>
           <w:color w:val="000000" w:themeColor="text1"/>
           <w:kern w:val="0"/>
-          <w:sz w:val="28"/>
-          <w:szCs w:val="28"/>
           <w:lang w:eastAsia="nl-BE"/>
           <w14:ligatures w14:val="none"/>
         </w:rPr>
       </w:pPr>
-    </w:p>
-    <w:p>
-      <w:pPr>
-        <w:spacing w:afterLines="24" w:after="57" w:line="288" w:lineRule="auto"/>
+      <w:r>
         <w:rPr>
           <w:rFonts w:eastAsia="Times New Roman" w:cs="Times New Roman"/>
           <w:color w:val="000000" w:themeColor="text1"/>
@@ -20776,15 +21065,6 @@
           <w:lang w:eastAsia="nl-BE"/>
           <w14:ligatures w14:val="none"/>
         </w:rPr>
-      </w:pPr>
-      <w:r>
-        <w:rPr>
-          <w:rFonts w:eastAsia="Times New Roman" w:cs="Times New Roman"/>
-          <w:color w:val="000000" w:themeColor="text1"/>
-          <w:kern w:val="0"/>
-          <w:lang w:eastAsia="nl-BE"/>
-          <w14:ligatures w14:val="none"/>
-        </w:rPr>
         <w:t xml:space="preserve">Samenvattend tonen zowel de UEQ-scores als de open antwoorden dat het toevoegen van de nieuwe features leidt tot een verschuiving van een overwegend negatief naar een duidelijk positief UX-profiel. Versie 2 wordt door alle deelnemers als voorkeursversie beschouwd omdat deze tijd bespaart, fouten reduceert en een aantrekkelijker, overzichtelijker en intuïtiever ontwerp biedt, terwijl de geformuleerde suggesties tegelijk concrete aangrijpingspunten bieden voor verdere verfijning van de interface. </w:t>
       </w:r>
     </w:p>
@@ -20792,8 +21072,6 @@
       <w:pPr>
         <w:spacing w:afterLines="24" w:after="57" w:line="288" w:lineRule="auto"/>
         <w:rPr>
-          <w:b/>
-          <w:bCs/>
           <w:color w:val="000000" w:themeColor="text1"/>
         </w:rPr>
       </w:pPr>
@@ -20818,7 +21096,7 @@
           <w:color w:val="000000" w:themeColor="text1"/>
         </w:rPr>
       </w:pPr>
-      <w:bookmarkStart w:id="78" w:name="_Toc219064450"/>
+      <w:bookmarkStart w:id="78" w:name="_Toc219313898"/>
       <w:r>
         <w:rPr>
           <w:rFonts w:asciiTheme="minorHAnsi" w:hAnsiTheme="minorHAnsi"/>
@@ -20844,7 +21122,7 @@
           <w:bCs/>
           <w:color w:val="000000" w:themeColor="text1"/>
         </w:rPr>
-        <w:t xml:space="preserve"> Samenvatting van de belangrijkste resultaten</w:t>
+        <w:t xml:space="preserve"> Beantwoording van de onderzoeksvragen</w:t>
       </w:r>
       <w:bookmarkEnd w:id="78"/>
     </w:p>
@@ -20862,50 +21140,24 @@
       <w:pPr>
         <w:spacing w:afterLines="24" w:after="57" w:line="288" w:lineRule="auto"/>
         <w:rPr>
-          <w:color w:val="000000" w:themeColor="text1"/>
-        </w:rPr>
-      </w:pPr>
-      <w:r>
-        <w:rPr>
-          <w:color w:val="000000" w:themeColor="text1"/>
-        </w:rPr>
-        <w:t>De empirische resultaten bevestigen dat de basisfunctionaliteit van de tool voldoende is voor minimale ondersteuning van Fortunately-Unfortunately trees, maar dat de toegevoegde UX-features een substantiële verbetering opleveren in gebruiksvriendelijkheid en efficiëntie. Versie 2 scoort op alle UEQ-dimensies positief en wordt door alle deelnemers unaniem verkozen boven de basis mindmap-tool, dankzij features zoals filtering en visuele codering. Deze bevindingen beantwoorden de onderzoeksvragen direct en onderbouwen de waarde van domeinspecifieke UX in threat modeling.</w:t>
-      </w:r>
-    </w:p>
-    <w:p>
-      <w:pPr>
-        <w:spacing w:afterLines="24" w:after="57" w:line="288" w:lineRule="auto"/>
-        <w:rPr>
-          <w:b/>
-          <w:bCs/>
-          <w:color w:val="000000" w:themeColor="text1"/>
-        </w:rPr>
-      </w:pPr>
-    </w:p>
-    <w:p>
-      <w:pPr>
-        <w:spacing w:afterLines="24" w:after="57" w:line="288" w:lineRule="auto"/>
-        <w:rPr>
-          <w:b/>
-          <w:bCs/>
-          <w:color w:val="000000" w:themeColor="text1"/>
-        </w:rPr>
-      </w:pPr>
-    </w:p>
-    <w:p>
-      <w:pPr>
-        <w:pStyle w:val="Kop2"/>
-        <w:rPr>
-          <w:rFonts w:asciiTheme="minorHAnsi" w:hAnsiTheme="minorHAnsi"/>
-          <w:b/>
-          <w:bCs/>
-          <w:color w:val="000000" w:themeColor="text1"/>
-        </w:rPr>
-      </w:pPr>
-      <w:bookmarkStart w:id="79" w:name="_Toc219064451"/>
-      <w:r>
-        <w:rPr>
-          <w:rFonts w:asciiTheme="minorHAnsi" w:hAnsiTheme="minorHAnsi"/>
+          <w:b/>
+          <w:bCs/>
+          <w:color w:val="000000" w:themeColor="text1"/>
+        </w:rPr>
+      </w:pPr>
+    </w:p>
+    <w:p>
+      <w:pPr>
+        <w:pStyle w:val="Kop3"/>
+        <w:rPr>
+          <w:b/>
+          <w:bCs/>
+          <w:color w:val="000000" w:themeColor="text1"/>
+        </w:rPr>
+      </w:pPr>
+      <w:bookmarkStart w:id="79" w:name="_Toc219313899"/>
+      <w:r>
+        <w:rPr>
           <w:b/>
           <w:bCs/>
           <w:color w:val="000000" w:themeColor="text1"/>
@@ -20914,21 +21166,19 @@
       </w:r>
       <w:r>
         <w:rPr>
-          <w:rFonts w:asciiTheme="minorHAnsi" w:hAnsiTheme="minorHAnsi"/>
-          <w:b/>
-          <w:bCs/>
-          <w:color w:val="000000" w:themeColor="text1"/>
-        </w:rPr>
-        <w:t>8</w:t>
-      </w:r>
-      <w:r>
-        <w:rPr>
-          <w:rFonts w:asciiTheme="minorHAnsi" w:hAnsiTheme="minorHAnsi"/>
-          <w:b/>
-          <w:bCs/>
-          <w:color w:val="000000" w:themeColor="text1"/>
-        </w:rPr>
-        <w:t xml:space="preserve"> Beantwoording van de onderzoeksvragen</w:t>
+          <w:b/>
+          <w:bCs/>
+          <w:color w:val="000000" w:themeColor="text1"/>
+        </w:rPr>
+        <w:t>7</w:t>
+      </w:r>
+      <w:r>
+        <w:rPr>
+          <w:b/>
+          <w:bCs/>
+          <w:color w:val="000000" w:themeColor="text1"/>
+        </w:rPr>
+        <w:t>.1 Onderzoeksvraag 1: Minimale basisfunctionaliteit</w:t>
       </w:r>
       <w:bookmarkEnd w:id="79"/>
     </w:p>
@@ -20944,6 +21194,30 @@
     </w:p>
     <w:p>
       <w:pPr>
+        <w:spacing w:afterLines="24" w:after="57" w:line="288" w:lineRule="auto"/>
+        <w:rPr>
+          <w:color w:val="000000" w:themeColor="text1"/>
+        </w:rPr>
+      </w:pPr>
+      <w:r>
+        <w:rPr>
+          <w:color w:val="000000" w:themeColor="text1"/>
+        </w:rPr>
+        <w:t>De basisversie (versie 1) ondersteunt essentiële taken zoals node-creatie, uitklappen/inklappen en zoeken, wat noodzakelijk is voor het opbouwen van Fortunately-Unfortunately trees. Echter, de negatieve UEQ-scores op efficiëntie, stimulatie en originaliteit tonen aan dat deze functionaliteit alleen ontoereikend is voor soepele threat modeling zonder security-expertise. Dit sluit aan bij de literatuur over drempels in threat modeling, waar generieke tools cognitieve belasting verhogen door gebrek aan domeinspecifieke ondersteuning.</w:t>
+      </w:r>
+    </w:p>
+    <w:p>
+      <w:pPr>
+        <w:spacing w:afterLines="24" w:after="57" w:line="288" w:lineRule="auto"/>
+        <w:rPr>
+          <w:b/>
+          <w:bCs/>
+          <w:color w:val="000000" w:themeColor="text1"/>
+        </w:rPr>
+      </w:pPr>
+    </w:p>
+    <w:p>
+      <w:pPr>
         <w:pStyle w:val="Kop3"/>
         <w:rPr>
           <w:b/>
@@ -20951,13 +21225,14 @@
           <w:color w:val="000000" w:themeColor="text1"/>
         </w:rPr>
       </w:pPr>
-      <w:bookmarkStart w:id="80" w:name="_Toc219064452"/>
-      <w:r>
-        <w:rPr>
-          <w:b/>
-          <w:bCs/>
-          <w:color w:val="000000" w:themeColor="text1"/>
-        </w:rPr>
+      <w:bookmarkStart w:id="80" w:name="_Toc219313900"/>
+      <w:r>
+        <w:rPr>
+          <w:b/>
+          <w:bCs/>
+          <w:color w:val="000000" w:themeColor="text1"/>
+        </w:rPr>
+        <w:lastRenderedPageBreak/>
         <w:t>5.</w:t>
       </w:r>
       <w:r>
@@ -20966,15 +21241,15 @@
           <w:bCs/>
           <w:color w:val="000000" w:themeColor="text1"/>
         </w:rPr>
-        <w:t>8</w:t>
-      </w:r>
-      <w:r>
-        <w:rPr>
-          <w:b/>
-          <w:bCs/>
-          <w:color w:val="000000" w:themeColor="text1"/>
-        </w:rPr>
-        <w:t>.1 Onderzoeksvraag 1: Minimale basisfunctionaliteit</w:t>
+        <w:t>7</w:t>
+      </w:r>
+      <w:r>
+        <w:rPr>
+          <w:b/>
+          <w:bCs/>
+          <w:color w:val="000000" w:themeColor="text1"/>
+        </w:rPr>
+        <w:t>.2 Onderzoeksvraag 2: Meest nuttige extra functies</w:t>
       </w:r>
       <w:bookmarkEnd w:id="80"/>
     </w:p>
@@ -20999,14 +21274,7 @@
         <w:rPr>
           <w:color w:val="000000" w:themeColor="text1"/>
         </w:rPr>
-        <w:t xml:space="preserve">De basisversie (versie 1) ondersteunt essentiële taken zoals node-creatie, uitklappen/inklappen en zoeken, wat noodzakelijk is voor het opbouwen van Fortunately-Unfortunately trees. Echter, de negatieve UEQ-scores op efficiëntie, </w:t>
-      </w:r>
-      <w:r>
-        <w:rPr>
-          <w:color w:val="000000" w:themeColor="text1"/>
-        </w:rPr>
-        <w:lastRenderedPageBreak/>
-        <w:t>stimulatie en originaliteit tonen aan dat deze functionaliteit alleen ontoereikend is voor soepele threat modeling zonder security-expertise. Dit sluit aan bij de literatuur over drempels in threat modeling, waar generieke tools cognitieve belasting verhogen door gebrek aan domeinspecifieke ondersteuning.</w:t>
+        <w:t>Filtering op node-status scoort consequent als meest nuttig (meerdere rang 1), gevolgd door node-tellingen per status en highlighting vanuit de filterbalk. Visuele hulpmiddelen zoals kleurcodering en iconen (schilden) worden hoog gewaardeerd voor overzicht, terwijl tooltips en branch-samenvattingen lager scoren maar nog steeds positief bijdragen aan navigatie. Deze voorkeur bevestigt dat pragmatische features (zoeken, sorteren) voorop staan bij complexe hirarchische data, in lijn met Nielsen's heuristieken voor flexibiliteit en herkenning.</w:t>
       </w:r>
     </w:p>
     <w:p>
@@ -21038,7 +21306,7 @@
           <w:color w:val="000000" w:themeColor="text1"/>
         </w:rPr>
       </w:pPr>
-      <w:bookmarkStart w:id="81" w:name="_Toc219064453"/>
+      <w:bookmarkStart w:id="81" w:name="_Toc219313901"/>
       <w:r>
         <w:rPr>
           <w:b/>
@@ -21053,97 +21321,25 @@
           <w:bCs/>
           <w:color w:val="000000" w:themeColor="text1"/>
         </w:rPr>
-        <w:t>8</w:t>
-      </w:r>
-      <w:r>
-        <w:rPr>
-          <w:b/>
-          <w:bCs/>
-          <w:color w:val="000000" w:themeColor="text1"/>
-        </w:rPr>
-        <w:t>.2 Onderzoeksvraag 2: Meest nuttige extra functies</w:t>
+        <w:t>7</w:t>
+      </w:r>
+      <w:r>
+        <w:rPr>
+          <w:b/>
+          <w:bCs/>
+          <w:color w:val="000000" w:themeColor="text1"/>
+        </w:rPr>
+        <w:t xml:space="preserve">.3 Onderzoeksvraag 3: </w:t>
+      </w:r>
+      <w:r>
+        <w:rPr>
+          <w:b/>
+          <w:bCs/>
+          <w:color w:val="000000" w:themeColor="text1"/>
+        </w:rPr>
+        <w:t>Gebruiksvriendelijkheid en effectiviteit ten opzichte van de basisversie</w:t>
       </w:r>
       <w:bookmarkEnd w:id="81"/>
-    </w:p>
-    <w:p>
-      <w:pPr>
-        <w:spacing w:afterLines="24" w:after="57" w:line="288" w:lineRule="auto"/>
-        <w:rPr>
-          <w:b/>
-          <w:bCs/>
-          <w:color w:val="000000" w:themeColor="text1"/>
-        </w:rPr>
-      </w:pPr>
-    </w:p>
-    <w:p>
-      <w:pPr>
-        <w:spacing w:afterLines="24" w:after="57" w:line="288" w:lineRule="auto"/>
-        <w:rPr>
-          <w:color w:val="000000" w:themeColor="text1"/>
-        </w:rPr>
-      </w:pPr>
-      <w:r>
-        <w:rPr>
-          <w:color w:val="000000" w:themeColor="text1"/>
-        </w:rPr>
-        <w:t>Filtering op node-status scoort consequent als meest nuttig (meerdere rang 1), gevolgd door node-tellingen per status en highlighting vanuit de filterbalk. Visuele hulpmiddelen zoals kleurcodering en iconen (schilden) worden hoog gewaardeerd voor overzicht, terwijl tooltips en branch-samenvattingen lager scoren maar nog steeds positief bijdragen aan navigatie. Deze voorkeur bevestigt dat pragmatische features (zoeken, sorteren) voorop staan bij complexe hirarchische data, in lijn met Nielsen's heuristieken voor flexibiliteit en herkenning.</w:t>
-      </w:r>
-    </w:p>
-    <w:p>
-      <w:pPr>
-        <w:spacing w:afterLines="24" w:after="57" w:line="288" w:lineRule="auto"/>
-        <w:rPr>
-          <w:b/>
-          <w:bCs/>
-          <w:color w:val="000000" w:themeColor="text1"/>
-        </w:rPr>
-      </w:pPr>
-    </w:p>
-    <w:p>
-      <w:pPr>
-        <w:spacing w:afterLines="24" w:after="57" w:line="288" w:lineRule="auto"/>
-        <w:rPr>
-          <w:b/>
-          <w:bCs/>
-          <w:color w:val="000000" w:themeColor="text1"/>
-        </w:rPr>
-      </w:pPr>
-    </w:p>
-    <w:p>
-      <w:pPr>
-        <w:pStyle w:val="Kop3"/>
-        <w:rPr>
-          <w:b/>
-          <w:bCs/>
-          <w:color w:val="000000" w:themeColor="text1"/>
-        </w:rPr>
-      </w:pPr>
-      <w:bookmarkStart w:id="82" w:name="_Toc219064454"/>
-      <w:r>
-        <w:rPr>
-          <w:b/>
-          <w:bCs/>
-          <w:color w:val="000000" w:themeColor="text1"/>
-        </w:rPr>
-        <w:t>5.</w:t>
-      </w:r>
-      <w:r>
-        <w:rPr>
-          <w:b/>
-          <w:bCs/>
-          <w:color w:val="000000" w:themeColor="text1"/>
-        </w:rPr>
-        <w:t>8</w:t>
-      </w:r>
-      <w:r>
-        <w:rPr>
-          <w:b/>
-          <w:bCs/>
-          <w:color w:val="000000" w:themeColor="text1"/>
-        </w:rPr>
-        <w:t>.3 Onderzoeksvraag 3: Vergelijking met een basisversie</w:t>
-      </w:r>
-      <w:bookmarkEnd w:id="82"/>
     </w:p>
     <w:p>
       <w:pPr>
@@ -21237,7 +21433,7 @@
           <w:color w:val="000000" w:themeColor="text1"/>
         </w:rPr>
       </w:pPr>
-      <w:bookmarkStart w:id="83" w:name="_Toc219064455"/>
+      <w:bookmarkStart w:id="82" w:name="_Toc219313902"/>
       <w:r>
         <w:rPr>
           <w:rFonts w:asciiTheme="minorHAnsi" w:hAnsiTheme="minorHAnsi"/>
@@ -21247,95 +21443,95 @@
         </w:rPr>
         <w:t>Discussie</w:t>
       </w:r>
+      <w:bookmarkEnd w:id="82"/>
+    </w:p>
+    <w:p>
+      <w:pPr>
+        <w:spacing w:afterLines="24" w:after="57" w:line="288" w:lineRule="auto"/>
+        <w:rPr>
+          <w:rFonts w:eastAsia="Times New Roman" w:cs="Times New Roman"/>
+          <w:color w:val="000000" w:themeColor="text1"/>
+          <w:kern w:val="0"/>
+          <w:lang w:eastAsia="nl-BE"/>
+          <w14:ligatures w14:val="none"/>
+        </w:rPr>
+      </w:pPr>
+    </w:p>
+    <w:p>
+      <w:pPr>
+        <w:spacing w:afterLines="24" w:after="57" w:line="288" w:lineRule="auto"/>
+        <w:rPr>
+          <w:rFonts w:eastAsia="Times New Roman" w:cs="Times New Roman"/>
+          <w:color w:val="000000" w:themeColor="text1"/>
+          <w:kern w:val="0"/>
+          <w:lang w:eastAsia="nl-BE"/>
+          <w14:ligatures w14:val="none"/>
+        </w:rPr>
+      </w:pPr>
+    </w:p>
+    <w:p>
+      <w:pPr>
+        <w:pStyle w:val="Kop2"/>
+        <w:rPr>
+          <w:rFonts w:asciiTheme="minorHAnsi" w:eastAsia="Times New Roman" w:hAnsiTheme="minorHAnsi"/>
+          <w:b/>
+          <w:bCs/>
+          <w:color w:val="000000" w:themeColor="text1"/>
+          <w:lang w:eastAsia="nl-BE"/>
+        </w:rPr>
+      </w:pPr>
+      <w:bookmarkStart w:id="83" w:name="_Toc219313903"/>
+      <w:r>
+        <w:rPr>
+          <w:rFonts w:asciiTheme="minorHAnsi" w:eastAsia="Times New Roman" w:hAnsiTheme="minorHAnsi"/>
+          <w:b/>
+          <w:bCs/>
+          <w:color w:val="000000" w:themeColor="text1"/>
+          <w:lang w:eastAsia="nl-BE"/>
+        </w:rPr>
+        <w:t>6</w:t>
+      </w:r>
+      <w:r>
+        <w:rPr>
+          <w:rFonts w:asciiTheme="minorHAnsi" w:eastAsia="Times New Roman" w:hAnsiTheme="minorHAnsi"/>
+          <w:b/>
+          <w:bCs/>
+          <w:color w:val="000000" w:themeColor="text1"/>
+          <w:lang w:eastAsia="nl-BE"/>
+        </w:rPr>
+        <w:t>.</w:t>
+      </w:r>
+      <w:r>
+        <w:rPr>
+          <w:rFonts w:asciiTheme="minorHAnsi" w:eastAsia="Times New Roman" w:hAnsiTheme="minorHAnsi"/>
+          <w:b/>
+          <w:bCs/>
+          <w:color w:val="000000" w:themeColor="text1"/>
+          <w:lang w:eastAsia="nl-BE"/>
+        </w:rPr>
+        <w:t>1</w:t>
+      </w:r>
+      <w:r>
+        <w:rPr>
+          <w:rFonts w:asciiTheme="minorHAnsi" w:eastAsia="Times New Roman" w:hAnsiTheme="minorHAnsi"/>
+          <w:b/>
+          <w:bCs/>
+          <w:color w:val="000000" w:themeColor="text1"/>
+          <w:lang w:eastAsia="nl-BE"/>
+        </w:rPr>
+        <w:t xml:space="preserve"> </w:t>
+      </w:r>
+      <w:r>
+        <w:rPr>
+          <w:rFonts w:asciiTheme="minorHAnsi" w:eastAsia="Times New Roman" w:hAnsiTheme="minorHAnsi"/>
+          <w:b/>
+          <w:bCs/>
+          <w:color w:val="000000" w:themeColor="text1"/>
+          <w:lang w:eastAsia="nl-BE"/>
+        </w:rPr>
+        <w:t>Relatie met literatuur en theorie</w:t>
+      </w:r>
       <w:bookmarkEnd w:id="83"/>
-    </w:p>
-    <w:p>
-      <w:pPr>
-        <w:spacing w:afterLines="24" w:after="57" w:line="288" w:lineRule="auto"/>
-        <w:rPr>
-          <w:rFonts w:eastAsia="Times New Roman" w:cs="Times New Roman"/>
-          <w:color w:val="000000" w:themeColor="text1"/>
-          <w:kern w:val="0"/>
-          <w:lang w:eastAsia="nl-BE"/>
-          <w14:ligatures w14:val="none"/>
-        </w:rPr>
-      </w:pPr>
-    </w:p>
-    <w:p>
-      <w:pPr>
-        <w:spacing w:afterLines="24" w:after="57" w:line="288" w:lineRule="auto"/>
-        <w:rPr>
-          <w:rFonts w:eastAsia="Times New Roman" w:cs="Times New Roman"/>
-          <w:color w:val="000000" w:themeColor="text1"/>
-          <w:kern w:val="0"/>
-          <w:lang w:eastAsia="nl-BE"/>
-          <w14:ligatures w14:val="none"/>
-        </w:rPr>
-      </w:pPr>
-    </w:p>
-    <w:p>
-      <w:pPr>
-        <w:pStyle w:val="Kop2"/>
-        <w:rPr>
-          <w:rFonts w:asciiTheme="minorHAnsi" w:eastAsia="Times New Roman" w:hAnsiTheme="minorHAnsi"/>
-          <w:b/>
-          <w:bCs/>
-          <w:color w:val="000000" w:themeColor="text1"/>
-          <w:lang w:eastAsia="nl-BE"/>
-        </w:rPr>
-      </w:pPr>
-      <w:bookmarkStart w:id="84" w:name="_Toc219064456"/>
-      <w:r>
-        <w:rPr>
-          <w:rFonts w:asciiTheme="minorHAnsi" w:eastAsia="Times New Roman" w:hAnsiTheme="minorHAnsi"/>
-          <w:b/>
-          <w:bCs/>
-          <w:color w:val="000000" w:themeColor="text1"/>
-          <w:lang w:eastAsia="nl-BE"/>
-        </w:rPr>
-        <w:t>6</w:t>
-      </w:r>
-      <w:r>
-        <w:rPr>
-          <w:rFonts w:asciiTheme="minorHAnsi" w:eastAsia="Times New Roman" w:hAnsiTheme="minorHAnsi"/>
-          <w:b/>
-          <w:bCs/>
-          <w:color w:val="000000" w:themeColor="text1"/>
-          <w:lang w:eastAsia="nl-BE"/>
-        </w:rPr>
-        <w:t>.</w:t>
-      </w:r>
-      <w:r>
-        <w:rPr>
-          <w:rFonts w:asciiTheme="minorHAnsi" w:eastAsia="Times New Roman" w:hAnsiTheme="minorHAnsi"/>
-          <w:b/>
-          <w:bCs/>
-          <w:color w:val="000000" w:themeColor="text1"/>
-          <w:lang w:eastAsia="nl-BE"/>
-        </w:rPr>
-        <w:t>1</w:t>
-      </w:r>
-      <w:r>
-        <w:rPr>
-          <w:rFonts w:asciiTheme="minorHAnsi" w:eastAsia="Times New Roman" w:hAnsiTheme="minorHAnsi"/>
-          <w:b/>
-          <w:bCs/>
-          <w:color w:val="000000" w:themeColor="text1"/>
-          <w:lang w:eastAsia="nl-BE"/>
-        </w:rPr>
-        <w:t xml:space="preserve"> </w:t>
-      </w:r>
-      <w:r>
-        <w:rPr>
-          <w:rFonts w:asciiTheme="minorHAnsi" w:eastAsia="Times New Roman" w:hAnsiTheme="minorHAnsi"/>
-          <w:b/>
-          <w:bCs/>
-          <w:color w:val="000000" w:themeColor="text1"/>
-          <w:lang w:eastAsia="nl-BE"/>
-        </w:rPr>
-        <w:t>Relatie met literatuur en theorie</w:t>
-      </w:r>
-      <w:bookmarkEnd w:id="84"/>
     </w:p>
     <w:p>
       <w:pPr>
@@ -21745,7 +21941,7 @@
           <w:lang w:eastAsia="nl-BE"/>
           <w14:ligatures w14:val="none"/>
         </w:rPr>
-        <w:t>baseline.[</w:t>
+        <w:t>baseline[</w:t>
       </w:r>
       <w:r>
         <w:rPr>
@@ -21767,10 +21963,7 @@
         </w:rPr>
         <w:t>]</w:t>
       </w:r>
-    </w:p>
-    <w:p>
-      <w:pPr>
-        <w:spacing w:afterLines="24" w:after="57" w:line="288" w:lineRule="auto"/>
+      <w:r>
         <w:rPr>
           <w:rFonts w:eastAsia="Times New Roman" w:cs="Times New Roman"/>
           <w:color w:val="000000" w:themeColor="text1"/>
@@ -21778,7 +21971,8 @@
           <w:lang w:eastAsia="nl-BE"/>
           <w14:ligatures w14:val="none"/>
         </w:rPr>
-      </w:pPr>
+        <w:t>.</w:t>
+      </w:r>
     </w:p>
     <w:p>
       <w:pPr>
@@ -21791,7 +21985,10 @@
           <w14:ligatures w14:val="none"/>
         </w:rPr>
       </w:pPr>
-      <w:r>
+    </w:p>
+    <w:p>
+      <w:pPr>
+        <w:spacing w:afterLines="24" w:after="57" w:line="288" w:lineRule="auto"/>
         <w:rPr>
           <w:rFonts w:eastAsia="Times New Roman" w:cs="Times New Roman"/>
           <w:color w:val="000000" w:themeColor="text1"/>
@@ -21799,6 +21996,15 @@
           <w:lang w:eastAsia="nl-BE"/>
           <w14:ligatures w14:val="none"/>
         </w:rPr>
+      </w:pPr>
+      <w:r>
+        <w:rPr>
+          <w:rFonts w:eastAsia="Times New Roman" w:cs="Times New Roman"/>
+          <w:color w:val="000000" w:themeColor="text1"/>
+          <w:kern w:val="0"/>
+          <w:lang w:eastAsia="nl-BE"/>
+          <w14:ligatures w14:val="none"/>
+        </w:rPr>
         <w:t>Vanuit de treemap</w:t>
       </w:r>
       <w:r>
@@ -22049,7 +22255,7 @@
           <w:lang w:eastAsia="nl-BE"/>
           <w14:ligatures w14:val="none"/>
         </w:rPr>
-        <w:t>ontwerpargumentatie.[</w:t>
+        <w:t>ontwerpargumentatie</w:t>
       </w:r>
       <w:r>
         <w:rPr>
@@ -22059,6 +22265,16 @@
           <w:lang w:eastAsia="nl-BE"/>
           <w14:ligatures w14:val="none"/>
         </w:rPr>
+        <w:t>[</w:t>
+      </w:r>
+      <w:r>
+        <w:rPr>
+          <w:rFonts w:eastAsia="Times New Roman" w:cs="Times New Roman"/>
+          <w:color w:val="000000" w:themeColor="text1"/>
+          <w:kern w:val="0"/>
+          <w:lang w:eastAsia="nl-BE"/>
+          <w14:ligatures w14:val="none"/>
+        </w:rPr>
         <w:t>5</w:t>
       </w:r>
       <w:r>
@@ -22070,6 +22286,16 @@
           <w14:ligatures w14:val="none"/>
         </w:rPr>
         <w:t>]</w:t>
+      </w:r>
+      <w:r>
+        <w:rPr>
+          <w:rFonts w:eastAsia="Times New Roman" w:cs="Times New Roman"/>
+          <w:color w:val="000000" w:themeColor="text1"/>
+          <w:kern w:val="0"/>
+          <w:lang w:eastAsia="nl-BE"/>
+          <w14:ligatures w14:val="none"/>
+        </w:rPr>
+        <w:t>.</w:t>
       </w:r>
     </w:p>
     <w:p>
@@ -22374,7 +22600,7 @@
           <w:lang w:eastAsia="nl-BE"/>
           <w14:ligatures w14:val="none"/>
         </w:rPr>
-        <w:t>visualisaties voor een breder publiek.[</w:t>
+        <w:t>visualisaties voor een breder publiek[</w:t>
       </w:r>
       <w:r>
         <w:rPr>
@@ -22415,6 +22641,16 @@
           <w14:ligatures w14:val="none"/>
         </w:rPr>
         <w:t>]</w:t>
+      </w:r>
+      <w:r>
+        <w:rPr>
+          <w:rFonts w:eastAsia="Times New Roman" w:cs="Times New Roman"/>
+          <w:color w:val="000000" w:themeColor="text1"/>
+          <w:kern w:val="0"/>
+          <w:lang w:eastAsia="nl-BE"/>
+          <w14:ligatures w14:val="none"/>
+        </w:rPr>
+        <w:t>.</w:t>
       </w:r>
     </w:p>
     <w:p>
@@ -22460,7 +22696,7 @@
           <w:lang w:eastAsia="nl-BE"/>
         </w:rPr>
       </w:pPr>
-      <w:bookmarkStart w:id="85" w:name="_Toc219064457"/>
+      <w:bookmarkStart w:id="84" w:name="_Toc219313904"/>
       <w:r>
         <w:rPr>
           <w:rFonts w:asciiTheme="minorHAnsi" w:eastAsia="Times New Roman" w:hAnsiTheme="minorHAnsi"/>
@@ -22511,7 +22747,7 @@
         </w:rPr>
         <w:t>Beperkingen van het onderzoek</w:t>
       </w:r>
-      <w:bookmarkEnd w:id="85"/>
+      <w:bookmarkEnd w:id="84"/>
     </w:p>
     <w:p>
       <w:pPr>
@@ -22539,12 +22775,24 @@
       <w:r>
         <w:rPr>
           <w:rFonts w:eastAsia="Times New Roman" w:cs="Times New Roman"/>
+          <w:b/>
+          <w:bCs/>
           <w:color w:val="000000" w:themeColor="text1"/>
           <w:kern w:val="0"/>
           <w:lang w:eastAsia="nl-BE"/>
           <w14:ligatures w14:val="none"/>
         </w:rPr>
-        <w:t>Kleine steekproef en populatie. De steekproef is klein (9 deelnemers), waardoor de statistische kracht en externe validiteit beperkt zijn en conclusies enkel voorzichtig kunnen worden veralgemeend naar gelijkaardige profielen (ontwikkelaars met informatica</w:t>
+        <w:t>Kleine steekproef en populatie.</w:t>
+      </w:r>
+      <w:r>
+        <w:rPr>
+          <w:rFonts w:eastAsia="Times New Roman" w:cs="Times New Roman"/>
+          <w:color w:val="000000" w:themeColor="text1"/>
+          <w:kern w:val="0"/>
+          <w:lang w:eastAsia="nl-BE"/>
+          <w14:ligatures w14:val="none"/>
+        </w:rPr>
+        <w:t> De steekproef is klein (9 deelnemers), waardoor de statistische kracht en externe validiteit beperkt zijn en conclusies enkel voorzichtig kunnen worden veralgemeend naar gelijkaardige profielen (ontwikkelaars met informatica</w:t>
       </w:r>
       <w:r>
         <w:rPr>
@@ -22604,12 +22852,24 @@
       <w:r>
         <w:rPr>
           <w:rFonts w:eastAsia="Times New Roman" w:cs="Times New Roman"/>
+          <w:b/>
+          <w:bCs/>
           <w:color w:val="000000" w:themeColor="text1"/>
           <w:kern w:val="0"/>
           <w:lang w:eastAsia="nl-BE"/>
           <w14:ligatures w14:val="none"/>
         </w:rPr>
-        <w:t>Zelfrapportage en bias. Het gebruik van UEQ</w:t>
+        <w:t>Zelfrapportage en bias.</w:t>
+      </w:r>
+      <w:r>
+        <w:rPr>
+          <w:rFonts w:eastAsia="Times New Roman" w:cs="Times New Roman"/>
+          <w:color w:val="000000" w:themeColor="text1"/>
+          <w:kern w:val="0"/>
+          <w:lang w:eastAsia="nl-BE"/>
+          <w14:ligatures w14:val="none"/>
+        </w:rPr>
+        <w:t> Het gebruik van UEQ</w:t>
       </w:r>
       <w:r>
         <w:rPr>
@@ -22662,12 +22922,24 @@
       <w:r>
         <w:rPr>
           <w:rFonts w:eastAsia="Times New Roman" w:cs="Times New Roman"/>
+          <w:b/>
+          <w:bCs/>
           <w:color w:val="000000" w:themeColor="text1"/>
           <w:kern w:val="0"/>
           <w:lang w:eastAsia="nl-BE"/>
           <w14:ligatures w14:val="none"/>
         </w:rPr>
-        <w:t>Beperkte vergelijkingsbasis en duur. De studie vergelijkt de prototype</w:t>
+        <w:t>Beperkte vergelijkingsbasis en duur.</w:t>
+      </w:r>
+      <w:r>
+        <w:rPr>
+          <w:rFonts w:eastAsia="Times New Roman" w:cs="Times New Roman"/>
+          <w:color w:val="000000" w:themeColor="text1"/>
+          <w:kern w:val="0"/>
+          <w:lang w:eastAsia="nl-BE"/>
+          <w14:ligatures w14:val="none"/>
+        </w:rPr>
+        <w:t> De studie vergelijkt de prototype</w:t>
       </w:r>
       <w:r>
         <w:rPr>
@@ -22740,7 +23012,7 @@
           <w:lang w:eastAsia="nl-BE"/>
         </w:rPr>
       </w:pPr>
-      <w:bookmarkStart w:id="86" w:name="_Toc219064458"/>
+      <w:bookmarkStart w:id="85" w:name="_Toc219313905"/>
       <w:r>
         <w:rPr>
           <w:rFonts w:asciiTheme="minorHAnsi" w:eastAsia="Times New Roman" w:hAnsiTheme="minorHAnsi"/>
@@ -22791,7 +23063,7 @@
         </w:rPr>
         <w:t>Implicaties voor theorie en praktijk</w:t>
       </w:r>
-      <w:bookmarkEnd w:id="86"/>
+      <w:bookmarkEnd w:id="85"/>
     </w:p>
     <w:p>
       <w:pPr>
@@ -23088,7 +23360,7 @@
           <w:lang w:eastAsia="nl-BE"/>
         </w:rPr>
       </w:pPr>
-      <w:bookmarkStart w:id="87" w:name="_Toc219064459"/>
+      <w:bookmarkStart w:id="86" w:name="_Toc219313906"/>
       <w:r>
         <w:rPr>
           <w:rFonts w:asciiTheme="minorHAnsi" w:eastAsia="Times New Roman" w:hAnsiTheme="minorHAnsi"/>
@@ -23140,7 +23412,7 @@
         </w:rPr>
         <w:t>Aanbevelingen voor toekomstig onderzoek</w:t>
       </w:r>
-      <w:bookmarkEnd w:id="87"/>
+      <w:bookmarkEnd w:id="86"/>
     </w:p>
     <w:p>
       <w:pPr>
@@ -23472,7 +23744,7 @@
           <w:color w:val="000000" w:themeColor="text1"/>
         </w:rPr>
       </w:pPr>
-      <w:bookmarkStart w:id="88" w:name="_Toc219064460"/>
+      <w:bookmarkStart w:id="87" w:name="_Toc219313907"/>
       <w:r>
         <w:rPr>
           <w:rFonts w:asciiTheme="minorHAnsi" w:hAnsiTheme="minorHAnsi"/>
@@ -23482,7 +23754,7 @@
         </w:rPr>
         <w:t>Conclusie</w:t>
       </w:r>
-      <w:bookmarkEnd w:id="88"/>
+      <w:bookmarkEnd w:id="87"/>
     </w:p>
     <w:p>
       <w:pPr>
@@ -23848,7 +24120,19 @@
         <w:rPr>
           <w:color w:val="000000" w:themeColor="text1"/>
         </w:rPr>
-        <w:t>Overkoepelend voldoet de tool in belangrijke mate aan bekende usability</w:t>
+        <w:t xml:space="preserve">Overkoepelend voldoet de tool in </w:t>
+      </w:r>
+      <w:r>
+        <w:rPr>
+          <w:color w:val="000000" w:themeColor="text1"/>
+        </w:rPr>
+        <w:t>aanzienlijke</w:t>
+      </w:r>
+      <w:r>
+        <w:rPr>
+          <w:color w:val="000000" w:themeColor="text1"/>
+        </w:rPr>
+        <w:t xml:space="preserve"> mate aan bekende usability</w:t>
       </w:r>
       <w:r>
         <w:rPr>
@@ -23982,7 +24266,7 @@
           <w:lang w:val="en-US"/>
         </w:rPr>
       </w:pPr>
-      <w:bookmarkStart w:id="89" w:name="_Toc219064461"/>
+      <w:bookmarkStart w:id="88" w:name="_Toc219313908"/>
       <w:r>
         <w:rPr>
           <w:rFonts w:asciiTheme="minorHAnsi" w:hAnsiTheme="minorHAnsi"/>
@@ -23994,7 +24278,7 @@
         <w:lastRenderedPageBreak/>
         <w:t>Referentielijst</w:t>
       </w:r>
-      <w:bookmarkEnd w:id="89"/>
+      <w:bookmarkEnd w:id="88"/>
     </w:p>
     <w:p>
       <w:pPr>

</xml_diff>

<commit_message>
updated inhoudstabel and list of figures
</commit_message>
<xml_diff>
--- a/Master_scriptie_tekst.docx
+++ b/Master_scriptie_tekst.docx
@@ -12,7 +12,7 @@
           <w:color w:val="000000" w:themeColor="text1"/>
         </w:rPr>
       </w:pPr>
-      <w:bookmarkStart w:id="0" w:name="_Toc219557450"/>
+      <w:bookmarkStart w:id="0" w:name="_Toc219558576"/>
       <w:r>
         <w:rPr>
           <w:rFonts w:asciiTheme="minorHAnsi" w:hAnsiTheme="minorHAnsi"/>
@@ -154,7 +154,7 @@
             </w:rPr>
             <w:fldChar w:fldCharType="separate"/>
           </w:r>
-          <w:hyperlink w:anchor="_Toc219557450" w:history="1">
+          <w:hyperlink w:anchor="_Toc219558576" w:history="1">
             <w:r>
               <w:rPr>
                 <w:rStyle w:val="Hyperlink"/>
@@ -183,7 +183,7 @@
                 <w:noProof/>
                 <w:webHidden/>
               </w:rPr>
-              <w:instrText xml:space="preserve"> PAGEREF _Toc219557450 \h </w:instrText>
+              <w:instrText xml:space="preserve"> PAGEREF _Toc219558576 \h </w:instrText>
             </w:r>
             <w:r>
               <w:rPr>
@@ -226,7 +226,7 @@
               <w:lang w:eastAsia="nl-BE"/>
             </w:rPr>
           </w:pPr>
-          <w:hyperlink w:anchor="_Toc219557451" w:history="1">
+          <w:hyperlink w:anchor="_Toc219558577" w:history="1">
             <w:r>
               <w:rPr>
                 <w:rStyle w:val="Hyperlink"/>
@@ -255,7 +255,7 @@
                 <w:noProof/>
                 <w:webHidden/>
               </w:rPr>
-              <w:instrText xml:space="preserve"> PAGEREF _Toc219557451 \h </w:instrText>
+              <w:instrText xml:space="preserve"> PAGEREF _Toc219558577 \h </w:instrText>
             </w:r>
             <w:r>
               <w:rPr>
@@ -298,7 +298,7 @@
               <w:lang w:eastAsia="nl-BE"/>
             </w:rPr>
           </w:pPr>
-          <w:hyperlink w:anchor="_Toc219557452" w:history="1">
+          <w:hyperlink w:anchor="_Toc219558578" w:history="1">
             <w:r>
               <w:rPr>
                 <w:rStyle w:val="Hyperlink"/>
@@ -327,7 +327,7 @@
                 <w:noProof/>
                 <w:webHidden/>
               </w:rPr>
-              <w:instrText xml:space="preserve"> PAGEREF _Toc219557452 \h </w:instrText>
+              <w:instrText xml:space="preserve"> PAGEREF _Toc219558578 \h </w:instrText>
             </w:r>
             <w:r>
               <w:rPr>
@@ -370,7 +370,7 @@
               <w:lang w:eastAsia="nl-BE"/>
             </w:rPr>
           </w:pPr>
-          <w:hyperlink w:anchor="_Toc219557453" w:history="1">
+          <w:hyperlink w:anchor="_Toc219558579" w:history="1">
             <w:r>
               <w:rPr>
                 <w:rStyle w:val="Hyperlink"/>
@@ -400,7 +400,7 @@
                 <w:noProof/>
                 <w:webHidden/>
               </w:rPr>
-              <w:instrText xml:space="preserve"> PAGEREF _Toc219557453 \h </w:instrText>
+              <w:instrText xml:space="preserve"> PAGEREF _Toc219558579 \h </w:instrText>
             </w:r>
             <w:r>
               <w:rPr>
@@ -443,7 +443,7 @@
               <w:lang w:eastAsia="nl-BE"/>
             </w:rPr>
           </w:pPr>
-          <w:hyperlink w:anchor="_Toc219557454" w:history="1">
+          <w:hyperlink w:anchor="_Toc219558580" w:history="1">
             <w:r>
               <w:rPr>
                 <w:rStyle w:val="Hyperlink"/>
@@ -472,7 +472,7 @@
                 <w:noProof/>
                 <w:webHidden/>
               </w:rPr>
-              <w:instrText xml:space="preserve"> PAGEREF _Toc219557454 \h </w:instrText>
+              <w:instrText xml:space="preserve"> PAGEREF _Toc219558580 \h </w:instrText>
             </w:r>
             <w:r>
               <w:rPr>
@@ -515,7 +515,7 @@
               <w:lang w:eastAsia="nl-BE"/>
             </w:rPr>
           </w:pPr>
-          <w:hyperlink w:anchor="_Toc219557455" w:history="1">
+          <w:hyperlink w:anchor="_Toc219558581" w:history="1">
             <w:r>
               <w:rPr>
                 <w:rStyle w:val="Hyperlink"/>
@@ -544,7 +544,7 @@
                 <w:noProof/>
                 <w:webHidden/>
               </w:rPr>
-              <w:instrText xml:space="preserve"> PAGEREF _Toc219557455 \h </w:instrText>
+              <w:instrText xml:space="preserve"> PAGEREF _Toc219558581 \h </w:instrText>
             </w:r>
             <w:r>
               <w:rPr>
@@ -587,7 +587,7 @@
               <w:lang w:eastAsia="nl-BE"/>
             </w:rPr>
           </w:pPr>
-          <w:hyperlink w:anchor="_Toc219557456" w:history="1">
+          <w:hyperlink w:anchor="_Toc219558582" w:history="1">
             <w:r>
               <w:rPr>
                 <w:rStyle w:val="Hyperlink"/>
@@ -616,7 +616,7 @@
                 <w:noProof/>
                 <w:webHidden/>
               </w:rPr>
-              <w:instrText xml:space="preserve"> PAGEREF _Toc219557456 \h </w:instrText>
+              <w:instrText xml:space="preserve"> PAGEREF _Toc219558582 \h </w:instrText>
             </w:r>
             <w:r>
               <w:rPr>
@@ -659,7 +659,7 @@
               <w:lang w:eastAsia="nl-BE"/>
             </w:rPr>
           </w:pPr>
-          <w:hyperlink w:anchor="_Toc219557457" w:history="1">
+          <w:hyperlink w:anchor="_Toc219558583" w:history="1">
             <w:r>
               <w:rPr>
                 <w:rStyle w:val="Hyperlink"/>
@@ -688,7 +688,7 @@
                 <w:noProof/>
                 <w:webHidden/>
               </w:rPr>
-              <w:instrText xml:space="preserve"> PAGEREF _Toc219557457 \h </w:instrText>
+              <w:instrText xml:space="preserve"> PAGEREF _Toc219558583 \h </w:instrText>
             </w:r>
             <w:r>
               <w:rPr>
@@ -731,7 +731,7 @@
               <w:lang w:eastAsia="nl-BE"/>
             </w:rPr>
           </w:pPr>
-          <w:hyperlink w:anchor="_Toc219557458" w:history="1">
+          <w:hyperlink w:anchor="_Toc219558584" w:history="1">
             <w:r>
               <w:rPr>
                 <w:rStyle w:val="Hyperlink"/>
@@ -760,7 +760,7 @@
                 <w:noProof/>
                 <w:webHidden/>
               </w:rPr>
-              <w:instrText xml:space="preserve"> PAGEREF _Toc219557458 \h </w:instrText>
+              <w:instrText xml:space="preserve"> PAGEREF _Toc219558584 \h </w:instrText>
             </w:r>
             <w:r>
               <w:rPr>
@@ -803,7 +803,7 @@
               <w:lang w:eastAsia="nl-BE"/>
             </w:rPr>
           </w:pPr>
-          <w:hyperlink w:anchor="_Toc219557459" w:history="1">
+          <w:hyperlink w:anchor="_Toc219558585" w:history="1">
             <w:r>
               <w:rPr>
                 <w:rStyle w:val="Hyperlink"/>
@@ -832,7 +832,7 @@
                 <w:noProof/>
                 <w:webHidden/>
               </w:rPr>
-              <w:instrText xml:space="preserve"> PAGEREF _Toc219557459 \h </w:instrText>
+              <w:instrText xml:space="preserve"> PAGEREF _Toc219558585 \h </w:instrText>
             </w:r>
             <w:r>
               <w:rPr>
@@ -875,7 +875,7 @@
               <w:lang w:eastAsia="nl-BE"/>
             </w:rPr>
           </w:pPr>
-          <w:hyperlink w:anchor="_Toc219557460" w:history="1">
+          <w:hyperlink w:anchor="_Toc219558586" w:history="1">
             <w:r>
               <w:rPr>
                 <w:rStyle w:val="Hyperlink"/>
@@ -904,7 +904,7 @@
                 <w:noProof/>
                 <w:webHidden/>
               </w:rPr>
-              <w:instrText xml:space="preserve"> PAGEREF _Toc219557460 \h </w:instrText>
+              <w:instrText xml:space="preserve"> PAGEREF _Toc219558586 \h </w:instrText>
             </w:r>
             <w:r>
               <w:rPr>
@@ -947,7 +947,7 @@
               <w:lang w:eastAsia="nl-BE"/>
             </w:rPr>
           </w:pPr>
-          <w:hyperlink w:anchor="_Toc219557461" w:history="1">
+          <w:hyperlink w:anchor="_Toc219558587" w:history="1">
             <w:r>
               <w:rPr>
                 <w:rStyle w:val="Hyperlink"/>
@@ -976,7 +976,7 @@
                 <w:noProof/>
                 <w:webHidden/>
               </w:rPr>
-              <w:instrText xml:space="preserve"> PAGEREF _Toc219557461 \h </w:instrText>
+              <w:instrText xml:space="preserve"> PAGEREF _Toc219558587 \h </w:instrText>
             </w:r>
             <w:r>
               <w:rPr>
@@ -1019,7 +1019,7 @@
               <w:lang w:eastAsia="nl-BE"/>
             </w:rPr>
           </w:pPr>
-          <w:hyperlink w:anchor="_Toc219557462" w:history="1">
+          <w:hyperlink w:anchor="_Toc219558588" w:history="1">
             <w:r>
               <w:rPr>
                 <w:rStyle w:val="Hyperlink"/>
@@ -1048,7 +1048,7 @@
                 <w:noProof/>
                 <w:webHidden/>
               </w:rPr>
-              <w:instrText xml:space="preserve"> PAGEREF _Toc219557462 \h </w:instrText>
+              <w:instrText xml:space="preserve"> PAGEREF _Toc219558588 \h </w:instrText>
             </w:r>
             <w:r>
               <w:rPr>
@@ -1091,7 +1091,7 @@
               <w:lang w:eastAsia="nl-BE"/>
             </w:rPr>
           </w:pPr>
-          <w:hyperlink w:anchor="_Toc219557463" w:history="1">
+          <w:hyperlink w:anchor="_Toc219558589" w:history="1">
             <w:r>
               <w:rPr>
                 <w:rStyle w:val="Hyperlink"/>
@@ -1120,7 +1120,7 @@
                 <w:noProof/>
                 <w:webHidden/>
               </w:rPr>
-              <w:instrText xml:space="preserve"> PAGEREF _Toc219557463 \h </w:instrText>
+              <w:instrText xml:space="preserve"> PAGEREF _Toc219558589 \h </w:instrText>
             </w:r>
             <w:r>
               <w:rPr>
@@ -1163,7 +1163,7 @@
               <w:lang w:eastAsia="nl-BE"/>
             </w:rPr>
           </w:pPr>
-          <w:hyperlink w:anchor="_Toc219557464" w:history="1">
+          <w:hyperlink w:anchor="_Toc219558590" w:history="1">
             <w:r>
               <w:rPr>
                 <w:rStyle w:val="Hyperlink"/>
@@ -1192,7 +1192,7 @@
                 <w:noProof/>
                 <w:webHidden/>
               </w:rPr>
-              <w:instrText xml:space="preserve"> PAGEREF _Toc219557464 \h </w:instrText>
+              <w:instrText xml:space="preserve"> PAGEREF _Toc219558590 \h </w:instrText>
             </w:r>
             <w:r>
               <w:rPr>
@@ -1235,7 +1235,7 @@
               <w:lang w:eastAsia="nl-BE"/>
             </w:rPr>
           </w:pPr>
-          <w:hyperlink w:anchor="_Toc219557465" w:history="1">
+          <w:hyperlink w:anchor="_Toc219558591" w:history="1">
             <w:r>
               <w:rPr>
                 <w:rStyle w:val="Hyperlink"/>
@@ -1264,7 +1264,7 @@
                 <w:noProof/>
                 <w:webHidden/>
               </w:rPr>
-              <w:instrText xml:space="preserve"> PAGEREF _Toc219557465 \h </w:instrText>
+              <w:instrText xml:space="preserve"> PAGEREF _Toc219558591 \h </w:instrText>
             </w:r>
             <w:r>
               <w:rPr>
@@ -1307,7 +1307,7 @@
               <w:lang w:eastAsia="nl-BE"/>
             </w:rPr>
           </w:pPr>
-          <w:hyperlink w:anchor="_Toc219557466" w:history="1">
+          <w:hyperlink w:anchor="_Toc219558592" w:history="1">
             <w:r>
               <w:rPr>
                 <w:rStyle w:val="Hyperlink"/>
@@ -1336,7 +1336,7 @@
                 <w:noProof/>
                 <w:webHidden/>
               </w:rPr>
-              <w:instrText xml:space="preserve"> PAGEREF _Toc219557466 \h </w:instrText>
+              <w:instrText xml:space="preserve"> PAGEREF _Toc219558592 \h </w:instrText>
             </w:r>
             <w:r>
               <w:rPr>
@@ -1379,7 +1379,7 @@
               <w:lang w:eastAsia="nl-BE"/>
             </w:rPr>
           </w:pPr>
-          <w:hyperlink w:anchor="_Toc219557467" w:history="1">
+          <w:hyperlink w:anchor="_Toc219558593" w:history="1">
             <w:r>
               <w:rPr>
                 <w:rStyle w:val="Hyperlink"/>
@@ -1408,7 +1408,7 @@
                 <w:noProof/>
                 <w:webHidden/>
               </w:rPr>
-              <w:instrText xml:space="preserve"> PAGEREF _Toc219557467 \h </w:instrText>
+              <w:instrText xml:space="preserve"> PAGEREF _Toc219558593 \h </w:instrText>
             </w:r>
             <w:r>
               <w:rPr>
@@ -1451,7 +1451,7 @@
               <w:lang w:eastAsia="nl-BE"/>
             </w:rPr>
           </w:pPr>
-          <w:hyperlink w:anchor="_Toc219557468" w:history="1">
+          <w:hyperlink w:anchor="_Toc219558594" w:history="1">
             <w:r>
               <w:rPr>
                 <w:rStyle w:val="Hyperlink"/>
@@ -1480,7 +1480,7 @@
                 <w:noProof/>
                 <w:webHidden/>
               </w:rPr>
-              <w:instrText xml:space="preserve"> PAGEREF _Toc219557468 \h </w:instrText>
+              <w:instrText xml:space="preserve"> PAGEREF _Toc219558594 \h </w:instrText>
             </w:r>
             <w:r>
               <w:rPr>
@@ -1523,7 +1523,7 @@
               <w:lang w:eastAsia="nl-BE"/>
             </w:rPr>
           </w:pPr>
-          <w:hyperlink w:anchor="_Toc219557469" w:history="1">
+          <w:hyperlink w:anchor="_Toc219558595" w:history="1">
             <w:r>
               <w:rPr>
                 <w:rStyle w:val="Hyperlink"/>
@@ -1552,7 +1552,7 @@
                 <w:noProof/>
                 <w:webHidden/>
               </w:rPr>
-              <w:instrText xml:space="preserve"> PAGEREF _Toc219557469 \h </w:instrText>
+              <w:instrText xml:space="preserve"> PAGEREF _Toc219558595 \h </w:instrText>
             </w:r>
             <w:r>
               <w:rPr>
@@ -1595,7 +1595,7 @@
               <w:lang w:eastAsia="nl-BE"/>
             </w:rPr>
           </w:pPr>
-          <w:hyperlink w:anchor="_Toc219557470" w:history="1">
+          <w:hyperlink w:anchor="_Toc219558596" w:history="1">
             <w:r>
               <w:rPr>
                 <w:rStyle w:val="Hyperlink"/>
@@ -1624,7 +1624,7 @@
                 <w:noProof/>
                 <w:webHidden/>
               </w:rPr>
-              <w:instrText xml:space="preserve"> PAGEREF _Toc219557470 \h </w:instrText>
+              <w:instrText xml:space="preserve"> PAGEREF _Toc219558596 \h </w:instrText>
             </w:r>
             <w:r>
               <w:rPr>
@@ -1667,7 +1667,7 @@
               <w:lang w:eastAsia="nl-BE"/>
             </w:rPr>
           </w:pPr>
-          <w:hyperlink w:anchor="_Toc219557471" w:history="1">
+          <w:hyperlink w:anchor="_Toc219558597" w:history="1">
             <w:r>
               <w:rPr>
                 <w:rStyle w:val="Hyperlink"/>
@@ -1696,7 +1696,7 @@
                 <w:noProof/>
                 <w:webHidden/>
               </w:rPr>
-              <w:instrText xml:space="preserve"> PAGEREF _Toc219557471 \h </w:instrText>
+              <w:instrText xml:space="preserve"> PAGEREF _Toc219558597 \h </w:instrText>
             </w:r>
             <w:r>
               <w:rPr>
@@ -1739,7 +1739,7 @@
               <w:lang w:eastAsia="nl-BE"/>
             </w:rPr>
           </w:pPr>
-          <w:hyperlink w:anchor="_Toc219557472" w:history="1">
+          <w:hyperlink w:anchor="_Toc219558598" w:history="1">
             <w:r>
               <w:rPr>
                 <w:rStyle w:val="Hyperlink"/>
@@ -1768,7 +1768,7 @@
                 <w:noProof/>
                 <w:webHidden/>
               </w:rPr>
-              <w:instrText xml:space="preserve"> PAGEREF _Toc219557472 \h </w:instrText>
+              <w:instrText xml:space="preserve"> PAGEREF _Toc219558598 \h </w:instrText>
             </w:r>
             <w:r>
               <w:rPr>
@@ -1811,7 +1811,7 @@
               <w:lang w:eastAsia="nl-BE"/>
             </w:rPr>
           </w:pPr>
-          <w:hyperlink w:anchor="_Toc219557473" w:history="1">
+          <w:hyperlink w:anchor="_Toc219558599" w:history="1">
             <w:r>
               <w:rPr>
                 <w:rStyle w:val="Hyperlink"/>
@@ -1840,7 +1840,7 @@
                 <w:noProof/>
                 <w:webHidden/>
               </w:rPr>
-              <w:instrText xml:space="preserve"> PAGEREF _Toc219557473 \h </w:instrText>
+              <w:instrText xml:space="preserve"> PAGEREF _Toc219558599 \h </w:instrText>
             </w:r>
             <w:r>
               <w:rPr>
@@ -1883,7 +1883,7 @@
               <w:lang w:eastAsia="nl-BE"/>
             </w:rPr>
           </w:pPr>
-          <w:hyperlink w:anchor="_Toc219557474" w:history="1">
+          <w:hyperlink w:anchor="_Toc219558600" w:history="1">
             <w:r>
               <w:rPr>
                 <w:rStyle w:val="Hyperlink"/>
@@ -1912,7 +1912,7 @@
                 <w:noProof/>
                 <w:webHidden/>
               </w:rPr>
-              <w:instrText xml:space="preserve"> PAGEREF _Toc219557474 \h </w:instrText>
+              <w:instrText xml:space="preserve"> PAGEREF _Toc219558600 \h </w:instrText>
             </w:r>
             <w:r>
               <w:rPr>
@@ -1955,7 +1955,7 @@
               <w:lang w:eastAsia="nl-BE"/>
             </w:rPr>
           </w:pPr>
-          <w:hyperlink w:anchor="_Toc219557475" w:history="1">
+          <w:hyperlink w:anchor="_Toc219558601" w:history="1">
             <w:r>
               <w:rPr>
                 <w:rStyle w:val="Hyperlink"/>
@@ -1984,7 +1984,7 @@
                 <w:noProof/>
                 <w:webHidden/>
               </w:rPr>
-              <w:instrText xml:space="preserve"> PAGEREF _Toc219557475 \h </w:instrText>
+              <w:instrText xml:space="preserve"> PAGEREF _Toc219558601 \h </w:instrText>
             </w:r>
             <w:r>
               <w:rPr>
@@ -2027,7 +2027,7 @@
               <w:lang w:eastAsia="nl-BE"/>
             </w:rPr>
           </w:pPr>
-          <w:hyperlink w:anchor="_Toc219557476" w:history="1">
+          <w:hyperlink w:anchor="_Toc219558602" w:history="1">
             <w:r>
               <w:rPr>
                 <w:rStyle w:val="Hyperlink"/>
@@ -2056,7 +2056,7 @@
                 <w:noProof/>
                 <w:webHidden/>
               </w:rPr>
-              <w:instrText xml:space="preserve"> PAGEREF _Toc219557476 \h </w:instrText>
+              <w:instrText xml:space="preserve"> PAGEREF _Toc219558602 \h </w:instrText>
             </w:r>
             <w:r>
               <w:rPr>
@@ -2099,7 +2099,7 @@
               <w:lang w:eastAsia="nl-BE"/>
             </w:rPr>
           </w:pPr>
-          <w:hyperlink w:anchor="_Toc219557477" w:history="1">
+          <w:hyperlink w:anchor="_Toc219558603" w:history="1">
             <w:r>
               <w:rPr>
                 <w:rStyle w:val="Hyperlink"/>
@@ -2128,7 +2128,7 @@
                 <w:noProof/>
                 <w:webHidden/>
               </w:rPr>
-              <w:instrText xml:space="preserve"> PAGEREF _Toc219557477 \h </w:instrText>
+              <w:instrText xml:space="preserve"> PAGEREF _Toc219558603 \h </w:instrText>
             </w:r>
             <w:r>
               <w:rPr>
@@ -2171,7 +2171,7 @@
               <w:lang w:eastAsia="nl-BE"/>
             </w:rPr>
           </w:pPr>
-          <w:hyperlink w:anchor="_Toc219557478" w:history="1">
+          <w:hyperlink w:anchor="_Toc219558604" w:history="1">
             <w:r>
               <w:rPr>
                 <w:rStyle w:val="Hyperlink"/>
@@ -2200,7 +2200,7 @@
                 <w:noProof/>
                 <w:webHidden/>
               </w:rPr>
-              <w:instrText xml:space="preserve"> PAGEREF _Toc219557478 \h </w:instrText>
+              <w:instrText xml:space="preserve"> PAGEREF _Toc219558604 \h </w:instrText>
             </w:r>
             <w:r>
               <w:rPr>
@@ -2243,7 +2243,7 @@
               <w:lang w:eastAsia="nl-BE"/>
             </w:rPr>
           </w:pPr>
-          <w:hyperlink w:anchor="_Toc219557479" w:history="1">
+          <w:hyperlink w:anchor="_Toc219558605" w:history="1">
             <w:r>
               <w:rPr>
                 <w:rStyle w:val="Hyperlink"/>
@@ -2272,7 +2272,7 @@
                 <w:noProof/>
                 <w:webHidden/>
               </w:rPr>
-              <w:instrText xml:space="preserve"> PAGEREF _Toc219557479 \h </w:instrText>
+              <w:instrText xml:space="preserve"> PAGEREF _Toc219558605 \h </w:instrText>
             </w:r>
             <w:r>
               <w:rPr>
@@ -2315,7 +2315,7 @@
               <w:lang w:eastAsia="nl-BE"/>
             </w:rPr>
           </w:pPr>
-          <w:hyperlink w:anchor="_Toc219557480" w:history="1">
+          <w:hyperlink w:anchor="_Toc219558606" w:history="1">
             <w:r>
               <w:rPr>
                 <w:rStyle w:val="Hyperlink"/>
@@ -2344,7 +2344,7 @@
                 <w:noProof/>
                 <w:webHidden/>
               </w:rPr>
-              <w:instrText xml:space="preserve"> PAGEREF _Toc219557480 \h </w:instrText>
+              <w:instrText xml:space="preserve"> PAGEREF _Toc219558606 \h </w:instrText>
             </w:r>
             <w:r>
               <w:rPr>
@@ -2387,7 +2387,7 @@
               <w:lang w:eastAsia="nl-BE"/>
             </w:rPr>
           </w:pPr>
-          <w:hyperlink w:anchor="_Toc219557481" w:history="1">
+          <w:hyperlink w:anchor="_Toc219558607" w:history="1">
             <w:r>
               <w:rPr>
                 <w:rStyle w:val="Hyperlink"/>
@@ -2416,7 +2416,7 @@
                 <w:noProof/>
                 <w:webHidden/>
               </w:rPr>
-              <w:instrText xml:space="preserve"> PAGEREF _Toc219557481 \h </w:instrText>
+              <w:instrText xml:space="preserve"> PAGEREF _Toc219558607 \h </w:instrText>
             </w:r>
             <w:r>
               <w:rPr>
@@ -2459,7 +2459,7 @@
               <w:lang w:eastAsia="nl-BE"/>
             </w:rPr>
           </w:pPr>
-          <w:hyperlink w:anchor="_Toc219557482" w:history="1">
+          <w:hyperlink w:anchor="_Toc219558608" w:history="1">
             <w:r>
               <w:rPr>
                 <w:rStyle w:val="Hyperlink"/>
@@ -2488,7 +2488,7 @@
                 <w:noProof/>
                 <w:webHidden/>
               </w:rPr>
-              <w:instrText xml:space="preserve"> PAGEREF _Toc219557482 \h </w:instrText>
+              <w:instrText xml:space="preserve"> PAGEREF _Toc219558608 \h </w:instrText>
             </w:r>
             <w:r>
               <w:rPr>
@@ -2531,7 +2531,7 @@
               <w:lang w:eastAsia="nl-BE"/>
             </w:rPr>
           </w:pPr>
-          <w:hyperlink w:anchor="_Toc219557483" w:history="1">
+          <w:hyperlink w:anchor="_Toc219558609" w:history="1">
             <w:r>
               <w:rPr>
                 <w:rStyle w:val="Hyperlink"/>
@@ -2560,7 +2560,7 @@
                 <w:noProof/>
                 <w:webHidden/>
               </w:rPr>
-              <w:instrText xml:space="preserve"> PAGEREF _Toc219557483 \h </w:instrText>
+              <w:instrText xml:space="preserve"> PAGEREF _Toc219558609 \h </w:instrText>
             </w:r>
             <w:r>
               <w:rPr>
@@ -2603,7 +2603,7 @@
               <w:lang w:eastAsia="nl-BE"/>
             </w:rPr>
           </w:pPr>
-          <w:hyperlink w:anchor="_Toc219557484" w:history="1">
+          <w:hyperlink w:anchor="_Toc219558610" w:history="1">
             <w:r>
               <w:rPr>
                 <w:rStyle w:val="Hyperlink"/>
@@ -2632,7 +2632,7 @@
                 <w:noProof/>
                 <w:webHidden/>
               </w:rPr>
-              <w:instrText xml:space="preserve"> PAGEREF _Toc219557484 \h </w:instrText>
+              <w:instrText xml:space="preserve"> PAGEREF _Toc219558610 \h </w:instrText>
             </w:r>
             <w:r>
               <w:rPr>
@@ -2675,7 +2675,7 @@
               <w:lang w:eastAsia="nl-BE"/>
             </w:rPr>
           </w:pPr>
-          <w:hyperlink w:anchor="_Toc219557485" w:history="1">
+          <w:hyperlink w:anchor="_Toc219558611" w:history="1">
             <w:r>
               <w:rPr>
                 <w:rStyle w:val="Hyperlink"/>
@@ -2704,7 +2704,7 @@
                 <w:noProof/>
                 <w:webHidden/>
               </w:rPr>
-              <w:instrText xml:space="preserve"> PAGEREF _Toc219557485 \h </w:instrText>
+              <w:instrText xml:space="preserve"> PAGEREF _Toc219558611 \h </w:instrText>
             </w:r>
             <w:r>
               <w:rPr>
@@ -2747,7 +2747,7 @@
               <w:lang w:eastAsia="nl-BE"/>
             </w:rPr>
           </w:pPr>
-          <w:hyperlink w:anchor="_Toc219557486" w:history="1">
+          <w:hyperlink w:anchor="_Toc219558612" w:history="1">
             <w:r>
               <w:rPr>
                 <w:rStyle w:val="Hyperlink"/>
@@ -2776,7 +2776,7 @@
                 <w:noProof/>
                 <w:webHidden/>
               </w:rPr>
-              <w:instrText xml:space="preserve"> PAGEREF _Toc219557486 \h </w:instrText>
+              <w:instrText xml:space="preserve"> PAGEREF _Toc219558612 \h </w:instrText>
             </w:r>
             <w:r>
               <w:rPr>
@@ -2819,7 +2819,7 @@
               <w:lang w:eastAsia="nl-BE"/>
             </w:rPr>
           </w:pPr>
-          <w:hyperlink w:anchor="_Toc219557487" w:history="1">
+          <w:hyperlink w:anchor="_Toc219558613" w:history="1">
             <w:r>
               <w:rPr>
                 <w:rStyle w:val="Hyperlink"/>
@@ -2848,7 +2848,7 @@
                 <w:noProof/>
                 <w:webHidden/>
               </w:rPr>
-              <w:instrText xml:space="preserve"> PAGEREF _Toc219557487 \h </w:instrText>
+              <w:instrText xml:space="preserve"> PAGEREF _Toc219558613 \h </w:instrText>
             </w:r>
             <w:r>
               <w:rPr>
@@ -2891,7 +2891,7 @@
               <w:lang w:eastAsia="nl-BE"/>
             </w:rPr>
           </w:pPr>
-          <w:hyperlink w:anchor="_Toc219557488" w:history="1">
+          <w:hyperlink w:anchor="_Toc219558614" w:history="1">
             <w:r>
               <w:rPr>
                 <w:rStyle w:val="Hyperlink"/>
@@ -2920,7 +2920,7 @@
                 <w:noProof/>
                 <w:webHidden/>
               </w:rPr>
-              <w:instrText xml:space="preserve"> PAGEREF _Toc219557488 \h </w:instrText>
+              <w:instrText xml:space="preserve"> PAGEREF _Toc219558614 \h </w:instrText>
             </w:r>
             <w:r>
               <w:rPr>
@@ -2963,7 +2963,7 @@
               <w:lang w:eastAsia="nl-BE"/>
             </w:rPr>
           </w:pPr>
-          <w:hyperlink w:anchor="_Toc219557489" w:history="1">
+          <w:hyperlink w:anchor="_Toc219558615" w:history="1">
             <w:r>
               <w:rPr>
                 <w:rStyle w:val="Hyperlink"/>
@@ -2992,7 +2992,7 @@
                 <w:noProof/>
                 <w:webHidden/>
               </w:rPr>
-              <w:instrText xml:space="preserve"> PAGEREF _Toc219557489 \h </w:instrText>
+              <w:instrText xml:space="preserve"> PAGEREF _Toc219558615 \h </w:instrText>
             </w:r>
             <w:r>
               <w:rPr>
@@ -3035,7 +3035,7 @@
               <w:lang w:eastAsia="nl-BE"/>
             </w:rPr>
           </w:pPr>
-          <w:hyperlink w:anchor="_Toc219557490" w:history="1">
+          <w:hyperlink w:anchor="_Toc219558616" w:history="1">
             <w:r>
               <w:rPr>
                 <w:rStyle w:val="Hyperlink"/>
@@ -3064,7 +3064,7 @@
                 <w:noProof/>
                 <w:webHidden/>
               </w:rPr>
-              <w:instrText xml:space="preserve"> PAGEREF _Toc219557490 \h </w:instrText>
+              <w:instrText xml:space="preserve"> PAGEREF _Toc219558616 \h </w:instrText>
             </w:r>
             <w:r>
               <w:rPr>
@@ -3107,7 +3107,7 @@
               <w:lang w:eastAsia="nl-BE"/>
             </w:rPr>
           </w:pPr>
-          <w:hyperlink w:anchor="_Toc219557491" w:history="1">
+          <w:hyperlink w:anchor="_Toc219558617" w:history="1">
             <w:r>
               <w:rPr>
                 <w:rStyle w:val="Hyperlink"/>
@@ -3136,7 +3136,7 @@
                 <w:noProof/>
                 <w:webHidden/>
               </w:rPr>
-              <w:instrText xml:space="preserve"> PAGEREF _Toc219557491 \h </w:instrText>
+              <w:instrText xml:space="preserve"> PAGEREF _Toc219558617 \h </w:instrText>
             </w:r>
             <w:r>
               <w:rPr>
@@ -3179,7 +3179,7 @@
               <w:lang w:eastAsia="nl-BE"/>
             </w:rPr>
           </w:pPr>
-          <w:hyperlink w:anchor="_Toc219557492" w:history="1">
+          <w:hyperlink w:anchor="_Toc219558618" w:history="1">
             <w:r>
               <w:rPr>
                 <w:rStyle w:val="Hyperlink"/>
@@ -3208,7 +3208,7 @@
                 <w:noProof/>
                 <w:webHidden/>
               </w:rPr>
-              <w:instrText xml:space="preserve"> PAGEREF _Toc219557492 \h </w:instrText>
+              <w:instrText xml:space="preserve"> PAGEREF _Toc219558618 \h </w:instrText>
             </w:r>
             <w:r>
               <w:rPr>
@@ -3251,7 +3251,7 @@
               <w:lang w:eastAsia="nl-BE"/>
             </w:rPr>
           </w:pPr>
-          <w:hyperlink w:anchor="_Toc219557493" w:history="1">
+          <w:hyperlink w:anchor="_Toc219558619" w:history="1">
             <w:r>
               <w:rPr>
                 <w:rStyle w:val="Hyperlink"/>
@@ -3280,7 +3280,7 @@
                 <w:noProof/>
                 <w:webHidden/>
               </w:rPr>
-              <w:instrText xml:space="preserve"> PAGEREF _Toc219557493 \h </w:instrText>
+              <w:instrText xml:space="preserve"> PAGEREF _Toc219558619 \h </w:instrText>
             </w:r>
             <w:r>
               <w:rPr>
@@ -3323,7 +3323,7 @@
               <w:lang w:eastAsia="nl-BE"/>
             </w:rPr>
           </w:pPr>
-          <w:hyperlink w:anchor="_Toc219557494" w:history="1">
+          <w:hyperlink w:anchor="_Toc219558620" w:history="1">
             <w:r>
               <w:rPr>
                 <w:rStyle w:val="Hyperlink"/>
@@ -3352,7 +3352,7 @@
                 <w:noProof/>
                 <w:webHidden/>
               </w:rPr>
-              <w:instrText xml:space="preserve"> PAGEREF _Toc219557494 \h </w:instrText>
+              <w:instrText xml:space="preserve"> PAGEREF _Toc219558620 \h </w:instrText>
             </w:r>
             <w:r>
               <w:rPr>
@@ -3395,7 +3395,7 @@
               <w:lang w:eastAsia="nl-BE"/>
             </w:rPr>
           </w:pPr>
-          <w:hyperlink w:anchor="_Toc219557495" w:history="1">
+          <w:hyperlink w:anchor="_Toc219558621" w:history="1">
             <w:r>
               <w:rPr>
                 <w:rStyle w:val="Hyperlink"/>
@@ -3424,7 +3424,7 @@
                 <w:noProof/>
                 <w:webHidden/>
               </w:rPr>
-              <w:instrText xml:space="preserve"> PAGEREF _Toc219557495 \h </w:instrText>
+              <w:instrText xml:space="preserve"> PAGEREF _Toc219558621 \h </w:instrText>
             </w:r>
             <w:r>
               <w:rPr>
@@ -3467,7 +3467,7 @@
               <w:lang w:eastAsia="nl-BE"/>
             </w:rPr>
           </w:pPr>
-          <w:hyperlink w:anchor="_Toc219557496" w:history="1">
+          <w:hyperlink w:anchor="_Toc219558622" w:history="1">
             <w:r>
               <w:rPr>
                 <w:rStyle w:val="Hyperlink"/>
@@ -3496,7 +3496,7 @@
                 <w:noProof/>
                 <w:webHidden/>
               </w:rPr>
-              <w:instrText xml:space="preserve"> PAGEREF _Toc219557496 \h </w:instrText>
+              <w:instrText xml:space="preserve"> PAGEREF _Toc219558622 \h </w:instrText>
             </w:r>
             <w:r>
               <w:rPr>
@@ -3539,7 +3539,7 @@
               <w:lang w:eastAsia="nl-BE"/>
             </w:rPr>
           </w:pPr>
-          <w:hyperlink w:anchor="_Toc219557497" w:history="1">
+          <w:hyperlink w:anchor="_Toc219558623" w:history="1">
             <w:r>
               <w:rPr>
                 <w:rStyle w:val="Hyperlink"/>
@@ -3570,7 +3570,7 @@
                 <w:noProof/>
                 <w:webHidden/>
               </w:rPr>
-              <w:instrText xml:space="preserve"> PAGEREF _Toc219557497 \h </w:instrText>
+              <w:instrText xml:space="preserve"> PAGEREF _Toc219558623 \h </w:instrText>
             </w:r>
             <w:r>
               <w:rPr>
@@ -3613,7 +3613,7 @@
               <w:lang w:eastAsia="nl-BE"/>
             </w:rPr>
           </w:pPr>
-          <w:hyperlink w:anchor="_Toc219557498" w:history="1">
+          <w:hyperlink w:anchor="_Toc219558624" w:history="1">
             <w:r>
               <w:rPr>
                 <w:rStyle w:val="Hyperlink"/>
@@ -3644,7 +3644,7 @@
                 <w:noProof/>
                 <w:webHidden/>
               </w:rPr>
-              <w:instrText xml:space="preserve"> PAGEREF _Toc219557498 \h </w:instrText>
+              <w:instrText xml:space="preserve"> PAGEREF _Toc219558624 \h </w:instrText>
             </w:r>
             <w:r>
               <w:rPr>
@@ -3687,7 +3687,7 @@
               <w:lang w:eastAsia="nl-BE"/>
             </w:rPr>
           </w:pPr>
-          <w:hyperlink w:anchor="_Toc219557499" w:history="1">
+          <w:hyperlink w:anchor="_Toc219558625" w:history="1">
             <w:r>
               <w:rPr>
                 <w:rStyle w:val="Hyperlink"/>
@@ -3718,7 +3718,7 @@
                 <w:noProof/>
                 <w:webHidden/>
               </w:rPr>
-              <w:instrText xml:space="preserve"> PAGEREF _Toc219557499 \h </w:instrText>
+              <w:instrText xml:space="preserve"> PAGEREF _Toc219558625 \h </w:instrText>
             </w:r>
             <w:r>
               <w:rPr>
@@ -3761,7 +3761,7 @@
               <w:lang w:eastAsia="nl-BE"/>
             </w:rPr>
           </w:pPr>
-          <w:hyperlink w:anchor="_Toc219557500" w:history="1">
+          <w:hyperlink w:anchor="_Toc219558626" w:history="1">
             <w:r>
               <w:rPr>
                 <w:rStyle w:val="Hyperlink"/>
@@ -3792,7 +3792,7 @@
                 <w:noProof/>
                 <w:webHidden/>
               </w:rPr>
-              <w:instrText xml:space="preserve"> PAGEREF _Toc219557500 \h </w:instrText>
+              <w:instrText xml:space="preserve"> PAGEREF _Toc219558626 \h </w:instrText>
             </w:r>
             <w:r>
               <w:rPr>
@@ -3835,7 +3835,7 @@
               <w:lang w:eastAsia="nl-BE"/>
             </w:rPr>
           </w:pPr>
-          <w:hyperlink w:anchor="_Toc219557501" w:history="1">
+          <w:hyperlink w:anchor="_Toc219558627" w:history="1">
             <w:r>
               <w:rPr>
                 <w:rStyle w:val="Hyperlink"/>
@@ -3866,7 +3866,7 @@
                 <w:noProof/>
                 <w:webHidden/>
               </w:rPr>
-              <w:instrText xml:space="preserve"> PAGEREF _Toc219557501 \h </w:instrText>
+              <w:instrText xml:space="preserve"> PAGEREF _Toc219558627 \h </w:instrText>
             </w:r>
             <w:r>
               <w:rPr>
@@ -3909,7 +3909,7 @@
               <w:lang w:eastAsia="nl-BE"/>
             </w:rPr>
           </w:pPr>
-          <w:hyperlink w:anchor="_Toc219557502" w:history="1">
+          <w:hyperlink w:anchor="_Toc219558628" w:history="1">
             <w:r>
               <w:rPr>
                 <w:rStyle w:val="Hyperlink"/>
@@ -3940,7 +3940,7 @@
                 <w:noProof/>
                 <w:webHidden/>
               </w:rPr>
-              <w:instrText xml:space="preserve"> PAGEREF _Toc219557502 \h </w:instrText>
+              <w:instrText xml:space="preserve"> PAGEREF _Toc219558628 \h </w:instrText>
             </w:r>
             <w:r>
               <w:rPr>
@@ -3983,7 +3983,7 @@
               <w:lang w:eastAsia="nl-BE"/>
             </w:rPr>
           </w:pPr>
-          <w:hyperlink w:anchor="_Toc219557503" w:history="1">
+          <w:hyperlink w:anchor="_Toc219558629" w:history="1">
             <w:r>
               <w:rPr>
                 <w:rStyle w:val="Hyperlink"/>
@@ -4012,7 +4012,7 @@
                 <w:noProof/>
                 <w:webHidden/>
               </w:rPr>
-              <w:instrText xml:space="preserve"> PAGEREF _Toc219557503 \h </w:instrText>
+              <w:instrText xml:space="preserve"> PAGEREF _Toc219558629 \h </w:instrText>
             </w:r>
             <w:r>
               <w:rPr>
@@ -4055,7 +4055,7 @@
               <w:lang w:eastAsia="nl-BE"/>
             </w:rPr>
           </w:pPr>
-          <w:hyperlink w:anchor="_Toc219557504" w:history="1">
+          <w:hyperlink w:anchor="_Toc219558630" w:history="1">
             <w:r>
               <w:rPr>
                 <w:rStyle w:val="Hyperlink"/>
@@ -4084,7 +4084,7 @@
                 <w:noProof/>
                 <w:webHidden/>
               </w:rPr>
-              <w:instrText xml:space="preserve"> PAGEREF _Toc219557504 \h </w:instrText>
+              <w:instrText xml:space="preserve"> PAGEREF _Toc219558630 \h </w:instrText>
             </w:r>
             <w:r>
               <w:rPr>
@@ -4127,7 +4127,7 @@
               <w:lang w:eastAsia="nl-BE"/>
             </w:rPr>
           </w:pPr>
-          <w:hyperlink w:anchor="_Toc219557505" w:history="1">
+          <w:hyperlink w:anchor="_Toc219558631" w:history="1">
             <w:r>
               <w:rPr>
                 <w:rStyle w:val="Hyperlink"/>
@@ -4156,7 +4156,7 @@
                 <w:noProof/>
                 <w:webHidden/>
               </w:rPr>
-              <w:instrText xml:space="preserve"> PAGEREF _Toc219557505 \h </w:instrText>
+              <w:instrText xml:space="preserve"> PAGEREF _Toc219558631 \h </w:instrText>
             </w:r>
             <w:r>
               <w:rPr>
@@ -4199,7 +4199,7 @@
               <w:lang w:eastAsia="nl-BE"/>
             </w:rPr>
           </w:pPr>
-          <w:hyperlink w:anchor="_Toc219557506" w:history="1">
+          <w:hyperlink w:anchor="_Toc219558632" w:history="1">
             <w:r>
               <w:rPr>
                 <w:rStyle w:val="Hyperlink"/>
@@ -4228,7 +4228,7 @@
                 <w:noProof/>
                 <w:webHidden/>
               </w:rPr>
-              <w:instrText xml:space="preserve"> PAGEREF _Toc219557506 \h </w:instrText>
+              <w:instrText xml:space="preserve"> PAGEREF _Toc219558632 \h </w:instrText>
             </w:r>
             <w:r>
               <w:rPr>
@@ -4271,7 +4271,7 @@
               <w:lang w:eastAsia="nl-BE"/>
             </w:rPr>
           </w:pPr>
-          <w:hyperlink w:anchor="_Toc219557507" w:history="1">
+          <w:hyperlink w:anchor="_Toc219558633" w:history="1">
             <w:r>
               <w:rPr>
                 <w:rStyle w:val="Hyperlink"/>
@@ -4300,7 +4300,7 @@
                 <w:noProof/>
                 <w:webHidden/>
               </w:rPr>
-              <w:instrText xml:space="preserve"> PAGEREF _Toc219557507 \h </w:instrText>
+              <w:instrText xml:space="preserve"> PAGEREF _Toc219558633 \h </w:instrText>
             </w:r>
             <w:r>
               <w:rPr>
@@ -4343,7 +4343,7 @@
               <w:lang w:eastAsia="nl-BE"/>
             </w:rPr>
           </w:pPr>
-          <w:hyperlink w:anchor="_Toc219557508" w:history="1">
+          <w:hyperlink w:anchor="_Toc219558634" w:history="1">
             <w:r>
               <w:rPr>
                 <w:rStyle w:val="Hyperlink"/>
@@ -4374,7 +4374,7 @@
                 <w:noProof/>
                 <w:webHidden/>
               </w:rPr>
-              <w:instrText xml:space="preserve"> PAGEREF _Toc219557508 \h </w:instrText>
+              <w:instrText xml:space="preserve"> PAGEREF _Toc219558634 \h </w:instrText>
             </w:r>
             <w:r>
               <w:rPr>
@@ -4417,7 +4417,7 @@
               <w:lang w:eastAsia="nl-BE"/>
             </w:rPr>
           </w:pPr>
-          <w:hyperlink w:anchor="_Toc219557509" w:history="1">
+          <w:hyperlink w:anchor="_Toc219558635" w:history="1">
             <w:r>
               <w:rPr>
                 <w:rStyle w:val="Hyperlink"/>
@@ -4448,7 +4448,7 @@
                 <w:noProof/>
                 <w:webHidden/>
               </w:rPr>
-              <w:instrText xml:space="preserve"> PAGEREF _Toc219557509 \h </w:instrText>
+              <w:instrText xml:space="preserve"> PAGEREF _Toc219558635 \h </w:instrText>
             </w:r>
             <w:r>
               <w:rPr>
@@ -4491,7 +4491,7 @@
               <w:lang w:eastAsia="nl-BE"/>
             </w:rPr>
           </w:pPr>
-          <w:hyperlink w:anchor="_Toc219557510" w:history="1">
+          <w:hyperlink w:anchor="_Toc219558636" w:history="1">
             <w:r>
               <w:rPr>
                 <w:rStyle w:val="Hyperlink"/>
@@ -4522,7 +4522,7 @@
                 <w:noProof/>
                 <w:webHidden/>
               </w:rPr>
-              <w:instrText xml:space="preserve"> PAGEREF _Toc219557510 \h </w:instrText>
+              <w:instrText xml:space="preserve"> PAGEREF _Toc219558636 \h </w:instrText>
             </w:r>
             <w:r>
               <w:rPr>
@@ -4565,7 +4565,7 @@
               <w:lang w:eastAsia="nl-BE"/>
             </w:rPr>
           </w:pPr>
-          <w:hyperlink w:anchor="_Toc219557511" w:history="1">
+          <w:hyperlink w:anchor="_Toc219558637" w:history="1">
             <w:r>
               <w:rPr>
                 <w:rStyle w:val="Hyperlink"/>
@@ -4596,7 +4596,7 @@
                 <w:noProof/>
                 <w:webHidden/>
               </w:rPr>
-              <w:instrText xml:space="preserve"> PAGEREF _Toc219557511 \h </w:instrText>
+              <w:instrText xml:space="preserve"> PAGEREF _Toc219558637 \h </w:instrText>
             </w:r>
             <w:r>
               <w:rPr>
@@ -4639,7 +4639,7 @@
               <w:lang w:eastAsia="nl-BE"/>
             </w:rPr>
           </w:pPr>
-          <w:hyperlink w:anchor="_Toc219557512" w:history="1">
+          <w:hyperlink w:anchor="_Toc219558638" w:history="1">
             <w:r>
               <w:rPr>
                 <w:rStyle w:val="Hyperlink"/>
@@ -4668,7 +4668,7 @@
                 <w:noProof/>
                 <w:webHidden/>
               </w:rPr>
-              <w:instrText xml:space="preserve"> PAGEREF _Toc219557512 \h </w:instrText>
+              <w:instrText xml:space="preserve"> PAGEREF _Toc219558638 \h </w:instrText>
             </w:r>
             <w:r>
               <w:rPr>
@@ -4711,7 +4711,7 @@
               <w:lang w:eastAsia="nl-BE"/>
             </w:rPr>
           </w:pPr>
-          <w:hyperlink w:anchor="_Toc219557513" w:history="1">
+          <w:hyperlink w:anchor="_Toc219558639" w:history="1">
             <w:r>
               <w:rPr>
                 <w:rStyle w:val="Hyperlink"/>
@@ -4741,7 +4741,7 @@
                 <w:noProof/>
                 <w:webHidden/>
               </w:rPr>
-              <w:instrText xml:space="preserve"> PAGEREF _Toc219557513 \h </w:instrText>
+              <w:instrText xml:space="preserve"> PAGEREF _Toc219558639 \h </w:instrText>
             </w:r>
             <w:r>
               <w:rPr>
@@ -4784,7 +4784,7 @@
               <w:lang w:eastAsia="nl-BE"/>
             </w:rPr>
           </w:pPr>
-          <w:hyperlink w:anchor="_Toc219557514" w:history="1">
+          <w:hyperlink w:anchor="_Toc219558640" w:history="1">
             <w:r>
               <w:rPr>
                 <w:rStyle w:val="Hyperlink"/>
@@ -4813,7 +4813,7 @@
                 <w:noProof/>
                 <w:webHidden/>
               </w:rPr>
-              <w:instrText xml:space="preserve"> PAGEREF _Toc219557514 \h </w:instrText>
+              <w:instrText xml:space="preserve"> PAGEREF _Toc219558640 \h </w:instrText>
             </w:r>
             <w:r>
               <w:rPr>
@@ -4856,7 +4856,7 @@
               <w:lang w:eastAsia="nl-BE"/>
             </w:rPr>
           </w:pPr>
-          <w:hyperlink w:anchor="_Toc219557515" w:history="1">
+          <w:hyperlink w:anchor="_Toc219558641" w:history="1">
             <w:r>
               <w:rPr>
                 <w:rStyle w:val="Hyperlink"/>
@@ -4885,7 +4885,7 @@
                 <w:noProof/>
                 <w:webHidden/>
               </w:rPr>
-              <w:instrText xml:space="preserve"> PAGEREF _Toc219557515 \h </w:instrText>
+              <w:instrText xml:space="preserve"> PAGEREF _Toc219558641 \h </w:instrText>
             </w:r>
             <w:r>
               <w:rPr>
@@ -4928,7 +4928,7 @@
               <w:lang w:eastAsia="nl-BE"/>
             </w:rPr>
           </w:pPr>
-          <w:hyperlink w:anchor="_Toc219557516" w:history="1">
+          <w:hyperlink w:anchor="_Toc219558642" w:history="1">
             <w:r>
               <w:rPr>
                 <w:rStyle w:val="Hyperlink"/>
@@ -4967,7 +4967,7 @@
                 <w:noProof/>
                 <w:webHidden/>
               </w:rPr>
-              <w:instrText xml:space="preserve"> PAGEREF _Toc219557516 \h </w:instrText>
+              <w:instrText xml:space="preserve"> PAGEREF _Toc219558642 \h </w:instrText>
             </w:r>
             <w:r>
               <w:rPr>
@@ -5010,7 +5010,7 @@
               <w:lang w:eastAsia="nl-BE"/>
             </w:rPr>
           </w:pPr>
-          <w:hyperlink w:anchor="_Toc219557517" w:history="1">
+          <w:hyperlink w:anchor="_Toc219558643" w:history="1">
             <w:r>
               <w:rPr>
                 <w:rStyle w:val="Hyperlink"/>
@@ -5039,7 +5039,7 @@
                 <w:noProof/>
                 <w:webHidden/>
               </w:rPr>
-              <w:instrText xml:space="preserve"> PAGEREF _Toc219557517 \h </w:instrText>
+              <w:instrText xml:space="preserve"> PAGEREF _Toc219558643 \h </w:instrText>
             </w:r>
             <w:r>
               <w:rPr>
@@ -5133,7 +5133,7 @@
           <w:color w:val="000000" w:themeColor="text1"/>
         </w:rPr>
       </w:pPr>
-      <w:bookmarkStart w:id="1" w:name="_Toc219557451"/>
+      <w:bookmarkStart w:id="1" w:name="_Toc219558577"/>
       <w:r>
         <w:rPr>
           <w:rFonts w:asciiTheme="minorHAnsi" w:hAnsiTheme="minorHAnsi"/>
@@ -5194,7 +5194,7 @@
         </w:rPr>
         <w:fldChar w:fldCharType="separate"/>
       </w:r>
-      <w:hyperlink w:anchor="_Toc219557518" w:history="1">
+      <w:hyperlink w:anchor="_Toc219558644" w:history="1">
         <w:r>
           <w:rPr>
             <w:rStyle w:val="Hyperlink"/>
@@ -5221,7 +5221,7 @@
             <w:noProof/>
             <w:webHidden/>
           </w:rPr>
-          <w:instrText xml:space="preserve"> PAGEREF _Toc219557518 \h </w:instrText>
+          <w:instrText xml:space="preserve"> PAGEREF _Toc219558644 \h </w:instrText>
         </w:r>
         <w:r>
           <w:rPr>
@@ -5264,7 +5264,7 @@
           <w:lang w:eastAsia="nl-BE"/>
         </w:rPr>
       </w:pPr>
-      <w:hyperlink w:anchor="_Toc219557519" w:history="1">
+      <w:hyperlink w:anchor="_Toc219558645" w:history="1">
         <w:r>
           <w:rPr>
             <w:rStyle w:val="Hyperlink"/>
@@ -5291,7 +5291,7 @@
             <w:noProof/>
             <w:webHidden/>
           </w:rPr>
-          <w:instrText xml:space="preserve"> PAGEREF _Toc219557519 \h </w:instrText>
+          <w:instrText xml:space="preserve"> PAGEREF _Toc219558645 \h </w:instrText>
         </w:r>
         <w:r>
           <w:rPr>
@@ -5334,7 +5334,7 @@
           <w:lang w:eastAsia="nl-BE"/>
         </w:rPr>
       </w:pPr>
-      <w:hyperlink w:anchor="_Toc219557520" w:history="1">
+      <w:hyperlink w:anchor="_Toc219558646" w:history="1">
         <w:r>
           <w:rPr>
             <w:rStyle w:val="Hyperlink"/>
@@ -5361,7 +5361,7 @@
             <w:noProof/>
             <w:webHidden/>
           </w:rPr>
-          <w:instrText xml:space="preserve"> PAGEREF _Toc219557520 \h </w:instrText>
+          <w:instrText xml:space="preserve"> PAGEREF _Toc219558646 \h </w:instrText>
         </w:r>
         <w:r>
           <w:rPr>
@@ -5404,7 +5404,7 @@
           <w:lang w:eastAsia="nl-BE"/>
         </w:rPr>
       </w:pPr>
-      <w:hyperlink w:anchor="_Toc219557521" w:history="1">
+      <w:hyperlink w:anchor="_Toc219558647" w:history="1">
         <w:r>
           <w:rPr>
             <w:rStyle w:val="Hyperlink"/>
@@ -5431,7 +5431,7 @@
             <w:noProof/>
             <w:webHidden/>
           </w:rPr>
-          <w:instrText xml:space="preserve"> PAGEREF _Toc219557521 \h </w:instrText>
+          <w:instrText xml:space="preserve"> PAGEREF _Toc219558647 \h </w:instrText>
         </w:r>
         <w:r>
           <w:rPr>
@@ -5474,7 +5474,7 @@
           <w:lang w:eastAsia="nl-BE"/>
         </w:rPr>
       </w:pPr>
-      <w:hyperlink w:anchor="_Toc219557522" w:history="1">
+      <w:hyperlink w:anchor="_Toc219558648" w:history="1">
         <w:r>
           <w:rPr>
             <w:rStyle w:val="Hyperlink"/>
@@ -5501,7 +5501,7 @@
             <w:noProof/>
             <w:webHidden/>
           </w:rPr>
-          <w:instrText xml:space="preserve"> PAGEREF _Toc219557522 \h </w:instrText>
+          <w:instrText xml:space="preserve"> PAGEREF _Toc219558648 \h </w:instrText>
         </w:r>
         <w:r>
           <w:rPr>
@@ -5544,7 +5544,7 @@
           <w:lang w:eastAsia="nl-BE"/>
         </w:rPr>
       </w:pPr>
-      <w:hyperlink w:anchor="_Toc219557523" w:history="1">
+      <w:hyperlink w:anchor="_Toc219558649" w:history="1">
         <w:r>
           <w:rPr>
             <w:rStyle w:val="Hyperlink"/>
@@ -5571,7 +5571,7 @@
             <w:noProof/>
             <w:webHidden/>
           </w:rPr>
-          <w:instrText xml:space="preserve"> PAGEREF _Toc219557523 \h </w:instrText>
+          <w:instrText xml:space="preserve"> PAGEREF _Toc219558649 \h </w:instrText>
         </w:r>
         <w:r>
           <w:rPr>
@@ -5614,7 +5614,7 @@
           <w:lang w:eastAsia="nl-BE"/>
         </w:rPr>
       </w:pPr>
-      <w:hyperlink w:anchor="_Toc219557524" w:history="1">
+      <w:hyperlink w:anchor="_Toc219558650" w:history="1">
         <w:r>
           <w:rPr>
             <w:rStyle w:val="Hyperlink"/>
@@ -5641,7 +5641,7 @@
             <w:noProof/>
             <w:webHidden/>
           </w:rPr>
-          <w:instrText xml:space="preserve"> PAGEREF _Toc219557524 \h </w:instrText>
+          <w:instrText xml:space="preserve"> PAGEREF _Toc219558650 \h </w:instrText>
         </w:r>
         <w:r>
           <w:rPr>
@@ -5684,7 +5684,7 @@
           <w:lang w:eastAsia="nl-BE"/>
         </w:rPr>
       </w:pPr>
-      <w:hyperlink w:anchor="_Toc219557525" w:history="1">
+      <w:hyperlink w:anchor="_Toc219558651" w:history="1">
         <w:r>
           <w:rPr>
             <w:rStyle w:val="Hyperlink"/>
@@ -5711,7 +5711,7 @@
             <w:noProof/>
             <w:webHidden/>
           </w:rPr>
-          <w:instrText xml:space="preserve"> PAGEREF _Toc219557525 \h </w:instrText>
+          <w:instrText xml:space="preserve"> PAGEREF _Toc219558651 \h </w:instrText>
         </w:r>
         <w:r>
           <w:rPr>
@@ -5754,7 +5754,7 @@
           <w:lang w:eastAsia="nl-BE"/>
         </w:rPr>
       </w:pPr>
-      <w:hyperlink w:anchor="_Toc219557526" w:history="1">
+      <w:hyperlink w:anchor="_Toc219558652" w:history="1">
         <w:r>
           <w:rPr>
             <w:rStyle w:val="Hyperlink"/>
@@ -5781,7 +5781,7 @@
             <w:noProof/>
             <w:webHidden/>
           </w:rPr>
-          <w:instrText xml:space="preserve"> PAGEREF _Toc219557526 \h </w:instrText>
+          <w:instrText xml:space="preserve"> PAGEREF _Toc219558652 \h </w:instrText>
         </w:r>
         <w:r>
           <w:rPr>
@@ -5824,7 +5824,7 @@
           <w:lang w:eastAsia="nl-BE"/>
         </w:rPr>
       </w:pPr>
-      <w:hyperlink w:anchor="_Toc219557527" w:history="1">
+      <w:hyperlink w:anchor="_Toc219558653" w:history="1">
         <w:r>
           <w:rPr>
             <w:rStyle w:val="Hyperlink"/>
@@ -5851,7 +5851,7 @@
             <w:noProof/>
             <w:webHidden/>
           </w:rPr>
-          <w:instrText xml:space="preserve"> PAGEREF _Toc219557527 \h </w:instrText>
+          <w:instrText xml:space="preserve"> PAGEREF _Toc219558653 \h </w:instrText>
         </w:r>
         <w:r>
           <w:rPr>
@@ -5894,7 +5894,7 @@
           <w:lang w:eastAsia="nl-BE"/>
         </w:rPr>
       </w:pPr>
-      <w:hyperlink w:anchor="_Toc219557528" w:history="1">
+      <w:hyperlink w:anchor="_Toc219558654" w:history="1">
         <w:r>
           <w:rPr>
             <w:rStyle w:val="Hyperlink"/>
@@ -5921,7 +5921,7 @@
             <w:noProof/>
             <w:webHidden/>
           </w:rPr>
-          <w:instrText xml:space="preserve"> PAGEREF _Toc219557528 \h </w:instrText>
+          <w:instrText xml:space="preserve"> PAGEREF _Toc219558654 \h </w:instrText>
         </w:r>
         <w:r>
           <w:rPr>
@@ -5964,7 +5964,7 @@
           <w:lang w:eastAsia="nl-BE"/>
         </w:rPr>
       </w:pPr>
-      <w:hyperlink w:anchor="_Toc219557529" w:history="1">
+      <w:hyperlink w:anchor="_Toc219558655" w:history="1">
         <w:r>
           <w:rPr>
             <w:rStyle w:val="Hyperlink"/>
@@ -5991,7 +5991,7 @@
             <w:noProof/>
             <w:webHidden/>
           </w:rPr>
-          <w:instrText xml:space="preserve"> PAGEREF _Toc219557529 \h </w:instrText>
+          <w:instrText xml:space="preserve"> PAGEREF _Toc219558655 \h </w:instrText>
         </w:r>
         <w:r>
           <w:rPr>
@@ -6034,7 +6034,7 @@
           <w:lang w:eastAsia="nl-BE"/>
         </w:rPr>
       </w:pPr>
-      <w:hyperlink w:anchor="_Toc219557530" w:history="1">
+      <w:hyperlink w:anchor="_Toc219558656" w:history="1">
         <w:r>
           <w:rPr>
             <w:rStyle w:val="Hyperlink"/>
@@ -6061,7 +6061,7 @@
             <w:noProof/>
             <w:webHidden/>
           </w:rPr>
-          <w:instrText xml:space="preserve"> PAGEREF _Toc219557530 \h </w:instrText>
+          <w:instrText xml:space="preserve"> PAGEREF _Toc219558656 \h </w:instrText>
         </w:r>
         <w:r>
           <w:rPr>
@@ -6104,7 +6104,7 @@
           <w:lang w:eastAsia="nl-BE"/>
         </w:rPr>
       </w:pPr>
-      <w:hyperlink w:anchor="_Toc219557531" w:history="1">
+      <w:hyperlink w:anchor="_Toc219558657" w:history="1">
         <w:r>
           <w:rPr>
             <w:rStyle w:val="Hyperlink"/>
@@ -6131,7 +6131,7 @@
             <w:noProof/>
             <w:webHidden/>
           </w:rPr>
-          <w:instrText xml:space="preserve"> PAGEREF _Toc219557531 \h </w:instrText>
+          <w:instrText xml:space="preserve"> PAGEREF _Toc219558657 \h </w:instrText>
         </w:r>
         <w:r>
           <w:rPr>
@@ -6174,7 +6174,7 @@
           <w:lang w:eastAsia="nl-BE"/>
         </w:rPr>
       </w:pPr>
-      <w:hyperlink w:anchor="_Toc219557532" w:history="1">
+      <w:hyperlink w:anchor="_Toc219558658" w:history="1">
         <w:r>
           <w:rPr>
             <w:rStyle w:val="Hyperlink"/>
@@ -6201,7 +6201,7 @@
             <w:noProof/>
             <w:webHidden/>
           </w:rPr>
-          <w:instrText xml:space="preserve"> PAGEREF _Toc219557532 \h </w:instrText>
+          <w:instrText xml:space="preserve"> PAGEREF _Toc219558658 \h </w:instrText>
         </w:r>
         <w:r>
           <w:rPr>
@@ -6244,7 +6244,7 @@
           <w:lang w:eastAsia="nl-BE"/>
         </w:rPr>
       </w:pPr>
-      <w:hyperlink w:anchor="_Toc219557533" w:history="1">
+      <w:hyperlink w:anchor="_Toc219558659" w:history="1">
         <w:r>
           <w:rPr>
             <w:rStyle w:val="Hyperlink"/>
@@ -6271,7 +6271,7 @@
             <w:noProof/>
             <w:webHidden/>
           </w:rPr>
-          <w:instrText xml:space="preserve"> PAGEREF _Toc219557533 \h </w:instrText>
+          <w:instrText xml:space="preserve"> PAGEREF _Toc219558659 \h </w:instrText>
         </w:r>
         <w:r>
           <w:rPr>
@@ -6314,7 +6314,7 @@
           <w:lang w:eastAsia="nl-BE"/>
         </w:rPr>
       </w:pPr>
-      <w:hyperlink w:anchor="_Toc219557534" w:history="1">
+      <w:hyperlink w:anchor="_Toc219558660" w:history="1">
         <w:r>
           <w:rPr>
             <w:rStyle w:val="Hyperlink"/>
@@ -6341,7 +6341,7 @@
             <w:noProof/>
             <w:webHidden/>
           </w:rPr>
-          <w:instrText xml:space="preserve"> PAGEREF _Toc219557534 \h </w:instrText>
+          <w:instrText xml:space="preserve"> PAGEREF _Toc219558660 \h </w:instrText>
         </w:r>
         <w:r>
           <w:rPr>
@@ -6384,7 +6384,7 @@
           <w:lang w:eastAsia="nl-BE"/>
         </w:rPr>
       </w:pPr>
-      <w:hyperlink w:anchor="_Toc219557535" w:history="1">
+      <w:hyperlink w:anchor="_Toc219558661" w:history="1">
         <w:r>
           <w:rPr>
             <w:rStyle w:val="Hyperlink"/>
@@ -6411,7 +6411,7 @@
             <w:noProof/>
             <w:webHidden/>
           </w:rPr>
-          <w:instrText xml:space="preserve"> PAGEREF _Toc219557535 \h </w:instrText>
+          <w:instrText xml:space="preserve"> PAGEREF _Toc219558661 \h </w:instrText>
         </w:r>
         <w:r>
           <w:rPr>
@@ -6454,7 +6454,7 @@
           <w:lang w:eastAsia="nl-BE"/>
         </w:rPr>
       </w:pPr>
-      <w:hyperlink w:anchor="_Toc219557536" w:history="1">
+      <w:hyperlink w:anchor="_Toc219558662" w:history="1">
         <w:r>
           <w:rPr>
             <w:rStyle w:val="Hyperlink"/>
@@ -6481,7 +6481,7 @@
             <w:noProof/>
             <w:webHidden/>
           </w:rPr>
-          <w:instrText xml:space="preserve"> PAGEREF _Toc219557536 \h </w:instrText>
+          <w:instrText xml:space="preserve"> PAGEREF _Toc219558662 \h </w:instrText>
         </w:r>
         <w:r>
           <w:rPr>
@@ -6524,7 +6524,7 @@
           <w:lang w:eastAsia="nl-BE"/>
         </w:rPr>
       </w:pPr>
-      <w:hyperlink w:anchor="_Toc219557537" w:history="1">
+      <w:hyperlink w:anchor="_Toc219558663" w:history="1">
         <w:r>
           <w:rPr>
             <w:rStyle w:val="Hyperlink"/>
@@ -6551,7 +6551,7 @@
             <w:noProof/>
             <w:webHidden/>
           </w:rPr>
-          <w:instrText xml:space="preserve"> PAGEREF _Toc219557537 \h </w:instrText>
+          <w:instrText xml:space="preserve"> PAGEREF _Toc219558663 \h </w:instrText>
         </w:r>
         <w:r>
           <w:rPr>
@@ -6594,7 +6594,7 @@
           <w:lang w:eastAsia="nl-BE"/>
         </w:rPr>
       </w:pPr>
-      <w:hyperlink w:anchor="_Toc219557538" w:history="1">
+      <w:hyperlink w:anchor="_Toc219558664" w:history="1">
         <w:r>
           <w:rPr>
             <w:rStyle w:val="Hyperlink"/>
@@ -6621,7 +6621,7 @@
             <w:noProof/>
             <w:webHidden/>
           </w:rPr>
-          <w:instrText xml:space="preserve"> PAGEREF _Toc219557538 \h </w:instrText>
+          <w:instrText xml:space="preserve"> PAGEREF _Toc219558664 \h </w:instrText>
         </w:r>
         <w:r>
           <w:rPr>
@@ -6664,7 +6664,7 @@
           <w:lang w:eastAsia="nl-BE"/>
         </w:rPr>
       </w:pPr>
-      <w:hyperlink w:anchor="_Toc219557539" w:history="1">
+      <w:hyperlink w:anchor="_Toc219558665" w:history="1">
         <w:r>
           <w:rPr>
             <w:rStyle w:val="Hyperlink"/>
@@ -6691,7 +6691,7 @@
             <w:noProof/>
             <w:webHidden/>
           </w:rPr>
-          <w:instrText xml:space="preserve"> PAGEREF _Toc219557539 \h </w:instrText>
+          <w:instrText xml:space="preserve"> PAGEREF _Toc219558665 \h </w:instrText>
         </w:r>
         <w:r>
           <w:rPr>
@@ -6734,7 +6734,7 @@
           <w:lang w:eastAsia="nl-BE"/>
         </w:rPr>
       </w:pPr>
-      <w:hyperlink w:anchor="_Toc219557540" w:history="1">
+      <w:hyperlink w:anchor="_Toc219558666" w:history="1">
         <w:r>
           <w:rPr>
             <w:rStyle w:val="Hyperlink"/>
@@ -6761,7 +6761,7 @@
             <w:noProof/>
             <w:webHidden/>
           </w:rPr>
-          <w:instrText xml:space="preserve"> PAGEREF _Toc219557540 \h </w:instrText>
+          <w:instrText xml:space="preserve"> PAGEREF _Toc219558666 \h </w:instrText>
         </w:r>
         <w:r>
           <w:rPr>
@@ -6804,7 +6804,7 @@
           <w:lang w:eastAsia="nl-BE"/>
         </w:rPr>
       </w:pPr>
-      <w:hyperlink w:anchor="_Toc219557541" w:history="1">
+      <w:hyperlink w:anchor="_Toc219558667" w:history="1">
         <w:r>
           <w:rPr>
             <w:rStyle w:val="Hyperlink"/>
@@ -6831,7 +6831,7 @@
             <w:noProof/>
             <w:webHidden/>
           </w:rPr>
-          <w:instrText xml:space="preserve"> PAGEREF _Toc219557541 \h </w:instrText>
+          <w:instrText xml:space="preserve"> PAGEREF _Toc219558667 \h </w:instrText>
         </w:r>
         <w:r>
           <w:rPr>
@@ -6874,7 +6874,7 @@
           <w:lang w:eastAsia="nl-BE"/>
         </w:rPr>
       </w:pPr>
-      <w:hyperlink w:anchor="_Toc219557542" w:history="1">
+      <w:hyperlink w:anchor="_Toc219558668" w:history="1">
         <w:r>
           <w:rPr>
             <w:rStyle w:val="Hyperlink"/>
@@ -6901,7 +6901,7 @@
             <w:noProof/>
             <w:webHidden/>
           </w:rPr>
-          <w:instrText xml:space="preserve"> PAGEREF _Toc219557542 \h </w:instrText>
+          <w:instrText xml:space="preserve"> PAGEREF _Toc219558668 \h </w:instrText>
         </w:r>
         <w:r>
           <w:rPr>
@@ -6991,7 +6991,7 @@
           <w:color w:val="000000" w:themeColor="text1"/>
         </w:rPr>
       </w:pPr>
-      <w:bookmarkStart w:id="2" w:name="_Toc219557452"/>
+      <w:bookmarkStart w:id="2" w:name="_Toc219558578"/>
       <w:r>
         <w:rPr>
           <w:rFonts w:asciiTheme="minorHAnsi" w:hAnsiTheme="minorHAnsi"/>
@@ -7235,7 +7235,7 @@
           <w:lang w:val="en-GB"/>
         </w:rPr>
       </w:pPr>
-      <w:bookmarkStart w:id="3" w:name="_Toc219557453"/>
+      <w:bookmarkStart w:id="3" w:name="_Toc219558579"/>
       <w:r>
         <w:rPr>
           <w:rFonts w:asciiTheme="minorHAnsi" w:hAnsiTheme="minorHAnsi"/>
@@ -7513,7 +7513,7 @@
           <w:color w:val="000000" w:themeColor="text1"/>
         </w:rPr>
       </w:pPr>
-      <w:bookmarkStart w:id="4" w:name="_Toc219557454"/>
+      <w:bookmarkStart w:id="4" w:name="_Toc219558580"/>
       <w:r>
         <w:rPr>
           <w:rFonts w:asciiTheme="minorHAnsi" w:hAnsiTheme="minorHAnsi"/>
@@ -8236,7 +8236,7 @@
           <w:color w:val="000000" w:themeColor="text1"/>
         </w:rPr>
       </w:pPr>
-      <w:bookmarkStart w:id="6" w:name="_Toc219557455"/>
+      <w:bookmarkStart w:id="6" w:name="_Toc219558581"/>
       <w:r>
         <w:rPr>
           <w:rFonts w:asciiTheme="minorHAnsi" w:hAnsiTheme="minorHAnsi"/>
@@ -8291,7 +8291,7 @@
           <w:color w:val="000000" w:themeColor="text1"/>
         </w:rPr>
       </w:pPr>
-      <w:bookmarkStart w:id="7" w:name="_Toc219557456"/>
+      <w:bookmarkStart w:id="7" w:name="_Toc219558582"/>
       <w:r>
         <w:rPr>
           <w:rFonts w:asciiTheme="minorHAnsi" w:hAnsiTheme="minorHAnsi"/>
@@ -8354,7 +8354,7 @@
           <w:color w:val="000000" w:themeColor="text1"/>
         </w:rPr>
       </w:pPr>
-      <w:bookmarkStart w:id="8" w:name="_Toc219557457"/>
+      <w:bookmarkStart w:id="8" w:name="_Toc219558583"/>
       <w:r>
         <w:rPr>
           <w:b/>
@@ -8705,7 +8705,7 @@
           <w:color w:val="000000" w:themeColor="text1"/>
         </w:rPr>
       </w:pPr>
-      <w:bookmarkStart w:id="9" w:name="_Toc219557458"/>
+      <w:bookmarkStart w:id="9" w:name="_Toc219558584"/>
       <w:r>
         <w:rPr>
           <w:b/>
@@ -9070,7 +9070,7 @@
           <w:color w:val="000000" w:themeColor="text1"/>
         </w:rPr>
       </w:pPr>
-      <w:bookmarkStart w:id="10" w:name="_Toc219557459"/>
+      <w:bookmarkStart w:id="10" w:name="_Toc219558585"/>
       <w:r>
         <w:rPr>
           <w:rFonts w:asciiTheme="minorHAnsi" w:hAnsiTheme="minorHAnsi"/>
@@ -9973,7 +9973,7 @@
           <w:color w:val="auto"/>
         </w:rPr>
       </w:pPr>
-      <w:bookmarkStart w:id="11" w:name="_Toc219557518"/>
+      <w:bookmarkStart w:id="11" w:name="_Toc219558644"/>
       <w:r>
         <w:rPr>
           <w:color w:val="auto"/>
@@ -10535,7 +10535,7 @@
           <w:color w:val="000000" w:themeColor="text1"/>
         </w:rPr>
       </w:pPr>
-      <w:bookmarkStart w:id="12" w:name="_Toc219557460"/>
+      <w:bookmarkStart w:id="12" w:name="_Toc219558586"/>
       <w:r>
         <w:rPr>
           <w:rFonts w:asciiTheme="minorHAnsi" w:hAnsiTheme="minorHAnsi"/>
@@ -10711,7 +10711,7 @@
           <w:color w:val="000000" w:themeColor="text1"/>
         </w:rPr>
       </w:pPr>
-      <w:bookmarkStart w:id="13" w:name="_Toc219557461"/>
+      <w:bookmarkStart w:id="13" w:name="_Toc219558587"/>
       <w:r>
         <w:rPr>
           <w:rFonts w:asciiTheme="minorHAnsi" w:hAnsiTheme="minorHAnsi"/>
@@ -10805,7 +10805,7 @@
           <w:color w:val="000000" w:themeColor="text1"/>
         </w:rPr>
       </w:pPr>
-      <w:bookmarkStart w:id="14" w:name="_Toc219557462"/>
+      <w:bookmarkStart w:id="14" w:name="_Toc219558588"/>
       <w:r>
         <w:rPr>
           <w:rFonts w:asciiTheme="minorHAnsi" w:hAnsiTheme="minorHAnsi"/>
@@ -11036,7 +11036,7 @@
           <w:color w:val="000000" w:themeColor="text1"/>
         </w:rPr>
       </w:pPr>
-      <w:bookmarkStart w:id="15" w:name="_Toc219557463"/>
+      <w:bookmarkStart w:id="15" w:name="_Toc219558589"/>
       <w:r>
         <w:rPr>
           <w:rFonts w:asciiTheme="minorHAnsi" w:hAnsiTheme="minorHAnsi"/>
@@ -11082,7 +11082,7 @@
           <w:color w:val="auto"/>
         </w:rPr>
       </w:pPr>
-      <w:bookmarkStart w:id="16" w:name="_Toc219557464"/>
+      <w:bookmarkStart w:id="16" w:name="_Toc219558590"/>
       <w:r>
         <w:rPr>
           <w:b/>
@@ -11259,7 +11259,7 @@
           <w:color w:val="auto"/>
         </w:rPr>
       </w:pPr>
-      <w:bookmarkStart w:id="17" w:name="_Toc219557519"/>
+      <w:bookmarkStart w:id="17" w:name="_Toc219558645"/>
       <w:r>
         <w:rPr>
           <w:color w:val="auto"/>
@@ -11386,7 +11386,7 @@
           <w:color w:val="auto"/>
         </w:rPr>
       </w:pPr>
-      <w:bookmarkStart w:id="18" w:name="_Toc219557520"/>
+      <w:bookmarkStart w:id="18" w:name="_Toc219558646"/>
       <w:r>
         <w:rPr>
           <w:color w:val="auto"/>
@@ -11574,7 +11574,7 @@
           <w:color w:val="auto"/>
         </w:rPr>
       </w:pPr>
-      <w:bookmarkStart w:id="19" w:name="_Toc219557521"/>
+      <w:bookmarkStart w:id="19" w:name="_Toc219558647"/>
       <w:r>
         <w:rPr>
           <w:color w:val="auto"/>
@@ -11683,7 +11683,7 @@
           <w:color w:val="auto"/>
         </w:rPr>
       </w:pPr>
-      <w:bookmarkStart w:id="20" w:name="_Toc219557522"/>
+      <w:bookmarkStart w:id="20" w:name="_Toc219558648"/>
       <w:r>
         <w:rPr>
           <w:color w:val="auto"/>
@@ -11841,7 +11841,7 @@
           <w:color w:val="auto"/>
         </w:rPr>
       </w:pPr>
-      <w:bookmarkStart w:id="21" w:name="_Toc219557523"/>
+      <w:bookmarkStart w:id="21" w:name="_Toc219558649"/>
       <w:r>
         <w:rPr>
           <w:color w:val="auto"/>
@@ -11914,7 +11914,7 @@
           <w:color w:val="auto"/>
         </w:rPr>
       </w:pPr>
-      <w:bookmarkStart w:id="22" w:name="_Toc219557465"/>
+      <w:bookmarkStart w:id="22" w:name="_Toc219558591"/>
       <w:r>
         <w:rPr>
           <w:b/>
@@ -11980,7 +11980,7 @@
           <w:color w:val="000000" w:themeColor="text1"/>
         </w:rPr>
       </w:pPr>
-      <w:bookmarkStart w:id="23" w:name="_Toc219557466"/>
+      <w:bookmarkStart w:id="23" w:name="_Toc219558592"/>
       <w:r>
         <w:rPr>
           <w:rFonts w:asciiTheme="minorHAnsi" w:hAnsiTheme="minorHAnsi"/>
@@ -12147,7 +12147,7 @@
           <w:color w:val="auto"/>
         </w:rPr>
       </w:pPr>
-      <w:bookmarkStart w:id="24" w:name="_Toc219557467"/>
+      <w:bookmarkStart w:id="24" w:name="_Toc219558593"/>
       <w:r>
         <w:rPr>
           <w:rFonts w:asciiTheme="minorHAnsi" w:hAnsiTheme="minorHAnsi"/>
@@ -12184,7 +12184,7 @@
           <w:color w:val="auto"/>
         </w:rPr>
       </w:pPr>
-      <w:bookmarkStart w:id="25" w:name="_Toc219557468"/>
+      <w:bookmarkStart w:id="25" w:name="_Toc219558594"/>
       <w:r>
         <w:rPr>
           <w:b/>
@@ -12476,7 +12476,7 @@
           <w:color w:val="auto"/>
         </w:rPr>
       </w:pPr>
-      <w:bookmarkStart w:id="26" w:name="_Toc219557524"/>
+      <w:bookmarkStart w:id="26" w:name="_Toc219558650"/>
       <w:r>
         <w:rPr>
           <w:color w:val="auto"/>
@@ -12584,7 +12584,7 @@
           <w:color w:val="auto"/>
         </w:rPr>
       </w:pPr>
-      <w:bookmarkStart w:id="27" w:name="_Toc219557525"/>
+      <w:bookmarkStart w:id="27" w:name="_Toc219558651"/>
       <w:r>
         <w:rPr>
           <w:color w:val="auto"/>
@@ -12656,7 +12656,7 @@
           <w:color w:val="auto"/>
         </w:rPr>
       </w:pPr>
-      <w:bookmarkStart w:id="28" w:name="_Toc219557469"/>
+      <w:bookmarkStart w:id="28" w:name="_Toc219558595"/>
       <w:r>
         <w:rPr>
           <w:b/>
@@ -13153,7 +13153,7 @@
                                 <w:szCs w:val="20"/>
                               </w:rPr>
                             </w:pPr>
-                            <w:bookmarkStart w:id="31" w:name="_Toc219557526"/>
+                            <w:bookmarkStart w:id="31" w:name="_Toc219558652"/>
                             <w:r>
                               <w:rPr>
                                 <w:color w:val="auto"/>
@@ -13274,7 +13274,7 @@
                           <w:szCs w:val="20"/>
                         </w:rPr>
                       </w:pPr>
-                      <w:bookmarkStart w:id="32" w:name="_Toc219557526"/>
+                      <w:bookmarkStart w:id="32" w:name="_Toc219558652"/>
                       <w:r>
                         <w:rPr>
                           <w:color w:val="auto"/>
@@ -13757,7 +13757,7 @@
           <w:color w:val="auto"/>
         </w:rPr>
       </w:pPr>
-      <w:bookmarkStart w:id="33" w:name="_Toc219557470"/>
+      <w:bookmarkStart w:id="33" w:name="_Toc219558596"/>
       <w:r>
         <w:rPr>
           <w:b/>
@@ -14012,7 +14012,7 @@
           <w:color w:val="auto"/>
         </w:rPr>
       </w:pPr>
-      <w:bookmarkStart w:id="34" w:name="_Toc219557527"/>
+      <w:bookmarkStart w:id="34" w:name="_Toc219558653"/>
       <w:r>
         <w:rPr>
           <w:color w:val="auto"/>
@@ -14069,7 +14069,7 @@
           <w:color w:val="auto"/>
         </w:rPr>
       </w:pPr>
-      <w:bookmarkStart w:id="35" w:name="_Toc219557471"/>
+      <w:bookmarkStart w:id="35" w:name="_Toc219558597"/>
       <w:r>
         <w:rPr>
           <w:b/>
@@ -14361,7 +14361,7 @@
           <w:color w:val="auto"/>
         </w:rPr>
       </w:pPr>
-      <w:bookmarkStart w:id="36" w:name="_Toc219557528"/>
+      <w:bookmarkStart w:id="36" w:name="_Toc219558654"/>
       <w:r>
         <w:rPr>
           <w:color w:val="auto"/>
@@ -14433,7 +14433,7 @@
           <w:color w:val="auto"/>
         </w:rPr>
       </w:pPr>
-      <w:bookmarkStart w:id="37" w:name="_Toc219557472"/>
+      <w:bookmarkStart w:id="37" w:name="_Toc219558598"/>
       <w:r>
         <w:rPr>
           <w:b/>
@@ -14741,7 +14741,7 @@
           <w:color w:val="auto"/>
         </w:rPr>
       </w:pPr>
-      <w:bookmarkStart w:id="38" w:name="_Toc219557529"/>
+      <w:bookmarkStart w:id="38" w:name="_Toc219558655"/>
       <w:r>
         <w:rPr>
           <w:color w:val="auto"/>
@@ -14859,7 +14859,7 @@
           <w:color w:val="auto"/>
         </w:rPr>
       </w:pPr>
-      <w:bookmarkStart w:id="39" w:name="_Toc219557530"/>
+      <w:bookmarkStart w:id="39" w:name="_Toc219558656"/>
       <w:r>
         <w:rPr>
           <w:color w:val="auto"/>
@@ -14968,7 +14968,7 @@
           <w:color w:val="auto"/>
         </w:rPr>
       </w:pPr>
-      <w:bookmarkStart w:id="40" w:name="_Toc219557531"/>
+      <w:bookmarkStart w:id="40" w:name="_Toc219558657"/>
       <w:r>
         <w:rPr>
           <w:color w:val="auto"/>
@@ -15188,7 +15188,7 @@
           <w:color w:val="auto"/>
         </w:rPr>
       </w:pPr>
-      <w:bookmarkStart w:id="42" w:name="_Toc219557473"/>
+      <w:bookmarkStart w:id="42" w:name="_Toc219558599"/>
       <w:r>
         <w:rPr>
           <w:b/>
@@ -15571,7 +15571,7 @@
           <w:color w:val="auto"/>
         </w:rPr>
       </w:pPr>
-      <w:bookmarkStart w:id="43" w:name="_Toc219557532"/>
+      <w:bookmarkStart w:id="43" w:name="_Toc219558658"/>
       <w:r>
         <w:rPr>
           <w:color w:val="auto"/>
@@ -15696,7 +15696,7 @@
           <w:szCs w:val="28"/>
         </w:rPr>
       </w:pPr>
-      <w:bookmarkStart w:id="44" w:name="_Toc219557533"/>
+      <w:bookmarkStart w:id="44" w:name="_Toc219558659"/>
       <w:r>
         <w:rPr>
           <w:color w:val="auto"/>
@@ -15776,7 +15776,7 @@
           <w:color w:val="000000" w:themeColor="text1"/>
         </w:rPr>
       </w:pPr>
-      <w:bookmarkStart w:id="45" w:name="_Toc219557474"/>
+      <w:bookmarkStart w:id="45" w:name="_Toc219558600"/>
       <w:r>
         <w:rPr>
           <w:rFonts w:asciiTheme="minorHAnsi" w:hAnsiTheme="minorHAnsi"/>
@@ -16144,7 +16144,7 @@
           <w:color w:val="auto"/>
         </w:rPr>
       </w:pPr>
-      <w:bookmarkStart w:id="46" w:name="_Toc219557534"/>
+      <w:bookmarkStart w:id="46" w:name="_Toc219558660"/>
       <w:r>
         <w:rPr>
           <w:color w:val="auto"/>
@@ -16253,7 +16253,7 @@
           <w:color w:val="auto"/>
         </w:rPr>
       </w:pPr>
-      <w:bookmarkStart w:id="47" w:name="_Toc219557535"/>
+      <w:bookmarkStart w:id="47" w:name="_Toc219558661"/>
       <w:r>
         <w:rPr>
           <w:color w:val="auto"/>
@@ -16361,7 +16361,7 @@
           <w:color w:val="auto"/>
         </w:rPr>
       </w:pPr>
-      <w:bookmarkStart w:id="48" w:name="_Toc219557536"/>
+      <w:bookmarkStart w:id="48" w:name="_Toc219558662"/>
       <w:r>
         <w:rPr>
           <w:color w:val="auto"/>
@@ -16478,7 +16478,7 @@
           <w:color w:val="auto"/>
         </w:rPr>
       </w:pPr>
-      <w:bookmarkStart w:id="49" w:name="_Toc219557537"/>
+      <w:bookmarkStart w:id="49" w:name="_Toc219558663"/>
       <w:r>
         <w:rPr>
           <w:color w:val="auto"/>
@@ -16547,7 +16547,7 @@
           <w:color w:val="000000" w:themeColor="text1"/>
         </w:rPr>
       </w:pPr>
-      <w:bookmarkStart w:id="50" w:name="_Toc219557475"/>
+      <w:bookmarkStart w:id="50" w:name="_Toc219558601"/>
       <w:r>
         <w:rPr>
           <w:rFonts w:asciiTheme="minorHAnsi" w:hAnsiTheme="minorHAnsi"/>
@@ -16668,7 +16668,7 @@
           <w:color w:val="000000" w:themeColor="text1"/>
         </w:rPr>
       </w:pPr>
-      <w:bookmarkStart w:id="51" w:name="_Toc219557476"/>
+      <w:bookmarkStart w:id="51" w:name="_Toc219558602"/>
       <w:r>
         <w:rPr>
           <w:b/>
@@ -16826,7 +16826,7 @@
           <w:color w:val="000000" w:themeColor="text1"/>
         </w:rPr>
       </w:pPr>
-      <w:bookmarkStart w:id="52" w:name="_Toc219557477"/>
+      <w:bookmarkStart w:id="52" w:name="_Toc219558603"/>
       <w:r>
         <w:rPr>
           <w:b/>
@@ -16957,7 +16957,7 @@
           <w:color w:val="000000" w:themeColor="text1"/>
         </w:rPr>
       </w:pPr>
-      <w:bookmarkStart w:id="53" w:name="_Toc219557478"/>
+      <w:bookmarkStart w:id="53" w:name="_Toc219558604"/>
       <w:r>
         <w:rPr>
           <w:b/>
@@ -17092,7 +17092,7 @@
           <w:color w:val="000000" w:themeColor="text1"/>
         </w:rPr>
       </w:pPr>
-      <w:bookmarkStart w:id="54" w:name="_Toc219557479"/>
+      <w:bookmarkStart w:id="54" w:name="_Toc219558605"/>
       <w:r>
         <w:rPr>
           <w:b/>
@@ -17213,7 +17213,7 @@
           <w:color w:val="000000" w:themeColor="text1"/>
         </w:rPr>
       </w:pPr>
-      <w:bookmarkStart w:id="55" w:name="_Toc219557480"/>
+      <w:bookmarkStart w:id="55" w:name="_Toc219558606"/>
       <w:r>
         <w:rPr>
           <w:b/>
@@ -17317,7 +17317,7 @@
           <w:color w:val="000000" w:themeColor="text1"/>
         </w:rPr>
       </w:pPr>
-      <w:bookmarkStart w:id="56" w:name="_Toc219557481"/>
+      <w:bookmarkStart w:id="56" w:name="_Toc219558607"/>
       <w:r>
         <w:rPr>
           <w:b/>
@@ -17440,7 +17440,7 @@
           <w:color w:val="000000" w:themeColor="text1"/>
         </w:rPr>
       </w:pPr>
-      <w:bookmarkStart w:id="57" w:name="_Toc219557482"/>
+      <w:bookmarkStart w:id="57" w:name="_Toc219558608"/>
       <w:r>
         <w:rPr>
           <w:b/>
@@ -17545,7 +17545,7 @@
           <w:color w:val="000000" w:themeColor="text1"/>
         </w:rPr>
       </w:pPr>
-      <w:bookmarkStart w:id="58" w:name="_Toc219557483"/>
+      <w:bookmarkStart w:id="58" w:name="_Toc219558609"/>
       <w:r>
         <w:rPr>
           <w:b/>
@@ -17652,7 +17652,7 @@
           <w:color w:val="000000" w:themeColor="text1"/>
         </w:rPr>
       </w:pPr>
-      <w:bookmarkStart w:id="59" w:name="_Toc219557484"/>
+      <w:bookmarkStart w:id="59" w:name="_Toc219558610"/>
       <w:r>
         <w:rPr>
           <w:b/>
@@ -17799,7 +17799,7 @@
           <w:color w:val="000000" w:themeColor="text1"/>
         </w:rPr>
       </w:pPr>
-      <w:bookmarkStart w:id="60" w:name="_Toc219557485"/>
+      <w:bookmarkStart w:id="60" w:name="_Toc219558611"/>
       <w:r>
         <w:rPr>
           <w:b/>
@@ -17919,7 +17919,7 @@
           <w:color w:val="000000" w:themeColor="text1"/>
         </w:rPr>
       </w:pPr>
-      <w:bookmarkStart w:id="61" w:name="_Toc219557486"/>
+      <w:bookmarkStart w:id="61" w:name="_Toc219558612"/>
       <w:r>
         <w:rPr>
           <w:rFonts w:asciiTheme="minorHAnsi" w:hAnsiTheme="minorHAnsi"/>
@@ -18181,7 +18181,7 @@
           <w:color w:val="000000" w:themeColor="text1"/>
         </w:rPr>
       </w:pPr>
-      <w:bookmarkStart w:id="62" w:name="_Toc219557487"/>
+      <w:bookmarkStart w:id="62" w:name="_Toc219558613"/>
       <w:r>
         <w:rPr>
           <w:rFonts w:asciiTheme="minorHAnsi" w:hAnsiTheme="minorHAnsi"/>
@@ -18227,7 +18227,7 @@
           <w:color w:val="000000" w:themeColor="text1"/>
         </w:rPr>
       </w:pPr>
-      <w:bookmarkStart w:id="63" w:name="_Toc219557488"/>
+      <w:bookmarkStart w:id="63" w:name="_Toc219558614"/>
       <w:r>
         <w:rPr>
           <w:rFonts w:asciiTheme="minorHAnsi" w:hAnsiTheme="minorHAnsi"/>
@@ -18381,7 +18381,7 @@
           <w:color w:val="000000" w:themeColor="text1"/>
         </w:rPr>
       </w:pPr>
-      <w:bookmarkStart w:id="64" w:name="_Toc219557489"/>
+      <w:bookmarkStart w:id="64" w:name="_Toc219558615"/>
       <w:r>
         <w:rPr>
           <w:rFonts w:asciiTheme="minorHAnsi" w:hAnsiTheme="minorHAnsi"/>
@@ -18661,7 +18661,7 @@
           <w:color w:val="000000" w:themeColor="text1"/>
         </w:rPr>
       </w:pPr>
-      <w:bookmarkStart w:id="65" w:name="_Toc219557490"/>
+      <w:bookmarkStart w:id="65" w:name="_Toc219558616"/>
       <w:r>
         <w:rPr>
           <w:rFonts w:asciiTheme="minorHAnsi" w:hAnsiTheme="minorHAnsi"/>
@@ -18941,7 +18941,7 @@
           <w:color w:val="000000" w:themeColor="text1"/>
         </w:rPr>
       </w:pPr>
-      <w:bookmarkStart w:id="66" w:name="_Toc219557491"/>
+      <w:bookmarkStart w:id="66" w:name="_Toc219558617"/>
       <w:r>
         <w:rPr>
           <w:rFonts w:asciiTheme="minorHAnsi" w:hAnsiTheme="minorHAnsi"/>
@@ -19353,7 +19353,7 @@
           <w:color w:val="auto"/>
         </w:rPr>
       </w:pPr>
-      <w:bookmarkStart w:id="67" w:name="_Toc219557538"/>
+      <w:bookmarkStart w:id="67" w:name="_Toc219558664"/>
       <w:r>
         <w:rPr>
           <w:color w:val="auto"/>
@@ -19463,7 +19463,7 @@
           <w:color w:val="auto"/>
         </w:rPr>
       </w:pPr>
-      <w:bookmarkStart w:id="68" w:name="_Toc219557539"/>
+      <w:bookmarkStart w:id="68" w:name="_Toc219558665"/>
       <w:r>
         <w:rPr>
           <w:color w:val="auto"/>
@@ -19581,7 +19581,7 @@
           <w:color w:val="auto"/>
         </w:rPr>
       </w:pPr>
-      <w:bookmarkStart w:id="69" w:name="_Toc219557540"/>
+      <w:bookmarkStart w:id="69" w:name="_Toc219558666"/>
       <w:r>
         <w:rPr>
           <w:color w:val="auto"/>
@@ -19674,7 +19674,7 @@
           <w:color w:val="000000" w:themeColor="text1"/>
         </w:rPr>
       </w:pPr>
-      <w:bookmarkStart w:id="70" w:name="_Toc219557492"/>
+      <w:bookmarkStart w:id="70" w:name="_Toc219558618"/>
       <w:r>
         <w:rPr>
           <w:rFonts w:asciiTheme="minorHAnsi" w:hAnsiTheme="minorHAnsi"/>
@@ -20306,7 +20306,7 @@
           <w:color w:val="000000" w:themeColor="text1"/>
         </w:rPr>
       </w:pPr>
-      <w:bookmarkStart w:id="71" w:name="_Toc219557493"/>
+      <w:bookmarkStart w:id="71" w:name="_Toc219558619"/>
       <w:r>
         <w:rPr>
           <w:rFonts w:asciiTheme="minorHAnsi" w:hAnsiTheme="minorHAnsi"/>
@@ -20492,7 +20492,7 @@
           <w:color w:val="000000" w:themeColor="text1"/>
         </w:rPr>
       </w:pPr>
-      <w:bookmarkStart w:id="72" w:name="_Toc219557494"/>
+      <w:bookmarkStart w:id="72" w:name="_Toc219558620"/>
       <w:r>
         <w:rPr>
           <w:rFonts w:asciiTheme="minorHAnsi" w:hAnsiTheme="minorHAnsi"/>
@@ -20667,7 +20667,7 @@
           <w:color w:val="000000" w:themeColor="text1"/>
         </w:rPr>
       </w:pPr>
-      <w:bookmarkStart w:id="73" w:name="_Toc219557495"/>
+      <w:bookmarkStart w:id="73" w:name="_Toc219558621"/>
       <w:r>
         <w:rPr>
           <w:rFonts w:asciiTheme="minorHAnsi" w:hAnsiTheme="minorHAnsi"/>
@@ -20841,7 +20841,7 @@
           <w:color w:val="000000" w:themeColor="text1"/>
         </w:rPr>
       </w:pPr>
-      <w:bookmarkStart w:id="74" w:name="_Toc219557496"/>
+      <w:bookmarkStart w:id="74" w:name="_Toc219558622"/>
       <w:r>
         <w:rPr>
           <w:rFonts w:asciiTheme="minorHAnsi" w:hAnsiTheme="minorHAnsi"/>
@@ -21000,7 +21000,7 @@
           <w:lang w:eastAsia="nl-BE"/>
         </w:rPr>
       </w:pPr>
-      <w:bookmarkStart w:id="75" w:name="_Toc219557497"/>
+      <w:bookmarkStart w:id="75" w:name="_Toc219558623"/>
       <w:r>
         <w:rPr>
           <w:rFonts w:asciiTheme="minorHAnsi" w:eastAsia="Times New Roman" w:hAnsiTheme="minorHAnsi"/>
@@ -21473,7 +21473,7 @@
           <w:color w:val="auto"/>
         </w:rPr>
       </w:pPr>
-      <w:bookmarkStart w:id="76" w:name="_Toc219557541"/>
+      <w:bookmarkStart w:id="76" w:name="_Toc219558667"/>
       <w:r>
         <w:rPr>
           <w:color w:val="auto"/>
@@ -21562,7 +21562,7 @@
           <w:lang w:eastAsia="nl-BE"/>
         </w:rPr>
       </w:pPr>
-      <w:bookmarkStart w:id="77" w:name="_Toc219557498"/>
+      <w:bookmarkStart w:id="77" w:name="_Toc219558624"/>
       <w:r>
         <w:rPr>
           <w:rFonts w:asciiTheme="minorHAnsi" w:eastAsia="Times New Roman" w:hAnsiTheme="minorHAnsi"/>
@@ -21831,7 +21831,7 @@
           <w:lang w:eastAsia="nl-BE"/>
         </w:rPr>
       </w:pPr>
-      <w:bookmarkStart w:id="78" w:name="_Toc219557499"/>
+      <w:bookmarkStart w:id="78" w:name="_Toc219558625"/>
       <w:r>
         <w:rPr>
           <w:rFonts w:asciiTheme="minorHAnsi" w:eastAsia="Times New Roman" w:hAnsiTheme="minorHAnsi"/>
@@ -22098,7 +22098,7 @@
           <w14:ligatures w14:val="none"/>
         </w:rPr>
       </w:pPr>
-      <w:bookmarkStart w:id="79" w:name="_Toc219557542"/>
+      <w:bookmarkStart w:id="79" w:name="_Toc219558668"/>
       <w:r>
         <w:rPr>
           <w:color w:val="auto"/>
@@ -22179,7 +22179,7 @@
           <w:lang w:eastAsia="nl-BE"/>
         </w:rPr>
       </w:pPr>
-      <w:bookmarkStart w:id="80" w:name="_Toc219557500"/>
+      <w:bookmarkStart w:id="80" w:name="_Toc219558626"/>
       <w:r>
         <w:rPr>
           <w:rFonts w:asciiTheme="minorHAnsi" w:eastAsia="Times New Roman" w:hAnsiTheme="minorHAnsi"/>
@@ -22431,7 +22431,7 @@
           <w:lang w:eastAsia="nl-BE"/>
         </w:rPr>
       </w:pPr>
-      <w:bookmarkStart w:id="81" w:name="_Toc219557501"/>
+      <w:bookmarkStart w:id="81" w:name="_Toc219558627"/>
       <w:r>
         <w:rPr>
           <w:rFonts w:asciiTheme="minorHAnsi" w:eastAsia="Times New Roman" w:hAnsiTheme="minorHAnsi"/>
@@ -22557,7 +22557,7 @@
           <w:lang w:eastAsia="nl-BE"/>
         </w:rPr>
       </w:pPr>
-      <w:bookmarkStart w:id="82" w:name="_Toc219557502"/>
+      <w:bookmarkStart w:id="82" w:name="_Toc219558628"/>
       <w:r>
         <w:rPr>
           <w:rFonts w:asciiTheme="minorHAnsi" w:eastAsia="Times New Roman" w:hAnsiTheme="minorHAnsi"/>
@@ -22692,7 +22692,7 @@
           <w:color w:val="000000" w:themeColor="text1"/>
         </w:rPr>
       </w:pPr>
-      <w:bookmarkStart w:id="83" w:name="_Toc219557503"/>
+      <w:bookmarkStart w:id="83" w:name="_Toc219558629"/>
       <w:r>
         <w:rPr>
           <w:rFonts w:asciiTheme="minorHAnsi" w:hAnsiTheme="minorHAnsi"/>
@@ -22751,7 +22751,7 @@
           <w:color w:val="000000" w:themeColor="text1"/>
         </w:rPr>
       </w:pPr>
-      <w:bookmarkStart w:id="84" w:name="_Toc219557504"/>
+      <w:bookmarkStart w:id="84" w:name="_Toc219558630"/>
       <w:r>
         <w:rPr>
           <w:b/>
@@ -22821,7 +22821,7 @@
           <w:color w:val="000000" w:themeColor="text1"/>
         </w:rPr>
       </w:pPr>
-      <w:bookmarkStart w:id="85" w:name="_Toc219557505"/>
+      <w:bookmarkStart w:id="85" w:name="_Toc219558631"/>
       <w:r>
         <w:rPr>
           <w:b/>
@@ -23015,7 +23015,7 @@
           <w:color w:val="000000" w:themeColor="text1"/>
         </w:rPr>
       </w:pPr>
-      <w:bookmarkStart w:id="86" w:name="_Toc219557506"/>
+      <w:bookmarkStart w:id="86" w:name="_Toc219558632"/>
       <w:r>
         <w:rPr>
           <w:b/>
@@ -23142,7 +23142,7 @@
           <w:color w:val="000000" w:themeColor="text1"/>
         </w:rPr>
       </w:pPr>
-      <w:bookmarkStart w:id="87" w:name="_Toc219557507"/>
+      <w:bookmarkStart w:id="87" w:name="_Toc219558633"/>
       <w:r>
         <w:rPr>
           <w:rFonts w:asciiTheme="minorHAnsi" w:hAnsiTheme="minorHAnsi"/>
@@ -23189,7 +23189,7 @@
           <w:lang w:eastAsia="nl-BE"/>
         </w:rPr>
       </w:pPr>
-      <w:bookmarkStart w:id="88" w:name="_Toc219557508"/>
+      <w:bookmarkStart w:id="88" w:name="_Toc219558634"/>
       <w:r>
         <w:rPr>
           <w:rFonts w:asciiTheme="minorHAnsi" w:eastAsia="Times New Roman" w:hAnsiTheme="minorHAnsi"/>
@@ -24405,7 +24405,7 @@
           <w:lang w:eastAsia="nl-BE"/>
         </w:rPr>
       </w:pPr>
-      <w:bookmarkStart w:id="89" w:name="_Toc219557509"/>
+      <w:bookmarkStart w:id="89" w:name="_Toc219558635"/>
       <w:r>
         <w:rPr>
           <w:rFonts w:asciiTheme="minorHAnsi" w:eastAsia="Times New Roman" w:hAnsiTheme="minorHAnsi"/>
@@ -24721,7 +24721,7 @@
           <w:lang w:eastAsia="nl-BE"/>
         </w:rPr>
       </w:pPr>
-      <w:bookmarkStart w:id="90" w:name="_Toc219557510"/>
+      <w:bookmarkStart w:id="90" w:name="_Toc219558636"/>
       <w:r>
         <w:rPr>
           <w:rFonts w:asciiTheme="minorHAnsi" w:eastAsia="Times New Roman" w:hAnsiTheme="minorHAnsi"/>
@@ -25069,7 +25069,7 @@
           <w:lang w:eastAsia="nl-BE"/>
         </w:rPr>
       </w:pPr>
-      <w:bookmarkStart w:id="91" w:name="_Toc219557511"/>
+      <w:bookmarkStart w:id="91" w:name="_Toc219558637"/>
       <w:r>
         <w:rPr>
           <w:rFonts w:asciiTheme="minorHAnsi" w:eastAsia="Times New Roman" w:hAnsiTheme="minorHAnsi"/>
@@ -25453,7 +25453,7 @@
           <w:color w:val="000000" w:themeColor="text1"/>
         </w:rPr>
       </w:pPr>
-      <w:bookmarkStart w:id="92" w:name="_Toc219557512"/>
+      <w:bookmarkStart w:id="92" w:name="_Toc219558638"/>
       <w:r>
         <w:rPr>
           <w:rFonts w:asciiTheme="minorHAnsi" w:hAnsiTheme="minorHAnsi"/>
@@ -26019,7 +26019,7 @@
           <w:lang w:val="en-US"/>
         </w:rPr>
       </w:pPr>
-      <w:bookmarkStart w:id="93" w:name="_Toc219557513"/>
+      <w:bookmarkStart w:id="93" w:name="_Toc219558639"/>
       <w:r>
         <w:rPr>
           <w:rFonts w:asciiTheme="minorHAnsi" w:hAnsiTheme="minorHAnsi"/>
@@ -26548,7 +26548,7 @@
           <w:color w:val="000000" w:themeColor="text1"/>
         </w:rPr>
       </w:pPr>
-      <w:bookmarkStart w:id="94" w:name="_Toc219557514"/>
+      <w:bookmarkStart w:id="94" w:name="_Toc219558640"/>
       <w:r>
         <w:rPr>
           <w:rFonts w:asciiTheme="minorHAnsi" w:hAnsiTheme="minorHAnsi"/>
@@ -26589,7 +26589,7 @@
           <w:color w:val="000000" w:themeColor="text1"/>
         </w:rPr>
       </w:pPr>
-      <w:bookmarkStart w:id="95" w:name="_Toc219557515"/>
+      <w:bookmarkStart w:id="95" w:name="_Toc219558641"/>
       <w:r>
         <w:rPr>
           <w:b/>
@@ -27022,7 +27022,7 @@
           <w:color w:val="000000" w:themeColor="text1"/>
         </w:rPr>
       </w:pPr>
-      <w:bookmarkStart w:id="96" w:name="_Toc219557516"/>
+      <w:bookmarkStart w:id="96" w:name="_Toc219558642"/>
       <w:r>
         <w:rPr>
           <w:b/>
@@ -27543,7 +27543,7 @@
           <w:color w:val="000000" w:themeColor="text1"/>
         </w:rPr>
       </w:pPr>
-      <w:bookmarkStart w:id="97" w:name="_Toc219557517"/>
+      <w:bookmarkStart w:id="97" w:name="_Toc219558643"/>
       <w:r>
         <w:rPr>
           <w:rFonts w:asciiTheme="minorHAnsi" w:hAnsiTheme="minorHAnsi"/>

</xml_diff>

<commit_message>
rewritten parts to fit better academic writing style
</commit_message>
<xml_diff>
--- a/Master_scriptie_tekst.docx
+++ b/Master_scriptie_tekst.docx
@@ -7547,7 +7547,67 @@
         <w:rPr>
           <w:color w:val="000000" w:themeColor="text1"/>
         </w:rPr>
-        <w:t>Threat modeling is een systematische techniek om mogelijke dreigingen tegen een softwaresysteem te identificeren, te analyseren en te prioriteren nog vóór implementatie of tijdens evolutief onderhoud. In essentie dwingt threat modeling ontwikkelaars en architecten om expliciet na te denken over “wat kan er misgaan?”, “wat is de impact?” en “welke maatregelen zijn nodig?”, en vormt het daarmee een kernonderdeel van secure software engineering. Het proces omvat typisch het in kaart brengen van systeemcomponenten en dataflows, het identificeren van potentiële aanvallers en aanvalspaden, en het koppelen van passende mitigaties aan de belangrijkste risico’s.</w:t>
+        <w:t>Threat modeling is een systematische techniek om mogelijke dreigingen tegen een softwaresysteem te identificeren, te analyseren en te prioriteren</w:t>
+      </w:r>
+      <w:r>
+        <w:rPr>
+          <w:color w:val="000000" w:themeColor="text1"/>
+        </w:rPr>
+        <w:t xml:space="preserve">. Dit proces vind plaats </w:t>
+      </w:r>
+      <w:r>
+        <w:rPr>
+          <w:color w:val="000000" w:themeColor="text1"/>
+        </w:rPr>
+        <w:t>v</w:t>
+      </w:r>
+      <w:r>
+        <w:rPr>
+          <w:color w:val="000000" w:themeColor="text1"/>
+        </w:rPr>
+        <w:t>oo</w:t>
+      </w:r>
+      <w:r>
+        <w:rPr>
+          <w:color w:val="000000" w:themeColor="text1"/>
+        </w:rPr>
+        <w:t xml:space="preserve">r </w:t>
+      </w:r>
+      <w:r>
+        <w:rPr>
+          <w:color w:val="000000" w:themeColor="text1"/>
+        </w:rPr>
+        <w:t xml:space="preserve">de </w:t>
+      </w:r>
+      <w:r>
+        <w:rPr>
+          <w:color w:val="000000" w:themeColor="text1"/>
+        </w:rPr>
+        <w:t>implementatie of tijdens evolutief onderhoud. In essentie dwingt threat modeling ontwikkelaars en architecten om expliciet na te denken over “wat kan er misgaan?”, “wat is de impact?” en “welke maatregelen zijn nodig?”</w:t>
+      </w:r>
+      <w:r>
+        <w:rPr>
+          <w:color w:val="000000" w:themeColor="text1"/>
+        </w:rPr>
+        <w:t xml:space="preserve">. Hierdoor </w:t>
+      </w:r>
+      <w:r>
+        <w:rPr>
+          <w:color w:val="000000" w:themeColor="text1"/>
+        </w:rPr>
+        <w:t>vormt het daarmee een kernonderdeel van secure software engineering. Het proces omvat typisch het in kaart brengen van systeemcomponenten en dataflows, het identificeren van potentiële aanvallers en aanvalspaden</w:t>
+      </w:r>
+      <w:r>
+        <w:rPr>
+          <w:color w:val="000000" w:themeColor="text1"/>
+        </w:rPr>
+        <w:t xml:space="preserve"> </w:t>
+      </w:r>
+      <w:r>
+        <w:rPr>
+          <w:color w:val="000000" w:themeColor="text1"/>
+        </w:rPr>
+        <w:t>en het koppelen van passende mitigaties aan de belangrijkste risico’s.</w:t>
       </w:r>
       <w:r>
         <w:rPr>
@@ -7691,7 +7751,91 @@
         <w:rPr>
           <w:color w:val="000000" w:themeColor="text1"/>
         </w:rPr>
-        <w:t>Door de jaren heen zijn diverse methoden ontwikkeld om threat modeling te structureren. Een bekende categorie zijn taxonomie-gebaseerde benaderingen, zoals STRIDE, die dreigingen klasseren op basis van hun effect (bijvoorbeeld spoofing, tampering, repudiation, information disclosure, denial of service, elevation of privilege). Andere benaderingen maken gebruik van attack trees of misuse cases</w:t>
+        <w:t xml:space="preserve">Door de jaren heen zijn diverse methoden ontwikkeld om threat modeling te structureren. Een bekende categorie zijn taxonomie-gebaseerde benaderingen, zoals STRIDE, die dreigingen klasseren op basis van hun effect (bijvoorbeeld </w:t>
+      </w:r>
+      <w:r>
+        <w:rPr>
+          <w:i/>
+          <w:iCs/>
+          <w:color w:val="000000" w:themeColor="text1"/>
+        </w:rPr>
+        <w:t>spoofing</w:t>
+      </w:r>
+      <w:r>
+        <w:rPr>
+          <w:color w:val="000000" w:themeColor="text1"/>
+        </w:rPr>
+        <w:t xml:space="preserve">, </w:t>
+      </w:r>
+      <w:r>
+        <w:rPr>
+          <w:i/>
+          <w:iCs/>
+          <w:color w:val="000000" w:themeColor="text1"/>
+        </w:rPr>
+        <w:t>tampering</w:t>
+      </w:r>
+      <w:r>
+        <w:rPr>
+          <w:color w:val="000000" w:themeColor="text1"/>
+        </w:rPr>
+        <w:t xml:space="preserve">, </w:t>
+      </w:r>
+      <w:r>
+        <w:rPr>
+          <w:i/>
+          <w:iCs/>
+          <w:color w:val="000000" w:themeColor="text1"/>
+        </w:rPr>
+        <w:t>repudiation</w:t>
+      </w:r>
+      <w:r>
+        <w:rPr>
+          <w:color w:val="000000" w:themeColor="text1"/>
+        </w:rPr>
+        <w:t xml:space="preserve">, </w:t>
+      </w:r>
+      <w:r>
+        <w:rPr>
+          <w:i/>
+          <w:iCs/>
+          <w:color w:val="000000" w:themeColor="text1"/>
+        </w:rPr>
+        <w:t>information disclosure</w:t>
+      </w:r>
+      <w:r>
+        <w:rPr>
+          <w:color w:val="000000" w:themeColor="text1"/>
+        </w:rPr>
+        <w:t xml:space="preserve">, </w:t>
+      </w:r>
+      <w:r>
+        <w:rPr>
+          <w:i/>
+          <w:iCs/>
+          <w:color w:val="000000" w:themeColor="text1"/>
+        </w:rPr>
+        <w:t>denial of service, elevation of privilege</w:t>
+      </w:r>
+      <w:r>
+        <w:rPr>
+          <w:color w:val="000000" w:themeColor="text1"/>
+        </w:rPr>
+        <w:t xml:space="preserve">). Andere benaderingen maken gebruik van attack trees of </w:t>
+      </w:r>
+      <w:r>
+        <w:rPr>
+          <w:i/>
+          <w:iCs/>
+          <w:color w:val="000000" w:themeColor="text1"/>
+        </w:rPr>
+        <w:t>misuse</w:t>
+      </w:r>
+      <w:r>
+        <w:rPr>
+          <w:color w:val="000000" w:themeColor="text1"/>
+        </w:rPr>
+        <w:t xml:space="preserve"> cases</w:t>
       </w:r>
       <w:r>
         <w:rPr>
@@ -7739,7 +7883,19 @@
         <w:rPr>
           <w:color w:val="000000" w:themeColor="text1"/>
         </w:rPr>
-        <w:t>maar weinig domeinspecifieke ondersteuning voor prioritering</w:t>
+        <w:t xml:space="preserve">maar weinig </w:t>
+      </w:r>
+      <w:r>
+        <w:rPr>
+          <w:color w:val="000000" w:themeColor="text1"/>
+        </w:rPr>
+        <w:t>domein specifieke</w:t>
+      </w:r>
+      <w:r>
+        <w:rPr>
+          <w:color w:val="000000" w:themeColor="text1"/>
+        </w:rPr>
+        <w:t xml:space="preserve"> ondersteuning voor prioritering</w:t>
       </w:r>
       <w:r>
         <w:rPr>
@@ -7804,14 +7960,38 @@
         <w:rPr>
           <w:color w:val="000000" w:themeColor="text1"/>
         </w:rPr>
-        <w:t xml:space="preserve">e vergen vertrouwdheid met beveiligingsconcepten, formele notaties en lijsten van standaarddreigingen, terwijl de beschikbare tools zelden gericht zijn op gebruiksgemak of leerbaarheid. Hierdoor dreigt threat modeling een specialistische activiteit te blijven, in plaats van een breed gedragen ontwerpraktijk binnen ontwikkelteams. Deze kloof tussen theoretisch aanbevolen werkwijzen en feitelijke toepassing in de praktijk vormt een belangrijk motief </w:t>
+        <w:t>e vergen vertrouwdheid met beveiligingsconcepten, formele notaties en lijsten van standaarddreigingen</w:t>
+      </w:r>
+      <w:r>
+        <w:rPr>
+          <w:color w:val="000000" w:themeColor="text1"/>
+        </w:rPr>
+        <w:t xml:space="preserve">. Dit </w:t>
+      </w:r>
+      <w:r>
+        <w:rPr>
+          <w:color w:val="000000" w:themeColor="text1"/>
+        </w:rPr>
+        <w:t>terwijl de beschikbare tools zelden gericht zijn op gebruiksgemak of leerbaarheid. Hierdoor dreigt threat modeling een specialistische activiteit te blijven, in plaats van een breed gedragen ontwer</w:t>
+      </w:r>
+      <w:r>
+        <w:rPr>
+          <w:color w:val="000000" w:themeColor="text1"/>
+        </w:rPr>
+        <w:t>p</w:t>
+      </w:r>
+      <w:r>
+        <w:rPr>
+          <w:color w:val="000000" w:themeColor="text1"/>
+        </w:rPr>
+        <w:t xml:space="preserve">praktijk binnen ontwikkelteams. Deze kloof tussen theoretisch </w:t>
       </w:r>
       <w:r>
         <w:rPr>
           <w:color w:val="000000" w:themeColor="text1"/>
         </w:rPr>
         <w:lastRenderedPageBreak/>
-        <w:t>voor onderzoek naar meer toegankelijke, visueel ondersteunde en gebruiksvriendelijke threat-modelingbenaderingen</w:t>
+        <w:t>aanbevolen werkwijzen en feitelijke toepassing in de praktijk vormt een belangrijk motief voor onderzoek naar meer toegankelijke, visueel ondersteunde en gebruiksvriendelijke threat-modelingbenaderingen</w:t>
       </w:r>
       <w:r>
         <w:rPr>
@@ -7953,7 +8133,19 @@
         <w:rPr>
           <w:color w:val="000000" w:themeColor="text1"/>
         </w:rPr>
-        <w:t>Welke basisfunctionaliteit is minimaal noodzakelijk om threat modeling met Fortunately-Unfortunately trees te ondersteunen?</w:t>
+        <w:t>w</w:t>
+      </w:r>
+      <w:r>
+        <w:rPr>
+          <w:color w:val="000000" w:themeColor="text1"/>
+        </w:rPr>
+        <w:t>elke basisfunctionaliteit is minimaal noodzakelijk om threat modeling met Fortunately-Unfortunately trees te ondersteunen</w:t>
+      </w:r>
+      <w:r>
+        <w:rPr>
+          <w:color w:val="000000" w:themeColor="text1"/>
+        </w:rPr>
+        <w:t>;</w:t>
       </w:r>
     </w:p>
     <w:p>
@@ -7972,7 +8164,19 @@
         <w:rPr>
           <w:color w:val="000000" w:themeColor="text1"/>
         </w:rPr>
-        <w:t>Welke extra functies (bv. filters, zoekfuncties, statusiconen, visuele structuren) worden door gebruikers als het meest nuttig ervaren?</w:t>
+        <w:t>w</w:t>
+      </w:r>
+      <w:r>
+        <w:rPr>
+          <w:color w:val="000000" w:themeColor="text1"/>
+        </w:rPr>
+        <w:t>elke extra functies (bv. filters, zoekfuncties, statusiconen, visuele structuren) worden door gebruikers als het meest nuttig ervaren</w:t>
+      </w:r>
+      <w:r>
+        <w:rPr>
+          <w:color w:val="000000" w:themeColor="text1"/>
+        </w:rPr>
+        <w:t>;</w:t>
       </w:r>
     </w:p>
     <w:p>
@@ -7991,7 +8195,13 @@
         <w:rPr>
           <w:color w:val="000000" w:themeColor="text1"/>
         </w:rPr>
-        <w:t xml:space="preserve">Hoe verhoudt de voorgestelde tool zich qua gebruiksvriendelijkheid en effectiviteit ten opzichte van </w:t>
+        <w:t>h</w:t>
+      </w:r>
+      <w:r>
+        <w:rPr>
+          <w:color w:val="000000" w:themeColor="text1"/>
+        </w:rPr>
+        <w:t xml:space="preserve">oe verhoudt de voorgestelde tool zich qua gebruiksvriendelijkheid en effectiviteit ten opzichte van </w:t>
       </w:r>
       <w:r>
         <w:rPr>
@@ -8049,7 +8259,31 @@
         <w:rPr>
           <w:color w:val="000000" w:themeColor="text1"/>
         </w:rPr>
-        <w:t xml:space="preserve"> ook ontwikkelaars zonder uitgesproken securityprofiel beter onderbouwde risicoanalyses uitvoeren. Anderzijds draagt het werk bij aan HCI-onderzoek rond gebruiksvriendelijke security-tools door empirisch te onderzoeken welke interface-elementen (zoals kleuren, iconen, filters en tooltips) daadwerkelijk bijdragen aan taakprestatie, gebruikservaring en feature-voorkeur. Daarmee sluit de masterproef aan bij een bredere verschuiving van puur technische security-oplossingen naar mensgerichte, visueel ondersteunde hulpmiddelen.</w:t>
+        <w:t xml:space="preserve"> ook ontwikkelaars zonder uitgesproken securityprofiel beter onderbouwde risicoanalyses uitvoeren. Anderzijds draagt het werk bij aan HCI-onderzoek rond gebruiksvriendelijke security-tools door empirisch te onderzoeken welke interface-elementen (zoals kleuren, iconen, filters en tooltips) daadwerkelijk bijdragen aan taakprestatie</w:t>
+      </w:r>
+      <w:r>
+        <w:rPr>
+          <w:color w:val="000000" w:themeColor="text1"/>
+        </w:rPr>
+        <w:t xml:space="preserve"> en</w:t>
+      </w:r>
+      <w:r>
+        <w:rPr>
+          <w:color w:val="000000" w:themeColor="text1"/>
+        </w:rPr>
+        <w:t xml:space="preserve"> gebruikservarin</w:t>
+      </w:r>
+      <w:r>
+        <w:rPr>
+          <w:color w:val="000000" w:themeColor="text1"/>
+        </w:rPr>
+        <w:t>g</w:t>
+      </w:r>
+      <w:r>
+        <w:rPr>
+          <w:color w:val="000000" w:themeColor="text1"/>
+        </w:rPr>
+        <w:t>. Daarmee sluit de masterproef aan bij een bredere verschuiving van puur technische security-oplossingen naar mensgerichte, visueel ondersteunde hulpmiddelen.</w:t>
       </w:r>
     </w:p>
     <w:p>
@@ -8069,7 +8303,6 @@
     </w:p>
     <w:p>
       <w:pPr>
-        <w:spacing w:afterLines="24" w:after="57" w:line="288" w:lineRule="auto"/>
         <w:rPr>
           <w:color w:val="000000" w:themeColor="text1"/>
         </w:rPr>
@@ -8092,7 +8325,13 @@
         <w:rPr>
           <w:color w:val="000000" w:themeColor="text1"/>
         </w:rPr>
-        <w:t>rond threat modeling, de Fortunately–Unfortunately-methode en usability- en UX-evaluatie in securitycontexten. Hoofdstuk 3 beschrijft het ontwerp en de implementatie van het React/D3-webprototype en licht het onderzoeksdesign van de gebruikerstudie toe, inclusief taken</w:t>
+        <w:t xml:space="preserve">rond threat modeling, de Fortunately–Unfortunately-methode en usability- en UX-evaluatie in securitycontexten. Hoofdstuk 3 beschrijft het ontwerp en de implementatie van het React/D3-webprototype. </w:t>
+      </w:r>
+      <w:r>
+        <w:rPr>
+          <w:color w:val="000000" w:themeColor="text1"/>
+        </w:rPr>
+        <w:t>Hoofdstuk 4 werkt de opzet van de gebruikersstudie uit, inclusief onderzoeksopzet, deelnemers, taken</w:t>
       </w:r>
       <w:r>
         <w:rPr>
@@ -8104,13 +8343,7 @@
         <w:rPr>
           <w:color w:val="000000" w:themeColor="text1"/>
         </w:rPr>
-        <w:t xml:space="preserve">en analysemethoden. </w:t>
-      </w:r>
-      <w:r>
-        <w:rPr>
-          <w:color w:val="000000" w:themeColor="text1"/>
-        </w:rPr>
-        <w:t>Hoofdstuk 4 werkt de opzet van de gebruikersstudie uit, inclusief onderzoeksopzet, deelnemers, taken</w:t>
+        <w:t>en analysemethoden.</w:t>
       </w:r>
       <w:r>
         <w:rPr>
@@ -8122,18 +8355,6 @@
         <w:rPr>
           <w:color w:val="000000" w:themeColor="text1"/>
         </w:rPr>
-        <w:t>en analysemethoden.</w:t>
-      </w:r>
-      <w:r>
-        <w:rPr>
-          <w:color w:val="000000" w:themeColor="text1"/>
-        </w:rPr>
-        <w:t xml:space="preserve"> </w:t>
-      </w:r>
-      <w:r>
-        <w:rPr>
-          <w:color w:val="000000" w:themeColor="text1"/>
-        </w:rPr>
         <w:t xml:space="preserve">Hoofdstuk </w:t>
       </w:r>
       <w:r>
@@ -8146,7 +8367,19 @@
         <w:rPr>
           <w:color w:val="000000" w:themeColor="text1"/>
         </w:rPr>
-        <w:t xml:space="preserve"> presenteert de empirische resultaten over taakprestaties, user experience en feature-ranking, gevolgd door een discussie in hoofdstuk </w:t>
+        <w:t xml:space="preserve"> presenteert de empirische resultaten over taakprestaties, user experience en feature-ranking</w:t>
+      </w:r>
+      <w:r>
+        <w:rPr>
+          <w:color w:val="000000" w:themeColor="text1"/>
+        </w:rPr>
+        <w:t>. Dit wordt ver</w:t>
+      </w:r>
+      <w:r>
+        <w:rPr>
+          <w:color w:val="000000" w:themeColor="text1"/>
+        </w:rPr>
+        <w:t xml:space="preserve">volgd door een discussie in hoofdstuk </w:t>
       </w:r>
       <w:r>
         <w:rPr>
@@ -8177,7 +8410,7 @@
         <w:rPr>
           <w:color w:val="000000" w:themeColor="text1"/>
         </w:rPr>
-        <w:t xml:space="preserve"> besluit met de belangrijkste conclusies en schetst mogelijke uitbreidingen, zoals AI-ondersteuning en collaboratieve functies voor breder gebruik in onderwijs en industrie.</w:t>
+        <w:t xml:space="preserve"> besluit met de belangrijkste conclusies en schetst mogelijke uitbreidingen, zoals AI-ondersteuning en collaboratieve functies voor breder gebruik in industrie.</w:t>
       </w:r>
       <w:r>
         <w:rPr>
@@ -8317,7 +8550,25 @@
           <w:bCs/>
           <w:color w:val="000000" w:themeColor="text1"/>
         </w:rPr>
-        <w:t>ortunately-unfortunately methode</w:t>
+        <w:t>ortunately-unfortunately</w:t>
+      </w:r>
+      <w:r>
+        <w:rPr>
+          <w:rFonts w:asciiTheme="minorHAnsi" w:hAnsiTheme="minorHAnsi"/>
+          <w:b/>
+          <w:bCs/>
+          <w:color w:val="000000" w:themeColor="text1"/>
+        </w:rPr>
+        <w:t>-</w:t>
+      </w:r>
+      <w:r>
+        <w:rPr>
+          <w:rFonts w:asciiTheme="minorHAnsi" w:hAnsiTheme="minorHAnsi"/>
+          <w:b/>
+          <w:bCs/>
+          <w:color w:val="000000" w:themeColor="text1"/>
+        </w:rPr>
+        <w:t>methode</w:t>
       </w:r>
       <w:bookmarkEnd w:id="7"/>
     </w:p>
@@ -8418,13 +8669,61 @@
         <w:rPr>
           <w:color w:val="000000" w:themeColor="text1"/>
         </w:rPr>
-        <w:t xml:space="preserve">De Fortunately–Unfortunately-methode is een gestructureerde threat modeling-techniek die scenarios verhalend verkent door systematisch af te wisselen tussen gunstige en ongunstige ontwikkelingen. </w:t>
-      </w:r>
-      <w:r>
-        <w:rPr>
-          <w:color w:val="000000" w:themeColor="text1"/>
-        </w:rPr>
-        <w:t>Oorspronkelijk afkomstig uit improvisatietheater, werd de methode door Adam Shostack onder de aandacht gebracht voor threat modeling in zijn paper Fast, Cheap and Good (2021), als snelle manier om in een heen</w:t>
+        <w:t xml:space="preserve">De Fortunately–Unfortunately-methode is een gestructureerde threat modeling-techniek die </w:t>
+      </w:r>
+      <w:r>
+        <w:rPr>
+          <w:color w:val="000000" w:themeColor="text1"/>
+        </w:rPr>
+        <w:t>scenario’s</w:t>
+      </w:r>
+      <w:r>
+        <w:rPr>
+          <w:color w:val="000000" w:themeColor="text1"/>
+        </w:rPr>
+        <w:t xml:space="preserve"> verhalend verkent door systematisch af te wisselen tussen gunstige en ongunstige ontwikkelingen. </w:t>
+      </w:r>
+      <w:r>
+        <w:rPr>
+          <w:color w:val="000000" w:themeColor="text1"/>
+        </w:rPr>
+        <w:t>Oorspronkelijk afkomstig uit improvisatietheater, werd de methode door Adam Shostack onder de aandacht gebracht voor threat modeling in zijn paper Fast, Cheap and Good (2021)</w:t>
+      </w:r>
+      <w:r>
+        <w:rPr>
+          <w:color w:val="000000" w:themeColor="text1"/>
+        </w:rPr>
+        <w:t>. De paper beschrij</w:t>
+      </w:r>
+      <w:r>
+        <w:rPr>
+          <w:color w:val="000000" w:themeColor="text1"/>
+        </w:rPr>
+        <w:t>f</w:t>
+      </w:r>
+      <w:r>
+        <w:rPr>
+          <w:color w:val="000000" w:themeColor="text1"/>
+        </w:rPr>
+        <w:t>t de methode</w:t>
+      </w:r>
+      <w:r>
+        <w:rPr>
+          <w:color w:val="000000" w:themeColor="text1"/>
+        </w:rPr>
+        <w:t xml:space="preserve"> als</w:t>
+      </w:r>
+      <w:r>
+        <w:rPr>
+          <w:color w:val="000000" w:themeColor="text1"/>
+        </w:rPr>
+        <w:t xml:space="preserve"> een</w:t>
+      </w:r>
+      <w:r>
+        <w:rPr>
+          <w:color w:val="000000" w:themeColor="text1"/>
+        </w:rPr>
+        <w:t xml:space="preserve"> snelle manier om in een heen</w:t>
       </w:r>
       <w:r>
         <w:rPr>
@@ -8512,7 +8811,13 @@
         <w:rPr>
           <w:color w:val="000000" w:themeColor="text1"/>
         </w:rPr>
-        <w:t>Start met een fortunately node dat het doel van de te modelleren software beschrijft;</w:t>
+        <w:t>s</w:t>
+      </w:r>
+      <w:r>
+        <w:rPr>
+          <w:color w:val="000000" w:themeColor="text1"/>
+        </w:rPr>
+        <w:t>tart met een fortunately node dat het doel van de te modelleren software beschrijft;</w:t>
       </w:r>
     </w:p>
     <w:p>
@@ -8531,7 +8836,13 @@
         <w:rPr>
           <w:color w:val="000000" w:themeColor="text1"/>
         </w:rPr>
-        <w:t>Bouw hierop verder door na te denken over mogelijk situaties die voor een probleem kunnen zorgen (risico’s). Dit vormt nu een unfortunately node;</w:t>
+        <w:t>b</w:t>
+      </w:r>
+      <w:r>
+        <w:rPr>
+          <w:color w:val="000000" w:themeColor="text1"/>
+        </w:rPr>
+        <w:t>ouw hierop verder door na te denken over mogelijk situaties die voor een probleem kunnen zorgen (risico’s). Dit vormt nu een unfortunately node;</w:t>
       </w:r>
     </w:p>
     <w:p>
@@ -8550,7 +8861,13 @@
         <w:rPr>
           <w:color w:val="000000" w:themeColor="text1"/>
         </w:rPr>
-        <w:t>Bedenk een oplossing (mitigation) voor dit risico. Dit is een fortunately node;</w:t>
+        <w:t>b</w:t>
+      </w:r>
+      <w:r>
+        <w:rPr>
+          <w:color w:val="000000" w:themeColor="text1"/>
+        </w:rPr>
+        <w:t>edenk een oplossing (mitigation) voor dit risico. Dit is een fortunately node;</w:t>
       </w:r>
     </w:p>
     <w:p>
@@ -8569,7 +8886,13 @@
         <w:rPr>
           <w:color w:val="000000" w:themeColor="text1"/>
         </w:rPr>
-        <w:t>Bouw verder aan de tree tot er een model gemaakt is dat alle risico’s en oplossingen bevat. Dit is nu het security model voor de te maken software.</w:t>
+        <w:t>b</w:t>
+      </w:r>
+      <w:r>
+        <w:rPr>
+          <w:color w:val="000000" w:themeColor="text1"/>
+        </w:rPr>
+        <w:t>ouw verder aan de tree tot er een model gemaakt is dat alle risico’s en oplossingen bevat. Dit is nu het security model voor de te maken software.</w:t>
       </w:r>
     </w:p>
     <w:p>
@@ -8755,25 +9078,74 @@
           <w:color w:val="000000" w:themeColor="text1"/>
           <w:lang w:val="en-GB"/>
         </w:rPr>
-        <w:t xml:space="preserve">Bestaande threat modeling tools (Microsoft TMT, OWASP Threat Dragon) focussen op STRIDE-data flow diagrams of attack trees, zonder afdwinging van fortunately-unfortunately afwisseling. </w:t>
-      </w:r>
-      <w:r>
-        <w:rPr>
-          <w:color w:val="000000" w:themeColor="text1"/>
-        </w:rPr>
-        <w:t xml:space="preserve">Generieke mindmapsoftware kan gebruikt worden, maar vereist handmatige </w:t>
-      </w:r>
-      <w:r>
-        <w:rPr>
-          <w:color w:val="000000" w:themeColor="text1"/>
-        </w:rPr>
-        <w:t>toepassing van de fortunately-unfortunately afwisseling,</w:t>
-      </w:r>
-      <w:r>
-        <w:rPr>
-          <w:color w:val="000000" w:themeColor="text1"/>
-        </w:rPr>
-        <w:t xml:space="preserve"> zonder </w:t>
+        <w:t>Bestaande threat modeling tools (Microsoft TMT, OWASP Threat Dragon) focussen op STRIDE-data flow diagrams of attack trees</w:t>
+      </w:r>
+      <w:r>
+        <w:rPr>
+          <w:color w:val="000000" w:themeColor="text1"/>
+          <w:lang w:val="en-GB"/>
+        </w:rPr>
+        <w:t xml:space="preserve">. </w:t>
+      </w:r>
+      <w:r>
+        <w:rPr>
+          <w:color w:val="000000" w:themeColor="text1"/>
+        </w:rPr>
+        <w:t>Deze bevatten geen</w:t>
+      </w:r>
+      <w:r>
+        <w:rPr>
+          <w:color w:val="000000" w:themeColor="text1"/>
+        </w:rPr>
+        <w:t xml:space="preserve"> afdwinging van fortunately-unfortunately afwisseling. </w:t>
+      </w:r>
+      <w:r>
+        <w:rPr>
+          <w:color w:val="000000" w:themeColor="text1"/>
+        </w:rPr>
+        <w:t xml:space="preserve">Generieke mindmapsoftware </w:t>
+      </w:r>
+      <w:r>
+        <w:rPr>
+          <w:color w:val="000000" w:themeColor="text1"/>
+        </w:rPr>
+        <w:t>kunnen</w:t>
+      </w:r>
+      <w:r>
+        <w:rPr>
+          <w:color w:val="000000" w:themeColor="text1"/>
+        </w:rPr>
+        <w:t xml:space="preserve"> gebruikt worden, maar vereis</w:t>
+      </w:r>
+      <w:r>
+        <w:rPr>
+          <w:color w:val="000000" w:themeColor="text1"/>
+        </w:rPr>
+        <w:t>en</w:t>
+      </w:r>
+      <w:r>
+        <w:rPr>
+          <w:color w:val="000000" w:themeColor="text1"/>
+        </w:rPr>
+        <w:t xml:space="preserve"> handmatige </w:t>
+      </w:r>
+      <w:r>
+        <w:rPr>
+          <w:color w:val="000000" w:themeColor="text1"/>
+        </w:rPr>
+        <w:t>toepassing van de fortunately-unfortunately afwisseling</w:t>
+      </w:r>
+      <w:r>
+        <w:rPr>
+          <w:color w:val="000000" w:themeColor="text1"/>
+        </w:rPr>
+        <w:t>. Ook hebben deze software geen</w:t>
+      </w:r>
+      <w:r>
+        <w:rPr>
+          <w:color w:val="000000" w:themeColor="text1"/>
+        </w:rPr>
+        <w:t xml:space="preserve"> </w:t>
       </w:r>
       <w:r>
         <w:rPr>
@@ -8785,7 +9157,19 @@
         <w:rPr>
           <w:color w:val="000000" w:themeColor="text1"/>
         </w:rPr>
-        <w:t xml:space="preserve"> ondersteuning voor statussen of danger ratings[</w:t>
+        <w:t xml:space="preserve"> ondersteuning voor statussen of danger ratings</w:t>
+      </w:r>
+      <w:r>
+        <w:rPr>
+          <w:color w:val="000000" w:themeColor="text1"/>
+        </w:rPr>
+        <w:t xml:space="preserve"> </w:t>
+      </w:r>
+      <w:r>
+        <w:rPr>
+          <w:color w:val="000000" w:themeColor="text1"/>
+        </w:rPr>
+        <w:t>[</w:t>
       </w:r>
       <w:r>
         <w:rPr>
@@ -8837,7 +9221,31 @@
         <w:rPr>
           <w:color w:val="000000" w:themeColor="text1"/>
         </w:rPr>
-        <w:t>Shostack benadrukt de eenvoud van deze methode als een snelle manier om met beperkte security</w:t>
+        <w:t xml:space="preserve">Shostack benadrukt de eenvoud van deze </w:t>
+      </w:r>
+      <w:r>
+        <w:rPr>
+          <w:color w:val="000000" w:themeColor="text1"/>
+        </w:rPr>
+        <w:t xml:space="preserve">de </w:t>
+      </w:r>
+      <w:r>
+        <w:rPr>
+          <w:color w:val="000000" w:themeColor="text1"/>
+        </w:rPr>
+        <w:t>fortunately-unfortunately</w:t>
+      </w:r>
+      <w:r>
+        <w:rPr>
+          <w:color w:val="000000" w:themeColor="text1"/>
+        </w:rPr>
+        <w:t>-methode</w:t>
+      </w:r>
+      <w:r>
+        <w:rPr>
+          <w:color w:val="000000" w:themeColor="text1"/>
+        </w:rPr>
+        <w:t xml:space="preserve"> als een snelle manier om met beperkte security</w:t>
       </w:r>
       <w:r>
         <w:rPr>
@@ -8905,13 +9313,35 @@
         <w:rPr>
           <w:color w:val="000000" w:themeColor="text1"/>
         </w:rPr>
-        <w:t>Structuur technisch afdwingt (</w:t>
-      </w:r>
-      <w:r>
-        <w:rPr>
-          <w:color w:val="000000" w:themeColor="text1"/>
-        </w:rPr>
-        <w:t>child nodes</w:t>
+        <w:t>s</w:t>
+      </w:r>
+      <w:r>
+        <w:rPr>
+          <w:color w:val="000000" w:themeColor="text1"/>
+        </w:rPr>
+        <w:t>tructuur technisch afdwingt (</w:t>
+      </w:r>
+      <w:r>
+        <w:rPr>
+          <w:i/>
+          <w:iCs/>
+          <w:color w:val="000000" w:themeColor="text1"/>
+        </w:rPr>
+        <w:t>child</w:t>
+      </w:r>
+      <w:r>
+        <w:rPr>
+          <w:color w:val="000000" w:themeColor="text1"/>
+        </w:rPr>
+        <w:t xml:space="preserve"> </w:t>
+      </w:r>
+      <w:r>
+        <w:rPr>
+          <w:i/>
+          <w:iCs/>
+          <w:color w:val="000000" w:themeColor="text1"/>
+        </w:rPr>
+        <w:t>nodes</w:t>
       </w:r>
       <w:r>
         <w:rPr>
@@ -8948,6 +9378,12 @@
           <w:color w:val="000000" w:themeColor="text1"/>
         </w:rPr>
         <w:t>type)</w:t>
+      </w:r>
+      <w:r>
+        <w:rPr>
+          <w:color w:val="000000" w:themeColor="text1"/>
+        </w:rPr>
+        <w:t>;</w:t>
       </w:r>
     </w:p>
     <w:p>
@@ -8960,15 +9396,25 @@
         <w:spacing w:afterLines="24" w:after="57" w:line="288" w:lineRule="auto"/>
         <w:rPr>
           <w:color w:val="000000" w:themeColor="text1"/>
-          <w:lang w:val="en-GB"/>
-        </w:rPr>
-      </w:pPr>
-      <w:r>
-        <w:rPr>
-          <w:color w:val="000000" w:themeColor="text1"/>
-          <w:lang w:val="en-GB"/>
-        </w:rPr>
-        <w:t>Statusiconen (Weakness, Verified Assumption) en danger rating biedt</w:t>
+        </w:rPr>
+      </w:pPr>
+      <w:r>
+        <w:rPr>
+          <w:color w:val="000000" w:themeColor="text1"/>
+        </w:rPr>
+        <w:t>s</w:t>
+      </w:r>
+      <w:r>
+        <w:rPr>
+          <w:color w:val="000000" w:themeColor="text1"/>
+        </w:rPr>
+        <w:t>tatusiconen en danger rating biedt</w:t>
+      </w:r>
+      <w:r>
+        <w:rPr>
+          <w:color w:val="000000" w:themeColor="text1"/>
+        </w:rPr>
+        <w:t>;</w:t>
       </w:r>
     </w:p>
     <w:p>
@@ -8987,7 +9433,19 @@
         <w:rPr>
           <w:color w:val="000000" w:themeColor="text1"/>
         </w:rPr>
-        <w:t>Filtering en branch summaries toevoegt voor schaalbare navigatie</w:t>
+        <w:t>f</w:t>
+      </w:r>
+      <w:r>
+        <w:rPr>
+          <w:color w:val="000000" w:themeColor="text1"/>
+        </w:rPr>
+        <w:t>iltering en branch summaries toevoegt voor schaalbare navigatie</w:t>
+      </w:r>
+      <w:r>
+        <w:rPr>
+          <w:color w:val="000000" w:themeColor="text1"/>
+        </w:rPr>
+        <w:t>.</w:t>
       </w:r>
     </w:p>
     <w:p>
@@ -9009,7 +9467,39 @@
         <w:rPr>
           <w:color w:val="000000" w:themeColor="text1"/>
         </w:rPr>
-        <w:t>De Fortunately–Unfortunately-methode biedt verschillende voordelen en kent enkele beperkingen. De narratieve flow verlaagt de instapdrempel aanzienlijk voor niet-security-experts, terwijl de iteratieve ketens bestaande trade-offs tussen risico's en mitigerende maatregelen expliciet zichtbaar maken. Tegelijk is de inherent lineaire structuur minder geschikt voor het modelleren van niet-hiërarchische of parallelle risico's die gelijktijdig optreden binnen een systeem</w:t>
+        <w:t>De Fortunately–Unfortunately-methode biedt verschillende voordelen en kent enkele beperkingen. De narratieve flow verlaagt de instapdrempel aanzienlijk voor niet-security-experts</w:t>
+      </w:r>
+      <w:r>
+        <w:rPr>
+          <w:color w:val="000000" w:themeColor="text1"/>
+        </w:rPr>
+        <w:t>. Dit terwijl</w:t>
+      </w:r>
+      <w:r>
+        <w:rPr>
+          <w:color w:val="000000" w:themeColor="text1"/>
+        </w:rPr>
+        <w:t xml:space="preserve"> de iteratieve ketens bestaande </w:t>
+      </w:r>
+      <w:r>
+        <w:rPr>
+          <w:i/>
+          <w:iCs/>
+          <w:color w:val="000000" w:themeColor="text1"/>
+        </w:rPr>
+        <w:t>trade-offs</w:t>
+      </w:r>
+      <w:r>
+        <w:rPr>
+          <w:color w:val="000000" w:themeColor="text1"/>
+        </w:rPr>
+        <w:t xml:space="preserve"> tussen risico's en mitigerende maatregelen expliciet zichtbaar maken. Tegelijk is de inherent lineaire structuur minder geschikt voor het modelleren van niet-hiërarchische of parallelle risico's die gelijktijdig optreden binnen een systeem</w:t>
+      </w:r>
+      <w:r>
+        <w:rPr>
+          <w:color w:val="000000" w:themeColor="text1"/>
+        </w:rPr>
+        <w:t xml:space="preserve"> </w:t>
       </w:r>
       <w:r>
         <w:rPr>
@@ -9225,7 +9715,37 @@
         <w:rPr>
           <w:color w:val="000000" w:themeColor="text1"/>
         </w:rPr>
-        <w:t>s optimaal presteert en dat de keuze voor een layout altijd taak</w:t>
+        <w:t xml:space="preserve">s optimaal presteert en dat de keuze voor een </w:t>
+      </w:r>
+      <w:r>
+        <w:rPr>
+          <w:i/>
+          <w:iCs/>
+          <w:color w:val="000000" w:themeColor="text1"/>
+        </w:rPr>
+        <w:t>lay</w:t>
+      </w:r>
+      <w:r>
+        <w:rPr>
+          <w:i/>
+          <w:iCs/>
+          <w:color w:val="000000" w:themeColor="text1"/>
+        </w:rPr>
+        <w:t>-</w:t>
+      </w:r>
+      <w:r>
+        <w:rPr>
+          <w:i/>
+          <w:iCs/>
+          <w:color w:val="000000" w:themeColor="text1"/>
+        </w:rPr>
+        <w:t>out</w:t>
+      </w:r>
+      <w:r>
+        <w:rPr>
+          <w:color w:val="000000" w:themeColor="text1"/>
+        </w:rPr>
+        <w:t xml:space="preserve"> altijd taak</w:t>
       </w:r>
       <w:r>
         <w:rPr>
@@ -9264,7 +9784,19 @@
         <w:rPr>
           <w:color w:val="000000" w:themeColor="text1"/>
         </w:rPr>
-        <w:t>afhankelijk is[</w:t>
+        <w:t>afhankelijk is</w:t>
+      </w:r>
+      <w:r>
+        <w:rPr>
+          <w:color w:val="000000" w:themeColor="text1"/>
+        </w:rPr>
+        <w:t xml:space="preserve"> </w:t>
+      </w:r>
+      <w:r>
+        <w:rPr>
+          <w:color w:val="000000" w:themeColor="text1"/>
+        </w:rPr>
+        <w:t>[</w:t>
       </w:r>
       <w:r>
         <w:rPr>
@@ -9329,7 +9861,43 @@
         <w:rPr>
           <w:color w:val="000000" w:themeColor="text1"/>
         </w:rPr>
-        <w:t>outs: elk kindvlak ligt volledig binnen het vlak van zijn ouder en siblings overlappen elkaar niet.  Dit sluit aan bij de boomstructuur van de Fortunately</w:t>
+        <w:t>outs: elk</w:t>
+      </w:r>
+      <w:r>
+        <w:rPr>
+          <w:color w:val="000000" w:themeColor="text1"/>
+        </w:rPr>
+        <w:t>e</w:t>
+      </w:r>
+      <w:r>
+        <w:rPr>
+          <w:color w:val="000000" w:themeColor="text1"/>
+        </w:rPr>
+        <w:t xml:space="preserve"> </w:t>
+      </w:r>
+      <w:r>
+        <w:rPr>
+          <w:color w:val="000000" w:themeColor="text1"/>
+        </w:rPr>
+        <w:t>child node</w:t>
+      </w:r>
+      <w:r>
+        <w:rPr>
+          <w:color w:val="000000" w:themeColor="text1"/>
+        </w:rPr>
+        <w:t xml:space="preserve"> ligt volledig binnen het vlak van zijn ouder en siblings overlappen elkaar niet.  Dit sluit aan bij de boomstructuur van de </w:t>
+      </w:r>
+      <w:r>
+        <w:rPr>
+          <w:color w:val="000000" w:themeColor="text1"/>
+        </w:rPr>
+        <w:t>f</w:t>
+      </w:r>
+      <w:r>
+        <w:rPr>
+          <w:color w:val="000000" w:themeColor="text1"/>
+        </w:rPr>
+        <w:t>ortunately</w:t>
       </w:r>
       <w:r>
         <w:rPr>
@@ -9342,7 +9910,13 @@
         <w:rPr>
           <w:color w:val="000000" w:themeColor="text1"/>
         </w:rPr>
-        <w:t>Unfortunately</w:t>
+        <w:t>u</w:t>
+      </w:r>
+      <w:r>
+        <w:rPr>
+          <w:color w:val="000000" w:themeColor="text1"/>
+        </w:rPr>
+        <w:t>nfortunately</w:t>
       </w:r>
       <w:r>
         <w:rPr>
@@ -9355,7 +9929,19 @@
         <w:rPr>
           <w:color w:val="000000" w:themeColor="text1"/>
         </w:rPr>
-        <w:t>tool, waar elke stap in het scenario genest is onder de voorafgaande beslissing.  In tegenstelling tot klassieke treemaps wordt de beschikbare ruimte hier echter niet gebruikt om numerieke waarden (zoals bestandsgrootte of frequentie) te encoderen, maar om een sequentiële, causale keten van “fortunately”</w:t>
+        <w:t>tool, waar elke stap in het scenario genest is onder de voorafgaande beslissing.  In tegenstelling tot klassieke treemaps wordt de beschikbare ruimte hier echter niet gebruikt om numerieke waarden (zoals bestandsgrootte of frequentie) te encoderen</w:t>
+      </w:r>
+      <w:r>
+        <w:rPr>
+          <w:color w:val="000000" w:themeColor="text1"/>
+        </w:rPr>
+        <w:t>. De ruimte is gebruikt</w:t>
+      </w:r>
+      <w:r>
+        <w:rPr>
+          <w:color w:val="000000" w:themeColor="text1"/>
+        </w:rPr>
+        <w:t xml:space="preserve"> om een sequentiële, causale keten van “fortunately”</w:t>
       </w:r>
       <w:r>
         <w:rPr>
@@ -9401,7 +9987,7 @@
         <w:rPr>
           <w:color w:val="000000" w:themeColor="text1"/>
         </w:rPr>
-        <w:t>gevolgen leesbaar te maken.  De survey maakt duidelijk dat bestaande treemap</w:t>
+        <w:t>gevolgen leesbaar te maken. De survey maakt duidelijk dat bestaande treemap</w:t>
       </w:r>
       <w:r>
         <w:rPr>
@@ -9414,7 +10000,31 @@
         <w:rPr>
           <w:color w:val="000000" w:themeColor="text1"/>
         </w:rPr>
-        <w:t>algoritmes vooral ruimtegebruik, aspect ratio, buurtbehoud en stabiliteit over tijd optimaliseren, maar nauwelijks inspelen op de behoefte om expliciete argumentatie</w:t>
+        <w:t>algoritmes vooral ruimtegebruik, aspect ratio, buurtbehoud en stabiliteit over tijd optimaliseren</w:t>
+      </w:r>
+      <w:r>
+        <w:rPr>
+          <w:color w:val="000000" w:themeColor="text1"/>
+        </w:rPr>
+        <w:t>. Deze treemap-algoritmes spelen</w:t>
+      </w:r>
+      <w:r>
+        <w:rPr>
+          <w:color w:val="000000" w:themeColor="text1"/>
+        </w:rPr>
+        <w:t xml:space="preserve"> nauwelijks </w:t>
+      </w:r>
+      <w:r>
+        <w:rPr>
+          <w:color w:val="000000" w:themeColor="text1"/>
+        </w:rPr>
+        <w:t>in</w:t>
+      </w:r>
+      <w:r>
+        <w:rPr>
+          <w:color w:val="000000" w:themeColor="text1"/>
+        </w:rPr>
+        <w:t xml:space="preserve"> op de behoefte om expliciete argumentatie</w:t>
       </w:r>
       <w:r>
         <w:rPr>
@@ -9453,7 +10063,19 @@
         <w:rPr>
           <w:color w:val="000000" w:themeColor="text1"/>
         </w:rPr>
-        <w:t>ontwerpargumentatie zoals in deze thesis[</w:t>
+        <w:t>ontwerpargumentatie zoals in deze thesis</w:t>
+      </w:r>
+      <w:r>
+        <w:rPr>
+          <w:color w:val="000000" w:themeColor="text1"/>
+        </w:rPr>
+        <w:t xml:space="preserve"> </w:t>
+      </w:r>
+      <w:r>
+        <w:rPr>
+          <w:color w:val="000000" w:themeColor="text1"/>
+        </w:rPr>
+        <w:t>[</w:t>
       </w:r>
       <w:r>
         <w:rPr>
@@ -9544,7 +10166,19 @@
         <w:rPr>
           <w:color w:val="000000" w:themeColor="text1"/>
         </w:rPr>
-        <w:t xml:space="preserve"> introduceert, waarin proposities en </w:t>
+        <w:t xml:space="preserve"> introduceert</w:t>
+      </w:r>
+      <w:r>
+        <w:rPr>
+          <w:color w:val="000000" w:themeColor="text1"/>
+        </w:rPr>
+        <w:t>. In deze hi-tree wisselen</w:t>
+      </w:r>
+      <w:r>
+        <w:rPr>
+          <w:color w:val="000000" w:themeColor="text1"/>
+        </w:rPr>
+        <w:t xml:space="preserve"> proposities en </w:t>
       </w:r>
       <w:r>
         <w:rPr>
@@ -9570,85 +10204,442 @@
         <w:rPr>
           <w:color w:val="000000" w:themeColor="text1"/>
         </w:rPr>
-        <w:t xml:space="preserve"> (redenen) elkaar afwisselen en compound nodes meerdere premissen groeperen voor multi</w:t>
+        <w:t xml:space="preserve"> (redenen) elkaar </w:t>
+      </w:r>
+      <w:r>
+        <w:rPr>
+          <w:color w:val="000000" w:themeColor="text1"/>
+        </w:rPr>
+        <w:t>af</w:t>
+      </w:r>
+      <w:r>
+        <w:rPr>
+          <w:color w:val="000000" w:themeColor="text1"/>
+        </w:rPr>
+        <w:t>.  De tool gebruikt tekstuele labels (</w:t>
+      </w:r>
+      <w:r>
+        <w:rPr>
+          <w:rFonts w:cs="Aptos"/>
+          <w:color w:val="000000" w:themeColor="text1"/>
+        </w:rPr>
+        <w:t>“</w:t>
+      </w:r>
+      <w:r>
+        <w:rPr>
+          <w:color w:val="000000" w:themeColor="text1"/>
+        </w:rPr>
+        <w:t>support</w:t>
+      </w:r>
+      <w:r>
+        <w:rPr>
+          <w:rFonts w:cs="Aptos"/>
+          <w:color w:val="000000" w:themeColor="text1"/>
+        </w:rPr>
+        <w:t>”</w:t>
+      </w:r>
+      <w:r>
+        <w:rPr>
+          <w:color w:val="000000" w:themeColor="text1"/>
+        </w:rPr>
+        <w:t xml:space="preserve">, </w:t>
+      </w:r>
+      <w:r>
+        <w:rPr>
+          <w:rFonts w:cs="Aptos"/>
+          <w:color w:val="000000" w:themeColor="text1"/>
+        </w:rPr>
+        <w:t>“</w:t>
+      </w:r>
+      <w:r>
+        <w:rPr>
+          <w:color w:val="000000" w:themeColor="text1"/>
+        </w:rPr>
+        <w:t>oppose</w:t>
+      </w:r>
+      <w:r>
+        <w:rPr>
+          <w:rFonts w:cs="Aptos"/>
+          <w:color w:val="000000" w:themeColor="text1"/>
+        </w:rPr>
+        <w:t>”</w:t>
+      </w:r>
+      <w:r>
+        <w:rPr>
+          <w:color w:val="000000" w:themeColor="text1"/>
+        </w:rPr>
+        <w:t>) en kleurcodering (groen voor ondersteuning, rood voor tegenargumenten) om de evidenti</w:t>
+      </w:r>
+      <w:r>
+        <w:rPr>
+          <w:rFonts w:cs="Aptos"/>
+          <w:color w:val="000000" w:themeColor="text1"/>
+        </w:rPr>
+        <w:t>ë</w:t>
+      </w:r>
+      <w:r>
+        <w:rPr>
+          <w:color w:val="000000" w:themeColor="text1"/>
+        </w:rPr>
+        <w:t xml:space="preserve">le relatie tussen </w:t>
+      </w:r>
+      <w:r>
+        <w:rPr>
+          <w:color w:val="000000" w:themeColor="text1"/>
+        </w:rPr>
+        <w:t>nodes</w:t>
+      </w:r>
+      <w:r>
+        <w:rPr>
+          <w:color w:val="000000" w:themeColor="text1"/>
+        </w:rPr>
+        <w:t xml:space="preserve"> expliciet te maken.  De auteurs kiezen bewust voor een aangepaste </w:t>
+      </w:r>
+      <w:r>
+        <w:rPr>
+          <w:i/>
+          <w:iCs/>
+          <w:color w:val="000000" w:themeColor="text1"/>
+        </w:rPr>
+        <w:t>layered</w:t>
       </w:r>
       <w:r>
         <w:rPr>
           <w:rFonts w:ascii="Cambria Math" w:hAnsi="Cambria Math" w:cs="Cambria Math"/>
+          <w:i/>
+          <w:iCs/>
           <w:color w:val="000000" w:themeColor="text1"/>
         </w:rPr>
         <w:t>‑</w:t>
       </w:r>
       <w:r>
         <w:rPr>
-          <w:color w:val="000000" w:themeColor="text1"/>
-        </w:rPr>
-        <w:t>premise redeneringen.  De tool gebruikt tekstuele labels (</w:t>
+          <w:i/>
+          <w:iCs/>
+          <w:color w:val="000000" w:themeColor="text1"/>
+        </w:rPr>
+        <w:t>tree</w:t>
+      </w:r>
+      <w:r>
+        <w:rPr>
+          <w:rFonts w:ascii="Cambria Math" w:hAnsi="Cambria Math" w:cs="Cambria Math"/>
+          <w:i/>
+          <w:iCs/>
+          <w:color w:val="000000" w:themeColor="text1"/>
+        </w:rPr>
+        <w:t>‑</w:t>
+      </w:r>
+      <w:r>
+        <w:rPr>
+          <w:i/>
+          <w:iCs/>
+          <w:color w:val="000000" w:themeColor="text1"/>
+        </w:rPr>
+        <w:t>lay</w:t>
+      </w:r>
+      <w:r>
+        <w:rPr>
+          <w:i/>
+          <w:iCs/>
+          <w:color w:val="000000" w:themeColor="text1"/>
+        </w:rPr>
+        <w:t>-</w:t>
+      </w:r>
+      <w:r>
+        <w:rPr>
+          <w:i/>
+          <w:iCs/>
+          <w:color w:val="000000" w:themeColor="text1"/>
+        </w:rPr>
+        <w:t>out</w:t>
+      </w:r>
+      <w:r>
+        <w:rPr>
+          <w:color w:val="000000" w:themeColor="text1"/>
+        </w:rPr>
+        <w:t xml:space="preserve"> boven alternatieven zoals h</w:t>
+      </w:r>
+      <w:r>
+        <w:rPr>
+          <w:rFonts w:ascii="Cambria Math" w:hAnsi="Cambria Math" w:cs="Cambria Math"/>
+          <w:color w:val="000000" w:themeColor="text1"/>
+        </w:rPr>
+        <w:t>‑</w:t>
+      </w:r>
+      <w:r>
+        <w:rPr>
+          <w:color w:val="000000" w:themeColor="text1"/>
+        </w:rPr>
+        <w:t>v trees, cone trees en radial trees</w:t>
+      </w:r>
+      <w:r>
+        <w:rPr>
+          <w:color w:val="000000" w:themeColor="text1"/>
+        </w:rPr>
+        <w:t>. D</w:t>
+      </w:r>
+      <w:r>
+        <w:rPr>
+          <w:color w:val="000000" w:themeColor="text1"/>
+        </w:rPr>
+        <w:t>ie laatste</w:t>
+      </w:r>
+      <w:r>
+        <w:rPr>
+          <w:color w:val="000000" w:themeColor="text1"/>
+        </w:rPr>
+        <w:t xml:space="preserve"> opties tonen</w:t>
+      </w:r>
+      <w:r>
+        <w:rPr>
+          <w:color w:val="000000" w:themeColor="text1"/>
+        </w:rPr>
+        <w:t xml:space="preserve"> de logische structuur minder duidelijk en</w:t>
+      </w:r>
+      <w:r>
+        <w:rPr>
+          <w:color w:val="000000" w:themeColor="text1"/>
+        </w:rPr>
+        <w:t xml:space="preserve"> zijn</w:t>
+      </w:r>
+      <w:r>
+        <w:rPr>
+          <w:color w:val="000000" w:themeColor="text1"/>
+        </w:rPr>
+        <w:t xml:space="preserve"> minder geschikt voor grote, complexe argumentmaps.  Bovendien bekritiseren zij bestaande argument</w:t>
+      </w:r>
+      <w:r>
+        <w:rPr>
+          <w:rFonts w:ascii="Cambria Math" w:hAnsi="Cambria Math" w:cs="Cambria Math"/>
+          <w:color w:val="000000" w:themeColor="text1"/>
+        </w:rPr>
+        <w:t>‑</w:t>
+      </w:r>
+      <w:r>
+        <w:rPr>
+          <w:color w:val="000000" w:themeColor="text1"/>
+        </w:rPr>
+        <w:t>mappingtools om hun beperkte automatische lay</w:t>
+      </w:r>
+      <w:r>
+        <w:rPr>
+          <w:color w:val="000000" w:themeColor="text1"/>
+        </w:rPr>
+        <w:t>-</w:t>
+      </w:r>
+      <w:r>
+        <w:rPr>
+          <w:color w:val="000000" w:themeColor="text1"/>
+        </w:rPr>
+        <w:t xml:space="preserve">out, instabiele hertekeningen en gebrek aan controle over de volgorde van </w:t>
+      </w:r>
+      <w:r>
+        <w:rPr>
+          <w:color w:val="000000" w:themeColor="text1"/>
+        </w:rPr>
+        <w:t>child nodes</w:t>
+      </w:r>
+      <w:r>
+        <w:rPr>
+          <w:color w:val="000000" w:themeColor="text1"/>
+        </w:rPr>
+        <w:t>, wat direct raakt aan de leesbaarheid van redeneringen</w:t>
+      </w:r>
+      <w:r>
+        <w:rPr>
+          <w:color w:val="000000" w:themeColor="text1"/>
+        </w:rPr>
+        <w:t xml:space="preserve"> </w:t>
+      </w:r>
+      <w:r>
+        <w:rPr>
+          <w:color w:val="000000" w:themeColor="text1"/>
+        </w:rPr>
+        <w:t>[</w:t>
+      </w:r>
+      <w:r>
+        <w:rPr>
+          <w:color w:val="000000" w:themeColor="text1"/>
+        </w:rPr>
+        <w:t>6</w:t>
+      </w:r>
+      <w:r>
+        <w:rPr>
+          <w:color w:val="000000" w:themeColor="text1"/>
+        </w:rPr>
+        <w:t>]</w:t>
+      </w:r>
+      <w:r>
+        <w:rPr>
+          <w:color w:val="000000" w:themeColor="text1"/>
+        </w:rPr>
+        <w:t>.</w:t>
+      </w:r>
+    </w:p>
+    <w:p>
+      <w:pPr>
+        <w:spacing w:after="24"/>
+        <w:rPr>
+          <w:color w:val="000000" w:themeColor="text1"/>
+        </w:rPr>
+      </w:pPr>
+    </w:p>
+    <w:p>
+      <w:pPr>
+        <w:spacing w:after="24"/>
+        <w:rPr>
+          <w:color w:val="000000" w:themeColor="text1"/>
+        </w:rPr>
+      </w:pPr>
+      <w:r>
+        <w:rPr>
+          <w:color w:val="000000" w:themeColor="text1"/>
+        </w:rPr>
+        <w:t>De hi</w:t>
+      </w:r>
+      <w:r>
+        <w:rPr>
+          <w:rFonts w:ascii="Cambria Math" w:hAnsi="Cambria Math" w:cs="Cambria Math"/>
+          <w:color w:val="000000" w:themeColor="text1"/>
+        </w:rPr>
+        <w:t>‑</w:t>
+      </w:r>
+      <w:r>
+        <w:rPr>
+          <w:color w:val="000000" w:themeColor="text1"/>
+        </w:rPr>
+        <w:t>tree</w:t>
+      </w:r>
+      <w:r>
+        <w:rPr>
+          <w:rFonts w:ascii="Cambria Math" w:hAnsi="Cambria Math" w:cs="Cambria Math"/>
+          <w:color w:val="000000" w:themeColor="text1"/>
+        </w:rPr>
+        <w:t>‑</w:t>
+      </w:r>
+      <w:r>
+        <w:rPr>
+          <w:color w:val="000000" w:themeColor="text1"/>
+        </w:rPr>
+        <w:t xml:space="preserve">benadering is inhoudelijk verwant aan dit onderzoek: beide benaderingen willen </w:t>
+      </w:r>
+      <w:r>
+        <w:rPr>
+          <w:color w:val="000000" w:themeColor="text1"/>
+        </w:rPr>
+        <w:t>logische verbanden</w:t>
+      </w:r>
+      <w:r>
+        <w:rPr>
+          <w:color w:val="000000" w:themeColor="text1"/>
+        </w:rPr>
+        <w:t xml:space="preserve"> (support/oppose versus fortunately/unfortunately) zichtbaar maken voor gebruikers die complexe redeneringen moeten begrijpen</w:t>
+      </w:r>
+      <w:r>
+        <w:rPr>
+          <w:color w:val="000000" w:themeColor="text1"/>
+        </w:rPr>
+        <w:t>.</w:t>
+      </w:r>
+      <w:r>
+        <w:rPr>
+          <w:color w:val="000000" w:themeColor="text1"/>
+        </w:rPr>
+        <w:t> In de hi</w:t>
+      </w:r>
+      <w:r>
+        <w:rPr>
+          <w:color w:val="000000" w:themeColor="text1"/>
+        </w:rPr>
+        <w:noBreakHyphen/>
+        <w:t>tree van Sbarski et al. worden proposities en “compound nodes” (redenen) afwisselend in een bipartite boom geplaatst</w:t>
+      </w:r>
+      <w:r>
+        <w:rPr>
+          <w:color w:val="000000" w:themeColor="text1"/>
+        </w:rPr>
+        <w:t xml:space="preserve">. Hierbij groeperen </w:t>
+      </w:r>
+      <w:r>
+        <w:rPr>
+          <w:color w:val="000000" w:themeColor="text1"/>
+        </w:rPr>
+        <w:t>compound nodes meerdere premissen</w:t>
+      </w:r>
+      <w:r>
+        <w:rPr>
+          <w:color w:val="000000" w:themeColor="text1"/>
+        </w:rPr>
+        <w:t xml:space="preserve">. In de hi-tree worden de aard en sterkte van de inferentie expliciet getoond </w:t>
+      </w:r>
+      <w:r>
+        <w:rPr>
+          <w:color w:val="000000" w:themeColor="text1"/>
+        </w:rPr>
+        <w:t xml:space="preserve">via kleurcodering (groen voor ondersteuning, rood voor tegenargumenten, oranje voor rebuttals) </w:t>
+      </w:r>
+      <w:r>
+        <w:rPr>
+          <w:color w:val="000000" w:themeColor="text1"/>
+        </w:rPr>
+        <w:t>e</w:t>
+      </w:r>
+      <w:r>
+        <w:rPr>
+          <w:color w:val="000000" w:themeColor="text1"/>
+        </w:rPr>
+        <w:t>n linkdikte.</w:t>
+      </w:r>
+      <w:r>
+        <w:rPr>
+          <w:color w:val="000000" w:themeColor="text1"/>
+        </w:rPr>
+        <w:t xml:space="preserve"> Toch is het toepassingsdomein verschillend. Sbarski et al. richten zich op algemene argumentatie en kritische denkvaardigheden, terwijl deze thesis een specifieke vorm van security</w:t>
+      </w:r>
+      <w:r>
+        <w:rPr>
+          <w:rFonts w:ascii="Cambria Math" w:hAnsi="Cambria Math" w:cs="Cambria Math"/>
+          <w:color w:val="000000" w:themeColor="text1"/>
+        </w:rPr>
+        <w:t>‑</w:t>
+      </w:r>
+      <w:r>
+        <w:rPr>
+          <w:color w:val="000000" w:themeColor="text1"/>
+        </w:rPr>
+        <w:t>ontwerpargumentatie modelleert</w:t>
+      </w:r>
+      <w:r>
+        <w:rPr>
+          <w:color w:val="000000" w:themeColor="text1"/>
+        </w:rPr>
+        <w:t xml:space="preserve">. Deze thesis modelleert </w:t>
+      </w:r>
+      <w:r>
+        <w:rPr>
+          <w:color w:val="000000" w:themeColor="text1"/>
+        </w:rPr>
+        <w:t>namelijk beslissingen over risico</w:t>
       </w:r>
       <w:r>
         <w:rPr>
           <w:rFonts w:cs="Aptos"/>
           <w:color w:val="000000" w:themeColor="text1"/>
         </w:rPr>
-        <w:t>“</w:t>
-      </w:r>
-      <w:r>
-        <w:rPr>
-          <w:color w:val="000000" w:themeColor="text1"/>
-        </w:rPr>
-        <w:t>support</w:t>
-      </w:r>
-      <w:r>
-        <w:rPr>
-          <w:rFonts w:cs="Aptos"/>
-          <w:color w:val="000000" w:themeColor="text1"/>
-        </w:rPr>
-        <w:t>”</w:t>
-      </w:r>
-      <w:r>
-        <w:rPr>
-          <w:color w:val="000000" w:themeColor="text1"/>
-        </w:rPr>
-        <w:t xml:space="preserve">, </w:t>
-      </w:r>
-      <w:r>
-        <w:rPr>
-          <w:rFonts w:cs="Aptos"/>
-          <w:color w:val="000000" w:themeColor="text1"/>
-        </w:rPr>
-        <w:t>“</w:t>
-      </w:r>
-      <w:r>
-        <w:rPr>
-          <w:color w:val="000000" w:themeColor="text1"/>
-        </w:rPr>
-        <w:t>oppose</w:t>
-      </w:r>
-      <w:r>
-        <w:rPr>
-          <w:rFonts w:cs="Aptos"/>
-          <w:color w:val="000000" w:themeColor="text1"/>
-        </w:rPr>
-        <w:t>”</w:t>
-      </w:r>
-      <w:r>
-        <w:rPr>
-          <w:color w:val="000000" w:themeColor="text1"/>
-        </w:rPr>
-        <w:t>) en kleurcodering (groen voor ondersteuning, rood voor tegenargumenten) om de evidenti</w:t>
-      </w:r>
-      <w:r>
-        <w:rPr>
-          <w:rFonts w:cs="Aptos"/>
-          <w:color w:val="000000" w:themeColor="text1"/>
-        </w:rPr>
-        <w:t>ë</w:t>
-      </w:r>
-      <w:r>
-        <w:rPr>
-          <w:color w:val="000000" w:themeColor="text1"/>
-        </w:rPr>
-        <w:t>le relatie tussen knooppunten expliciet te maken.  De auteurs kiezen bewust voor een aangepaste layered</w:t>
+        <w:t>’</w:t>
+      </w:r>
+      <w:r>
+        <w:rPr>
+          <w:color w:val="000000" w:themeColor="text1"/>
+        </w:rPr>
+        <w:t xml:space="preserve">s en mitigaties in het kader van threat modeling. Deze </w:t>
+      </w:r>
+      <w:r>
+        <w:rPr>
+          <w:color w:val="000000" w:themeColor="text1"/>
+        </w:rPr>
+        <w:lastRenderedPageBreak/>
+        <w:t>focus op security</w:t>
       </w:r>
       <w:r>
         <w:rPr>
@@ -9661,7 +10652,7 @@
         <w:rPr>
           <w:color w:val="000000" w:themeColor="text1"/>
         </w:rPr>
-        <w:t>tree</w:t>
+        <w:t>specifieke beslissingen vertaalt zich in extra semantiek in de boom (danger rating, statusiconen) en in UX</w:t>
       </w:r>
       <w:r>
         <w:rPr>
@@ -9674,221 +10665,62 @@
         <w:rPr>
           <w:color w:val="000000" w:themeColor="text1"/>
         </w:rPr>
-        <w:t>layout boven alternatieven zoals h</w:t>
+        <w:t>keuzes die zijn afgestemd op ontwikkelaars zonder diepe securityachtergrond</w:t>
+      </w:r>
+      <w:r>
+        <w:rPr>
+          <w:color w:val="000000" w:themeColor="text1"/>
+        </w:rPr>
+        <w:t xml:space="preserve"> </w:t>
+      </w:r>
+      <w:r>
+        <w:rPr>
+          <w:color w:val="000000" w:themeColor="text1"/>
+        </w:rPr>
+        <w:t xml:space="preserve">in plaats van op </w:t>
+      </w:r>
+      <w:r>
+        <w:rPr>
+          <w:i/>
+          <w:iCs/>
+          <w:color w:val="000000" w:themeColor="text1"/>
+        </w:rPr>
+        <w:t>general</w:t>
       </w:r>
       <w:r>
         <w:rPr>
           <w:rFonts w:ascii="Cambria Math" w:hAnsi="Cambria Math" w:cs="Cambria Math"/>
+          <w:i/>
+          <w:iCs/>
           <w:color w:val="000000" w:themeColor="text1"/>
         </w:rPr>
         <w:t>‑</w:t>
       </w:r>
       <w:r>
         <w:rPr>
-          <w:color w:val="000000" w:themeColor="text1"/>
-        </w:rPr>
-        <w:t>v trees, cone trees en radial trees, omdat die laatste de logische structuur minder duidelijk tonen en minder geschikt zijn voor grote, complexe argumentmaps.  Bovendien bekritiseren zij bestaande argument</w:t>
-      </w:r>
-      <w:r>
-        <w:rPr>
-          <w:rFonts w:ascii="Cambria Math" w:hAnsi="Cambria Math" w:cs="Cambria Math"/>
-          <w:color w:val="000000" w:themeColor="text1"/>
-        </w:rPr>
-        <w:t>‑</w:t>
-      </w:r>
-      <w:r>
-        <w:rPr>
-          <w:color w:val="000000" w:themeColor="text1"/>
-        </w:rPr>
-        <w:t>mappingtools om hun beperkte automatische layout, instabiele hertekeningen en gebrek aan controle over de volgorde van kinderen, wat direct raakt aan de leesbaarheid van redeneringen[</w:t>
-      </w:r>
-      <w:r>
-        <w:rPr>
-          <w:color w:val="000000" w:themeColor="text1"/>
-        </w:rPr>
-        <w:t>6</w:t>
-      </w:r>
-      <w:r>
-        <w:rPr>
-          <w:color w:val="000000" w:themeColor="text1"/>
-        </w:rPr>
-        <w:t>]</w:t>
-      </w:r>
-      <w:r>
-        <w:rPr>
-          <w:color w:val="000000" w:themeColor="text1"/>
-        </w:rPr>
-        <w:t>.</w:t>
-      </w:r>
-    </w:p>
-    <w:p>
-      <w:pPr>
-        <w:spacing w:after="24"/>
-        <w:rPr>
-          <w:color w:val="000000" w:themeColor="text1"/>
-        </w:rPr>
-      </w:pPr>
-    </w:p>
-    <w:p>
-      <w:pPr>
-        <w:spacing w:after="24"/>
-        <w:rPr>
-          <w:color w:val="000000" w:themeColor="text1"/>
-        </w:rPr>
-      </w:pPr>
-      <w:r>
-        <w:rPr>
-          <w:color w:val="000000" w:themeColor="text1"/>
-        </w:rPr>
-        <w:t>De hi</w:t>
-      </w:r>
-      <w:r>
-        <w:rPr>
-          <w:rFonts w:ascii="Cambria Math" w:hAnsi="Cambria Math" w:cs="Cambria Math"/>
-          <w:color w:val="000000" w:themeColor="text1"/>
-        </w:rPr>
-        <w:t>‑</w:t>
-      </w:r>
-      <w:r>
-        <w:rPr>
-          <w:color w:val="000000" w:themeColor="text1"/>
-        </w:rPr>
-        <w:t>tree</w:t>
-      </w:r>
-      <w:r>
-        <w:rPr>
-          <w:rFonts w:ascii="Cambria Math" w:hAnsi="Cambria Math" w:cs="Cambria Math"/>
-          <w:color w:val="000000" w:themeColor="text1"/>
-        </w:rPr>
-        <w:t>‑</w:t>
-      </w:r>
-      <w:r>
-        <w:rPr>
-          <w:color w:val="000000" w:themeColor="text1"/>
-        </w:rPr>
-        <w:t>benadering is inhoudelijk verwant aan dit onderzoek: beide benaderingen willen inferenti</w:t>
-      </w:r>
-      <w:r>
-        <w:rPr>
-          <w:rFonts w:cs="Aptos"/>
-          <w:color w:val="000000" w:themeColor="text1"/>
-        </w:rPr>
-        <w:t>ë</w:t>
-      </w:r>
-      <w:r>
-        <w:rPr>
-          <w:color w:val="000000" w:themeColor="text1"/>
-        </w:rPr>
-        <w:t>le relaties (support/oppose versus fortunately/unfortunately) zichtbaar maken voor gebruikers die complexe redeneringen moeten begrijpen</w:t>
-      </w:r>
-      <w:r>
-        <w:rPr>
-          <w:color w:val="000000" w:themeColor="text1"/>
-        </w:rPr>
-        <w:t>.</w:t>
-      </w:r>
-      <w:r>
-        <w:rPr>
-          <w:color w:val="000000" w:themeColor="text1"/>
-        </w:rPr>
-        <w:t> In de hi</w:t>
-      </w:r>
-      <w:r>
-        <w:rPr>
-          <w:color w:val="000000" w:themeColor="text1"/>
-        </w:rPr>
-        <w:noBreakHyphen/>
-        <w:t xml:space="preserve">tree van Sbarski et al. worden proposities en “compound nodes” (redenen) afwisselend in een bipartite boom geplaatst, waarbij compound nodes meerdere premissen groeperen en via kleurcodering (groen voor ondersteuning, rood voor tegenargumenten, oranje voor rebuttals) </w:t>
-      </w:r>
-      <w:r>
-        <w:rPr>
-          <w:color w:val="000000" w:themeColor="text1"/>
-        </w:rPr>
-        <w:t>e</w:t>
-      </w:r>
-      <w:r>
-        <w:rPr>
-          <w:color w:val="000000" w:themeColor="text1"/>
-        </w:rPr>
-        <w:t>n linkdikte de aard en sterkte van de inferentie expliciet tonen.</w:t>
-      </w:r>
-      <w:r>
-        <w:rPr>
-          <w:color w:val="000000" w:themeColor="text1"/>
-        </w:rPr>
-        <w:t xml:space="preserve"> Toch is het toepassingsdomein verschillend. Sbarski et al. richten zich op algemene argumentatie en kritische denkvaardigheden, terwijl deze thesis een specifieke vorm van security</w:t>
-      </w:r>
-      <w:r>
-        <w:rPr>
-          <w:rFonts w:ascii="Cambria Math" w:hAnsi="Cambria Math" w:cs="Cambria Math"/>
-          <w:color w:val="000000" w:themeColor="text1"/>
-        </w:rPr>
-        <w:t>‑</w:t>
-      </w:r>
-      <w:r>
-        <w:rPr>
-          <w:color w:val="000000" w:themeColor="text1"/>
-        </w:rPr>
-        <w:t>ontwerpargumentatie modelleert, namelijk beslissingen over risico</w:t>
-      </w:r>
-      <w:r>
-        <w:rPr>
-          <w:rFonts w:cs="Aptos"/>
-          <w:color w:val="000000" w:themeColor="text1"/>
-        </w:rPr>
-        <w:t>’</w:t>
-      </w:r>
-      <w:r>
-        <w:rPr>
-          <w:color w:val="000000" w:themeColor="text1"/>
-        </w:rPr>
-        <w:t xml:space="preserve">s en </w:t>
-      </w:r>
-      <w:r>
-        <w:rPr>
-          <w:color w:val="000000" w:themeColor="text1"/>
-        </w:rPr>
-        <w:lastRenderedPageBreak/>
-        <w:t>mitigaties in het kader van threat modeling.  Deze focus op security</w:t>
-      </w:r>
-      <w:r>
-        <w:rPr>
-          <w:rFonts w:ascii="Cambria Math" w:hAnsi="Cambria Math" w:cs="Cambria Math"/>
-          <w:color w:val="000000" w:themeColor="text1"/>
-        </w:rPr>
-        <w:t>‑</w:t>
-      </w:r>
-      <w:r>
-        <w:rPr>
-          <w:color w:val="000000" w:themeColor="text1"/>
-        </w:rPr>
-        <w:t>specifieke beslissingen vertaalt zich in extra semantiek in de boom (danger rating, statusiconen) en in UX</w:t>
-      </w:r>
-      <w:r>
-        <w:rPr>
-          <w:rFonts w:ascii="Cambria Math" w:hAnsi="Cambria Math" w:cs="Cambria Math"/>
-          <w:color w:val="000000" w:themeColor="text1"/>
-        </w:rPr>
-        <w:t>‑</w:t>
-      </w:r>
-      <w:r>
-        <w:rPr>
-          <w:color w:val="000000" w:themeColor="text1"/>
-        </w:rPr>
-        <w:t>keuzes die zijn afgestemd op ontwikkelaars zonder diepe securityachtergrond, in plaats van op general</w:t>
-      </w:r>
-      <w:r>
-        <w:rPr>
-          <w:rFonts w:ascii="Cambria Math" w:hAnsi="Cambria Math" w:cs="Cambria Math"/>
-          <w:color w:val="000000" w:themeColor="text1"/>
-        </w:rPr>
-        <w:t>‑</w:t>
-      </w:r>
-      <w:r>
-        <w:rPr>
-          <w:color w:val="000000" w:themeColor="text1"/>
-        </w:rPr>
-        <w:t>purpose argumentanalyse[</w:t>
+          <w:i/>
+          <w:iCs/>
+          <w:color w:val="000000" w:themeColor="text1"/>
+        </w:rPr>
+        <w:t>purpose</w:t>
+      </w:r>
+      <w:r>
+        <w:rPr>
+          <w:color w:val="000000" w:themeColor="text1"/>
+        </w:rPr>
+        <w:t xml:space="preserve"> argumentanalyse</w:t>
+      </w:r>
+      <w:r>
+        <w:rPr>
+          <w:color w:val="000000" w:themeColor="text1"/>
+        </w:rPr>
+        <w:t xml:space="preserve"> </w:t>
+      </w:r>
+      <w:r>
+        <w:rPr>
+          <w:color w:val="000000" w:themeColor="text1"/>
+        </w:rPr>
+        <w:t>[</w:t>
       </w:r>
       <w:r>
         <w:rPr>
@@ -10256,7 +11088,19 @@
         <w:rPr>
           <w:color w:val="000000" w:themeColor="text1"/>
         </w:rPr>
-        <w:t>integratie, en zijn primair ontworpen voor security</w:t>
+        <w:t>integratie</w:t>
+      </w:r>
+      <w:r>
+        <w:rPr>
+          <w:color w:val="000000" w:themeColor="text1"/>
+        </w:rPr>
+        <w:t xml:space="preserve">. Deze technieken </w:t>
+      </w:r>
+      <w:r>
+        <w:rPr>
+          <w:color w:val="000000" w:themeColor="text1"/>
+        </w:rPr>
+        <w:t>zijn primair ontworpen voor security</w:t>
       </w:r>
       <w:r>
         <w:rPr>
@@ -10269,7 +11113,21 @@
         <w:rPr>
           <w:color w:val="000000" w:themeColor="text1"/>
         </w:rPr>
-        <w:t>analisten en andere technische experts.  De auteurs benadrukken dat deze visualisaties vaak moeilijk te integreren zijn in agile pipelines en dat er een gebrek is aan gebruikersvriendelijke, taakgerichte visualisaties voor niet</w:t>
+        <w:t xml:space="preserve">analisten en andere technische experts.  De auteurs benadrukken dat deze visualisaties vaak moeilijk te integreren zijn in agile </w:t>
+      </w:r>
+      <w:r>
+        <w:rPr>
+          <w:i/>
+          <w:iCs/>
+          <w:color w:val="000000" w:themeColor="text1"/>
+        </w:rPr>
+        <w:t>pipelines</w:t>
+      </w:r>
+      <w:r>
+        <w:rPr>
+          <w:color w:val="000000" w:themeColor="text1"/>
+        </w:rPr>
+        <w:t xml:space="preserve"> en dat er een gebrek is aan gebruikersvriendelijke, taakgerichte visualisaties voor niet</w:t>
       </w:r>
       <w:r>
         <w:rPr>
@@ -10282,7 +11140,19 @@
         <w:rPr>
           <w:color w:val="000000" w:themeColor="text1"/>
         </w:rPr>
-        <w:t>experts[</w:t>
+        <w:t>experts</w:t>
+      </w:r>
+      <w:r>
+        <w:rPr>
+          <w:color w:val="000000" w:themeColor="text1"/>
+        </w:rPr>
+        <w:t xml:space="preserve"> </w:t>
+      </w:r>
+      <w:r>
+        <w:rPr>
+          <w:color w:val="000000" w:themeColor="text1"/>
+        </w:rPr>
+        <w:t>[</w:t>
       </w:r>
       <w:r>
         <w:rPr>
@@ -10335,7 +11205,51 @@
         <w:rPr>
           <w:color w:val="000000" w:themeColor="text1"/>
         </w:rPr>
-        <w:t>relevante informatie visualiseert, maar verschilt wezenlijk in focus: het gaat niet om monitoring van logs, phishingcampagnes of runtime</w:t>
+        <w:t>relevante informatie visualiseert</w:t>
+      </w:r>
+      <w:r>
+        <w:rPr>
+          <w:color w:val="000000" w:themeColor="text1"/>
+        </w:rPr>
+        <w:t xml:space="preserve">. </w:t>
+      </w:r>
+      <w:r>
+        <w:rPr>
+          <w:color w:val="000000" w:themeColor="text1"/>
+        </w:rPr>
+        <w:t>Het</w:t>
+      </w:r>
+      <w:r>
+        <w:rPr>
+          <w:color w:val="000000" w:themeColor="text1"/>
+        </w:rPr>
+        <w:t xml:space="preserve"> onderzoek</w:t>
+      </w:r>
+      <w:r>
+        <w:rPr>
+          <w:color w:val="000000" w:themeColor="text1"/>
+        </w:rPr>
+        <w:t xml:space="preserve"> </w:t>
+      </w:r>
+      <w:r>
+        <w:rPr>
+          <w:color w:val="000000" w:themeColor="text1"/>
+        </w:rPr>
+        <w:t xml:space="preserve">van deze thesis </w:t>
+      </w:r>
+      <w:r>
+        <w:rPr>
+          <w:color w:val="000000" w:themeColor="text1"/>
+        </w:rPr>
+        <w:t xml:space="preserve">verschilt wezenlijk in focus: het gaat niet om monitoring van logs, phishingcampagnes of </w:t>
+      </w:r>
+      <w:r>
+        <w:rPr>
+          <w:i/>
+          <w:iCs/>
+          <w:color w:val="000000" w:themeColor="text1"/>
+        </w:rPr>
+        <w:t>runtime</w:t>
       </w:r>
       <w:r>
         <w:rPr>
@@ -10361,7 +11275,7 @@
         <w:rPr>
           <w:color w:val="000000" w:themeColor="text1"/>
         </w:rPr>
-        <w:t>ontwerpargumentatie en beslissingen tijdens threat modeling.  Waar Devendra et al. voornamelijk bestaande tools voor operationele analyse synthetiseren, verkent deze thesis een narratieve, boomgebaseerde representatie die de trade</w:t>
+        <w:t>ontwerpargumentatie en beslissingen tijdens threat modeling. Waar Devendra et al. voornamelijk bestaande tools voor operationele analyse synthetiseren, verkent deze thesis een narratieve, boomgebaseerde representatie die de trade</w:t>
       </w:r>
       <w:r>
         <w:rPr>
@@ -10374,20 +11288,62 @@
         <w:rPr>
           <w:color w:val="000000" w:themeColor="text1"/>
         </w:rPr>
-        <w:t>offs tussen risico’s (unfortunately) en mitigaties (fortunately) expliciet maakt en daarmee het ontwerpproces zelf ondersteunt.  Daarmee positioneert dit werk zich op het snijvlak van hiërarchische visualisatie (treemap</w:t>
+        <w:t>offs tussen risico’s (unfortunately) en mitigaties (fortunately) expliciet maakt</w:t>
+      </w:r>
+      <w:r>
+        <w:rPr>
+          <w:color w:val="000000" w:themeColor="text1"/>
+        </w:rPr>
+        <w:t xml:space="preserve">. </w:t>
+      </w:r>
+      <w:r>
+        <w:rPr>
+          <w:color w:val="000000" w:themeColor="text1"/>
+        </w:rPr>
+        <w:t>Op deze manier</w:t>
+      </w:r>
+      <w:r>
+        <w:rPr>
+          <w:color w:val="000000" w:themeColor="text1"/>
+        </w:rPr>
+        <w:t xml:space="preserve"> ondersteunt de tool uit de thesis </w:t>
+      </w:r>
+      <w:r>
+        <w:rPr>
+          <w:color w:val="000000" w:themeColor="text1"/>
+        </w:rPr>
+        <w:t>het ontwerpproces zelf. Daarmee positioneert dit werk zich op het snijvlak van hiërarchische visualisatie (</w:t>
+      </w:r>
+      <w:r>
+        <w:rPr>
+          <w:i/>
+          <w:iCs/>
+          <w:color w:val="000000" w:themeColor="text1"/>
+        </w:rPr>
+        <w:t>treemap</w:t>
       </w:r>
       <w:r>
         <w:rPr>
           <w:rFonts w:ascii="Cambria Math" w:hAnsi="Cambria Math" w:cs="Cambria Math"/>
+          <w:i/>
+          <w:iCs/>
           <w:color w:val="000000" w:themeColor="text1"/>
         </w:rPr>
         <w:t>‑</w:t>
       </w:r>
       <w:r>
         <w:rPr>
-          <w:color w:val="000000" w:themeColor="text1"/>
-        </w:rPr>
-        <w:t>design space), argumentvisualisatie (hi</w:t>
+          <w:i/>
+          <w:iCs/>
+          <w:color w:val="000000" w:themeColor="text1"/>
+        </w:rPr>
+        <w:t>design space</w:t>
+      </w:r>
+      <w:r>
+        <w:rPr>
+          <w:color w:val="000000" w:themeColor="text1"/>
+        </w:rPr>
+        <w:t>), argumentvisualisatie (hi</w:t>
       </w:r>
       <w:r>
         <w:rPr>
@@ -10420,33 +11376,69 @@
         <w:rPr>
           <w:color w:val="000000" w:themeColor="text1"/>
         </w:rPr>
-        <w:t>visualisatie, maar met een nadrukkelijke verschuiving van operationele analyse naar begrijpelijke ontwerpargumentatie voor niet</w:t>
-      </w:r>
-      <w:r>
-        <w:rPr>
-          <w:rFonts w:ascii="Cambria Math" w:hAnsi="Cambria Math" w:cs="Cambria Math"/>
-          <w:color w:val="000000" w:themeColor="text1"/>
-        </w:rPr>
-        <w:t>‑</w:t>
-      </w:r>
-      <w:r>
-        <w:rPr>
-          <w:color w:val="000000" w:themeColor="text1"/>
-        </w:rPr>
+        <w:t>visualisatie</w:t>
+      </w:r>
+      <w:r>
+        <w:rPr>
+          <w:color w:val="000000" w:themeColor="text1"/>
+        </w:rPr>
+        <w:t>.</w:t>
+      </w:r>
+      <w:r>
+        <w:rPr>
+          <w:color w:val="000000" w:themeColor="text1"/>
+        </w:rPr>
+        <w:t> Tegelijkertijd</w:t>
+      </w:r>
+      <w:r>
+        <w:rPr>
+          <w:color w:val="000000" w:themeColor="text1"/>
+        </w:rPr>
+        <w:t xml:space="preserve"> verschuift d</w:t>
+      </w:r>
+      <w:r>
+        <w:rPr>
+          <w:color w:val="000000" w:themeColor="text1"/>
+        </w:rPr>
+        <w:t xml:space="preserve">it </w:t>
+      </w:r>
+      <w:r>
+        <w:rPr>
+          <w:color w:val="000000" w:themeColor="text1"/>
+        </w:rPr>
+        <w:t xml:space="preserve">onderzoek </w:t>
+      </w:r>
+      <w:r>
+        <w:rPr>
+          <w:color w:val="000000" w:themeColor="text1"/>
+        </w:rPr>
+        <w:t>de focus van operationele analyse naar toegankelijke ontwerpargumentatie voor niet</w:t>
+      </w:r>
+      <w:r>
+        <w:rPr>
+          <w:color w:val="000000" w:themeColor="text1"/>
+        </w:rPr>
+        <w:noBreakHyphen/>
         <w:t>security</w:t>
       </w:r>
       <w:r>
         <w:rPr>
-          <w:rFonts w:ascii="Cambria Math" w:hAnsi="Cambria Math" w:cs="Cambria Math"/>
-          <w:color w:val="000000" w:themeColor="text1"/>
-        </w:rPr>
-        <w:t>‑</w:t>
-      </w:r>
-      <w:r>
-        <w:rPr>
-          <w:color w:val="000000" w:themeColor="text1"/>
-        </w:rPr>
-        <w:t>experts[</w:t>
+          <w:color w:val="000000" w:themeColor="text1"/>
+        </w:rPr>
+        <w:noBreakHyphen/>
+        <w:t>experts</w:t>
+      </w:r>
+      <w:r>
+        <w:rPr>
+          <w:color w:val="000000" w:themeColor="text1"/>
+        </w:rPr>
+        <w:t xml:space="preserve"> </w:t>
+      </w:r>
+      <w:r>
+        <w:rPr>
+          <w:color w:val="000000" w:themeColor="text1"/>
+        </w:rPr>
+        <w:t>[</w:t>
       </w:r>
       <w:r>
         <w:rPr>
@@ -10583,20 +11575,164 @@
         <w:rPr>
           <w:color w:val="000000" w:themeColor="text1"/>
         </w:rPr>
-        <w:t>modelingtool beschreven. Eerst wordt de gekozen architectuur en gebruikte technologie</w:t>
+        <w:t xml:space="preserve">modelingtool beschreven. </w:t>
+      </w:r>
+      <w:r>
+        <w:rPr>
+          <w:color w:val="000000" w:themeColor="text1"/>
+        </w:rPr>
+        <w:t>Eerst worden de gekozen architectuur en gebruikte technologieën toegelicht.</w:t>
+      </w:r>
+      <w:r>
+        <w:rPr>
+          <w:i/>
+          <w:iCs/>
+          <w:color w:val="000000" w:themeColor="text1"/>
+        </w:rPr>
+        <w:t xml:space="preserve"> </w:t>
+      </w:r>
+      <w:r>
+        <w:rPr>
+          <w:color w:val="000000" w:themeColor="text1"/>
+        </w:rPr>
+        <w:t xml:space="preserve">Daarmee wordt verantwoord waarom deze </w:t>
+      </w:r>
+      <w:r>
+        <w:rPr>
+          <w:color w:val="000000" w:themeColor="text1"/>
+        </w:rPr>
+        <w:t>combinatie</w:t>
+      </w:r>
+      <w:r>
+        <w:rPr>
+          <w:color w:val="000000" w:themeColor="text1"/>
+        </w:rPr>
+        <w:t xml:space="preserve"> geschikt is voor interactieve boomvisualisaties en snelle iteratie</w:t>
+      </w:r>
+      <w:r>
+        <w:rPr>
+          <w:color w:val="000000" w:themeColor="text1"/>
+        </w:rPr>
+        <w:t xml:space="preserve">. </w:t>
+      </w:r>
+      <w:r>
+        <w:rPr>
+          <w:color w:val="000000" w:themeColor="text1"/>
+        </w:rPr>
+        <w:t>Vervolgens</w:t>
+      </w:r>
+      <w:r>
+        <w:rPr>
+          <w:color w:val="000000" w:themeColor="text1"/>
+        </w:rPr>
+        <w:t xml:space="preserve"> worden alternatieve visualisatielay</w:t>
+      </w:r>
+      <w:r>
+        <w:rPr>
+          <w:rFonts w:ascii="Cambria Math" w:hAnsi="Cambria Math" w:cs="Cambria Math"/>
+          <w:color w:val="000000" w:themeColor="text1"/>
+        </w:rPr>
+        <w:t>‑</w:t>
+      </w:r>
+      <w:r>
+        <w:rPr>
+          <w:color w:val="000000" w:themeColor="text1"/>
+        </w:rPr>
+        <w:t>outs besproken en gemotiveerd</w:t>
+      </w:r>
+      <w:r>
+        <w:rPr>
+          <w:color w:val="000000" w:themeColor="text1"/>
+        </w:rPr>
+        <w:t>. Zo wordt het</w:t>
+      </w:r>
+      <w:r>
+        <w:rPr>
+          <w:color w:val="000000" w:themeColor="text1"/>
+        </w:rPr>
+        <w:t xml:space="preserve"> duidelijk waarom uiteindelijk voor de fileview</w:t>
+      </w:r>
+      <w:r>
+        <w:rPr>
+          <w:rFonts w:ascii="Cambria Math" w:hAnsi="Cambria Math" w:cs="Cambria Math"/>
+          <w:color w:val="000000" w:themeColor="text1"/>
+        </w:rPr>
+        <w:t>‑</w:t>
+      </w:r>
+      <w:r>
+        <w:rPr>
+          <w:color w:val="000000" w:themeColor="text1"/>
+        </w:rPr>
+        <w:t>representatie is gekozen. Daarna volgt een gedetailleerde beschrijving van de belangrijkste interface</w:t>
+      </w:r>
+      <w:r>
+        <w:rPr>
+          <w:rFonts w:ascii="Cambria Math" w:hAnsi="Cambria Math" w:cs="Cambria Math"/>
+          <w:color w:val="000000" w:themeColor="text1"/>
+        </w:rPr>
+        <w:t>‑</w:t>
+      </w:r>
+      <w:r>
+        <w:rPr>
+          <w:color w:val="000000" w:themeColor="text1"/>
+        </w:rPr>
+        <w:t>componenten en UX</w:t>
+      </w:r>
+      <w:r>
+        <w:rPr>
+          <w:rFonts w:ascii="Cambria Math" w:hAnsi="Cambria Math" w:cs="Cambria Math"/>
+          <w:color w:val="000000" w:themeColor="text1"/>
+        </w:rPr>
+        <w:t>‑</w:t>
+      </w:r>
+      <w:r>
+        <w:rPr>
+          <w:color w:val="000000" w:themeColor="text1"/>
+        </w:rPr>
+        <w:t>features (kleurcodering, statusiconen, filtering, branch summaries)</w:t>
+      </w:r>
+      <w:r>
+        <w:rPr>
+          <w:color w:val="000000" w:themeColor="text1"/>
+        </w:rPr>
+        <w:t xml:space="preserve">. Deze concretiseren </w:t>
+      </w:r>
+      <w:r>
+        <w:rPr>
+          <w:color w:val="000000" w:themeColor="text1"/>
+        </w:rPr>
+        <w:t xml:space="preserve">samen de ondersteuning voor de </w:t>
+      </w:r>
+      <w:r>
+        <w:rPr>
+          <w:color w:val="000000" w:themeColor="text1"/>
+        </w:rPr>
+        <w:t>f</w:t>
+      </w:r>
+      <w:r>
+        <w:rPr>
+          <w:color w:val="000000" w:themeColor="text1"/>
+        </w:rPr>
+        <w:t>ortunately</w:t>
       </w:r>
       <w:r>
         <w:rPr>
           <w:rFonts w:cs="Aptos"/>
           <w:color w:val="000000" w:themeColor="text1"/>
         </w:rPr>
-        <w:t>ë</w:t>
-      </w:r>
-      <w:r>
-        <w:rPr>
-          <w:color w:val="000000" w:themeColor="text1"/>
-        </w:rPr>
-        <w:t>n toegelicht, om te verantwoorden waarom deze stack geschikt is voor interactieve boomvisualisaties en snelle iteratie. Vervolgens worden alternatieve visualisatielay</w:t>
+        <w:t>–</w:t>
+      </w:r>
+      <w:r>
+        <w:rPr>
+          <w:color w:val="000000" w:themeColor="text1"/>
+        </w:rPr>
+        <w:t>u</w:t>
+      </w:r>
+      <w:r>
+        <w:rPr>
+          <w:color w:val="000000" w:themeColor="text1"/>
+        </w:rPr>
+        <w:t>nfortunately</w:t>
       </w:r>
       <w:r>
         <w:rPr>
@@ -10609,72 +11745,7 @@
         <w:rPr>
           <w:color w:val="000000" w:themeColor="text1"/>
         </w:rPr>
-        <w:t>outs besproken en gemotiveerd, zodat duidelijk wordt waarom uiteindelijk voor de fileview</w:t>
-      </w:r>
-      <w:r>
-        <w:rPr>
-          <w:rFonts w:ascii="Cambria Math" w:hAnsi="Cambria Math" w:cs="Cambria Math"/>
-          <w:color w:val="000000" w:themeColor="text1"/>
-        </w:rPr>
-        <w:t>‑</w:t>
-      </w:r>
-      <w:r>
-        <w:rPr>
-          <w:color w:val="000000" w:themeColor="text1"/>
-        </w:rPr>
-        <w:t>representatie is gekozen. Daarna volgt een gedetailleerde beschrijving van de belangrijkste interface</w:t>
-      </w:r>
-      <w:r>
-        <w:rPr>
-          <w:rFonts w:ascii="Cambria Math" w:hAnsi="Cambria Math" w:cs="Cambria Math"/>
-          <w:color w:val="000000" w:themeColor="text1"/>
-        </w:rPr>
-        <w:t>‑</w:t>
-      </w:r>
-      <w:r>
-        <w:rPr>
-          <w:color w:val="000000" w:themeColor="text1"/>
-        </w:rPr>
-        <w:t>componenten en UX</w:t>
-      </w:r>
-      <w:r>
-        <w:rPr>
-          <w:rFonts w:ascii="Cambria Math" w:hAnsi="Cambria Math" w:cs="Cambria Math"/>
-          <w:color w:val="000000" w:themeColor="text1"/>
-        </w:rPr>
-        <w:t>‑</w:t>
-      </w:r>
-      <w:r>
-        <w:rPr>
-          <w:color w:val="000000" w:themeColor="text1"/>
-        </w:rPr>
-        <w:t>features (kleurcodering, statusiconen, filtering, branch summaries), die samen de ondersteuning voor de Fortunately</w:t>
-      </w:r>
-      <w:r>
-        <w:rPr>
-          <w:rFonts w:cs="Aptos"/>
-          <w:color w:val="000000" w:themeColor="text1"/>
-        </w:rPr>
-        <w:t>–</w:t>
-      </w:r>
-      <w:r>
-        <w:rPr>
-          <w:color w:val="000000" w:themeColor="text1"/>
-        </w:rPr>
-        <w:t>Unfortunately</w:t>
-      </w:r>
-      <w:r>
-        <w:rPr>
-          <w:rFonts w:ascii="Cambria Math" w:hAnsi="Cambria Math" w:cs="Cambria Math"/>
-          <w:color w:val="000000" w:themeColor="text1"/>
-        </w:rPr>
-        <w:t>‑</w:t>
-      </w:r>
-      <w:r>
-        <w:rPr>
-          <w:color w:val="000000" w:themeColor="text1"/>
-        </w:rPr>
-        <w:t>methode concretiseren. Tot slot worden prototypebeperkingen en designkeuzes samengevat als voorbereiding op de gebruikersstudie in het volgende hoofdstuk.</w:t>
+        <w:t>methode. Tot slot worden prototypebeperkingen en designkeuzes samengevat als voorbereiding op de gebruikersstudie in het volgende hoofdstuk.</w:t>
       </w:r>
     </w:p>
     <w:p>
@@ -10755,7 +11826,57 @@
         <w:rPr>
           <w:color w:val="000000" w:themeColor="text1"/>
         </w:rPr>
-        <w:t>Het ontwerp van de webtool vertrekt vanuit de nood om threat modeling concreet uitvoerbaar te maken voor ontwikkelaars zonder uitgebreide securityachtergrond, met een sterke focus op leesbaarheid van de boom, directe visuele feedback en eenvoudige navigatie. De codebasis is daarom opgezet rond een beperkt aantal, duidelijk herkenbare visuele bouwblokken (nodes, iconen, panelen) die in de volledige interface consequent worden hergebruikt. De Fortunately–Unfortunately</w:t>
+        <w:t>Het ontwerp van de webtool vertrekt vanuit de nood om threat modeling concreet uitvoerbaar te maken voor ontwikkelaars zonder uitgebreide securityachtergrond</w:t>
+      </w:r>
+      <w:r>
+        <w:rPr>
+          <w:color w:val="000000" w:themeColor="text1"/>
+        </w:rPr>
+        <w:t>. De tool heeft nood aan</w:t>
+      </w:r>
+      <w:r>
+        <w:rPr>
+          <w:color w:val="000000" w:themeColor="text1"/>
+        </w:rPr>
+        <w:t xml:space="preserve"> een sterke focus op leesbaarheid van de boom, directe visuele feedback en eenvoudige navigatie. De codebasis is daarom opgezet rond een beperkt aantal, duidelijk herkenbare visuele bouwblokken (nodes, iconen, </w:t>
+      </w:r>
+      <w:r>
+        <w:rPr>
+          <w:i/>
+          <w:iCs/>
+          <w:color w:val="000000" w:themeColor="text1"/>
+        </w:rPr>
+        <w:t>sidebars</w:t>
+      </w:r>
+      <w:r>
+        <w:rPr>
+          <w:color w:val="000000" w:themeColor="text1"/>
+        </w:rPr>
+        <w:t xml:space="preserve">) die in de volledige interface consequent worden hergebruikt. De </w:t>
+      </w:r>
+      <w:r>
+        <w:rPr>
+          <w:color w:val="000000" w:themeColor="text1"/>
+        </w:rPr>
+        <w:t>f</w:t>
+      </w:r>
+      <w:r>
+        <w:rPr>
+          <w:color w:val="000000" w:themeColor="text1"/>
+        </w:rPr>
+        <w:t>ortunately–</w:t>
+      </w:r>
+      <w:r>
+        <w:rPr>
+          <w:color w:val="000000" w:themeColor="text1"/>
+        </w:rPr>
+        <w:t>u</w:t>
+      </w:r>
+      <w:r>
+        <w:rPr>
+          <w:color w:val="000000" w:themeColor="text1"/>
+        </w:rPr>
+        <w:t>nfortunately</w:t>
       </w:r>
       <w:r>
         <w:rPr>
@@ -10900,6 +12021,7 @@
         <w:rPr>
           <w:color w:val="000000" w:themeColor="text1"/>
         </w:rPr>
+        <w:lastRenderedPageBreak/>
         <w:t xml:space="preserve">een datastructuur voor nodes (name, </w:t>
       </w:r>
       <w:r>
@@ -10942,15 +12064,38 @@
         <w:rPr>
           <w:color w:val="000000" w:themeColor="text1"/>
         </w:rPr>
-        <w:lastRenderedPageBreak/>
-        <w:t>een visualisatielaag met React</w:t>
+        <w:t xml:space="preserve">een </w:t>
+      </w:r>
+      <w:r>
+        <w:rPr>
+          <w:color w:val="000000" w:themeColor="text1"/>
+        </w:rPr>
+        <w:t>visualisatie laag</w:t>
+      </w:r>
+      <w:r>
+        <w:rPr>
+          <w:color w:val="000000" w:themeColor="text1"/>
+        </w:rPr>
+        <w:t xml:space="preserve"> met React</w:t>
       </w:r>
       <w:r>
         <w:rPr>
           <w:color w:val="000000" w:themeColor="text1"/>
         </w:rPr>
         <w:noBreakHyphen/>
-        <w:t>componenten voor nodes, iconen, zijpanelen en tooltips;</w:t>
+        <w:t xml:space="preserve">componenten voor nodes, iconen, </w:t>
+      </w:r>
+      <w:r>
+        <w:rPr>
+          <w:color w:val="000000" w:themeColor="text1"/>
+        </w:rPr>
+        <w:t>sidebars</w:t>
+      </w:r>
+      <w:r>
+        <w:rPr>
+          <w:color w:val="000000" w:themeColor="text1"/>
+        </w:rPr>
+        <w:t xml:space="preserve"> en tooltips;</w:t>
       </w:r>
     </w:p>
     <w:p>
@@ -11112,7 +12257,28 @@
     <w:p/>
     <w:p>
       <w:r>
-        <w:t>Verschillende visuele structuren voor de representatie van fortunately/unfortunately-bomen werden onderzocht, waaronder treemaps, circulaire treemaps, horizontale tree lay-outs, verticale tree lay-outs en een fileview-geïnspireerde lay-out. Deze opties werden geëvalueerd op leesbaarheid, schaalbaarheid, cognitieve belasting en hun vermogen om sequentiële en hiërarchische relaties tegelijkertijd te ondersteunen.</w:t>
+        <w:t>Verschillende visuele structuren voor de representatie van fortunately</w:t>
+      </w:r>
+      <w:r>
+        <w:t>-</w:t>
+      </w:r>
+      <w:r>
+        <w:t>unfortunately-bomen werden onderzocht</w:t>
+      </w:r>
+      <w:r>
+        <w:t xml:space="preserve">. </w:t>
+      </w:r>
+      <w:r>
+        <w:t>De afgewogen structuren zij</w:t>
+      </w:r>
+      <w:r>
+        <w:t xml:space="preserve">n </w:t>
+      </w:r>
+      <w:r>
+        <w:t xml:space="preserve">treemaps, circulaire treemaps, horizontale tree lay-outs, verticale tree lay-outs en een fileview-geïnspireerde lay-out. </w:t>
+      </w:r>
+      <w:r>
+        <w:t>Deze opties werden geëvalueerd op leesbaarheid, schaalbaarheid, cognitieve belasting en hun vermogen om sequentiële en hiërarchische relaties tegelijkertijd te ondersteunen.</w:t>
       </w:r>
     </w:p>
     <w:p/>
@@ -11169,7 +12335,13 @@
         <w:t xml:space="preserve"> fragmenteert</w:t>
       </w:r>
       <w:r>
-        <w:t xml:space="preserve"> de volgorde van fortunately/unfortunately-relaties visueel en </w:t>
+        <w:t xml:space="preserve"> de volgorde van fortunately</w:t>
+      </w:r>
+      <w:r>
+        <w:t>-</w:t>
+      </w:r>
+      <w:r>
+        <w:t xml:space="preserve">unfortunately-relaties visueel en </w:t>
       </w:r>
       <w:r>
         <w:t>bemoeilijkt</w:t>
@@ -11181,7 +12353,19 @@
         <w:t xml:space="preserve">de traceerbaarheid </w:t>
       </w:r>
       <w:r>
-        <w:t xml:space="preserve">van parent-child-paden. Treemaps, waarin unfortunately-nodes als dominante blokstructuren en fortunately-nodes als subregio’s worden weergegeven, optimaliseren </w:t>
+        <w:t>van parent-child-paden. Treemaps, waarin unfortunately</w:t>
+      </w:r>
+      <w:r>
+        <w:t xml:space="preserve"> </w:t>
+      </w:r>
+      <w:r>
+        <w:t>nodes als dominante blokstructuren en fortunately</w:t>
+      </w:r>
+      <w:r>
+        <w:t xml:space="preserve"> </w:t>
+      </w:r>
+      <w:r>
+        <w:t xml:space="preserve">nodes als subregio’s worden weergegeven, optimaliseren </w:t>
       </w:r>
       <w:r>
         <w:t>risico-overzicht</w:t>
@@ -11209,7 +12393,7 @@
         </w:rPr>
         <w:lastRenderedPageBreak/>
         <w:drawing>
-          <wp:inline distT="0" distB="0" distL="0" distR="0" wp14:anchorId="164C6A69" wp14:editId="53FBE641">
+          <wp:inline distT="0" distB="0" distL="0" distR="0" wp14:anchorId="164C6A69" wp14:editId="0BCD9128">
             <wp:extent cx="4117443" cy="2455034"/>
             <wp:effectExtent l="0" t="0" r="0" b="2540"/>
             <wp:docPr id="163695878" name="Afbeelding 1"/>
@@ -11336,7 +12520,7 @@
           <w:color w:val="000000" w:themeColor="text1"/>
         </w:rPr>
         <w:drawing>
-          <wp:inline distT="0" distB="0" distL="0" distR="0" wp14:anchorId="2D40E1FD" wp14:editId="396E3534">
+          <wp:inline distT="0" distB="0" distL="0" distR="0" wp14:anchorId="2D40E1FD" wp14:editId="4B3A048E">
             <wp:extent cx="5779492" cy="3544028"/>
             <wp:effectExtent l="0" t="0" r="0" b="0"/>
             <wp:docPr id="935087861" name="Afbeelding 1"/>
@@ -11489,7 +12673,13 @@
         <w:t xml:space="preserve">mplementeerd. </w:t>
       </w:r>
       <w:r>
-        <w:t>De horizontale versie toont de afwisseling tussen fortunately- en unfortunately-nodes van links naar rechts, terwijl de verticale lay-out een top-downstructuur met uitklapbare takken hanteert. Hoewel beide dezelfde node</w:t>
+        <w:t>De horizontale versie toont de afwisseling tussen fortunately en unfortunately</w:t>
+      </w:r>
+      <w:r>
+        <w:t xml:space="preserve"> </w:t>
+      </w:r>
+      <w:r>
+        <w:t>nodes van links naar rechts, terwijl de verticale lay-out een top-downstructuur met uitklapbare takken hanteert. Hoewel beide dezelfde node</w:t>
       </w:r>
       <w:r>
         <w:t>-</w:t>
@@ -11524,7 +12714,7 @@
         </w:rPr>
         <w:lastRenderedPageBreak/>
         <w:drawing>
-          <wp:inline distT="0" distB="0" distL="0" distR="0" wp14:anchorId="6AC59A2E" wp14:editId="01C9E54C">
+          <wp:inline distT="0" distB="0" distL="0" distR="0" wp14:anchorId="6AC59A2E" wp14:editId="1D75CCAF">
             <wp:extent cx="5759450" cy="2856865"/>
             <wp:effectExtent l="0" t="0" r="0" b="635"/>
             <wp:docPr id="234035025" name="Afbeelding 1" descr="Afbeelding met diagram, schermopname, lijn, ontwerp&#10;&#10;Door AI gegenereerde inhoud is mogelijk onjuist."/>
@@ -11633,7 +12823,7 @@
           <w:color w:val="000000" w:themeColor="text1"/>
         </w:rPr>
         <w:drawing>
-          <wp:inline distT="0" distB="0" distL="0" distR="0" wp14:anchorId="11AC0779" wp14:editId="0E558487">
+          <wp:inline distT="0" distB="0" distL="0" distR="0" wp14:anchorId="11AC0779" wp14:editId="47122081">
             <wp:extent cx="5759450" cy="1689735"/>
             <wp:effectExtent l="0" t="0" r="0" b="5715"/>
             <wp:docPr id="373297823" name="Afbeelding 2" descr="Afbeelding met diagram, lijn, origami, ontwerp&#10;&#10;Door AI gegenereerde inhoud is mogelijk onjuist."/>
@@ -11744,7 +12934,13 @@
         <w:t>6</w:t>
       </w:r>
       <w:r>
-        <w:t>) onderzocht, waarin de boomstructuur wordt gepresenteerd als een hi</w:t>
+        <w:t>) onderzocht</w:t>
+      </w:r>
+      <w:r>
+        <w:t xml:space="preserve">. Hierin wordt </w:t>
+      </w:r>
+      <w:r>
+        <w:t>de boomstructuur gepresenteerd als een hi</w:t>
       </w:r>
       <w:r>
         <w:rPr>
@@ -11944,7 +13140,13 @@
     <w:p/>
     <w:p>
       <w:r>
-        <w:t>Op basis van de verkenning werden de treemap- en circulaire treemapvarianten op voorhand uitgesloten wegens hun lage geschiktheid voor sequentiële causaliteitsweergave. De horizontale en verticale tree lay-outs werden wel ontwikkeld en getest, maar voldeden niet aan de gebruikerseisen inzake overzicht en leesbaarheid.</w:t>
+        <w:t>Op basis van de verkenning werden de treemap- en circulaire treemap</w:t>
+      </w:r>
+      <w:r>
+        <w:t xml:space="preserve"> </w:t>
+      </w:r>
+      <w:r>
+        <w:t>varianten op voorhand uitgesloten wegens hun lage geschiktheid voor sequentiële causaliteitsweergave. De horizontale en verticale tree lay-outs werden wel ontwikkeld en getest, maar voldeden niet aan de gebruikerseisen inzake overzicht en leesbaarheid.</w:t>
       </w:r>
     </w:p>
     <w:p/>
@@ -12064,7 +13266,43 @@
           <w:color w:val="000000" w:themeColor="text1"/>
         </w:rPr>
         <w:noBreakHyphen/>
-        <w:t>trees überhaupt te kunnen modelleren: het aanmaken, hernoemen en verwijderen van nodes, het uit</w:t>
+        <w:t>trees te kunnen modelleren</w:t>
+      </w:r>
+      <w:r>
+        <w:rPr>
+          <w:color w:val="000000" w:themeColor="text1"/>
+        </w:rPr>
+        <w:t xml:space="preserve">. </w:t>
+      </w:r>
+      <w:r>
+        <w:rPr>
+          <w:color w:val="000000" w:themeColor="text1"/>
+        </w:rPr>
+        <w:t>Dit</w:t>
+      </w:r>
+      <w:r>
+        <w:rPr>
+          <w:color w:val="000000" w:themeColor="text1"/>
+        </w:rPr>
+        <w:t xml:space="preserve"> gaat </w:t>
+      </w:r>
+      <w:r>
+        <w:rPr>
+          <w:color w:val="000000" w:themeColor="text1"/>
+        </w:rPr>
+        <w:t>over</w:t>
+      </w:r>
+      <w:r>
+        <w:rPr>
+          <w:color w:val="000000" w:themeColor="text1"/>
+        </w:rPr>
+        <w:t xml:space="preserve"> functies als</w:t>
+      </w:r>
+      <w:r>
+        <w:rPr>
+          <w:color w:val="000000" w:themeColor="text1"/>
+        </w:rPr>
+        <w:t xml:space="preserve"> het aanmaken, hernoemen en verwijderen van nodes, het uit</w:t>
       </w:r>
       <w:r>
         <w:rPr>
@@ -12078,7 +13316,19 @@
           <w:color w:val="000000" w:themeColor="text1"/>
         </w:rPr>
         <w:noBreakHyphen/>
-        <w:t>layout (fileview</w:t>
+        <w:t>lay</w:t>
+      </w:r>
+      <w:r>
+        <w:rPr>
+          <w:color w:val="000000" w:themeColor="text1"/>
+        </w:rPr>
+        <w:t>-</w:t>
+      </w:r>
+      <w:r>
+        <w:rPr>
+          <w:color w:val="000000" w:themeColor="text1"/>
+        </w:rPr>
+        <w:t>out (fileview</w:t>
       </w:r>
       <w:r>
         <w:rPr>
@@ -12246,7 +13496,51 @@
         <w:rPr>
           <w:color w:val="000000" w:themeColor="text1"/>
         </w:rPr>
-        <w:t>stappen visueel onmiddellijk duidelijk te maken en tegelijk de boom goed leesbaar te houden bij lange ketens. Elke node toont daarom steeds dezelfde basiselementen (tekst, rand, vorm), maar het type wordt onderscheidend weergegeven via kleur en label</w:t>
+        <w:t>stappen visueel onmiddellijk duidelijk te maken en tegelijk de boom goed leesbaar te houden bij lange ketens. Elke node toont daarom steeds dezelfde basiselementen (tekst, rand, vorm)</w:t>
+      </w:r>
+      <w:r>
+        <w:rPr>
+          <w:color w:val="000000" w:themeColor="text1"/>
+        </w:rPr>
+        <w:t xml:space="preserve">. </w:t>
+      </w:r>
+      <w:r>
+        <w:rPr>
+          <w:color w:val="000000" w:themeColor="text1"/>
+        </w:rPr>
+        <w:t>Daarnaast</w:t>
+      </w:r>
+      <w:r>
+        <w:rPr>
+          <w:color w:val="000000" w:themeColor="text1"/>
+        </w:rPr>
+        <w:t xml:space="preserve"> wordt </w:t>
+      </w:r>
+      <w:r>
+        <w:rPr>
+          <w:color w:val="000000" w:themeColor="text1"/>
+        </w:rPr>
+        <w:t>het type onderscheidend weergegeven via kleur en</w:t>
+      </w:r>
+      <w:r>
+        <w:rPr>
+          <w:color w:val="000000" w:themeColor="text1"/>
+        </w:rPr>
+        <w:t xml:space="preserve"> een</w:t>
+      </w:r>
+      <w:r>
+        <w:rPr>
+          <w:color w:val="000000" w:themeColor="text1"/>
+        </w:rPr>
+        <w:t xml:space="preserve"> </w:t>
+      </w:r>
+      <w:r>
+        <w:rPr>
+          <w:i/>
+          <w:iCs/>
+          <w:color w:val="000000" w:themeColor="text1"/>
+        </w:rPr>
+        <w:t>label</w:t>
       </w:r>
       <w:r>
         <w:rPr>
@@ -12307,6 +13601,12 @@
         <w:rPr>
           <w:color w:val="000000" w:themeColor="text1"/>
         </w:rPr>
+        <w:t xml:space="preserve"> de</w:t>
+      </w:r>
+      <w:r>
+        <w:rPr>
+          <w:color w:val="000000" w:themeColor="text1"/>
+        </w:rPr>
         <w:t xml:space="preserve"> unfortunately</w:t>
       </w:r>
       <w:r>
@@ -12344,7 +13644,67 @@
         <w:rPr>
           <w:color w:val="000000" w:themeColor="text1"/>
         </w:rPr>
-        <w:t xml:space="preserve"> een rode achtergrond, telkens met afgeronde hoeken, zwarte rand en gecentreerde tekst. Deze consistente vormgeving ondersteunt snelle scanning van de structuur en maakt het eenvoudig om in één oogopslag te zien waar positieve en negatieve stappen elkaar afwisselen, wat cruciaal is voor het begrijpen van de logica van een Fortunately–Unfortunately</w:t>
+        <w:t xml:space="preserve"> een rode achtergrond</w:t>
+      </w:r>
+      <w:r>
+        <w:rPr>
+          <w:color w:val="000000" w:themeColor="text1"/>
+        </w:rPr>
+        <w:t>. Deze nodes hebben telkens</w:t>
+      </w:r>
+      <w:r>
+        <w:rPr>
+          <w:color w:val="000000" w:themeColor="text1"/>
+        </w:rPr>
+        <w:t xml:space="preserve"> afgeronde hoeken,</w:t>
+      </w:r>
+      <w:r>
+        <w:rPr>
+          <w:color w:val="000000" w:themeColor="text1"/>
+        </w:rPr>
+        <w:t xml:space="preserve"> een</w:t>
+      </w:r>
+      <w:r>
+        <w:rPr>
+          <w:color w:val="000000" w:themeColor="text1"/>
+        </w:rPr>
+        <w:t xml:space="preserve"> zwarte rand en gecentreerde tekst. Deze consistente vormgeving ondersteunt snelle scanning van de structuur en maakt het eenvoudig om in één oogopslag te zien waar positieve en negatieve stappen elkaar afwisselen</w:t>
+      </w:r>
+      <w:r>
+        <w:rPr>
+          <w:color w:val="000000" w:themeColor="text1"/>
+        </w:rPr>
+        <w:t>. Dit is</w:t>
+      </w:r>
+      <w:r>
+        <w:rPr>
+          <w:color w:val="000000" w:themeColor="text1"/>
+        </w:rPr>
+        <w:t xml:space="preserve"> cruciaal voor het begrijpen van de logica van een </w:t>
+      </w:r>
+      <w:r>
+        <w:rPr>
+          <w:color w:val="000000" w:themeColor="text1"/>
+        </w:rPr>
+        <w:t>f</w:t>
+      </w:r>
+      <w:r>
+        <w:rPr>
+          <w:color w:val="000000" w:themeColor="text1"/>
+        </w:rPr>
+        <w:t>ortunately–</w:t>
+      </w:r>
+      <w:r>
+        <w:rPr>
+          <w:color w:val="000000" w:themeColor="text1"/>
+        </w:rPr>
+        <w:t>u</w:t>
+      </w:r>
+      <w:r>
+        <w:rPr>
+          <w:color w:val="000000" w:themeColor="text1"/>
+        </w:rPr>
+        <w:t>nfortunately</w:t>
       </w:r>
       <w:r>
         <w:rPr>
@@ -12379,14 +13739,110 @@
         <w:rPr>
           <w:color w:val="000000" w:themeColor="text1"/>
         </w:rPr>
-        <w:t>Alle nodes worden via één generieke component opgebouwd, zodat maximum breedte, tekstomloop, padding en borders overal identiek zijn. Dit voorkomt visuele ruis en zorgt ervoor dat gebruikers zich kunnen concentreren op de inhoud (de scenario</w:t>
+        <w:t>Alle nodes worden via één generieke component opgebouwd</w:t>
+      </w:r>
+      <w:r>
+        <w:rPr>
+          <w:color w:val="000000" w:themeColor="text1"/>
+        </w:rPr>
+        <w:t>.</w:t>
+      </w:r>
+      <w:r>
+        <w:rPr>
+          <w:color w:val="000000" w:themeColor="text1"/>
+        </w:rPr>
+        <w:t xml:space="preserve"> </w:t>
+      </w:r>
+      <w:r>
+        <w:rPr>
+          <w:color w:val="000000" w:themeColor="text1"/>
+        </w:rPr>
+        <w:t xml:space="preserve">Zo </w:t>
+      </w:r>
+      <w:r>
+        <w:rPr>
+          <w:color w:val="000000" w:themeColor="text1"/>
+        </w:rPr>
+        <w:t xml:space="preserve">zijn </w:t>
+      </w:r>
+      <w:r>
+        <w:rPr>
+          <w:color w:val="000000" w:themeColor="text1"/>
+        </w:rPr>
+        <w:t>de</w:t>
+      </w:r>
+      <w:r>
+        <w:rPr>
+          <w:color w:val="000000" w:themeColor="text1"/>
+        </w:rPr>
+        <w:t xml:space="preserve"> maximum breedte, </w:t>
+      </w:r>
+      <w:r>
+        <w:rPr>
+          <w:color w:val="000000" w:themeColor="text1"/>
+        </w:rPr>
+        <w:t xml:space="preserve">de </w:t>
+      </w:r>
+      <w:r>
+        <w:rPr>
+          <w:color w:val="000000" w:themeColor="text1"/>
+        </w:rPr>
+        <w:t xml:space="preserve">tekstomloop, </w:t>
+      </w:r>
+      <w:r>
+        <w:rPr>
+          <w:color w:val="000000" w:themeColor="text1"/>
+        </w:rPr>
+        <w:t xml:space="preserve">de </w:t>
+      </w:r>
+      <w:r>
+        <w:rPr>
+          <w:color w:val="000000" w:themeColor="text1"/>
+        </w:rPr>
+        <w:t>padding en</w:t>
+      </w:r>
+      <w:r>
+        <w:rPr>
+          <w:color w:val="000000" w:themeColor="text1"/>
+        </w:rPr>
+        <w:t xml:space="preserve"> de</w:t>
+      </w:r>
+      <w:r>
+        <w:rPr>
+          <w:color w:val="000000" w:themeColor="text1"/>
+        </w:rPr>
+        <w:t xml:space="preserve"> borders overal identie</w:t>
+      </w:r>
+      <w:r>
+        <w:rPr>
+          <w:color w:val="000000" w:themeColor="text1"/>
+        </w:rPr>
+        <w:t>k</w:t>
+      </w:r>
+      <w:r>
+        <w:rPr>
+          <w:color w:val="000000" w:themeColor="text1"/>
+        </w:rPr>
+        <w:t>. Dit voorkomt visuele ruis en zorgt ervoor dat gebruikers zich kunnen concentreren op de inhoud (de scenario</w:t>
       </w:r>
       <w:r>
         <w:rPr>
           <w:color w:val="000000" w:themeColor="text1"/>
         </w:rPr>
         <w:noBreakHyphen/>
-        <w:t>stappen) in plaats van op kleine stijlverschillen. Boven elke node wordt in kleinere typografie het corresponderende label “fortunately” of “unfortunately” toegevoegd. Deze redundante codering (kleur én tekst) verlaagt de cognitieve belasting, sluit aan bij Nielsen</w:t>
+        <w:t>stappen) in plaats van op kleine stijlverschillen. Boven elke node wordt in kleinere typografie het corresponderende label “fortunately” of “unfortunately” toegevoegd. Deze codering (kleur én tekst) verlaagt de cognitieve belasting</w:t>
+      </w:r>
+      <w:r>
+        <w:rPr>
+          <w:color w:val="000000" w:themeColor="text1"/>
+        </w:rPr>
+        <w:t xml:space="preserve"> en </w:t>
+      </w:r>
+      <w:r>
+        <w:rPr>
+          <w:color w:val="000000" w:themeColor="text1"/>
+        </w:rPr>
+        <w:t>sluit aan bij Nielsen</w:t>
       </w:r>
       <w:r>
         <w:rPr>
@@ -12398,14 +13854,77 @@
         <w:rPr>
           <w:color w:val="000000" w:themeColor="text1"/>
         </w:rPr>
-        <w:t xml:space="preserve">s heuristieken rond consistentie en herkenning boven herinnering, en komt ook gebruikers met kleurperceptieproblemen tegemoet, omdat zij niet uitsluitend op kleur hoeven te </w:t>
+        <w:t>s heuristieken rond consistentie en herkenning boven herinnering</w:t>
+      </w:r>
+      <w:r>
+        <w:rPr>
+          <w:color w:val="000000" w:themeColor="text1"/>
+        </w:rPr>
+        <w:t>.</w:t>
+      </w:r>
+      <w:r>
+        <w:rPr>
+          <w:color w:val="000000" w:themeColor="text1"/>
+        </w:rPr>
+        <w:t xml:space="preserve"> </w:t>
+      </w:r>
+      <w:r>
+        <w:rPr>
+          <w:color w:val="000000" w:themeColor="text1"/>
+        </w:rPr>
+        <w:t>Door het lab</w:t>
+      </w:r>
+      <w:r>
+        <w:t>el</w:t>
+      </w:r>
+      <w:r>
+        <w:rPr>
+          <w:color w:val="000000" w:themeColor="text1"/>
+        </w:rPr>
+        <w:t xml:space="preserve"> </w:t>
+      </w:r>
+      <w:r>
+        <w:rPr>
+          <w:color w:val="000000" w:themeColor="text1"/>
+        </w:rPr>
+        <w:t>kunnen</w:t>
+      </w:r>
+      <w:r>
+        <w:rPr>
+          <w:color w:val="000000" w:themeColor="text1"/>
+        </w:rPr>
+        <w:t xml:space="preserve"> ook gebruikers met kleurperceptieproblemen </w:t>
+      </w:r>
+      <w:r>
+        <w:rPr>
+          <w:color w:val="000000" w:themeColor="text1"/>
+        </w:rPr>
+        <w:t>de nodes herkennen</w:t>
+      </w:r>
+      <w:r>
+        <w:rPr>
+          <w:color w:val="000000" w:themeColor="text1"/>
+        </w:rPr>
+        <w:t xml:space="preserve">. </w:t>
       </w:r>
       <w:r>
         <w:rPr>
           <w:color w:val="000000" w:themeColor="text1"/>
         </w:rPr>
         <w:lastRenderedPageBreak/>
-        <w:t>vertrouwen.</w:t>
+        <w:t>Hierdoor moeten deze gebruikers</w:t>
+      </w:r>
+      <w:r>
+        <w:rPr>
+          <w:color w:val="000000" w:themeColor="text1"/>
+        </w:rPr>
+        <w:t xml:space="preserve"> </w:t>
+      </w:r>
+      <w:r>
+        <w:rPr>
+          <w:color w:val="000000" w:themeColor="text1"/>
+        </w:rPr>
+        <w:t>niet uitsluitend op kleur vertrouwen.</w:t>
       </w:r>
       <w:r>
         <w:rPr>
@@ -12726,7 +14245,7 @@
         <w:rPr>
           <w:color w:val="000000" w:themeColor="text1"/>
         </w:rPr>
-        <w:t>. In de basisversie moesten gebruikers dit zelf onthouden of in de node</w:t>
+        <w:t>. In de basisversie moeten gebruikers dit zelf onthouden of in de node</w:t>
       </w:r>
       <w:r>
         <w:rPr>
@@ -12739,7 +14258,99 @@
         <w:rPr>
           <w:color w:val="000000" w:themeColor="text1"/>
         </w:rPr>
-        <w:t>tekst noteren, wat foutgevoelig is bij grotere trees. Daarom krijgt elke node nu een statusicoon dat tegelijk het type en de voortgang uitdrukt: een rood schild voor Weakness, een oranje schild voor Weakness Under Review, een oranje checkschild voor Assumption Under Review en een groen checkschild voor Verified Assumption. Daarnaast is er een blauw checkschild voor volledig afgewerkte fortunately</w:t>
+        <w:t>tekst noteren</w:t>
+      </w:r>
+      <w:r>
+        <w:rPr>
+          <w:color w:val="000000" w:themeColor="text1"/>
+        </w:rPr>
+        <w:t>.</w:t>
+      </w:r>
+      <w:r>
+        <w:rPr>
+          <w:color w:val="000000" w:themeColor="text1"/>
+        </w:rPr>
+        <w:t xml:space="preserve"> </w:t>
+      </w:r>
+      <w:r>
+        <w:rPr>
+          <w:color w:val="000000" w:themeColor="text1"/>
+        </w:rPr>
+        <w:t>Dit kan</w:t>
+      </w:r>
+      <w:r>
+        <w:rPr>
+          <w:color w:val="000000" w:themeColor="text1"/>
+        </w:rPr>
+        <w:t xml:space="preserve"> foutgevoelig </w:t>
+      </w:r>
+      <w:r>
+        <w:rPr>
+          <w:color w:val="000000" w:themeColor="text1"/>
+        </w:rPr>
+        <w:t>zijn</w:t>
+      </w:r>
+      <w:r>
+        <w:rPr>
+          <w:color w:val="000000" w:themeColor="text1"/>
+        </w:rPr>
+        <w:t xml:space="preserve"> bij grotere trees. Daarom krijgt elke node nu een statusicoon dat tegelijk het type en de voortgang uitdrukt: een rood schild voor </w:t>
+      </w:r>
+      <w:r>
+        <w:rPr>
+          <w:i/>
+          <w:iCs/>
+          <w:color w:val="000000" w:themeColor="text1"/>
+        </w:rPr>
+        <w:t>Weakness</w:t>
+      </w:r>
+      <w:r>
+        <w:rPr>
+          <w:color w:val="000000" w:themeColor="text1"/>
+        </w:rPr>
+        <w:t xml:space="preserve">, een oranje schild voor </w:t>
+      </w:r>
+      <w:r>
+        <w:rPr>
+          <w:i/>
+          <w:iCs/>
+          <w:color w:val="000000" w:themeColor="text1"/>
+        </w:rPr>
+        <w:t>Weakness Under Review</w:t>
+      </w:r>
+      <w:r>
+        <w:rPr>
+          <w:color w:val="000000" w:themeColor="text1"/>
+        </w:rPr>
+        <w:t xml:space="preserve">, een oranje checkschild voor </w:t>
+      </w:r>
+      <w:r>
+        <w:rPr>
+          <w:i/>
+          <w:iCs/>
+          <w:color w:val="000000" w:themeColor="text1"/>
+        </w:rPr>
+        <w:t>Assumption Under Review</w:t>
+      </w:r>
+      <w:r>
+        <w:rPr>
+          <w:color w:val="000000" w:themeColor="text1"/>
+        </w:rPr>
+        <w:t xml:space="preserve"> en een groen checkschild voor </w:t>
+      </w:r>
+      <w:r>
+        <w:rPr>
+          <w:i/>
+          <w:iCs/>
+          <w:color w:val="000000" w:themeColor="text1"/>
+        </w:rPr>
+        <w:t>Verified Assumption</w:t>
+      </w:r>
+      <w:r>
+        <w:rPr>
+          <w:color w:val="000000" w:themeColor="text1"/>
+        </w:rPr>
+        <w:t>. Daarnaast is er een blauw checkschild voor volledig afgewerkte fortunately</w:t>
       </w:r>
       <w:r>
         <w:rPr>
@@ -12765,7 +14376,19 @@
         <w:rPr>
           <w:color w:val="000000" w:themeColor="text1"/>
         </w:rPr>
-        <w:t>nodes met lage prioriteit, zodat gebruikers ook minder belangrijke of afgeronde paden expliciet kunnen markeren.</w:t>
+        <w:t>nodes met lage prioriteit</w:t>
+      </w:r>
+      <w:r>
+        <w:rPr>
+          <w:color w:val="000000" w:themeColor="text1"/>
+        </w:rPr>
+        <w:t xml:space="preserve">. Zo kunnen </w:t>
+      </w:r>
+      <w:r>
+        <w:rPr>
+          <w:color w:val="000000" w:themeColor="text1"/>
+        </w:rPr>
+        <w:t>gebruikers ook minder belangrijke of afgeronde paden expliciet markeren.</w:t>
       </w:r>
       <w:r>
         <w:rPr>
@@ -12810,7 +14433,21 @@
         <w:rPr>
           <w:color w:val="000000" w:themeColor="text1"/>
         </w:rPr>
-        <w:t xml:space="preserve">een Completed </w:t>
+        <w:t xml:space="preserve">een </w:t>
+      </w:r>
+      <w:r>
+        <w:rPr>
+          <w:i/>
+          <w:iCs/>
+          <w:color w:val="000000" w:themeColor="text1"/>
+        </w:rPr>
+        <w:t>Completed</w:t>
+      </w:r>
+      <w:r>
+        <w:rPr>
+          <w:color w:val="000000" w:themeColor="text1"/>
+        </w:rPr>
+        <w:t xml:space="preserve"> </w:t>
       </w:r>
       <w:r>
         <w:rPr>
@@ -12885,7 +14522,21 @@
           <w:color w:val="000000" w:themeColor="text1"/>
         </w:rPr>
         <w:noBreakHyphen/>
-        <w:t>node zonder kinderen kan de status Weakness of Low Importance krijgen</w:t>
+        <w:t xml:space="preserve">node zonder kinderen kan de status Weakness of </w:t>
+      </w:r>
+      <w:r>
+        <w:rPr>
+          <w:i/>
+          <w:iCs/>
+          <w:color w:val="000000" w:themeColor="text1"/>
+        </w:rPr>
+        <w:t>Low Importance</w:t>
+      </w:r>
+      <w:r>
+        <w:rPr>
+          <w:color w:val="000000" w:themeColor="text1"/>
+        </w:rPr>
+        <w:t xml:space="preserve"> krijgen</w:t>
       </w:r>
       <w:r>
         <w:rPr>
@@ -13039,7 +14690,97 @@
         <w:rPr>
           <w:color w:val="000000" w:themeColor="text1"/>
         </w:rPr>
-        <w:t>, omdat symbolen en kleuren sneller visueel scanbaar zijn dan woorden en minder schermruimte innemen, wat vooral bij grote trees belangrijk is. Deze keuze sluit aan bij UX</w:t>
+        <w:t>.</w:t>
+      </w:r>
+      <w:r>
+        <w:rPr>
+          <w:color w:val="000000" w:themeColor="text1"/>
+        </w:rPr>
+        <w:t xml:space="preserve"> </w:t>
+      </w:r>
+      <w:r>
+        <w:rPr>
+          <w:color w:val="000000" w:themeColor="text1"/>
+        </w:rPr>
+        <w:t>S</w:t>
+      </w:r>
+      <w:r>
+        <w:rPr>
+          <w:color w:val="000000" w:themeColor="text1"/>
+        </w:rPr>
+        <w:t>ymbolen en kleuren</w:t>
+      </w:r>
+      <w:r>
+        <w:rPr>
+          <w:color w:val="000000" w:themeColor="text1"/>
+        </w:rPr>
+        <w:t xml:space="preserve"> zijn</w:t>
+      </w:r>
+      <w:r>
+        <w:rPr>
+          <w:color w:val="000000" w:themeColor="text1"/>
+        </w:rPr>
+        <w:t xml:space="preserve"> visueel </w:t>
+      </w:r>
+      <w:r>
+        <w:rPr>
+          <w:color w:val="000000" w:themeColor="text1"/>
+        </w:rPr>
+        <w:t xml:space="preserve">sneller </w:t>
+      </w:r>
+      <w:r>
+        <w:rPr>
+          <w:color w:val="000000" w:themeColor="text1"/>
+        </w:rPr>
+        <w:t xml:space="preserve">scanbaar dan woorden en </w:t>
+      </w:r>
+      <w:r>
+        <w:rPr>
+          <w:color w:val="000000" w:themeColor="text1"/>
+        </w:rPr>
+        <w:t xml:space="preserve">nemen </w:t>
+      </w:r>
+      <w:r>
+        <w:rPr>
+          <w:color w:val="000000" w:themeColor="text1"/>
+        </w:rPr>
+        <w:t>minder schermruimte in</w:t>
+      </w:r>
+      <w:r>
+        <w:rPr>
+          <w:color w:val="000000" w:themeColor="text1"/>
+        </w:rPr>
+        <w:t xml:space="preserve">. Dit kan </w:t>
+      </w:r>
+      <w:r>
+        <w:rPr>
+          <w:color w:val="000000" w:themeColor="text1"/>
+        </w:rPr>
+        <w:t xml:space="preserve">vooral bij grote trees </w:t>
+      </w:r>
+      <w:r>
+        <w:rPr>
+          <w:color w:val="000000" w:themeColor="text1"/>
+        </w:rPr>
+        <w:t>van belang</w:t>
+      </w:r>
+      <w:r>
+        <w:rPr>
+          <w:color w:val="000000" w:themeColor="text1"/>
+        </w:rPr>
+        <w:t xml:space="preserve"> </w:t>
+      </w:r>
+      <w:r>
+        <w:rPr>
+          <w:color w:val="000000" w:themeColor="text1"/>
+        </w:rPr>
+        <w:t>zijn</w:t>
+      </w:r>
+      <w:r>
+        <w:rPr>
+          <w:color w:val="000000" w:themeColor="text1"/>
+        </w:rPr>
+        <w:t>. Deze keuze sluit aan bij UX</w:t>
       </w:r>
       <w:r>
         <w:rPr>
@@ -13082,7 +14823,45 @@
         <w:rPr>
           <w:color w:val="000000" w:themeColor="text1"/>
         </w:rPr>
-        <w:t>it wordt deels opgevangen door consistente vormverschillen (schild versus checkschild) en door de mogelijkheid om de betekenis van een icoon via een tooltip op te vragen, maar toekomstige iteraties kunnen nog explicietere textuele labels of alternatieve patronen toevoegen om de toegankelijkheid verder te verbeteren.</w:t>
+        <w:t xml:space="preserve">it wordt deels opgevangen door consistente vormverschillen (schild versus checkschild) en door de mogelijkheid om de betekenis van een icoon via een </w:t>
+      </w:r>
+      <w:r>
+        <w:rPr>
+          <w:i/>
+          <w:iCs/>
+          <w:color w:val="000000" w:themeColor="text1"/>
+        </w:rPr>
+        <w:t>tooltip</w:t>
+      </w:r>
+      <w:r>
+        <w:rPr>
+          <w:color w:val="000000" w:themeColor="text1"/>
+        </w:rPr>
+        <w:t xml:space="preserve"> op te vragen</w:t>
+      </w:r>
+      <w:r>
+        <w:rPr>
+          <w:color w:val="000000" w:themeColor="text1"/>
+        </w:rPr>
+        <w:t>. T</w:t>
+      </w:r>
+      <w:r>
+        <w:rPr>
+          <w:color w:val="000000" w:themeColor="text1"/>
+        </w:rPr>
+        <w:t xml:space="preserve">oekomstige iteraties kunnen nog explicietere </w:t>
+      </w:r>
+      <w:r>
+        <w:rPr>
+          <w:color w:val="000000" w:themeColor="text1"/>
+        </w:rPr>
+        <w:t>tekstuele</w:t>
+      </w:r>
+      <w:r>
+        <w:rPr>
+          <w:color w:val="000000" w:themeColor="text1"/>
+        </w:rPr>
+        <w:t xml:space="preserve"> labels of alternatieve patronen toevoegen om de toegankelijkheid verder te verbeteren.</w:t>
       </w:r>
       <w:r>
         <w:rPr>
@@ -13870,7 +15649,13 @@
         <w:rPr>
           <w:color w:val="000000" w:themeColor="text1"/>
         </w:rPr>
-        <w:t>, waarmee de gebruiker elk een waarde van 1 tot 5 kan toekennen. Op basis van deze twee waarden wordt automatisch de danger rating berekend</w:t>
+        <w:t>. Hiermee kan</w:t>
+      </w:r>
+      <w:r>
+        <w:rPr>
+          <w:color w:val="000000" w:themeColor="text1"/>
+        </w:rPr>
+        <w:t xml:space="preserve"> de gebruiker elk een waarde van 1 tot 5 toekennen. Op basis van deze twee waarden wordt automatisch de danger rating berekend</w:t>
       </w:r>
       <w:r>
         <w:rPr>
@@ -13895,7 +15680,31 @@
         <w:rPr>
           <w:color w:val="000000" w:themeColor="text1"/>
         </w:rPr>
-        <w:t>node en gebruikt om nodes in de filterweergave aflopend te sorteren, zodat de ernstigste weaknesses automatisch bovenaan verschijnen. De danger rating</w:t>
+        <w:t>node en gebruikt om nodes in de filterweergave aflopend te sorteren</w:t>
+      </w:r>
+      <w:r>
+        <w:rPr>
+          <w:color w:val="000000" w:themeColor="text1"/>
+        </w:rPr>
+        <w:t>. Deze sortering laat</w:t>
+      </w:r>
+      <w:r>
+        <w:rPr>
+          <w:color w:val="000000" w:themeColor="text1"/>
+        </w:rPr>
+        <w:t xml:space="preserve"> de </w:t>
+      </w:r>
+      <w:r>
+        <w:rPr>
+          <w:color w:val="000000" w:themeColor="text1"/>
+        </w:rPr>
+        <w:t>belangrijkste</w:t>
+      </w:r>
+      <w:r>
+        <w:rPr>
+          <w:color w:val="000000" w:themeColor="text1"/>
+        </w:rPr>
+        <w:t xml:space="preserve"> weaknesses automatisch bovenaan verschijnen. De danger rating</w:t>
       </w:r>
       <w:r>
         <w:rPr>
@@ -13914,14 +15723,50 @@
           <w:color w:val="000000" w:themeColor="text1"/>
         </w:rPr>
         <w:noBreakHyphen/>
-        <w:t xml:space="preserve">icoon, een symbool dat in het dagelijks leven vaak gebruikt wordt om gevaar of verhoogde aandacht aan te duiden. Deze keuze </w:t>
+        <w:t>icoon</w:t>
+      </w:r>
+      <w:r>
+        <w:rPr>
+          <w:color w:val="000000" w:themeColor="text1"/>
+        </w:rPr>
+        <w:t xml:space="preserve">. Dit </w:t>
+      </w:r>
+      <w:r>
+        <w:rPr>
+          <w:color w:val="000000" w:themeColor="text1"/>
+        </w:rPr>
+        <w:t xml:space="preserve">symbool </w:t>
+      </w:r>
+      <w:r>
+        <w:rPr>
+          <w:color w:val="000000" w:themeColor="text1"/>
+        </w:rPr>
+        <w:t>wordt</w:t>
+      </w:r>
+      <w:r>
+        <w:rPr>
+          <w:color w:val="000000" w:themeColor="text1"/>
+        </w:rPr>
+        <w:t xml:space="preserve"> in het dagelijks leven</w:t>
+      </w:r>
+      <w:r>
+        <w:rPr>
+          <w:color w:val="000000" w:themeColor="text1"/>
+        </w:rPr>
+        <w:t xml:space="preserve"> al</w:t>
+      </w:r>
+      <w:r>
+        <w:rPr>
+          <w:color w:val="000000" w:themeColor="text1"/>
+        </w:rPr>
+        <w:t xml:space="preserve"> vaak gebruikt om gevaar of verhoogde aandacht aan te duiden. </w:t>
       </w:r>
       <w:r>
         <w:rPr>
           <w:color w:val="000000" w:themeColor="text1"/>
         </w:rPr>
         <w:lastRenderedPageBreak/>
-        <w:t>versterkt de intuïtieve interpretatie van de score als risicosignaal en helpt gebruikers om kritieke weaknesses sneller te herkennen zonder bijkomende uitleg</w:t>
+        <w:t>Deze keuze versterkt de intuïtieve interpretatie van de score als risicosignaal en helpt gebruikers om kritieke weaknesses sneller te herkennen zonder bijkomende uitleg</w:t>
       </w:r>
       <w:r>
         <w:rPr>
@@ -13933,7 +15778,99 @@
         <w:rPr>
           <w:color w:val="000000" w:themeColor="text1"/>
         </w:rPr>
-        <w:t xml:space="preserve"> Door de rating altijd zichtbaar te houden, in plaats van ze achter extra kliks te verbergen, wordt prioriteren sterk vereenvoudigd en hoeven gebruikers minder te onthouden. Tegelijk is gekozen om secundaire acties (zoals add, delete en collapse) pas bij hover te tonen, om visuele overbelasting te vermijden en de focus op de kerninformatie, status en gevaar, te leggen. De centrale berekening en hergebruik van dezelfde rating in zowel de boom als de filterlijsten zorgen voor consistentie in de interface en sluiten aan bij usability</w:t>
+        <w:t xml:space="preserve"> Door de rating altijd zichtbaar te houden, in plaats van ze achter extra kliks te verbergen, wordt prioriteren sterk vereenvoudigd en hoeven gebruikers minder te onthouden. Tegelijk is gekozen om secundaire acties (zoals add, delete en collapse</w:t>
+      </w:r>
+      <w:r>
+        <w:rPr>
+          <w:color w:val="000000" w:themeColor="text1"/>
+        </w:rPr>
+        <w:t>/expand</w:t>
+      </w:r>
+      <w:r>
+        <w:rPr>
+          <w:color w:val="000000" w:themeColor="text1"/>
+        </w:rPr>
+        <w:t>) pas bij hover te tonen</w:t>
+      </w:r>
+      <w:r>
+        <w:rPr>
+          <w:color w:val="000000" w:themeColor="text1"/>
+        </w:rPr>
+        <w:t xml:space="preserve">. </w:t>
+      </w:r>
+      <w:r>
+        <w:rPr>
+          <w:color w:val="000000" w:themeColor="text1"/>
+        </w:rPr>
+        <w:t>Hierdoor</w:t>
+      </w:r>
+      <w:r>
+        <w:rPr>
+          <w:color w:val="000000" w:themeColor="text1"/>
+        </w:rPr>
+        <w:t xml:space="preserve"> wordt </w:t>
+      </w:r>
+      <w:r>
+        <w:rPr>
+          <w:color w:val="000000" w:themeColor="text1"/>
+        </w:rPr>
+        <w:t xml:space="preserve">visuele overbelasting </w:t>
+      </w:r>
+      <w:r>
+        <w:rPr>
+          <w:color w:val="000000" w:themeColor="text1"/>
+        </w:rPr>
+        <w:t>vermeden</w:t>
+      </w:r>
+      <w:r>
+        <w:rPr>
+          <w:color w:val="000000" w:themeColor="text1"/>
+        </w:rPr>
+        <w:t xml:space="preserve"> en</w:t>
+      </w:r>
+      <w:r>
+        <w:rPr>
+          <w:color w:val="000000" w:themeColor="text1"/>
+        </w:rPr>
+        <w:t xml:space="preserve"> ligt</w:t>
+      </w:r>
+      <w:r>
+        <w:rPr>
+          <w:color w:val="000000" w:themeColor="text1"/>
+        </w:rPr>
+        <w:t xml:space="preserve"> de focus op de kerninformatie</w:t>
+      </w:r>
+      <w:r>
+        <w:rPr>
+          <w:color w:val="000000" w:themeColor="text1"/>
+        </w:rPr>
+        <w:t xml:space="preserve"> </w:t>
+      </w:r>
+      <w:r>
+        <w:rPr>
+          <w:color w:val="000000" w:themeColor="text1"/>
+        </w:rPr>
+        <w:t>en gevaar. De centrale berekening en hergebruik van dezelfde rating in zowel de boom als de filterlijsten zorgen voor consistentie in de interface</w:t>
+      </w:r>
+      <w:r>
+        <w:rPr>
+          <w:color w:val="000000" w:themeColor="text1"/>
+        </w:rPr>
+        <w:t xml:space="preserve">. Dit </w:t>
+      </w:r>
+      <w:r>
+        <w:rPr>
+          <w:color w:val="000000" w:themeColor="text1"/>
+        </w:rPr>
+        <w:t xml:space="preserve">sluit aan bij </w:t>
+      </w:r>
+      <w:r>
+        <w:rPr>
+          <w:i/>
+          <w:iCs/>
+          <w:color w:val="000000" w:themeColor="text1"/>
+        </w:rPr>
+        <w:t>usability</w:t>
       </w:r>
       <w:r>
         <w:rPr>
@@ -13946,7 +15883,33 @@
         <w:rPr>
           <w:color w:val="000000" w:themeColor="text1"/>
         </w:rPr>
-        <w:t>principes rond zichtbaarheid van systeemstatus en herkenning boven herinnering.</w:t>
+        <w:t>principes rond zichtbaarheid van systeemstatus</w:t>
+      </w:r>
+      <w:r>
+        <w:rPr>
+          <w:color w:val="000000" w:themeColor="text1"/>
+        </w:rPr>
+        <w:t xml:space="preserve">, </w:t>
+      </w:r>
+      <w:r>
+        <w:rPr>
+          <w:i/>
+          <w:iCs/>
+          <w:color w:val="000000" w:themeColor="text1"/>
+        </w:rPr>
+        <w:t>consistency</w:t>
+      </w:r>
+      <w:r>
+        <w:rPr>
+          <w:color w:val="000000" w:themeColor="text1"/>
+        </w:rPr>
+        <w:t xml:space="preserve"> en standaarden</w:t>
+      </w:r>
+      <w:r>
+        <w:rPr>
+          <w:color w:val="000000" w:themeColor="text1"/>
+        </w:rPr>
+        <w:t xml:space="preserve"> en herkenning boven herinnering.</w:t>
       </w:r>
     </w:p>
     <w:p/>
@@ -14127,14 +16090,59 @@
         <w:rPr>
           <w:color w:val="000000" w:themeColor="text1"/>
         </w:rPr>
-        <w:t>De branch</w:t>
-      </w:r>
-      <w:r>
-        <w:rPr>
-          <w:color w:val="000000" w:themeColor="text1"/>
-        </w:rPr>
-        <w:noBreakHyphen/>
-        <w:t>samenvatting is toegevoegd om een terugkerend probleem bij grotere Fortunately–Unfortunately</w:t>
+        <w:t xml:space="preserve">De </w:t>
+      </w:r>
+      <w:r>
+        <w:rPr>
+          <w:i/>
+          <w:iCs/>
+          <w:color w:val="000000" w:themeColor="text1"/>
+        </w:rPr>
+        <w:t>branch</w:t>
+      </w:r>
+      <w:r>
+        <w:rPr>
+          <w:color w:val="000000" w:themeColor="text1"/>
+        </w:rPr>
+        <w:t xml:space="preserve"> </w:t>
+      </w:r>
+      <w:r>
+        <w:rPr>
+          <w:i/>
+          <w:iCs/>
+          <w:color w:val="000000" w:themeColor="text1"/>
+        </w:rPr>
+        <w:t>summary</w:t>
+      </w:r>
+      <w:r>
+        <w:rPr>
+          <w:color w:val="000000" w:themeColor="text1"/>
+        </w:rPr>
+        <w:t xml:space="preserve"> is toegevoegd om een terugkerend probleem bij grotere </w:t>
+      </w:r>
+      <w:r>
+        <w:rPr>
+          <w:color w:val="000000" w:themeColor="text1"/>
+        </w:rPr>
+        <w:t>f</w:t>
+      </w:r>
+      <w:r>
+        <w:rPr>
+          <w:color w:val="000000" w:themeColor="text1"/>
+        </w:rPr>
+        <w:t>ortunately–</w:t>
+      </w:r>
+      <w:r>
+        <w:rPr>
+          <w:color w:val="000000" w:themeColor="text1"/>
+        </w:rPr>
+        <w:t>u</w:t>
+      </w:r>
+      <w:r>
+        <w:rPr>
+          <w:color w:val="000000" w:themeColor="text1"/>
+        </w:rPr>
+        <w:t>nfortunately</w:t>
       </w:r>
       <w:r>
         <w:rPr>
@@ -14267,28 +16275,74 @@
           <w:color w:val="000000" w:themeColor="text1"/>
         </w:rPr>
         <w:noBreakHyphen/>
-        <w:t>stappen aan een bepaalde beslissing voorafgaan, zonder telkens terug te moeten scrollen naar het begin van de tree. Dit ondersteunt typische taken zoals het voorbereiden van een samenvatting richting een teamlead of het controleren of een bepaalde mitigatie wel op de juiste plaats in de keten hangt. De samenvatting vult zo de fileview</w:t>
+      </w:r>
+      <w:r>
+        <w:rPr>
+          <w:color w:val="000000" w:themeColor="text1"/>
+        </w:rPr>
+        <w:t>nodes</w:t>
+      </w:r>
+      <w:r>
+        <w:rPr>
+          <w:color w:val="000000" w:themeColor="text1"/>
+        </w:rPr>
+        <w:t xml:space="preserve"> aan een bepaalde beslissing voorafgaan,</w:t>
+      </w:r>
+      <w:r>
+        <w:rPr>
+          <w:color w:val="000000" w:themeColor="text1"/>
+        </w:rPr>
+        <w:t xml:space="preserve"> </w:t>
+      </w:r>
+      <w:r>
+        <w:rPr>
+          <w:color w:val="000000" w:themeColor="text1"/>
+        </w:rPr>
+        <w:t>zonder telkens terug te moeten scrollen naar het begin van de tree. Dit ondersteunt typische taken zoals het voorbereiden van een samenvatting richting een teamlead of het controleren of een bepaalde mitigatie wel op de juiste plaats in de keten hangt. De samenvatting vult zo de fileview</w:t>
       </w:r>
       <w:r>
         <w:rPr>
           <w:color w:val="000000" w:themeColor="text1"/>
         </w:rPr>
         <w:noBreakHyphen/>
-        <w:t>representatie aan met een lineaire, leesbare weergave van de context, wat aansluit bij UX</w:t>
-      </w:r>
-      <w:r>
-        <w:rPr>
-          <w:color w:val="000000" w:themeColor="text1"/>
-        </w:rPr>
-        <w:noBreakHyphen/>
-        <w:t xml:space="preserve">principes rond </w:t>
+        <w:t xml:space="preserve">representatie aan met een </w:t>
       </w:r>
       <w:r>
         <w:rPr>
           <w:color w:val="000000" w:themeColor="text1"/>
         </w:rPr>
         <w:lastRenderedPageBreak/>
-        <w:t>oriëntatie en minimalisering van onnodige navigatiestappen. Doordat deze context in een aparte maar gekoppelde visualisatie wordt aangeboden, kunnen gebruikers de volledige redeneringsketen los van de detailweergave bestuderen, wat het begrijpen en bespreken van de logica binnen een specifieke branch verder vergemakkelijkt.</w:t>
+        <w:t>lineaire, leesbare weergave van de context</w:t>
+      </w:r>
+      <w:r>
+        <w:rPr>
+          <w:color w:val="000000" w:themeColor="text1"/>
+        </w:rPr>
+        <w:t>. Dit</w:t>
+      </w:r>
+      <w:r>
+        <w:rPr>
+          <w:color w:val="000000" w:themeColor="text1"/>
+        </w:rPr>
+        <w:t xml:space="preserve"> </w:t>
+      </w:r>
+      <w:r>
+        <w:rPr>
+          <w:color w:val="000000" w:themeColor="text1"/>
+        </w:rPr>
+        <w:t>helpt bij</w:t>
+      </w:r>
+      <w:r>
+        <w:rPr>
+          <w:color w:val="000000" w:themeColor="text1"/>
+        </w:rPr>
+        <w:t xml:space="preserve"> oriëntatie en minimalisering van onnodige navigatiestappen. </w:t>
+      </w:r>
+      <w:r>
+        <w:rPr>
+          <w:color w:val="000000" w:themeColor="text1"/>
+        </w:rPr>
+        <w:t>Doordat deze context in een aparte maar gekoppelde visualisatie wordt aangeboden, kunnen gebruikers de volledige redeneringsketen los van de detailweergave bestuderen. Hierdoor wordt het eenvoudiger om de onderliggende logica te begrijpen. Dit vergemakkelijkt ook het bespreken van de logica binnen een specifieke branch.</w:t>
       </w:r>
     </w:p>
     <w:p>
@@ -14461,7 +16515,13 @@
         <w:t>. Zo is het</w:t>
       </w:r>
       <w:r>
-        <w:t xml:space="preserve"> duidelijk welke onderdelen eerst aandacht verdienen.</w:t>
+        <w:t xml:space="preserve"> duidelijk welke onderdelen eerst aandacht </w:t>
+      </w:r>
+      <w:r>
+        <w:t>nodig hebben</w:t>
+      </w:r>
+      <w:r>
+        <w:t>.</w:t>
       </w:r>
       <w:r>
         <w:t xml:space="preserve"> </w:t>
@@ -14476,13 +16536,17 @@
         <w:t xml:space="preserve"> zelf </w:t>
       </w:r>
       <w:r>
+        <w:lastRenderedPageBreak/>
         <w:t>via de zoekfunctie of door handmatig te scrollen</w:t>
       </w:r>
       <w:r>
         <w:t xml:space="preserve"> </w:t>
       </w:r>
       <w:r>
-        <w:t>bijhouden welke paden aandacht vroegen</w:t>
+        <w:t xml:space="preserve">bijhouden welke paden aandacht </w:t>
+      </w:r>
+      <w:r>
+        <w:t>vragen</w:t>
       </w:r>
       <w:r>
         <w:t xml:space="preserve">. Hierdoor kan </w:t>
@@ -14505,12 +16569,6 @@
           <w:color w:val="000000" w:themeColor="text1"/>
         </w:rPr>
       </w:pPr>
-      <w:r>
-        <w:rPr>
-          <w:color w:val="000000" w:themeColor="text1"/>
-        </w:rPr>
-        <w:t xml:space="preserve">De filterlogica is ontworpen om gebruikers direct naar de belangrijkste risico’s te leiden. </w:t>
-      </w:r>
       <w:r>
         <w:rPr>
           <w:color w:val="000000" w:themeColor="text1"/>
@@ -14546,7 +16604,7 @@
         <w:rPr>
           <w:color w:val="000000" w:themeColor="text1"/>
         </w:rPr>
-        <w:t>, waardoor gebruikers in één oogopslag een overzicht hebben van de globale voortgang van het model zonder extra schermruimte in te nemen.</w:t>
+        <w:t>.</w:t>
       </w:r>
       <w:r>
         <w:rPr>
@@ -14557,6 +16615,24 @@
       <w:r>
         <w:rPr>
           <w:color w:val="000000" w:themeColor="text1"/>
+        </w:rPr>
+        <w:t>Hierdoor hebben</w:t>
+      </w:r>
+      <w:r>
+        <w:rPr>
+          <w:color w:val="000000" w:themeColor="text1"/>
+        </w:rPr>
+        <w:t xml:space="preserve"> gebruikers in één oogopslag een overzicht van de globale voortgang van het model zonder extra schermruimte in te nemen.</w:t>
+      </w:r>
+      <w:r>
+        <w:rPr>
+          <w:color w:val="000000" w:themeColor="text1"/>
+        </w:rPr>
+        <w:t xml:space="preserve"> </w:t>
+      </w:r>
+      <w:r>
+        <w:rPr>
+          <w:color w:val="000000" w:themeColor="text1"/>
           <w:lang w:val="en-GB"/>
         </w:rPr>
         <w:t>In de uitgeklapte filter sidebar worden n</w:t>
@@ -14619,7 +16695,49 @@
         <w:rPr>
           <w:color w:val="000000" w:themeColor="text1"/>
         </w:rPr>
-        <w:t>de Weakness en Weakenss under review worden de nodes op</w:t>
+        <w:t xml:space="preserve">de Weakness en Weakenss </w:t>
+      </w:r>
+      <w:r>
+        <w:rPr>
+          <w:color w:val="000000" w:themeColor="text1"/>
+        </w:rPr>
+        <w:t>U</w:t>
+      </w:r>
+      <w:r>
+        <w:rPr>
+          <w:color w:val="000000" w:themeColor="text1"/>
+        </w:rPr>
+        <w:t xml:space="preserve">nder </w:t>
+      </w:r>
+      <w:r>
+        <w:rPr>
+          <w:color w:val="000000" w:themeColor="text1"/>
+        </w:rPr>
+        <w:t>R</w:t>
+      </w:r>
+      <w:r>
+        <w:rPr>
+          <w:color w:val="000000" w:themeColor="text1"/>
+        </w:rPr>
+        <w:t>eview</w:t>
+      </w:r>
+      <w:r>
+        <w:rPr>
+          <w:color w:val="000000" w:themeColor="text1"/>
+        </w:rPr>
+        <w:t xml:space="preserve"> tab</w:t>
+      </w:r>
+      <w:r>
+        <w:rPr>
+          <w:color w:val="000000" w:themeColor="text1"/>
+        </w:rPr>
+        <w:t>,</w:t>
+      </w:r>
+      <w:r>
+        <w:rPr>
+          <w:color w:val="000000" w:themeColor="text1"/>
+        </w:rPr>
+        <w:t xml:space="preserve"> worden de nodes op</w:t>
       </w:r>
       <w:r>
         <w:rPr>
@@ -14649,26 +16767,104 @@
         <w:rPr>
           <w:color w:val="000000" w:themeColor="text1"/>
         </w:rPr>
-        <w:t>. Hierdoor verschijnen de meest kritieke weaknesses automatisch bovenaan en kan een analist met één klik naar de relevante plaats in de boom springen, waarbij de gekozen node visueel wordt gehighlight. Dit ontwerp sluit aan bij de doelstelling om threat modeling efficiënter te maken</w:t>
-      </w:r>
-      <w:r>
-        <w:rPr>
-          <w:color w:val="000000" w:themeColor="text1"/>
-        </w:rPr>
-        <w:t>. I</w:t>
-      </w:r>
-      <w:r>
-        <w:rPr>
-          <w:color w:val="000000" w:themeColor="text1"/>
-        </w:rPr>
-        <w:t>n plaats van handmatig te zoeken, kunnen gebruikers systematisch “top</w:t>
+        <w:t>. Hierdoor verschijnen de meest kritieke weaknesses automatisch bovenaan en kan een analist met één klik naar de relevante plaats in de boom springen</w:t>
+      </w:r>
+      <w:r>
+        <w:rPr>
+          <w:color w:val="000000" w:themeColor="text1"/>
+        </w:rPr>
+        <w:t xml:space="preserve">. </w:t>
+      </w:r>
+      <w:r>
+        <w:rPr>
+          <w:color w:val="000000" w:themeColor="text1"/>
+        </w:rPr>
+        <w:t>Bij h</w:t>
+      </w:r>
+      <w:r>
+        <w:rPr>
+          <w:color w:val="000000" w:themeColor="text1"/>
+        </w:rPr>
+        <w:t xml:space="preserve">et aanklikken van </w:t>
+      </w:r>
+      <w:r>
+        <w:rPr>
+          <w:color w:val="000000" w:themeColor="text1"/>
+        </w:rPr>
+        <w:t>gekozen node</w:t>
+      </w:r>
+      <w:r>
+        <w:rPr>
+          <w:color w:val="000000" w:themeColor="text1"/>
+        </w:rPr>
+        <w:t xml:space="preserve"> </w:t>
+      </w:r>
+      <w:r>
+        <w:rPr>
+          <w:color w:val="000000" w:themeColor="text1"/>
+        </w:rPr>
+        <w:t>wordt</w:t>
+      </w:r>
+      <w:r>
+        <w:rPr>
+          <w:color w:val="000000" w:themeColor="text1"/>
+        </w:rPr>
+        <w:t xml:space="preserve"> de node in de tree</w:t>
+      </w:r>
+      <w:r>
+        <w:rPr>
+          <w:color w:val="000000" w:themeColor="text1"/>
+        </w:rPr>
+        <w:t xml:space="preserve"> </w:t>
+      </w:r>
+      <w:r>
+        <w:rPr>
+          <w:color w:val="000000" w:themeColor="text1"/>
+        </w:rPr>
+        <w:t xml:space="preserve">ook </w:t>
+      </w:r>
+      <w:r>
+        <w:rPr>
+          <w:color w:val="000000" w:themeColor="text1"/>
+        </w:rPr>
+        <w:t>visueel gehighlight. Dit ontwerp sluit aan bij de doelstelling om threat modeling efficiënter te maken</w:t>
+      </w:r>
+      <w:r>
+        <w:rPr>
+          <w:color w:val="000000" w:themeColor="text1"/>
+        </w:rPr>
+        <w:t xml:space="preserve">. </w:t>
+      </w:r>
+      <w:r>
+        <w:rPr>
+          <w:color w:val="000000" w:themeColor="text1"/>
+        </w:rPr>
+        <w:t>Zo</w:t>
+      </w:r>
+      <w:r>
+        <w:rPr>
+          <w:color w:val="000000" w:themeColor="text1"/>
+        </w:rPr>
+        <w:t xml:space="preserve"> kunnen gebruikers systematisch “top</w:t>
       </w:r>
       <w:r>
         <w:rPr>
           <w:color w:val="000000" w:themeColor="text1"/>
         </w:rPr>
         <w:noBreakHyphen/>
-        <w:t xml:space="preserve">down” door hun werkvoorraad van openstaande risico’s en aannames gaan. </w:t>
+        <w:t>down” door hun werkvoorraad van openstaande risico’s en aannames gaan</w:t>
+      </w:r>
+      <w:r>
+        <w:rPr>
+          <w:color w:val="000000" w:themeColor="text1"/>
+        </w:rPr>
+        <w:t xml:space="preserve"> zonder dit handmatig te moeten zoeken</w:t>
+      </w:r>
+      <w:r>
+        <w:rPr>
+          <w:color w:val="000000" w:themeColor="text1"/>
+        </w:rPr>
+        <w:t xml:space="preserve">. </w:t>
       </w:r>
     </w:p>
     <w:p>
@@ -15019,23 +17215,15 @@
     <w:p>
       <w:pPr>
         <w:spacing w:afterLines="24" w:after="57" w:line="288" w:lineRule="auto"/>
-        <w:jc w:val="center"/>
-        <w:rPr>
-          <w:color w:val="000000" w:themeColor="text1"/>
-        </w:rPr>
-      </w:pPr>
-    </w:p>
-    <w:p>
-      <w:pPr>
-        <w:spacing w:afterLines="24" w:after="57" w:line="288" w:lineRule="auto"/>
-        <w:rPr>
-          <w:color w:val="000000" w:themeColor="text1"/>
-        </w:rPr>
-      </w:pPr>
-      <w:r>
-        <w:rPr>
-          <w:color w:val="000000" w:themeColor="text1"/>
-        </w:rPr>
+        <w:rPr>
+          <w:color w:val="000000" w:themeColor="text1"/>
+        </w:rPr>
+      </w:pPr>
+      <w:r>
+        <w:rPr>
+          <w:color w:val="000000" w:themeColor="text1"/>
+        </w:rPr>
+        <w:lastRenderedPageBreak/>
         <w:t xml:space="preserve">Bij het ontwerp is ook overwogen om </w:t>
       </w:r>
       <w:r>
@@ -15048,8 +17236,13 @@
         <w:rPr>
           <w:color w:val="000000" w:themeColor="text1"/>
         </w:rPr>
-        <w:noBreakHyphen/>
-        <w:t>samenvatting en filterfunctionaliteit</w:t>
+        <w:t xml:space="preserve"> summary</w:t>
+      </w:r>
+      <w:r>
+        <w:rPr>
+          <w:color w:val="000000" w:themeColor="text1"/>
+        </w:rPr>
+        <w:t xml:space="preserve"> en filterfunctionaliteit</w:t>
       </w:r>
       <w:r>
         <w:rPr>
@@ -15080,19 +17273,25 @@
         <w:rPr>
           <w:color w:val="000000" w:themeColor="text1"/>
         </w:rPr>
-        <w:t xml:space="preserve"> zou het zicht op de boom volledig of gedeeltelijk wegnemen en maakt het minder duidelijk naar welke exacte plaats in de structuur wordt genavigeerd wanneer een node geselecteerd wordt</w:t>
-      </w:r>
-      <w:r>
-        <w:rPr>
-          <w:color w:val="000000" w:themeColor="text1"/>
-        </w:rPr>
-        <w:t>. Hierdoor neemt</w:t>
-      </w:r>
-      <w:r>
-        <w:rPr>
-          <w:color w:val="000000" w:themeColor="text1"/>
-        </w:rPr>
-        <w:t xml:space="preserve"> de ruimtelijke oriëntatie van de gebruiker af. Dergelijke oplossing zou bovendien meer cognitieve schakelmomenten vereisen tussen lijst en boom</w:t>
+        <w:t xml:space="preserve"> zou het zicht op de boom </w:t>
+      </w:r>
+      <w:r>
+        <w:rPr>
+          <w:color w:val="000000" w:themeColor="text1"/>
+        </w:rPr>
+        <w:t>volledig of in grotere mate</w:t>
+      </w:r>
+      <w:r>
+        <w:rPr>
+          <w:color w:val="000000" w:themeColor="text1"/>
+        </w:rPr>
+        <w:t xml:space="preserve"> wegnemen</w:t>
+      </w:r>
+      <w:r>
+        <w:rPr>
+          <w:color w:val="000000" w:themeColor="text1"/>
+        </w:rPr>
+        <w:t>.</w:t>
       </w:r>
       <w:r>
         <w:rPr>
@@ -15104,19 +17303,141 @@
         <w:rPr>
           <w:color w:val="000000" w:themeColor="text1"/>
         </w:rPr>
-        <w:t>en minder direct aangeven welke items het meest urgent zijn. Door filtering en sortering te integreren in een zijpaneel dat direct naar nodes navigeert, wordt voldaan aan heuristieken rond zichtbaarheid van systeemstatus en herkenning boven herinnering</w:t>
-      </w:r>
-      <w:r>
-        <w:rPr>
-          <w:color w:val="000000" w:themeColor="text1"/>
-        </w:rPr>
-        <w:t>. D</w:t>
-      </w:r>
-      <w:r>
-        <w:rPr>
-          <w:color w:val="000000" w:themeColor="text1"/>
-        </w:rPr>
-        <w:t>e tool toont expliciet welke weaknesses bestaan, welke nog “under review” zijn en welke veronderstellingen al geverifieerd zijn, zonder dat gebruikers dit zelf moeten onthouden. Een mogelijke beperking is dat het zijpaneel extra schermruimte inneemt en dat gebruikers de betekenis van de verschillende statussen moeten leren</w:t>
+        <w:t>Daardoor wordt</w:t>
+      </w:r>
+      <w:r>
+        <w:rPr>
+          <w:color w:val="000000" w:themeColor="text1"/>
+        </w:rPr>
+        <w:t xml:space="preserve"> het</w:t>
+      </w:r>
+      <w:r>
+        <w:rPr>
+          <w:color w:val="000000" w:themeColor="text1"/>
+        </w:rPr>
+        <w:t xml:space="preserve"> minder duidelijk naar welke exacte plaats in de structuur wordt genavigeerd wanneer een gebruiker een node in de geopende weergave aanklikt.</w:t>
+      </w:r>
+      <w:r>
+        <w:rPr>
+          <w:color w:val="000000" w:themeColor="text1"/>
+        </w:rPr>
+        <w:t xml:space="preserve"> </w:t>
+      </w:r>
+      <w:r>
+        <w:rPr>
+          <w:color w:val="000000" w:themeColor="text1"/>
+        </w:rPr>
+        <w:t>Als gevolg hiervan</w:t>
+      </w:r>
+      <w:r>
+        <w:rPr>
+          <w:color w:val="000000" w:themeColor="text1"/>
+        </w:rPr>
+        <w:t xml:space="preserve"> neemt</w:t>
+      </w:r>
+      <w:r>
+        <w:rPr>
+          <w:color w:val="000000" w:themeColor="text1"/>
+        </w:rPr>
+        <w:t xml:space="preserve"> de ruimtelijke oriëntatie van de gebruiker af. </w:t>
+      </w:r>
+      <w:r>
+        <w:rPr>
+          <w:color w:val="000000" w:themeColor="text1"/>
+        </w:rPr>
+        <w:t>Een dergelijke</w:t>
+      </w:r>
+      <w:r>
+        <w:rPr>
+          <w:color w:val="000000" w:themeColor="text1"/>
+        </w:rPr>
+        <w:t xml:space="preserve"> oplossing zou bovendien meer cognitieve schakelmomenten vereisen tussen lijst en </w:t>
+      </w:r>
+      <w:r>
+        <w:rPr>
+          <w:color w:val="000000" w:themeColor="text1"/>
+        </w:rPr>
+        <w:t>tree</w:t>
+      </w:r>
+      <w:r>
+        <w:rPr>
+          <w:color w:val="000000" w:themeColor="text1"/>
+        </w:rPr>
+        <w:t xml:space="preserve">. </w:t>
+      </w:r>
+    </w:p>
+    <w:p>
+      <w:pPr>
+        <w:spacing w:afterLines="24" w:after="57" w:line="288" w:lineRule="auto"/>
+        <w:rPr>
+          <w:color w:val="000000" w:themeColor="text1"/>
+        </w:rPr>
+      </w:pPr>
+    </w:p>
+    <w:p>
+      <w:pPr>
+        <w:spacing w:afterLines="24" w:after="57" w:line="288" w:lineRule="auto"/>
+        <w:rPr>
+          <w:color w:val="000000" w:themeColor="text1"/>
+        </w:rPr>
+      </w:pPr>
+      <w:r>
+        <w:rPr>
+          <w:color w:val="000000" w:themeColor="text1"/>
+        </w:rPr>
+        <w:t>Door filtering en sortering te integreren in een zijpaneel dat direct naar nodes navigeert, wordt voldaan aan heuristieken rond zichtbaarheid van systeemstatus en herkenning boven herinnering. Relevante statussen en opties blijven immers voortdurend zichtbaar</w:t>
+      </w:r>
+      <w:r>
+        <w:rPr>
+          <w:color w:val="000000" w:themeColor="text1"/>
+        </w:rPr>
+        <w:t xml:space="preserve">. </w:t>
+      </w:r>
+      <w:r>
+        <w:rPr>
+          <w:color w:val="000000" w:themeColor="text1"/>
+        </w:rPr>
+        <w:t xml:space="preserve">Zo moeten </w:t>
+      </w:r>
+      <w:r>
+        <w:rPr>
+          <w:color w:val="000000" w:themeColor="text1"/>
+        </w:rPr>
+        <w:t xml:space="preserve">gebruikers deze </w:t>
+      </w:r>
+      <w:r>
+        <w:rPr>
+          <w:color w:val="000000" w:themeColor="text1"/>
+        </w:rPr>
+        <w:t xml:space="preserve">niet </w:t>
+      </w:r>
+      <w:r>
+        <w:rPr>
+          <w:color w:val="000000" w:themeColor="text1"/>
+        </w:rPr>
+        <w:t>onthouden. De tool toont expliciet welke weaknesses bestaan, welke nog “under review” zijn en welke veronderstellingen al geverifieerd zijn.</w:t>
+      </w:r>
+    </w:p>
+    <w:p>
+      <w:pPr>
+        <w:spacing w:afterLines="24" w:after="57" w:line="288" w:lineRule="auto"/>
+        <w:rPr>
+          <w:color w:val="000000" w:themeColor="text1"/>
+        </w:rPr>
+      </w:pPr>
+    </w:p>
+    <w:p>
+      <w:pPr>
+        <w:spacing w:afterLines="24" w:after="57" w:line="288" w:lineRule="auto"/>
+        <w:rPr>
+          <w:color w:val="000000" w:themeColor="text1"/>
+        </w:rPr>
+      </w:pPr>
+      <w:r>
+        <w:rPr>
+          <w:color w:val="000000" w:themeColor="text1"/>
+        </w:rPr>
+        <w:t>Een mogelijke beperking is dat het zijpaneel extra schermruimte inneemt en dat gebruikers de betekenis van de verschillende statussen moeten leren</w:t>
       </w:r>
       <w:r>
         <w:rPr>
@@ -15153,14 +17474,64 @@
         <w:rPr>
           <w:color w:val="000000" w:themeColor="text1"/>
         </w:rPr>
-        <w:t>fortunately/unfortunately</w:t>
+        <w:t>fortunately</w:t>
+      </w:r>
+      <w:r>
+        <w:rPr>
+          <w:color w:val="000000" w:themeColor="text1"/>
+        </w:rPr>
+        <w:t>-</w:t>
+      </w:r>
+      <w:r>
+        <w:rPr>
+          <w:color w:val="000000" w:themeColor="text1"/>
+        </w:rPr>
+        <w:t>unfortunately</w:t>
       </w:r>
       <w:r>
         <w:rPr>
           <w:color w:val="000000" w:themeColor="text1"/>
         </w:rPr>
         <w:noBreakHyphen/>
-        <w:t>label op de nodes, maar verdere onboarding of een korte legend kan in toekomstig werk nog voorzien worden.</w:t>
+        <w:t>label op de nodes</w:t>
+      </w:r>
+      <w:r>
+        <w:rPr>
+          <w:color w:val="000000" w:themeColor="text1"/>
+        </w:rPr>
+        <w:t>. V</w:t>
+      </w:r>
+      <w:r>
+        <w:rPr>
+          <w:color w:val="000000" w:themeColor="text1"/>
+        </w:rPr>
+        <w:t xml:space="preserve">erdere </w:t>
+      </w:r>
+      <w:r>
+        <w:rPr>
+          <w:i/>
+          <w:iCs/>
+          <w:color w:val="000000" w:themeColor="text1"/>
+        </w:rPr>
+        <w:t>onboarding</w:t>
+      </w:r>
+      <w:r>
+        <w:rPr>
+          <w:color w:val="000000" w:themeColor="text1"/>
+        </w:rPr>
+        <w:t xml:space="preserve"> of een korte legend</w:t>
+      </w:r>
+      <w:r>
+        <w:rPr>
+          <w:color w:val="000000" w:themeColor="text1"/>
+        </w:rPr>
+        <w:t>e</w:t>
+      </w:r>
+      <w:r>
+        <w:rPr>
+          <w:color w:val="000000" w:themeColor="text1"/>
+        </w:rPr>
+        <w:t xml:space="preserve"> kan in toekomstig werk nog voorzien worden.</w:t>
       </w:r>
     </w:p>
     <w:p>
@@ -15246,25 +17617,37 @@
         <w:rPr>
           <w:color w:val="000000" w:themeColor="text1"/>
         </w:rPr>
-        <w:t xml:space="preserve">In zowel de boomvisualisatie als </w:t>
-      </w:r>
-      <w:r>
-        <w:rPr>
-          <w:color w:val="000000" w:themeColor="text1"/>
-        </w:rPr>
-        <w:t xml:space="preserve">de filter sidebar, </w:t>
-      </w:r>
-      <w:r>
-        <w:rPr>
-          <w:color w:val="000000" w:themeColor="text1"/>
-        </w:rPr>
-        <w:t>wordt bij hover over een node de directe parent getoond</w:t>
-      </w:r>
-      <w:r>
-        <w:rPr>
-          <w:color w:val="000000" w:themeColor="text1"/>
-        </w:rPr>
-        <w:t xml:space="preserve"> (Fig. 1</w:t>
+        <w:t xml:space="preserve">Een hover over de node toont zowel in tree als </w:t>
+      </w:r>
+      <w:r>
+        <w:rPr>
+          <w:color w:val="000000" w:themeColor="text1"/>
+        </w:rPr>
+        <w:t>de filter sidebare de directe parent node van deze</w:t>
+      </w:r>
+      <w:r>
+        <w:rPr>
+          <w:color w:val="000000" w:themeColor="text1"/>
+        </w:rPr>
+        <w:t xml:space="preserve"> gehoverde</w:t>
+      </w:r>
+      <w:r>
+        <w:rPr>
+          <w:color w:val="000000" w:themeColor="text1"/>
+        </w:rPr>
+        <w:t xml:space="preserve"> node</w:t>
+      </w:r>
+      <w:r>
+        <w:rPr>
+          <w:color w:val="000000" w:themeColor="text1"/>
+        </w:rPr>
+        <w:t xml:space="preserve"> </w:t>
+      </w:r>
+      <w:r>
+        <w:rPr>
+          <w:color w:val="000000" w:themeColor="text1"/>
+        </w:rPr>
+        <w:t>(Fig. 1</w:t>
       </w:r>
       <w:r>
         <w:rPr>
@@ -15324,6 +17707,12 @@
         <w:rPr>
           <w:color w:val="000000" w:themeColor="text1"/>
         </w:rPr>
+        <w:t xml:space="preserve"> </w:t>
+      </w:r>
+      <w:r>
+        <w:rPr>
+          <w:color w:val="000000" w:themeColor="text1"/>
+        </w:rPr>
         <w:t>interactie. Dit ontwerp speelt in op het doel om gebruikers ook in grotere trees snel te laten oriënteren</w:t>
       </w:r>
       <w:r>
@@ -15336,7 +17725,13 @@
         <w:rPr>
           <w:color w:val="000000" w:themeColor="text1"/>
         </w:rPr>
-        <w:t xml:space="preserve">n de boom kunnen zij zonder terug te scrollen zien in welke redeneringsstap een node ingebed is, terwijl </w:t>
+        <w:t>n de boom kunnen zij zonder terug te scrollen zien in welke redeneringsstap een node ingebed is</w:t>
+      </w:r>
+      <w:r>
+        <w:rPr>
+          <w:color w:val="000000" w:themeColor="text1"/>
+        </w:rPr>
+        <w:t xml:space="preserve">. In </w:t>
       </w:r>
       <w:r>
         <w:rPr>
@@ -15348,7 +17743,35 @@
         <w:rPr>
           <w:color w:val="000000" w:themeColor="text1"/>
         </w:rPr>
-        <w:t>toelaat om gefilterde nodes (bijvoorbeeld alle Weaknesses) te beoordelen zonder eerst hun exacte positie in de structuur te moeten reconstrueren. Door deze context als korte parent</w:t>
+        <w:t>laat dit toe</w:t>
+      </w:r>
+      <w:r>
+        <w:rPr>
+          <w:color w:val="000000" w:themeColor="text1"/>
+        </w:rPr>
+        <w:t xml:space="preserve"> om gefilterde nodes (bijvoorbeeld alle Weaknesses) te beoordelen zonder eerst hun exacte positie in de structuur te moeten reconstrueren. </w:t>
+      </w:r>
+    </w:p>
+    <w:p>
+      <w:pPr>
+        <w:spacing w:afterLines="24" w:after="57" w:line="288" w:lineRule="auto"/>
+        <w:rPr>
+          <w:color w:val="000000" w:themeColor="text1"/>
+        </w:rPr>
+      </w:pPr>
+    </w:p>
+    <w:p>
+      <w:pPr>
+        <w:spacing w:afterLines="24" w:after="57" w:line="288" w:lineRule="auto"/>
+        <w:rPr>
+          <w:color w:val="000000" w:themeColor="text1"/>
+        </w:rPr>
+      </w:pPr>
+      <w:r>
+        <w:rPr>
+          <w:color w:val="000000" w:themeColor="text1"/>
+        </w:rPr>
+        <w:t>Door deze context als korte parent</w:t>
       </w:r>
       <w:r>
         <w:rPr>
@@ -15453,13 +17876,25 @@
         <w:rPr>
           <w:color w:val="000000" w:themeColor="text1"/>
         </w:rPr>
-        <w:t xml:space="preserve">en </w:t>
-      </w:r>
-      <w:r>
-        <w:rPr>
-          <w:color w:val="000000" w:themeColor="text1"/>
-        </w:rPr>
-        <w:t>om via de branch</w:t>
+        <w:t>en</w:t>
+      </w:r>
+      <w:r>
+        <w:rPr>
+          <w:color w:val="000000" w:themeColor="text1"/>
+        </w:rPr>
+        <w:t xml:space="preserve">. Gebruikers zouden </w:t>
+      </w:r>
+      <w:r>
+        <w:rPr>
+          <w:color w:val="000000" w:themeColor="text1"/>
+        </w:rPr>
+        <w:t xml:space="preserve">dan </w:t>
+      </w:r>
+      <w:r>
+        <w:rPr>
+          <w:color w:val="000000" w:themeColor="text1"/>
+        </w:rPr>
+        <w:t>via de branch</w:t>
       </w:r>
       <w:r>
         <w:rPr>
@@ -15484,7 +17919,56 @@
         <w:rPr>
           <w:color w:val="000000" w:themeColor="text1"/>
         </w:rPr>
-        <w:t xml:space="preserve"> de volledige context op te vragen. Dit werd aanvaard als compromis om schermruimte en visuele ruis te beperken, in lijn met UX</w:t>
+        <w:t xml:space="preserve"> de volledige context op </w:t>
+      </w:r>
+      <w:r>
+        <w:rPr>
+          <w:color w:val="000000" w:themeColor="text1"/>
+        </w:rPr>
+        <w:t>moeten</w:t>
+      </w:r>
+      <w:r>
+        <w:rPr>
+          <w:color w:val="000000" w:themeColor="text1"/>
+        </w:rPr>
+        <w:t xml:space="preserve"> vragen. Dit werd aanvaard als compromis om </w:t>
+      </w:r>
+      <w:r>
+        <w:rPr>
+          <w:color w:val="000000" w:themeColor="text1"/>
+        </w:rPr>
+        <w:lastRenderedPageBreak/>
+        <w:t>schermruimte en visuele ruis te beperken</w:t>
+      </w:r>
+      <w:r>
+        <w:rPr>
+          <w:color w:val="000000" w:themeColor="text1"/>
+        </w:rPr>
+        <w:t xml:space="preserve">. Hierdoor volgt </w:t>
+      </w:r>
+      <w:r>
+        <w:rPr>
+          <w:color w:val="000000" w:themeColor="text1"/>
+        </w:rPr>
+        <w:t>dit</w:t>
+      </w:r>
+      <w:r>
+        <w:rPr>
+          <w:color w:val="000000" w:themeColor="text1"/>
+        </w:rPr>
+        <w:t xml:space="preserve"> </w:t>
+      </w:r>
+      <w:r>
+        <w:rPr>
+          <w:color w:val="000000" w:themeColor="text1"/>
+        </w:rPr>
+        <w:t>het</w:t>
+      </w:r>
+      <w:r>
+        <w:rPr>
+          <w:color w:val="000000" w:themeColor="text1"/>
+        </w:rPr>
+        <w:t xml:space="preserve"> UX</w:t>
       </w:r>
       <w:r>
         <w:rPr>
@@ -15497,7 +17981,7 @@
         <w:rPr>
           <w:color w:val="000000" w:themeColor="text1"/>
         </w:rPr>
-        <w:t>principes rond minimalisme en gerichte informatievoorziening.</w:t>
+        <w:t>principe rond minimalisme.</w:t>
       </w:r>
     </w:p>
     <w:p>
@@ -15519,7 +18003,6 @@
           <w:noProof/>
           <w:color w:val="000000" w:themeColor="text1"/>
         </w:rPr>
-        <w:lastRenderedPageBreak/>
         <w:drawing>
           <wp:inline distT="0" distB="0" distL="0" distR="0" wp14:anchorId="209EFDD2" wp14:editId="229EF71E">
             <wp:extent cx="4198620" cy="1668338"/>
@@ -16014,7 +18497,14 @@
         <w:rPr>
           <w:color w:val="000000" w:themeColor="text1"/>
         </w:rPr>
-        <w:t>geen bijkomende modale meldingen nodig. Een beperking is dat gebruikers wel moeten weten dat zij kunnen hoveren om extra uitleg te krijgen. Dit werd aanvaard als compromis om de interface visueel zo eenvoudig mogelijk te houden.</w:t>
+        <w:t xml:space="preserve">geen bijkomende modale meldingen nodig. Een beperking is </w:t>
+      </w:r>
+      <w:r>
+        <w:rPr>
+          <w:color w:val="000000" w:themeColor="text1"/>
+        </w:rPr>
+        <w:lastRenderedPageBreak/>
+        <w:t>dat gebruikers wel moeten weten dat zij kunnen hoveren om extra uitleg te krijgen. Dit werd aanvaard als compromis om de interface visueel zo eenvoudig mogelijk te houden.</w:t>
       </w:r>
       <w:r>
         <w:rPr>
@@ -16034,14 +18524,7 @@
         <w:rPr>
           <w:color w:val="000000" w:themeColor="text1"/>
         </w:rPr>
-        <w:t xml:space="preserve">. </w:t>
-      </w:r>
-      <w:r>
-        <w:rPr>
-          <w:color w:val="000000" w:themeColor="text1"/>
-        </w:rPr>
-        <w:lastRenderedPageBreak/>
-        <w:t>Op deze manier is het</w:t>
+        <w:t>. Op deze manier is het</w:t>
       </w:r>
       <w:r>
         <w:rPr>
@@ -16555,7 +19038,6 @@
           <w:bCs/>
           <w:color w:val="000000" w:themeColor="text1"/>
         </w:rPr>
-        <w:lastRenderedPageBreak/>
         <w:t>3.</w:t>
       </w:r>
       <w:r>
@@ -16964,7 +19446,6 @@
           <w:bCs/>
           <w:color w:val="000000" w:themeColor="text1"/>
         </w:rPr>
-        <w:lastRenderedPageBreak/>
         <w:t>3.</w:t>
       </w:r>
       <w:r>
@@ -17305,7 +19786,14 @@
           <w:color w:val="000000" w:themeColor="text1"/>
         </w:rPr>
         <w:noBreakHyphen/>
-        <w:t>ratingvenster of de iconselector) sluit deze vensters automatisch, waardoor de kans op onbedoelde verdere interactie in een oude context afneemt.</w:t>
+        <w:t xml:space="preserve">ratingvenster of de iconselector) sluit deze </w:t>
+      </w:r>
+      <w:r>
+        <w:rPr>
+          <w:color w:val="000000" w:themeColor="text1"/>
+        </w:rPr>
+        <w:lastRenderedPageBreak/>
+        <w:t>vensters automatisch, waardoor de kans op onbedoelde verdere interactie in een oude context afneemt.</w:t>
       </w:r>
     </w:p>
     <w:p>
@@ -17324,7 +19812,6 @@
           <w:bCs/>
           <w:color w:val="000000" w:themeColor="text1"/>
         </w:rPr>
-        <w:lastRenderedPageBreak/>
         <w:t>3.</w:t>
       </w:r>
       <w:r>
@@ -17630,7 +20117,14 @@
         <w:rPr>
           <w:color w:val="000000" w:themeColor="text1"/>
         </w:rPr>
-        <w:t>et volledige overzichtspaneel wordt alleen getoond wanneer de gebruiker hier expliciet voor kiest. Tooltips zijn kort en beperkt tot contextuele uitleg, zodat er geen overdadige tekst of iconografie ontstaat die de cognitieve belasting zou verhogen.</w:t>
+        <w:t xml:space="preserve">et volledige overzichtspaneel wordt alleen getoond wanneer de gebruiker hier expliciet </w:t>
+      </w:r>
+      <w:r>
+        <w:rPr>
+          <w:color w:val="000000" w:themeColor="text1"/>
+        </w:rPr>
+        <w:lastRenderedPageBreak/>
+        <w:t>voor kiest. Tooltips zijn kort en beperkt tot contextuele uitleg, zodat er geen overdadige tekst of iconografie ontstaat die de cognitieve belasting zou verhogen.</w:t>
       </w:r>
     </w:p>
     <w:p>
@@ -17659,7 +20153,6 @@
           <w:bCs/>
           <w:color w:val="000000" w:themeColor="text1"/>
         </w:rPr>
-        <w:lastRenderedPageBreak/>
         <w:t>3.</w:t>
       </w:r>
       <w:r>
@@ -18038,6 +20531,7 @@
         <w:rPr>
           <w:color w:val="000000" w:themeColor="text1"/>
         </w:rPr>
+        <w:lastRenderedPageBreak/>
         <w:t>er is geen multi</w:t>
       </w:r>
       <w:r>
@@ -18084,7 +20578,6 @@
         <w:rPr>
           <w:color w:val="000000" w:themeColor="text1"/>
         </w:rPr>
-        <w:lastRenderedPageBreak/>
         <w:t>Deze keuzes houden de implementatie beheersbaar en laten toe om de impact van de visualisatie</w:t>
       </w:r>
       <w:r>
@@ -19303,7 +21796,7 @@
           <w:color w:val="000000" w:themeColor="text1"/>
         </w:rPr>
         <w:drawing>
-          <wp:inline distT="0" distB="0" distL="0" distR="0" wp14:anchorId="1D6CEF09" wp14:editId="5E9ED4C5">
+          <wp:inline distT="0" distB="0" distL="0" distR="0" wp14:anchorId="1D6CEF09" wp14:editId="2BE68F3F">
             <wp:extent cx="5759450" cy="2903855"/>
             <wp:effectExtent l="0" t="0" r="0" b="0"/>
             <wp:docPr id="254494346" name="Afbeelding 25" descr="Afbeelding met tekst, schermopname, Lettertype, nummer&#10;&#10;Door AI gegenereerde inhoud is mogelijk onjuist."/>
@@ -22044,6 +24537,7 @@
       <w:r>
         <w:rPr>
           <w:rFonts w:eastAsia="Times New Roman" w:cs="Times New Roman"/>
+          <w:noProof/>
           <w:color w:val="000000" w:themeColor="text1"/>
           <w:kern w:val="0"/>
           <w:lang w:eastAsia="nl-BE"/>
@@ -22959,13 +25453,7 @@
           <w:color w:val="000000" w:themeColor="text1"/>
         </w:rPr>
         <w:noBreakHyphen/>
-        <w:t>samenvatting wordt gematigd gewaardeerd, terwijl de tooltips als minst nuttig worden beoordeeld en slechts beperkt bijdragen aan navigatie</w:t>
-      </w:r>
-      <w:r>
-        <w:rPr>
-          <w:color w:val="000000" w:themeColor="text1"/>
-        </w:rPr>
-        <w:t>.</w:t>
+        <w:t>samenvatting wordt gematigd gewaardeerd, terwijl de tooltips als minst nuttig worden beoordeeld en slechts beperkt bijdragen aan navigatie.</w:t>
       </w:r>
       <w:r>
         <w:rPr>

</xml_diff>

<commit_message>
rewritten text to better fit academic writing - hfst 3
</commit_message>
<xml_diff>
--- a/Master_scriptie_tekst.docx
+++ b/Master_scriptie_tekst.docx
@@ -8367,7 +8367,19 @@
         <w:rPr>
           <w:color w:val="000000" w:themeColor="text1"/>
         </w:rPr>
-        <w:t xml:space="preserve"> presenteert de empirische resultaten over taakprestaties, user experience en feature-ranking</w:t>
+        <w:t xml:space="preserve"> presenteert de empirische resultaten over taakprestaties, user experience</w:t>
+      </w:r>
+      <w:r>
+        <w:rPr>
+          <w:color w:val="000000" w:themeColor="text1"/>
+        </w:rPr>
+        <w:t xml:space="preserve"> (UX)</w:t>
+      </w:r>
+      <w:r>
+        <w:rPr>
+          <w:color w:val="000000" w:themeColor="text1"/>
+        </w:rPr>
+        <w:t xml:space="preserve"> en feature-ranking</w:t>
       </w:r>
       <w:r>
         <w:rPr>
@@ -12393,7 +12405,7 @@
         </w:rPr>
         <w:lastRenderedPageBreak/>
         <w:drawing>
-          <wp:inline distT="0" distB="0" distL="0" distR="0" wp14:anchorId="164C6A69" wp14:editId="0BCD9128">
+          <wp:inline distT="0" distB="0" distL="0" distR="0" wp14:anchorId="164C6A69" wp14:editId="3FD7F8CE">
             <wp:extent cx="4117443" cy="2455034"/>
             <wp:effectExtent l="0" t="0" r="0" b="2540"/>
             <wp:docPr id="163695878" name="Afbeelding 1"/>
@@ -12520,7 +12532,7 @@
           <w:color w:val="000000" w:themeColor="text1"/>
         </w:rPr>
         <w:drawing>
-          <wp:inline distT="0" distB="0" distL="0" distR="0" wp14:anchorId="2D40E1FD" wp14:editId="4B3A048E">
+          <wp:inline distT="0" distB="0" distL="0" distR="0" wp14:anchorId="2D40E1FD" wp14:editId="60769250">
             <wp:extent cx="5779492" cy="3544028"/>
             <wp:effectExtent l="0" t="0" r="0" b="0"/>
             <wp:docPr id="935087861" name="Afbeelding 1"/>
@@ -12714,7 +12726,7 @@
         </w:rPr>
         <w:lastRenderedPageBreak/>
         <w:drawing>
-          <wp:inline distT="0" distB="0" distL="0" distR="0" wp14:anchorId="6AC59A2E" wp14:editId="1D75CCAF">
+          <wp:inline distT="0" distB="0" distL="0" distR="0" wp14:anchorId="6AC59A2E" wp14:editId="59E5D057">
             <wp:extent cx="5759450" cy="2856865"/>
             <wp:effectExtent l="0" t="0" r="0" b="635"/>
             <wp:docPr id="234035025" name="Afbeelding 1" descr="Afbeelding met diagram, schermopname, lijn, ontwerp&#10;&#10;Door AI gegenereerde inhoud is mogelijk onjuist."/>
@@ -12823,7 +12835,7 @@
           <w:color w:val="000000" w:themeColor="text1"/>
         </w:rPr>
         <w:drawing>
-          <wp:inline distT="0" distB="0" distL="0" distR="0" wp14:anchorId="11AC0779" wp14:editId="47122081">
+          <wp:inline distT="0" distB="0" distL="0" distR="0" wp14:anchorId="11AC0779" wp14:editId="294BBEDC">
             <wp:extent cx="5759450" cy="1689735"/>
             <wp:effectExtent l="0" t="0" r="0" b="5715"/>
             <wp:docPr id="373297823" name="Afbeelding 2" descr="Afbeelding met diagram, lijn, origami, ontwerp&#10;&#10;Door AI gegenereerde inhoud is mogelijk onjuist."/>
@@ -17617,13 +17629,7 @@
         <w:rPr>
           <w:color w:val="000000" w:themeColor="text1"/>
         </w:rPr>
-        <w:t xml:space="preserve">Een hover over de node toont zowel in tree als </w:t>
-      </w:r>
-      <w:r>
-        <w:rPr>
-          <w:color w:val="000000" w:themeColor="text1"/>
-        </w:rPr>
-        <w:t>de filter sidebare de directe parent node van deze</w:t>
+        <w:t>Een hover over de node toont zowel in tree als de filter sidebare de directe parent node van deze</w:t>
       </w:r>
       <w:r>
         <w:rPr>
@@ -18485,26 +18491,76 @@
         <w:rPr>
           <w:color w:val="000000" w:themeColor="text1"/>
         </w:rPr>
-        <w:t>effecten, waardoor gebruikers onmiddellijk zien wat er in de boom is veranderd</w:t>
-      </w:r>
-      <w:r>
-        <w:rPr>
-          <w:color w:val="000000" w:themeColor="text1"/>
-        </w:rPr>
-        <w:t xml:space="preserve">. Hierdoor zijn er </w:t>
-      </w:r>
-      <w:r>
-        <w:rPr>
-          <w:color w:val="000000" w:themeColor="text1"/>
-        </w:rPr>
-        <w:t xml:space="preserve">geen bijkomende modale meldingen nodig. Een beperking is </w:t>
-      </w:r>
+        <w:t>effecten</w:t>
+      </w:r>
+      <w:r>
+        <w:rPr>
+          <w:color w:val="000000" w:themeColor="text1"/>
+        </w:rPr>
+        <w:t>. Hierdoor zien de</w:t>
+      </w:r>
+      <w:r>
+        <w:rPr>
+          <w:color w:val="000000" w:themeColor="text1"/>
+        </w:rPr>
+        <w:t xml:space="preserve"> gebruikers onmiddellijk wat er in de boom is veranderd</w:t>
+      </w:r>
+      <w:r>
+        <w:rPr>
+          <w:color w:val="000000" w:themeColor="text1"/>
+        </w:rPr>
+        <w:t xml:space="preserve">. </w:t>
+      </w:r>
+      <w:r>
+        <w:rPr>
+          <w:color w:val="000000" w:themeColor="text1"/>
+        </w:rPr>
+        <w:t>Dit zorgt ervoor dat</w:t>
+      </w:r>
+      <w:r>
+        <w:rPr>
+          <w:color w:val="000000" w:themeColor="text1"/>
+        </w:rPr>
+        <w:t xml:space="preserve"> bijkomende modale meldingen </w:t>
+      </w:r>
+      <w:r>
+        <w:rPr>
+          <w:color w:val="000000" w:themeColor="text1"/>
+        </w:rPr>
+        <w:t xml:space="preserve">niet </w:t>
+      </w:r>
+      <w:r>
+        <w:rPr>
+          <w:color w:val="000000" w:themeColor="text1"/>
+        </w:rPr>
+        <w:t>nodig</w:t>
+      </w:r>
+      <w:r>
+        <w:rPr>
+          <w:color w:val="000000" w:themeColor="text1"/>
+        </w:rPr>
+        <w:t xml:space="preserve"> zijn</w:t>
+      </w:r>
+      <w:r>
+        <w:rPr>
+          <w:color w:val="000000" w:themeColor="text1"/>
+        </w:rPr>
+        <w:t xml:space="preserve">. </w:t>
+      </w:r>
+    </w:p>
+    <w:p>
+      <w:pPr>
+        <w:spacing w:afterLines="24" w:after="57" w:line="288" w:lineRule="auto"/>
+        <w:rPr>
+          <w:color w:val="000000" w:themeColor="text1"/>
+        </w:rPr>
+      </w:pPr>
       <w:r>
         <w:rPr>
           <w:color w:val="000000" w:themeColor="text1"/>
         </w:rPr>
         <w:lastRenderedPageBreak/>
-        <w:t>dat gebruikers wel moeten weten dat zij kunnen hoveren om extra uitleg te krijgen. Dit werd aanvaard als compromis om de interface visueel zo eenvoudig mogelijk te houden.</w:t>
+        <w:t>Een beperking is dat gebruikers wel moeten weten dat zij kunnen hoveren om extra uitleg te krijgen. Dit werd aanvaard als compromis om de interface visueel zo eenvoudig mogelijk te houden.</w:t>
       </w:r>
       <w:r>
         <w:rPr>
@@ -18910,6 +18966,7 @@
           <w:noProof/>
           <w:color w:val="000000" w:themeColor="text1"/>
         </w:rPr>
+        <w:lastRenderedPageBreak/>
         <w:drawing>
           <wp:inline distT="0" distB="0" distL="0" distR="0" wp14:anchorId="1E71BD73" wp14:editId="524232FC">
             <wp:extent cx="5037257" cy="1257409"/>
@@ -19212,7 +19269,19 @@
         <w:rPr>
           <w:color w:val="000000" w:themeColor="text1"/>
         </w:rPr>
-        <w:t xml:space="preserve">De tool geeft gebruikers voortdurend feedback over de huidige toestand van het systeem. De boomweergave in TreeVisualizer wordt onmiddellijk geüpdatet na toevoeging, bewerking of verwijdering van </w:t>
+        <w:t>De tool geeft gebruikers voortdurend feedback over de huidige toestand van het systeem. De boomweergave</w:t>
+      </w:r>
+      <w:r>
+        <w:rPr>
+          <w:color w:val="000000" w:themeColor="text1"/>
+        </w:rPr>
+        <w:t xml:space="preserve"> </w:t>
+      </w:r>
+      <w:r>
+        <w:rPr>
+          <w:color w:val="000000" w:themeColor="text1"/>
+        </w:rPr>
+        <w:t xml:space="preserve">wordt onmiddellijk geüpdatet na toevoeging, bewerking of verwijdering van </w:t>
       </w:r>
       <w:r>
         <w:rPr>
@@ -19224,7 +19293,31 @@
         <w:rPr>
           <w:color w:val="000000" w:themeColor="text1"/>
         </w:rPr>
-        <w:t xml:space="preserve"> via setTreeData. De geselecteerde knoop (currentNode) en zoekresultaten (highlightedNodes) worden visueel geaccentueerd met een extra rand en achtergrondkleur. </w:t>
+        <w:t xml:space="preserve">. De geselecteerde </w:t>
+      </w:r>
+      <w:r>
+        <w:rPr>
+          <w:color w:val="000000" w:themeColor="text1"/>
+        </w:rPr>
+        <w:t xml:space="preserve">node </w:t>
+      </w:r>
+      <w:r>
+        <w:rPr>
+          <w:color w:val="000000" w:themeColor="text1"/>
+        </w:rPr>
+        <w:t>en zoekresultaten</w:t>
+      </w:r>
+      <w:r>
+        <w:rPr>
+          <w:color w:val="000000" w:themeColor="text1"/>
+        </w:rPr>
+        <w:t xml:space="preserve"> </w:t>
+      </w:r>
+      <w:r>
+        <w:rPr>
+          <w:color w:val="000000" w:themeColor="text1"/>
+        </w:rPr>
+        <w:t xml:space="preserve">worden visueel geaccentueerd met een extra rand en achtergrondkleur. </w:t>
       </w:r>
       <w:r>
         <w:rPr>
@@ -19261,26 +19354,43 @@
         <w:rPr>
           <w:color w:val="000000" w:themeColor="text1"/>
         </w:rPr>
-        <w:t xml:space="preserve">([redNodes.length], [greenNodes.length] enz.) </w:t>
-      </w:r>
-      <w:r>
-        <w:rPr>
-          <w:color w:val="000000" w:themeColor="text1"/>
-        </w:rPr>
         <w:t xml:space="preserve">tonen onmiddellijk na gebruikersinteractie </w:t>
       </w:r>
       <w:r>
         <w:rPr>
           <w:color w:val="000000" w:themeColor="text1"/>
         </w:rPr>
-        <w:t>hoeveel zwaktes en aannames zich in elke status bevinden. De “Danger rating”-indicator per unfortunately</w:t>
+        <w:t xml:space="preserve">hoeveel zwaktes en aannames zich in elke status bevinden. De </w:t>
+      </w:r>
+      <w:r>
+        <w:rPr>
+          <w:color w:val="000000" w:themeColor="text1"/>
+        </w:rPr>
+        <w:t>d</w:t>
+      </w:r>
+      <w:r>
+        <w:rPr>
+          <w:color w:val="000000" w:themeColor="text1"/>
+        </w:rPr>
+        <w:t>anger rating per unfortunately</w:t>
       </w:r>
       <w:r>
         <w:rPr>
           <w:color w:val="000000" w:themeColor="text1"/>
         </w:rPr>
         <w:noBreakHyphen/>
-        <w:t>knoop (component NodeDangerPopup) geeft continu de actuele risicoscore weer, die direct wijzigt bij aanpassing van impact en likelihood.</w:t>
+      </w:r>
+      <w:r>
+        <w:rPr>
+          <w:color w:val="000000" w:themeColor="text1"/>
+        </w:rPr>
+        <w:t>node</w:t>
+      </w:r>
+      <w:r>
+        <w:rPr>
+          <w:color w:val="000000" w:themeColor="text1"/>
+        </w:rPr>
+        <w:t xml:space="preserve"> geeft continu de actuele risicoscore weer, die direct wijzigt bij aanpassing van impact en likelihood.</w:t>
       </w:r>
     </w:p>
     <w:p>
@@ -19355,6 +19465,8 @@
       <w:pPr>
         <w:spacing w:afterLines="24" w:after="57" w:line="288" w:lineRule="auto"/>
         <w:rPr>
+          <w:b/>
+          <w:bCs/>
           <w:color w:val="000000" w:themeColor="text1"/>
         </w:rPr>
       </w:pPr>
@@ -19369,19 +19481,754 @@
           <w:color w:val="000000" w:themeColor="text1"/>
         </w:rPr>
         <w:noBreakHyphen/>
-        <w:t xml:space="preserve"> en risicoanalyse. </w:t>
-      </w:r>
-      <w:r>
-        <w:rPr>
-          <w:color w:val="000000" w:themeColor="text1"/>
-        </w:rPr>
-        <w:t>Nodes</w:t>
-      </w:r>
-      <w:r>
-        <w:rPr>
-          <w:color w:val="000000" w:themeColor="text1"/>
-        </w:rPr>
-        <w:t xml:space="preserve"> zijn expliciet getypeerd als level "fortunately" of "unfortunately", wat overeenkomt met positieve en negatieve implicaties in het analyseproces. De rechterzijbalk groepeert </w:t>
+        <w:t xml:space="preserve"> en risicoanalyse. Nodes zijn expliciet getypeerd als level “fortunately” of “unfortunately”, wat overeenkomt met positieve en negatieve implicaties in het analyseproces. De rechterzijbalk groepeert nodes in domeinspecifieke categorieën: “Weaknesses”, “Weaknesses Under Review”, “Assumptions Under Review” en “Verified </w:t>
+      </w:r>
+      <w:r>
+        <w:rPr>
+          <w:color w:val="000000" w:themeColor="text1"/>
+        </w:rPr>
+        <w:lastRenderedPageBreak/>
+        <w:t>assumptions”, ondersteund door passende schild</w:t>
+      </w:r>
+      <w:r>
+        <w:rPr>
+          <w:color w:val="000000" w:themeColor="text1"/>
+        </w:rPr>
+        <w:noBreakHyphen/>
+        <w:t>iconen. De keuze voor een schild sluit aan bij de wijdverspreide visuele metafoor van een schild als symbool voor bescherming en security. De risicoscore wordt opgebouwd uit de dimensies impact en likelihood en weergegeven als danger rating</w:t>
+      </w:r>
+      <w:r>
+        <w:rPr>
+          <w:color w:val="000000" w:themeColor="text1"/>
+        </w:rPr>
+        <w:t>. Dit sluit aan</w:t>
+      </w:r>
+      <w:r>
+        <w:rPr>
+          <w:color w:val="000000" w:themeColor="text1"/>
+        </w:rPr>
+        <w:t xml:space="preserve"> bij gangbare risico</w:t>
+      </w:r>
+      <w:r>
+        <w:rPr>
+          <w:color w:val="000000" w:themeColor="text1"/>
+        </w:rPr>
+        <w:noBreakHyphen/>
+        <w:t xml:space="preserve">taxonomieën. De danger rating wordt </w:t>
+      </w:r>
+      <w:r>
+        <w:rPr>
+          <w:color w:val="000000" w:themeColor="text1"/>
+        </w:rPr>
+        <w:t>gevisualiseerd</w:t>
+      </w:r>
+      <w:r>
+        <w:rPr>
+          <w:color w:val="000000" w:themeColor="text1"/>
+        </w:rPr>
+        <w:t xml:space="preserve"> in een gevarendriehoek</w:t>
+      </w:r>
+      <w:r>
+        <w:rPr>
+          <w:color w:val="000000" w:themeColor="text1"/>
+        </w:rPr>
+        <w:noBreakHyphen/>
+        <w:t xml:space="preserve">pictogram, een vorm die in veiligheidssignalisatie </w:t>
+      </w:r>
+      <w:r>
+        <w:rPr>
+          <w:color w:val="000000" w:themeColor="text1"/>
+        </w:rPr>
+        <w:t>veelvoudig</w:t>
+      </w:r>
+      <w:r>
+        <w:rPr>
+          <w:color w:val="000000" w:themeColor="text1"/>
+        </w:rPr>
+        <w:t xml:space="preserve"> wordt gebruikt om gevaar te markeren.</w:t>
+      </w:r>
+    </w:p>
+    <w:p>
+      <w:pPr>
+        <w:spacing w:afterLines="24" w:after="57" w:line="288" w:lineRule="auto"/>
+        <w:rPr>
+          <w:b/>
+          <w:bCs/>
+          <w:color w:val="000000" w:themeColor="text1"/>
+        </w:rPr>
+      </w:pPr>
+    </w:p>
+    <w:p>
+      <w:pPr>
+        <w:pStyle w:val="Kop3"/>
+        <w:rPr>
+          <w:b/>
+          <w:bCs/>
+          <w:color w:val="000000" w:themeColor="text1"/>
+        </w:rPr>
+      </w:pPr>
+      <w:bookmarkStart w:id="53" w:name="_Toc219558604"/>
+      <w:r>
+        <w:rPr>
+          <w:b/>
+          <w:bCs/>
+          <w:color w:val="000000" w:themeColor="text1"/>
+        </w:rPr>
+        <w:t>3.</w:t>
+      </w:r>
+      <w:r>
+        <w:rPr>
+          <w:b/>
+          <w:bCs/>
+          <w:color w:val="000000" w:themeColor="text1"/>
+        </w:rPr>
+        <w:t>7</w:t>
+      </w:r>
+      <w:r>
+        <w:rPr>
+          <w:b/>
+          <w:bCs/>
+          <w:color w:val="000000" w:themeColor="text1"/>
+        </w:rPr>
+        <w:t xml:space="preserve">.3 </w:t>
+      </w:r>
+      <w:r>
+        <w:rPr>
+          <w:b/>
+          <w:bCs/>
+          <w:color w:val="000000" w:themeColor="text1"/>
+        </w:rPr>
+        <w:t>Gebruikerscontrole en vrijheid</w:t>
+      </w:r>
+      <w:bookmarkEnd w:id="53"/>
+    </w:p>
+    <w:p>
+      <w:pPr>
+        <w:spacing w:afterLines="24" w:after="57" w:line="288" w:lineRule="auto"/>
+        <w:rPr>
+          <w:color w:val="000000" w:themeColor="text1"/>
+        </w:rPr>
+      </w:pPr>
+    </w:p>
+    <w:p>
+      <w:pPr>
+        <w:spacing w:afterLines="24" w:after="57" w:line="288" w:lineRule="auto"/>
+        <w:rPr>
+          <w:color w:val="000000" w:themeColor="text1"/>
+        </w:rPr>
+      </w:pPr>
+      <w:r>
+        <w:rPr>
+          <w:color w:val="000000" w:themeColor="text1"/>
+        </w:rPr>
+        <w:t>De implementatie voorziet diverse mechanismen die de gebruiker controle geven over het modelleerproces. Via “Reset Tree” kan op elk moment naar een lege beginsituatie worden teruggekeerd</w:t>
+      </w:r>
+      <w:r>
+        <w:rPr>
+          <w:color w:val="000000" w:themeColor="text1"/>
+        </w:rPr>
+        <w:t>.</w:t>
+      </w:r>
+      <w:r>
+        <w:rPr>
+          <w:color w:val="000000" w:themeColor="text1"/>
+        </w:rPr>
+        <w:t xml:space="preserve"> </w:t>
+      </w:r>
+      <w:r>
+        <w:rPr>
+          <w:color w:val="000000" w:themeColor="text1"/>
+        </w:rPr>
+        <w:t>D</w:t>
+      </w:r>
+      <w:r>
+        <w:rPr>
+          <w:color w:val="000000" w:themeColor="text1"/>
+        </w:rPr>
+        <w:t xml:space="preserve">eze actie wordt voorafgegaan door een bevestigingsdialoog om onbedoeld dataverlies te vermijden. Op knoopniveau kunnen gebruikers afzonderlijke elementen verwijderen via de prullenbakknop of nieuwe </w:t>
+      </w:r>
+      <w:r>
+        <w:rPr>
+          <w:color w:val="000000" w:themeColor="text1"/>
+        </w:rPr>
+        <w:t>children</w:t>
+      </w:r>
+      <w:r>
+        <w:rPr>
+          <w:color w:val="000000" w:themeColor="text1"/>
+        </w:rPr>
+        <w:t xml:space="preserve"> toevoegen</w:t>
+      </w:r>
+      <w:r>
+        <w:rPr>
+          <w:color w:val="000000" w:themeColor="text1"/>
+        </w:rPr>
+        <w:t xml:space="preserve"> via de </w:t>
+      </w:r>
+      <w:r>
+        <w:rPr>
+          <w:i/>
+          <w:iCs/>
+          <w:color w:val="000000" w:themeColor="text1"/>
+        </w:rPr>
+        <w:t>add</w:t>
+      </w:r>
+      <w:r>
+        <w:rPr>
+          <w:color w:val="000000" w:themeColor="text1"/>
+        </w:rPr>
+        <w:t xml:space="preserve"> knop</w:t>
+      </w:r>
+      <w:r>
+        <w:rPr>
+          <w:color w:val="000000" w:themeColor="text1"/>
+        </w:rPr>
+        <w:t xml:space="preserve">. Panelen zoals de rechter </w:t>
+      </w:r>
+      <w:r>
+        <w:rPr>
+          <w:color w:val="000000" w:themeColor="text1"/>
+        </w:rPr>
+        <w:t>filter sidebar</w:t>
+      </w:r>
+      <w:r>
+        <w:rPr>
+          <w:color w:val="000000" w:themeColor="text1"/>
+        </w:rPr>
+        <w:t xml:space="preserve"> en het linker </w:t>
+      </w:r>
+      <w:r>
+        <w:rPr>
+          <w:color w:val="000000" w:themeColor="text1"/>
+        </w:rPr>
+        <w:t>branch summary</w:t>
+      </w:r>
+      <w:r>
+        <w:rPr>
+          <w:color w:val="000000" w:themeColor="text1"/>
+        </w:rPr>
+        <w:t xml:space="preserve"> kunnen naar </w:t>
+      </w:r>
+      <w:r>
+        <w:rPr>
+          <w:color w:val="000000" w:themeColor="text1"/>
+        </w:rPr>
+        <w:t>wens</w:t>
+      </w:r>
+      <w:r>
+        <w:rPr>
+          <w:color w:val="000000" w:themeColor="text1"/>
+        </w:rPr>
+        <w:t xml:space="preserve"> worden geopend en gesloten</w:t>
+      </w:r>
+      <w:r>
+        <w:rPr>
+          <w:color w:val="000000" w:themeColor="text1"/>
+        </w:rPr>
+        <w:t xml:space="preserve">. Zo kunnen </w:t>
+      </w:r>
+      <w:r>
+        <w:rPr>
+          <w:color w:val="000000" w:themeColor="text1"/>
+        </w:rPr>
+        <w:t>gebruikers vrij</w:t>
+      </w:r>
+      <w:r>
+        <w:rPr>
+          <w:color w:val="000000" w:themeColor="text1"/>
+        </w:rPr>
+        <w:t xml:space="preserve"> </w:t>
+      </w:r>
+      <w:r>
+        <w:rPr>
+          <w:color w:val="000000" w:themeColor="text1"/>
+        </w:rPr>
+        <w:t>schakelen tussen een compacte en een meer gedetailleerde weergave.</w:t>
+      </w:r>
+    </w:p>
+    <w:p>
+      <w:pPr>
+        <w:spacing w:afterLines="24" w:after="57" w:line="288" w:lineRule="auto"/>
+        <w:rPr>
+          <w:b/>
+          <w:bCs/>
+          <w:color w:val="000000" w:themeColor="text1"/>
+        </w:rPr>
+      </w:pPr>
+    </w:p>
+    <w:p>
+      <w:pPr>
+        <w:spacing w:afterLines="24" w:after="57" w:line="288" w:lineRule="auto"/>
+        <w:rPr>
+          <w:b/>
+          <w:bCs/>
+          <w:color w:val="000000" w:themeColor="text1"/>
+        </w:rPr>
+      </w:pPr>
+    </w:p>
+    <w:p>
+      <w:pPr>
+        <w:pStyle w:val="Kop3"/>
+        <w:rPr>
+          <w:b/>
+          <w:bCs/>
+          <w:color w:val="000000" w:themeColor="text1"/>
+        </w:rPr>
+      </w:pPr>
+      <w:bookmarkStart w:id="54" w:name="_Toc219558605"/>
+      <w:r>
+        <w:rPr>
+          <w:b/>
+          <w:bCs/>
+          <w:color w:val="000000" w:themeColor="text1"/>
+        </w:rPr>
+        <w:t>3.</w:t>
+      </w:r>
+      <w:r>
+        <w:rPr>
+          <w:b/>
+          <w:bCs/>
+          <w:color w:val="000000" w:themeColor="text1"/>
+        </w:rPr>
+        <w:t>7</w:t>
+      </w:r>
+      <w:r>
+        <w:rPr>
+          <w:b/>
+          <w:bCs/>
+          <w:color w:val="000000" w:themeColor="text1"/>
+        </w:rPr>
+        <w:t xml:space="preserve">.4 </w:t>
+      </w:r>
+      <w:r>
+        <w:rPr>
+          <w:b/>
+          <w:bCs/>
+          <w:color w:val="000000" w:themeColor="text1"/>
+        </w:rPr>
+        <w:t>Consistentie en standaarden</w:t>
+      </w:r>
+      <w:bookmarkEnd w:id="54"/>
+      <w:r>
+        <w:rPr>
+          <w:b/>
+          <w:bCs/>
+          <w:color w:val="000000" w:themeColor="text1"/>
+        </w:rPr>
+        <w:br/>
+      </w:r>
+    </w:p>
+    <w:p>
+      <w:pPr>
+        <w:spacing w:afterLines="24" w:after="57" w:line="288" w:lineRule="auto"/>
+        <w:rPr>
+          <w:color w:val="000000" w:themeColor="text1"/>
+        </w:rPr>
+      </w:pPr>
+      <w:r>
+        <w:rPr>
+          <w:color w:val="000000" w:themeColor="text1"/>
+        </w:rPr>
+        <w:t>In zowel de code als de visuele vormgeving is een consistente logica doorgevoerd. Fortunately</w:t>
+      </w:r>
+      <w:r>
+        <w:rPr>
+          <w:color w:val="000000" w:themeColor="text1"/>
+        </w:rPr>
+        <w:noBreakHyphen/>
+        <w:t>nodes worden systematisch in groen weergegeven</w:t>
+      </w:r>
+      <w:r>
+        <w:rPr>
+          <w:color w:val="000000" w:themeColor="text1"/>
+        </w:rPr>
+        <w:t xml:space="preserve"> en </w:t>
+      </w:r>
+      <w:r>
+        <w:rPr>
+          <w:color w:val="000000" w:themeColor="text1"/>
+        </w:rPr>
+        <w:t>unfortunately</w:t>
+      </w:r>
+      <w:r>
+        <w:rPr>
+          <w:color w:val="000000" w:themeColor="text1"/>
+        </w:rPr>
+        <w:noBreakHyphen/>
+        <w:t>nodes in rood. Deze kleurcodering komt ook terug in de zijbalk (groene/rode labels met “F” en “U”). De betekenis van iconen blijft overal gelijk: GoShield markeert zwaktes, GoShieldCheck markeert aannames of voltooide nodes, GoInfo toont de branchesamenvatting en GoChevronDown/Up staan voor uit</w:t>
+      </w:r>
+      <w:r>
+        <w:rPr>
+          <w:color w:val="000000" w:themeColor="text1"/>
+        </w:rPr>
+        <w:noBreakHyphen/>
+        <w:t xml:space="preserve"> en inklappen. Deze iconen en interactie</w:t>
+      </w:r>
+      <w:r>
+        <w:rPr>
+          <w:color w:val="000000" w:themeColor="text1"/>
+        </w:rPr>
+        <w:noBreakHyphen/>
+        <w:t>patronen sluiten aan bij gangbare webstandaarden, zoals hover</w:t>
+      </w:r>
+      <w:r>
+        <w:rPr>
+          <w:color w:val="000000" w:themeColor="text1"/>
+        </w:rPr>
+        <w:noBreakHyphen/>
+        <w:t>tooltips, modale bevestigingen en scrollIntoView</w:t>
+      </w:r>
+      <w:r>
+        <w:rPr>
+          <w:color w:val="000000" w:themeColor="text1"/>
+        </w:rPr>
+        <w:t xml:space="preserve">. Hierdoor kunnen </w:t>
+      </w:r>
+      <w:r>
+        <w:rPr>
+          <w:color w:val="000000" w:themeColor="text1"/>
+        </w:rPr>
+        <w:t xml:space="preserve">gebruikers hun bestaande ervaring met andere applicaties hergebruiken en </w:t>
+      </w:r>
+      <w:r>
+        <w:rPr>
+          <w:color w:val="000000" w:themeColor="text1"/>
+        </w:rPr>
+        <w:t xml:space="preserve">hoeven ze </w:t>
+      </w:r>
+      <w:r>
+        <w:rPr>
+          <w:color w:val="000000" w:themeColor="text1"/>
+        </w:rPr>
+        <w:t>minder nieuwe conventies te leren.</w:t>
+      </w:r>
+    </w:p>
+    <w:p>
+      <w:pPr>
+        <w:spacing w:afterLines="24" w:after="57" w:line="288" w:lineRule="auto"/>
+        <w:rPr>
+          <w:color w:val="000000" w:themeColor="text1"/>
+        </w:rPr>
+      </w:pPr>
+    </w:p>
+    <w:p>
+      <w:pPr>
+        <w:spacing w:afterLines="24" w:after="57" w:line="288" w:lineRule="auto"/>
+        <w:rPr>
+          <w:color w:val="000000" w:themeColor="text1"/>
+        </w:rPr>
+      </w:pPr>
+    </w:p>
+    <w:p>
+      <w:pPr>
+        <w:pStyle w:val="Kop3"/>
+        <w:rPr>
+          <w:b/>
+          <w:bCs/>
+          <w:color w:val="000000" w:themeColor="text1"/>
+        </w:rPr>
+      </w:pPr>
+      <w:bookmarkStart w:id="55" w:name="_Toc219558606"/>
+      <w:r>
+        <w:rPr>
+          <w:b/>
+          <w:bCs/>
+          <w:color w:val="000000" w:themeColor="text1"/>
+        </w:rPr>
+        <w:lastRenderedPageBreak/>
+        <w:t>3.</w:t>
+      </w:r>
+      <w:r>
+        <w:rPr>
+          <w:b/>
+          <w:bCs/>
+          <w:color w:val="000000" w:themeColor="text1"/>
+        </w:rPr>
+        <w:t>7</w:t>
+      </w:r>
+      <w:r>
+        <w:rPr>
+          <w:b/>
+          <w:bCs/>
+          <w:color w:val="000000" w:themeColor="text1"/>
+        </w:rPr>
+        <w:t xml:space="preserve">.5 </w:t>
+      </w:r>
+      <w:r>
+        <w:rPr>
+          <w:b/>
+          <w:bCs/>
+          <w:color w:val="000000" w:themeColor="text1"/>
+        </w:rPr>
+        <w:t>Foutpreventie</w:t>
+      </w:r>
+      <w:bookmarkEnd w:id="55"/>
+      <w:r>
+        <w:rPr>
+          <w:b/>
+          <w:bCs/>
+          <w:color w:val="000000" w:themeColor="text1"/>
+        </w:rPr>
+        <w:br/>
+      </w:r>
+    </w:p>
+    <w:p>
+      <w:pPr>
+        <w:spacing w:afterLines="24" w:after="57" w:line="288" w:lineRule="auto"/>
+        <w:rPr>
+          <w:color w:val="000000" w:themeColor="text1"/>
+        </w:rPr>
+      </w:pPr>
+      <w:r>
+        <w:rPr>
+          <w:color w:val="000000" w:themeColor="text1"/>
+        </w:rPr>
+        <w:t xml:space="preserve">Het ontwerp tracht fouten te voorkomen door de interactieruimte te beperken tot zinvolle acties. Bij het toevoegen van een </w:t>
+      </w:r>
+      <w:r>
+        <w:rPr>
+          <w:color w:val="000000" w:themeColor="text1"/>
+        </w:rPr>
+        <w:t>child node</w:t>
+      </w:r>
+      <w:r>
+        <w:rPr>
+          <w:color w:val="000000" w:themeColor="text1"/>
+        </w:rPr>
+        <w:t xml:space="preserve"> bepaalt de applicatie automatisch het type (fortunately of unfortunately) op basis van het level van de </w:t>
+      </w:r>
+      <w:r>
+        <w:rPr>
+          <w:color w:val="000000" w:themeColor="text1"/>
+        </w:rPr>
+        <w:t>parent</w:t>
+      </w:r>
+      <w:r>
+        <w:rPr>
+          <w:color w:val="000000" w:themeColor="text1"/>
+        </w:rPr>
+        <w:t>.</w:t>
+      </w:r>
+      <w:r>
+        <w:rPr>
+          <w:color w:val="000000" w:themeColor="text1"/>
+        </w:rPr>
+        <w:t xml:space="preserve"> </w:t>
+      </w:r>
+      <w:r>
+        <w:rPr>
+          <w:color w:val="000000" w:themeColor="text1"/>
+        </w:rPr>
+        <w:t>Hierdoor worden</w:t>
+      </w:r>
+      <w:r>
+        <w:rPr>
+          <w:color w:val="000000" w:themeColor="text1"/>
+        </w:rPr>
+        <w:t xml:space="preserve"> semantisch inconsistente ketens vermeden. Destructieve acties zoals het verwijderen van een </w:t>
+      </w:r>
+      <w:r>
+        <w:rPr>
+          <w:color w:val="000000" w:themeColor="text1"/>
+        </w:rPr>
+        <w:t>node</w:t>
+      </w:r>
+      <w:r>
+        <w:rPr>
+          <w:color w:val="000000" w:themeColor="text1"/>
+        </w:rPr>
+        <w:t xml:space="preserve"> of het resetten van de volledige boom vereisen expliciete bevestiging. Dropdowns voor impact en likelihood zijn begrensd tot waarden 1–5, wat foutieve invoer uitsluit en tegelijk een uniforme schaal afdwingt. Klikken buiten pop</w:t>
+      </w:r>
+      <w:r>
+        <w:rPr>
+          <w:color w:val="000000" w:themeColor="text1"/>
+        </w:rPr>
+        <w:noBreakHyphen/>
+        <w:t>ups</w:t>
+      </w:r>
+      <w:r>
+        <w:rPr>
+          <w:color w:val="000000" w:themeColor="text1"/>
+        </w:rPr>
+        <w:t xml:space="preserve"> </w:t>
+      </w:r>
+      <w:r>
+        <w:rPr>
+          <w:color w:val="000000" w:themeColor="text1"/>
+        </w:rPr>
+        <w:t>sluit deze vensters automatisch</w:t>
+      </w:r>
+      <w:r>
+        <w:rPr>
+          <w:color w:val="000000" w:themeColor="text1"/>
+        </w:rPr>
+        <w:t xml:space="preserve">. Hierdoor neemt </w:t>
+      </w:r>
+      <w:r>
+        <w:rPr>
+          <w:color w:val="000000" w:themeColor="text1"/>
+        </w:rPr>
+        <w:t xml:space="preserve">de kans op onbedoelde verdere interactie in een oude context </w:t>
+      </w:r>
+      <w:r>
+        <w:rPr>
+          <w:color w:val="000000" w:themeColor="text1"/>
+        </w:rPr>
+        <w:t>af</w:t>
+      </w:r>
+      <w:r>
+        <w:rPr>
+          <w:color w:val="000000" w:themeColor="text1"/>
+        </w:rPr>
+        <w:t>.</w:t>
+      </w:r>
+    </w:p>
+    <w:p>
+      <w:pPr>
+        <w:spacing w:afterLines="24" w:after="57" w:line="288" w:lineRule="auto"/>
+        <w:rPr>
+          <w:color w:val="000000" w:themeColor="text1"/>
+        </w:rPr>
+      </w:pPr>
+    </w:p>
+    <w:p>
+      <w:pPr>
+        <w:spacing w:afterLines="24" w:after="57" w:line="288" w:lineRule="auto"/>
+        <w:rPr>
+          <w:color w:val="000000" w:themeColor="text1"/>
+        </w:rPr>
+      </w:pPr>
+    </w:p>
+    <w:p>
+      <w:pPr>
+        <w:pStyle w:val="Kop3"/>
+        <w:rPr>
+          <w:b/>
+          <w:bCs/>
+          <w:color w:val="000000" w:themeColor="text1"/>
+        </w:rPr>
+      </w:pPr>
+      <w:bookmarkStart w:id="56" w:name="_Toc219558607"/>
+      <w:r>
+        <w:rPr>
+          <w:b/>
+          <w:bCs/>
+          <w:color w:val="000000" w:themeColor="text1"/>
+        </w:rPr>
+        <w:t>3.</w:t>
+      </w:r>
+      <w:r>
+        <w:rPr>
+          <w:b/>
+          <w:bCs/>
+          <w:color w:val="000000" w:themeColor="text1"/>
+        </w:rPr>
+        <w:t>7</w:t>
+      </w:r>
+      <w:r>
+        <w:rPr>
+          <w:b/>
+          <w:bCs/>
+          <w:color w:val="000000" w:themeColor="text1"/>
+        </w:rPr>
+        <w:t xml:space="preserve">.6 </w:t>
+      </w:r>
+      <w:r>
+        <w:rPr>
+          <w:b/>
+          <w:bCs/>
+          <w:color w:val="000000" w:themeColor="text1"/>
+        </w:rPr>
+        <w:t>Herkenning boven herinnering</w:t>
+      </w:r>
+      <w:bookmarkEnd w:id="56"/>
+      <w:r>
+        <w:rPr>
+          <w:b/>
+          <w:bCs/>
+          <w:color w:val="000000" w:themeColor="text1"/>
+        </w:rPr>
+        <w:br/>
+      </w:r>
+    </w:p>
+    <w:p>
+      <w:pPr>
+        <w:spacing w:afterLines="24" w:after="57" w:line="288" w:lineRule="auto"/>
+        <w:rPr>
+          <w:color w:val="000000" w:themeColor="text1"/>
+        </w:rPr>
+      </w:pPr>
+      <w:r>
+        <w:rPr>
+          <w:color w:val="000000" w:themeColor="text1"/>
+        </w:rPr>
+        <w:t xml:space="preserve">De interface is zo ontworpen dat relevante acties en informatie zichtbaar worden aangeboden in plaats van uit het geheugen te moeten worden opgeroepen. Contextuele knoppen rond elke </w:t>
+      </w:r>
+      <w:r>
+        <w:rPr>
+          <w:color w:val="000000" w:themeColor="text1"/>
+        </w:rPr>
+        <w:t>node</w:t>
+      </w:r>
+      <w:r>
+        <w:rPr>
+          <w:color w:val="000000" w:themeColor="text1"/>
+        </w:rPr>
+        <w:t xml:space="preserve"> verschijnen bij hover</w:t>
+      </w:r>
+      <w:r>
+        <w:rPr>
+          <w:color w:val="000000" w:themeColor="text1"/>
+        </w:rPr>
+        <w:t>. Z</w:t>
+      </w:r>
+      <w:r>
+        <w:rPr>
+          <w:color w:val="000000" w:themeColor="text1"/>
+        </w:rPr>
+        <w:t>o</w:t>
+      </w:r>
+      <w:r>
+        <w:rPr>
+          <w:color w:val="000000" w:themeColor="text1"/>
+        </w:rPr>
+        <w:t xml:space="preserve"> zien</w:t>
+      </w:r>
+      <w:r>
+        <w:rPr>
+          <w:color w:val="000000" w:themeColor="text1"/>
+        </w:rPr>
+        <w:t xml:space="preserve"> gebruikers welke handelingen mogelijk zijn zonder menu’s of commando’s te onthouden. De IconSelectorButton toont bij hover een korte tekstuele uitleg (Weakness, Assumption Under Review, Verified assumption, enz.), waardoor de betekenis van de iconen direct herkenbaar is. De SearchBar laat gebruikers zoeken op </w:t>
+      </w:r>
+      <w:r>
+        <w:rPr>
+          <w:color w:val="000000" w:themeColor="text1"/>
+        </w:rPr>
+        <w:t>nodenaam</w:t>
+      </w:r>
+      <w:r>
+        <w:rPr>
+          <w:color w:val="000000" w:themeColor="text1"/>
+        </w:rPr>
+        <w:t>.</w:t>
+      </w:r>
+      <w:r>
+        <w:rPr>
+          <w:color w:val="000000" w:themeColor="text1"/>
+        </w:rPr>
+        <w:t xml:space="preserve"> </w:t>
+      </w:r>
+      <w:r>
+        <w:rPr>
+          <w:color w:val="000000" w:themeColor="text1"/>
+        </w:rPr>
+        <w:t xml:space="preserve">De </w:t>
+      </w:r>
+      <w:r>
+        <w:rPr>
+          <w:color w:val="000000" w:themeColor="text1"/>
+        </w:rPr>
+        <w:t xml:space="preserve">gevonden </w:t>
       </w:r>
       <w:r>
         <w:rPr>
@@ -19393,21 +20240,199 @@
         <w:rPr>
           <w:color w:val="000000" w:themeColor="text1"/>
         </w:rPr>
-        <w:t xml:space="preserve"> in domeinspecifieke categorieën: “Weaknesses”, “Weaknesses Under Review”, “Assumptions Under Review” en “Verified assumptions”, ondersteund door passende schild</w:t>
+        <w:t xml:space="preserve"> worden automatisch gehighlight en centraal in beeld gescrold</w:t>
+      </w:r>
+      <w:r>
+        <w:rPr>
+          <w:color w:val="000000" w:themeColor="text1"/>
+        </w:rPr>
+        <w:t>.</w:t>
+      </w:r>
+      <w:r>
+        <w:rPr>
+          <w:color w:val="000000" w:themeColor="text1"/>
+        </w:rPr>
+        <w:t xml:space="preserve"> </w:t>
+      </w:r>
+      <w:r>
+        <w:rPr>
+          <w:color w:val="000000" w:themeColor="text1"/>
+        </w:rPr>
+        <w:t>Hierdoor hoeft</w:t>
+      </w:r>
+      <w:r>
+        <w:rPr>
+          <w:color w:val="000000" w:themeColor="text1"/>
+        </w:rPr>
+        <w:t xml:space="preserve"> de gebruiker de exacte positie in de boomstructuur niet te onthouden.</w:t>
+      </w:r>
+    </w:p>
+    <w:p>
+      <w:pPr>
+        <w:spacing w:afterLines="24" w:after="57" w:line="288" w:lineRule="auto"/>
+        <w:rPr>
+          <w:b/>
+          <w:bCs/>
+          <w:color w:val="000000" w:themeColor="text1"/>
+        </w:rPr>
+      </w:pPr>
+    </w:p>
+    <w:p>
+      <w:pPr>
+        <w:spacing w:after="24"/>
+        <w:rPr>
+          <w:b/>
+          <w:bCs/>
+          <w:color w:val="000000" w:themeColor="text1"/>
+        </w:rPr>
+      </w:pPr>
+    </w:p>
+    <w:p>
+      <w:pPr>
+        <w:pStyle w:val="Kop3"/>
+        <w:rPr>
+          <w:b/>
+          <w:bCs/>
+          <w:color w:val="000000" w:themeColor="text1"/>
+        </w:rPr>
+      </w:pPr>
+      <w:bookmarkStart w:id="57" w:name="_Toc219558608"/>
+      <w:r>
+        <w:rPr>
+          <w:b/>
+          <w:bCs/>
+          <w:color w:val="000000" w:themeColor="text1"/>
+        </w:rPr>
+        <w:t>3.</w:t>
+      </w:r>
+      <w:r>
+        <w:rPr>
+          <w:b/>
+          <w:bCs/>
+          <w:color w:val="000000" w:themeColor="text1"/>
+        </w:rPr>
+        <w:t>7</w:t>
+      </w:r>
+      <w:r>
+        <w:rPr>
+          <w:b/>
+          <w:bCs/>
+          <w:color w:val="000000" w:themeColor="text1"/>
+        </w:rPr>
+        <w:t xml:space="preserve">.7 </w:t>
+      </w:r>
+      <w:r>
+        <w:rPr>
+          <w:b/>
+          <w:bCs/>
+          <w:color w:val="000000" w:themeColor="text1"/>
+        </w:rPr>
+        <w:t>Flexibiliteit en efficiëntie van gebruik</w:t>
+      </w:r>
+      <w:bookmarkEnd w:id="57"/>
+      <w:r>
+        <w:rPr>
+          <w:b/>
+          <w:bCs/>
+          <w:color w:val="000000" w:themeColor="text1"/>
+        </w:rPr>
+        <w:br/>
+      </w:r>
+    </w:p>
+    <w:p>
+      <w:pPr>
+        <w:spacing w:afterLines="24" w:after="57" w:line="288" w:lineRule="auto"/>
+        <w:rPr>
+          <w:b/>
+          <w:bCs/>
+          <w:color w:val="000000" w:themeColor="text1"/>
+        </w:rPr>
+      </w:pPr>
+      <w:r>
+        <w:rPr>
+          <w:color w:val="000000" w:themeColor="text1"/>
+        </w:rPr>
+        <w:t xml:space="preserve">De tool ondersteunt efficiënte interactie met zowel kleine als complexe bomen. Gebruikers kunnen via de </w:t>
+      </w:r>
+      <w:r>
+        <w:rPr>
+          <w:color w:val="000000" w:themeColor="text1"/>
+        </w:rPr>
+        <w:t>knoppen</w:t>
+      </w:r>
+      <w:r>
+        <w:rPr>
+          <w:color w:val="000000" w:themeColor="text1"/>
+        </w:rPr>
+        <w:t xml:space="preserve"> in de boom nodes toevoegen en labels aanpassen. </w:t>
+      </w:r>
+      <w:r>
+        <w:rPr>
+          <w:color w:val="000000" w:themeColor="text1"/>
+        </w:rPr>
+        <w:t>Grote modellen kunnen snel gemanipuleerd worden via globale collapse/expand</w:t>
       </w:r>
       <w:r>
         <w:rPr>
           <w:color w:val="000000" w:themeColor="text1"/>
         </w:rPr>
         <w:noBreakHyphen/>
-        <w:t>iconen (GoShield, GoShieldCheck). De risicoscore wordt opgebouwd uit de dimensies “Impact” en “Likelihood” en weergegeven als “Danger rating”, wat aansluit bij gangbare risico</w:t>
+        <w:t>functionaliteit. Daarnaast kunnen gebruikers door herhaaldelijk op Enter te drukken in het zoekveld cyclisch door alle matches navigeren.</w:t>
+      </w:r>
+      <w:r>
+        <w:rPr>
+          <w:color w:val="000000" w:themeColor="text1"/>
+        </w:rPr>
+        <w:t xml:space="preserve"> </w:t>
+      </w:r>
+      <w:r>
+        <w:rPr>
+          <w:color w:val="000000" w:themeColor="text1"/>
+        </w:rPr>
+        <w:t xml:space="preserve">De dynamische lijsten van </w:t>
+      </w:r>
+      <w:r>
+        <w:rPr>
+          <w:color w:val="000000" w:themeColor="text1"/>
+        </w:rPr>
+        <w:t>weaknesses</w:t>
+      </w:r>
+      <w:r>
+        <w:rPr>
+          <w:color w:val="000000" w:themeColor="text1"/>
+        </w:rPr>
+        <w:t xml:space="preserve"> en </w:t>
+      </w:r>
+      <w:r>
+        <w:rPr>
+          <w:color w:val="000000" w:themeColor="text1"/>
+        </w:rPr>
+        <w:t>assumptions</w:t>
+      </w:r>
+      <w:r>
+        <w:rPr>
+          <w:color w:val="000000" w:themeColor="text1"/>
+        </w:rPr>
+        <w:t xml:space="preserve"> in de rechterzijbalk fungeren als werkvoorraad</w:t>
+      </w:r>
+      <w:r>
+        <w:rPr>
+          <w:color w:val="000000" w:themeColor="text1"/>
+        </w:rPr>
+        <w:t>. E</w:t>
+      </w:r>
+      <w:r>
+        <w:rPr>
+          <w:color w:val="000000" w:themeColor="text1"/>
+        </w:rPr>
+        <w:t>en klik op een item zorgt ervoor dat de relevante tak automatisch wordt uitgeklapt en in beeld komt, wat gericht en efficiënt werken ondersteunt. De consistente kleur</w:t>
       </w:r>
       <w:r>
         <w:rPr>
           <w:color w:val="000000" w:themeColor="text1"/>
         </w:rPr>
         <w:noBreakHyphen/>
-        <w:t>taxonomieën.</w:t>
+        <w:t xml:space="preserve"> en iconencodering in boom en zijbalk versterkt deze efficiëntie, omdat gebruikers relevante nodes en statussen in één oogopslag kunnen herkennen.</w:t>
       </w:r>
     </w:p>
     <w:p>
@@ -19422,8 +20447,139 @@
     </w:p>
     <w:p>
       <w:pPr>
+        <w:pStyle w:val="Kop3"/>
+        <w:rPr>
+          <w:b/>
+          <w:bCs/>
+          <w:color w:val="000000" w:themeColor="text1"/>
+        </w:rPr>
+      </w:pPr>
+      <w:bookmarkStart w:id="58" w:name="_Toc219558609"/>
+      <w:r>
+        <w:rPr>
+          <w:b/>
+          <w:bCs/>
+          <w:color w:val="000000" w:themeColor="text1"/>
+        </w:rPr>
+        <w:t>3.</w:t>
+      </w:r>
+      <w:r>
+        <w:rPr>
+          <w:b/>
+          <w:bCs/>
+          <w:color w:val="000000" w:themeColor="text1"/>
+        </w:rPr>
+        <w:t>7</w:t>
+      </w:r>
+      <w:r>
+        <w:rPr>
+          <w:b/>
+          <w:bCs/>
+          <w:color w:val="000000" w:themeColor="text1"/>
+        </w:rPr>
+        <w:t xml:space="preserve">.8 </w:t>
+      </w:r>
+      <w:r>
+        <w:rPr>
+          <w:b/>
+          <w:bCs/>
+          <w:color w:val="000000" w:themeColor="text1"/>
+        </w:rPr>
+        <w:t>Esthetisch en minimalistisch ontwerp</w:t>
+      </w:r>
+      <w:bookmarkEnd w:id="58"/>
+      <w:r>
+        <w:rPr>
+          <w:b/>
+          <w:bCs/>
+          <w:color w:val="000000" w:themeColor="text1"/>
+        </w:rPr>
+        <w:br/>
+      </w:r>
+    </w:p>
+    <w:p>
+      <w:pPr>
         <w:spacing w:afterLines="24" w:after="57" w:line="288" w:lineRule="auto"/>
         <w:rPr>
+          <w:color w:val="000000" w:themeColor="text1"/>
+        </w:rPr>
+      </w:pPr>
+      <w:r>
+        <w:rPr>
+          <w:color w:val="000000" w:themeColor="text1"/>
+        </w:rPr>
+        <w:t>De interface combineert een eenvoudige lay</w:t>
+      </w:r>
+      <w:r>
+        <w:rPr>
+          <w:color w:val="000000" w:themeColor="text1"/>
+        </w:rPr>
+        <w:noBreakHyphen/>
+        <w:t>out met terughoudende visuele elementen. De centrale boomweergave is dominant en gebruikt een beperkt kleurenpalet (groen/rood) om de belangrijkste semantische verschillen te markeren. Secundaire acties verschijnen pas bij hover</w:t>
+      </w:r>
+      <w:r>
+        <w:rPr>
+          <w:color w:val="000000" w:themeColor="text1"/>
+        </w:rPr>
+        <w:t>.</w:t>
+      </w:r>
+      <w:r>
+        <w:rPr>
+          <w:color w:val="000000" w:themeColor="text1"/>
+        </w:rPr>
+        <w:t xml:space="preserve"> </w:t>
+      </w:r>
+      <w:r>
+        <w:rPr>
+          <w:color w:val="000000" w:themeColor="text1"/>
+        </w:rPr>
+        <w:t>Hierdoor blijft</w:t>
+      </w:r>
+      <w:r>
+        <w:rPr>
+          <w:color w:val="000000" w:themeColor="text1"/>
+        </w:rPr>
+        <w:t xml:space="preserve"> de standaardweergave relatief schoon. De rechterzijbalk is standaard samengevouwen tot compacte shield-knoppen</w:t>
+      </w:r>
+      <w:r>
+        <w:rPr>
+          <w:color w:val="000000" w:themeColor="text1"/>
+        </w:rPr>
+        <w:t>.</w:t>
+      </w:r>
+      <w:r>
+        <w:rPr>
+          <w:color w:val="000000" w:themeColor="text1"/>
+        </w:rPr>
+        <w:t xml:space="preserve"> </w:t>
+      </w:r>
+      <w:r>
+        <w:rPr>
+          <w:color w:val="000000" w:themeColor="text1"/>
+        </w:rPr>
+        <w:t>H</w:t>
+      </w:r>
+      <w:r>
+        <w:rPr>
+          <w:color w:val="000000" w:themeColor="text1"/>
+        </w:rPr>
+        <w:t>et volledige overzichtspaneel wordt alleen getoond wanneer de gebruiker hier expliciet voor kiest. Tooltips zijn kort en beperkt tot contextuele uitleg, zodat er geen overdadige tekst of iconografie ontstaat die de cognitieve belasting zou verhogen.</w:t>
+      </w:r>
+    </w:p>
+    <w:p>
+      <w:pPr>
+        <w:spacing w:afterLines="24" w:after="57" w:line="288" w:lineRule="auto"/>
+        <w:rPr>
+          <w:b/>
+          <w:bCs/>
+          <w:color w:val="000000" w:themeColor="text1"/>
+        </w:rPr>
+      </w:pPr>
+    </w:p>
+    <w:p>
+      <w:pPr>
+        <w:spacing w:afterLines="24" w:after="57" w:line="288" w:lineRule="auto"/>
+        <w:rPr>
           <w:b/>
           <w:bCs/>
           <w:color w:val="000000" w:themeColor="text1"/>
@@ -19439,7 +20595,7 @@
           <w:color w:val="000000" w:themeColor="text1"/>
         </w:rPr>
       </w:pPr>
-      <w:bookmarkStart w:id="53" w:name="_Toc219558604"/>
+      <w:bookmarkStart w:id="59" w:name="_Toc219558610"/>
       <w:r>
         <w:rPr>
           <w:b/>
@@ -19462,17 +20618,41 @@
           <w:bCs/>
           <w:color w:val="000000" w:themeColor="text1"/>
         </w:rPr>
-        <w:t xml:space="preserve">.3 </w:t>
-      </w:r>
-      <w:r>
-        <w:rPr>
-          <w:b/>
-          <w:bCs/>
-          <w:color w:val="000000" w:themeColor="text1"/>
-        </w:rPr>
-        <w:t>Gebruikerscontrole en vrijheid</w:t>
-      </w:r>
-      <w:bookmarkEnd w:id="53"/>
+        <w:t>.</w:t>
+      </w:r>
+      <w:r>
+        <w:rPr>
+          <w:b/>
+          <w:bCs/>
+          <w:color w:val="000000" w:themeColor="text1"/>
+        </w:rPr>
+        <w:t>9</w:t>
+      </w:r>
+      <w:r>
+        <w:rPr>
+          <w:b/>
+          <w:bCs/>
+          <w:color w:val="000000" w:themeColor="text1"/>
+        </w:rPr>
+        <w:t xml:space="preserve"> </w:t>
+      </w:r>
+      <w:r>
+        <w:rPr>
+          <w:b/>
+          <w:bCs/>
+          <w:color w:val="000000" w:themeColor="text1"/>
+        </w:rPr>
+        <w:t>Helpen bij herkennen, diagnosticeren en herstellen van fouten</w:t>
+      </w:r>
+      <w:bookmarkEnd w:id="59"/>
+      <w:r>
+        <w:rPr>
+          <w:b/>
+          <w:bCs/>
+          <w:color w:val="000000" w:themeColor="text1"/>
+        </w:rPr>
+        <w:br/>
+      </w:r>
     </w:p>
     <w:p>
       <w:pPr>
@@ -19481,6 +20661,24 @@
           <w:color w:val="000000" w:themeColor="text1"/>
         </w:rPr>
       </w:pPr>
+      <w:r>
+        <w:rPr>
+          <w:color w:val="000000" w:themeColor="text1"/>
+        </w:rPr>
+        <w:t>Hoewel geavanceerde foutafhandeling nog beperkt is, ondersteunt de tool gebruikers bij het herkennen en corrigeren van fouten. Bevestigingsdialogen bij verwijderen en resetten maken expliciet welke actie op het punt staat uitgevoerd te worden</w:t>
+      </w:r>
+      <w:r>
+        <w:rPr>
+          <w:color w:val="000000" w:themeColor="text1"/>
+        </w:rPr>
+        <w:t>. Zo kan</w:t>
+      </w:r>
+      <w:r>
+        <w:rPr>
+          <w:color w:val="000000" w:themeColor="text1"/>
+        </w:rPr>
+        <w:t xml:space="preserve"> de gebruiker een vergissing terugdraaien door te annuleren. </w:t>
+      </w:r>
     </w:p>
     <w:p>
       <w:pPr>
@@ -19489,11 +20687,67 @@
           <w:color w:val="000000" w:themeColor="text1"/>
         </w:rPr>
       </w:pPr>
-      <w:r>
-        <w:rPr>
-          <w:color w:val="000000" w:themeColor="text1"/>
-        </w:rPr>
-        <w:t>De implementatie voorziet diverse mechanismen die de gebruiker controle geven over het modelleerproces. Via “Reset Tree” kan op elk moment naar een lege beginsituatie worden teruggekeerd</w:t>
+    </w:p>
+    <w:p>
+      <w:pPr>
+        <w:spacing w:afterLines="24" w:after="57" w:line="288" w:lineRule="auto"/>
+        <w:rPr>
+          <w:color w:val="000000" w:themeColor="text1"/>
+        </w:rPr>
+      </w:pPr>
+      <w:r>
+        <w:rPr>
+          <w:color w:val="000000" w:themeColor="text1"/>
+        </w:rPr>
+        <w:t>In</w:t>
+      </w:r>
+      <w:r>
+        <w:rPr>
+          <w:color w:val="000000" w:themeColor="text1"/>
+        </w:rPr>
+        <w:t xml:space="preserve"> </w:t>
+      </w:r>
+      <w:r>
+        <w:rPr>
+          <w:color w:val="000000" w:themeColor="text1"/>
+        </w:rPr>
+        <w:t>elke</w:t>
+      </w:r>
+      <w:r>
+        <w:rPr>
+          <w:color w:val="000000" w:themeColor="text1"/>
+        </w:rPr>
+        <w:t> </w:t>
+      </w:r>
+      <w:r>
+        <w:rPr>
+          <w:color w:val="000000" w:themeColor="text1"/>
+        </w:rPr>
+        <w:t>node</w:t>
+      </w:r>
+      <w:r>
+        <w:rPr>
+          <w:color w:val="000000" w:themeColor="text1"/>
+        </w:rPr>
+        <w:t xml:space="preserve"> </w:t>
+      </w:r>
+      <w:r>
+        <w:rPr>
+          <w:color w:val="000000" w:themeColor="text1"/>
+        </w:rPr>
+        <w:t>worden de actuele dange</w:t>
+      </w:r>
+      <w:r>
+        <w:rPr>
+          <w:color w:val="000000" w:themeColor="text1"/>
+        </w:rPr>
+        <w:t>r</w:t>
+      </w:r>
+      <w:r>
+        <w:rPr>
+          <w:color w:val="000000" w:themeColor="text1"/>
+        </w:rPr>
+        <w:t xml:space="preserve"> rating, impact en likelihood expliciet getoond</w:t>
       </w:r>
       <w:r>
         <w:rPr>
@@ -19511,45 +20765,55 @@
         <w:rPr>
           <w:color w:val="000000" w:themeColor="text1"/>
         </w:rPr>
-        <w:t>D</w:t>
-      </w:r>
-      <w:r>
-        <w:rPr>
-          <w:color w:val="000000" w:themeColor="text1"/>
-        </w:rPr>
-        <w:t xml:space="preserve">eze actie wordt voorafgegaan door een bevestigingsdialoog (window.confirm) om onbedoeld dataverlies te vermijden. Op knoopniveau kunnen gebruikers afzonderlijke elementen verwijderen via de prullenbakknop (GoTrash) of nieuwe </w:t>
-      </w:r>
-      <w:r>
-        <w:rPr>
-          <w:color w:val="000000" w:themeColor="text1"/>
-        </w:rPr>
-        <w:t>children</w:t>
-      </w:r>
-      <w:r>
-        <w:rPr>
-          <w:color w:val="000000" w:themeColor="text1"/>
-        </w:rPr>
-        <w:t xml:space="preserve"> toevoegen (RiAddBoxLine). Panelen zoals de rechter “shields”-sidebar (isOpen) en het linker “Parents above current node”-overzicht (openParentSummary) kunnen naar </w:t>
-      </w:r>
-      <w:r>
-        <w:rPr>
-          <w:color w:val="000000" w:themeColor="text1"/>
-        </w:rPr>
-        <w:t>wens</w:t>
-      </w:r>
-      <w:r>
-        <w:rPr>
-          <w:color w:val="000000" w:themeColor="text1"/>
-        </w:rPr>
-        <w:t xml:space="preserve"> worden geopend en gesloten, zodat gebruikers vrij kunnen schakelen tussen een compacte en een meer gedetailleerde weergave.</w:t>
+        <w:t>Hierdoor kunnen</w:t>
+      </w:r>
+      <w:r>
+        <w:rPr>
+          <w:color w:val="000000" w:themeColor="text1"/>
+        </w:rPr>
+        <w:t xml:space="preserve"> incongruente waarden </w:t>
+      </w:r>
+      <w:r>
+        <w:rPr>
+          <w:color w:val="000000" w:themeColor="text1"/>
+        </w:rPr>
+        <w:t>eenvoudig</w:t>
+      </w:r>
+      <w:r>
+        <w:rPr>
+          <w:color w:val="000000" w:themeColor="text1"/>
+        </w:rPr>
+        <w:t xml:space="preserve"> opgemerkt en aangepast worden. De branch</w:t>
+      </w:r>
+      <w:r>
+        <w:rPr>
+          <w:color w:val="000000" w:themeColor="text1"/>
+        </w:rPr>
+        <w:t xml:space="preserve"> summary</w:t>
+      </w:r>
+      <w:r>
+        <w:rPr>
+          <w:color w:val="000000" w:themeColor="text1"/>
+        </w:rPr>
+        <w:t xml:space="preserve"> helpt gebruikers bij het diagnosticeren van structurele fouten in de redeneringsketen</w:t>
+      </w:r>
+      <w:r>
+        <w:rPr>
+          <w:color w:val="000000" w:themeColor="text1"/>
+        </w:rPr>
+        <w:t>. D</w:t>
+      </w:r>
+      <w:r>
+        <w:rPr>
+          <w:color w:val="000000" w:themeColor="text1"/>
+        </w:rPr>
+        <w:t>oor de context van een knoop te tonen, wordt het eenvoudiger vast te stellen of een veronderstelling op de juiste plaats staat.</w:t>
       </w:r>
     </w:p>
     <w:p>
       <w:pPr>
         <w:spacing w:afterLines="24" w:after="57" w:line="288" w:lineRule="auto"/>
         <w:rPr>
-          <w:b/>
-          <w:bCs/>
           <w:color w:val="000000" w:themeColor="text1"/>
         </w:rPr>
       </w:pPr>
@@ -19558,6 +20822,56 @@
       <w:pPr>
         <w:spacing w:afterLines="24" w:after="57" w:line="288" w:lineRule="auto"/>
         <w:rPr>
+          <w:color w:val="000000" w:themeColor="text1"/>
+        </w:rPr>
+      </w:pPr>
+      <w:r>
+        <w:rPr>
+          <w:color w:val="000000" w:themeColor="text1"/>
+        </w:rPr>
+        <w:t>Daarnaast beperkt de geprogrammeerde afwisseling tussen fortunately</w:t>
+      </w:r>
+      <w:r>
+        <w:rPr>
+          <w:color w:val="000000" w:themeColor="text1"/>
+        </w:rPr>
+        <w:noBreakHyphen/>
+        <w:t xml:space="preserve"> en unfortunately</w:t>
+      </w:r>
+      <w:r>
+        <w:rPr>
+          <w:color w:val="000000" w:themeColor="text1"/>
+        </w:rPr>
+        <w:noBreakHyphen/>
+        <w:t>nodes het risico op fouten in de opbouw van de redenering</w:t>
+      </w:r>
+      <w:r>
+        <w:rPr>
+          <w:color w:val="000000" w:themeColor="text1"/>
+        </w:rPr>
+        <w:t>. Gebruikers worden</w:t>
+      </w:r>
+      <w:r>
+        <w:rPr>
+          <w:color w:val="000000" w:themeColor="text1"/>
+        </w:rPr>
+        <w:t xml:space="preserve"> systematisch gestimuleerd om positieve en negatieve implicaties correct af te wisselen.</w:t>
+      </w:r>
+    </w:p>
+    <w:p>
+      <w:pPr>
+        <w:spacing w:afterLines="24" w:after="57" w:line="288" w:lineRule="auto"/>
+        <w:rPr>
+          <w:b/>
+          <w:bCs/>
+          <w:color w:val="000000" w:themeColor="text1"/>
+        </w:rPr>
+      </w:pPr>
+    </w:p>
+    <w:p>
+      <w:pPr>
+        <w:spacing w:afterLines="24" w:after="57" w:line="288" w:lineRule="auto"/>
+        <w:rPr>
           <w:b/>
           <w:bCs/>
           <w:color w:val="000000" w:themeColor="text1"/>
@@ -19573,7 +20887,7 @@
           <w:color w:val="000000" w:themeColor="text1"/>
         </w:rPr>
       </w:pPr>
-      <w:bookmarkStart w:id="54" w:name="_Toc219558605"/>
+      <w:bookmarkStart w:id="60" w:name="_Toc219558611"/>
       <w:r>
         <w:rPr>
           <w:b/>
@@ -19596,17 +20910,25 @@
           <w:bCs/>
           <w:color w:val="000000" w:themeColor="text1"/>
         </w:rPr>
-        <w:t xml:space="preserve">.4 </w:t>
-      </w:r>
-      <w:r>
-        <w:rPr>
-          <w:b/>
-          <w:bCs/>
-          <w:color w:val="000000" w:themeColor="text1"/>
-        </w:rPr>
-        <w:t>Consistentie en standaarden</w:t>
-      </w:r>
-      <w:bookmarkEnd w:id="54"/>
+        <w:t>.1</w:t>
+      </w:r>
+      <w:r>
+        <w:rPr>
+          <w:b/>
+          <w:bCs/>
+          <w:color w:val="000000" w:themeColor="text1"/>
+        </w:rPr>
+        <w:t xml:space="preserve">0 </w:t>
+      </w:r>
+      <w:r>
+        <w:rPr>
+          <w:b/>
+          <w:bCs/>
+          <w:color w:val="000000" w:themeColor="text1"/>
+        </w:rPr>
+        <w:t>Help en documentatie</w:t>
+      </w:r>
+      <w:bookmarkEnd w:id="60"/>
       <w:r>
         <w:rPr>
           <w:b/>
@@ -19627,748 +20949,65 @@
         <w:rPr>
           <w:color w:val="000000" w:themeColor="text1"/>
         </w:rPr>
-        <w:t>In zowel de code als de visuele vormgeving is een consistente logica doorgevoerd. Fortunately</w:t>
+        <w:t xml:space="preserve">Tot slot voorziet de webtool </w:t>
+      </w:r>
+      <w:r>
+        <w:rPr>
+          <w:color w:val="000000" w:themeColor="text1"/>
+        </w:rPr>
+        <w:t>een</w:t>
+      </w:r>
+      <w:r>
+        <w:rPr>
+          <w:color w:val="000000" w:themeColor="text1"/>
+        </w:rPr>
+        <w:t xml:space="preserve"> lichte, geïntegreerde ondersteuning. Verschillende elementen bevatten tooltips die bij hover verschijnen, zoals “Danger rating” bij de rode driehoek, “Show branch summary” bij het infopictogram en semantische labels bij de </w:t>
+      </w:r>
+      <w:r>
+        <w:rPr>
+          <w:color w:val="000000" w:themeColor="text1"/>
+        </w:rPr>
+        <w:lastRenderedPageBreak/>
+        <w:t>icons in </w:t>
+      </w:r>
+      <w:r>
+        <w:rPr>
+          <w:color w:val="000000" w:themeColor="text1"/>
+        </w:rPr>
+        <w:t>de icon knop</w:t>
+      </w:r>
+      <w:r>
+        <w:rPr>
+          <w:color w:val="000000" w:themeColor="text1"/>
+        </w:rPr>
+        <w:t xml:space="preserve"> </w:t>
+      </w:r>
+      <w:r>
+        <w:rPr>
+          <w:color w:val="000000" w:themeColor="text1"/>
+        </w:rPr>
+        <w:t>(“Weakness Under Review”, “Completed node”, “Low Importance”). De zoekbalk is duidelijk gelabeld (“Search for node”) en gebruikt een herkenbare Material</w:t>
       </w:r>
       <w:r>
         <w:rPr>
           <w:color w:val="000000" w:themeColor="text1"/>
         </w:rPr>
         <w:noBreakHyphen/>
-        <w:t>knooppunten worden systematisch in groen weergegeven, unfortunately</w:t>
-      </w:r>
-      <w:r>
-        <w:rPr>
-          <w:color w:val="000000" w:themeColor="text1"/>
-        </w:rPr>
-        <w:noBreakHyphen/>
-        <w:t xml:space="preserve">knooppunten in rood (component Node en de achtergrondklassen in ShowNodes), een kleurcodering die ook terugkomt in de zijbalk (groene/rode labels met “F” en “U”) en in de badges voor gevaar (FiTriangle). De betekenis van iconen blijft overal gelijk: GoShield markeert zwaktes, GoShieldCheck markeert aannames of voltooide </w:t>
-      </w:r>
-      <w:r>
-        <w:rPr>
-          <w:color w:val="000000" w:themeColor="text1"/>
-        </w:rPr>
-        <w:t>nodes</w:t>
-      </w:r>
-      <w:r>
-        <w:rPr>
-          <w:color w:val="000000" w:themeColor="text1"/>
-        </w:rPr>
-        <w:t>, GoInfo toont branchesamenvatting, en GoChevronDown/Up staan voor uit</w:t>
-      </w:r>
-      <w:r>
-        <w:rPr>
-          <w:color w:val="000000" w:themeColor="text1"/>
-        </w:rPr>
-        <w:noBreakHyphen/>
-        <w:t xml:space="preserve"> en inklappen. Interactie</w:t>
-      </w:r>
-      <w:r>
-        <w:rPr>
-          <w:color w:val="000000" w:themeColor="text1"/>
-        </w:rPr>
-        <w:noBreakHyphen/>
-        <w:t>patronen zoals hover</w:t>
-      </w:r>
-      <w:r>
-        <w:rPr>
-          <w:color w:val="000000" w:themeColor="text1"/>
-        </w:rPr>
-        <w:noBreakHyphen/>
-        <w:t>tooltips, modale bevestigingen en scrollIntoView sluiten aan bij typische webstandaarden, zodat gebruikers bestaande ervaring met andere applicaties kunnen hergebruiken.</w:t>
-      </w:r>
-    </w:p>
-    <w:p>
-      <w:pPr>
-        <w:spacing w:afterLines="24" w:after="57" w:line="288" w:lineRule="auto"/>
-        <w:rPr>
-          <w:color w:val="000000" w:themeColor="text1"/>
-        </w:rPr>
-      </w:pPr>
-    </w:p>
-    <w:p>
-      <w:pPr>
-        <w:pStyle w:val="Kop3"/>
-        <w:rPr>
-          <w:b/>
-          <w:bCs/>
-          <w:color w:val="000000" w:themeColor="text1"/>
-        </w:rPr>
-      </w:pPr>
-      <w:bookmarkStart w:id="55" w:name="_Toc219558606"/>
-      <w:r>
-        <w:rPr>
-          <w:b/>
-          <w:bCs/>
-          <w:color w:val="000000" w:themeColor="text1"/>
-        </w:rPr>
-        <w:t>3.</w:t>
-      </w:r>
-      <w:r>
-        <w:rPr>
-          <w:b/>
-          <w:bCs/>
-          <w:color w:val="000000" w:themeColor="text1"/>
-        </w:rPr>
-        <w:t>7</w:t>
-      </w:r>
-      <w:r>
-        <w:rPr>
-          <w:b/>
-          <w:bCs/>
-          <w:color w:val="000000" w:themeColor="text1"/>
-        </w:rPr>
-        <w:t xml:space="preserve">.5 </w:t>
-      </w:r>
-      <w:r>
-        <w:rPr>
-          <w:b/>
-          <w:bCs/>
-          <w:color w:val="000000" w:themeColor="text1"/>
-        </w:rPr>
-        <w:t>Foutpreventie</w:t>
-      </w:r>
-      <w:bookmarkEnd w:id="55"/>
-      <w:r>
-        <w:rPr>
-          <w:b/>
-          <w:bCs/>
-          <w:color w:val="000000" w:themeColor="text1"/>
-        </w:rPr>
-        <w:br/>
-      </w:r>
-    </w:p>
-    <w:p>
-      <w:pPr>
-        <w:spacing w:afterLines="24" w:after="57" w:line="288" w:lineRule="auto"/>
-        <w:rPr>
-          <w:color w:val="000000" w:themeColor="text1"/>
-        </w:rPr>
-      </w:pPr>
-      <w:r>
-        <w:rPr>
-          <w:color w:val="000000" w:themeColor="text1"/>
-        </w:rPr>
-        <w:t xml:space="preserve">Het ontwerp tracht fouten te voorkomen door de interactieruimte te beperken tot zinvolle acties. Bij het toevoegen van een </w:t>
-      </w:r>
-      <w:r>
-        <w:rPr>
-          <w:color w:val="000000" w:themeColor="text1"/>
-        </w:rPr>
-        <w:t>childe node</w:t>
-      </w:r>
-      <w:r>
-        <w:rPr>
-          <w:color w:val="000000" w:themeColor="text1"/>
-        </w:rPr>
-        <w:t xml:space="preserve"> bepaalt de applicatie automatisch het type (fortunately of unfortunately) op basis van het level van de </w:t>
-      </w:r>
-      <w:r>
-        <w:rPr>
-          <w:color w:val="000000" w:themeColor="text1"/>
-        </w:rPr>
-        <w:t>parent</w:t>
-      </w:r>
-      <w:r>
-        <w:rPr>
-          <w:color w:val="000000" w:themeColor="text1"/>
-        </w:rPr>
-        <w:t>, waardoor semantisch inconsistente ketens vermeden worden. Destructieve acties zoals het verwijderen van een knoop of het resetten van de volledige boom vereisen expliciete bevestiging via window.confirm. Dropdowns voor impact en likelihood zijn begrensd tot waarden 1–5, wat foutieve invoer uitsluit en tegelijk een uniforme schaal afdwingt. Klikken buiten pop</w:t>
-      </w:r>
-      <w:r>
-        <w:rPr>
-          <w:color w:val="000000" w:themeColor="text1"/>
-        </w:rPr>
-        <w:noBreakHyphen/>
-        <w:t>ups (zoals het danger</w:t>
-      </w:r>
-      <w:r>
-        <w:rPr>
-          <w:color w:val="000000" w:themeColor="text1"/>
-        </w:rPr>
-        <w:noBreakHyphen/>
-        <w:t xml:space="preserve">ratingvenster of de iconselector) sluit deze </w:t>
-      </w:r>
-      <w:r>
-        <w:rPr>
-          <w:color w:val="000000" w:themeColor="text1"/>
-        </w:rPr>
-        <w:lastRenderedPageBreak/>
-        <w:t>vensters automatisch, waardoor de kans op onbedoelde verdere interactie in een oude context afneemt.</w:t>
-      </w:r>
-    </w:p>
-    <w:p>
-      <w:pPr>
-        <w:pStyle w:val="Kop3"/>
-        <w:rPr>
-          <w:b/>
-          <w:bCs/>
-          <w:color w:val="000000" w:themeColor="text1"/>
-        </w:rPr>
-      </w:pPr>
-      <w:bookmarkStart w:id="56" w:name="_Toc219558607"/>
-      <w:r>
-        <w:rPr>
-          <w:b/>
-          <w:bCs/>
-          <w:color w:val="000000" w:themeColor="text1"/>
-        </w:rPr>
-        <w:t>3.</w:t>
-      </w:r>
-      <w:r>
-        <w:rPr>
-          <w:b/>
-          <w:bCs/>
-          <w:color w:val="000000" w:themeColor="text1"/>
-        </w:rPr>
-        <w:t>7</w:t>
-      </w:r>
-      <w:r>
-        <w:rPr>
-          <w:b/>
-          <w:bCs/>
-          <w:color w:val="000000" w:themeColor="text1"/>
-        </w:rPr>
-        <w:t xml:space="preserve">.6 </w:t>
-      </w:r>
-      <w:r>
-        <w:rPr>
-          <w:b/>
-          <w:bCs/>
-          <w:color w:val="000000" w:themeColor="text1"/>
-        </w:rPr>
-        <w:t>Herkenning boven herinnering</w:t>
-      </w:r>
-      <w:bookmarkEnd w:id="56"/>
-      <w:r>
-        <w:rPr>
-          <w:b/>
-          <w:bCs/>
-          <w:color w:val="000000" w:themeColor="text1"/>
-        </w:rPr>
-        <w:br/>
-      </w:r>
-    </w:p>
-    <w:p>
-      <w:pPr>
-        <w:spacing w:afterLines="24" w:after="57" w:line="288" w:lineRule="auto"/>
-        <w:rPr>
-          <w:color w:val="000000" w:themeColor="text1"/>
-        </w:rPr>
-      </w:pPr>
-      <w:r>
-        <w:rPr>
-          <w:color w:val="000000" w:themeColor="text1"/>
-        </w:rPr>
-        <w:t>De interface is zo ontworpen dat relevante acties en informatie zichtbaar worden aangeboden in plaats van uit het geheugen te moeten worden opgeroepen. Contextuele knoppen rond elke knoop (iconselector, expand/collapse, delete, add child) verschijnen bij hover, zodat gebruikers zien welke handelingen mogelijk zijn zonder menu’s of commando’s te onthouden. De IconSelectorButton toont bij hover een korte tekstuele uitleg (“Weakness”, “Assumption Under Review”, “Verified assumption”, enz.), waardoor de betekenis van de iconen direct herkenbaar is. De SearchBar laat gebruikers zoeken op knoopnaam</w:t>
-      </w:r>
-      <w:r>
-        <w:rPr>
-          <w:color w:val="000000" w:themeColor="text1"/>
-        </w:rPr>
-        <w:t>.</w:t>
-      </w:r>
-      <w:r>
-        <w:rPr>
-          <w:color w:val="000000" w:themeColor="text1"/>
-        </w:rPr>
-        <w:t xml:space="preserve"> </w:t>
-      </w:r>
-      <w:r>
-        <w:rPr>
-          <w:color w:val="000000" w:themeColor="text1"/>
-        </w:rPr>
-        <w:t xml:space="preserve">De </w:t>
-      </w:r>
-      <w:r>
-        <w:rPr>
-          <w:color w:val="000000" w:themeColor="text1"/>
-        </w:rPr>
-        <w:t xml:space="preserve">gevonden </w:t>
-      </w:r>
-      <w:r>
-        <w:rPr>
-          <w:color w:val="000000" w:themeColor="text1"/>
-        </w:rPr>
-        <w:t>nodes</w:t>
-      </w:r>
-      <w:r>
-        <w:rPr>
-          <w:color w:val="000000" w:themeColor="text1"/>
-        </w:rPr>
-        <w:t xml:space="preserve"> worden automatisch gehighlight en centraal in beeld gescrold (scrollIntoView), waardoor de gebruiker de exacte positie in de boomstructuur niet hoeft te onthouden.</w:t>
-      </w:r>
-    </w:p>
-    <w:p>
-      <w:pPr>
-        <w:spacing w:afterLines="24" w:after="57" w:line="288" w:lineRule="auto"/>
-        <w:rPr>
-          <w:b/>
-          <w:bCs/>
-          <w:color w:val="000000" w:themeColor="text1"/>
-        </w:rPr>
-      </w:pPr>
-    </w:p>
-    <w:p>
-      <w:pPr>
-        <w:spacing w:after="24"/>
-        <w:rPr>
-          <w:b/>
-          <w:bCs/>
-          <w:color w:val="000000" w:themeColor="text1"/>
-        </w:rPr>
-      </w:pPr>
-    </w:p>
-    <w:p>
-      <w:pPr>
-        <w:pStyle w:val="Kop3"/>
-        <w:rPr>
-          <w:b/>
-          <w:bCs/>
-          <w:color w:val="000000" w:themeColor="text1"/>
-        </w:rPr>
-      </w:pPr>
-      <w:bookmarkStart w:id="57" w:name="_Toc219558608"/>
-      <w:r>
-        <w:rPr>
-          <w:b/>
-          <w:bCs/>
-          <w:color w:val="000000" w:themeColor="text1"/>
-        </w:rPr>
-        <w:t>3.</w:t>
-      </w:r>
-      <w:r>
-        <w:rPr>
-          <w:b/>
-          <w:bCs/>
-          <w:color w:val="000000" w:themeColor="text1"/>
-        </w:rPr>
-        <w:t>7</w:t>
-      </w:r>
-      <w:r>
-        <w:rPr>
-          <w:b/>
-          <w:bCs/>
-          <w:color w:val="000000" w:themeColor="text1"/>
-        </w:rPr>
-        <w:t xml:space="preserve">.7 </w:t>
-      </w:r>
-      <w:r>
-        <w:rPr>
-          <w:b/>
-          <w:bCs/>
-          <w:color w:val="000000" w:themeColor="text1"/>
-        </w:rPr>
-        <w:t>Flexibiliteit en efficiëntie van gebruik</w:t>
-      </w:r>
-      <w:bookmarkEnd w:id="57"/>
-      <w:r>
-        <w:rPr>
-          <w:b/>
-          <w:bCs/>
-          <w:color w:val="000000" w:themeColor="text1"/>
-        </w:rPr>
-        <w:br/>
-      </w:r>
-    </w:p>
-    <w:p>
-      <w:pPr>
-        <w:spacing w:afterLines="24" w:after="57" w:line="288" w:lineRule="auto"/>
-        <w:rPr>
-          <w:color w:val="000000" w:themeColor="text1"/>
-        </w:rPr>
-      </w:pPr>
-      <w:r>
-        <w:rPr>
-          <w:color w:val="000000" w:themeColor="text1"/>
-        </w:rPr>
-        <w:t xml:space="preserve">De tool ondersteunt zowel exploratief gebruik door beginners als efficiëntere workflows voor ervaren gebruikers. Beginners kunnen via de knoppen in de boom en de zijbalk lineair </w:t>
-      </w:r>
-      <w:r>
-        <w:rPr>
-          <w:color w:val="000000" w:themeColor="text1"/>
-        </w:rPr>
-        <w:t>nodes</w:t>
-      </w:r>
-      <w:r>
-        <w:rPr>
-          <w:color w:val="000000" w:themeColor="text1"/>
-        </w:rPr>
-        <w:t xml:space="preserve"> toevoegen en labels aanpassen. Tegelijk kunnen ervaren gebruikers grote modellen snel manipuleren via globale collapse/expand</w:t>
-      </w:r>
-      <w:r>
-        <w:rPr>
-          <w:color w:val="000000" w:themeColor="text1"/>
-        </w:rPr>
-        <w:noBreakHyphen/>
-        <w:t>functionaliteit (CollapseButtons) en door herhaaldelijk op Enter te drukken in het zoekveld om cyclisch door alle matches te navigeren (highlightIndex). De dynamische lijsten van zwaktes en aannames in de rechterzijbalk fungeren als werkvoorraad: een klik op een item zorgt ervoor dat de relevante tak automatisch wordt uitgeklapt en in beeld komt, wat gericht en efficiënt werken bij complexe bomen ondersteunt.</w:t>
-      </w:r>
-    </w:p>
-    <w:p>
-      <w:pPr>
-        <w:spacing w:afterLines="24" w:after="57" w:line="288" w:lineRule="auto"/>
-        <w:rPr>
-          <w:b/>
-          <w:bCs/>
-          <w:color w:val="000000" w:themeColor="text1"/>
-        </w:rPr>
-      </w:pPr>
-    </w:p>
-    <w:p>
-      <w:pPr>
-        <w:spacing w:afterLines="24" w:after="57" w:line="288" w:lineRule="auto"/>
-        <w:rPr>
-          <w:b/>
-          <w:bCs/>
-          <w:color w:val="000000" w:themeColor="text1"/>
-        </w:rPr>
-      </w:pPr>
-    </w:p>
-    <w:p>
-      <w:pPr>
-        <w:pStyle w:val="Kop3"/>
-        <w:rPr>
-          <w:b/>
-          <w:bCs/>
-          <w:color w:val="000000" w:themeColor="text1"/>
-        </w:rPr>
-      </w:pPr>
-      <w:bookmarkStart w:id="58" w:name="_Toc219558609"/>
-      <w:r>
-        <w:rPr>
-          <w:b/>
-          <w:bCs/>
-          <w:color w:val="000000" w:themeColor="text1"/>
-        </w:rPr>
-        <w:t>3.</w:t>
-      </w:r>
-      <w:r>
-        <w:rPr>
-          <w:b/>
-          <w:bCs/>
-          <w:color w:val="000000" w:themeColor="text1"/>
-        </w:rPr>
-        <w:t>7</w:t>
-      </w:r>
-      <w:r>
-        <w:rPr>
-          <w:b/>
-          <w:bCs/>
-          <w:color w:val="000000" w:themeColor="text1"/>
-        </w:rPr>
-        <w:t xml:space="preserve">.8 </w:t>
-      </w:r>
-      <w:r>
-        <w:rPr>
-          <w:b/>
-          <w:bCs/>
-          <w:color w:val="000000" w:themeColor="text1"/>
-        </w:rPr>
-        <w:t>Esthetisch en minimalistisch ontwerp</w:t>
-      </w:r>
-      <w:bookmarkEnd w:id="58"/>
-      <w:r>
-        <w:rPr>
-          <w:b/>
-          <w:bCs/>
-          <w:color w:val="000000" w:themeColor="text1"/>
-        </w:rPr>
-        <w:br/>
-      </w:r>
-    </w:p>
-    <w:p>
-      <w:pPr>
-        <w:spacing w:afterLines="24" w:after="57" w:line="288" w:lineRule="auto"/>
-        <w:rPr>
-          <w:color w:val="000000" w:themeColor="text1"/>
-        </w:rPr>
-      </w:pPr>
-      <w:r>
-        <w:rPr>
-          <w:color w:val="000000" w:themeColor="text1"/>
-        </w:rPr>
-        <w:t>De interface combineert een eenvoudige lay</w:t>
-      </w:r>
-      <w:r>
-        <w:rPr>
-          <w:color w:val="000000" w:themeColor="text1"/>
-        </w:rPr>
-        <w:noBreakHyphen/>
-        <w:t>out met terughoudende visuele elementen. De centrale boomweergave is dominant en gebruikt een beperkt kleurenpalet (groen/rood) om de belangrijkste semantische verschillen te markeren. Secundaire acties verschijnen pas bij hover, waardoor de standaardweergave relatief schoon blijft. De rechterzijbalk is standaard samengevouwen tot compacte “shield”-knoppen</w:t>
-      </w:r>
-      <w:r>
-        <w:rPr>
-          <w:color w:val="000000" w:themeColor="text1"/>
-        </w:rPr>
-        <w:t>.</w:t>
-      </w:r>
-      <w:r>
-        <w:rPr>
-          <w:color w:val="000000" w:themeColor="text1"/>
-        </w:rPr>
-        <w:t xml:space="preserve"> </w:t>
-      </w:r>
-      <w:r>
-        <w:rPr>
-          <w:color w:val="000000" w:themeColor="text1"/>
-        </w:rPr>
-        <w:t>H</w:t>
-      </w:r>
-      <w:r>
-        <w:rPr>
-          <w:color w:val="000000" w:themeColor="text1"/>
-        </w:rPr>
-        <w:t xml:space="preserve">et volledige overzichtspaneel wordt alleen getoond wanneer de gebruiker hier expliciet </w:t>
-      </w:r>
-      <w:r>
-        <w:rPr>
-          <w:color w:val="000000" w:themeColor="text1"/>
-        </w:rPr>
-        <w:lastRenderedPageBreak/>
-        <w:t>voor kiest. Tooltips zijn kort en beperkt tot contextuele uitleg, zodat er geen overdadige tekst of iconografie ontstaat die de cognitieve belasting zou verhogen.</w:t>
-      </w:r>
-    </w:p>
-    <w:p>
-      <w:pPr>
-        <w:spacing w:afterLines="24" w:after="57" w:line="288" w:lineRule="auto"/>
-        <w:rPr>
-          <w:b/>
-          <w:bCs/>
-          <w:color w:val="000000" w:themeColor="text1"/>
-        </w:rPr>
-      </w:pPr>
-    </w:p>
-    <w:p>
-      <w:pPr>
-        <w:pStyle w:val="Kop3"/>
-        <w:rPr>
-          <w:b/>
-          <w:bCs/>
-          <w:color w:val="000000" w:themeColor="text1"/>
-        </w:rPr>
-      </w:pPr>
-      <w:bookmarkStart w:id="59" w:name="_Toc219558610"/>
-      <w:r>
-        <w:rPr>
-          <w:b/>
-          <w:bCs/>
-          <w:color w:val="000000" w:themeColor="text1"/>
-        </w:rPr>
-        <w:t>3.</w:t>
-      </w:r>
-      <w:r>
-        <w:rPr>
-          <w:b/>
-          <w:bCs/>
-          <w:color w:val="000000" w:themeColor="text1"/>
-        </w:rPr>
-        <w:t>7</w:t>
-      </w:r>
-      <w:r>
-        <w:rPr>
-          <w:b/>
-          <w:bCs/>
-          <w:color w:val="000000" w:themeColor="text1"/>
-        </w:rPr>
-        <w:t xml:space="preserve">.10 </w:t>
-      </w:r>
-      <w:r>
-        <w:rPr>
-          <w:b/>
-          <w:bCs/>
-          <w:color w:val="000000" w:themeColor="text1"/>
-        </w:rPr>
-        <w:t>Helpen bij herkennen, diagnosticeren en herstellen van fouten</w:t>
-      </w:r>
-      <w:bookmarkEnd w:id="59"/>
-      <w:r>
-        <w:rPr>
-          <w:b/>
-          <w:bCs/>
-          <w:color w:val="000000" w:themeColor="text1"/>
-        </w:rPr>
-        <w:br/>
-      </w:r>
-    </w:p>
-    <w:p>
-      <w:pPr>
-        <w:spacing w:afterLines="24" w:after="57" w:line="288" w:lineRule="auto"/>
-        <w:rPr>
-          <w:color w:val="000000" w:themeColor="text1"/>
-        </w:rPr>
-      </w:pPr>
-      <w:r>
-        <w:rPr>
-          <w:color w:val="000000" w:themeColor="text1"/>
-        </w:rPr>
-        <w:t xml:space="preserve">Hoewel geavanceerde foutafhandeling nog beperkt is, ondersteunt de tool gebruikers bij het herkennen en corrigeren van fouten. Bevestigingsdialogen bij verwijderen en resetten maken expliciet welke actie op het punt staat uitgevoerd te worden, zodat de gebruiker een vergissing kan terugdraaien door te annuleren. </w:t>
-      </w:r>
-    </w:p>
-    <w:p>
-      <w:pPr>
-        <w:spacing w:afterLines="24" w:after="57" w:line="288" w:lineRule="auto"/>
-        <w:rPr>
-          <w:color w:val="000000" w:themeColor="text1"/>
-        </w:rPr>
-      </w:pPr>
-    </w:p>
-    <w:p>
-      <w:pPr>
-        <w:spacing w:afterLines="24" w:after="57" w:line="288" w:lineRule="auto"/>
-        <w:rPr>
-          <w:color w:val="000000" w:themeColor="text1"/>
-        </w:rPr>
-      </w:pPr>
-      <w:r>
-        <w:rPr>
-          <w:color w:val="000000" w:themeColor="text1"/>
-        </w:rPr>
-        <w:t>In</w:t>
-      </w:r>
-      <w:r>
-        <w:rPr>
-          <w:color w:val="000000" w:themeColor="text1"/>
-        </w:rPr>
-        <w:t xml:space="preserve"> </w:t>
-      </w:r>
-      <w:r>
-        <w:rPr>
-          <w:color w:val="000000" w:themeColor="text1"/>
-        </w:rPr>
-        <w:t>de NodeDangerPopup worden de actuele dange</w:t>
-      </w:r>
-      <w:r>
-        <w:rPr>
-          <w:color w:val="000000" w:themeColor="text1"/>
-        </w:rPr>
-        <w:t>r</w:t>
-      </w:r>
-      <w:r>
-        <w:rPr>
-          <w:color w:val="000000" w:themeColor="text1"/>
-        </w:rPr>
-        <w:t xml:space="preserve"> rating, impact en likelihood expliciet getoond, waardoor incongruente waarden makkelijk opgemerkt en aangepast kunnen worden. De branch</w:t>
-      </w:r>
-      <w:r>
-        <w:rPr>
-          <w:color w:val="000000" w:themeColor="text1"/>
-        </w:rPr>
-        <w:noBreakHyphen/>
-        <w:t>samenvatting (via de GoInfo</w:t>
-      </w:r>
-      <w:r>
-        <w:rPr>
-          <w:color w:val="000000" w:themeColor="text1"/>
-        </w:rPr>
-        <w:noBreakHyphen/>
-        <w:t>knop en getParentsAbove) helpt gebruikers bij het diagnosticeren van structurele fouten in de redeneringsketen: door de context van een knoop te tonen, wordt het eenvoudiger vast te stellen of een veronderstelling op de juiste plaats staat.</w:t>
-      </w:r>
-    </w:p>
-    <w:p>
-      <w:pPr>
-        <w:spacing w:afterLines="24" w:after="57" w:line="288" w:lineRule="auto"/>
-        <w:rPr>
-          <w:b/>
-          <w:bCs/>
-          <w:color w:val="000000" w:themeColor="text1"/>
-        </w:rPr>
-      </w:pPr>
-    </w:p>
-    <w:p>
-      <w:pPr>
-        <w:spacing w:afterLines="24" w:after="57" w:line="288" w:lineRule="auto"/>
-        <w:rPr>
-          <w:b/>
-          <w:bCs/>
-          <w:color w:val="000000" w:themeColor="text1"/>
-        </w:rPr>
-      </w:pPr>
-    </w:p>
-    <w:p>
-      <w:pPr>
-        <w:pStyle w:val="Kop3"/>
-        <w:rPr>
-          <w:b/>
-          <w:bCs/>
-          <w:color w:val="000000" w:themeColor="text1"/>
-        </w:rPr>
-      </w:pPr>
-      <w:bookmarkStart w:id="60" w:name="_Toc219558611"/>
-      <w:r>
-        <w:rPr>
-          <w:b/>
-          <w:bCs/>
-          <w:color w:val="000000" w:themeColor="text1"/>
-        </w:rPr>
-        <w:t>3.</w:t>
-      </w:r>
-      <w:r>
-        <w:rPr>
-          <w:b/>
-          <w:bCs/>
-          <w:color w:val="000000" w:themeColor="text1"/>
-        </w:rPr>
-        <w:t>7</w:t>
-      </w:r>
-      <w:r>
-        <w:rPr>
-          <w:b/>
-          <w:bCs/>
-          <w:color w:val="000000" w:themeColor="text1"/>
-        </w:rPr>
-        <w:t>.11</w:t>
-      </w:r>
-      <w:r>
-        <w:rPr>
-          <w:b/>
-          <w:bCs/>
-          <w:color w:val="000000" w:themeColor="text1"/>
-        </w:rPr>
-        <w:t xml:space="preserve"> </w:t>
-      </w:r>
-      <w:r>
-        <w:rPr>
-          <w:b/>
-          <w:bCs/>
-          <w:color w:val="000000" w:themeColor="text1"/>
-        </w:rPr>
-        <w:t>Help en documentatie</w:t>
-      </w:r>
-      <w:bookmarkEnd w:id="60"/>
-      <w:r>
-        <w:rPr>
-          <w:b/>
-          <w:bCs/>
-          <w:color w:val="000000" w:themeColor="text1"/>
-        </w:rPr>
-        <w:br/>
-      </w:r>
-    </w:p>
-    <w:p>
-      <w:pPr>
-        <w:spacing w:afterLines="24" w:after="57" w:line="288" w:lineRule="auto"/>
-        <w:rPr>
-          <w:color w:val="000000" w:themeColor="text1"/>
-        </w:rPr>
-      </w:pPr>
-      <w:r>
-        <w:rPr>
-          <w:color w:val="000000" w:themeColor="text1"/>
-        </w:rPr>
-        <w:t>Tot slot voorziet de webtool in lichte, geïntegreerde ondersteuning. Verschillende elementen bevatten inline</w:t>
-      </w:r>
-      <w:r>
-        <w:rPr>
-          <w:color w:val="000000" w:themeColor="text1"/>
-        </w:rPr>
-        <w:noBreakHyphen/>
-        <w:t>tooltips die bij hover verschijnen, zoals “Danger rating” bij de rode driehoek, “Show branch summary” bij het infopictogram en semantische labels bij de icons in IconSelectorButton (“Weakness Under Review”, “Completed node”, “Low Importance”). De zoekbalk is duidelijk gelabeld (“Search for node”) en gebruikt een herkenbare Material</w:t>
-      </w:r>
-      <w:r>
-        <w:rPr>
-          <w:color w:val="000000" w:themeColor="text1"/>
-        </w:rPr>
-        <w:noBreakHyphen/>
-        <w:t>UI TextField, waardoor de functie intuïtief is. Deze vorm van embedded documentatie reduceert de noodzaak voor een omvangrijke externe handleiding en ondersteunt vooral eerste</w:t>
+        <w:t xml:space="preserve">UI TextField, waardoor de functie intuïtief is. Deze vorm van </w:t>
+      </w:r>
+      <w:r>
+        <w:rPr>
+          <w:i/>
+          <w:iCs/>
+          <w:color w:val="000000" w:themeColor="text1"/>
+        </w:rPr>
+        <w:t>embedded</w:t>
+      </w:r>
+      <w:r>
+        <w:rPr>
+          <w:color w:val="000000" w:themeColor="text1"/>
+        </w:rPr>
+        <w:t xml:space="preserve"> documentatie reduceert de noodzaak voor een omvangrijke externe handleiding en ondersteunt vooral eerste</w:t>
       </w:r>
       <w:r>
         <w:rPr>
@@ -20531,7 +21170,6 @@
         <w:rPr>
           <w:color w:val="000000" w:themeColor="text1"/>
         </w:rPr>
-        <w:lastRenderedPageBreak/>
         <w:t>er is geen multi</w:t>
       </w:r>
       <w:r>
@@ -21796,7 +22434,7 @@
           <w:color w:val="000000" w:themeColor="text1"/>
         </w:rPr>
         <w:drawing>
-          <wp:inline distT="0" distB="0" distL="0" distR="0" wp14:anchorId="1D6CEF09" wp14:editId="2BE68F3F">
+          <wp:inline distT="0" distB="0" distL="0" distR="0" wp14:anchorId="1D6CEF09" wp14:editId="35EEE81F">
             <wp:extent cx="5759450" cy="2903855"/>
             <wp:effectExtent l="0" t="0" r="0" b="0"/>
             <wp:docPr id="254494346" name="Afbeelding 25" descr="Afbeelding met tekst, schermopname, Lettertype, nummer&#10;&#10;Door AI gegenereerde inhoud is mogelijk onjuist."/>

</xml_diff>